<commit_message>
0.10.7 feat: implement water ripple text effect simulation
</commit_message>
<xml_diff>
--- a/To do.docx
+++ b/To do.docx
@@ -7,35 +7,7 @@
         <w:rPr>
           <w:rFonts w:hint="eastAsia"/>
         </w:rPr>
-        <w:t>預設是一個顯示器，一個平板，平板選擇詞</w:t>
-      </w:r>
-      <w:proofErr w:type="gramStart"/>
-      <w:r>
-        <w:rPr>
-          <w:rFonts w:hint="eastAsia"/>
-        </w:rPr>
-        <w:t>匯后</w:t>
-      </w:r>
-      <w:proofErr w:type="gramEnd"/>
-      <w:r>
-        <w:rPr>
-          <w:rFonts w:hint="eastAsia"/>
-        </w:rPr>
-        <w:t>，透過影像識別，流淚流出詞</w:t>
-      </w:r>
-      <w:proofErr w:type="gramStart"/>
-      <w:r>
-        <w:rPr>
-          <w:rFonts w:hint="eastAsia"/>
-        </w:rPr>
-        <w:t>匯</w:t>
-      </w:r>
-      <w:proofErr w:type="gramEnd"/>
-      <w:r>
-        <w:rPr>
-          <w:rFonts w:hint="eastAsia"/>
-        </w:rPr>
-        <w:t>最終流入平板，匯聚成寶石。</w:t>
+        <w:t>預設是一個顯示器，一個平板，平板選擇詞匯后，透過影像識別，流淚流出詞匯最終流入平板，匯聚成寶石。</w:t>
       </w:r>
     </w:p>
     <w:p/>
@@ -43,7 +15,6 @@
       <w:pPr>
         <w:rPr>
           <w:rFonts w:eastAsia="DengXian"/>
-          <w:lang w:eastAsia="zh-CN"/>
         </w:rPr>
       </w:pPr>
       <w:r>
@@ -59,55 +30,7 @@
         <w:t>Pixi</w:t>
       </w:r>
       <w:r>
-        <w:t>，設計點擊五組心情詞擇</w:t>
-      </w:r>
-      <w:proofErr w:type="gramStart"/>
-      <w:r>
-        <w:t>一</w:t>
-      </w:r>
-      <w:proofErr w:type="gramEnd"/>
-      <w:r>
-        <w:t>後，透過影像識別人眼，最終選擇的</w:t>
-      </w:r>
-      <w:proofErr w:type="gramStart"/>
-      <w:r>
-        <w:t>心情詞會不斷</w:t>
-      </w:r>
-      <w:proofErr w:type="gramEnd"/>
-      <w:r>
-        <w:t>從眼中流出（流出的詞</w:t>
-      </w:r>
-      <w:proofErr w:type="gramStart"/>
-      <w:r>
-        <w:t>匯</w:t>
-      </w:r>
-      <w:proofErr w:type="gramEnd"/>
-      <w:r>
-        <w:t>越來越多，有最大值），詞</w:t>
-      </w:r>
-      <w:proofErr w:type="gramStart"/>
-      <w:r>
-        <w:t>匯</w:t>
-      </w:r>
-      <w:proofErr w:type="gramEnd"/>
-      <w:r>
-        <w:t>在顯示器的流動過程中，慢慢由完整的字分解成流動的水墨，最後流入顯示器底端，幾秒</w:t>
-      </w:r>
-      <w:proofErr w:type="gramStart"/>
-      <w:r>
-        <w:t>后</w:t>
-      </w:r>
-      <w:proofErr w:type="gramEnd"/>
-      <w:r>
-        <w:t>平板接續顯示器的水墨，並慢慢往平板中心匯聚，匯聚過程中漸漸變色</w:t>
-      </w:r>
-      <w:proofErr w:type="gramStart"/>
-      <w:r>
-        <w:t>（</w:t>
-      </w:r>
-      <w:proofErr w:type="gramEnd"/>
-      <w:r>
-        <w:t>顔色是根據最終要生成的寶石顔色決定）</w:t>
+        <w:t>，設計點擊五組心情詞擇一後，透過影像識別人眼，最終選擇的心情詞會不斷從眼中流出（流出的詞匯越來越多，有最大值），詞匯在顯示器的流動過程中，慢慢由完整的字分解成流動的水墨，最後流入顯示器底端，幾秒后平板接續顯示器的水墨，並慢慢往平板中心匯聚，匯聚過程中漸漸變色（顔色是根據最終要生成的寶石顔色決定）</w:t>
       </w:r>
       <w:r>
         <w:t>,</w:t>
@@ -150,6 +73,101 @@
       </w:r>
       <w:r>
         <w:t>所有文字都匯聚后水墨經過一陣波動變成寶石。</w:t>
+      </w:r>
+    </w:p>
+    <w:p>
+      <w:pPr>
+        <w:jc w:val="left"/>
+      </w:pPr>
+    </w:p>
+    <w:p>
+      <w:pPr>
+        <w:jc w:val="left"/>
+      </w:pPr>
+      <w:r>
+        <w:rPr>
+          <w:noProof/>
+        </w:rPr>
+        <w:drawing>
+          <wp:inline distT="0" distB="0" distL="0" distR="0" wp14:anchorId="166BB0E6" wp14:editId="4C67D358">
+            <wp:extent cx="5274310" cy="2028190"/>
+            <wp:effectExtent l="0" t="0" r="2540" b="0"/>
+            <wp:docPr id="540758584" name="圖片 1"/>
+            <wp:cNvGraphicFramePr>
+              <a:graphicFrameLocks xmlns:a="http://schemas.openxmlformats.org/drawingml/2006/main" noChangeAspect="1"/>
+            </wp:cNvGraphicFramePr>
+            <a:graphic xmlns:a="http://schemas.openxmlformats.org/drawingml/2006/main">
+              <a:graphicData uri="http://schemas.openxmlformats.org/drawingml/2006/picture">
+                <pic:pic xmlns:pic="http://schemas.openxmlformats.org/drawingml/2006/picture">
+                  <pic:nvPicPr>
+                    <pic:cNvPr id="540758584" name=""/>
+                    <pic:cNvPicPr/>
+                  </pic:nvPicPr>
+                  <pic:blipFill>
+                    <a:blip r:embed="rId5"/>
+                    <a:stretch>
+                      <a:fillRect/>
+                    </a:stretch>
+                  </pic:blipFill>
+                  <pic:spPr>
+                    <a:xfrm>
+                      <a:off x="0" y="0"/>
+                      <a:ext cx="5274310" cy="2028190"/>
+                    </a:xfrm>
+                    <a:prstGeom prst="rect">
+                      <a:avLst/>
+                    </a:prstGeom>
+                  </pic:spPr>
+                </pic:pic>
+              </a:graphicData>
+            </a:graphic>
+          </wp:inline>
+        </w:drawing>
+      </w:r>
+    </w:p>
+    <w:p>
+      <w:pPr>
+        <w:jc w:val="left"/>
+      </w:pPr>
+      <w:r>
+        <w:rPr>
+          <w:noProof/>
+        </w:rPr>
+        <w:drawing>
+          <wp:inline distT="0" distB="0" distL="0" distR="0" wp14:anchorId="180954D3" wp14:editId="1A80AE58">
+            <wp:extent cx="5274310" cy="2434590"/>
+            <wp:effectExtent l="0" t="0" r="2540" b="3810"/>
+            <wp:docPr id="748177995" name="圖片 1"/>
+            <wp:cNvGraphicFramePr>
+              <a:graphicFrameLocks xmlns:a="http://schemas.openxmlformats.org/drawingml/2006/main" noChangeAspect="1"/>
+            </wp:cNvGraphicFramePr>
+            <a:graphic xmlns:a="http://schemas.openxmlformats.org/drawingml/2006/main">
+              <a:graphicData uri="http://schemas.openxmlformats.org/drawingml/2006/picture">
+                <pic:pic xmlns:pic="http://schemas.openxmlformats.org/drawingml/2006/picture">
+                  <pic:nvPicPr>
+                    <pic:cNvPr id="748177995" name=""/>
+                    <pic:cNvPicPr/>
+                  </pic:nvPicPr>
+                  <pic:blipFill>
+                    <a:blip r:embed="rId6"/>
+                    <a:stretch>
+                      <a:fillRect/>
+                    </a:stretch>
+                  </pic:blipFill>
+                  <pic:spPr>
+                    <a:xfrm>
+                      <a:off x="0" y="0"/>
+                      <a:ext cx="5274310" cy="2434590"/>
+                    </a:xfrm>
+                    <a:prstGeom prst="rect">
+                      <a:avLst/>
+                    </a:prstGeom>
+                  </pic:spPr>
+                </pic:pic>
+              </a:graphicData>
+            </a:graphic>
+          </wp:inline>
+        </w:drawing>
       </w:r>
     </w:p>
     <w:p>
@@ -159,6 +177,47 @@
           <w:rFonts w:hint="eastAsia"/>
         </w:rPr>
       </w:pPr>
+      <w:r>
+        <w:rPr>
+          <w:noProof/>
+        </w:rPr>
+        <w:lastRenderedPageBreak/>
+        <w:drawing>
+          <wp:inline distT="0" distB="0" distL="0" distR="0" wp14:anchorId="755F5801" wp14:editId="11054A60">
+            <wp:extent cx="5274310" cy="2160270"/>
+            <wp:effectExtent l="0" t="0" r="2540" b="0"/>
+            <wp:docPr id="612090285" name="圖片 1"/>
+            <wp:cNvGraphicFramePr>
+              <a:graphicFrameLocks xmlns:a="http://schemas.openxmlformats.org/drawingml/2006/main" noChangeAspect="1"/>
+            </wp:cNvGraphicFramePr>
+            <a:graphic xmlns:a="http://schemas.openxmlformats.org/drawingml/2006/main">
+              <a:graphicData uri="http://schemas.openxmlformats.org/drawingml/2006/picture">
+                <pic:pic xmlns:pic="http://schemas.openxmlformats.org/drawingml/2006/picture">
+                  <pic:nvPicPr>
+                    <pic:cNvPr id="612090285" name=""/>
+                    <pic:cNvPicPr/>
+                  </pic:nvPicPr>
+                  <pic:blipFill>
+                    <a:blip r:embed="rId7"/>
+                    <a:stretch>
+                      <a:fillRect/>
+                    </a:stretch>
+                  </pic:blipFill>
+                  <pic:spPr>
+                    <a:xfrm>
+                      <a:off x="0" y="0"/>
+                      <a:ext cx="5274310" cy="2160270"/>
+                    </a:xfrm>
+                    <a:prstGeom prst="rect">
+                      <a:avLst/>
+                    </a:prstGeom>
+                  </pic:spPr>
+                </pic:pic>
+              </a:graphicData>
+            </a:graphic>
+          </wp:inline>
+        </w:drawing>
+      </w:r>
     </w:p>
     <w:sectPr>
       <w:pgSz w:w="11906" w:h="16838"/>
@@ -1011,6 +1070,7 @@
   <w:style w:type="character" w:default="1" w:styleId="a0">
     <w:name w:val="Default Paragraph Font"/>
     <w:uiPriority w:val="1"/>
+    <w:semiHidden/>
     <w:unhideWhenUsed/>
   </w:style>
   <w:style w:type="table" w:default="1" w:styleId="a1">

</xml_diff>

<commit_message>
0.11.2 feat: implement collision boundary and randomized ripple dynamics
</commit_message>
<xml_diff>
--- a/To do.docx
+++ b/To do.docx
@@ -104,7 +104,7 @@
                     <pic:cNvPicPr/>
                   </pic:nvPicPr>
                   <pic:blipFill>
-                    <a:blip r:embed="rId5"/>
+                    <a:blip r:embed="rId7"/>
                     <a:stretch>
                       <a:fillRect/>
                     </a:stretch>
@@ -149,7 +149,7 @@
                     <pic:cNvPicPr/>
                   </pic:nvPicPr>
                   <pic:blipFill>
-                    <a:blip r:embed="rId6"/>
+                    <a:blip r:embed="rId8"/>
                     <a:stretch>
                       <a:fillRect/>
                     </a:stretch>
@@ -173,9 +173,6 @@
     <w:p>
       <w:pPr>
         <w:jc w:val="left"/>
-        <w:rPr>
-          <w:rFonts w:hint="eastAsia"/>
-        </w:rPr>
       </w:pPr>
       <w:r>
         <w:rPr>
@@ -198,7 +195,7 @@
                     <pic:cNvPicPr/>
                   </pic:nvPicPr>
                   <pic:blipFill>
-                    <a:blip r:embed="rId7"/>
+                    <a:blip r:embed="rId9"/>
                     <a:stretch>
                       <a:fillRect/>
                     </a:stretch>
@@ -219,6 +216,286 @@
         </w:drawing>
       </w:r>
     </w:p>
+    <w:p>
+      <w:pPr>
+        <w:jc w:val="left"/>
+      </w:pPr>
+    </w:p>
+    <w:p>
+      <w:pPr>
+        <w:jc w:val="left"/>
+      </w:pPr>
+      <w:r>
+        <w:rPr>
+          <w:noProof/>
+        </w:rPr>
+        <w:drawing>
+          <wp:inline distT="0" distB="0" distL="0" distR="0" wp14:anchorId="02FBAA42" wp14:editId="75FBC8A7">
+            <wp:extent cx="5274310" cy="1766570"/>
+            <wp:effectExtent l="0" t="0" r="2540" b="5080"/>
+            <wp:docPr id="2062461477" name="圖片 1"/>
+            <wp:cNvGraphicFramePr>
+              <a:graphicFrameLocks xmlns:a="http://schemas.openxmlformats.org/drawingml/2006/main" noChangeAspect="1"/>
+            </wp:cNvGraphicFramePr>
+            <a:graphic xmlns:a="http://schemas.openxmlformats.org/drawingml/2006/main">
+              <a:graphicData uri="http://schemas.openxmlformats.org/drawingml/2006/picture">
+                <pic:pic xmlns:pic="http://schemas.openxmlformats.org/drawingml/2006/picture">
+                  <pic:nvPicPr>
+                    <pic:cNvPr id="2062461477" name=""/>
+                    <pic:cNvPicPr/>
+                  </pic:nvPicPr>
+                  <pic:blipFill>
+                    <a:blip r:embed="rId10"/>
+                    <a:stretch>
+                      <a:fillRect/>
+                    </a:stretch>
+                  </pic:blipFill>
+                  <pic:spPr>
+                    <a:xfrm>
+                      <a:off x="0" y="0"/>
+                      <a:ext cx="5274310" cy="1766570"/>
+                    </a:xfrm>
+                    <a:prstGeom prst="rect">
+                      <a:avLst/>
+                    </a:prstGeom>
+                  </pic:spPr>
+                </pic:pic>
+              </a:graphicData>
+            </a:graphic>
+          </wp:inline>
+        </w:drawing>
+      </w:r>
+    </w:p>
+    <w:p>
+      <w:pPr>
+        <w:jc w:val="left"/>
+      </w:pPr>
+      <w:r>
+        <w:rPr>
+          <w:noProof/>
+        </w:rPr>
+        <w:drawing>
+          <wp:inline distT="0" distB="0" distL="0" distR="0" wp14:anchorId="285DCA4B" wp14:editId="2F547613">
+            <wp:extent cx="5274310" cy="2360295"/>
+            <wp:effectExtent l="0" t="0" r="2540" b="1905"/>
+            <wp:docPr id="175888976" name="圖片 1"/>
+            <wp:cNvGraphicFramePr>
+              <a:graphicFrameLocks xmlns:a="http://schemas.openxmlformats.org/drawingml/2006/main" noChangeAspect="1"/>
+            </wp:cNvGraphicFramePr>
+            <a:graphic xmlns:a="http://schemas.openxmlformats.org/drawingml/2006/main">
+              <a:graphicData uri="http://schemas.openxmlformats.org/drawingml/2006/picture">
+                <pic:pic xmlns:pic="http://schemas.openxmlformats.org/drawingml/2006/picture">
+                  <pic:nvPicPr>
+                    <pic:cNvPr id="175888976" name=""/>
+                    <pic:cNvPicPr/>
+                  </pic:nvPicPr>
+                  <pic:blipFill>
+                    <a:blip r:embed="rId11"/>
+                    <a:stretch>
+                      <a:fillRect/>
+                    </a:stretch>
+                  </pic:blipFill>
+                  <pic:spPr>
+                    <a:xfrm>
+                      <a:off x="0" y="0"/>
+                      <a:ext cx="5274310" cy="2360295"/>
+                    </a:xfrm>
+                    <a:prstGeom prst="rect">
+                      <a:avLst/>
+                    </a:prstGeom>
+                  </pic:spPr>
+                </pic:pic>
+              </a:graphicData>
+            </a:graphic>
+          </wp:inline>
+        </w:drawing>
+      </w:r>
+    </w:p>
+    <w:p>
+      <w:pPr>
+        <w:jc w:val="left"/>
+      </w:pPr>
+      <w:r>
+        <w:rPr>
+          <w:noProof/>
+        </w:rPr>
+        <w:lastRenderedPageBreak/>
+        <w:drawing>
+          <wp:inline distT="0" distB="0" distL="0" distR="0" wp14:anchorId="0B78E0C1" wp14:editId="0ED73B1D">
+            <wp:extent cx="5274310" cy="2898140"/>
+            <wp:effectExtent l="0" t="0" r="2540" b="0"/>
+            <wp:docPr id="1413408770" name="圖片 1"/>
+            <wp:cNvGraphicFramePr>
+              <a:graphicFrameLocks xmlns:a="http://schemas.openxmlformats.org/drawingml/2006/main" noChangeAspect="1"/>
+            </wp:cNvGraphicFramePr>
+            <a:graphic xmlns:a="http://schemas.openxmlformats.org/drawingml/2006/main">
+              <a:graphicData uri="http://schemas.openxmlformats.org/drawingml/2006/picture">
+                <pic:pic xmlns:pic="http://schemas.openxmlformats.org/drawingml/2006/picture">
+                  <pic:nvPicPr>
+                    <pic:cNvPr id="1413408770" name=""/>
+                    <pic:cNvPicPr/>
+                  </pic:nvPicPr>
+                  <pic:blipFill>
+                    <a:blip r:embed="rId12"/>
+                    <a:stretch>
+                      <a:fillRect/>
+                    </a:stretch>
+                  </pic:blipFill>
+                  <pic:spPr>
+                    <a:xfrm>
+                      <a:off x="0" y="0"/>
+                      <a:ext cx="5274310" cy="2898140"/>
+                    </a:xfrm>
+                    <a:prstGeom prst="rect">
+                      <a:avLst/>
+                    </a:prstGeom>
+                  </pic:spPr>
+                </pic:pic>
+              </a:graphicData>
+            </a:graphic>
+          </wp:inline>
+        </w:drawing>
+      </w:r>
+    </w:p>
+    <w:p>
+      <w:pPr>
+        <w:jc w:val="left"/>
+      </w:pPr>
+      <w:r>
+        <w:rPr>
+          <w:noProof/>
+        </w:rPr>
+        <w:drawing>
+          <wp:inline distT="0" distB="0" distL="0" distR="0" wp14:anchorId="2930EBA4" wp14:editId="441E0757">
+            <wp:extent cx="5274310" cy="1220470"/>
+            <wp:effectExtent l="0" t="0" r="2540" b="0"/>
+            <wp:docPr id="1136173474" name="圖片 1"/>
+            <wp:cNvGraphicFramePr>
+              <a:graphicFrameLocks xmlns:a="http://schemas.openxmlformats.org/drawingml/2006/main" noChangeAspect="1"/>
+            </wp:cNvGraphicFramePr>
+            <a:graphic xmlns:a="http://schemas.openxmlformats.org/drawingml/2006/main">
+              <a:graphicData uri="http://schemas.openxmlformats.org/drawingml/2006/picture">
+                <pic:pic xmlns:pic="http://schemas.openxmlformats.org/drawingml/2006/picture">
+                  <pic:nvPicPr>
+                    <pic:cNvPr id="1136173474" name=""/>
+                    <pic:cNvPicPr/>
+                  </pic:nvPicPr>
+                  <pic:blipFill>
+                    <a:blip r:embed="rId13"/>
+                    <a:stretch>
+                      <a:fillRect/>
+                    </a:stretch>
+                  </pic:blipFill>
+                  <pic:spPr>
+                    <a:xfrm>
+                      <a:off x="0" y="0"/>
+                      <a:ext cx="5274310" cy="1220470"/>
+                    </a:xfrm>
+                    <a:prstGeom prst="rect">
+                      <a:avLst/>
+                    </a:prstGeom>
+                  </pic:spPr>
+                </pic:pic>
+              </a:graphicData>
+            </a:graphic>
+          </wp:inline>
+        </w:drawing>
+      </w:r>
+    </w:p>
+    <w:p>
+      <w:pPr>
+        <w:jc w:val="left"/>
+      </w:pPr>
+      <w:r>
+        <w:rPr>
+          <w:noProof/>
+        </w:rPr>
+        <w:drawing>
+          <wp:inline distT="0" distB="0" distL="0" distR="0" wp14:anchorId="0F6B4E1A" wp14:editId="113E51D4">
+            <wp:extent cx="5274310" cy="2874010"/>
+            <wp:effectExtent l="0" t="0" r="2540" b="2540"/>
+            <wp:docPr id="886711411" name="圖片 1"/>
+            <wp:cNvGraphicFramePr>
+              <a:graphicFrameLocks xmlns:a="http://schemas.openxmlformats.org/drawingml/2006/main" noChangeAspect="1"/>
+            </wp:cNvGraphicFramePr>
+            <a:graphic xmlns:a="http://schemas.openxmlformats.org/drawingml/2006/main">
+              <a:graphicData uri="http://schemas.openxmlformats.org/drawingml/2006/picture">
+                <pic:pic xmlns:pic="http://schemas.openxmlformats.org/drawingml/2006/picture">
+                  <pic:nvPicPr>
+                    <pic:cNvPr id="886711411" name=""/>
+                    <pic:cNvPicPr/>
+                  </pic:nvPicPr>
+                  <pic:blipFill>
+                    <a:blip r:embed="rId14"/>
+                    <a:stretch>
+                      <a:fillRect/>
+                    </a:stretch>
+                  </pic:blipFill>
+                  <pic:spPr>
+                    <a:xfrm>
+                      <a:off x="0" y="0"/>
+                      <a:ext cx="5274310" cy="2874010"/>
+                    </a:xfrm>
+                    <a:prstGeom prst="rect">
+                      <a:avLst/>
+                    </a:prstGeom>
+                  </pic:spPr>
+                </pic:pic>
+              </a:graphicData>
+            </a:graphic>
+          </wp:inline>
+        </w:drawing>
+      </w:r>
+    </w:p>
+    <w:p>
+      <w:pPr>
+        <w:jc w:val="left"/>
+        <w:rPr>
+          <w:rFonts w:hint="eastAsia"/>
+        </w:rPr>
+      </w:pPr>
+      <w:r>
+        <w:rPr>
+          <w:noProof/>
+        </w:rPr>
+        <w:lastRenderedPageBreak/>
+        <w:drawing>
+          <wp:inline distT="0" distB="0" distL="0" distR="0" wp14:anchorId="40F4A1C2" wp14:editId="254072D8">
+            <wp:extent cx="5274310" cy="2540635"/>
+            <wp:effectExtent l="0" t="0" r="2540" b="0"/>
+            <wp:docPr id="1076929682" name="圖片 1"/>
+            <wp:cNvGraphicFramePr>
+              <a:graphicFrameLocks xmlns:a="http://schemas.openxmlformats.org/drawingml/2006/main" noChangeAspect="1"/>
+            </wp:cNvGraphicFramePr>
+            <a:graphic xmlns:a="http://schemas.openxmlformats.org/drawingml/2006/main">
+              <a:graphicData uri="http://schemas.openxmlformats.org/drawingml/2006/picture">
+                <pic:pic xmlns:pic="http://schemas.openxmlformats.org/drawingml/2006/picture">
+                  <pic:nvPicPr>
+                    <pic:cNvPr id="1076929682" name=""/>
+                    <pic:cNvPicPr/>
+                  </pic:nvPicPr>
+                  <pic:blipFill>
+                    <a:blip r:embed="rId15"/>
+                    <a:stretch>
+                      <a:fillRect/>
+                    </a:stretch>
+                  </pic:blipFill>
+                  <pic:spPr>
+                    <a:xfrm>
+                      <a:off x="0" y="0"/>
+                      <a:ext cx="5274310" cy="2540635"/>
+                    </a:xfrm>
+                    <a:prstGeom prst="rect">
+                      <a:avLst/>
+                    </a:prstGeom>
+                  </pic:spPr>
+                </pic:pic>
+              </a:graphicData>
+            </a:graphic>
+          </wp:inline>
+        </w:drawing>
+      </w:r>
+    </w:p>
     <w:sectPr>
       <w:pgSz w:w="11906" w:h="16838"/>
       <w:pgMar w:top="1440" w:right="1800" w:bottom="1440" w:left="1800" w:header="851" w:footer="992" w:gutter="0"/>
@@ -227,6 +504,44 @@
     </w:sectPr>
   </w:body>
 </w:document>
+</file>
+
+<file path=word/endnotes.xml><?xml version="1.0" encoding="utf-8"?>
+<w:endnotes xmlns:wpc="http://schemas.microsoft.com/office/word/2010/wordprocessingCanvas" xmlns:cx="http://schemas.microsoft.com/office/drawing/2014/chartex" xmlns:cx1="http://schemas.microsoft.com/office/drawing/2015/9/8/chartex" xmlns:cx2="http://schemas.microsoft.com/office/drawing/2015/10/21/chartex" xmlns:cx3="http://schemas.microsoft.com/office/drawing/2016/5/9/chartex" xmlns:cx4="http://schemas.microsoft.com/office/drawing/2016/5/10/chartex" xmlns:cx5="http://schemas.microsoft.com/office/drawing/2016/5/11/chartex" xmlns:cx6="http://schemas.microsoft.com/office/drawing/2016/5/12/chartex" xmlns:cx7="http://schemas.microsoft.com/office/drawing/2016/5/13/chartex" xmlns:cx8="http://schemas.microsoft.com/office/drawing/2016/5/14/chartex" xmlns:mc="http://schemas.openxmlformats.org/markup-compatibility/2006" xmlns:aink="http://schemas.microsoft.com/office/drawing/2016/ink" xmlns:am3d="http://schemas.microsoft.com/office/drawing/2017/model3d" xmlns:o="urn:schemas-microsoft-com:office:office" xmlns:oel="http://schemas.microsoft.com/office/2019/extlst" xmlns:r="http://schemas.openxmlformats.org/officeDocument/2006/relationships" xmlns:m="http://schemas.openxmlformats.org/officeDocument/2006/math" xmlns:v="urn:schemas-microsoft-com:vml" xmlns:wp14="http://schemas.microsoft.com/office/word/2010/wordprocessingDrawing" xmlns:wp="http://schemas.openxmlformats.org/drawingml/2006/wordprocessingDrawing" xmlns:w10="urn:schemas-microsoft-com:office:word" xmlns:w="http://schemas.openxmlformats.org/wordprocessingml/2006/main" xmlns:w14="http://schemas.microsoft.com/office/word/2010/wordml" xmlns:w15="http://schemas.microsoft.com/office/word/2012/wordml" xmlns:w16cex="http://schemas.microsoft.com/office/word/2018/wordml/cex" xmlns:w16cid="http://schemas.microsoft.com/office/word/2016/wordml/cid" xmlns:w16="http://schemas.microsoft.com/office/word/2018/wordml" xmlns:w16du="http://schemas.microsoft.com/office/word/2023/wordml/word16du" xmlns:w16sdtdh="http://schemas.microsoft.com/office/word/2020/wordml/sdtdatahash" xmlns:w16sdtfl="http://schemas.microsoft.com/office/word/2024/wordml/sdtformatlock" xmlns:w16se="http://schemas.microsoft.com/office/word/2015/wordml/symex" xmlns:wpg="http://schemas.microsoft.com/office/word/2010/wordprocessingGroup" xmlns:wpi="http://schemas.microsoft.com/office/word/2010/wordprocessingInk" xmlns:wne="http://schemas.microsoft.com/office/word/2006/wordml" xmlns:wps="http://schemas.microsoft.com/office/word/2010/wordprocessingShape" mc:Ignorable="w14 w15 w16se w16cid w16 w16cex w16sdtdh w16sdtfl w16du wp14">
+  <w:endnote w:type="separator" w:id="-1">
+    <w:p>
+      <w:r>
+        <w:separator/>
+      </w:r>
+    </w:p>
+  </w:endnote>
+  <w:endnote w:type="continuationSeparator" w:id="0">
+    <w:p>
+      <w:r>
+        <w:continuationSeparator/>
+      </w:r>
+    </w:p>
+  </w:endnote>
+</w:endnotes>
+</file>
+
+<file path=word/footnotes.xml><?xml version="1.0" encoding="utf-8"?>
+<w:footnotes xmlns:wpc="http://schemas.microsoft.com/office/word/2010/wordprocessingCanvas" xmlns:cx="http://schemas.microsoft.com/office/drawing/2014/chartex" xmlns:cx1="http://schemas.microsoft.com/office/drawing/2015/9/8/chartex" xmlns:cx2="http://schemas.microsoft.com/office/drawing/2015/10/21/chartex" xmlns:cx3="http://schemas.microsoft.com/office/drawing/2016/5/9/chartex" xmlns:cx4="http://schemas.microsoft.com/office/drawing/2016/5/10/chartex" xmlns:cx5="http://schemas.microsoft.com/office/drawing/2016/5/11/chartex" xmlns:cx6="http://schemas.microsoft.com/office/drawing/2016/5/12/chartex" xmlns:cx7="http://schemas.microsoft.com/office/drawing/2016/5/13/chartex" xmlns:cx8="http://schemas.microsoft.com/office/drawing/2016/5/14/chartex" xmlns:mc="http://schemas.openxmlformats.org/markup-compatibility/2006" xmlns:aink="http://schemas.microsoft.com/office/drawing/2016/ink" xmlns:am3d="http://schemas.microsoft.com/office/drawing/2017/model3d" xmlns:o="urn:schemas-microsoft-com:office:office" xmlns:oel="http://schemas.microsoft.com/office/2019/extlst" xmlns:r="http://schemas.openxmlformats.org/officeDocument/2006/relationships" xmlns:m="http://schemas.openxmlformats.org/officeDocument/2006/math" xmlns:v="urn:schemas-microsoft-com:vml" xmlns:wp14="http://schemas.microsoft.com/office/word/2010/wordprocessingDrawing" xmlns:wp="http://schemas.openxmlformats.org/drawingml/2006/wordprocessingDrawing" xmlns:w10="urn:schemas-microsoft-com:office:word" xmlns:w="http://schemas.openxmlformats.org/wordprocessingml/2006/main" xmlns:w14="http://schemas.microsoft.com/office/word/2010/wordml" xmlns:w15="http://schemas.microsoft.com/office/word/2012/wordml" xmlns:w16cex="http://schemas.microsoft.com/office/word/2018/wordml/cex" xmlns:w16cid="http://schemas.microsoft.com/office/word/2016/wordml/cid" xmlns:w16="http://schemas.microsoft.com/office/word/2018/wordml" xmlns:w16du="http://schemas.microsoft.com/office/word/2023/wordml/word16du" xmlns:w16sdtdh="http://schemas.microsoft.com/office/word/2020/wordml/sdtdatahash" xmlns:w16sdtfl="http://schemas.microsoft.com/office/word/2024/wordml/sdtformatlock" xmlns:w16se="http://schemas.microsoft.com/office/word/2015/wordml/symex" xmlns:wpg="http://schemas.microsoft.com/office/word/2010/wordprocessingGroup" xmlns:wpi="http://schemas.microsoft.com/office/word/2010/wordprocessingInk" xmlns:wne="http://schemas.microsoft.com/office/word/2006/wordml" xmlns:wps="http://schemas.microsoft.com/office/word/2010/wordprocessingShape" mc:Ignorable="w14 w15 w16se w16cid w16 w16cex w16sdtdh w16sdtfl w16du wp14">
+  <w:footnote w:type="separator" w:id="-1">
+    <w:p>
+      <w:r>
+        <w:separator/>
+      </w:r>
+    </w:p>
+  </w:footnote>
+  <w:footnote w:type="continuationSeparator" w:id="0">
+    <w:p>
+      <w:r>
+        <w:continuationSeparator/>
+      </w:r>
+    </w:p>
+  </w:footnote>
+</w:footnotes>
 </file>
 
 <file path=word/numbering.xml><?xml version="1.0" encoding="utf-8"?>
@@ -1383,6 +1698,66 @@
       <w:spacing w:val="5"/>
     </w:rPr>
   </w:style>
+  <w:style w:type="paragraph" w:styleId="ae">
+    <w:name w:val="header"/>
+    <w:basedOn w:val="a"/>
+    <w:link w:val="af"/>
+    <w:uiPriority w:val="99"/>
+    <w:unhideWhenUsed/>
+    <w:rsid w:val="001369BD"/>
+    <w:pPr>
+      <w:tabs>
+        <w:tab w:val="center" w:pos="4153"/>
+        <w:tab w:val="right" w:pos="8306"/>
+      </w:tabs>
+      <w:snapToGrid w:val="0"/>
+    </w:pPr>
+    <w:rPr>
+      <w:sz w:val="20"/>
+      <w:szCs w:val="20"/>
+    </w:rPr>
+  </w:style>
+  <w:style w:type="character" w:customStyle="1" w:styleId="af">
+    <w:name w:val="頁首 字元"/>
+    <w:basedOn w:val="a0"/>
+    <w:link w:val="ae"/>
+    <w:uiPriority w:val="99"/>
+    <w:rsid w:val="001369BD"/>
+    <w:rPr>
+      <w:sz w:val="20"/>
+      <w:szCs w:val="20"/>
+    </w:rPr>
+  </w:style>
+  <w:style w:type="paragraph" w:styleId="af0">
+    <w:name w:val="footer"/>
+    <w:basedOn w:val="a"/>
+    <w:link w:val="af1"/>
+    <w:uiPriority w:val="99"/>
+    <w:unhideWhenUsed/>
+    <w:rsid w:val="001369BD"/>
+    <w:pPr>
+      <w:tabs>
+        <w:tab w:val="center" w:pos="4153"/>
+        <w:tab w:val="right" w:pos="8306"/>
+      </w:tabs>
+      <w:snapToGrid w:val="0"/>
+    </w:pPr>
+    <w:rPr>
+      <w:sz w:val="20"/>
+      <w:szCs w:val="20"/>
+    </w:rPr>
+  </w:style>
+  <w:style w:type="character" w:customStyle="1" w:styleId="af1">
+    <w:name w:val="頁尾 字元"/>
+    <w:basedOn w:val="a0"/>
+    <w:link w:val="af0"/>
+    <w:uiPriority w:val="99"/>
+    <w:rsid w:val="001369BD"/>
+    <w:rPr>
+      <w:sz w:val="20"/>
+      <w:szCs w:val="20"/>
+    </w:rPr>
+  </w:style>
 </w:styles>
 </file>
 

</xml_diff>

<commit_message>
0.11.8 style: enhance text typography and visual styling on monitor
</commit_message>
<xml_diff>
--- a/To do.docx
+++ b/To do.docx
@@ -7,7 +7,35 @@
         <w:rPr>
           <w:rFonts w:hint="eastAsia"/>
         </w:rPr>
-        <w:t>預設是一個顯示器，一個平板，平板選擇詞匯后，透過影像識別，流淚流出詞匯最終流入平板，匯聚成寶石。</w:t>
+        <w:t>預設是一個顯示器，一個平板，平板選擇詞</w:t>
+      </w:r>
+      <w:proofErr w:type="gramStart"/>
+      <w:r>
+        <w:rPr>
+          <w:rFonts w:hint="eastAsia"/>
+        </w:rPr>
+        <w:t>匯后</w:t>
+      </w:r>
+      <w:proofErr w:type="gramEnd"/>
+      <w:r>
+        <w:rPr>
+          <w:rFonts w:hint="eastAsia"/>
+        </w:rPr>
+        <w:t>，透過影像識別，流淚流出詞</w:t>
+      </w:r>
+      <w:proofErr w:type="gramStart"/>
+      <w:r>
+        <w:rPr>
+          <w:rFonts w:hint="eastAsia"/>
+        </w:rPr>
+        <w:t>匯</w:t>
+      </w:r>
+      <w:proofErr w:type="gramEnd"/>
+      <w:r>
+        <w:rPr>
+          <w:rFonts w:hint="eastAsia"/>
+        </w:rPr>
+        <w:t>最終流入平板，匯聚成寶石。</w:t>
       </w:r>
     </w:p>
     <w:p/>
@@ -30,7 +58,55 @@
         <w:t>Pixi</w:t>
       </w:r>
       <w:r>
-        <w:t>，設計點擊五組心情詞擇一後，透過影像識別人眼，最終選擇的心情詞會不斷從眼中流出（流出的詞匯越來越多，有最大值），詞匯在顯示器的流動過程中，慢慢由完整的字分解成流動的水墨，最後流入顯示器底端，幾秒后平板接續顯示器的水墨，並慢慢往平板中心匯聚，匯聚過程中漸漸變色（顔色是根據最終要生成的寶石顔色決定）</w:t>
+        <w:t>，設計點擊五組心情詞擇</w:t>
+      </w:r>
+      <w:proofErr w:type="gramStart"/>
+      <w:r>
+        <w:t>一</w:t>
+      </w:r>
+      <w:proofErr w:type="gramEnd"/>
+      <w:r>
+        <w:t>後，透過影像識別人眼，最終選擇的</w:t>
+      </w:r>
+      <w:proofErr w:type="gramStart"/>
+      <w:r>
+        <w:t>心情詞會不斷</w:t>
+      </w:r>
+      <w:proofErr w:type="gramEnd"/>
+      <w:r>
+        <w:t>從眼中流出（流出的詞</w:t>
+      </w:r>
+      <w:proofErr w:type="gramStart"/>
+      <w:r>
+        <w:t>匯</w:t>
+      </w:r>
+      <w:proofErr w:type="gramEnd"/>
+      <w:r>
+        <w:t>越來越多，有最大值），詞</w:t>
+      </w:r>
+      <w:proofErr w:type="gramStart"/>
+      <w:r>
+        <w:t>匯</w:t>
+      </w:r>
+      <w:proofErr w:type="gramEnd"/>
+      <w:r>
+        <w:t>在顯示器的流動過程中，慢慢由完整的字分解成流動的水墨，最後流入顯示器底端，幾秒</w:t>
+      </w:r>
+      <w:proofErr w:type="gramStart"/>
+      <w:r>
+        <w:t>后</w:t>
+      </w:r>
+      <w:proofErr w:type="gramEnd"/>
+      <w:r>
+        <w:t>平板接續顯示器的水墨，並慢慢往平板中心匯聚，匯聚過程中漸漸變色</w:t>
+      </w:r>
+      <w:proofErr w:type="gramStart"/>
+      <w:r>
+        <w:t>（</w:t>
+      </w:r>
+      <w:proofErr w:type="gramEnd"/>
+      <w:r>
+        <w:t>顔色是根據最終要生成的寶石顔色決定）</w:t>
       </w:r>
       <w:r>
         <w:t>,</w:t>
@@ -450,9 +526,6 @@
     <w:p>
       <w:pPr>
         <w:jc w:val="left"/>
-        <w:rPr>
-          <w:rFonts w:hint="eastAsia"/>
-        </w:rPr>
       </w:pPr>
       <w:r>
         <w:rPr>
@@ -494,6 +567,47 @@
             </a:graphic>
           </wp:inline>
         </w:drawing>
+      </w:r>
+    </w:p>
+    <w:p>
+      <w:pPr>
+        <w:jc w:val="left"/>
+      </w:pPr>
+    </w:p>
+    <w:p>
+      <w:pPr>
+        <w:jc w:val="left"/>
+      </w:pPr>
+      <w:r>
+        <w:rPr>
+          <w:rFonts w:hint="eastAsia"/>
+        </w:rPr>
+        <w:t>黑體淺藍文字、半透明邊框</w:t>
+      </w:r>
+    </w:p>
+    <w:p>
+      <w:pPr>
+        <w:jc w:val="left"/>
+      </w:pPr>
+      <w:r>
+        <w:rPr>
+          <w:rFonts w:hint="eastAsia"/>
+        </w:rPr>
+        <w:t>序列圖旋轉慢一點</w:t>
+      </w:r>
+    </w:p>
+    <w:p>
+      <w:pPr>
+        <w:jc w:val="left"/>
+        <w:rPr>
+          <w:rFonts w:hint="eastAsia"/>
+        </w:rPr>
+      </w:pPr>
+      <w:r>
+        <w:rPr>
+          <w:rFonts w:hint="eastAsia"/>
+        </w:rPr>
+        <w:t>不要波紋，保持顯影</w:t>
       </w:r>
     </w:p>
     <w:sectPr>

</xml_diff>

<commit_message>
0.11.10 fix: correct reference filename
</commit_message>
<xml_diff>
--- a/To do.docx
+++ b/To do.docx
@@ -3,39 +3,431 @@
 <w:document xmlns:wpc="http://schemas.microsoft.com/office/word/2010/wordprocessingCanvas" xmlns:cx="http://schemas.microsoft.com/office/drawing/2014/chartex" xmlns:cx1="http://schemas.microsoft.com/office/drawing/2015/9/8/chartex" xmlns:cx2="http://schemas.microsoft.com/office/drawing/2015/10/21/chartex" xmlns:cx3="http://schemas.microsoft.com/office/drawing/2016/5/9/chartex" xmlns:cx4="http://schemas.microsoft.com/office/drawing/2016/5/10/chartex" xmlns:cx5="http://schemas.microsoft.com/office/drawing/2016/5/11/chartex" xmlns:cx6="http://schemas.microsoft.com/office/drawing/2016/5/12/chartex" xmlns:cx7="http://schemas.microsoft.com/office/drawing/2016/5/13/chartex" xmlns:cx8="http://schemas.microsoft.com/office/drawing/2016/5/14/chartex" xmlns:mc="http://schemas.openxmlformats.org/markup-compatibility/2006" xmlns:aink="http://schemas.microsoft.com/office/drawing/2016/ink" xmlns:am3d="http://schemas.microsoft.com/office/drawing/2017/model3d" xmlns:o="urn:schemas-microsoft-com:office:office" xmlns:oel="http://schemas.microsoft.com/office/2019/extlst" xmlns:r="http://schemas.openxmlformats.org/officeDocument/2006/relationships" xmlns:m="http://schemas.openxmlformats.org/officeDocument/2006/math" xmlns:v="urn:schemas-microsoft-com:vml" xmlns:wp14="http://schemas.microsoft.com/office/word/2010/wordprocessingDrawing" xmlns:wp="http://schemas.openxmlformats.org/drawingml/2006/wordprocessingDrawing" xmlns:w10="urn:schemas-microsoft-com:office:word" xmlns:w="http://schemas.openxmlformats.org/wordprocessingml/2006/main" xmlns:w14="http://schemas.microsoft.com/office/word/2010/wordml" xmlns:w15="http://schemas.microsoft.com/office/word/2012/wordml" xmlns:w16cex="http://schemas.microsoft.com/office/word/2018/wordml/cex" xmlns:w16cid="http://schemas.microsoft.com/office/word/2016/wordml/cid" xmlns:w16="http://schemas.microsoft.com/office/word/2018/wordml" xmlns:w16du="http://schemas.microsoft.com/office/word/2023/wordml/word16du" xmlns:w16sdtdh="http://schemas.microsoft.com/office/word/2020/wordml/sdtdatahash" xmlns:w16sdtfl="http://schemas.microsoft.com/office/word/2024/wordml/sdtformatlock" xmlns:w16se="http://schemas.microsoft.com/office/word/2015/wordml/symex" xmlns:wpg="http://schemas.microsoft.com/office/word/2010/wordprocessingGroup" xmlns:wpi="http://schemas.microsoft.com/office/word/2010/wordprocessingInk" xmlns:wne="http://schemas.microsoft.com/office/word/2006/wordml" xmlns:wps="http://schemas.microsoft.com/office/word/2010/wordprocessingShape" mc:Ignorable="w14 w15 w16se w16cid w16 w16cex w16sdtdh w16sdtfl w16du wp14">
   <w:body>
     <w:p>
+      <w:pPr>
+        <w:jc w:val="left"/>
+        <w:rPr>
+          <w:rFonts w:eastAsia="DengXian"/>
+          <w:lang w:eastAsia="zh-CN"/>
+        </w:rPr>
+      </w:pPr>
+      <w:r>
+        <w:rPr>
+          <w:rFonts w:ascii="DengXian" w:eastAsia="DengXian" w:hAnsi="DengXian" w:cs="微軟正黑體" w:hint="eastAsia"/>
+          <w:lang w:eastAsia="zh-CN"/>
+        </w:rPr>
+        <w:t>设计组：</w:t>
+      </w:r>
+    </w:p>
+    <w:p>
+      <w:pPr>
+        <w:jc w:val="left"/>
+        <w:rPr>
+          <w:rFonts w:eastAsia="DengXian"/>
+          <w:lang w:eastAsia="zh-CN"/>
+        </w:rPr>
+      </w:pPr>
+      <w:sdt>
+        <w:sdtPr>
+          <w:rPr>
+            <w:rFonts w:eastAsia="DengXian" w:hint="eastAsia"/>
+            <w:lang w:eastAsia="zh-CN"/>
+          </w:rPr>
+          <w:id w:val="-8457041"/>
+          <w14:checkbox>
+            <w14:checked w14:val="0"/>
+            <w14:checkedState w14:val="2612" w14:font="MS Gothic"/>
+            <w14:uncheckedState w14:val="2610" w14:font="MS Gothic"/>
+          </w14:checkbox>
+        </w:sdtPr>
+        <w:sdtContent>
+          <w:r>
+            <w:rPr>
+              <w:rFonts w:ascii="MS Gothic" w:eastAsia="MS Gothic" w:hAnsi="MS Gothic" w:hint="eastAsia"/>
+              <w:lang w:eastAsia="zh-CN"/>
+            </w:rPr>
+            <w:t>☐</w:t>
+          </w:r>
+        </w:sdtContent>
+      </w:sdt>
+      <w:r>
+        <w:rPr>
+          <w:rFonts w:eastAsia="DengXian" w:hint="eastAsia"/>
+          <w:lang w:eastAsia="zh-CN"/>
+        </w:rPr>
+        <w:t xml:space="preserve"> </w:t>
+      </w:r>
+      <w:r>
+        <w:rPr>
+          <w:rFonts w:eastAsia="DengXian" w:hint="eastAsia"/>
+          <w:lang w:eastAsia="zh-CN"/>
+        </w:rPr>
+        <w:t>待机动画</w:t>
+      </w:r>
+    </w:p>
+    <w:p>
+      <w:pPr>
+        <w:jc w:val="left"/>
+        <w:rPr>
+          <w:rFonts w:eastAsia="DengXian"/>
+          <w:lang w:eastAsia="zh-CN"/>
+        </w:rPr>
+      </w:pPr>
+      <w:sdt>
+        <w:sdtPr>
+          <w:rPr>
+            <w:rFonts w:eastAsia="DengXian" w:hint="eastAsia"/>
+            <w:lang w:eastAsia="zh-CN"/>
+          </w:rPr>
+          <w:id w:val="-1995182535"/>
+          <w14:checkbox>
+            <w14:checked w14:val="0"/>
+            <w14:checkedState w14:val="2612" w14:font="MS Gothic"/>
+            <w14:uncheckedState w14:val="2610" w14:font="MS Gothic"/>
+          </w14:checkbox>
+        </w:sdtPr>
+        <w:sdtContent>
+          <w:r>
+            <w:rPr>
+              <w:rFonts w:ascii="MS Gothic" w:eastAsia="MS Gothic" w:hAnsi="MS Gothic" w:hint="eastAsia"/>
+              <w:lang w:eastAsia="zh-CN"/>
+            </w:rPr>
+            <w:t>☐</w:t>
+          </w:r>
+        </w:sdtContent>
+      </w:sdt>
+      <w:r>
+        <w:rPr>
+          <w:rFonts w:eastAsia="DengXian" w:hint="eastAsia"/>
+          <w:lang w:eastAsia="zh-CN"/>
+        </w:rPr>
+        <w:t xml:space="preserve"> UI设计</w:t>
+      </w:r>
+    </w:p>
+    <w:p>
+      <w:pPr>
+        <w:jc w:val="left"/>
+        <w:rPr>
+          <w:rFonts w:eastAsia="DengXian"/>
+          <w:lang w:eastAsia="zh-CN"/>
+        </w:rPr>
+      </w:pPr>
+      <w:sdt>
+        <w:sdtPr>
+          <w:rPr>
+            <w:rFonts w:eastAsia="DengXian" w:hint="eastAsia"/>
+            <w:lang w:eastAsia="zh-CN"/>
+          </w:rPr>
+          <w:id w:val="1635052256"/>
+          <w14:checkbox>
+            <w14:checked w14:val="0"/>
+            <w14:checkedState w14:val="2612" w14:font="MS Gothic"/>
+            <w14:uncheckedState w14:val="2610" w14:font="MS Gothic"/>
+          </w14:checkbox>
+        </w:sdtPr>
+        <w:sdtContent>
+          <w:r>
+            <w:rPr>
+              <w:rFonts w:ascii="MS Gothic" w:eastAsia="MS Gothic" w:hAnsi="MS Gothic" w:hint="eastAsia"/>
+              <w:lang w:eastAsia="zh-CN"/>
+            </w:rPr>
+            <w:t>☐</w:t>
+          </w:r>
+        </w:sdtContent>
+      </w:sdt>
+      <w:r>
+        <w:rPr>
+          <w:rFonts w:eastAsia="DengXian" w:hint="eastAsia"/>
+          <w:lang w:eastAsia="zh-CN"/>
+        </w:rPr>
+        <w:t xml:space="preserve"> 5个宝石的旋转序列图</w:t>
+      </w:r>
+      <w:r>
+        <w:rPr>
+          <w:rFonts w:eastAsia="DengXian" w:hint="eastAsia"/>
+          <w:lang w:eastAsia="zh-CN"/>
+        </w:rPr>
+        <w:t>（</w:t>
+      </w:r>
+      <w:r>
+        <w:rPr>
+          <w:rFonts w:eastAsia="DengXian" w:hint="eastAsia"/>
+          <w:lang w:eastAsia="zh-CN"/>
+        </w:rPr>
+        <w:t>规格、裁切</w:t>
+      </w:r>
+      <w:r>
+        <w:rPr>
+          <w:rFonts w:eastAsia="DengXian" w:hint="eastAsia"/>
+          <w:lang w:eastAsia="zh-CN"/>
+        </w:rPr>
+        <w:t>）</w:t>
+      </w:r>
+    </w:p>
+    <w:p>
+      <w:pPr>
+        <w:jc w:val="left"/>
+        <w:rPr>
+          <w:rFonts w:eastAsia="DengXian"/>
+          <w:lang w:eastAsia="zh-CN"/>
+        </w:rPr>
+      </w:pPr>
+      <w:sdt>
+        <w:sdtPr>
+          <w:rPr>
+            <w:rFonts w:eastAsia="DengXian" w:hint="eastAsia"/>
+            <w:lang w:eastAsia="zh-CN"/>
+          </w:rPr>
+          <w:id w:val="1410652168"/>
+          <w14:checkbox>
+            <w14:checked w14:val="0"/>
+            <w14:checkedState w14:val="2612" w14:font="MS Gothic"/>
+            <w14:uncheckedState w14:val="2610" w14:font="MS Gothic"/>
+          </w14:checkbox>
+        </w:sdtPr>
+        <w:sdtContent>
+          <w:r>
+            <w:rPr>
+              <w:rFonts w:ascii="MS Gothic" w:eastAsia="MS Gothic" w:hAnsi="MS Gothic" w:hint="eastAsia"/>
+              <w:lang w:eastAsia="zh-CN"/>
+            </w:rPr>
+            <w:t>☐</w:t>
+          </w:r>
+        </w:sdtContent>
+      </w:sdt>
+      <w:r>
+        <w:rPr>
+          <w:rFonts w:eastAsia="DengXian" w:hint="eastAsia"/>
+          <w:lang w:eastAsia="zh-CN"/>
+        </w:rPr>
+        <w:t xml:space="preserve"> 装置连接测试</w:t>
+      </w:r>
+    </w:p>
+    <w:p>
+      <w:pPr>
+        <w:jc w:val="left"/>
+        <w:rPr>
+          <w:rFonts w:eastAsia="DengXian"/>
+          <w:lang w:eastAsia="zh-CN"/>
+        </w:rPr>
+      </w:pPr>
+      <w:sdt>
+        <w:sdtPr>
+          <w:rPr>
+            <w:rFonts w:eastAsia="DengXian" w:hint="eastAsia"/>
+            <w:lang w:eastAsia="zh-CN"/>
+          </w:rPr>
+          <w:id w:val="1141612850"/>
+          <w14:checkbox>
+            <w14:checked w14:val="0"/>
+            <w14:checkedState w14:val="2612" w14:font="MS Gothic"/>
+            <w14:uncheckedState w14:val="2610" w14:font="MS Gothic"/>
+          </w14:checkbox>
+        </w:sdtPr>
+        <w:sdtContent>
+          <w:r>
+            <w:rPr>
+              <w:rFonts w:ascii="MS Gothic" w:eastAsia="MS Gothic" w:hAnsi="MS Gothic" w:hint="eastAsia"/>
+              <w:lang w:eastAsia="zh-CN"/>
+            </w:rPr>
+            <w:t>☐</w:t>
+          </w:r>
+        </w:sdtContent>
+      </w:sdt>
+      <w:r>
+        <w:rPr>
+          <w:rFonts w:eastAsia="DengXian" w:hint="eastAsia"/>
+          <w:lang w:eastAsia="zh-CN"/>
+        </w:rPr>
+        <w:t xml:space="preserve"> </w:t>
+      </w:r>
+      <w:r>
+        <w:rPr>
+          <w:rFonts w:eastAsia="DengXian" w:hint="eastAsia"/>
+          <w:lang w:eastAsia="zh-CN"/>
+        </w:rPr>
+        <w:t>海报</w:t>
+      </w:r>
+    </w:p>
+    <w:p>
+      <w:pPr>
+        <w:jc w:val="left"/>
+        <w:rPr>
+          <w:rFonts w:eastAsia="DengXian" w:hint="eastAsia"/>
+          <w:lang w:eastAsia="zh-CN"/>
+        </w:rPr>
+      </w:pPr>
+      <w:sdt>
+        <w:sdtPr>
+          <w:rPr>
+            <w:rFonts w:eastAsia="DengXian" w:hint="eastAsia"/>
+            <w:lang w:eastAsia="zh-CN"/>
+          </w:rPr>
+          <w:id w:val="1562210606"/>
+          <w14:checkbox>
+            <w14:checked w14:val="0"/>
+            <w14:checkedState w14:val="2612" w14:font="MS Gothic"/>
+            <w14:uncheckedState w14:val="2610" w14:font="MS Gothic"/>
+          </w14:checkbox>
+        </w:sdtPr>
+        <w:sdtContent>
+          <w:r>
+            <w:rPr>
+              <w:rFonts w:ascii="MS Gothic" w:eastAsia="MS Gothic" w:hAnsi="MS Gothic" w:hint="eastAsia"/>
+              <w:lang w:eastAsia="zh-CN"/>
+            </w:rPr>
+            <w:t>☐</w:t>
+          </w:r>
+        </w:sdtContent>
+      </w:sdt>
+      <w:r>
+        <w:rPr>
+          <w:rFonts w:eastAsia="DengXian" w:hint="eastAsia"/>
+          <w:lang w:eastAsia="zh-CN"/>
+        </w:rPr>
+        <w:t xml:space="preserve"> 展示ppt</w:t>
+      </w:r>
+      <w:r>
+        <w:rPr>
+          <w:rFonts w:eastAsia="DengXian" w:hint="eastAsia"/>
+          <w:lang w:eastAsia="zh-CN"/>
+        </w:rPr>
+        <w:t>_0525</w:t>
+      </w:r>
+    </w:p>
+    <w:p>
+      <w:pPr>
+        <w:jc w:val="left"/>
+        <w:rPr>
+          <w:rFonts w:eastAsia="DengXian" w:hint="eastAsia"/>
+          <w:lang w:eastAsia="zh-CN"/>
+        </w:rPr>
+      </w:pPr>
+    </w:p>
+    <w:p>
+      <w:pPr>
+        <w:jc w:val="left"/>
+        <w:rPr>
+          <w:rFonts w:eastAsia="DengXian" w:hint="eastAsia"/>
+          <w:lang w:eastAsia="zh-CN"/>
+        </w:rPr>
+      </w:pPr>
+      <w:r>
+        <w:rPr>
+          <w:rFonts w:eastAsia="DengXian" w:hint="eastAsia"/>
+          <w:lang w:eastAsia="zh-CN"/>
+        </w:rPr>
+        <w:t>科技组：</w:t>
+      </w:r>
+    </w:p>
+    <w:p>
+      <w:pPr>
+        <w:jc w:val="left"/>
+        <w:rPr>
+          <w:rFonts w:eastAsia="DengXian"/>
+          <w:lang w:eastAsia="zh-CN"/>
+        </w:rPr>
+      </w:pPr>
+      <w:sdt>
+        <w:sdtPr>
+          <w:rPr>
+            <w:rFonts w:eastAsia="DengXian" w:hint="eastAsia"/>
+            <w:lang w:eastAsia="zh-CN"/>
+          </w:rPr>
+          <w:id w:val="1096280076"/>
+          <w14:checkbox>
+            <w14:checked w14:val="0"/>
+            <w14:checkedState w14:val="2612" w14:font="MS Gothic"/>
+            <w14:uncheckedState w14:val="2610" w14:font="MS Gothic"/>
+          </w14:checkbox>
+        </w:sdtPr>
+        <w:sdtContent>
+          <w:r>
+            <w:rPr>
+              <w:rFonts w:ascii="MS Gothic" w:eastAsia="MS Gothic" w:hAnsi="MS Gothic" w:hint="eastAsia"/>
+              <w:lang w:eastAsia="zh-CN"/>
+            </w:rPr>
+            <w:t>☐</w:t>
+          </w:r>
+        </w:sdtContent>
+      </w:sdt>
+      <w:r>
+        <w:rPr>
+          <w:rFonts w:eastAsia="DengXian" w:hint="eastAsia"/>
+          <w:lang w:eastAsia="zh-CN"/>
+        </w:rPr>
+        <w:t xml:space="preserve"> </w:t>
+      </w:r>
+      <w:r>
+        <w:rPr>
+          <w:rFonts w:eastAsia="DengXian" w:hint="eastAsia"/>
+          <w:lang w:eastAsia="zh-CN"/>
+        </w:rPr>
+        <w:t>水波纹特效替换</w:t>
+      </w:r>
+    </w:p>
+    <w:p>
+      <w:pPr>
+        <w:jc w:val="left"/>
+        <w:rPr>
+          <w:rFonts w:eastAsia="DengXian"/>
+          <w:lang w:eastAsia="zh-CN"/>
+        </w:rPr>
+      </w:pPr>
+      <w:sdt>
+        <w:sdtPr>
+          <w:rPr>
+            <w:rFonts w:eastAsia="DengXian" w:hint="eastAsia"/>
+            <w:lang w:eastAsia="zh-CN"/>
+          </w:rPr>
+          <w:id w:val="1206906764"/>
+          <w14:checkbox>
+            <w14:checked w14:val="0"/>
+            <w14:checkedState w14:val="2612" w14:font="MS Gothic"/>
+            <w14:uncheckedState w14:val="2610" w14:font="MS Gothic"/>
+          </w14:checkbox>
+        </w:sdtPr>
+        <w:sdtContent>
+          <w:r>
+            <w:rPr>
+              <w:rFonts w:ascii="MS Gothic" w:eastAsia="MS Gothic" w:hAnsi="MS Gothic" w:hint="eastAsia"/>
+              <w:lang w:eastAsia="zh-CN"/>
+            </w:rPr>
+            <w:t>☐</w:t>
+          </w:r>
+        </w:sdtContent>
+      </w:sdt>
+      <w:r>
+        <w:rPr>
+          <w:rFonts w:eastAsia="DengXian" w:hint="eastAsia"/>
+          <w:lang w:eastAsia="zh-CN"/>
+        </w:rPr>
+        <w:t xml:space="preserve"> 文字图打包</w:t>
+      </w:r>
+    </w:p>
+    <w:p>
+      <w:pPr>
+        <w:jc w:val="left"/>
+        <w:rPr>
+          <w:rFonts w:eastAsia="DengXian" w:hint="eastAsia"/>
+          <w:lang w:eastAsia="zh-CN"/>
+        </w:rPr>
+      </w:pPr>
+    </w:p>
+    <w:p>
+      <w:pPr>
+        <w:jc w:val="left"/>
+      </w:pPr>
+      <w:r>
+        <w:br w:type="page"/>
+      </w:r>
+    </w:p>
+    <w:p>
       <w:r>
         <w:rPr>
           <w:rFonts w:hint="eastAsia"/>
         </w:rPr>
-        <w:t>預設是一個顯示器，一個平板，平板選擇詞</w:t>
-      </w:r>
-      <w:proofErr w:type="gramStart"/>
-      <w:r>
-        <w:rPr>
-          <w:rFonts w:hint="eastAsia"/>
-        </w:rPr>
-        <w:t>匯后</w:t>
-      </w:r>
-      <w:proofErr w:type="gramEnd"/>
-      <w:r>
-        <w:rPr>
-          <w:rFonts w:hint="eastAsia"/>
-        </w:rPr>
-        <w:t>，透過影像識別，流淚流出詞</w:t>
-      </w:r>
-      <w:proofErr w:type="gramStart"/>
-      <w:r>
-        <w:rPr>
-          <w:rFonts w:hint="eastAsia"/>
-        </w:rPr>
-        <w:t>匯</w:t>
-      </w:r>
-      <w:proofErr w:type="gramEnd"/>
-      <w:r>
-        <w:rPr>
-          <w:rFonts w:hint="eastAsia"/>
-        </w:rPr>
-        <w:t>最終流入平板，匯聚成寶石。</w:t>
+        <w:lastRenderedPageBreak/>
+        <w:t>預設是一個顯示器，一個平板，平板選擇詞匯后，透過影像識別，流淚流出詞匯最終流入平板，匯聚成寶石。</w:t>
       </w:r>
     </w:p>
     <w:p/>
@@ -58,55 +450,7 @@
         <w:t>Pixi</w:t>
       </w:r>
       <w:r>
-        <w:t>，設計點擊五組心情詞擇</w:t>
-      </w:r>
-      <w:proofErr w:type="gramStart"/>
-      <w:r>
-        <w:t>一</w:t>
-      </w:r>
-      <w:proofErr w:type="gramEnd"/>
-      <w:r>
-        <w:t>後，透過影像識別人眼，最終選擇的</w:t>
-      </w:r>
-      <w:proofErr w:type="gramStart"/>
-      <w:r>
-        <w:t>心情詞會不斷</w:t>
-      </w:r>
-      <w:proofErr w:type="gramEnd"/>
-      <w:r>
-        <w:t>從眼中流出（流出的詞</w:t>
-      </w:r>
-      <w:proofErr w:type="gramStart"/>
-      <w:r>
-        <w:t>匯</w:t>
-      </w:r>
-      <w:proofErr w:type="gramEnd"/>
-      <w:r>
-        <w:t>越來越多，有最大值），詞</w:t>
-      </w:r>
-      <w:proofErr w:type="gramStart"/>
-      <w:r>
-        <w:t>匯</w:t>
-      </w:r>
-      <w:proofErr w:type="gramEnd"/>
-      <w:r>
-        <w:t>在顯示器的流動過程中，慢慢由完整的字分解成流動的水墨，最後流入顯示器底端，幾秒</w:t>
-      </w:r>
-      <w:proofErr w:type="gramStart"/>
-      <w:r>
-        <w:t>后</w:t>
-      </w:r>
-      <w:proofErr w:type="gramEnd"/>
-      <w:r>
-        <w:t>平板接續顯示器的水墨，並慢慢往平板中心匯聚，匯聚過程中漸漸變色</w:t>
-      </w:r>
-      <w:proofErr w:type="gramStart"/>
-      <w:r>
-        <w:t>（</w:t>
-      </w:r>
-      <w:proofErr w:type="gramEnd"/>
-      <w:r>
-        <w:t>顔色是根據最終要生成的寶石顔色決定）</w:t>
+        <w:t>，設計點擊五組心情詞擇一後，透過影像識別人眼，最終選擇的心情詞會不斷從眼中流出（流出的詞匯越來越多，有最大值），詞匯在顯示器的流動過程中，慢慢由完整的字分解成流動的水墨，最後流入顯示器底端，幾秒后平板接續顯示器的水墨，並慢慢往平板中心匯聚，匯聚過程中漸漸變色（顔色是根據最終要生成的寶石顔色決定）</w:t>
       </w:r>
       <w:r>
         <w:t>,</w:t>
@@ -599,9 +943,6 @@
     <w:p>
       <w:pPr>
         <w:jc w:val="left"/>
-        <w:rPr>
-          <w:rFonts w:hint="eastAsia"/>
-        </w:rPr>
       </w:pPr>
       <w:r>
         <w:rPr>

</xml_diff>

<commit_message>
0.11.12 docs: adjust folder structure and add directory tree documentation
</commit_message>
<xml_diff>
--- a/To do.docx
+++ b/To do.docx
@@ -150,10 +150,23 @@
       </w:r>
       <w:r>
         <w:rPr>
-          <w:rFonts w:eastAsia="DengXian" w:hint="eastAsia"/>
-          <w:lang w:eastAsia="zh-CN"/>
-        </w:rPr>
-        <w:t>规格、裁切</w:t>
+          <w:rFonts w:asciiTheme="minorEastAsia" w:hAnsiTheme="minorEastAsia" w:hint="eastAsia"/>
+          <w:lang w:eastAsia="zh-CN"/>
+        </w:rPr>
+        <w:t>1秒30，轉一圈也是</w:t>
+      </w:r>
+      <w:r>
+        <w:rPr>
+          <w:rFonts w:asciiTheme="minorEastAsia" w:hAnsiTheme="minorEastAsia" w:hint="eastAsia"/>
+        </w:rPr>
+        <w:t>30</w:t>
+      </w:r>
+      <w:r>
+        <w:rPr>
+          <w:rFonts w:asciiTheme="minorEastAsia" w:hAnsiTheme="minorEastAsia" w:hint="eastAsia"/>
+          <w:lang w:eastAsia="zh-CN"/>
+        </w:rPr>
+        <w:t>張</w:t>
       </w:r>
       <w:r>
         <w:rPr>
@@ -252,7 +265,7 @@
       <w:pPr>
         <w:jc w:val="left"/>
         <w:rPr>
-          <w:rFonts w:eastAsia="DengXian" w:hint="eastAsia"/>
+          <w:rFonts w:eastAsia="DengXian"/>
           <w:lang w:eastAsia="zh-CN"/>
         </w:rPr>
       </w:pPr>
@@ -298,16 +311,16 @@
       <w:pPr>
         <w:jc w:val="left"/>
         <w:rPr>
-          <w:rFonts w:eastAsia="DengXian" w:hint="eastAsia"/>
-          <w:lang w:eastAsia="zh-CN"/>
-        </w:rPr>
-      </w:pPr>
-    </w:p>
-    <w:p>
-      <w:pPr>
-        <w:jc w:val="left"/>
-        <w:rPr>
-          <w:rFonts w:eastAsia="DengXian" w:hint="eastAsia"/>
+          <w:rFonts w:eastAsia="DengXian"/>
+          <w:lang w:eastAsia="zh-CN"/>
+        </w:rPr>
+      </w:pPr>
+    </w:p>
+    <w:p>
+      <w:pPr>
+        <w:jc w:val="left"/>
+        <w:rPr>
+          <w:rFonts w:eastAsia="DengXian"/>
           <w:lang w:eastAsia="zh-CN"/>
         </w:rPr>
       </w:pPr>
@@ -335,7 +348,7 @@
           </w:rPr>
           <w:id w:val="1096280076"/>
           <w14:checkbox>
-            <w14:checked w14:val="0"/>
+            <w14:checked w14:val="1"/>
             <w14:checkedState w14:val="2612" w14:font="MS Gothic"/>
             <w14:uncheckedState w14:val="2610" w14:font="MS Gothic"/>
           </w14:checkbox>
@@ -346,7 +359,7 @@
               <w:rFonts w:ascii="MS Gothic" w:eastAsia="MS Gothic" w:hAnsi="MS Gothic" w:hint="eastAsia"/>
               <w:lang w:eastAsia="zh-CN"/>
             </w:rPr>
-            <w:t>☐</w:t>
+            <w:t>☒</w:t>
           </w:r>
         </w:sdtContent>
       </w:sdt>
@@ -370,18 +383,16 @@
         <w:jc w:val="left"/>
         <w:rPr>
           <w:rFonts w:eastAsia="DengXian"/>
-          <w:lang w:eastAsia="zh-CN"/>
         </w:rPr>
       </w:pPr>
       <w:sdt>
         <w:sdtPr>
           <w:rPr>
             <w:rFonts w:eastAsia="DengXian" w:hint="eastAsia"/>
-            <w:lang w:eastAsia="zh-CN"/>
           </w:rPr>
           <w:id w:val="1206906764"/>
           <w14:checkbox>
-            <w14:checked w14:val="0"/>
+            <w14:checked w14:val="1"/>
             <w14:checkedState w14:val="2612" w14:font="MS Gothic"/>
             <w14:uncheckedState w14:val="2610" w14:font="MS Gothic"/>
           </w14:checkbox>
@@ -390,16 +401,14 @@
           <w:r>
             <w:rPr>
               <w:rFonts w:ascii="MS Gothic" w:eastAsia="MS Gothic" w:hAnsi="MS Gothic" w:hint="eastAsia"/>
-              <w:lang w:eastAsia="zh-CN"/>
             </w:rPr>
-            <w:t>☐</w:t>
+            <w:t>☒</w:t>
           </w:r>
         </w:sdtContent>
       </w:sdt>
       <w:r>
         <w:rPr>
           <w:rFonts w:eastAsia="DengXian" w:hint="eastAsia"/>
-          <w:lang w:eastAsia="zh-CN"/>
         </w:rPr>
         <w:t xml:space="preserve"> 文字图打包</w:t>
       </w:r>
@@ -408,8 +417,7 @@
       <w:pPr>
         <w:jc w:val="left"/>
         <w:rPr>
-          <w:rFonts w:eastAsia="DengXian" w:hint="eastAsia"/>
-          <w:lang w:eastAsia="zh-CN"/>
+          <w:rFonts w:eastAsia="DengXian"/>
         </w:rPr>
       </w:pPr>
     </w:p>

</xml_diff>

<commit_message>
0.12.0 refactor(architecture): implement routing and split monitor/tablet views
</commit_message>
<xml_diff>
--- a/To do.docx
+++ b/To do.docx
@@ -107,7 +107,7 @@
       <w:pPr>
         <w:jc w:val="left"/>
         <w:rPr>
-          <w:rFonts w:eastAsia="DengXian"/>
+          <w:rFonts w:asciiTheme="minorEastAsia" w:hAnsiTheme="minorEastAsia"/>
           <w:lang w:eastAsia="zh-CN"/>
         </w:rPr>
       </w:pPr>
@@ -153,27 +153,52 @@
           <w:rFonts w:asciiTheme="minorEastAsia" w:hAnsiTheme="minorEastAsia" w:hint="eastAsia"/>
           <w:lang w:eastAsia="zh-CN"/>
         </w:rPr>
-        <w:t>1秒30，轉一圈也是</w:t>
-      </w:r>
+        <w:t>1秒30，轉一圈也是30張</w:t>
+      </w:r>
+      <w:r>
+        <w:rPr>
+          <w:rFonts w:eastAsia="DengXian" w:hint="eastAsia"/>
+          <w:lang w:eastAsia="zh-CN"/>
+        </w:rPr>
+        <w:t>）</w:t>
+      </w:r>
+    </w:p>
+    <w:p>
+      <w:pPr>
+        <w:jc w:val="left"/>
+        <w:rPr>
+          <w:lang w:eastAsia="zh-CN"/>
+        </w:rPr>
+      </w:pPr>
+      <w:sdt>
+        <w:sdtPr>
+          <w:rPr>
+            <w:rFonts w:eastAsia="DengXian" w:hint="eastAsia"/>
+            <w:lang w:eastAsia="zh-CN"/>
+          </w:rPr>
+          <w:id w:val="-1680348082"/>
+          <w14:checkbox>
+            <w14:checked w14:val="0"/>
+            <w14:checkedState w14:val="2612" w14:font="MS Gothic"/>
+            <w14:uncheckedState w14:val="2610" w14:font="MS Gothic"/>
+          </w14:checkbox>
+        </w:sdtPr>
+        <w:sdtContent>
+          <w:r>
+            <w:rPr>
+              <w:rFonts w:ascii="MS Gothic" w:eastAsia="MS Gothic" w:hAnsi="MS Gothic" w:hint="eastAsia"/>
+              <w:lang w:eastAsia="zh-CN"/>
+            </w:rPr>
+            <w:t>☐</w:t>
+          </w:r>
+        </w:sdtContent>
+      </w:sdt>
       <w:r>
         <w:rPr>
           <w:rFonts w:asciiTheme="minorEastAsia" w:hAnsiTheme="minorEastAsia" w:hint="eastAsia"/>
-        </w:rPr>
-        <w:t>30</w:t>
-      </w:r>
-      <w:r>
-        <w:rPr>
-          <w:rFonts w:asciiTheme="minorEastAsia" w:hAnsiTheme="minorEastAsia" w:hint="eastAsia"/>
-          <w:lang w:eastAsia="zh-CN"/>
-        </w:rPr>
-        <w:t>張</w:t>
-      </w:r>
-      <w:r>
-        <w:rPr>
-          <w:rFonts w:eastAsia="DengXian" w:hint="eastAsia"/>
-          <w:lang w:eastAsia="zh-CN"/>
-        </w:rPr>
-        <w:t>）</w:t>
+          <w:lang w:eastAsia="zh-CN"/>
+        </w:rPr>
+        <w:t xml:space="preserve"> 20個水波紋文字圖</w:t>
       </w:r>
     </w:p>
     <w:p>
@@ -319,10 +344,6 @@
     <w:p>
       <w:pPr>
         <w:jc w:val="left"/>
-        <w:rPr>
-          <w:rFonts w:eastAsia="DengXian"/>
-          <w:lang w:eastAsia="zh-CN"/>
-        </w:rPr>
       </w:pPr>
       <w:r>
         <w:rPr>
@@ -330,6 +351,289 @@
           <w:lang w:eastAsia="zh-CN"/>
         </w:rPr>
         <w:t>科技组：</w:t>
+      </w:r>
+    </w:p>
+    <w:p>
+      <w:pPr>
+        <w:jc w:val="left"/>
+        <w:rPr>
+          <w:rFonts w:ascii="微軟正黑體" w:eastAsia="DengXian" w:hAnsi="微軟正黑體" w:cs="微軟正黑體"/>
+          <w:lang w:eastAsia="zh-CN"/>
+        </w:rPr>
+      </w:pPr>
+      <w:sdt>
+        <w:sdtPr>
+          <w:rPr>
+            <w:rFonts w:eastAsia="DengXian" w:hint="eastAsia"/>
+          </w:rPr>
+          <w:id w:val="1112555195"/>
+          <w14:checkbox>
+            <w14:checked w14:val="0"/>
+            <w14:checkedState w14:val="2612" w14:font="MS Gothic"/>
+            <w14:uncheckedState w14:val="2610" w14:font="MS Gothic"/>
+          </w14:checkbox>
+        </w:sdtPr>
+        <w:sdtContent>
+          <w:r>
+            <w:rPr>
+              <w:rFonts w:ascii="MS Gothic" w:eastAsia="MS Gothic" w:hAnsi="MS Gothic" w:hint="eastAsia"/>
+            </w:rPr>
+            <w:t>☐</w:t>
+          </w:r>
+        </w:sdtContent>
+      </w:sdt>
+      <w:r>
+        <w:rPr>
+          <w:rFonts w:asciiTheme="minorEastAsia" w:hAnsiTheme="minorEastAsia" w:hint="eastAsia"/>
+        </w:rPr>
+        <w:t xml:space="preserve"> UI</w:t>
+      </w:r>
+      <w:r>
+        <w:rPr>
+          <w:rFonts w:ascii="微軟正黑體" w:eastAsia="DengXian" w:hAnsi="微軟正黑體" w:cs="微軟正黑體" w:hint="eastAsia"/>
+          <w:lang w:eastAsia="zh-CN"/>
+        </w:rPr>
+        <w:t>套用</w:t>
+      </w:r>
+    </w:p>
+    <w:p>
+      <w:pPr>
+        <w:jc w:val="left"/>
+        <w:rPr>
+          <w:rFonts w:eastAsia="DengXian"/>
+          <w:lang w:eastAsia="zh-CN"/>
+        </w:rPr>
+      </w:pPr>
+      <w:sdt>
+        <w:sdtPr>
+          <w:rPr>
+            <w:rFonts w:eastAsia="DengXian" w:hint="eastAsia"/>
+          </w:rPr>
+          <w:id w:val="-1247256250"/>
+          <w14:checkbox>
+            <w14:checked w14:val="0"/>
+            <w14:checkedState w14:val="2612" w14:font="MS Gothic"/>
+            <w14:uncheckedState w14:val="2610" w14:font="MS Gothic"/>
+          </w14:checkbox>
+        </w:sdtPr>
+        <w:sdtContent>
+          <w:r>
+            <w:rPr>
+              <w:rFonts w:ascii="MS Gothic" w:eastAsia="MS Gothic" w:hAnsi="MS Gothic" w:hint="eastAsia"/>
+            </w:rPr>
+            <w:t>☐</w:t>
+          </w:r>
+        </w:sdtContent>
+      </w:sdt>
+      <w:r>
+        <w:rPr>
+          <w:rFonts w:eastAsia="DengXian" w:hint="eastAsia"/>
+          <w:lang w:eastAsia="zh-CN"/>
+        </w:rPr>
+        <w:t xml:space="preserve"> React的单界面拆成两个页面</w:t>
+      </w:r>
+    </w:p>
+    <w:p>
+      <w:pPr>
+        <w:jc w:val="left"/>
+        <w:rPr>
+          <w:rFonts w:eastAsia="DengXian"/>
+          <w:lang w:eastAsia="zh-CN"/>
+        </w:rPr>
+      </w:pPr>
+      <w:sdt>
+        <w:sdtPr>
+          <w:rPr>
+            <w:rFonts w:eastAsia="DengXian" w:hint="eastAsia"/>
+          </w:rPr>
+          <w:id w:val="2142530858"/>
+          <w14:checkbox>
+            <w14:checked w14:val="0"/>
+            <w14:checkedState w14:val="2612" w14:font="MS Gothic"/>
+            <w14:uncheckedState w14:val="2610" w14:font="MS Gothic"/>
+          </w14:checkbox>
+        </w:sdtPr>
+        <w:sdtContent>
+          <w:r>
+            <w:rPr>
+              <w:rFonts w:ascii="MS Gothic" w:eastAsia="MS Gothic" w:hAnsi="MS Gothic" w:hint="eastAsia"/>
+            </w:rPr>
+            <w:t>☐</w:t>
+          </w:r>
+        </w:sdtContent>
+      </w:sdt>
+      <w:r>
+        <w:rPr>
+          <w:rFonts w:eastAsia="DengXian" w:hint="eastAsia"/>
+          <w:lang w:eastAsia="zh-CN"/>
+        </w:rPr>
+        <w:t xml:space="preserve"> 平板待机动画实装</w:t>
+      </w:r>
+    </w:p>
+    <w:p>
+      <w:pPr>
+        <w:jc w:val="left"/>
+        <w:rPr>
+          <w:rFonts w:eastAsia="DengXian" w:hint="eastAsia"/>
+          <w:lang w:eastAsia="zh-CN"/>
+        </w:rPr>
+      </w:pPr>
+      <w:sdt>
+        <w:sdtPr>
+          <w:rPr>
+            <w:rFonts w:eastAsia="DengXian" w:hint="eastAsia"/>
+          </w:rPr>
+          <w:id w:val="-565875338"/>
+          <w14:checkbox>
+            <w14:checked w14:val="0"/>
+            <w14:checkedState w14:val="2612" w14:font="MS Gothic"/>
+            <w14:uncheckedState w14:val="2610" w14:font="MS Gothic"/>
+          </w14:checkbox>
+        </w:sdtPr>
+        <w:sdtContent>
+          <w:r>
+            <w:rPr>
+              <w:rFonts w:ascii="MS Gothic" w:eastAsia="MS Gothic" w:hAnsi="MS Gothic" w:hint="eastAsia"/>
+            </w:rPr>
+            <w:t>☐</w:t>
+          </w:r>
+        </w:sdtContent>
+      </w:sdt>
+      <w:r>
+        <w:rPr>
+          <w:rFonts w:eastAsia="DengXian" w:hint="eastAsia"/>
+          <w:lang w:eastAsia="zh-CN"/>
+        </w:rPr>
+        <w:t xml:space="preserve"> GPU预设修改</w:t>
+      </w:r>
+    </w:p>
+    <w:p>
+      <w:pPr>
+        <w:jc w:val="left"/>
+      </w:pPr>
+      <w:sdt>
+        <w:sdtPr>
+          <w:rPr>
+            <w:rFonts w:eastAsia="DengXian" w:hint="eastAsia"/>
+          </w:rPr>
+          <w:id w:val="-435906838"/>
+          <w14:checkbox>
+            <w14:checked w14:val="0"/>
+            <w14:checkedState w14:val="2612" w14:font="MS Gothic"/>
+            <w14:uncheckedState w14:val="2610" w14:font="MS Gothic"/>
+          </w14:checkbox>
+        </w:sdtPr>
+        <w:sdtContent>
+          <w:r>
+            <w:rPr>
+              <w:rFonts w:ascii="MS Gothic" w:eastAsia="MS Gothic" w:hAnsi="MS Gothic" w:hint="eastAsia"/>
+            </w:rPr>
+            <w:t>☐</w:t>
+          </w:r>
+        </w:sdtContent>
+      </w:sdt>
+      <w:r>
+        <w:rPr>
+          <w:rFonts w:asciiTheme="minorEastAsia" w:hAnsiTheme="minorEastAsia" w:hint="eastAsia"/>
+        </w:rPr>
+        <w:t xml:space="preserve"> </w:t>
+      </w:r>
+      <w:r>
+        <w:rPr>
+          <w:rFonts w:asciiTheme="minorEastAsia" w:hAnsiTheme="minorEastAsia" w:hint="eastAsia"/>
+        </w:rPr>
+        <w:t>UI設計(改成小字小框長方形小圓角，加入橫向分隔線，按鈕與標題和開始互動按鈕用粗分隔線，20個字詞的選框之間用較細的分隔線</w:t>
+      </w:r>
+      <w:r>
+        <w:rPr>
+          <w:rFonts w:asciiTheme="minorEastAsia" w:hAnsiTheme="minorEastAsia" w:hint="eastAsia"/>
+        </w:rPr>
+        <w:t>，類似蘋果的風格</w:t>
+      </w:r>
+      <w:r>
+        <w:rPr>
+          <w:rFonts w:asciiTheme="minorEastAsia" w:hAnsiTheme="minorEastAsia" w:hint="eastAsia"/>
+        </w:rPr>
+        <w:t>)</w:t>
+      </w:r>
+    </w:p>
+    <w:p>
+      <w:pPr>
+        <w:jc w:val="left"/>
+      </w:pPr>
+      <w:sdt>
+        <w:sdtPr>
+          <w:rPr>
+            <w:rFonts w:eastAsia="DengXian" w:hint="eastAsia"/>
+          </w:rPr>
+          <w:id w:val="1768113167"/>
+          <w14:checkbox>
+            <w14:checked w14:val="0"/>
+            <w14:checkedState w14:val="2612" w14:font="MS Gothic"/>
+            <w14:uncheckedState w14:val="2610" w14:font="MS Gothic"/>
+          </w14:checkbox>
+        </w:sdtPr>
+        <w:sdtContent>
+          <w:r>
+            <w:rPr>
+              <w:rFonts w:ascii="MS Gothic" w:eastAsia="MS Gothic" w:hAnsi="MS Gothic" w:hint="eastAsia"/>
+            </w:rPr>
+            <w:t>☐</w:t>
+          </w:r>
+        </w:sdtContent>
+      </w:sdt>
+      <w:r>
+        <w:rPr>
+          <w:rFonts w:asciiTheme="minorEastAsia" w:hAnsiTheme="minorEastAsia" w:hint="eastAsia"/>
+        </w:rPr>
+        <w:t xml:space="preserve"> </w:t>
+      </w:r>
+      <w:r>
+        <w:rPr>
+          <w:rFonts w:asciiTheme="minorEastAsia" w:hAnsiTheme="minorEastAsia" w:hint="eastAsia"/>
+        </w:rPr>
+        <w:t>UI文字描述修改</w:t>
+      </w:r>
+    </w:p>
+    <w:p>
+      <w:pPr>
+        <w:jc w:val="left"/>
+        <w:rPr>
+          <w:rFonts w:asciiTheme="minorEastAsia" w:hAnsiTheme="minorEastAsia"/>
+        </w:rPr>
+      </w:pPr>
+      <w:sdt>
+        <w:sdtPr>
+          <w:rPr>
+            <w:rFonts w:eastAsia="DengXian" w:hint="eastAsia"/>
+          </w:rPr>
+          <w:id w:val="1232651796"/>
+          <w14:checkbox>
+            <w14:checked w14:val="0"/>
+            <w14:checkedState w14:val="2612" w14:font="MS Gothic"/>
+            <w14:uncheckedState w14:val="2610" w14:font="MS Gothic"/>
+          </w14:checkbox>
+        </w:sdtPr>
+        <w:sdtContent>
+          <w:r>
+            <w:rPr>
+              <w:rFonts w:ascii="MS Gothic" w:eastAsia="MS Gothic" w:hAnsi="MS Gothic" w:hint="eastAsia"/>
+            </w:rPr>
+            <w:t>☐</w:t>
+          </w:r>
+        </w:sdtContent>
+      </w:sdt>
+      <w:r>
+        <w:rPr>
+          <w:rFonts w:hint="eastAsia"/>
+        </w:rPr>
+        <w:t xml:space="preserve"> </w:t>
+      </w:r>
+      <w:r>
+        <w:rPr>
+          <w:rFonts w:asciiTheme="minorEastAsia" w:hAnsiTheme="minorEastAsia" w:hint="eastAsia"/>
+        </w:rPr>
+        <w:t>結算回饋文字描述</w:t>
       </w:r>
     </w:p>
     <w:p>
@@ -368,27 +672,21 @@
           <w:rFonts w:eastAsia="DengXian" w:hint="eastAsia"/>
           <w:lang w:eastAsia="zh-CN"/>
         </w:rPr>
-        <w:t xml:space="preserve"> </w:t>
-      </w:r>
-      <w:r>
-        <w:rPr>
-          <w:rFonts w:eastAsia="DengXian" w:hint="eastAsia"/>
-          <w:lang w:eastAsia="zh-CN"/>
-        </w:rPr>
-        <w:t>水波纹特效替换</w:t>
-      </w:r>
-    </w:p>
-    <w:p>
-      <w:pPr>
-        <w:jc w:val="left"/>
-        <w:rPr>
-          <w:rFonts w:eastAsia="DengXian"/>
+        <w:t xml:space="preserve"> 水波纹特效替换</w:t>
+      </w:r>
+    </w:p>
+    <w:p>
+      <w:pPr>
+        <w:jc w:val="left"/>
+        <w:rPr>
+          <w:rFonts w:hint="eastAsia"/>
         </w:rPr>
       </w:pPr>
       <w:sdt>
         <w:sdtPr>
           <w:rPr>
             <w:rFonts w:eastAsia="DengXian" w:hint="eastAsia"/>
+            <w:lang w:eastAsia="zh-CN"/>
           </w:rPr>
           <w:id w:val="1206906764"/>
           <w14:checkbox>
@@ -401,6 +699,7 @@
           <w:r>
             <w:rPr>
               <w:rFonts w:ascii="MS Gothic" w:eastAsia="MS Gothic" w:hAnsi="MS Gothic" w:hint="eastAsia"/>
+              <w:lang w:eastAsia="zh-CN"/>
             </w:rPr>
             <w:t>☒</w:t>
           </w:r>
@@ -409,6 +708,7 @@
       <w:r>
         <w:rPr>
           <w:rFonts w:eastAsia="DengXian" w:hint="eastAsia"/>
+          <w:lang w:eastAsia="zh-CN"/>
         </w:rPr>
         <w:t xml:space="preserve"> 文字图打包</w:t>
       </w:r>
@@ -417,7 +717,1043 @@
       <w:pPr>
         <w:jc w:val="left"/>
         <w:rPr>
-          <w:rFonts w:eastAsia="DengXian"/>
+          <w:lang w:eastAsia="zh-CN"/>
+        </w:rPr>
+      </w:pPr>
+      <w:r>
+        <w:rPr>
+          <w:lang w:eastAsia="zh-CN"/>
+        </w:rPr>
+        <w:br w:type="page"/>
+      </w:r>
+    </w:p>
+    <w:p>
+      <w:pPr>
+        <w:jc w:val="left"/>
+        <w:rPr>
+          <w:rFonts w:eastAsia="DengXian"/>
+          <w:b/>
+          <w:bCs/>
+          <w:lang w:eastAsia="zh-CN"/>
+        </w:rPr>
+      </w:pPr>
+      <w:r>
+        <w:rPr>
+          <w:noProof/>
+        </w:rPr>
+        <w:lastRenderedPageBreak/>
+        <w:drawing>
+          <wp:inline distT="0" distB="0" distL="0" distR="0" wp14:anchorId="747A92AB" wp14:editId="1DC35F82">
+            <wp:extent cx="5274310" cy="922020"/>
+            <wp:effectExtent l="0" t="0" r="2540" b="0"/>
+            <wp:docPr id="913172587" name="圖片 1"/>
+            <wp:cNvGraphicFramePr>
+              <a:graphicFrameLocks xmlns:a="http://schemas.openxmlformats.org/drawingml/2006/main" noChangeAspect="1"/>
+            </wp:cNvGraphicFramePr>
+            <a:graphic xmlns:a="http://schemas.openxmlformats.org/drawingml/2006/main">
+              <a:graphicData uri="http://schemas.openxmlformats.org/drawingml/2006/picture">
+                <pic:pic xmlns:pic="http://schemas.openxmlformats.org/drawingml/2006/picture">
+                  <pic:nvPicPr>
+                    <pic:cNvPr id="913172587" name=""/>
+                    <pic:cNvPicPr/>
+                  </pic:nvPicPr>
+                  <pic:blipFill>
+                    <a:blip r:embed="rId7"/>
+                    <a:stretch>
+                      <a:fillRect/>
+                    </a:stretch>
+                  </pic:blipFill>
+                  <pic:spPr>
+                    <a:xfrm>
+                      <a:off x="0" y="0"/>
+                      <a:ext cx="5274310" cy="922020"/>
+                    </a:xfrm>
+                    <a:prstGeom prst="rect">
+                      <a:avLst/>
+                    </a:prstGeom>
+                  </pic:spPr>
+                </pic:pic>
+              </a:graphicData>
+            </a:graphic>
+          </wp:inline>
+        </w:drawing>
+      </w:r>
+    </w:p>
+    <w:p>
+      <w:pPr>
+        <w:jc w:val="left"/>
+        <w:rPr>
+          <w:rFonts w:eastAsia="DengXian"/>
+          <w:b/>
+          <w:bCs/>
+          <w:lang w:eastAsia="zh-CN"/>
+        </w:rPr>
+      </w:pPr>
+      <w:r>
+        <w:rPr>
+          <w:rFonts w:eastAsia="DengXian"/>
+          <w:b/>
+          <w:bCs/>
+          <w:lang w:eastAsia="zh-CN"/>
+        </w:rPr>
+        <w:t>第一步：畫面拆分 (React Router)</w:t>
+      </w:r>
+    </w:p>
+    <w:p>
+      <w:pPr>
+        <w:jc w:val="left"/>
+        <w:rPr>
+          <w:rFonts w:eastAsia="DengXian"/>
+          <w:lang w:eastAsia="zh-CN"/>
+        </w:rPr>
+      </w:pPr>
+      <w:r>
+        <w:rPr>
+          <w:rFonts w:eastAsia="DengXian"/>
+          <w:lang w:eastAsia="zh-CN"/>
+        </w:rPr>
+        <w:t xml:space="preserve">引入 </w:t>
+      </w:r>
+      <w:r>
+        <w:rPr>
+          <w:rFonts w:eastAsia="DengXian"/>
+          <w:b/>
+          <w:bCs/>
+          <w:lang w:eastAsia="zh-CN"/>
+        </w:rPr>
+        <w:t>React Router</w:t>
+      </w:r>
+      <w:r>
+        <w:rPr>
+          <w:rFonts w:eastAsia="DengXian"/>
+          <w:lang w:eastAsia="zh-CN"/>
+        </w:rPr>
+        <w:t>，讓你的專案透過「不同的網址」來決定要顯示哪一個畫面。 例如：</w:t>
+      </w:r>
+    </w:p>
+    <w:p>
+      <w:pPr>
+        <w:numPr>
+          <w:ilvl w:val="0"/>
+          <w:numId w:val="3"/>
+        </w:numPr>
+        <w:jc w:val="left"/>
+        <w:rPr>
+          <w:rFonts w:eastAsia="DengXian"/>
+          <w:lang w:eastAsia="zh-CN"/>
+        </w:rPr>
+      </w:pPr>
+      <w:r>
+        <w:rPr>
+          <w:rFonts w:eastAsia="DengXian"/>
+          <w:lang w:eastAsia="zh-CN"/>
+        </w:rPr>
+        <w:t>在大螢幕瀏覽器輸入：</w:t>
+      </w:r>
+    </w:p>
+    <w:p>
+      <w:pPr>
+        <w:ind w:left="720"/>
+        <w:jc w:val="left"/>
+        <w:rPr>
+          <w:rFonts w:eastAsia="DengXian"/>
+          <w:lang w:eastAsia="zh-CN"/>
+        </w:rPr>
+      </w:pPr>
+      <w:r>
+        <w:rPr>
+          <w:rFonts w:eastAsia="DengXian"/>
+          <w:lang w:eastAsia="zh-CN"/>
+        </w:rPr>
+        <w:t>http://localhost:5173/monitor（只載入上半部的臉部追蹤與掉落動畫）</w:t>
+      </w:r>
+    </w:p>
+    <w:p>
+      <w:pPr>
+        <w:numPr>
+          <w:ilvl w:val="0"/>
+          <w:numId w:val="3"/>
+        </w:numPr>
+        <w:jc w:val="left"/>
+        <w:rPr>
+          <w:rFonts w:eastAsia="DengXian"/>
+        </w:rPr>
+      </w:pPr>
+      <w:r>
+        <w:rPr>
+          <w:rFonts w:eastAsia="DengXian"/>
+        </w:rPr>
+        <w:t>在平板瀏覽器輸入：</w:t>
+      </w:r>
+    </w:p>
+    <w:p>
+      <w:pPr>
+        <w:ind w:left="720"/>
+        <w:jc w:val="left"/>
+        <w:rPr>
+          <w:rFonts w:eastAsia="DengXian"/>
+        </w:rPr>
+      </w:pPr>
+      <w:r>
+        <w:rPr>
+          <w:rFonts w:eastAsia="DengXian"/>
+        </w:rPr>
+        <w:t>http://localhost:5173/tablet（只載入下半部的選單 UI 與寶石水池）</w:t>
+      </w:r>
+    </w:p>
+    <w:p>
+      <w:pPr>
+        <w:jc w:val="left"/>
+        <w:rPr>
+          <w:rFonts w:eastAsia="DengXian"/>
+          <w:lang w:eastAsia="zh-CN"/>
+        </w:rPr>
+      </w:pPr>
+      <w:r>
+        <w:rPr>
+          <w:rFonts w:eastAsia="DengXian"/>
+          <w:b/>
+          <w:bCs/>
+          <w:lang w:eastAsia="zh-CN"/>
+        </w:rPr>
+        <w:t>架構修改方式：</w:t>
+      </w:r>
+    </w:p>
+    <w:p>
+      <w:pPr>
+        <w:numPr>
+          <w:ilvl w:val="0"/>
+          <w:numId w:val="4"/>
+        </w:numPr>
+        <w:jc w:val="left"/>
+        <w:rPr>
+          <w:rFonts w:eastAsia="DengXian"/>
+          <w:lang w:eastAsia="zh-CN"/>
+        </w:rPr>
+      </w:pPr>
+      <w:r>
+        <w:rPr>
+          <w:rFonts w:eastAsia="DengXian"/>
+          <w:lang w:eastAsia="zh-CN"/>
+        </w:rPr>
+        <w:t>安裝路由：npm install react-router-dom</w:t>
+      </w:r>
+    </w:p>
+    <w:p>
+      <w:pPr>
+        <w:numPr>
+          <w:ilvl w:val="0"/>
+          <w:numId w:val="4"/>
+        </w:numPr>
+        <w:jc w:val="left"/>
+        <w:rPr>
+          <w:rFonts w:eastAsia="DengXian"/>
+        </w:rPr>
+      </w:pPr>
+      <w:r>
+        <w:rPr>
+          <w:rFonts w:eastAsia="DengXian"/>
+        </w:rPr>
+        <w:t>將原本的 App.jsx 拆分成三個檔案：</w:t>
+      </w:r>
+    </w:p>
+    <w:p>
+      <w:pPr>
+        <w:numPr>
+          <w:ilvl w:val="1"/>
+          <w:numId w:val="4"/>
+        </w:numPr>
+        <w:jc w:val="left"/>
+        <w:rPr>
+          <w:rFonts w:eastAsia="DengXian"/>
+        </w:rPr>
+      </w:pPr>
+      <w:r>
+        <w:rPr>
+          <w:rFonts w:eastAsia="DengXian"/>
+        </w:rPr>
+        <w:t>App.jsx（只負責設定路由路徑）</w:t>
+      </w:r>
+    </w:p>
+    <w:p>
+      <w:pPr>
+        <w:numPr>
+          <w:ilvl w:val="1"/>
+          <w:numId w:val="4"/>
+        </w:numPr>
+        <w:jc w:val="left"/>
+        <w:rPr>
+          <w:rFonts w:eastAsia="DengXian"/>
+          <w:lang w:eastAsia="zh-CN"/>
+        </w:rPr>
+      </w:pPr>
+      <w:r>
+        <w:rPr>
+          <w:rFonts w:eastAsia="DengXian"/>
+          <w:lang w:eastAsia="zh-CN"/>
+        </w:rPr>
+        <w:t>MonitorView.jsx（原本畫面上半部鏡頭與 PIXI 的邏輯）</w:t>
+      </w:r>
+    </w:p>
+    <w:p>
+      <w:pPr>
+        <w:numPr>
+          <w:ilvl w:val="1"/>
+          <w:numId w:val="4"/>
+        </w:numPr>
+        <w:jc w:val="left"/>
+        <w:rPr>
+          <w:rFonts w:eastAsia="DengXian"/>
+          <w:lang w:eastAsia="zh-CN"/>
+        </w:rPr>
+      </w:pPr>
+      <w:r>
+        <w:rPr>
+          <w:rFonts w:eastAsia="DengXian"/>
+          <w:lang w:eastAsia="zh-CN"/>
+        </w:rPr>
+        <w:t>TabletView.jsx（原本畫面下半部的 UI 按鈕與水池 PIXI 邏輯）</w:t>
+      </w:r>
+    </w:p>
+    <w:p>
+      <w:pPr>
+        <w:jc w:val="left"/>
+        <w:rPr>
+          <w:rFonts w:eastAsia="DengXian"/>
+          <w:lang w:eastAsia="zh-CN"/>
+        </w:rPr>
+      </w:pPr>
+    </w:p>
+    <w:p>
+      <w:pPr>
+        <w:jc w:val="left"/>
+        <w:rPr>
+          <w:rFonts w:eastAsia="DengXian"/>
+          <w:b/>
+          <w:bCs/>
+        </w:rPr>
+      </w:pPr>
+      <w:r>
+        <w:rPr>
+          <w:rFonts w:eastAsia="DengXian"/>
+          <w:b/>
+          <w:bCs/>
+        </w:rPr>
+        <w:t>第二步：資料通訊 (Data Transmission)</w:t>
+      </w:r>
+    </w:p>
+    <w:p>
+      <w:pPr>
+        <w:jc w:val="left"/>
+        <w:rPr>
+          <w:rFonts w:eastAsia="DengXian"/>
+          <w:lang w:eastAsia="zh-CN"/>
+        </w:rPr>
+      </w:pPr>
+      <w:r>
+        <w:rPr>
+          <w:rFonts w:eastAsia="DengXian"/>
+        </w:rPr>
+        <w:t>既然拆成了兩個頁面，它們該怎麼溝通？</w:t>
+      </w:r>
+    </w:p>
+    <w:p>
+      <w:pPr>
+        <w:jc w:val="left"/>
+        <w:rPr>
+          <w:rFonts w:eastAsia="DengXian"/>
+        </w:rPr>
+      </w:pPr>
+      <w:r>
+        <w:rPr>
+          <w:rFonts w:eastAsia="DengXian"/>
+        </w:rPr>
+        <w:t xml:space="preserve">（例如：平板按下了「盡情哭吧 GO」，顯示器怎麼知道要開始掉字？） </w:t>
+      </w:r>
+    </w:p>
+    <w:p>
+      <w:pPr>
+        <w:jc w:val="left"/>
+        <w:rPr>
+          <w:rFonts w:eastAsia="DengXian"/>
+        </w:rPr>
+      </w:pPr>
+      <w:r>
+        <w:rPr>
+          <w:rFonts w:eastAsia="DengXian"/>
+        </w:rPr>
+        <w:t>這裡有兩種解決方案，取決於你展場的</w:t>
+      </w:r>
+      <w:r>
+        <w:rPr>
+          <w:rFonts w:eastAsia="DengXian"/>
+          <w:b/>
+          <w:bCs/>
+        </w:rPr>
+        <w:t>硬體配置</w:t>
+      </w:r>
+      <w:r>
+        <w:rPr>
+          <w:rFonts w:eastAsia="DengXian"/>
+        </w:rPr>
+        <w:t>：</w:t>
+      </w:r>
+    </w:p>
+    <w:p>
+      <w:pPr>
+        <w:jc w:val="left"/>
+        <w:rPr>
+          <w:rFonts w:eastAsia="DengXian"/>
+          <w:b/>
+          <w:bCs/>
+          <w:lang w:eastAsia="zh-CN"/>
+        </w:rPr>
+      </w:pPr>
+    </w:p>
+    <w:p>
+      <w:pPr>
+        <w:jc w:val="left"/>
+        <w:rPr>
+          <w:rFonts w:eastAsia="DengXian"/>
+          <w:b/>
+          <w:bCs/>
+        </w:rPr>
+      </w:pPr>
+      <w:r>
+        <w:rPr>
+          <w:rFonts w:eastAsia="DengXian"/>
+          <w:b/>
+          <w:bCs/>
+        </w:rPr>
+        <w:t>方案 A：雙螢幕接在「同一台電腦」上 (使用 BroadcastChannel API)</w:t>
+      </w:r>
+    </w:p>
+    <w:p>
+      <w:pPr>
+        <w:jc w:val="left"/>
+        <w:rPr>
+          <w:rFonts w:eastAsia="DengXian"/>
+        </w:rPr>
+      </w:pPr>
+      <w:r>
+        <w:rPr>
+          <w:rFonts w:eastAsia="DengXian"/>
+        </w:rPr>
+        <w:t>如果你的展場是使用一台效能較好的主機（如 Mac Macni 或 PC），同時外接兩個螢幕（一個掛牆上，一個平放當平板），這是</w:t>
+      </w:r>
+      <w:r>
+        <w:rPr>
+          <w:rFonts w:eastAsia="DengXian"/>
+          <w:b/>
+          <w:bCs/>
+        </w:rPr>
+        <w:t>最推薦且最簡單</w:t>
+      </w:r>
+      <w:r>
+        <w:rPr>
+          <w:rFonts w:eastAsia="DengXian"/>
+        </w:rPr>
+        <w:t>的做法！</w:t>
+      </w:r>
+    </w:p>
+    <w:p>
+      <w:pPr>
+        <w:jc w:val="left"/>
+        <w:rPr>
+          <w:rFonts w:eastAsia="DengXian"/>
+          <w:lang w:eastAsia="zh-CN"/>
+        </w:rPr>
+      </w:pPr>
+      <w:r>
+        <w:rPr>
+          <w:rFonts w:eastAsia="DengXian"/>
+          <w:lang w:eastAsia="zh-CN"/>
+        </w:rPr>
+        <w:t>不需要寫後端伺服器，直接利用瀏覽器內建的 BroadcastChannel 就能讓兩個分頁秒速溝通：</w:t>
+      </w:r>
+    </w:p>
+    <w:p>
+      <w:pPr>
+        <w:jc w:val="left"/>
+        <w:rPr>
+          <w:rFonts w:eastAsia="DengXian"/>
+          <w:lang w:eastAsia="zh-CN"/>
+        </w:rPr>
+      </w:pPr>
+      <w:r>
+        <w:rPr>
+          <w:rFonts w:eastAsia="DengXian"/>
+          <w:b/>
+          <w:bCs/>
+          <w:lang w:eastAsia="zh-CN"/>
+        </w:rPr>
+        <w:t>在平板端 (TabletView.jsx) 發送訊號：</w:t>
+      </w:r>
+    </w:p>
+    <w:p>
+      <w:pPr>
+        <w:jc w:val="left"/>
+        <w:rPr>
+          <w:rFonts w:eastAsia="DengXian"/>
+          <w:lang w:eastAsia="zh-CN"/>
+        </w:rPr>
+      </w:pPr>
+      <w:r>
+        <w:rPr>
+          <w:rFonts w:eastAsia="DengXian"/>
+          <w:lang w:eastAsia="zh-CN"/>
+        </w:rPr>
+        <w:t>JavaScript</w:t>
+      </w:r>
+    </w:p>
+    <w:p>
+      <w:pPr>
+        <w:jc w:val="left"/>
+        <w:rPr>
+          <w:rFonts w:eastAsia="DengXian"/>
+          <w:lang w:eastAsia="zh-CN"/>
+        </w:rPr>
+      </w:pPr>
+      <w:r>
+        <w:rPr>
+          <w:rFonts w:eastAsia="DengXian"/>
+          <w:lang w:eastAsia="zh-CN"/>
+        </w:rPr>
+        <w:t>// 建立一個專屬頻道</w:t>
+      </w:r>
+    </w:p>
+    <w:p>
+      <w:pPr>
+        <w:jc w:val="left"/>
+        <w:rPr>
+          <w:rFonts w:eastAsia="DengXian"/>
+          <w:lang w:eastAsia="zh-CN"/>
+        </w:rPr>
+      </w:pPr>
+      <w:r>
+        <w:rPr>
+          <w:rFonts w:eastAsia="DengXian"/>
+          <w:lang w:eastAsia="zh-CN"/>
+        </w:rPr>
+        <w:t>const channel = new BroadcastChannel('tears_art_channel');</w:t>
+      </w:r>
+    </w:p>
+    <w:p>
+      <w:pPr>
+        <w:jc w:val="left"/>
+        <w:rPr>
+          <w:rFonts w:eastAsia="DengXian"/>
+          <w:lang w:eastAsia="zh-CN"/>
+        </w:rPr>
+      </w:pPr>
+    </w:p>
+    <w:p>
+      <w:pPr>
+        <w:jc w:val="left"/>
+        <w:rPr>
+          <w:rFonts w:eastAsia="DengXian"/>
+          <w:lang w:eastAsia="zh-CN"/>
+        </w:rPr>
+      </w:pPr>
+      <w:r>
+        <w:rPr>
+          <w:rFonts w:eastAsia="DengXian"/>
+          <w:lang w:eastAsia="zh-CN"/>
+        </w:rPr>
+        <w:t>const handleCrying = () =&gt; {</w:t>
+      </w:r>
+    </w:p>
+    <w:p>
+      <w:pPr>
+        <w:jc w:val="left"/>
+        <w:rPr>
+          <w:rFonts w:eastAsia="DengXian"/>
+          <w:lang w:eastAsia="zh-CN"/>
+        </w:rPr>
+      </w:pPr>
+      <w:r>
+        <w:rPr>
+          <w:rFonts w:eastAsia="DengXian"/>
+          <w:lang w:eastAsia="zh-CN"/>
+        </w:rPr>
+        <w:t xml:space="preserve">    // 當使用者按下按鈕，發送廣播訊息給所有打開這個頻道的頁面</w:t>
+      </w:r>
+    </w:p>
+    <w:p>
+      <w:pPr>
+        <w:jc w:val="left"/>
+        <w:rPr>
+          <w:rFonts w:eastAsia="DengXian"/>
+          <w:lang w:eastAsia="zh-CN"/>
+        </w:rPr>
+      </w:pPr>
+      <w:r>
+        <w:rPr>
+          <w:rFonts w:eastAsia="DengXian"/>
+          <w:lang w:eastAsia="zh-CN"/>
+        </w:rPr>
+        <w:t xml:space="preserve">    channel.postMessage({ </w:t>
+      </w:r>
+    </w:p>
+    <w:p>
+      <w:pPr>
+        <w:jc w:val="left"/>
+        <w:rPr>
+          <w:rFonts w:eastAsia="DengXian"/>
+          <w:lang w:eastAsia="zh-CN"/>
+        </w:rPr>
+      </w:pPr>
+      <w:r>
+        <w:rPr>
+          <w:rFonts w:eastAsia="DengXian"/>
+          <w:lang w:eastAsia="zh-CN"/>
+        </w:rPr>
+        <w:t xml:space="preserve">        action: 'TRIGGER_CRYING', </w:t>
+      </w:r>
+    </w:p>
+    <w:p>
+      <w:pPr>
+        <w:jc w:val="left"/>
+        <w:rPr>
+          <w:rFonts w:eastAsia="DengXian"/>
+          <w:lang w:eastAsia="zh-CN"/>
+        </w:rPr>
+      </w:pPr>
+      <w:r>
+        <w:rPr>
+          <w:rFonts w:eastAsia="DengXian"/>
+          <w:lang w:eastAsia="zh-CN"/>
+        </w:rPr>
+        <w:lastRenderedPageBreak/>
+        <w:t xml:space="preserve">        words: selectedWords </w:t>
+      </w:r>
+    </w:p>
+    <w:p>
+      <w:pPr>
+        <w:jc w:val="left"/>
+        <w:rPr>
+          <w:rFonts w:eastAsia="DengXian"/>
+          <w:lang w:eastAsia="zh-CN"/>
+        </w:rPr>
+      </w:pPr>
+      <w:r>
+        <w:rPr>
+          <w:rFonts w:eastAsia="DengXian"/>
+          <w:lang w:eastAsia="zh-CN"/>
+        </w:rPr>
+        <w:t xml:space="preserve">    });</w:t>
+      </w:r>
+    </w:p>
+    <w:p>
+      <w:pPr>
+        <w:jc w:val="left"/>
+        <w:rPr>
+          <w:rFonts w:eastAsia="DengXian"/>
+          <w:lang w:eastAsia="zh-CN"/>
+        </w:rPr>
+      </w:pPr>
+      <w:r>
+        <w:rPr>
+          <w:rFonts w:eastAsia="DengXian"/>
+          <w:lang w:eastAsia="zh-CN"/>
+        </w:rPr>
+        <w:t>};</w:t>
+      </w:r>
+    </w:p>
+    <w:p>
+      <w:pPr>
+        <w:jc w:val="left"/>
+        <w:rPr>
+          <w:rFonts w:eastAsia="DengXian"/>
+          <w:lang w:eastAsia="zh-CN"/>
+        </w:rPr>
+      </w:pPr>
+      <w:r>
+        <w:rPr>
+          <w:rFonts w:eastAsia="DengXian"/>
+          <w:b/>
+          <w:bCs/>
+          <w:lang w:eastAsia="zh-CN"/>
+        </w:rPr>
+        <w:t>在顯示器端 (MonitorView.jsx) 接收訊號：</w:t>
+      </w:r>
+    </w:p>
+    <w:p>
+      <w:pPr>
+        <w:jc w:val="left"/>
+        <w:rPr>
+          <w:rFonts w:eastAsia="DengXian"/>
+          <w:lang w:eastAsia="zh-CN"/>
+        </w:rPr>
+      </w:pPr>
+      <w:r>
+        <w:rPr>
+          <w:rFonts w:eastAsia="DengXian"/>
+          <w:lang w:eastAsia="zh-CN"/>
+        </w:rPr>
+        <w:t>JavaScript</w:t>
+      </w:r>
+    </w:p>
+    <w:p>
+      <w:pPr>
+        <w:jc w:val="left"/>
+        <w:rPr>
+          <w:rFonts w:eastAsia="DengXian"/>
+          <w:lang w:eastAsia="zh-CN"/>
+        </w:rPr>
+      </w:pPr>
+      <w:r>
+        <w:rPr>
+          <w:rFonts w:eastAsia="DengXian"/>
+          <w:lang w:eastAsia="zh-CN"/>
+        </w:rPr>
+        <w:t>useEffect(() =&gt; {</w:t>
+      </w:r>
+    </w:p>
+    <w:p>
+      <w:pPr>
+        <w:jc w:val="left"/>
+        <w:rPr>
+          <w:rFonts w:eastAsia="DengXian"/>
+          <w:lang w:eastAsia="zh-CN"/>
+        </w:rPr>
+      </w:pPr>
+      <w:r>
+        <w:rPr>
+          <w:rFonts w:eastAsia="DengXian"/>
+          <w:lang w:eastAsia="zh-CN"/>
+        </w:rPr>
+        <w:t xml:space="preserve">    const channel = new BroadcastChannel('tears_art_channel');</w:t>
+      </w:r>
+    </w:p>
+    <w:p>
+      <w:pPr>
+        <w:jc w:val="left"/>
+        <w:rPr>
+          <w:rFonts w:eastAsia="DengXian"/>
+          <w:lang w:eastAsia="zh-CN"/>
+        </w:rPr>
+      </w:pPr>
+      <w:r>
+        <w:rPr>
+          <w:rFonts w:eastAsia="DengXian"/>
+          <w:lang w:eastAsia="zh-CN"/>
+        </w:rPr>
+        <w:t xml:space="preserve">    </w:t>
+      </w:r>
+    </w:p>
+    <w:p>
+      <w:pPr>
+        <w:jc w:val="left"/>
+        <w:rPr>
+          <w:rFonts w:eastAsia="DengXian"/>
+          <w:lang w:eastAsia="zh-CN"/>
+        </w:rPr>
+      </w:pPr>
+      <w:r>
+        <w:rPr>
+          <w:rFonts w:eastAsia="DengXian"/>
+          <w:lang w:eastAsia="zh-CN"/>
+        </w:rPr>
+        <w:t xml:space="preserve">    // 監聽來自平板的廣播</w:t>
+      </w:r>
+    </w:p>
+    <w:p>
+      <w:pPr>
+        <w:jc w:val="left"/>
+        <w:rPr>
+          <w:rFonts w:eastAsia="DengXian"/>
+          <w:lang w:eastAsia="zh-CN"/>
+        </w:rPr>
+      </w:pPr>
+      <w:r>
+        <w:rPr>
+          <w:rFonts w:eastAsia="DengXian"/>
+          <w:lang w:eastAsia="zh-CN"/>
+        </w:rPr>
+        <w:t xml:space="preserve">    channel.onmessage = (event) =&gt; {</w:t>
+      </w:r>
+    </w:p>
+    <w:p>
+      <w:pPr>
+        <w:jc w:val="left"/>
+        <w:rPr>
+          <w:rFonts w:eastAsia="DengXian"/>
+          <w:lang w:eastAsia="zh-CN"/>
+        </w:rPr>
+      </w:pPr>
+      <w:r>
+        <w:rPr>
+          <w:rFonts w:eastAsia="DengXian"/>
+          <w:lang w:eastAsia="zh-CN"/>
+        </w:rPr>
+        <w:t xml:space="preserve">        if (event.data.action === 'TRIGGER_CRYING') {</w:t>
+      </w:r>
+    </w:p>
+    <w:p>
+      <w:pPr>
+        <w:jc w:val="left"/>
+        <w:rPr>
+          <w:rFonts w:eastAsia="DengXian"/>
+          <w:lang w:eastAsia="zh-CN"/>
+        </w:rPr>
+      </w:pPr>
+      <w:r>
+        <w:rPr>
+          <w:rFonts w:eastAsia="DengXian"/>
+          <w:lang w:eastAsia="zh-CN"/>
+        </w:rPr>
+        <w:t xml:space="preserve">            const userWords = event.data.words;</w:t>
+      </w:r>
+    </w:p>
+    <w:p>
+      <w:pPr>
+        <w:jc w:val="left"/>
+        <w:rPr>
+          <w:rFonts w:eastAsia="DengXian"/>
+        </w:rPr>
+      </w:pPr>
+      <w:r>
+        <w:rPr>
+          <w:rFonts w:eastAsia="DengXian"/>
+          <w:lang w:eastAsia="zh-CN"/>
+        </w:rPr>
+        <w:t xml:space="preserve">            </w:t>
+      </w:r>
+      <w:r>
+        <w:rPr>
+          <w:rFonts w:eastAsia="DengXian"/>
+        </w:rPr>
+        <w:t>// 呼叫顯示器的 PIXI 引擎開始掉落文字</w:t>
+      </w:r>
+    </w:p>
+    <w:p>
+      <w:pPr>
+        <w:jc w:val="left"/>
+        <w:rPr>
+          <w:rFonts w:eastAsia="DengXian"/>
+          <w:lang w:eastAsia="zh-CN"/>
+        </w:rPr>
+      </w:pPr>
+      <w:r>
+        <w:rPr>
+          <w:rFonts w:eastAsia="DengXian"/>
+        </w:rPr>
+        <w:t xml:space="preserve">            </w:t>
+      </w:r>
+      <w:r>
+        <w:rPr>
+          <w:rFonts w:eastAsia="DengXian"/>
+          <w:lang w:eastAsia="zh-CN"/>
+        </w:rPr>
+        <w:t>monitorEngine.current.startCrying(userWords);</w:t>
+      </w:r>
+    </w:p>
+    <w:p>
+      <w:pPr>
+        <w:jc w:val="left"/>
+        <w:rPr>
+          <w:rFonts w:eastAsia="DengXian"/>
+          <w:lang w:eastAsia="zh-CN"/>
+        </w:rPr>
+      </w:pPr>
+      <w:r>
+        <w:rPr>
+          <w:rFonts w:eastAsia="DengXian"/>
+          <w:lang w:eastAsia="zh-CN"/>
+        </w:rPr>
+        <w:t xml:space="preserve">        }</w:t>
+      </w:r>
+    </w:p>
+    <w:p>
+      <w:pPr>
+        <w:jc w:val="left"/>
+        <w:rPr>
+          <w:rFonts w:eastAsia="DengXian"/>
+          <w:lang w:eastAsia="zh-CN"/>
+        </w:rPr>
+      </w:pPr>
+      <w:r>
+        <w:rPr>
+          <w:rFonts w:eastAsia="DengXian"/>
+          <w:lang w:eastAsia="zh-CN"/>
+        </w:rPr>
+        <w:t xml:space="preserve">    };</w:t>
+      </w:r>
+    </w:p>
+    <w:p>
+      <w:pPr>
+        <w:jc w:val="left"/>
+        <w:rPr>
+          <w:rFonts w:eastAsia="DengXian"/>
+          <w:lang w:eastAsia="zh-CN"/>
+        </w:rPr>
+      </w:pPr>
+      <w:r>
+        <w:rPr>
+          <w:rFonts w:eastAsia="DengXian"/>
+          <w:lang w:eastAsia="zh-CN"/>
+        </w:rPr>
+        <w:t xml:space="preserve">    </w:t>
+      </w:r>
+    </w:p>
+    <w:p>
+      <w:pPr>
+        <w:jc w:val="left"/>
+        <w:rPr>
+          <w:rFonts w:eastAsia="DengXian"/>
+          <w:lang w:eastAsia="zh-CN"/>
+        </w:rPr>
+      </w:pPr>
+      <w:r>
+        <w:rPr>
+          <w:rFonts w:eastAsia="DengXian"/>
+          <w:lang w:eastAsia="zh-CN"/>
+        </w:rPr>
+        <w:t xml:space="preserve">    return () =&gt; channel.close();</w:t>
+      </w:r>
+    </w:p>
+    <w:p>
+      <w:pPr>
+        <w:jc w:val="left"/>
+        <w:rPr>
+          <w:rFonts w:eastAsia="DengXian"/>
+          <w:lang w:eastAsia="zh-CN"/>
+        </w:rPr>
+      </w:pPr>
+      <w:r>
+        <w:rPr>
+          <w:rFonts w:eastAsia="DengXian"/>
+          <w:lang w:eastAsia="zh-CN"/>
+        </w:rPr>
+        <w:t>}, []);</w:t>
+      </w:r>
+    </w:p>
+    <w:p>
+      <w:pPr>
+        <w:jc w:val="left"/>
+        <w:rPr>
+          <w:rFonts w:eastAsia="DengXian"/>
+          <w:lang w:eastAsia="zh-CN"/>
+        </w:rPr>
+      </w:pPr>
+    </w:p>
+    <w:p>
+      <w:pPr>
+        <w:jc w:val="left"/>
+        <w:rPr>
+          <w:rFonts w:eastAsia="DengXian"/>
+          <w:lang w:eastAsia="zh-CN"/>
+        </w:rPr>
+      </w:pPr>
+      <w:r>
+        <w:rPr>
+          <w:noProof/>
+        </w:rPr>
+        <w:drawing>
+          <wp:inline distT="0" distB="0" distL="0" distR="0" wp14:anchorId="25927D48" wp14:editId="47ADFE95">
+            <wp:extent cx="5274310" cy="1240155"/>
+            <wp:effectExtent l="0" t="0" r="2540" b="0"/>
+            <wp:docPr id="1821489965" name="圖片 1"/>
+            <wp:cNvGraphicFramePr>
+              <a:graphicFrameLocks xmlns:a="http://schemas.openxmlformats.org/drawingml/2006/main" noChangeAspect="1"/>
+            </wp:cNvGraphicFramePr>
+            <a:graphic xmlns:a="http://schemas.openxmlformats.org/drawingml/2006/main">
+              <a:graphicData uri="http://schemas.openxmlformats.org/drawingml/2006/picture">
+                <pic:pic xmlns:pic="http://schemas.openxmlformats.org/drawingml/2006/picture">
+                  <pic:nvPicPr>
+                    <pic:cNvPr id="1821489965" name=""/>
+                    <pic:cNvPicPr/>
+                  </pic:nvPicPr>
+                  <pic:blipFill>
+                    <a:blip r:embed="rId8"/>
+                    <a:stretch>
+                      <a:fillRect/>
+                    </a:stretch>
+                  </pic:blipFill>
+                  <pic:spPr>
+                    <a:xfrm>
+                      <a:off x="0" y="0"/>
+                      <a:ext cx="5274310" cy="1240155"/>
+                    </a:xfrm>
+                    <a:prstGeom prst="rect">
+                      <a:avLst/>
+                    </a:prstGeom>
+                  </pic:spPr>
+                </pic:pic>
+              </a:graphicData>
+            </a:graphic>
+          </wp:inline>
+        </w:drawing>
+      </w:r>
+    </w:p>
+    <w:p>
+      <w:pPr>
+        <w:jc w:val="left"/>
+        <w:rPr>
+          <w:rFonts w:eastAsia="DengXian" w:hint="eastAsia"/>
+          <w:lang w:eastAsia="zh-CN"/>
+        </w:rPr>
+      </w:pPr>
+    </w:p>
+    <w:p>
+      <w:pPr>
+        <w:jc w:val="left"/>
+        <w:rPr>
+          <w:rFonts w:eastAsia="DengXian"/>
+          <w:b/>
+          <w:bCs/>
+          <w:lang w:eastAsia="zh-CN"/>
+        </w:rPr>
+      </w:pPr>
+      <w:r>
+        <w:rPr>
+          <w:rFonts w:eastAsia="DengXian"/>
+          <w:b/>
+          <w:bCs/>
+          <w:lang w:eastAsia="zh-CN"/>
+        </w:rPr>
+        <w:t>方案 B：使用兩台「完全不同的實體設備」 (使用 WebSocket / Socket.io)</w:t>
+      </w:r>
+    </w:p>
+    <w:p>
+      <w:pPr>
+        <w:jc w:val="left"/>
+        <w:rPr>
+          <w:rFonts w:eastAsia="DengXian"/>
+          <w:lang w:eastAsia="zh-CN"/>
+        </w:rPr>
+      </w:pPr>
+      <w:r>
+        <w:rPr>
+          <w:rFonts w:eastAsia="DengXian"/>
+          <w:lang w:eastAsia="zh-CN"/>
+        </w:rPr>
+        <w:t>如果你的顯示器是一台電腦，而平板是</w:t>
+      </w:r>
+      <w:r>
+        <w:rPr>
+          <w:rFonts w:eastAsia="DengXian"/>
+          <w:b/>
+          <w:bCs/>
+          <w:lang w:eastAsia="zh-CN"/>
+        </w:rPr>
+        <w:t>一台真正的 iPad</w:t>
+      </w:r>
+      <w:r>
+        <w:rPr>
+          <w:rFonts w:eastAsia="DengXian"/>
+          <w:lang w:eastAsia="zh-CN"/>
+        </w:rPr>
+        <w:t>（兩台設備只是連著同一個 Wi-Fi）。 因為它們在不同的機器上，BroadcastChannel 就失效了。你必須在</w:t>
+      </w:r>
+    </w:p>
+    <w:p>
+      <w:pPr>
+        <w:jc w:val="left"/>
+        <w:rPr>
+          <w:rFonts w:eastAsia="DengXian" w:hint="eastAsia"/>
+          <w:lang w:eastAsia="zh-CN"/>
         </w:rPr>
       </w:pPr>
     </w:p>
@@ -532,7 +1868,7 @@
                     <pic:cNvPicPr/>
                   </pic:nvPicPr>
                   <pic:blipFill>
-                    <a:blip r:embed="rId7"/>
+                    <a:blip r:embed="rId9"/>
                     <a:stretch>
                       <a:fillRect/>
                     </a:stretch>
@@ -577,7 +1913,7 @@
                     <pic:cNvPicPr/>
                   </pic:nvPicPr>
                   <pic:blipFill>
-                    <a:blip r:embed="rId8"/>
+                    <a:blip r:embed="rId10"/>
                     <a:stretch>
                       <a:fillRect/>
                     </a:stretch>
@@ -623,7 +1959,7 @@
                     <pic:cNvPicPr/>
                   </pic:nvPicPr>
                   <pic:blipFill>
-                    <a:blip r:embed="rId9"/>
+                    <a:blip r:embed="rId11"/>
                     <a:stretch>
                       <a:fillRect/>
                     </a:stretch>
@@ -673,7 +2009,7 @@
                     <pic:cNvPicPr/>
                   </pic:nvPicPr>
                   <pic:blipFill>
-                    <a:blip r:embed="rId10"/>
+                    <a:blip r:embed="rId12"/>
                     <a:stretch>
                       <a:fillRect/>
                     </a:stretch>
@@ -718,7 +2054,7 @@
                     <pic:cNvPicPr/>
                   </pic:nvPicPr>
                   <pic:blipFill>
-                    <a:blip r:embed="rId11"/>
+                    <a:blip r:embed="rId13"/>
                     <a:stretch>
                       <a:fillRect/>
                     </a:stretch>
@@ -764,7 +2100,7 @@
                     <pic:cNvPicPr/>
                   </pic:nvPicPr>
                   <pic:blipFill>
-                    <a:blip r:embed="rId12"/>
+                    <a:blip r:embed="rId14"/>
                     <a:stretch>
                       <a:fillRect/>
                     </a:stretch>
@@ -809,7 +2145,7 @@
                     <pic:cNvPicPr/>
                   </pic:nvPicPr>
                   <pic:blipFill>
-                    <a:blip r:embed="rId13"/>
+                    <a:blip r:embed="rId15"/>
                     <a:stretch>
                       <a:fillRect/>
                     </a:stretch>
@@ -854,7 +2190,7 @@
                     <pic:cNvPicPr/>
                   </pic:nvPicPr>
                   <pic:blipFill>
-                    <a:blip r:embed="rId14"/>
+                    <a:blip r:embed="rId16"/>
                     <a:stretch>
                       <a:fillRect/>
                     </a:stretch>
@@ -900,7 +2236,7 @@
                     <pic:cNvPicPr/>
                   </pic:nvPicPr>
                   <pic:blipFill>
-                    <a:blip r:embed="rId15"/>
+                    <a:blip r:embed="rId17"/>
                     <a:stretch>
                       <a:fillRect/>
                     </a:stretch>
@@ -1123,6 +2459,123 @@
     </w:lvl>
   </w:abstractNum>
   <w:abstractNum w:abstractNumId="1" w15:restartNumberingAfterBreak="0">
+    <w:nsid w:val="43780A86"/>
+    <w:multiLevelType w:val="multilevel"/>
+    <w:tmpl w:val="D9FC2342"/>
+    <w:lvl w:ilvl="0">
+      <w:start w:val="1"/>
+      <w:numFmt w:val="decimal"/>
+      <w:lvlText w:val="%1."/>
+      <w:lvlJc w:val="left"/>
+      <w:pPr>
+        <w:tabs>
+          <w:tab w:val="num" w:pos="720"/>
+        </w:tabs>
+        <w:ind w:left="720" w:hanging="360"/>
+      </w:pPr>
+    </w:lvl>
+    <w:lvl w:ilvl="1">
+      <w:start w:val="1"/>
+      <w:numFmt w:val="bullet"/>
+      <w:lvlText w:val="o"/>
+      <w:lvlJc w:val="left"/>
+      <w:pPr>
+        <w:tabs>
+          <w:tab w:val="num" w:pos="1440"/>
+        </w:tabs>
+        <w:ind w:left="1440" w:hanging="360"/>
+      </w:pPr>
+      <w:rPr>
+        <w:rFonts w:ascii="Courier New" w:hAnsi="Courier New" w:hint="default"/>
+        <w:sz w:val="20"/>
+      </w:rPr>
+    </w:lvl>
+    <w:lvl w:ilvl="2" w:tentative="1">
+      <w:start w:val="1"/>
+      <w:numFmt w:val="decimal"/>
+      <w:lvlText w:val="%3."/>
+      <w:lvlJc w:val="left"/>
+      <w:pPr>
+        <w:tabs>
+          <w:tab w:val="num" w:pos="2160"/>
+        </w:tabs>
+        <w:ind w:left="2160" w:hanging="360"/>
+      </w:pPr>
+    </w:lvl>
+    <w:lvl w:ilvl="3" w:tentative="1">
+      <w:start w:val="1"/>
+      <w:numFmt w:val="decimal"/>
+      <w:lvlText w:val="%4."/>
+      <w:lvlJc w:val="left"/>
+      <w:pPr>
+        <w:tabs>
+          <w:tab w:val="num" w:pos="2880"/>
+        </w:tabs>
+        <w:ind w:left="2880" w:hanging="360"/>
+      </w:pPr>
+    </w:lvl>
+    <w:lvl w:ilvl="4" w:tentative="1">
+      <w:start w:val="1"/>
+      <w:numFmt w:val="decimal"/>
+      <w:lvlText w:val="%5."/>
+      <w:lvlJc w:val="left"/>
+      <w:pPr>
+        <w:tabs>
+          <w:tab w:val="num" w:pos="3600"/>
+        </w:tabs>
+        <w:ind w:left="3600" w:hanging="360"/>
+      </w:pPr>
+    </w:lvl>
+    <w:lvl w:ilvl="5" w:tentative="1">
+      <w:start w:val="1"/>
+      <w:numFmt w:val="decimal"/>
+      <w:lvlText w:val="%6."/>
+      <w:lvlJc w:val="left"/>
+      <w:pPr>
+        <w:tabs>
+          <w:tab w:val="num" w:pos="4320"/>
+        </w:tabs>
+        <w:ind w:left="4320" w:hanging="360"/>
+      </w:pPr>
+    </w:lvl>
+    <w:lvl w:ilvl="6" w:tentative="1">
+      <w:start w:val="1"/>
+      <w:numFmt w:val="decimal"/>
+      <w:lvlText w:val="%7."/>
+      <w:lvlJc w:val="left"/>
+      <w:pPr>
+        <w:tabs>
+          <w:tab w:val="num" w:pos="5040"/>
+        </w:tabs>
+        <w:ind w:left="5040" w:hanging="360"/>
+      </w:pPr>
+    </w:lvl>
+    <w:lvl w:ilvl="7" w:tentative="1">
+      <w:start w:val="1"/>
+      <w:numFmt w:val="decimal"/>
+      <w:lvlText w:val="%8."/>
+      <w:lvlJc w:val="left"/>
+      <w:pPr>
+        <w:tabs>
+          <w:tab w:val="num" w:pos="5760"/>
+        </w:tabs>
+        <w:ind w:left="5760" w:hanging="360"/>
+      </w:pPr>
+    </w:lvl>
+    <w:lvl w:ilvl="8" w:tentative="1">
+      <w:start w:val="1"/>
+      <w:numFmt w:val="decimal"/>
+      <w:lvlText w:val="%9."/>
+      <w:lvlJc w:val="left"/>
+      <w:pPr>
+        <w:tabs>
+          <w:tab w:val="num" w:pos="6480"/>
+        </w:tabs>
+        <w:ind w:left="6480" w:hanging="360"/>
+      </w:pPr>
+    </w:lvl>
+  </w:abstractNum>
+  <w:abstractNum w:abstractNumId="2" w15:restartNumberingAfterBreak="0">
     <w:nsid w:val="45F20EB6"/>
     <w:multiLevelType w:val="multilevel"/>
     <w:tmpl w:val="1302B4E8"/>
@@ -1235,10 +2688,165 @@
       </w:pPr>
     </w:lvl>
   </w:abstractNum>
+  <w:abstractNum w:abstractNumId="3" w15:restartNumberingAfterBreak="0">
+    <w:nsid w:val="48FD639A"/>
+    <w:multiLevelType w:val="multilevel"/>
+    <w:tmpl w:val="CA6AE7A6"/>
+    <w:lvl w:ilvl="0">
+      <w:start w:val="1"/>
+      <w:numFmt w:val="bullet"/>
+      <w:lvlText w:val=""/>
+      <w:lvlJc w:val="left"/>
+      <w:pPr>
+        <w:tabs>
+          <w:tab w:val="num" w:pos="720"/>
+        </w:tabs>
+        <w:ind w:left="720" w:hanging="360"/>
+      </w:pPr>
+      <w:rPr>
+        <w:rFonts w:ascii="Symbol" w:hAnsi="Symbol" w:hint="default"/>
+        <w:sz w:val="20"/>
+      </w:rPr>
+    </w:lvl>
+    <w:lvl w:ilvl="1" w:tentative="1">
+      <w:start w:val="1"/>
+      <w:numFmt w:val="bullet"/>
+      <w:lvlText w:val="o"/>
+      <w:lvlJc w:val="left"/>
+      <w:pPr>
+        <w:tabs>
+          <w:tab w:val="num" w:pos="1440"/>
+        </w:tabs>
+        <w:ind w:left="1440" w:hanging="360"/>
+      </w:pPr>
+      <w:rPr>
+        <w:rFonts w:ascii="Courier New" w:hAnsi="Courier New" w:hint="default"/>
+        <w:sz w:val="20"/>
+      </w:rPr>
+    </w:lvl>
+    <w:lvl w:ilvl="2" w:tentative="1">
+      <w:start w:val="1"/>
+      <w:numFmt w:val="bullet"/>
+      <w:lvlText w:val=""/>
+      <w:lvlJc w:val="left"/>
+      <w:pPr>
+        <w:tabs>
+          <w:tab w:val="num" w:pos="2160"/>
+        </w:tabs>
+        <w:ind w:left="2160" w:hanging="360"/>
+      </w:pPr>
+      <w:rPr>
+        <w:rFonts w:ascii="Wingdings" w:hAnsi="Wingdings" w:hint="default"/>
+        <w:sz w:val="20"/>
+      </w:rPr>
+    </w:lvl>
+    <w:lvl w:ilvl="3" w:tentative="1">
+      <w:start w:val="1"/>
+      <w:numFmt w:val="bullet"/>
+      <w:lvlText w:val=""/>
+      <w:lvlJc w:val="left"/>
+      <w:pPr>
+        <w:tabs>
+          <w:tab w:val="num" w:pos="2880"/>
+        </w:tabs>
+        <w:ind w:left="2880" w:hanging="360"/>
+      </w:pPr>
+      <w:rPr>
+        <w:rFonts w:ascii="Wingdings" w:hAnsi="Wingdings" w:hint="default"/>
+        <w:sz w:val="20"/>
+      </w:rPr>
+    </w:lvl>
+    <w:lvl w:ilvl="4" w:tentative="1">
+      <w:start w:val="1"/>
+      <w:numFmt w:val="bullet"/>
+      <w:lvlText w:val=""/>
+      <w:lvlJc w:val="left"/>
+      <w:pPr>
+        <w:tabs>
+          <w:tab w:val="num" w:pos="3600"/>
+        </w:tabs>
+        <w:ind w:left="3600" w:hanging="360"/>
+      </w:pPr>
+      <w:rPr>
+        <w:rFonts w:ascii="Wingdings" w:hAnsi="Wingdings" w:hint="default"/>
+        <w:sz w:val="20"/>
+      </w:rPr>
+    </w:lvl>
+    <w:lvl w:ilvl="5" w:tentative="1">
+      <w:start w:val="1"/>
+      <w:numFmt w:val="bullet"/>
+      <w:lvlText w:val=""/>
+      <w:lvlJc w:val="left"/>
+      <w:pPr>
+        <w:tabs>
+          <w:tab w:val="num" w:pos="4320"/>
+        </w:tabs>
+        <w:ind w:left="4320" w:hanging="360"/>
+      </w:pPr>
+      <w:rPr>
+        <w:rFonts w:ascii="Wingdings" w:hAnsi="Wingdings" w:hint="default"/>
+        <w:sz w:val="20"/>
+      </w:rPr>
+    </w:lvl>
+    <w:lvl w:ilvl="6" w:tentative="1">
+      <w:start w:val="1"/>
+      <w:numFmt w:val="bullet"/>
+      <w:lvlText w:val=""/>
+      <w:lvlJc w:val="left"/>
+      <w:pPr>
+        <w:tabs>
+          <w:tab w:val="num" w:pos="5040"/>
+        </w:tabs>
+        <w:ind w:left="5040" w:hanging="360"/>
+      </w:pPr>
+      <w:rPr>
+        <w:rFonts w:ascii="Wingdings" w:hAnsi="Wingdings" w:hint="default"/>
+        <w:sz w:val="20"/>
+      </w:rPr>
+    </w:lvl>
+    <w:lvl w:ilvl="7" w:tentative="1">
+      <w:start w:val="1"/>
+      <w:numFmt w:val="bullet"/>
+      <w:lvlText w:val=""/>
+      <w:lvlJc w:val="left"/>
+      <w:pPr>
+        <w:tabs>
+          <w:tab w:val="num" w:pos="5760"/>
+        </w:tabs>
+        <w:ind w:left="5760" w:hanging="360"/>
+      </w:pPr>
+      <w:rPr>
+        <w:rFonts w:ascii="Wingdings" w:hAnsi="Wingdings" w:hint="default"/>
+        <w:sz w:val="20"/>
+      </w:rPr>
+    </w:lvl>
+    <w:lvl w:ilvl="8" w:tentative="1">
+      <w:start w:val="1"/>
+      <w:numFmt w:val="bullet"/>
+      <w:lvlText w:val=""/>
+      <w:lvlJc w:val="left"/>
+      <w:pPr>
+        <w:tabs>
+          <w:tab w:val="num" w:pos="6480"/>
+        </w:tabs>
+        <w:ind w:left="6480" w:hanging="360"/>
+      </w:pPr>
+      <w:rPr>
+        <w:rFonts w:ascii="Wingdings" w:hAnsi="Wingdings" w:hint="default"/>
+        <w:sz w:val="20"/>
+      </w:rPr>
+    </w:lvl>
+  </w:abstractNum>
   <w:num w:numId="1" w16cid:durableId="1252467865">
     <w:abstractNumId w:val="0"/>
   </w:num>
   <w:num w:numId="2" w16cid:durableId="1581284350">
+    <w:abstractNumId w:val="2"/>
+  </w:num>
+  <w:num w:numId="3" w16cid:durableId="722096468">
+    <w:abstractNumId w:val="3"/>
+  </w:num>
+  <w:num w:numId="4" w16cid:durableId="1013824">
     <w:abstractNumId w:val="1"/>
   </w:num>
 </w:numbering>
@@ -1848,7 +3456,6 @@
   <w:style w:type="character" w:default="1" w:styleId="a0">
     <w:name w:val="Default Paragraph Font"/>
     <w:uiPriority w:val="1"/>
-    <w:semiHidden/>
     <w:unhideWhenUsed/>
   </w:style>
   <w:style w:type="table" w:default="1" w:styleId="a1">

</xml_diff>

<commit_message>
0.12.1 feat(architecture):  complete full-screen cross-device adaptation
</commit_message>
<xml_diff>
--- a/To do.docx
+++ b/To do.docx
@@ -679,7 +679,8 @@
       <w:pPr>
         <w:jc w:val="left"/>
         <w:rPr>
-          <w:rFonts w:hint="eastAsia"/>
+          <w:rFonts w:eastAsia="DengXian"/>
+          <w:lang w:eastAsia="zh-CN"/>
         </w:rPr>
       </w:pPr>
       <w:sdt>
@@ -712,6 +713,161 @@
         </w:rPr>
         <w:t xml:space="preserve"> 文字图打包</w:t>
       </w:r>
+    </w:p>
+    <w:p>
+      <w:pPr>
+        <w:jc w:val="left"/>
+        <w:rPr>
+          <w:rFonts w:eastAsia="DengXian"/>
+          <w:lang w:eastAsia="zh-CN"/>
+        </w:rPr>
+      </w:pPr>
+    </w:p>
+    <w:p>
+      <w:pPr>
+        <w:jc w:val="left"/>
+        <w:rPr>
+          <w:rFonts w:eastAsia="DengXian"/>
+          <w:lang w:eastAsia="zh-CN"/>
+        </w:rPr>
+      </w:pPr>
+      <w:r>
+        <w:rPr>
+          <w:rFonts w:eastAsia="DengXian" w:hint="eastAsia"/>
+          <w:lang w:eastAsia="zh-CN"/>
+        </w:rPr>
+        <w:t xml:space="preserve"># </w:t>
+      </w:r>
+      <w:r>
+        <w:rPr>
+          <w:rFonts w:eastAsia="DengXian"/>
+          <w:lang w:eastAsia="zh-CN"/>
+        </w:rPr>
+        <w:t>安裝路由</w:t>
+      </w:r>
+    </w:p>
+    <w:p>
+      <w:pPr>
+        <w:ind w:firstLine="480"/>
+        <w:jc w:val="left"/>
+        <w:rPr>
+          <w:rFonts w:eastAsia="DengXian"/>
+          <w:lang w:eastAsia="zh-CN"/>
+        </w:rPr>
+      </w:pPr>
+      <w:r>
+        <w:rPr>
+          <w:rFonts w:eastAsia="DengXian"/>
+          <w:lang w:eastAsia="zh-CN"/>
+        </w:rPr>
+        <w:t>npm install react-router-dom</w:t>
+      </w:r>
+    </w:p>
+    <w:p>
+      <w:pPr>
+        <w:jc w:val="left"/>
+        <w:rPr>
+          <w:rFonts w:eastAsia="DengXian"/>
+          <w:lang w:eastAsia="zh-CN"/>
+        </w:rPr>
+      </w:pPr>
+      <w:r>
+        <w:rPr>
+          <w:rFonts w:eastAsia="DengXian"/>
+          <w:lang w:eastAsia="zh-CN"/>
+        </w:rPr>
+        <w:t xml:space="preserve"># 安裝前端 Socket 用戶端 </w:t>
+      </w:r>
+    </w:p>
+    <w:p>
+      <w:pPr>
+        <w:ind w:firstLine="480"/>
+        <w:jc w:val="left"/>
+        <w:rPr>
+          <w:rFonts w:eastAsia="DengXian"/>
+          <w:lang w:eastAsia="zh-CN"/>
+        </w:rPr>
+      </w:pPr>
+      <w:r>
+        <w:rPr>
+          <w:rFonts w:eastAsia="DengXian"/>
+          <w:lang w:eastAsia="zh-CN"/>
+        </w:rPr>
+        <w:t>npm install socket.io-client</w:t>
+      </w:r>
+    </w:p>
+    <w:p>
+      <w:pPr>
+        <w:jc w:val="left"/>
+        <w:rPr>
+          <w:rFonts w:eastAsia="DengXian"/>
+          <w:lang w:eastAsia="zh-CN"/>
+        </w:rPr>
+      </w:pPr>
+      <w:r>
+        <w:rPr>
+          <w:rFonts w:eastAsia="DengXian"/>
+          <w:lang w:eastAsia="zh-CN"/>
+        </w:rPr>
+        <w:t xml:space="preserve"># 安裝後端伺服器套件（用來當兩台裝置的郵差） </w:t>
+      </w:r>
+    </w:p>
+    <w:p>
+      <w:pPr>
+        <w:ind w:firstLine="480"/>
+        <w:jc w:val="left"/>
+        <w:rPr>
+          <w:rFonts w:eastAsia="DengXian"/>
+          <w:lang w:eastAsia="zh-CN"/>
+        </w:rPr>
+      </w:pPr>
+      <w:r>
+        <w:rPr>
+          <w:rFonts w:eastAsia="DengXian"/>
+          <w:lang w:eastAsia="zh-CN"/>
+        </w:rPr>
+        <w:t>npm install express socket.io</w:t>
+      </w:r>
+    </w:p>
+    <w:p>
+      <w:pPr>
+        <w:jc w:val="left"/>
+      </w:pPr>
+      <w:r>
+        <w:rPr>
+          <w:rFonts w:asciiTheme="minorEastAsia" w:hAnsiTheme="minorEastAsia" w:hint="eastAsia"/>
+        </w:rPr>
+        <w:t xml:space="preserve"># </w:t>
+      </w:r>
+      <w:r>
+        <w:rPr>
+          <w:rFonts w:asciiTheme="minorEastAsia" w:hAnsiTheme="minorEastAsia" w:hint="eastAsia"/>
+          <w:lang w:eastAsia="zh-CN"/>
+        </w:rPr>
+        <w:t>啟動伺服器</w:t>
+      </w:r>
+    </w:p>
+    <w:p>
+      <w:pPr>
+        <w:jc w:val="left"/>
+        <w:rPr>
+          <w:rFonts w:hint="eastAsia"/>
+        </w:rPr>
+      </w:pPr>
+      <w:r>
+        <w:tab/>
+      </w:r>
+      <w:r>
+        <w:t>node server.js</w:t>
+      </w:r>
+    </w:p>
+    <w:p>
+      <w:pPr>
+        <w:jc w:val="left"/>
+        <w:rPr>
+          <w:rFonts w:hint="eastAsia"/>
+        </w:rPr>
+      </w:pPr>
     </w:p>
     <w:p>
       <w:pPr>
@@ -1028,7 +1184,7 @@
       <w:pPr>
         <w:jc w:val="left"/>
         <w:rPr>
-          <w:rFonts w:eastAsia="DengXian"/>
+          <w:rFonts w:hint="eastAsia"/>
           <w:b/>
           <w:bCs/>
         </w:rPr>
@@ -1041,331 +1197,105 @@
         </w:rPr>
         <w:t>第二步：資料通訊 (Data Transmission)</w:t>
       </w:r>
-    </w:p>
-    <w:p>
-      <w:pPr>
-        <w:jc w:val="left"/>
-        <w:rPr>
-          <w:rFonts w:eastAsia="DengXian"/>
-          <w:lang w:eastAsia="zh-CN"/>
-        </w:rPr>
-      </w:pPr>
-      <w:r>
-        <w:rPr>
-          <w:rFonts w:eastAsia="DengXian"/>
-        </w:rPr>
-        <w:t>既然拆成了兩個頁面，它們該怎麼溝通？</w:t>
-      </w:r>
-    </w:p>
-    <w:p>
-      <w:pPr>
-        <w:jc w:val="left"/>
-        <w:rPr>
-          <w:rFonts w:eastAsia="DengXian"/>
-        </w:rPr>
-      </w:pPr>
-      <w:r>
-        <w:rPr>
-          <w:rFonts w:eastAsia="DengXian"/>
-        </w:rPr>
-        <w:t xml:space="preserve">（例如：平板按下了「盡情哭吧 GO」，顯示器怎麼知道要開始掉字？） </w:t>
-      </w:r>
-    </w:p>
-    <w:p>
-      <w:pPr>
-        <w:jc w:val="left"/>
-        <w:rPr>
-          <w:rFonts w:eastAsia="DengXian"/>
-        </w:rPr>
-      </w:pPr>
-      <w:r>
-        <w:rPr>
-          <w:rFonts w:eastAsia="DengXian"/>
-        </w:rPr>
-        <w:t>這裡有兩種解決方案，取決於你展場的</w:t>
-      </w:r>
-      <w:r>
-        <w:rPr>
-          <w:rFonts w:eastAsia="DengXian"/>
+      <w:r>
+        <w:rPr>
+          <w:rFonts w:asciiTheme="minorEastAsia" w:hAnsiTheme="minorEastAsia" w:hint="eastAsia"/>
           <w:b/>
           <w:bCs/>
         </w:rPr>
-        <w:t>硬體配置</w:t>
-      </w:r>
-      <w:r>
-        <w:rPr>
-          <w:rFonts w:eastAsia="DengXian"/>
-        </w:rPr>
-        <w:t>：</w:t>
-      </w:r>
-    </w:p>
-    <w:p>
-      <w:pPr>
-        <w:jc w:val="left"/>
-        <w:rPr>
-          <w:rFonts w:eastAsia="DengXian"/>
+        <w:t>—</w:t>
+      </w:r>
+      <w:r>
+        <w:rPr>
+          <w:rFonts w:asciiTheme="minorEastAsia" w:hAnsiTheme="minorEastAsia" w:hint="eastAsia"/>
           <w:b/>
           <w:bCs/>
-          <w:lang w:eastAsia="zh-CN"/>
-        </w:rPr>
-      </w:pPr>
-    </w:p>
-    <w:p>
-      <w:pPr>
-        <w:jc w:val="left"/>
-        <w:rPr>
-          <w:rFonts w:eastAsia="DengXian"/>
+        </w:rPr>
+        <w:t>—</w:t>
+      </w:r>
+      <w:r>
+        <w:rPr>
+          <w:rFonts w:asciiTheme="minorEastAsia" w:hAnsiTheme="minorEastAsia" w:hint="eastAsia"/>
           <w:b/>
           <w:bCs/>
         </w:rPr>
-      </w:pPr>
+        <w:t>使用方案B</w:t>
+      </w:r>
+    </w:p>
+    <w:p>
+      <w:pPr>
+        <w:jc w:val="left"/>
+        <w:rPr>
+          <w:rFonts w:eastAsia="DengXian"/>
+        </w:rPr>
+      </w:pPr>
+      <w:r>
+        <w:rPr>
+          <w:rFonts w:eastAsia="DengXian"/>
+        </w:rPr>
+        <w:t>既然拆成了兩個頁面，它們該怎麼溝通？</w:t>
+      </w:r>
+    </w:p>
+    <w:p>
+      <w:pPr>
+        <w:jc w:val="left"/>
+        <w:rPr>
+          <w:rFonts w:eastAsia="DengXian"/>
+        </w:rPr>
+      </w:pPr>
+      <w:r>
+        <w:rPr>
+          <w:rFonts w:eastAsia="DengXian"/>
+        </w:rPr>
+        <w:t xml:space="preserve">（例如：平板按下了「盡情哭吧 GO」，顯示器怎麼知道要開始掉字？） </w:t>
+      </w:r>
+    </w:p>
+    <w:p>
+      <w:pPr>
+        <w:jc w:val="left"/>
+        <w:rPr>
+          <w:rFonts w:eastAsia="DengXian"/>
+        </w:rPr>
+      </w:pPr>
+      <w:r>
+        <w:rPr>
+          <w:rFonts w:eastAsia="DengXian"/>
+        </w:rPr>
+        <w:t>這裡有兩種解決方案，取決於你展場的</w:t>
+      </w:r>
       <w:r>
         <w:rPr>
           <w:rFonts w:eastAsia="DengXian"/>
           <w:b/>
           <w:bCs/>
         </w:rPr>
-        <w:t>方案 A：雙螢幕接在「同一台電腦」上 (使用 BroadcastChannel API)</w:t>
-      </w:r>
-    </w:p>
-    <w:p>
-      <w:pPr>
-        <w:jc w:val="left"/>
-        <w:rPr>
-          <w:rFonts w:eastAsia="DengXian"/>
-        </w:rPr>
-      </w:pPr>
-      <w:r>
-        <w:rPr>
-          <w:rFonts w:eastAsia="DengXian"/>
-        </w:rPr>
-        <w:t>如果你的展場是使用一台效能較好的主機（如 Mac Macni 或 PC），同時外接兩個螢幕（一個掛牆上，一個平放當平板），這是</w:t>
-      </w:r>
-      <w:r>
+        <w:t>硬體配置</w:t>
+      </w:r>
+      <w:r>
+        <w:rPr>
+          <w:rFonts w:eastAsia="DengXian"/>
+        </w:rPr>
+        <w:t>：</w:t>
+      </w:r>
+    </w:p>
+    <w:p>
+      <w:pPr>
+        <w:jc w:val="left"/>
         <w:rPr>
           <w:rFonts w:eastAsia="DengXian"/>
           <w:b/>
           <w:bCs/>
-        </w:rPr>
-        <w:t>最推薦且最簡單</w:t>
-      </w:r>
-      <w:r>
-        <w:rPr>
-          <w:rFonts w:eastAsia="DengXian"/>
-        </w:rPr>
-        <w:t>的做法！</w:t>
-      </w:r>
-    </w:p>
-    <w:p>
-      <w:pPr>
-        <w:jc w:val="left"/>
-        <w:rPr>
-          <w:rFonts w:eastAsia="DengXian"/>
-          <w:lang w:eastAsia="zh-CN"/>
-        </w:rPr>
-      </w:pPr>
-      <w:r>
-        <w:rPr>
-          <w:rFonts w:eastAsia="DengXian"/>
-          <w:lang w:eastAsia="zh-CN"/>
-        </w:rPr>
-        <w:t>不需要寫後端伺服器，直接利用瀏覽器內建的 BroadcastChannel 就能讓兩個分頁秒速溝通：</w:t>
-      </w:r>
-    </w:p>
-    <w:p>
-      <w:pPr>
-        <w:jc w:val="left"/>
-        <w:rPr>
-          <w:rFonts w:eastAsia="DengXian"/>
-          <w:lang w:eastAsia="zh-CN"/>
-        </w:rPr>
-      </w:pPr>
-      <w:r>
+          <w:lang w:eastAsia="zh-CN"/>
+        </w:rPr>
+      </w:pPr>
+    </w:p>
+    <w:p>
+      <w:pPr>
+        <w:jc w:val="left"/>
         <w:rPr>
           <w:rFonts w:eastAsia="DengXian"/>
           <w:b/>
           <w:bCs/>
-          <w:lang w:eastAsia="zh-CN"/>
-        </w:rPr>
-        <w:t>在平板端 (TabletView.jsx) 發送訊號：</w:t>
-      </w:r>
-    </w:p>
-    <w:p>
-      <w:pPr>
-        <w:jc w:val="left"/>
-        <w:rPr>
-          <w:rFonts w:eastAsia="DengXian"/>
-          <w:lang w:eastAsia="zh-CN"/>
-        </w:rPr>
-      </w:pPr>
-      <w:r>
-        <w:rPr>
-          <w:rFonts w:eastAsia="DengXian"/>
-          <w:lang w:eastAsia="zh-CN"/>
-        </w:rPr>
-        <w:t>JavaScript</w:t>
-      </w:r>
-    </w:p>
-    <w:p>
-      <w:pPr>
-        <w:jc w:val="left"/>
-        <w:rPr>
-          <w:rFonts w:eastAsia="DengXian"/>
-          <w:lang w:eastAsia="zh-CN"/>
-        </w:rPr>
-      </w:pPr>
-      <w:r>
-        <w:rPr>
-          <w:rFonts w:eastAsia="DengXian"/>
-          <w:lang w:eastAsia="zh-CN"/>
-        </w:rPr>
-        <w:t>// 建立一個專屬頻道</w:t>
-      </w:r>
-    </w:p>
-    <w:p>
-      <w:pPr>
-        <w:jc w:val="left"/>
-        <w:rPr>
-          <w:rFonts w:eastAsia="DengXian"/>
-          <w:lang w:eastAsia="zh-CN"/>
-        </w:rPr>
-      </w:pPr>
-      <w:r>
-        <w:rPr>
-          <w:rFonts w:eastAsia="DengXian"/>
-          <w:lang w:eastAsia="zh-CN"/>
-        </w:rPr>
-        <w:t>const channel = new BroadcastChannel('tears_art_channel');</w:t>
-      </w:r>
-    </w:p>
-    <w:p>
-      <w:pPr>
-        <w:jc w:val="left"/>
-        <w:rPr>
-          <w:rFonts w:eastAsia="DengXian"/>
-          <w:lang w:eastAsia="zh-CN"/>
-        </w:rPr>
-      </w:pPr>
-    </w:p>
-    <w:p>
-      <w:pPr>
-        <w:jc w:val="left"/>
-        <w:rPr>
-          <w:rFonts w:eastAsia="DengXian"/>
-          <w:lang w:eastAsia="zh-CN"/>
-        </w:rPr>
-      </w:pPr>
-      <w:r>
-        <w:rPr>
-          <w:rFonts w:eastAsia="DengXian"/>
-          <w:lang w:eastAsia="zh-CN"/>
-        </w:rPr>
-        <w:t>const handleCrying = () =&gt; {</w:t>
-      </w:r>
-    </w:p>
-    <w:p>
-      <w:pPr>
-        <w:jc w:val="left"/>
-        <w:rPr>
-          <w:rFonts w:eastAsia="DengXian"/>
-          <w:lang w:eastAsia="zh-CN"/>
-        </w:rPr>
-      </w:pPr>
-      <w:r>
-        <w:rPr>
-          <w:rFonts w:eastAsia="DengXian"/>
-          <w:lang w:eastAsia="zh-CN"/>
-        </w:rPr>
-        <w:t xml:space="preserve">    // 當使用者按下按鈕，發送廣播訊息給所有打開這個頻道的頁面</w:t>
-      </w:r>
-    </w:p>
-    <w:p>
-      <w:pPr>
-        <w:jc w:val="left"/>
-        <w:rPr>
-          <w:rFonts w:eastAsia="DengXian"/>
-          <w:lang w:eastAsia="zh-CN"/>
-        </w:rPr>
-      </w:pPr>
-      <w:r>
-        <w:rPr>
-          <w:rFonts w:eastAsia="DengXian"/>
-          <w:lang w:eastAsia="zh-CN"/>
-        </w:rPr>
-        <w:t xml:space="preserve">    channel.postMessage({ </w:t>
-      </w:r>
-    </w:p>
-    <w:p>
-      <w:pPr>
-        <w:jc w:val="left"/>
-        <w:rPr>
-          <w:rFonts w:eastAsia="DengXian"/>
-          <w:lang w:eastAsia="zh-CN"/>
-        </w:rPr>
-      </w:pPr>
-      <w:r>
-        <w:rPr>
-          <w:rFonts w:eastAsia="DengXian"/>
-          <w:lang w:eastAsia="zh-CN"/>
-        </w:rPr>
-        <w:t xml:space="preserve">        action: 'TRIGGER_CRYING', </w:t>
-      </w:r>
-    </w:p>
-    <w:p>
-      <w:pPr>
-        <w:jc w:val="left"/>
-        <w:rPr>
-          <w:rFonts w:eastAsia="DengXian"/>
-          <w:lang w:eastAsia="zh-CN"/>
-        </w:rPr>
-      </w:pPr>
-      <w:r>
-        <w:rPr>
-          <w:rFonts w:eastAsia="DengXian"/>
-          <w:lang w:eastAsia="zh-CN"/>
-        </w:rPr>
-        <w:lastRenderedPageBreak/>
-        <w:t xml:space="preserve">        words: selectedWords </w:t>
-      </w:r>
-    </w:p>
-    <w:p>
-      <w:pPr>
-        <w:jc w:val="left"/>
-        <w:rPr>
-          <w:rFonts w:eastAsia="DengXian"/>
-          <w:lang w:eastAsia="zh-CN"/>
-        </w:rPr>
-      </w:pPr>
-      <w:r>
-        <w:rPr>
-          <w:rFonts w:eastAsia="DengXian"/>
-          <w:lang w:eastAsia="zh-CN"/>
-        </w:rPr>
-        <w:t xml:space="preserve">    });</w:t>
-      </w:r>
-    </w:p>
-    <w:p>
-      <w:pPr>
-        <w:jc w:val="left"/>
-        <w:rPr>
-          <w:rFonts w:eastAsia="DengXian"/>
-          <w:lang w:eastAsia="zh-CN"/>
-        </w:rPr>
-      </w:pPr>
-      <w:r>
-        <w:rPr>
-          <w:rFonts w:eastAsia="DengXian"/>
-          <w:lang w:eastAsia="zh-CN"/>
-        </w:rPr>
-        <w:t>};</w:t>
-      </w:r>
-    </w:p>
-    <w:p>
-      <w:pPr>
-        <w:jc w:val="left"/>
-        <w:rPr>
-          <w:rFonts w:eastAsia="DengXian"/>
-          <w:lang w:eastAsia="zh-CN"/>
         </w:rPr>
       </w:pPr>
       <w:r>
@@ -1373,270 +1303,179 @@
           <w:rFonts w:eastAsia="DengXian"/>
           <w:b/>
           <w:bCs/>
-          <w:lang w:eastAsia="zh-CN"/>
-        </w:rPr>
-        <w:t>在顯示器端 (MonitorView.jsx) 接收訊號：</w:t>
-      </w:r>
-    </w:p>
-    <w:p>
-      <w:pPr>
-        <w:jc w:val="left"/>
-        <w:rPr>
-          <w:rFonts w:eastAsia="DengXian"/>
-          <w:lang w:eastAsia="zh-CN"/>
-        </w:rPr>
-      </w:pPr>
-      <w:r>
-        <w:rPr>
-          <w:rFonts w:eastAsia="DengXian"/>
-          <w:lang w:eastAsia="zh-CN"/>
-        </w:rPr>
-        <w:t>JavaScript</w:t>
-      </w:r>
-    </w:p>
-    <w:p>
-      <w:pPr>
-        <w:jc w:val="left"/>
-        <w:rPr>
-          <w:rFonts w:eastAsia="DengXian"/>
-          <w:lang w:eastAsia="zh-CN"/>
-        </w:rPr>
-      </w:pPr>
-      <w:r>
-        <w:rPr>
-          <w:rFonts w:eastAsia="DengXian"/>
-          <w:lang w:eastAsia="zh-CN"/>
-        </w:rPr>
-        <w:t>useEffect(() =&gt; {</w:t>
-      </w:r>
-    </w:p>
-    <w:p>
-      <w:pPr>
-        <w:jc w:val="left"/>
-        <w:rPr>
-          <w:rFonts w:eastAsia="DengXian"/>
-          <w:lang w:eastAsia="zh-CN"/>
-        </w:rPr>
-      </w:pPr>
-      <w:r>
-        <w:rPr>
-          <w:rFonts w:eastAsia="DengXian"/>
-          <w:lang w:eastAsia="zh-CN"/>
-        </w:rPr>
-        <w:t xml:space="preserve">    const channel = new BroadcastChannel('tears_art_channel');</w:t>
-      </w:r>
-    </w:p>
-    <w:p>
-      <w:pPr>
-        <w:jc w:val="left"/>
-        <w:rPr>
-          <w:rFonts w:eastAsia="DengXian"/>
-          <w:lang w:eastAsia="zh-CN"/>
-        </w:rPr>
-      </w:pPr>
-      <w:r>
-        <w:rPr>
-          <w:rFonts w:eastAsia="DengXian"/>
-          <w:lang w:eastAsia="zh-CN"/>
-        </w:rPr>
-        <w:t xml:space="preserve">    </w:t>
-      </w:r>
-    </w:p>
-    <w:p>
-      <w:pPr>
-        <w:jc w:val="left"/>
-        <w:rPr>
-          <w:rFonts w:eastAsia="DengXian"/>
-          <w:lang w:eastAsia="zh-CN"/>
-        </w:rPr>
-      </w:pPr>
-      <w:r>
-        <w:rPr>
-          <w:rFonts w:eastAsia="DengXian"/>
-          <w:lang w:eastAsia="zh-CN"/>
-        </w:rPr>
-        <w:t xml:space="preserve">    // 監聽來自平板的廣播</w:t>
-      </w:r>
-    </w:p>
-    <w:p>
-      <w:pPr>
-        <w:jc w:val="left"/>
-        <w:rPr>
-          <w:rFonts w:eastAsia="DengXian"/>
-          <w:lang w:eastAsia="zh-CN"/>
-        </w:rPr>
-      </w:pPr>
-      <w:r>
-        <w:rPr>
-          <w:rFonts w:eastAsia="DengXian"/>
-          <w:lang w:eastAsia="zh-CN"/>
-        </w:rPr>
-        <w:t xml:space="preserve">    channel.onmessage = (event) =&gt; {</w:t>
-      </w:r>
-    </w:p>
-    <w:p>
-      <w:pPr>
-        <w:jc w:val="left"/>
-        <w:rPr>
-          <w:rFonts w:eastAsia="DengXian"/>
-          <w:lang w:eastAsia="zh-CN"/>
-        </w:rPr>
-      </w:pPr>
-      <w:r>
-        <w:rPr>
-          <w:rFonts w:eastAsia="DengXian"/>
-          <w:lang w:eastAsia="zh-CN"/>
-        </w:rPr>
-        <w:t xml:space="preserve">        if (event.data.action === 'TRIGGER_CRYING') {</w:t>
-      </w:r>
-    </w:p>
-    <w:p>
-      <w:pPr>
-        <w:jc w:val="left"/>
-        <w:rPr>
-          <w:rFonts w:eastAsia="DengXian"/>
-          <w:lang w:eastAsia="zh-CN"/>
-        </w:rPr>
-      </w:pPr>
-      <w:r>
-        <w:rPr>
-          <w:rFonts w:eastAsia="DengXian"/>
-          <w:lang w:eastAsia="zh-CN"/>
-        </w:rPr>
-        <w:t xml:space="preserve">            const userWords = event.data.words;</w:t>
-      </w:r>
-    </w:p>
-    <w:p>
-      <w:pPr>
-        <w:jc w:val="left"/>
-        <w:rPr>
-          <w:rFonts w:eastAsia="DengXian"/>
-        </w:rPr>
-      </w:pPr>
-      <w:r>
-        <w:rPr>
-          <w:rFonts w:eastAsia="DengXian"/>
-          <w:lang w:eastAsia="zh-CN"/>
-        </w:rPr>
-        <w:t xml:space="preserve">            </w:t>
-      </w:r>
-      <w:r>
-        <w:rPr>
-          <w:rFonts w:eastAsia="DengXian"/>
-        </w:rPr>
-        <w:t>// 呼叫顯示器的 PIXI 引擎開始掉落文字</w:t>
-      </w:r>
-    </w:p>
-    <w:p>
-      <w:pPr>
-        <w:jc w:val="left"/>
-        <w:rPr>
-          <w:rFonts w:eastAsia="DengXian"/>
-          <w:lang w:eastAsia="zh-CN"/>
-        </w:rPr>
-      </w:pPr>
-      <w:r>
-        <w:rPr>
-          <w:rFonts w:eastAsia="DengXian"/>
-        </w:rPr>
-        <w:t xml:space="preserve">            </w:t>
-      </w:r>
-      <w:r>
-        <w:rPr>
-          <w:rFonts w:eastAsia="DengXian"/>
-          <w:lang w:eastAsia="zh-CN"/>
-        </w:rPr>
-        <w:t>monitorEngine.current.startCrying(userWords);</w:t>
-      </w:r>
-    </w:p>
-    <w:p>
-      <w:pPr>
-        <w:jc w:val="left"/>
-        <w:rPr>
-          <w:rFonts w:eastAsia="DengXian"/>
-          <w:lang w:eastAsia="zh-CN"/>
-        </w:rPr>
-      </w:pPr>
-      <w:r>
-        <w:rPr>
-          <w:rFonts w:eastAsia="DengXian"/>
-          <w:lang w:eastAsia="zh-CN"/>
-        </w:rPr>
-        <w:t xml:space="preserve">        }</w:t>
-      </w:r>
-    </w:p>
-    <w:p>
-      <w:pPr>
-        <w:jc w:val="left"/>
-        <w:rPr>
-          <w:rFonts w:eastAsia="DengXian"/>
-          <w:lang w:eastAsia="zh-CN"/>
-        </w:rPr>
-      </w:pPr>
-      <w:r>
-        <w:rPr>
-          <w:rFonts w:eastAsia="DengXian"/>
-          <w:lang w:eastAsia="zh-CN"/>
-        </w:rPr>
-        <w:t xml:space="preserve">    };</w:t>
-      </w:r>
-    </w:p>
-    <w:p>
-      <w:pPr>
-        <w:jc w:val="left"/>
-        <w:rPr>
-          <w:rFonts w:eastAsia="DengXian"/>
-          <w:lang w:eastAsia="zh-CN"/>
-        </w:rPr>
-      </w:pPr>
-      <w:r>
-        <w:rPr>
-          <w:rFonts w:eastAsia="DengXian"/>
-          <w:lang w:eastAsia="zh-CN"/>
-        </w:rPr>
-        <w:t xml:space="preserve">    </w:t>
-      </w:r>
-    </w:p>
-    <w:p>
-      <w:pPr>
-        <w:jc w:val="left"/>
-        <w:rPr>
-          <w:rFonts w:eastAsia="DengXian"/>
-          <w:lang w:eastAsia="zh-CN"/>
-        </w:rPr>
-      </w:pPr>
-      <w:r>
-        <w:rPr>
-          <w:rFonts w:eastAsia="DengXian"/>
-          <w:lang w:eastAsia="zh-CN"/>
-        </w:rPr>
-        <w:t xml:space="preserve">    return () =&gt; channel.close();</w:t>
-      </w:r>
-    </w:p>
-    <w:p>
-      <w:pPr>
-        <w:jc w:val="left"/>
-        <w:rPr>
-          <w:rFonts w:eastAsia="DengXian"/>
-          <w:lang w:eastAsia="zh-CN"/>
-        </w:rPr>
-      </w:pPr>
-      <w:r>
-        <w:rPr>
-          <w:rFonts w:eastAsia="DengXian"/>
-          <w:lang w:eastAsia="zh-CN"/>
-        </w:rPr>
-        <w:t>}, []);</w:t>
-      </w:r>
-    </w:p>
-    <w:p>
-      <w:pPr>
-        <w:jc w:val="left"/>
-        <w:rPr>
-          <w:rFonts w:eastAsia="DengXian"/>
-          <w:lang w:eastAsia="zh-CN"/>
-        </w:rPr>
-      </w:pPr>
+        </w:rPr>
+        <w:t>方案 A：雙螢幕接在「同一台電腦」上 (使用 BroadcastChannel API)</w:t>
+      </w:r>
+    </w:p>
+    <w:p>
+      <w:pPr>
+        <w:jc w:val="left"/>
+        <w:rPr>
+          <w:rFonts w:eastAsia="DengXian"/>
+        </w:rPr>
+      </w:pPr>
+      <w:r>
+        <w:rPr>
+          <w:rFonts w:eastAsia="DengXian"/>
+        </w:rPr>
+        <w:t>如果你的展場是使用一台效能較好的主機（如 Mac Macni 或 PC），同時外接兩個螢幕（一個掛牆上，一個平放當平板），這是</w:t>
+      </w:r>
+      <w:r>
+        <w:rPr>
+          <w:rFonts w:eastAsia="DengXian"/>
+          <w:b/>
+          <w:bCs/>
+        </w:rPr>
+        <w:t>最推薦且最簡單</w:t>
+      </w:r>
+      <w:r>
+        <w:rPr>
+          <w:rFonts w:eastAsia="DengXian"/>
+        </w:rPr>
+        <w:t>的做法！</w:t>
+      </w:r>
+    </w:p>
+    <w:p>
+      <w:pPr>
+        <w:jc w:val="left"/>
+        <w:rPr>
+          <w:rFonts w:eastAsia="DengXian"/>
+          <w:lang w:eastAsia="zh-CN"/>
+        </w:rPr>
+      </w:pPr>
+      <w:r>
+        <w:rPr>
+          <w:rFonts w:eastAsia="DengXian"/>
+          <w:lang w:eastAsia="zh-CN"/>
+        </w:rPr>
+        <w:t>不需要寫後端伺服器，直接利用瀏覽器內建的 BroadcastChannel 就能讓兩個分頁秒速溝通：</w:t>
+      </w:r>
+    </w:p>
+    <w:p>
+      <w:pPr>
+        <w:jc w:val="left"/>
+        <w:rPr>
+          <w:rFonts w:eastAsia="DengXian"/>
+          <w:noProof/>
+          <w:lang w:eastAsia="zh-CN"/>
+        </w:rPr>
+      </w:pPr>
+      <w:r>
+        <w:rPr>
+          <w:noProof/>
+        </w:rPr>
+        <w:lastRenderedPageBreak/>
+        <w:drawing>
+          <wp:inline distT="0" distB="0" distL="0" distR="0" wp14:anchorId="5831CBF5" wp14:editId="5C93E509">
+            <wp:extent cx="5274310" cy="2571750"/>
+            <wp:effectExtent l="0" t="0" r="2540" b="0"/>
+            <wp:docPr id="1838031858" name="圖片 1"/>
+            <wp:cNvGraphicFramePr>
+              <a:graphicFrameLocks xmlns:a="http://schemas.openxmlformats.org/drawingml/2006/main" noChangeAspect="1"/>
+            </wp:cNvGraphicFramePr>
+            <a:graphic xmlns:a="http://schemas.openxmlformats.org/drawingml/2006/main">
+              <a:graphicData uri="http://schemas.openxmlformats.org/drawingml/2006/picture">
+                <pic:pic xmlns:pic="http://schemas.openxmlformats.org/drawingml/2006/picture">
+                  <pic:nvPicPr>
+                    <pic:cNvPr id="1838031858" name=""/>
+                    <pic:cNvPicPr/>
+                  </pic:nvPicPr>
+                  <pic:blipFill>
+                    <a:blip r:embed="rId8"/>
+                    <a:stretch>
+                      <a:fillRect/>
+                    </a:stretch>
+                  </pic:blipFill>
+                  <pic:spPr>
+                    <a:xfrm>
+                      <a:off x="0" y="0"/>
+                      <a:ext cx="5274310" cy="2571750"/>
+                    </a:xfrm>
+                    <a:prstGeom prst="rect">
+                      <a:avLst/>
+                    </a:prstGeom>
+                  </pic:spPr>
+                </pic:pic>
+              </a:graphicData>
+            </a:graphic>
+          </wp:inline>
+        </w:drawing>
+      </w:r>
+      <w:r>
+        <w:rPr>
+          <w:noProof/>
+        </w:rPr>
+        <w:t xml:space="preserve"> </w:t>
+      </w:r>
+    </w:p>
+    <w:p>
+      <w:pPr>
+        <w:jc w:val="left"/>
+        <w:rPr>
+          <w:rFonts w:eastAsia="DengXian"/>
+          <w:lang w:eastAsia="zh-CN"/>
+        </w:rPr>
+      </w:pPr>
+      <w:r>
+        <w:rPr>
+          <w:noProof/>
+        </w:rPr>
+        <w:drawing>
+          <wp:inline distT="0" distB="0" distL="0" distR="0" wp14:anchorId="0A694788" wp14:editId="4AA50C14">
+            <wp:extent cx="5274310" cy="3165475"/>
+            <wp:effectExtent l="0" t="0" r="2540" b="0"/>
+            <wp:docPr id="178170416" name="圖片 1"/>
+            <wp:cNvGraphicFramePr>
+              <a:graphicFrameLocks xmlns:a="http://schemas.openxmlformats.org/drawingml/2006/main" noChangeAspect="1"/>
+            </wp:cNvGraphicFramePr>
+            <a:graphic xmlns:a="http://schemas.openxmlformats.org/drawingml/2006/main">
+              <a:graphicData uri="http://schemas.openxmlformats.org/drawingml/2006/picture">
+                <pic:pic xmlns:pic="http://schemas.openxmlformats.org/drawingml/2006/picture">
+                  <pic:nvPicPr>
+                    <pic:cNvPr id="178170416" name=""/>
+                    <pic:cNvPicPr/>
+                  </pic:nvPicPr>
+                  <pic:blipFill>
+                    <a:blip r:embed="rId9"/>
+                    <a:stretch>
+                      <a:fillRect/>
+                    </a:stretch>
+                  </pic:blipFill>
+                  <pic:spPr>
+                    <a:xfrm>
+                      <a:off x="0" y="0"/>
+                      <a:ext cx="5274310" cy="3165475"/>
+                    </a:xfrm>
+                    <a:prstGeom prst="rect">
+                      <a:avLst/>
+                    </a:prstGeom>
+                  </pic:spPr>
+                </pic:pic>
+              </a:graphicData>
+            </a:graphic>
+          </wp:inline>
+        </w:drawing>
+      </w:r>
+    </w:p>
+    <w:p>
+      <w:pPr>
+        <w:jc w:val="left"/>
+        <w:rPr>
+          <w:rFonts w:eastAsia="DengXian" w:hint="eastAsia"/>
+          <w:b/>
+          <w:bCs/>
+          <w:lang w:eastAsia="zh-CN"/>
+        </w:rPr>
+      </w:pPr>
+      <w:r>
+        <w:rPr>
+          <w:rFonts w:eastAsia="DengXian"/>
+          <w:b/>
+          <w:bCs/>
+          <w:lang w:eastAsia="zh-CN"/>
+        </w:rPr>
+        <w:t>方案 B：使用兩台「完全不同的實體設備」 (使用 WebSocket / Socket.io)</w:t>
+      </w:r>
     </w:p>
     <w:p>
       <w:pPr>
@@ -1666,7 +1505,7 @@
                     <pic:cNvPicPr/>
                   </pic:nvPicPr>
                   <pic:blipFill>
-                    <a:blip r:embed="rId8"/>
+                    <a:blip r:embed="rId10"/>
                     <a:stretch>
                       <a:fillRect/>
                     </a:stretch>
@@ -1690,72 +1529,203 @@
     <w:p>
       <w:pPr>
         <w:jc w:val="left"/>
+      </w:pPr>
+      <w:r>
+        <w:rPr>
+          <w:noProof/>
+        </w:rPr>
+        <w:lastRenderedPageBreak/>
+        <w:drawing>
+          <wp:inline distT="0" distB="0" distL="0" distR="0" wp14:anchorId="2E9739E9" wp14:editId="6DFE1A54">
+            <wp:extent cx="5274310" cy="1706245"/>
+            <wp:effectExtent l="0" t="0" r="2540" b="8255"/>
+            <wp:docPr id="435516999" name="圖片 1"/>
+            <wp:cNvGraphicFramePr>
+              <a:graphicFrameLocks xmlns:a="http://schemas.openxmlformats.org/drawingml/2006/main" noChangeAspect="1"/>
+            </wp:cNvGraphicFramePr>
+            <a:graphic xmlns:a="http://schemas.openxmlformats.org/drawingml/2006/main">
+              <a:graphicData uri="http://schemas.openxmlformats.org/drawingml/2006/picture">
+                <pic:pic xmlns:pic="http://schemas.openxmlformats.org/drawingml/2006/picture">
+                  <pic:nvPicPr>
+                    <pic:cNvPr id="435516999" name=""/>
+                    <pic:cNvPicPr/>
+                  </pic:nvPicPr>
+                  <pic:blipFill>
+                    <a:blip r:embed="rId11"/>
+                    <a:stretch>
+                      <a:fillRect/>
+                    </a:stretch>
+                  </pic:blipFill>
+                  <pic:spPr>
+                    <a:xfrm>
+                      <a:off x="0" y="0"/>
+                      <a:ext cx="5274310" cy="1706245"/>
+                    </a:xfrm>
+                    <a:prstGeom prst="rect">
+                      <a:avLst/>
+                    </a:prstGeom>
+                  </pic:spPr>
+                </pic:pic>
+              </a:graphicData>
+            </a:graphic>
+          </wp:inline>
+        </w:drawing>
+      </w:r>
+    </w:p>
+    <w:p>
+      <w:pPr>
+        <w:jc w:val="left"/>
+      </w:pPr>
+      <w:r>
+        <w:t>建立中央通訊伺服器</w:t>
+      </w:r>
+      <w:r>
+        <w:t xml:space="preserve"> (server.js)</w:t>
+      </w:r>
+    </w:p>
+    <w:p>
+      <w:pPr>
+        <w:jc w:val="left"/>
+        <w:rPr>
+          <w:rFonts w:hint="eastAsia"/>
+        </w:rPr>
+      </w:pPr>
+      <w:r>
+        <w:rPr>
+          <w:noProof/>
+        </w:rPr>
+        <w:drawing>
+          <wp:inline distT="0" distB="0" distL="0" distR="0" wp14:anchorId="69B8B385" wp14:editId="3FD1D7F3">
+            <wp:extent cx="5274310" cy="1984375"/>
+            <wp:effectExtent l="0" t="0" r="2540" b="0"/>
+            <wp:docPr id="385000223" name="圖片 1"/>
+            <wp:cNvGraphicFramePr>
+              <a:graphicFrameLocks xmlns:a="http://schemas.openxmlformats.org/drawingml/2006/main" noChangeAspect="1"/>
+            </wp:cNvGraphicFramePr>
+            <a:graphic xmlns:a="http://schemas.openxmlformats.org/drawingml/2006/main">
+              <a:graphicData uri="http://schemas.openxmlformats.org/drawingml/2006/picture">
+                <pic:pic xmlns:pic="http://schemas.openxmlformats.org/drawingml/2006/picture">
+                  <pic:nvPicPr>
+                    <pic:cNvPr id="385000223" name=""/>
+                    <pic:cNvPicPr/>
+                  </pic:nvPicPr>
+                  <pic:blipFill>
+                    <a:blip r:embed="rId12"/>
+                    <a:stretch>
+                      <a:fillRect/>
+                    </a:stretch>
+                  </pic:blipFill>
+                  <pic:spPr>
+                    <a:xfrm>
+                      <a:off x="0" y="0"/>
+                      <a:ext cx="5274310" cy="1984375"/>
+                    </a:xfrm>
+                    <a:prstGeom prst="rect">
+                      <a:avLst/>
+                    </a:prstGeom>
+                  </pic:spPr>
+                </pic:pic>
+              </a:graphicData>
+            </a:graphic>
+          </wp:inline>
+        </w:drawing>
+      </w:r>
+    </w:p>
+    <w:p>
+      <w:pPr>
+        <w:jc w:val="left"/>
+      </w:pPr>
+      <w:r>
+        <w:t>192.168.138.1</w:t>
+      </w:r>
+    </w:p>
+    <w:p>
+      <w:pPr>
+        <w:jc w:val="left"/>
+      </w:pPr>
+    </w:p>
+    <w:p>
+      <w:pPr>
+        <w:jc w:val="left"/>
+        <w:rPr>
+          <w:rFonts w:hint="eastAsia"/>
+        </w:rPr>
+      </w:pPr>
+    </w:p>
+    <w:p>
+      <w:pPr>
+        <w:jc w:val="left"/>
+        <w:rPr>
+          <w:rFonts w:hint="eastAsia"/>
+        </w:rPr>
+      </w:pPr>
+      <w:r>
+        <w:rPr>
+          <w:rFonts w:hint="eastAsia"/>
+        </w:rPr>
+        <w:t>第三步：</w:t>
+      </w:r>
+      <w:r>
+        <w:rPr>
+          <w:rFonts w:hint="eastAsia"/>
+        </w:rPr>
+        <w:t>PIXI</w:t>
+      </w:r>
+      <w:r>
+        <w:rPr>
+          <w:rFonts w:hint="eastAsia"/>
+        </w:rPr>
+        <w:t>引擎檔案拆分</w:t>
+      </w:r>
+    </w:p>
+    <w:p>
+      <w:pPr>
+        <w:jc w:val="left"/>
         <w:rPr>
           <w:rFonts w:eastAsia="DengXian" w:hint="eastAsia"/>
           <w:lang w:eastAsia="zh-CN"/>
         </w:rPr>
       </w:pPr>
-    </w:p>
-    <w:p>
-      <w:pPr>
-        <w:jc w:val="left"/>
-        <w:rPr>
-          <w:rFonts w:eastAsia="DengXian"/>
-          <w:b/>
-          <w:bCs/>
-          <w:lang w:eastAsia="zh-CN"/>
-        </w:rPr>
-      </w:pPr>
-      <w:r>
-        <w:rPr>
-          <w:rFonts w:eastAsia="DengXian"/>
-          <w:b/>
-          <w:bCs/>
-          <w:lang w:eastAsia="zh-CN"/>
-        </w:rPr>
-        <w:t>方案 B：使用兩台「完全不同的實體設備」 (使用 WebSocket / Socket.io)</w:t>
-      </w:r>
-    </w:p>
-    <w:p>
-      <w:pPr>
-        <w:jc w:val="left"/>
-        <w:rPr>
-          <w:rFonts w:eastAsia="DengXian"/>
-          <w:lang w:eastAsia="zh-CN"/>
-        </w:rPr>
-      </w:pPr>
-      <w:r>
-        <w:rPr>
-          <w:rFonts w:eastAsia="DengXian"/>
-          <w:lang w:eastAsia="zh-CN"/>
-        </w:rPr>
-        <w:t>如果你的顯示器是一台電腦，而平板是</w:t>
-      </w:r>
-      <w:r>
-        <w:rPr>
-          <w:rFonts w:eastAsia="DengXian"/>
-          <w:b/>
-          <w:bCs/>
-          <w:lang w:eastAsia="zh-CN"/>
-        </w:rPr>
-        <w:t>一台真正的 iPad</w:t>
-      </w:r>
-      <w:r>
-        <w:rPr>
-          <w:rFonts w:eastAsia="DengXian"/>
-          <w:lang w:eastAsia="zh-CN"/>
-        </w:rPr>
-        <w:t>（兩台設備只是連著同一個 Wi-Fi）。 因為它們在不同的機器上，BroadcastChannel 就失效了。你必須在</w:t>
-      </w:r>
-    </w:p>
-    <w:p>
-      <w:pPr>
-        <w:jc w:val="left"/>
-        <w:rPr>
-          <w:rFonts w:eastAsia="DengXian" w:hint="eastAsia"/>
-          <w:lang w:eastAsia="zh-CN"/>
-        </w:rPr>
-      </w:pPr>
+      <w:r>
+        <w:rPr>
+          <w:noProof/>
+        </w:rPr>
+        <w:drawing>
+          <wp:inline distT="0" distB="0" distL="0" distR="0" wp14:anchorId="768CEA04" wp14:editId="43AF0DDD">
+            <wp:extent cx="5274310" cy="2133600"/>
+            <wp:effectExtent l="0" t="0" r="2540" b="0"/>
+            <wp:docPr id="86348523" name="圖片 1"/>
+            <wp:cNvGraphicFramePr>
+              <a:graphicFrameLocks xmlns:a="http://schemas.openxmlformats.org/drawingml/2006/main" noChangeAspect="1"/>
+            </wp:cNvGraphicFramePr>
+            <a:graphic xmlns:a="http://schemas.openxmlformats.org/drawingml/2006/main">
+              <a:graphicData uri="http://schemas.openxmlformats.org/drawingml/2006/picture">
+                <pic:pic xmlns:pic="http://schemas.openxmlformats.org/drawingml/2006/picture">
+                  <pic:nvPicPr>
+                    <pic:cNvPr id="86348523" name=""/>
+                    <pic:cNvPicPr/>
+                  </pic:nvPicPr>
+                  <pic:blipFill>
+                    <a:blip r:embed="rId13"/>
+                    <a:stretch>
+                      <a:fillRect/>
+                    </a:stretch>
+                  </pic:blipFill>
+                  <pic:spPr>
+                    <a:xfrm>
+                      <a:off x="0" y="0"/>
+                      <a:ext cx="5274310" cy="2133600"/>
+                    </a:xfrm>
+                    <a:prstGeom prst="rect">
+                      <a:avLst/>
+                    </a:prstGeom>
+                  </pic:spPr>
+                </pic:pic>
+              </a:graphicData>
+            </a:graphic>
+          </wp:inline>
+        </w:drawing>
+      </w:r>
     </w:p>
     <w:p>
       <w:pPr>
@@ -1868,7 +1838,7 @@
                     <pic:cNvPicPr/>
                   </pic:nvPicPr>
                   <pic:blipFill>
-                    <a:blip r:embed="rId9"/>
+                    <a:blip r:embed="rId14"/>
                     <a:stretch>
                       <a:fillRect/>
                     </a:stretch>
@@ -1913,7 +1883,7 @@
                     <pic:cNvPicPr/>
                   </pic:nvPicPr>
                   <pic:blipFill>
-                    <a:blip r:embed="rId10"/>
+                    <a:blip r:embed="rId15"/>
                     <a:stretch>
                       <a:fillRect/>
                     </a:stretch>
@@ -1959,7 +1929,7 @@
                     <pic:cNvPicPr/>
                   </pic:nvPicPr>
                   <pic:blipFill>
-                    <a:blip r:embed="rId11"/>
+                    <a:blip r:embed="rId16"/>
                     <a:stretch>
                       <a:fillRect/>
                     </a:stretch>
@@ -2009,7 +1979,7 @@
                     <pic:cNvPicPr/>
                   </pic:nvPicPr>
                   <pic:blipFill>
-                    <a:blip r:embed="rId12"/>
+                    <a:blip r:embed="rId17"/>
                     <a:stretch>
                       <a:fillRect/>
                     </a:stretch>
@@ -2054,7 +2024,7 @@
                     <pic:cNvPicPr/>
                   </pic:nvPicPr>
                   <pic:blipFill>
-                    <a:blip r:embed="rId13"/>
+                    <a:blip r:embed="rId18"/>
                     <a:stretch>
                       <a:fillRect/>
                     </a:stretch>
@@ -2100,7 +2070,7 @@
                     <pic:cNvPicPr/>
                   </pic:nvPicPr>
                   <pic:blipFill>
-                    <a:blip r:embed="rId14"/>
+                    <a:blip r:embed="rId19"/>
                     <a:stretch>
                       <a:fillRect/>
                     </a:stretch>
@@ -2145,7 +2115,7 @@
                     <pic:cNvPicPr/>
                   </pic:nvPicPr>
                   <pic:blipFill>
-                    <a:blip r:embed="rId15"/>
+                    <a:blip r:embed="rId20"/>
                     <a:stretch>
                       <a:fillRect/>
                     </a:stretch>
@@ -2190,7 +2160,7 @@
                     <pic:cNvPicPr/>
                   </pic:nvPicPr>
                   <pic:blipFill>
-                    <a:blip r:embed="rId16"/>
+                    <a:blip r:embed="rId21"/>
                     <a:stretch>
                       <a:fillRect/>
                     </a:stretch>
@@ -2236,7 +2206,7 @@
                     <pic:cNvPicPr/>
                   </pic:nvPicPr>
                   <pic:blipFill>
-                    <a:blip r:embed="rId17"/>
+                    <a:blip r:embed="rId22"/>
                     <a:stretch>
                       <a:fillRect/>
                     </a:stretch>

</xml_diff>

<commit_message>
0.13.1 refactor(tablet): extract gem rotation speeds into centralized constants
</commit_message>
<xml_diff>
--- a/To do.docx
+++ b/To do.docx
@@ -34,7 +34,7 @@
           </w:rPr>
           <w:id w:val="-8457041"/>
           <w14:checkbox>
-            <w14:checked w14:val="0"/>
+            <w14:checked w14:val="1"/>
             <w14:checkedState w14:val="2612" w14:font="MS Gothic"/>
             <w14:uncheckedState w14:val="2610" w14:font="MS Gothic"/>
           </w14:checkbox>
@@ -45,7 +45,7 @@
               <w:rFonts w:ascii="MS Gothic" w:eastAsia="MS Gothic" w:hAnsi="MS Gothic" w:hint="eastAsia"/>
               <w:lang w:eastAsia="zh-CN"/>
             </w:rPr>
-            <w:t>☐</w:t>
+            <w:t>☒</w:t>
           </w:r>
         </w:sdtContent>
       </w:sdt>
@@ -80,7 +80,7 @@
           </w:rPr>
           <w:id w:val="-1995182535"/>
           <w14:checkbox>
-            <w14:checked w14:val="0"/>
+            <w14:checked w14:val="1"/>
             <w14:checkedState w14:val="2612" w14:font="MS Gothic"/>
             <w14:uncheckedState w14:val="2610" w14:font="MS Gothic"/>
           </w14:checkbox>
@@ -91,7 +91,7 @@
               <w:rFonts w:ascii="MS Gothic" w:eastAsia="MS Gothic" w:hAnsi="MS Gothic" w:hint="eastAsia"/>
               <w:lang w:eastAsia="zh-CN"/>
             </w:rPr>
-            <w:t>☐</w:t>
+            <w:t>☒</w:t>
           </w:r>
         </w:sdtContent>
       </w:sdt>
@@ -153,7 +153,7 @@
           <w:rFonts w:asciiTheme="minorEastAsia" w:hAnsiTheme="minorEastAsia" w:hint="eastAsia"/>
           <w:lang w:eastAsia="zh-CN"/>
         </w:rPr>
-        <w:t>1秒30，轉一圈也是30張</w:t>
+        <w:t>1秒30，轉一圈30張</w:t>
       </w:r>
       <w:r>
         <w:rPr>
@@ -200,6 +200,12 @@
         </w:rPr>
         <w:t xml:space="preserve"> 20個水波紋文字圖</w:t>
       </w:r>
+      <w:r>
+        <w:rPr>
+          <w:rFonts w:asciiTheme="minorEastAsia" w:hAnsiTheme="minorEastAsia" w:hint="eastAsia"/>
+        </w:rPr>
+        <w:t>(變形變色)</w:t>
+      </w:r>
     </w:p>
     <w:p>
       <w:pPr>
@@ -302,7 +308,7 @@
           </w:rPr>
           <w:id w:val="1562210606"/>
           <w14:checkbox>
-            <w14:checked w14:val="0"/>
+            <w14:checked w14:val="1"/>
             <w14:checkedState w14:val="2612" w14:font="MS Gothic"/>
             <w14:uncheckedState w14:val="2610" w14:font="MS Gothic"/>
           </w14:checkbox>
@@ -313,7 +319,7 @@
               <w:rFonts w:ascii="MS Gothic" w:eastAsia="MS Gothic" w:hAnsi="MS Gothic" w:hint="eastAsia"/>
               <w:lang w:eastAsia="zh-CN"/>
             </w:rPr>
-            <w:t>☐</w:t>
+            <w:t>☒</w:t>
           </w:r>
         </w:sdtContent>
       </w:sdt>
@@ -357,8 +363,7 @@
       <w:pPr>
         <w:jc w:val="left"/>
         <w:rPr>
-          <w:rFonts w:ascii="微軟正黑體" w:eastAsia="DengXian" w:hAnsi="微軟正黑體" w:cs="微軟正黑體"/>
-          <w:lang w:eastAsia="zh-CN"/>
+          <w:rFonts w:asciiTheme="minorEastAsia" w:hAnsiTheme="minorEastAsia"/>
         </w:rPr>
       </w:pPr>
       <w:sdt>
@@ -366,7 +371,7 @@
           <w:rPr>
             <w:rFonts w:eastAsia="DengXian" w:hint="eastAsia"/>
           </w:rPr>
-          <w:id w:val="1112555195"/>
+          <w:id w:val="-532811772"/>
           <w14:checkbox>
             <w14:checked w14:val="0"/>
             <w14:checkedState w14:val="2612" w14:font="MS Gothic"/>
@@ -384,32 +389,62 @@
       </w:sdt>
       <w:r>
         <w:rPr>
-          <w:rFonts w:asciiTheme="minorEastAsia" w:hAnsiTheme="minorEastAsia" w:hint="eastAsia"/>
-        </w:rPr>
-        <w:t xml:space="preserve"> UI</w:t>
-      </w:r>
-      <w:r>
-        <w:rPr>
-          <w:rFonts w:ascii="微軟正黑體" w:eastAsia="DengXian" w:hAnsi="微軟正黑體" w:cs="微軟正黑體" w:hint="eastAsia"/>
-          <w:lang w:eastAsia="zh-CN"/>
-        </w:rPr>
-        <w:t>套用</w:t>
-      </w:r>
-    </w:p>
-    <w:p>
-      <w:pPr>
-        <w:jc w:val="left"/>
-        <w:rPr>
-          <w:rFonts w:eastAsia="DengXian"/>
-          <w:lang w:eastAsia="zh-CN"/>
-        </w:rPr>
-      </w:pPr>
+          <w:rFonts w:hint="eastAsia"/>
+        </w:rPr>
+        <w:t xml:space="preserve"> </w:t>
+      </w:r>
+      <w:proofErr w:type="gramStart"/>
+      <w:r>
+        <w:rPr>
+          <w:rFonts w:hint="eastAsia"/>
+        </w:rPr>
+        <w:t>音效實裝</w:t>
+      </w:r>
+      <w:proofErr w:type="gramEnd"/>
+      <w:r>
+        <w:br/>
+      </w:r>
       <w:sdt>
         <w:sdtPr>
           <w:rPr>
             <w:rFonts w:eastAsia="DengXian" w:hint="eastAsia"/>
           </w:rPr>
-          <w:id w:val="-1247256250"/>
+          <w:id w:val="960685441"/>
+          <w14:checkbox>
+            <w14:checked w14:val="1"/>
+            <w14:checkedState w14:val="2612" w14:font="MS Gothic"/>
+            <w14:uncheckedState w14:val="2610" w14:font="MS Gothic"/>
+          </w14:checkbox>
+        </w:sdtPr>
+        <w:sdtContent>
+          <w:r>
+            <w:rPr>
+              <w:rFonts w:ascii="MS Gothic" w:eastAsia="MS Gothic" w:hAnsi="MS Gothic" w:hint="eastAsia"/>
+            </w:rPr>
+            <w:t>☒</w:t>
+          </w:r>
+        </w:sdtContent>
+      </w:sdt>
+      <w:r>
+        <w:rPr>
+          <w:rFonts w:asciiTheme="minorEastAsia" w:hAnsiTheme="minorEastAsia" w:hint="eastAsia"/>
+        </w:rPr>
+        <w:t xml:space="preserve"> 寶石5個轉速可單獨調整</w:t>
+      </w:r>
+    </w:p>
+    <w:p>
+      <w:pPr>
+        <w:jc w:val="left"/>
+        <w:rPr>
+          <w:rFonts w:asciiTheme="minorEastAsia" w:hAnsiTheme="minorEastAsia"/>
+        </w:rPr>
+      </w:pPr>
+      <w:sdt>
+        <w:sdtPr>
+          <w:rPr>
+            <w:rFonts w:eastAsia="DengXian" w:hint="eastAsia"/>
+          </w:rPr>
+          <w:id w:val="-1334440631"/>
           <w14:checkbox>
             <w14:checked w14:val="0"/>
             <w14:checkedState w14:val="2612" w14:font="MS Gothic"/>
@@ -427,18 +462,16 @@
       </w:sdt>
       <w:r>
         <w:rPr>
-          <w:rFonts w:eastAsia="DengXian" w:hint="eastAsia"/>
-          <w:lang w:eastAsia="zh-CN"/>
-        </w:rPr>
-        <w:t xml:space="preserve"> React的单界面拆成两个页面</w:t>
-      </w:r>
-    </w:p>
-    <w:p>
-      <w:pPr>
-        <w:jc w:val="left"/>
-        <w:rPr>
-          <w:rFonts w:eastAsia="DengXian"/>
-          <w:lang w:eastAsia="zh-CN"/>
+          <w:rFonts w:asciiTheme="minorEastAsia" w:hAnsiTheme="minorEastAsia" w:hint="eastAsia"/>
+        </w:rPr>
+        <w:t xml:space="preserve"> 寶石大小數據遷出</w:t>
+      </w:r>
+    </w:p>
+    <w:p>
+      <w:pPr>
+        <w:jc w:val="left"/>
+        <w:rPr>
+          <w:rFonts w:asciiTheme="minorEastAsia" w:hAnsiTheme="minorEastAsia"/>
         </w:rPr>
       </w:pPr>
       <w:sdt>
@@ -446,7 +479,7 @@
           <w:rPr>
             <w:rFonts w:eastAsia="DengXian" w:hint="eastAsia"/>
           </w:rPr>
-          <w:id w:val="2142530858"/>
+          <w:id w:val="375743201"/>
           <w14:checkbox>
             <w14:checked w14:val="0"/>
             <w14:checkedState w14:val="2612" w14:font="MS Gothic"/>
@@ -464,9 +497,208 @@
       </w:sdt>
       <w:r>
         <w:rPr>
+          <w:rFonts w:asciiTheme="minorEastAsia" w:hAnsiTheme="minorEastAsia" w:hint="eastAsia"/>
+        </w:rPr>
+        <w:t xml:space="preserve"> 文字圖速度，待機模糊數據遷出</w:t>
+      </w:r>
+    </w:p>
+    <w:p>
+      <w:pPr>
+        <w:jc w:val="left"/>
+        <w:rPr>
+          <w:rFonts w:asciiTheme="minorEastAsia" w:hAnsiTheme="minorEastAsia"/>
+        </w:rPr>
+      </w:pPr>
+      <w:sdt>
+        <w:sdtPr>
+          <w:rPr>
+            <w:rFonts w:eastAsia="DengXian" w:hint="eastAsia"/>
+          </w:rPr>
+          <w:id w:val="881442455"/>
+          <w14:checkbox>
+            <w14:checked w14:val="0"/>
+            <w14:checkedState w14:val="2612" w14:font="MS Gothic"/>
+            <w14:uncheckedState w14:val="2610" w14:font="MS Gothic"/>
+          </w14:checkbox>
+        </w:sdtPr>
+        <w:sdtContent>
+          <w:r>
+            <w:rPr>
+              <w:rFonts w:ascii="MS Gothic" w:eastAsia="MS Gothic" w:hAnsi="MS Gothic" w:hint="eastAsia"/>
+            </w:rPr>
+            <w:t>☐</w:t>
+          </w:r>
+        </w:sdtContent>
+      </w:sdt>
+      <w:r>
+        <w:rPr>
+          <w:rFonts w:asciiTheme="minorEastAsia" w:hAnsiTheme="minorEastAsia" w:hint="eastAsia"/>
+        </w:rPr>
+        <w:t xml:space="preserve"> 遊玩錄製</w:t>
+      </w:r>
+      <w:r>
+        <w:rPr>
+          <w:rFonts w:asciiTheme="minorEastAsia" w:hAnsiTheme="minorEastAsia" w:hint="eastAsia"/>
+        </w:rPr>
+        <w:t xml:space="preserve"> (5個寶石)</w:t>
+      </w:r>
+    </w:p>
+    <w:p>
+      <w:pPr>
+        <w:jc w:val="left"/>
+        <w:rPr>
+          <w:rFonts w:hint="eastAsia"/>
+        </w:rPr>
+      </w:pPr>
+      <w:sdt>
+        <w:sdtPr>
+          <w:rPr>
+            <w:rFonts w:eastAsia="DengXian" w:hint="eastAsia"/>
+          </w:rPr>
+          <w:id w:val="1870637296"/>
+          <w14:checkbox>
+            <w14:checked w14:val="0"/>
+            <w14:checkedState w14:val="2612" w14:font="MS Gothic"/>
+            <w14:uncheckedState w14:val="2610" w14:font="MS Gothic"/>
+          </w14:checkbox>
+        </w:sdtPr>
+        <w:sdtContent>
+          <w:r>
+            <w:rPr>
+              <w:rFonts w:ascii="MS Gothic" w:eastAsia="MS Gothic" w:hAnsi="MS Gothic" w:hint="eastAsia"/>
+            </w:rPr>
+            <w:t>☐</w:t>
+          </w:r>
+        </w:sdtContent>
+      </w:sdt>
+      <w:r>
+        <w:rPr>
+          <w:rFonts w:asciiTheme="minorEastAsia" w:hAnsiTheme="minorEastAsia" w:hint="eastAsia"/>
+        </w:rPr>
+        <w:t xml:space="preserve"> 回饋</w:t>
+      </w:r>
+    </w:p>
+    <w:p>
+      <w:pPr>
+        <w:jc w:val="left"/>
+        <w:rPr>
+          <w:rFonts w:ascii="微軟正黑體" w:eastAsia="DengXian" w:hAnsi="微軟正黑體" w:cs="微軟正黑體"/>
+          <w:lang w:eastAsia="zh-CN"/>
+        </w:rPr>
+      </w:pPr>
+      <w:sdt>
+        <w:sdtPr>
+          <w:rPr>
+            <w:rFonts w:eastAsia="DengXian" w:hint="eastAsia"/>
+            <w:lang w:eastAsia="zh-CN"/>
+          </w:rPr>
+          <w:id w:val="1112555195"/>
+          <w14:checkbox>
+            <w14:checked w14:val="1"/>
+            <w14:checkedState w14:val="2612" w14:font="MS Gothic"/>
+            <w14:uncheckedState w14:val="2610" w14:font="MS Gothic"/>
+          </w14:checkbox>
+        </w:sdtPr>
+        <w:sdtContent>
+          <w:r>
+            <w:rPr>
+              <w:rFonts w:ascii="MS Gothic" w:eastAsia="MS Gothic" w:hAnsi="MS Gothic" w:hint="eastAsia"/>
+              <w:lang w:eastAsia="zh-CN"/>
+            </w:rPr>
+            <w:t>☒</w:t>
+          </w:r>
+        </w:sdtContent>
+      </w:sdt>
+      <w:r>
+        <w:rPr>
+          <w:rFonts w:asciiTheme="minorEastAsia" w:hAnsiTheme="minorEastAsia" w:hint="eastAsia"/>
+          <w:lang w:eastAsia="zh-CN"/>
+        </w:rPr>
+        <w:t xml:space="preserve"> UI</w:t>
+      </w:r>
+      <w:r>
+        <w:rPr>
+          <w:rFonts w:ascii="微軟正黑體" w:eastAsia="DengXian" w:hAnsi="微軟正黑體" w:cs="微軟正黑體" w:hint="eastAsia"/>
+          <w:lang w:eastAsia="zh-CN"/>
+        </w:rPr>
+        <w:t>套用</w:t>
+      </w:r>
+    </w:p>
+    <w:p>
+      <w:pPr>
+        <w:jc w:val="left"/>
+        <w:rPr>
+          <w:rFonts w:eastAsia="DengXian"/>
+          <w:lang w:eastAsia="zh-CN"/>
+        </w:rPr>
+      </w:pPr>
+      <w:sdt>
+        <w:sdtPr>
+          <w:rPr>
+            <w:rFonts w:eastAsia="DengXian" w:hint="eastAsia"/>
+            <w:lang w:eastAsia="zh-CN"/>
+          </w:rPr>
+          <w:id w:val="-1247256250"/>
+          <w14:checkbox>
+            <w14:checked w14:val="1"/>
+            <w14:checkedState w14:val="2612" w14:font="MS Gothic"/>
+            <w14:uncheckedState w14:val="2610" w14:font="MS Gothic"/>
+          </w14:checkbox>
+        </w:sdtPr>
+        <w:sdtContent>
+          <w:r>
+            <w:rPr>
+              <w:rFonts w:ascii="MS Gothic" w:eastAsia="MS Gothic" w:hAnsi="MS Gothic" w:hint="eastAsia"/>
+              <w:lang w:eastAsia="zh-CN"/>
+            </w:rPr>
+            <w:t>☒</w:t>
+          </w:r>
+        </w:sdtContent>
+      </w:sdt>
+      <w:r>
+        <w:rPr>
           <w:rFonts w:eastAsia="DengXian" w:hint="eastAsia"/>
           <w:lang w:eastAsia="zh-CN"/>
         </w:rPr>
+        <w:t xml:space="preserve"> React的单界面拆成两个页面</w:t>
+      </w:r>
+    </w:p>
+    <w:p>
+      <w:pPr>
+        <w:jc w:val="left"/>
+        <w:rPr>
+          <w:rFonts w:eastAsia="DengXian"/>
+          <w:lang w:eastAsia="zh-CN"/>
+        </w:rPr>
+      </w:pPr>
+      <w:sdt>
+        <w:sdtPr>
+          <w:rPr>
+            <w:rFonts w:eastAsia="DengXian" w:hint="eastAsia"/>
+            <w:lang w:eastAsia="zh-CN"/>
+          </w:rPr>
+          <w:id w:val="2142530858"/>
+          <w14:checkbox>
+            <w14:checked w14:val="1"/>
+            <w14:checkedState w14:val="2612" w14:font="MS Gothic"/>
+            <w14:uncheckedState w14:val="2610" w14:font="MS Gothic"/>
+          </w14:checkbox>
+        </w:sdtPr>
+        <w:sdtContent>
+          <w:r>
+            <w:rPr>
+              <w:rFonts w:ascii="MS Gothic" w:eastAsia="MS Gothic" w:hAnsi="MS Gothic" w:hint="eastAsia"/>
+              <w:lang w:eastAsia="zh-CN"/>
+            </w:rPr>
+            <w:t>☒</w:t>
+          </w:r>
+        </w:sdtContent>
+      </w:sdt>
+      <w:r>
+        <w:rPr>
+          <w:rFonts w:eastAsia="DengXian" w:hint="eastAsia"/>
+          <w:lang w:eastAsia="zh-CN"/>
+        </w:rPr>
         <w:t xml:space="preserve"> 平板待机动画实装</w:t>
       </w:r>
     </w:p>
@@ -474,8 +706,7 @@
       <w:pPr>
         <w:jc w:val="left"/>
         <w:rPr>
-          <w:rFonts w:eastAsia="DengXian" w:hint="eastAsia"/>
-          <w:lang w:eastAsia="zh-CN"/>
+          <w:rFonts w:eastAsia="DengXian"/>
         </w:rPr>
       </w:pPr>
       <w:sdt>
@@ -502,7 +733,6 @@
       <w:r>
         <w:rPr>
           <w:rFonts w:eastAsia="DengXian" w:hint="eastAsia"/>
-          <w:lang w:eastAsia="zh-CN"/>
         </w:rPr>
         <w:t xml:space="preserve"> GPU预设修改</w:t>
       </w:r>
@@ -518,7 +748,7 @@
           </w:rPr>
           <w:id w:val="-435906838"/>
           <w14:checkbox>
-            <w14:checked w14:val="0"/>
+            <w14:checked w14:val="1"/>
             <w14:checkedState w14:val="2612" w14:font="MS Gothic"/>
             <w14:uncheckedState w14:val="2610" w14:font="MS Gothic"/>
           </w14:checkbox>
@@ -528,7 +758,7 @@
             <w:rPr>
               <w:rFonts w:ascii="MS Gothic" w:eastAsia="MS Gothic" w:hAnsi="MS Gothic" w:hint="eastAsia"/>
             </w:rPr>
-            <w:t>☐</w:t>
+            <w:t>☒</w:t>
           </w:r>
         </w:sdtContent>
       </w:sdt>
@@ -542,7 +772,21 @@
         <w:rPr>
           <w:rFonts w:asciiTheme="minorEastAsia" w:hAnsiTheme="minorEastAsia" w:hint="eastAsia"/>
         </w:rPr>
-        <w:t>UI設計(改成小字小框長方形小圓角，加入橫向分隔線，按鈕與標題和開始互動按鈕用粗分隔線，20個字詞的選框之間用較細的分隔線</w:t>
+        <w:t>UI設計(改成</w:t>
+      </w:r>
+      <w:proofErr w:type="gramStart"/>
+      <w:r>
+        <w:rPr>
+          <w:rFonts w:asciiTheme="minorEastAsia" w:hAnsiTheme="minorEastAsia" w:hint="eastAsia"/>
+        </w:rPr>
+        <w:t>小字小框長方形</w:t>
+      </w:r>
+      <w:proofErr w:type="gramEnd"/>
+      <w:r>
+        <w:rPr>
+          <w:rFonts w:asciiTheme="minorEastAsia" w:hAnsiTheme="minorEastAsia" w:hint="eastAsia"/>
+        </w:rPr>
+        <w:t>小圓角，加入橫向分隔線，按鈕與標題和開始互動按鈕用粗分隔線，20個字詞的選框之間用較細的分隔線</w:t>
       </w:r>
       <w:r>
         <w:rPr>
@@ -594,6 +838,12 @@
         </w:rPr>
         <w:t>UI文字描述修改</w:t>
       </w:r>
+      <w:r>
+        <w:rPr>
+          <w:rFonts w:asciiTheme="minorEastAsia" w:hAnsiTheme="minorEastAsia" w:hint="eastAsia"/>
+        </w:rPr>
+        <w:t>，加入回饋文字對應的寶石描述</w:t>
+      </w:r>
     </w:p>
     <w:p>
       <w:pPr>
@@ -609,7 +859,7 @@
           </w:rPr>
           <w:id w:val="1232651796"/>
           <w14:checkbox>
-            <w14:checked w14:val="0"/>
+            <w14:checked w14:val="1"/>
             <w14:checkedState w14:val="2612" w14:font="MS Gothic"/>
             <w14:uncheckedState w14:val="2610" w14:font="MS Gothic"/>
           </w14:checkbox>
@@ -619,7 +869,7 @@
             <w:rPr>
               <w:rFonts w:ascii="MS Gothic" w:eastAsia="MS Gothic" w:hAnsi="MS Gothic" w:hint="eastAsia"/>
             </w:rPr>
-            <w:t>☐</w:t>
+            <w:t>☒</w:t>
           </w:r>
         </w:sdtContent>
       </w:sdt>
@@ -755,28 +1005,62 @@
           <w:lang w:eastAsia="zh-CN"/>
         </w:rPr>
       </w:pPr>
-      <w:r>
-        <w:rPr>
-          <w:rFonts w:eastAsia="DengXian"/>
-          <w:lang w:eastAsia="zh-CN"/>
-        </w:rPr>
-        <w:t>npm install react-router-dom</w:t>
-      </w:r>
-    </w:p>
-    <w:p>
-      <w:pPr>
-        <w:jc w:val="left"/>
-        <w:rPr>
-          <w:rFonts w:eastAsia="DengXian"/>
-          <w:lang w:eastAsia="zh-CN"/>
-        </w:rPr>
-      </w:pPr>
-      <w:r>
-        <w:rPr>
-          <w:rFonts w:eastAsia="DengXian"/>
-          <w:lang w:eastAsia="zh-CN"/>
-        </w:rPr>
-        <w:t xml:space="preserve"># 安裝前端 Socket 用戶端 </w:t>
+      <w:proofErr w:type="spellStart"/>
+      <w:r>
+        <w:rPr>
+          <w:rFonts w:eastAsia="DengXian"/>
+          <w:lang w:eastAsia="zh-CN"/>
+        </w:rPr>
+        <w:t>npm</w:t>
+      </w:r>
+      <w:proofErr w:type="spellEnd"/>
+      <w:r>
+        <w:rPr>
+          <w:rFonts w:eastAsia="DengXian"/>
+          <w:lang w:eastAsia="zh-CN"/>
+        </w:rPr>
+        <w:t xml:space="preserve"> install react-router-</w:t>
+      </w:r>
+      <w:proofErr w:type="spellStart"/>
+      <w:r>
+        <w:rPr>
+          <w:rFonts w:eastAsia="DengXian"/>
+          <w:lang w:eastAsia="zh-CN"/>
+        </w:rPr>
+        <w:t>dom</w:t>
+      </w:r>
+      <w:proofErr w:type="spellEnd"/>
+    </w:p>
+    <w:p>
+      <w:pPr>
+        <w:jc w:val="left"/>
+        <w:rPr>
+          <w:rFonts w:eastAsia="DengXian"/>
+          <w:lang w:eastAsia="zh-CN"/>
+        </w:rPr>
+      </w:pPr>
+      <w:r>
+        <w:rPr>
+          <w:rFonts w:eastAsia="DengXian"/>
+          <w:lang w:eastAsia="zh-CN"/>
+        </w:rPr>
+        <w:t># 安裝前端 Socket 用</w:t>
+      </w:r>
+      <w:proofErr w:type="gramStart"/>
+      <w:r>
+        <w:rPr>
+          <w:rFonts w:eastAsia="DengXian"/>
+          <w:lang w:eastAsia="zh-CN"/>
+        </w:rPr>
+        <w:t>戶</w:t>
+      </w:r>
+      <w:proofErr w:type="gramEnd"/>
+      <w:r>
+        <w:rPr>
+          <w:rFonts w:eastAsia="DengXian"/>
+          <w:lang w:eastAsia="zh-CN"/>
+        </w:rPr>
+        <w:t xml:space="preserve">端 </w:t>
       </w:r>
     </w:p>
     <w:p>
@@ -788,28 +1072,85 @@
           <w:lang w:eastAsia="zh-CN"/>
         </w:rPr>
       </w:pPr>
-      <w:r>
-        <w:rPr>
-          <w:rFonts w:eastAsia="DengXian"/>
-          <w:lang w:eastAsia="zh-CN"/>
-        </w:rPr>
-        <w:t>npm install socket.io-client</w:t>
-      </w:r>
-    </w:p>
-    <w:p>
-      <w:pPr>
-        <w:jc w:val="left"/>
-        <w:rPr>
-          <w:rFonts w:eastAsia="DengXian"/>
-          <w:lang w:eastAsia="zh-CN"/>
-        </w:rPr>
-      </w:pPr>
-      <w:r>
-        <w:rPr>
-          <w:rFonts w:eastAsia="DengXian"/>
-          <w:lang w:eastAsia="zh-CN"/>
-        </w:rPr>
-        <w:t xml:space="preserve"># 安裝後端伺服器套件（用來當兩台裝置的郵差） </w:t>
+      <w:proofErr w:type="spellStart"/>
+      <w:r>
+        <w:rPr>
+          <w:rFonts w:eastAsia="DengXian"/>
+          <w:lang w:eastAsia="zh-CN"/>
+        </w:rPr>
+        <w:t>npm</w:t>
+      </w:r>
+      <w:proofErr w:type="spellEnd"/>
+      <w:r>
+        <w:rPr>
+          <w:rFonts w:eastAsia="DengXian"/>
+          <w:lang w:eastAsia="zh-CN"/>
+        </w:rPr>
+        <w:t xml:space="preserve"> install socket.io-client</w:t>
+      </w:r>
+    </w:p>
+    <w:p>
+      <w:pPr>
+        <w:jc w:val="left"/>
+        <w:rPr>
+          <w:rFonts w:eastAsia="DengXian"/>
+          <w:lang w:eastAsia="zh-CN"/>
+        </w:rPr>
+      </w:pPr>
+      <w:r>
+        <w:rPr>
+          <w:rFonts w:eastAsia="DengXian"/>
+          <w:lang w:eastAsia="zh-CN"/>
+        </w:rPr>
+        <w:t># 安裝</w:t>
+      </w:r>
+      <w:proofErr w:type="gramStart"/>
+      <w:r>
+        <w:rPr>
+          <w:rFonts w:eastAsia="DengXian"/>
+          <w:lang w:eastAsia="zh-CN"/>
+        </w:rPr>
+        <w:t>後</w:t>
+      </w:r>
+      <w:proofErr w:type="gramEnd"/>
+      <w:r>
+        <w:rPr>
+          <w:rFonts w:eastAsia="DengXian"/>
+          <w:lang w:eastAsia="zh-CN"/>
+        </w:rPr>
+        <w:t>端伺服器套件（用</w:t>
+      </w:r>
+      <w:proofErr w:type="gramStart"/>
+      <w:r>
+        <w:rPr>
+          <w:rFonts w:eastAsia="DengXian"/>
+          <w:lang w:eastAsia="zh-CN"/>
+        </w:rPr>
+        <w:t>來</w:t>
+      </w:r>
+      <w:proofErr w:type="gramEnd"/>
+      <w:r>
+        <w:rPr>
+          <w:rFonts w:eastAsia="DengXian"/>
+          <w:lang w:eastAsia="zh-CN"/>
+        </w:rPr>
+        <w:t>當</w:t>
+      </w:r>
+      <w:proofErr w:type="gramStart"/>
+      <w:r>
+        <w:rPr>
+          <w:rFonts w:eastAsia="DengXian"/>
+          <w:lang w:eastAsia="zh-CN"/>
+        </w:rPr>
+        <w:t>兩</w:t>
+      </w:r>
+      <w:proofErr w:type="gramEnd"/>
+      <w:r>
+        <w:rPr>
+          <w:rFonts w:eastAsia="DengXian"/>
+          <w:lang w:eastAsia="zh-CN"/>
+        </w:rPr>
+        <w:t xml:space="preserve">台裝置的郵差） </w:t>
       </w:r>
     </w:p>
     <w:p>
@@ -821,12 +1162,21 @@
           <w:lang w:eastAsia="zh-CN"/>
         </w:rPr>
       </w:pPr>
-      <w:r>
-        <w:rPr>
-          <w:rFonts w:eastAsia="DengXian"/>
-          <w:lang w:eastAsia="zh-CN"/>
-        </w:rPr>
-        <w:t>npm install express socket.io</w:t>
+      <w:proofErr w:type="spellStart"/>
+      <w:r>
+        <w:rPr>
+          <w:rFonts w:eastAsia="DengXian"/>
+          <w:lang w:eastAsia="zh-CN"/>
+        </w:rPr>
+        <w:t>npm</w:t>
+      </w:r>
+      <w:proofErr w:type="spellEnd"/>
+      <w:r>
+        <w:rPr>
+          <w:rFonts w:eastAsia="DengXian"/>
+          <w:lang w:eastAsia="zh-CN"/>
+        </w:rPr>
+        <w:t xml:space="preserve"> install express socket.io</w:t>
       </w:r>
     </w:p>
     <w:p>
@@ -839,20 +1189,26 @@
         </w:rPr>
         <w:t xml:space="preserve"># </w:t>
       </w:r>
+      <w:proofErr w:type="gramStart"/>
       <w:r>
         <w:rPr>
           <w:rFonts w:asciiTheme="minorEastAsia" w:hAnsiTheme="minorEastAsia" w:hint="eastAsia"/>
           <w:lang w:eastAsia="zh-CN"/>
         </w:rPr>
-        <w:t>啟動伺服器</w:t>
-      </w:r>
-    </w:p>
-    <w:p>
-      <w:pPr>
-        <w:jc w:val="left"/>
-        <w:rPr>
-          <w:rFonts w:hint="eastAsia"/>
-        </w:rPr>
+        <w:t>啟動</w:t>
+      </w:r>
+      <w:proofErr w:type="gramEnd"/>
+      <w:r>
+        <w:rPr>
+          <w:rFonts w:asciiTheme="minorEastAsia" w:hAnsiTheme="minorEastAsia" w:hint="eastAsia"/>
+          <w:lang w:eastAsia="zh-CN"/>
+        </w:rPr>
+        <w:t>伺服器</w:t>
+      </w:r>
+    </w:p>
+    <w:p>
+      <w:pPr>
+        <w:jc w:val="left"/>
       </w:pPr>
       <w:r>
         <w:tab/>
@@ -864,9 +1220,6 @@
     <w:p>
       <w:pPr>
         <w:jc w:val="left"/>
-        <w:rPr>
-          <w:rFonts w:hint="eastAsia"/>
-        </w:rPr>
       </w:pPr>
     </w:p>
     <w:p>
@@ -984,7 +1337,55 @@
           <w:rFonts w:eastAsia="DengXian"/>
           <w:lang w:eastAsia="zh-CN"/>
         </w:rPr>
-        <w:t>，讓你的專案透過「不同的網址」來決定要顯示哪一個畫面。 例如：</w:t>
+        <w:t>，讓你的</w:t>
+      </w:r>
+      <w:proofErr w:type="gramStart"/>
+      <w:r>
+        <w:rPr>
+          <w:rFonts w:eastAsia="DengXian"/>
+          <w:lang w:eastAsia="zh-CN"/>
+        </w:rPr>
+        <w:t>專</w:t>
+      </w:r>
+      <w:proofErr w:type="gramEnd"/>
+      <w:r>
+        <w:rPr>
+          <w:rFonts w:eastAsia="DengXian"/>
+          <w:lang w:eastAsia="zh-CN"/>
+        </w:rPr>
+        <w:t>案透過「不同的網址」</w:t>
+      </w:r>
+      <w:proofErr w:type="gramStart"/>
+      <w:r>
+        <w:rPr>
+          <w:rFonts w:eastAsia="DengXian"/>
+          <w:lang w:eastAsia="zh-CN"/>
+        </w:rPr>
+        <w:t>來</w:t>
+      </w:r>
+      <w:proofErr w:type="gramEnd"/>
+      <w:r>
+        <w:rPr>
+          <w:rFonts w:eastAsia="DengXian"/>
+          <w:lang w:eastAsia="zh-CN"/>
+        </w:rPr>
+        <w:t>決定要</w:t>
+      </w:r>
+      <w:proofErr w:type="gramStart"/>
+      <w:r>
+        <w:rPr>
+          <w:rFonts w:eastAsia="DengXian"/>
+          <w:lang w:eastAsia="zh-CN"/>
+        </w:rPr>
+        <w:t>顯示哪一</w:t>
+      </w:r>
+      <w:proofErr w:type="gramEnd"/>
+      <w:r>
+        <w:rPr>
+          <w:rFonts w:eastAsia="DengXian"/>
+          <w:lang w:eastAsia="zh-CN"/>
+        </w:rPr>
+        <w:t>個畫面。 例如：</w:t>
       </w:r>
     </w:p>
     <w:p>
@@ -1021,7 +1422,23 @@
           <w:rFonts w:eastAsia="DengXian"/>
           <w:lang w:eastAsia="zh-CN"/>
         </w:rPr>
-        <w:t>http://localhost:5173/monitor（只載入上半部的臉部追蹤與掉落動畫）</w:t>
+        <w:t>http://localhost:5173/monitor（只載入上半部的臉部追蹤與掉落</w:t>
+      </w:r>
+      <w:proofErr w:type="gramStart"/>
+      <w:r>
+        <w:rPr>
+          <w:rFonts w:eastAsia="DengXian"/>
+          <w:lang w:eastAsia="zh-CN"/>
+        </w:rPr>
+        <w:t>動</w:t>
+      </w:r>
+      <w:proofErr w:type="gramEnd"/>
+      <w:r>
+        <w:rPr>
+          <w:rFonts w:eastAsia="DengXian"/>
+          <w:lang w:eastAsia="zh-CN"/>
+        </w:rPr>
+        <w:t>畫）</w:t>
       </w:r>
     </w:p>
     <w:p>
@@ -1092,8 +1509,33 @@
           <w:rFonts w:eastAsia="DengXian"/>
           <w:lang w:eastAsia="zh-CN"/>
         </w:rPr>
-        <w:t>安裝路由：npm install react-router-dom</w:t>
-      </w:r>
+        <w:t>安裝路由：</w:t>
+      </w:r>
+      <w:proofErr w:type="spellStart"/>
+      <w:r>
+        <w:rPr>
+          <w:rFonts w:eastAsia="DengXian"/>
+          <w:lang w:eastAsia="zh-CN"/>
+        </w:rPr>
+        <w:t>npm</w:t>
+      </w:r>
+      <w:proofErr w:type="spellEnd"/>
+      <w:r>
+        <w:rPr>
+          <w:rFonts w:eastAsia="DengXian"/>
+          <w:lang w:eastAsia="zh-CN"/>
+        </w:rPr>
+        <w:t xml:space="preserve"> install react-router-</w:t>
+      </w:r>
+      <w:proofErr w:type="spellStart"/>
+      <w:r>
+        <w:rPr>
+          <w:rFonts w:eastAsia="DengXian"/>
+          <w:lang w:eastAsia="zh-CN"/>
+        </w:rPr>
+        <w:t>dom</w:t>
+      </w:r>
+      <w:proofErr w:type="spellEnd"/>
     </w:p>
     <w:p>
       <w:pPr>
@@ -1110,7 +1552,21 @@
         <w:rPr>
           <w:rFonts w:eastAsia="DengXian"/>
         </w:rPr>
-        <w:t>將原本的 App.jsx 拆分成三個檔案：</w:t>
+        <w:t xml:space="preserve">將原本的 </w:t>
+      </w:r>
+      <w:proofErr w:type="spellStart"/>
+      <w:r>
+        <w:rPr>
+          <w:rFonts w:eastAsia="DengXian"/>
+        </w:rPr>
+        <w:t>App.jsx</w:t>
+      </w:r>
+      <w:proofErr w:type="spellEnd"/>
+      <w:r>
+        <w:rPr>
+          <w:rFonts w:eastAsia="DengXian"/>
+        </w:rPr>
+        <w:t xml:space="preserve"> 拆分成三個檔案：</w:t>
       </w:r>
     </w:p>
     <w:p>
@@ -1124,11 +1580,19 @@
           <w:rFonts w:eastAsia="DengXian"/>
         </w:rPr>
       </w:pPr>
-      <w:r>
-        <w:rPr>
-          <w:rFonts w:eastAsia="DengXian"/>
-        </w:rPr>
-        <w:t>App.jsx（只負責設定路由路徑）</w:t>
+      <w:proofErr w:type="spellStart"/>
+      <w:r>
+        <w:rPr>
+          <w:rFonts w:eastAsia="DengXian"/>
+        </w:rPr>
+        <w:t>App.jsx</w:t>
+      </w:r>
+      <w:proofErr w:type="spellEnd"/>
+      <w:r>
+        <w:rPr>
+          <w:rFonts w:eastAsia="DengXian"/>
+        </w:rPr>
+        <w:t>（只負責設定路由路徑）</w:t>
       </w:r>
     </w:p>
     <w:p>
@@ -1143,12 +1607,21 @@
           <w:lang w:eastAsia="zh-CN"/>
         </w:rPr>
       </w:pPr>
-      <w:r>
-        <w:rPr>
-          <w:rFonts w:eastAsia="DengXian"/>
-          <w:lang w:eastAsia="zh-CN"/>
-        </w:rPr>
-        <w:t>MonitorView.jsx（原本畫面上半部鏡頭與 PIXI 的邏輯）</w:t>
+      <w:proofErr w:type="spellStart"/>
+      <w:r>
+        <w:rPr>
+          <w:rFonts w:eastAsia="DengXian"/>
+          <w:lang w:eastAsia="zh-CN"/>
+        </w:rPr>
+        <w:t>MonitorView.jsx</w:t>
+      </w:r>
+      <w:proofErr w:type="spellEnd"/>
+      <w:r>
+        <w:rPr>
+          <w:rFonts w:eastAsia="DengXian"/>
+          <w:lang w:eastAsia="zh-CN"/>
+        </w:rPr>
+        <w:t>（原本畫面上半部鏡頭與 PIXI 的邏輯）</w:t>
       </w:r>
     </w:p>
     <w:p>
@@ -1163,28 +1636,36 @@
           <w:lang w:eastAsia="zh-CN"/>
         </w:rPr>
       </w:pPr>
-      <w:r>
-        <w:rPr>
-          <w:rFonts w:eastAsia="DengXian"/>
-          <w:lang w:eastAsia="zh-CN"/>
-        </w:rPr>
-        <w:t>TabletView.jsx（原本畫面下半部的 UI 按鈕與水池 PIXI 邏輯）</w:t>
-      </w:r>
-    </w:p>
-    <w:p>
-      <w:pPr>
-        <w:jc w:val="left"/>
-        <w:rPr>
-          <w:rFonts w:eastAsia="DengXian"/>
-          <w:lang w:eastAsia="zh-CN"/>
-        </w:rPr>
-      </w:pPr>
-    </w:p>
-    <w:p>
-      <w:pPr>
-        <w:jc w:val="left"/>
-        <w:rPr>
-          <w:rFonts w:hint="eastAsia"/>
+      <w:proofErr w:type="spellStart"/>
+      <w:r>
+        <w:rPr>
+          <w:rFonts w:eastAsia="DengXian"/>
+          <w:lang w:eastAsia="zh-CN"/>
+        </w:rPr>
+        <w:t>TabletView.jsx</w:t>
+      </w:r>
+      <w:proofErr w:type="spellEnd"/>
+      <w:r>
+        <w:rPr>
+          <w:rFonts w:eastAsia="DengXian"/>
+          <w:lang w:eastAsia="zh-CN"/>
+        </w:rPr>
+        <w:t>（原本畫面下半部的 UI 按鈕與水池 PIXI 邏輯）</w:t>
+      </w:r>
+    </w:p>
+    <w:p>
+      <w:pPr>
+        <w:jc w:val="left"/>
+        <w:rPr>
+          <w:rFonts w:eastAsia="DengXian"/>
+          <w:lang w:eastAsia="zh-CN"/>
+        </w:rPr>
+      </w:pPr>
+    </w:p>
+    <w:p>
+      <w:pPr>
+        <w:jc w:val="left"/>
+        <w:rPr>
           <w:b/>
           <w:bCs/>
         </w:rPr>
@@ -1197,86 +1678,140 @@
         </w:rPr>
         <w:t>第二步：資料通訊 (Data Transmission)</w:t>
       </w:r>
+      <w:proofErr w:type="gramStart"/>
       <w:r>
         <w:rPr>
           <w:rFonts w:asciiTheme="minorEastAsia" w:hAnsiTheme="minorEastAsia" w:hint="eastAsia"/>
           <w:b/>
           <w:bCs/>
         </w:rPr>
-        <w:t>—</w:t>
-      </w:r>
+        <w:t>——</w:t>
+      </w:r>
+      <w:proofErr w:type="gramEnd"/>
       <w:r>
         <w:rPr>
           <w:rFonts w:asciiTheme="minorEastAsia" w:hAnsiTheme="minorEastAsia" w:hint="eastAsia"/>
           <w:b/>
           <w:bCs/>
         </w:rPr>
-        <w:t>—</w:t>
-      </w:r>
-      <w:r>
-        <w:rPr>
-          <w:rFonts w:asciiTheme="minorEastAsia" w:hAnsiTheme="minorEastAsia" w:hint="eastAsia"/>
+        <w:t>使用方案B</w:t>
+      </w:r>
+    </w:p>
+    <w:p>
+      <w:pPr>
+        <w:jc w:val="left"/>
+        <w:rPr>
+          <w:rFonts w:eastAsia="DengXian"/>
+        </w:rPr>
+      </w:pPr>
+      <w:r>
+        <w:rPr>
+          <w:rFonts w:eastAsia="DengXian"/>
+        </w:rPr>
+        <w:t>既然拆成了</w:t>
+      </w:r>
+      <w:proofErr w:type="gramStart"/>
+      <w:r>
+        <w:rPr>
+          <w:rFonts w:eastAsia="DengXian"/>
+        </w:rPr>
+        <w:t>兩個頁</w:t>
+      </w:r>
+      <w:proofErr w:type="gramEnd"/>
+      <w:r>
+        <w:rPr>
+          <w:rFonts w:eastAsia="DengXian"/>
+        </w:rPr>
+        <w:t>面，它們該怎麼溝通？</w:t>
+      </w:r>
+    </w:p>
+    <w:p>
+      <w:pPr>
+        <w:jc w:val="left"/>
+        <w:rPr>
+          <w:rFonts w:eastAsia="DengXian"/>
+        </w:rPr>
+      </w:pPr>
+      <w:proofErr w:type="gramStart"/>
+      <w:r>
+        <w:rPr>
+          <w:rFonts w:eastAsia="DengXian"/>
+        </w:rPr>
+        <w:t>（</w:t>
+      </w:r>
+      <w:proofErr w:type="gramEnd"/>
+      <w:r>
+        <w:rPr>
+          <w:rFonts w:eastAsia="DengXian"/>
+        </w:rPr>
+        <w:t>例如：平板按下了「</w:t>
+      </w:r>
+      <w:proofErr w:type="gramStart"/>
+      <w:r>
+        <w:rPr>
+          <w:rFonts w:eastAsia="DengXian"/>
+        </w:rPr>
+        <w:t>盡情哭吧</w:t>
+      </w:r>
+      <w:proofErr w:type="gramEnd"/>
+      <w:r>
+        <w:rPr>
+          <w:rFonts w:eastAsia="DengXian"/>
+        </w:rPr>
+        <w:t xml:space="preserve"> GO」，顯示器怎麼知道要</w:t>
+      </w:r>
+      <w:proofErr w:type="gramStart"/>
+      <w:r>
+        <w:rPr>
+          <w:rFonts w:eastAsia="DengXian"/>
+        </w:rPr>
+        <w:t>開始掉字</w:t>
+      </w:r>
+      <w:proofErr w:type="gramEnd"/>
+      <w:r>
+        <w:rPr>
+          <w:rFonts w:eastAsia="DengXian"/>
+        </w:rPr>
+        <w:t xml:space="preserve">？） </w:t>
+      </w:r>
+    </w:p>
+    <w:p>
+      <w:pPr>
+        <w:jc w:val="left"/>
+        <w:rPr>
+          <w:rFonts w:eastAsia="DengXian"/>
+        </w:rPr>
+      </w:pPr>
+      <w:r>
+        <w:rPr>
+          <w:rFonts w:eastAsia="DengXian"/>
+        </w:rPr>
+        <w:t>這裡有兩種解決方案，取決於你展場的</w:t>
+      </w:r>
+      <w:r>
+        <w:rPr>
+          <w:rFonts w:eastAsia="DengXian"/>
           <w:b/>
           <w:bCs/>
         </w:rPr>
-        <w:t>使用方案B</w:t>
-      </w:r>
-    </w:p>
-    <w:p>
-      <w:pPr>
-        <w:jc w:val="left"/>
-        <w:rPr>
-          <w:rFonts w:eastAsia="DengXian"/>
-        </w:rPr>
-      </w:pPr>
-      <w:r>
-        <w:rPr>
-          <w:rFonts w:eastAsia="DengXian"/>
-        </w:rPr>
-        <w:t>既然拆成了兩個頁面，它們該怎麼溝通？</w:t>
-      </w:r>
-    </w:p>
-    <w:p>
-      <w:pPr>
-        <w:jc w:val="left"/>
-        <w:rPr>
-          <w:rFonts w:eastAsia="DengXian"/>
-        </w:rPr>
-      </w:pPr>
-      <w:r>
-        <w:rPr>
-          <w:rFonts w:eastAsia="DengXian"/>
-        </w:rPr>
-        <w:t xml:space="preserve">（例如：平板按下了「盡情哭吧 GO」，顯示器怎麼知道要開始掉字？） </w:t>
-      </w:r>
-    </w:p>
-    <w:p>
-      <w:pPr>
-        <w:jc w:val="left"/>
-        <w:rPr>
-          <w:rFonts w:eastAsia="DengXian"/>
-        </w:rPr>
-      </w:pPr>
-      <w:r>
-        <w:rPr>
-          <w:rFonts w:eastAsia="DengXian"/>
-        </w:rPr>
-        <w:t>這裡有兩種解決方案，取決於你展場的</w:t>
-      </w:r>
-      <w:r>
+        <w:t>硬體配置</w:t>
+      </w:r>
+      <w:r>
+        <w:rPr>
+          <w:rFonts w:eastAsia="DengXian"/>
+        </w:rPr>
+        <w:t>：</w:t>
+      </w:r>
+    </w:p>
+    <w:p>
+      <w:pPr>
+        <w:jc w:val="left"/>
         <w:rPr>
           <w:rFonts w:eastAsia="DengXian"/>
           <w:b/>
           <w:bCs/>
         </w:rPr>
-        <w:t>硬體配置</w:t>
-      </w:r>
-      <w:r>
-        <w:rPr>
-          <w:rFonts w:eastAsia="DengXian"/>
-        </w:rPr>
-        <w:t>：</w:t>
-      </w:r>
+      </w:pPr>
     </w:p>
     <w:p>
       <w:pPr>
@@ -1285,47 +1820,54 @@
           <w:rFonts w:eastAsia="DengXian"/>
           <w:b/>
           <w:bCs/>
-          <w:lang w:eastAsia="zh-CN"/>
-        </w:rPr>
-      </w:pPr>
-    </w:p>
-    <w:p>
-      <w:pPr>
-        <w:jc w:val="left"/>
+        </w:rPr>
+      </w:pPr>
+      <w:r>
         <w:rPr>
           <w:rFonts w:eastAsia="DengXian"/>
           <w:b/>
           <w:bCs/>
         </w:rPr>
-      </w:pPr>
+        <w:t xml:space="preserve">方案 A：雙螢幕接在「同一台電腦」上 (使用 </w:t>
+      </w:r>
+      <w:proofErr w:type="spellStart"/>
       <w:r>
         <w:rPr>
           <w:rFonts w:eastAsia="DengXian"/>
           <w:b/>
           <w:bCs/>
         </w:rPr>
-        <w:t>方案 A：雙螢幕接在「同一台電腦」上 (使用 BroadcastChannel API)</w:t>
-      </w:r>
-    </w:p>
-    <w:p>
-      <w:pPr>
-        <w:jc w:val="left"/>
-        <w:rPr>
-          <w:rFonts w:eastAsia="DengXian"/>
-        </w:rPr>
-      </w:pPr>
-      <w:r>
-        <w:rPr>
-          <w:rFonts w:eastAsia="DengXian"/>
-        </w:rPr>
-        <w:t>如果你的展場是使用一台效能較好的主機（如 Mac Macni 或 PC），同時外接兩個螢幕（一個掛牆上，一個平放當平板），這是</w:t>
-      </w:r>
+        <w:t>BroadcastChannel</w:t>
+      </w:r>
+      <w:proofErr w:type="spellEnd"/>
       <w:r>
         <w:rPr>
           <w:rFonts w:eastAsia="DengXian"/>
           <w:b/>
           <w:bCs/>
         </w:rPr>
+        <w:t xml:space="preserve"> API)</w:t>
+      </w:r>
+    </w:p>
+    <w:p>
+      <w:pPr>
+        <w:jc w:val="left"/>
+        <w:rPr>
+          <w:rFonts w:eastAsia="DengXian"/>
+        </w:rPr>
+      </w:pPr>
+      <w:r>
+        <w:rPr>
+          <w:rFonts w:eastAsia="DengXian"/>
+        </w:rPr>
+        <w:t>如果你的展場是使用一台效能較好的主機（如 Mac Macni 或 PC），同時外接兩個螢幕（一個掛牆上，一個平放當平板），這是</w:t>
+      </w:r>
+      <w:r>
+        <w:rPr>
+          <w:rFonts w:eastAsia="DengXian"/>
+          <w:b/>
+          <w:bCs/>
+        </w:rPr>
         <w:t>最推薦且最簡單</w:t>
       </w:r>
       <w:r>
@@ -1348,7 +1890,87 @@
           <w:rFonts w:eastAsia="DengXian"/>
           <w:lang w:eastAsia="zh-CN"/>
         </w:rPr>
-        <w:t>不需要寫後端伺服器，直接利用瀏覽器內建的 BroadcastChannel 就能讓兩個分頁秒速溝通：</w:t>
+        <w:t>不需要寫</w:t>
+      </w:r>
+      <w:proofErr w:type="gramStart"/>
+      <w:r>
+        <w:rPr>
+          <w:rFonts w:eastAsia="DengXian"/>
+          <w:lang w:eastAsia="zh-CN"/>
+        </w:rPr>
+        <w:t>後</w:t>
+      </w:r>
+      <w:proofErr w:type="gramEnd"/>
+      <w:r>
+        <w:rPr>
+          <w:rFonts w:eastAsia="DengXian"/>
+          <w:lang w:eastAsia="zh-CN"/>
+        </w:rPr>
+        <w:t>端伺服器，直接利用瀏覽器</w:t>
+      </w:r>
+      <w:proofErr w:type="gramStart"/>
+      <w:r>
+        <w:rPr>
+          <w:rFonts w:eastAsia="DengXian"/>
+          <w:lang w:eastAsia="zh-CN"/>
+        </w:rPr>
+        <w:t>內</w:t>
+      </w:r>
+      <w:proofErr w:type="gramEnd"/>
+      <w:r>
+        <w:rPr>
+          <w:rFonts w:eastAsia="DengXian"/>
+          <w:lang w:eastAsia="zh-CN"/>
+        </w:rPr>
+        <w:t xml:space="preserve">建的 </w:t>
+      </w:r>
+      <w:proofErr w:type="spellStart"/>
+      <w:r>
+        <w:rPr>
+          <w:rFonts w:eastAsia="DengXian"/>
+          <w:lang w:eastAsia="zh-CN"/>
+        </w:rPr>
+        <w:t>BroadcastChannel</w:t>
+      </w:r>
+      <w:proofErr w:type="spellEnd"/>
+      <w:r>
+        <w:rPr>
+          <w:rFonts w:eastAsia="DengXian"/>
+          <w:lang w:eastAsia="zh-CN"/>
+        </w:rPr>
+        <w:t xml:space="preserve"> 就能讓</w:t>
+      </w:r>
+      <w:proofErr w:type="gramStart"/>
+      <w:r>
+        <w:rPr>
+          <w:rFonts w:eastAsia="DengXian"/>
+          <w:lang w:eastAsia="zh-CN"/>
+        </w:rPr>
+        <w:t>兩</w:t>
+      </w:r>
+      <w:proofErr w:type="gramEnd"/>
+      <w:r>
+        <w:rPr>
+          <w:rFonts w:eastAsia="DengXian"/>
+          <w:lang w:eastAsia="zh-CN"/>
+        </w:rPr>
+        <w:t>個分頁秒速</w:t>
+      </w:r>
+      <w:proofErr w:type="gramStart"/>
+      <w:r>
+        <w:rPr>
+          <w:rFonts w:eastAsia="DengXian"/>
+          <w:lang w:eastAsia="zh-CN"/>
+        </w:rPr>
+        <w:t>溝</w:t>
+      </w:r>
+      <w:proofErr w:type="gramEnd"/>
+      <w:r>
+        <w:rPr>
+          <w:rFonts w:eastAsia="DengXian"/>
+          <w:lang w:eastAsia="zh-CN"/>
+        </w:rPr>
+        <w:t>通：</w:t>
       </w:r>
     </w:p>
     <w:p>
@@ -1461,7 +2083,7 @@
       <w:pPr>
         <w:jc w:val="left"/>
         <w:rPr>
-          <w:rFonts w:eastAsia="DengXian" w:hint="eastAsia"/>
+          <w:rFonts w:eastAsia="DengXian"/>
           <w:b/>
           <w:bCs/>
           <w:lang w:eastAsia="zh-CN"/>
@@ -1474,7 +2096,47 @@
           <w:bCs/>
           <w:lang w:eastAsia="zh-CN"/>
         </w:rPr>
-        <w:t>方案 B：使用兩台「完全不同的實體設備」 (使用 WebSocket / Socket.io)</w:t>
+        <w:t>方案 B：使用</w:t>
+      </w:r>
+      <w:proofErr w:type="gramStart"/>
+      <w:r>
+        <w:rPr>
+          <w:rFonts w:eastAsia="DengXian"/>
+          <w:b/>
+          <w:bCs/>
+          <w:lang w:eastAsia="zh-CN"/>
+        </w:rPr>
+        <w:t>兩</w:t>
+      </w:r>
+      <w:proofErr w:type="gramEnd"/>
+      <w:r>
+        <w:rPr>
+          <w:rFonts w:eastAsia="DengXian"/>
+          <w:b/>
+          <w:bCs/>
+          <w:lang w:eastAsia="zh-CN"/>
+        </w:rPr>
+        <w:t>台「完全不同的實體設</w:t>
+      </w:r>
+      <w:proofErr w:type="gramStart"/>
+      <w:r>
+        <w:rPr>
+          <w:rFonts w:eastAsia="DengXian"/>
+          <w:b/>
+          <w:bCs/>
+          <w:lang w:eastAsia="zh-CN"/>
+        </w:rPr>
+        <w:t>備</w:t>
+      </w:r>
+      <w:proofErr w:type="gramEnd"/>
+      <w:r>
+        <w:rPr>
+          <w:rFonts w:eastAsia="DengXian"/>
+          <w:b/>
+          <w:bCs/>
+          <w:lang w:eastAsia="zh-CN"/>
+        </w:rPr>
+        <w:t>」 (使用 WebSocket / Socket.io)</w:t>
       </w:r>
     </w:p>
     <w:p>
@@ -1586,9 +2248,6 @@
     <w:p>
       <w:pPr>
         <w:jc w:val="left"/>
-        <w:rPr>
-          <w:rFonts w:hint="eastAsia"/>
-        </w:rPr>
       </w:pPr>
       <w:r>
         <w:rPr>
@@ -1647,34 +2306,28 @@
     <w:p>
       <w:pPr>
         <w:jc w:val="left"/>
+      </w:pPr>
+    </w:p>
+    <w:p>
+      <w:pPr>
+        <w:jc w:val="left"/>
+      </w:pPr>
+      <w:r>
         <w:rPr>
           <w:rFonts w:hint="eastAsia"/>
         </w:rPr>
-      </w:pPr>
-    </w:p>
-    <w:p>
-      <w:pPr>
-        <w:jc w:val="left"/>
+        <w:t>第三步：</w:t>
+      </w:r>
+      <w:r>
         <w:rPr>
           <w:rFonts w:hint="eastAsia"/>
         </w:rPr>
-      </w:pPr>
+        <w:t>PIXI</w:t>
+      </w:r>
       <w:r>
         <w:rPr>
           <w:rFonts w:hint="eastAsia"/>
         </w:rPr>
-        <w:t>第三步：</w:t>
-      </w:r>
-      <w:r>
-        <w:rPr>
-          <w:rFonts w:hint="eastAsia"/>
-        </w:rPr>
-        <w:t>PIXI</w:t>
-      </w:r>
-      <w:r>
-        <w:rPr>
-          <w:rFonts w:hint="eastAsia"/>
-        </w:rPr>
         <w:t>引擎檔案拆分</w:t>
       </w:r>
     </w:p>
@@ -1682,7 +2335,7 @@
       <w:pPr>
         <w:jc w:val="left"/>
         <w:rPr>
-          <w:rFonts w:eastAsia="DengXian" w:hint="eastAsia"/>
+          <w:rFonts w:eastAsia="DengXian"/>
           <w:lang w:eastAsia="zh-CN"/>
         </w:rPr>
       </w:pPr>
@@ -1741,7 +2394,35 @@
           <w:rFonts w:hint="eastAsia"/>
         </w:rPr>
         <w:lastRenderedPageBreak/>
-        <w:t>預設是一個顯示器，一個平板，平板選擇詞匯后，透過影像識別，流淚流出詞匯最終流入平板，匯聚成寶石。</w:t>
+        <w:t>預設是一個顯示器，一個平板，平板選擇詞</w:t>
+      </w:r>
+      <w:proofErr w:type="gramStart"/>
+      <w:r>
+        <w:rPr>
+          <w:rFonts w:hint="eastAsia"/>
+        </w:rPr>
+        <w:t>匯后</w:t>
+      </w:r>
+      <w:proofErr w:type="gramEnd"/>
+      <w:r>
+        <w:rPr>
+          <w:rFonts w:hint="eastAsia"/>
+        </w:rPr>
+        <w:t>，透過影像識別，流淚流出詞</w:t>
+      </w:r>
+      <w:proofErr w:type="gramStart"/>
+      <w:r>
+        <w:rPr>
+          <w:rFonts w:hint="eastAsia"/>
+        </w:rPr>
+        <w:t>匯</w:t>
+      </w:r>
+      <w:proofErr w:type="gramEnd"/>
+      <w:r>
+        <w:rPr>
+          <w:rFonts w:hint="eastAsia"/>
+        </w:rPr>
+        <w:t>最終流入平板，匯聚成寶石。</w:t>
       </w:r>
     </w:p>
     <w:p/>
@@ -1764,7 +2445,55 @@
         <w:t>Pixi</w:t>
       </w:r>
       <w:r>
-        <w:t>，設計點擊五組心情詞擇一後，透過影像識別人眼，最終選擇的心情詞會不斷從眼中流出（流出的詞匯越來越多，有最大值），詞匯在顯示器的流動過程中，慢慢由完整的字分解成流動的水墨，最後流入顯示器底端，幾秒后平板接續顯示器的水墨，並慢慢往平板中心匯聚，匯聚過程中漸漸變色（顔色是根據最終要生成的寶石顔色決定）</w:t>
+        <w:t>，設計點擊五組心情詞擇</w:t>
+      </w:r>
+      <w:proofErr w:type="gramStart"/>
+      <w:r>
+        <w:t>一</w:t>
+      </w:r>
+      <w:proofErr w:type="gramEnd"/>
+      <w:r>
+        <w:t>後，透過影像識別人眼，最終選擇的</w:t>
+      </w:r>
+      <w:proofErr w:type="gramStart"/>
+      <w:r>
+        <w:t>心情詞會不斷</w:t>
+      </w:r>
+      <w:proofErr w:type="gramEnd"/>
+      <w:r>
+        <w:t>從眼中流出（流出的詞</w:t>
+      </w:r>
+      <w:proofErr w:type="gramStart"/>
+      <w:r>
+        <w:t>匯</w:t>
+      </w:r>
+      <w:proofErr w:type="gramEnd"/>
+      <w:r>
+        <w:t>越來越多，有最大值），詞</w:t>
+      </w:r>
+      <w:proofErr w:type="gramStart"/>
+      <w:r>
+        <w:t>匯</w:t>
+      </w:r>
+      <w:proofErr w:type="gramEnd"/>
+      <w:r>
+        <w:t>在顯示器的流動過程中，慢慢由完整的字分解成流動的水墨，最後流入顯示器底端，幾秒</w:t>
+      </w:r>
+      <w:proofErr w:type="gramStart"/>
+      <w:r>
+        <w:t>后</w:t>
+      </w:r>
+      <w:proofErr w:type="gramEnd"/>
+      <w:r>
+        <w:t>平板接續顯示器的水墨，並慢慢往平板中心匯聚，匯聚過程中漸漸變色</w:t>
+      </w:r>
+      <w:proofErr w:type="gramStart"/>
+      <w:r>
+        <w:t>（</w:t>
+      </w:r>
+      <w:proofErr w:type="gramEnd"/>
+      <w:r>
+        <w:t>顔色是根據最終要生成的寶石顔色決定）</w:t>
       </w:r>
       <w:r>
         <w:t>,</w:t>
@@ -3426,6 +4155,7 @@
   <w:style w:type="character" w:default="1" w:styleId="a0">
     <w:name w:val="Default Paragraph Font"/>
     <w:uiPriority w:val="1"/>
+    <w:semiHidden/>
     <w:unhideWhenUsed/>
   </w:style>
   <w:style w:type="table" w:default="1" w:styleId="a1">

</xml_diff>

<commit_message>
0.13.3 refactor: externalize ripple scale and SVG displacement metrics to constants
</commit_message>
<xml_diff>
--- a/To do.docx
+++ b/To do.docx
@@ -446,7 +446,7 @@
           </w:rPr>
           <w:id w:val="-1334440631"/>
           <w14:checkbox>
-            <w14:checked w14:val="0"/>
+            <w14:checked w14:val="1"/>
             <w14:checkedState w14:val="2612" w14:font="MS Gothic"/>
             <w14:uncheckedState w14:val="2610" w14:font="MS Gothic"/>
           </w14:checkbox>
@@ -456,7 +456,7 @@
             <w:rPr>
               <w:rFonts w:ascii="MS Gothic" w:eastAsia="MS Gothic" w:hAnsi="MS Gothic" w:hint="eastAsia"/>
             </w:rPr>
-            <w:t>☐</w:t>
+            <w:t>☒</w:t>
           </w:r>
         </w:sdtContent>
       </w:sdt>

</xml_diff>

<commit_message>
0.13.4 refactor: externalize Socket SERVER_IP to global constants
</commit_message>
<xml_diff>
--- a/To do.docx
+++ b/To do.docx
@@ -363,7 +363,8 @@
       <w:pPr>
         <w:jc w:val="left"/>
         <w:rPr>
-          <w:rFonts w:asciiTheme="minorEastAsia" w:hAnsiTheme="minorEastAsia"/>
+          <w:rFonts w:eastAsia="DengXian"/>
+          <w:lang w:eastAsia="zh-CN"/>
         </w:rPr>
       </w:pPr>
       <w:sdt>
@@ -393,17 +394,20 @@
         </w:rPr>
         <w:t xml:space="preserve"> </w:t>
       </w:r>
-      <w:proofErr w:type="gramStart"/>
       <w:r>
         <w:rPr>
           <w:rFonts w:hint="eastAsia"/>
         </w:rPr>
         <w:t>音效實裝</w:t>
       </w:r>
-      <w:proofErr w:type="gramEnd"/>
-      <w:r>
-        <w:br/>
-      </w:r>
+    </w:p>
+    <w:p>
+      <w:pPr>
+        <w:jc w:val="left"/>
+        <w:rPr>
+          <w:rFonts w:asciiTheme="minorEastAsia" w:hAnsiTheme="minorEastAsia"/>
+        </w:rPr>
+      </w:pPr>
       <w:sdt>
         <w:sdtPr>
           <w:rPr>
@@ -436,7 +440,8 @@
       <w:pPr>
         <w:jc w:val="left"/>
         <w:rPr>
-          <w:rFonts w:asciiTheme="minorEastAsia" w:hAnsiTheme="minorEastAsia"/>
+          <w:rFonts w:asciiTheme="minorEastAsia" w:eastAsia="DengXian" w:hAnsiTheme="minorEastAsia"/>
+          <w:lang w:eastAsia="zh-CN"/>
         </w:rPr>
       </w:pPr>
       <w:sdt>
@@ -471,7 +476,8 @@
       <w:pPr>
         <w:jc w:val="left"/>
         <w:rPr>
-          <w:rFonts w:asciiTheme="minorEastAsia" w:hAnsiTheme="minorEastAsia"/>
+          <w:rFonts w:asciiTheme="minorEastAsia" w:eastAsia="DengXian" w:hAnsiTheme="minorEastAsia" w:hint="eastAsia"/>
+          <w:lang w:eastAsia="zh-CN"/>
         </w:rPr>
       </w:pPr>
       <w:sdt>
@@ -479,9 +485,9 @@
           <w:rPr>
             <w:rFonts w:eastAsia="DengXian" w:hint="eastAsia"/>
           </w:rPr>
-          <w:id w:val="375743201"/>
+          <w:id w:val="499082213"/>
           <w14:checkbox>
-            <w14:checked w14:val="0"/>
+            <w14:checked w14:val="1"/>
             <w14:checkedState w14:val="2612" w14:font="MS Gothic"/>
             <w14:uncheckedState w14:val="2610" w14:font="MS Gothic"/>
           </w14:checkbox>
@@ -491,7 +497,43 @@
             <w:rPr>
               <w:rFonts w:ascii="MS Gothic" w:eastAsia="MS Gothic" w:hAnsi="MS Gothic" w:hint="eastAsia"/>
             </w:rPr>
-            <w:t>☐</w:t>
+            <w:t>☒</w:t>
+          </w:r>
+        </w:sdtContent>
+      </w:sdt>
+      <w:r>
+        <w:rPr>
+          <w:rFonts w:eastAsia="DengXian" w:hint="eastAsia"/>
+          <w:lang w:eastAsia="zh-CN"/>
+        </w:rPr>
+        <w:t xml:space="preserve"> 网址数据迁出</w:t>
+      </w:r>
+    </w:p>
+    <w:p>
+      <w:pPr>
+        <w:jc w:val="left"/>
+        <w:rPr>
+          <w:rFonts w:asciiTheme="minorEastAsia" w:hAnsiTheme="minorEastAsia"/>
+        </w:rPr>
+      </w:pPr>
+      <w:sdt>
+        <w:sdtPr>
+          <w:rPr>
+            <w:rFonts w:eastAsia="DengXian" w:hint="eastAsia"/>
+          </w:rPr>
+          <w:id w:val="375743201"/>
+          <w14:checkbox>
+            <w14:checked w14:val="1"/>
+            <w14:checkedState w14:val="2612" w14:font="MS Gothic"/>
+            <w14:uncheckedState w14:val="2610" w14:font="MS Gothic"/>
+          </w14:checkbox>
+        </w:sdtPr>
+        <w:sdtContent>
+          <w:r>
+            <w:rPr>
+              <w:rFonts w:ascii="MS Gothic" w:eastAsia="MS Gothic" w:hAnsi="MS Gothic" w:hint="eastAsia"/>
+            </w:rPr>
+            <w:t>☒</w:t>
           </w:r>
         </w:sdtContent>
       </w:sdt>
@@ -576,6 +618,12 @@
           <w:rFonts w:asciiTheme="minorEastAsia" w:hAnsiTheme="minorEastAsia" w:hint="eastAsia"/>
         </w:rPr>
         <w:t xml:space="preserve"> 回饋</w:t>
+      </w:r>
+      <w:r>
+        <w:rPr>
+          <w:rFonts w:ascii="DengXian" w:eastAsia="DengXian" w:hAnsi="DengXian" w:hint="eastAsia"/>
+        </w:rPr>
+        <w:t>文字对应宝石</w:t>
       </w:r>
     </w:p>
     <w:p>
@@ -772,21 +820,7 @@
         <w:rPr>
           <w:rFonts w:asciiTheme="minorEastAsia" w:hAnsiTheme="minorEastAsia" w:hint="eastAsia"/>
         </w:rPr>
-        <w:t>UI設計(改成</w:t>
-      </w:r>
-      <w:proofErr w:type="gramStart"/>
-      <w:r>
-        <w:rPr>
-          <w:rFonts w:asciiTheme="minorEastAsia" w:hAnsiTheme="minorEastAsia" w:hint="eastAsia"/>
-        </w:rPr>
-        <w:t>小字小框長方形</w:t>
-      </w:r>
-      <w:proofErr w:type="gramEnd"/>
-      <w:r>
-        <w:rPr>
-          <w:rFonts w:asciiTheme="minorEastAsia" w:hAnsiTheme="minorEastAsia" w:hint="eastAsia"/>
-        </w:rPr>
-        <w:t>小圓角，加入橫向分隔線，按鈕與標題和開始互動按鈕用粗分隔線，20個字詞的選框之間用較細的分隔線</w:t>
+        <w:t>UI設計(改成小字小框長方形小圓角，加入橫向分隔線，按鈕與標題和開始互動按鈕用粗分隔線，20個字詞的選框之間用較細的分隔線</w:t>
       </w:r>
       <w:r>
         <w:rPr>
@@ -1005,62 +1039,28 @@
           <w:lang w:eastAsia="zh-CN"/>
         </w:rPr>
       </w:pPr>
-      <w:proofErr w:type="spellStart"/>
-      <w:r>
-        <w:rPr>
-          <w:rFonts w:eastAsia="DengXian"/>
-          <w:lang w:eastAsia="zh-CN"/>
-        </w:rPr>
-        <w:t>npm</w:t>
-      </w:r>
-      <w:proofErr w:type="spellEnd"/>
-      <w:r>
-        <w:rPr>
-          <w:rFonts w:eastAsia="DengXian"/>
-          <w:lang w:eastAsia="zh-CN"/>
-        </w:rPr>
-        <w:t xml:space="preserve"> install react-router-</w:t>
-      </w:r>
-      <w:proofErr w:type="spellStart"/>
-      <w:r>
-        <w:rPr>
-          <w:rFonts w:eastAsia="DengXian"/>
-          <w:lang w:eastAsia="zh-CN"/>
-        </w:rPr>
-        <w:t>dom</w:t>
-      </w:r>
-      <w:proofErr w:type="spellEnd"/>
-    </w:p>
-    <w:p>
-      <w:pPr>
-        <w:jc w:val="left"/>
-        <w:rPr>
-          <w:rFonts w:eastAsia="DengXian"/>
-          <w:lang w:eastAsia="zh-CN"/>
-        </w:rPr>
-      </w:pPr>
-      <w:r>
-        <w:rPr>
-          <w:rFonts w:eastAsia="DengXian"/>
-          <w:lang w:eastAsia="zh-CN"/>
-        </w:rPr>
-        <w:t># 安裝前端 Socket 用</w:t>
-      </w:r>
-      <w:proofErr w:type="gramStart"/>
-      <w:r>
-        <w:rPr>
-          <w:rFonts w:eastAsia="DengXian"/>
-          <w:lang w:eastAsia="zh-CN"/>
-        </w:rPr>
-        <w:t>戶</w:t>
-      </w:r>
-      <w:proofErr w:type="gramEnd"/>
-      <w:r>
-        <w:rPr>
-          <w:rFonts w:eastAsia="DengXian"/>
-          <w:lang w:eastAsia="zh-CN"/>
-        </w:rPr>
-        <w:t xml:space="preserve">端 </w:t>
+      <w:r>
+        <w:rPr>
+          <w:rFonts w:eastAsia="DengXian"/>
+          <w:lang w:eastAsia="zh-CN"/>
+        </w:rPr>
+        <w:t>npm install react-router-dom</w:t>
+      </w:r>
+    </w:p>
+    <w:p>
+      <w:pPr>
+        <w:jc w:val="left"/>
+        <w:rPr>
+          <w:rFonts w:eastAsia="DengXian"/>
+          <w:lang w:eastAsia="zh-CN"/>
+        </w:rPr>
+      </w:pPr>
+      <w:r>
+        <w:rPr>
+          <w:rFonts w:eastAsia="DengXian"/>
+          <w:lang w:eastAsia="zh-CN"/>
+        </w:rPr>
+        <w:t xml:space="preserve"># 安裝前端 Socket 用戶端 </w:t>
       </w:r>
     </w:p>
     <w:p>
@@ -1072,85 +1072,28 @@
           <w:lang w:eastAsia="zh-CN"/>
         </w:rPr>
       </w:pPr>
-      <w:proofErr w:type="spellStart"/>
-      <w:r>
-        <w:rPr>
-          <w:rFonts w:eastAsia="DengXian"/>
-          <w:lang w:eastAsia="zh-CN"/>
-        </w:rPr>
-        <w:t>npm</w:t>
-      </w:r>
-      <w:proofErr w:type="spellEnd"/>
-      <w:r>
-        <w:rPr>
-          <w:rFonts w:eastAsia="DengXian"/>
-          <w:lang w:eastAsia="zh-CN"/>
-        </w:rPr>
-        <w:t xml:space="preserve"> install socket.io-client</w:t>
-      </w:r>
-    </w:p>
-    <w:p>
-      <w:pPr>
-        <w:jc w:val="left"/>
-        <w:rPr>
-          <w:rFonts w:eastAsia="DengXian"/>
-          <w:lang w:eastAsia="zh-CN"/>
-        </w:rPr>
-      </w:pPr>
-      <w:r>
-        <w:rPr>
-          <w:rFonts w:eastAsia="DengXian"/>
-          <w:lang w:eastAsia="zh-CN"/>
-        </w:rPr>
-        <w:t># 安裝</w:t>
-      </w:r>
-      <w:proofErr w:type="gramStart"/>
-      <w:r>
-        <w:rPr>
-          <w:rFonts w:eastAsia="DengXian"/>
-          <w:lang w:eastAsia="zh-CN"/>
-        </w:rPr>
-        <w:t>後</w:t>
-      </w:r>
-      <w:proofErr w:type="gramEnd"/>
-      <w:r>
-        <w:rPr>
-          <w:rFonts w:eastAsia="DengXian"/>
-          <w:lang w:eastAsia="zh-CN"/>
-        </w:rPr>
-        <w:t>端伺服器套件（用</w:t>
-      </w:r>
-      <w:proofErr w:type="gramStart"/>
-      <w:r>
-        <w:rPr>
-          <w:rFonts w:eastAsia="DengXian"/>
-          <w:lang w:eastAsia="zh-CN"/>
-        </w:rPr>
-        <w:t>來</w:t>
-      </w:r>
-      <w:proofErr w:type="gramEnd"/>
-      <w:r>
-        <w:rPr>
-          <w:rFonts w:eastAsia="DengXian"/>
-          <w:lang w:eastAsia="zh-CN"/>
-        </w:rPr>
-        <w:t>當</w:t>
-      </w:r>
-      <w:proofErr w:type="gramStart"/>
-      <w:r>
-        <w:rPr>
-          <w:rFonts w:eastAsia="DengXian"/>
-          <w:lang w:eastAsia="zh-CN"/>
-        </w:rPr>
-        <w:t>兩</w:t>
-      </w:r>
-      <w:proofErr w:type="gramEnd"/>
-      <w:r>
-        <w:rPr>
-          <w:rFonts w:eastAsia="DengXian"/>
-          <w:lang w:eastAsia="zh-CN"/>
-        </w:rPr>
-        <w:t xml:space="preserve">台裝置的郵差） </w:t>
+      <w:r>
+        <w:rPr>
+          <w:rFonts w:eastAsia="DengXian"/>
+          <w:lang w:eastAsia="zh-CN"/>
+        </w:rPr>
+        <w:t>npm install socket.io-client</w:t>
+      </w:r>
+    </w:p>
+    <w:p>
+      <w:pPr>
+        <w:jc w:val="left"/>
+        <w:rPr>
+          <w:rFonts w:eastAsia="DengXian"/>
+          <w:lang w:eastAsia="zh-CN"/>
+        </w:rPr>
+      </w:pPr>
+      <w:r>
+        <w:rPr>
+          <w:rFonts w:eastAsia="DengXian"/>
+          <w:lang w:eastAsia="zh-CN"/>
+        </w:rPr>
+        <w:t xml:space="preserve"># 安裝後端伺服器套件（用來當兩台裝置的郵差） </w:t>
       </w:r>
     </w:p>
     <w:p>
@@ -1162,21 +1105,12 @@
           <w:lang w:eastAsia="zh-CN"/>
         </w:rPr>
       </w:pPr>
-      <w:proofErr w:type="spellStart"/>
-      <w:r>
-        <w:rPr>
-          <w:rFonts w:eastAsia="DengXian"/>
-          <w:lang w:eastAsia="zh-CN"/>
-        </w:rPr>
-        <w:t>npm</w:t>
-      </w:r>
-      <w:proofErr w:type="spellEnd"/>
-      <w:r>
-        <w:rPr>
-          <w:rFonts w:eastAsia="DengXian"/>
-          <w:lang w:eastAsia="zh-CN"/>
-        </w:rPr>
-        <w:t xml:space="preserve"> install express socket.io</w:t>
+      <w:r>
+        <w:rPr>
+          <w:rFonts w:eastAsia="DengXian"/>
+          <w:lang w:eastAsia="zh-CN"/>
+        </w:rPr>
+        <w:t>npm install express socket.io</w:t>
       </w:r>
     </w:p>
     <w:p>
@@ -1189,21 +1123,12 @@
         </w:rPr>
         <w:t xml:space="preserve"># </w:t>
       </w:r>
-      <w:proofErr w:type="gramStart"/>
       <w:r>
         <w:rPr>
           <w:rFonts w:asciiTheme="minorEastAsia" w:hAnsiTheme="minorEastAsia" w:hint="eastAsia"/>
           <w:lang w:eastAsia="zh-CN"/>
         </w:rPr>
-        <w:t>啟動</w:t>
-      </w:r>
-      <w:proofErr w:type="gramEnd"/>
-      <w:r>
-        <w:rPr>
-          <w:rFonts w:asciiTheme="minorEastAsia" w:hAnsiTheme="minorEastAsia" w:hint="eastAsia"/>
-          <w:lang w:eastAsia="zh-CN"/>
-        </w:rPr>
-        <w:t>伺服器</w:t>
+        <w:t>啟動伺服器</w:t>
       </w:r>
     </w:p>
     <w:p>
@@ -1337,55 +1262,7 @@
           <w:rFonts w:eastAsia="DengXian"/>
           <w:lang w:eastAsia="zh-CN"/>
         </w:rPr>
-        <w:t>，讓你的</w:t>
-      </w:r>
-      <w:proofErr w:type="gramStart"/>
-      <w:r>
-        <w:rPr>
-          <w:rFonts w:eastAsia="DengXian"/>
-          <w:lang w:eastAsia="zh-CN"/>
-        </w:rPr>
-        <w:t>專</w:t>
-      </w:r>
-      <w:proofErr w:type="gramEnd"/>
-      <w:r>
-        <w:rPr>
-          <w:rFonts w:eastAsia="DengXian"/>
-          <w:lang w:eastAsia="zh-CN"/>
-        </w:rPr>
-        <w:t>案透過「不同的網址」</w:t>
-      </w:r>
-      <w:proofErr w:type="gramStart"/>
-      <w:r>
-        <w:rPr>
-          <w:rFonts w:eastAsia="DengXian"/>
-          <w:lang w:eastAsia="zh-CN"/>
-        </w:rPr>
-        <w:t>來</w:t>
-      </w:r>
-      <w:proofErr w:type="gramEnd"/>
-      <w:r>
-        <w:rPr>
-          <w:rFonts w:eastAsia="DengXian"/>
-          <w:lang w:eastAsia="zh-CN"/>
-        </w:rPr>
-        <w:t>決定要</w:t>
-      </w:r>
-      <w:proofErr w:type="gramStart"/>
-      <w:r>
-        <w:rPr>
-          <w:rFonts w:eastAsia="DengXian"/>
-          <w:lang w:eastAsia="zh-CN"/>
-        </w:rPr>
-        <w:t>顯示哪一</w:t>
-      </w:r>
-      <w:proofErr w:type="gramEnd"/>
-      <w:r>
-        <w:rPr>
-          <w:rFonts w:eastAsia="DengXian"/>
-          <w:lang w:eastAsia="zh-CN"/>
-        </w:rPr>
-        <w:t>個畫面。 例如：</w:t>
+        <w:t>，讓你的專案透過「不同的網址」來決定要顯示哪一個畫面。 例如：</w:t>
       </w:r>
     </w:p>
     <w:p>
@@ -1422,23 +1299,7 @@
           <w:rFonts w:eastAsia="DengXian"/>
           <w:lang w:eastAsia="zh-CN"/>
         </w:rPr>
-        <w:t>http://localhost:5173/monitor（只載入上半部的臉部追蹤與掉落</w:t>
-      </w:r>
-      <w:proofErr w:type="gramStart"/>
-      <w:r>
-        <w:rPr>
-          <w:rFonts w:eastAsia="DengXian"/>
-          <w:lang w:eastAsia="zh-CN"/>
-        </w:rPr>
-        <w:t>動</w:t>
-      </w:r>
-      <w:proofErr w:type="gramEnd"/>
-      <w:r>
-        <w:rPr>
-          <w:rFonts w:eastAsia="DengXian"/>
-          <w:lang w:eastAsia="zh-CN"/>
-        </w:rPr>
-        <w:t>畫）</w:t>
+        <w:t>http://localhost:5173/monitor（只載入上半部的臉部追蹤與掉落動畫）</w:t>
       </w:r>
     </w:p>
     <w:p>
@@ -1509,33 +1370,8 @@
           <w:rFonts w:eastAsia="DengXian"/>
           <w:lang w:eastAsia="zh-CN"/>
         </w:rPr>
-        <w:t>安裝路由：</w:t>
-      </w:r>
-      <w:proofErr w:type="spellStart"/>
-      <w:r>
-        <w:rPr>
-          <w:rFonts w:eastAsia="DengXian"/>
-          <w:lang w:eastAsia="zh-CN"/>
-        </w:rPr>
-        <w:t>npm</w:t>
-      </w:r>
-      <w:proofErr w:type="spellEnd"/>
-      <w:r>
-        <w:rPr>
-          <w:rFonts w:eastAsia="DengXian"/>
-          <w:lang w:eastAsia="zh-CN"/>
-        </w:rPr>
-        <w:t xml:space="preserve"> install react-router-</w:t>
-      </w:r>
-      <w:proofErr w:type="spellStart"/>
-      <w:r>
-        <w:rPr>
-          <w:rFonts w:eastAsia="DengXian"/>
-          <w:lang w:eastAsia="zh-CN"/>
-        </w:rPr>
-        <w:t>dom</w:t>
-      </w:r>
-      <w:proofErr w:type="spellEnd"/>
+        <w:t>安裝路由：npm install react-router-dom</w:t>
+      </w:r>
     </w:p>
     <w:p>
       <w:pPr>
@@ -1552,21 +1388,7 @@
         <w:rPr>
           <w:rFonts w:eastAsia="DengXian"/>
         </w:rPr>
-        <w:t xml:space="preserve">將原本的 </w:t>
-      </w:r>
-      <w:proofErr w:type="spellStart"/>
-      <w:r>
-        <w:rPr>
-          <w:rFonts w:eastAsia="DengXian"/>
-        </w:rPr>
-        <w:t>App.jsx</w:t>
-      </w:r>
-      <w:proofErr w:type="spellEnd"/>
-      <w:r>
-        <w:rPr>
-          <w:rFonts w:eastAsia="DengXian"/>
-        </w:rPr>
-        <w:t xml:space="preserve"> 拆分成三個檔案：</w:t>
+        <w:t>將原本的 App.jsx 拆分成三個檔案：</w:t>
       </w:r>
     </w:p>
     <w:p>
@@ -1580,19 +1402,11 @@
           <w:rFonts w:eastAsia="DengXian"/>
         </w:rPr>
       </w:pPr>
-      <w:proofErr w:type="spellStart"/>
-      <w:r>
-        <w:rPr>
-          <w:rFonts w:eastAsia="DengXian"/>
-        </w:rPr>
-        <w:t>App.jsx</w:t>
-      </w:r>
-      <w:proofErr w:type="spellEnd"/>
-      <w:r>
-        <w:rPr>
-          <w:rFonts w:eastAsia="DengXian"/>
-        </w:rPr>
-        <w:t>（只負責設定路由路徑）</w:t>
+      <w:r>
+        <w:rPr>
+          <w:rFonts w:eastAsia="DengXian"/>
+        </w:rPr>
+        <w:t>App.jsx（只負責設定路由路徑）</w:t>
       </w:r>
     </w:p>
     <w:p>
@@ -1607,21 +1421,12 @@
           <w:lang w:eastAsia="zh-CN"/>
         </w:rPr>
       </w:pPr>
-      <w:proofErr w:type="spellStart"/>
-      <w:r>
-        <w:rPr>
-          <w:rFonts w:eastAsia="DengXian"/>
-          <w:lang w:eastAsia="zh-CN"/>
-        </w:rPr>
-        <w:t>MonitorView.jsx</w:t>
-      </w:r>
-      <w:proofErr w:type="spellEnd"/>
-      <w:r>
-        <w:rPr>
-          <w:rFonts w:eastAsia="DengXian"/>
-          <w:lang w:eastAsia="zh-CN"/>
-        </w:rPr>
-        <w:t>（原本畫面上半部鏡頭與 PIXI 的邏輯）</w:t>
+      <w:r>
+        <w:rPr>
+          <w:rFonts w:eastAsia="DengXian"/>
+          <w:lang w:eastAsia="zh-CN"/>
+        </w:rPr>
+        <w:t>MonitorView.jsx（原本畫面上半部鏡頭與 PIXI 的邏輯）</w:t>
       </w:r>
     </w:p>
     <w:p>
@@ -1636,21 +1441,12 @@
           <w:lang w:eastAsia="zh-CN"/>
         </w:rPr>
       </w:pPr>
-      <w:proofErr w:type="spellStart"/>
-      <w:r>
-        <w:rPr>
-          <w:rFonts w:eastAsia="DengXian"/>
-          <w:lang w:eastAsia="zh-CN"/>
-        </w:rPr>
-        <w:t>TabletView.jsx</w:t>
-      </w:r>
-      <w:proofErr w:type="spellEnd"/>
-      <w:r>
-        <w:rPr>
-          <w:rFonts w:eastAsia="DengXian"/>
-          <w:lang w:eastAsia="zh-CN"/>
-        </w:rPr>
-        <w:t>（原本畫面下半部的 UI 按鈕與水池 PIXI 邏輯）</w:t>
+      <w:r>
+        <w:rPr>
+          <w:rFonts w:eastAsia="DengXian"/>
+          <w:lang w:eastAsia="zh-CN"/>
+        </w:rPr>
+        <w:t>TabletView.jsx（原本畫面下半部的 UI 按鈕與水池 PIXI 邏輯）</w:t>
       </w:r>
     </w:p>
     <w:p>
@@ -1678,130 +1474,80 @@
         </w:rPr>
         <w:t>第二步：資料通訊 (Data Transmission)</w:t>
       </w:r>
-      <w:proofErr w:type="gramStart"/>
       <w:r>
         <w:rPr>
           <w:rFonts w:asciiTheme="minorEastAsia" w:hAnsiTheme="minorEastAsia" w:hint="eastAsia"/>
           <w:b/>
           <w:bCs/>
         </w:rPr>
-        <w:t>——</w:t>
-      </w:r>
-      <w:proofErr w:type="gramEnd"/>
-      <w:r>
-        <w:rPr>
-          <w:rFonts w:asciiTheme="minorEastAsia" w:hAnsiTheme="minorEastAsia" w:hint="eastAsia"/>
+        <w:t>——使用方案B</w:t>
+      </w:r>
+    </w:p>
+    <w:p>
+      <w:pPr>
+        <w:jc w:val="left"/>
+        <w:rPr>
+          <w:rFonts w:eastAsia="DengXian"/>
+        </w:rPr>
+      </w:pPr>
+      <w:r>
+        <w:rPr>
+          <w:rFonts w:eastAsia="DengXian"/>
+        </w:rPr>
+        <w:t>既然拆成了兩個頁面，它們該怎麼溝通？</w:t>
+      </w:r>
+    </w:p>
+    <w:p>
+      <w:pPr>
+        <w:jc w:val="left"/>
+        <w:rPr>
+          <w:rFonts w:eastAsia="DengXian"/>
+        </w:rPr>
+      </w:pPr>
+      <w:r>
+        <w:rPr>
+          <w:rFonts w:eastAsia="DengXian"/>
+        </w:rPr>
+        <w:t xml:space="preserve">（例如：平板按下了「盡情哭吧 GO」，顯示器怎麼知道要開始掉字？） </w:t>
+      </w:r>
+    </w:p>
+    <w:p>
+      <w:pPr>
+        <w:jc w:val="left"/>
+        <w:rPr>
+          <w:rFonts w:eastAsia="DengXian"/>
+        </w:rPr>
+      </w:pPr>
+      <w:r>
+        <w:rPr>
+          <w:rFonts w:eastAsia="DengXian"/>
+        </w:rPr>
+        <w:t>這裡有兩種解決方案，取決於你展場的</w:t>
+      </w:r>
+      <w:r>
+        <w:rPr>
+          <w:rFonts w:eastAsia="DengXian"/>
           <w:b/>
           <w:bCs/>
         </w:rPr>
-        <w:t>使用方案B</w:t>
-      </w:r>
-    </w:p>
-    <w:p>
-      <w:pPr>
-        <w:jc w:val="left"/>
-        <w:rPr>
-          <w:rFonts w:eastAsia="DengXian"/>
-        </w:rPr>
-      </w:pPr>
-      <w:r>
-        <w:rPr>
-          <w:rFonts w:eastAsia="DengXian"/>
-        </w:rPr>
-        <w:t>既然拆成了</w:t>
-      </w:r>
-      <w:proofErr w:type="gramStart"/>
-      <w:r>
-        <w:rPr>
-          <w:rFonts w:eastAsia="DengXian"/>
-        </w:rPr>
-        <w:t>兩個頁</w:t>
-      </w:r>
-      <w:proofErr w:type="gramEnd"/>
-      <w:r>
-        <w:rPr>
-          <w:rFonts w:eastAsia="DengXian"/>
-        </w:rPr>
-        <w:t>面，它們該怎麼溝通？</w:t>
-      </w:r>
-    </w:p>
-    <w:p>
-      <w:pPr>
-        <w:jc w:val="left"/>
-        <w:rPr>
-          <w:rFonts w:eastAsia="DengXian"/>
-        </w:rPr>
-      </w:pPr>
-      <w:proofErr w:type="gramStart"/>
-      <w:r>
-        <w:rPr>
-          <w:rFonts w:eastAsia="DengXian"/>
-        </w:rPr>
-        <w:t>（</w:t>
-      </w:r>
-      <w:proofErr w:type="gramEnd"/>
-      <w:r>
-        <w:rPr>
-          <w:rFonts w:eastAsia="DengXian"/>
-        </w:rPr>
-        <w:t>例如：平板按下了「</w:t>
-      </w:r>
-      <w:proofErr w:type="gramStart"/>
-      <w:r>
-        <w:rPr>
-          <w:rFonts w:eastAsia="DengXian"/>
-        </w:rPr>
-        <w:t>盡情哭吧</w:t>
-      </w:r>
-      <w:proofErr w:type="gramEnd"/>
-      <w:r>
-        <w:rPr>
-          <w:rFonts w:eastAsia="DengXian"/>
-        </w:rPr>
-        <w:t xml:space="preserve"> GO」，顯示器怎麼知道要</w:t>
-      </w:r>
-      <w:proofErr w:type="gramStart"/>
-      <w:r>
-        <w:rPr>
-          <w:rFonts w:eastAsia="DengXian"/>
-        </w:rPr>
-        <w:t>開始掉字</w:t>
-      </w:r>
-      <w:proofErr w:type="gramEnd"/>
-      <w:r>
-        <w:rPr>
-          <w:rFonts w:eastAsia="DengXian"/>
-        </w:rPr>
-        <w:t xml:space="preserve">？） </w:t>
-      </w:r>
-    </w:p>
-    <w:p>
-      <w:pPr>
-        <w:jc w:val="left"/>
-        <w:rPr>
-          <w:rFonts w:eastAsia="DengXian"/>
-        </w:rPr>
-      </w:pPr>
-      <w:r>
-        <w:rPr>
-          <w:rFonts w:eastAsia="DengXian"/>
-        </w:rPr>
-        <w:t>這裡有兩種解決方案，取決於你展場的</w:t>
-      </w:r>
-      <w:r>
+        <w:t>硬體配置</w:t>
+      </w:r>
+      <w:r>
+        <w:rPr>
+          <w:rFonts w:eastAsia="DengXian"/>
+        </w:rPr>
+        <w:t>：</w:t>
+      </w:r>
+    </w:p>
+    <w:p>
+      <w:pPr>
+        <w:jc w:val="left"/>
         <w:rPr>
           <w:rFonts w:eastAsia="DengXian"/>
           <w:b/>
           <w:bCs/>
         </w:rPr>
-        <w:t>硬體配置</w:t>
-      </w:r>
-      <w:r>
-        <w:rPr>
-          <w:rFonts w:eastAsia="DengXian"/>
-        </w:rPr>
-        <w:t>：</w:t>
-      </w:r>
+      </w:pPr>
     </w:p>
     <w:p>
       <w:pPr>
@@ -1812,62 +1558,34 @@
           <w:bCs/>
         </w:rPr>
       </w:pPr>
-    </w:p>
-    <w:p>
-      <w:pPr>
-        <w:jc w:val="left"/>
+      <w:r>
         <w:rPr>
           <w:rFonts w:eastAsia="DengXian"/>
           <w:b/>
           <w:bCs/>
         </w:rPr>
-      </w:pPr>
+        <w:t>方案 A：雙螢幕接在「同一台電腦」上 (使用 BroadcastChannel API)</w:t>
+      </w:r>
+    </w:p>
+    <w:p>
+      <w:pPr>
+        <w:jc w:val="left"/>
+        <w:rPr>
+          <w:rFonts w:eastAsia="DengXian"/>
+        </w:rPr>
+      </w:pPr>
+      <w:r>
+        <w:rPr>
+          <w:rFonts w:eastAsia="DengXian"/>
+        </w:rPr>
+        <w:t>如果你的展場是使用一台效能較好的主機（如 Mac Macni 或 PC），同時外接兩個螢幕（一個掛牆上，一個平放當平板），這是</w:t>
+      </w:r>
       <w:r>
         <w:rPr>
           <w:rFonts w:eastAsia="DengXian"/>
           <w:b/>
           <w:bCs/>
         </w:rPr>
-        <w:t xml:space="preserve">方案 A：雙螢幕接在「同一台電腦」上 (使用 </w:t>
-      </w:r>
-      <w:proofErr w:type="spellStart"/>
-      <w:r>
-        <w:rPr>
-          <w:rFonts w:eastAsia="DengXian"/>
-          <w:b/>
-          <w:bCs/>
-        </w:rPr>
-        <w:t>BroadcastChannel</w:t>
-      </w:r>
-      <w:proofErr w:type="spellEnd"/>
-      <w:r>
-        <w:rPr>
-          <w:rFonts w:eastAsia="DengXian"/>
-          <w:b/>
-          <w:bCs/>
-        </w:rPr>
-        <w:t xml:space="preserve"> API)</w:t>
-      </w:r>
-    </w:p>
-    <w:p>
-      <w:pPr>
-        <w:jc w:val="left"/>
-        <w:rPr>
-          <w:rFonts w:eastAsia="DengXian"/>
-        </w:rPr>
-      </w:pPr>
-      <w:r>
-        <w:rPr>
-          <w:rFonts w:eastAsia="DengXian"/>
-        </w:rPr>
-        <w:t>如果你的展場是使用一台效能較好的主機（如 Mac Macni 或 PC），同時外接兩個螢幕（一個掛牆上，一個平放當平板），這是</w:t>
-      </w:r>
-      <w:r>
-        <w:rPr>
-          <w:rFonts w:eastAsia="DengXian"/>
-          <w:b/>
-          <w:bCs/>
-        </w:rPr>
         <w:t>最推薦且最簡單</w:t>
       </w:r>
       <w:r>
@@ -1890,87 +1608,7 @@
           <w:rFonts w:eastAsia="DengXian"/>
           <w:lang w:eastAsia="zh-CN"/>
         </w:rPr>
-        <w:t>不需要寫</w:t>
-      </w:r>
-      <w:proofErr w:type="gramStart"/>
-      <w:r>
-        <w:rPr>
-          <w:rFonts w:eastAsia="DengXian"/>
-          <w:lang w:eastAsia="zh-CN"/>
-        </w:rPr>
-        <w:t>後</w:t>
-      </w:r>
-      <w:proofErr w:type="gramEnd"/>
-      <w:r>
-        <w:rPr>
-          <w:rFonts w:eastAsia="DengXian"/>
-          <w:lang w:eastAsia="zh-CN"/>
-        </w:rPr>
-        <w:t>端伺服器，直接利用瀏覽器</w:t>
-      </w:r>
-      <w:proofErr w:type="gramStart"/>
-      <w:r>
-        <w:rPr>
-          <w:rFonts w:eastAsia="DengXian"/>
-          <w:lang w:eastAsia="zh-CN"/>
-        </w:rPr>
-        <w:t>內</w:t>
-      </w:r>
-      <w:proofErr w:type="gramEnd"/>
-      <w:r>
-        <w:rPr>
-          <w:rFonts w:eastAsia="DengXian"/>
-          <w:lang w:eastAsia="zh-CN"/>
-        </w:rPr>
-        <w:t xml:space="preserve">建的 </w:t>
-      </w:r>
-      <w:proofErr w:type="spellStart"/>
-      <w:r>
-        <w:rPr>
-          <w:rFonts w:eastAsia="DengXian"/>
-          <w:lang w:eastAsia="zh-CN"/>
-        </w:rPr>
-        <w:t>BroadcastChannel</w:t>
-      </w:r>
-      <w:proofErr w:type="spellEnd"/>
-      <w:r>
-        <w:rPr>
-          <w:rFonts w:eastAsia="DengXian"/>
-          <w:lang w:eastAsia="zh-CN"/>
-        </w:rPr>
-        <w:t xml:space="preserve"> 就能讓</w:t>
-      </w:r>
-      <w:proofErr w:type="gramStart"/>
-      <w:r>
-        <w:rPr>
-          <w:rFonts w:eastAsia="DengXian"/>
-          <w:lang w:eastAsia="zh-CN"/>
-        </w:rPr>
-        <w:t>兩</w:t>
-      </w:r>
-      <w:proofErr w:type="gramEnd"/>
-      <w:r>
-        <w:rPr>
-          <w:rFonts w:eastAsia="DengXian"/>
-          <w:lang w:eastAsia="zh-CN"/>
-        </w:rPr>
-        <w:t>個分頁秒速</w:t>
-      </w:r>
-      <w:proofErr w:type="gramStart"/>
-      <w:r>
-        <w:rPr>
-          <w:rFonts w:eastAsia="DengXian"/>
-          <w:lang w:eastAsia="zh-CN"/>
-        </w:rPr>
-        <w:t>溝</w:t>
-      </w:r>
-      <w:proofErr w:type="gramEnd"/>
-      <w:r>
-        <w:rPr>
-          <w:rFonts w:eastAsia="DengXian"/>
-          <w:lang w:eastAsia="zh-CN"/>
-        </w:rPr>
-        <w:t>通：</w:t>
+        <w:t>不需要寫後端伺服器，直接利用瀏覽器內建的 BroadcastChannel 就能讓兩個分頁秒速溝通：</w:t>
       </w:r>
     </w:p>
     <w:p>
@@ -2096,47 +1734,7 @@
           <w:bCs/>
           <w:lang w:eastAsia="zh-CN"/>
         </w:rPr>
-        <w:t>方案 B：使用</w:t>
-      </w:r>
-      <w:proofErr w:type="gramStart"/>
-      <w:r>
-        <w:rPr>
-          <w:rFonts w:eastAsia="DengXian"/>
-          <w:b/>
-          <w:bCs/>
-          <w:lang w:eastAsia="zh-CN"/>
-        </w:rPr>
-        <w:t>兩</w:t>
-      </w:r>
-      <w:proofErr w:type="gramEnd"/>
-      <w:r>
-        <w:rPr>
-          <w:rFonts w:eastAsia="DengXian"/>
-          <w:b/>
-          <w:bCs/>
-          <w:lang w:eastAsia="zh-CN"/>
-        </w:rPr>
-        <w:t>台「完全不同的實體設</w:t>
-      </w:r>
-      <w:proofErr w:type="gramStart"/>
-      <w:r>
-        <w:rPr>
-          <w:rFonts w:eastAsia="DengXian"/>
-          <w:b/>
-          <w:bCs/>
-          <w:lang w:eastAsia="zh-CN"/>
-        </w:rPr>
-        <w:t>備</w:t>
-      </w:r>
-      <w:proofErr w:type="gramEnd"/>
-      <w:r>
-        <w:rPr>
-          <w:rFonts w:eastAsia="DengXian"/>
-          <w:b/>
-          <w:bCs/>
-          <w:lang w:eastAsia="zh-CN"/>
-        </w:rPr>
-        <w:t>」 (使用 WebSocket / Socket.io)</w:t>
+        <w:t>方案 B：使用兩台「完全不同的實體設備」 (使用 WebSocket / Socket.io)</w:t>
       </w:r>
     </w:p>
     <w:p>
@@ -2394,35 +1992,7 @@
           <w:rFonts w:hint="eastAsia"/>
         </w:rPr>
         <w:lastRenderedPageBreak/>
-        <w:t>預設是一個顯示器，一個平板，平板選擇詞</w:t>
-      </w:r>
-      <w:proofErr w:type="gramStart"/>
-      <w:r>
-        <w:rPr>
-          <w:rFonts w:hint="eastAsia"/>
-        </w:rPr>
-        <w:t>匯后</w:t>
-      </w:r>
-      <w:proofErr w:type="gramEnd"/>
-      <w:r>
-        <w:rPr>
-          <w:rFonts w:hint="eastAsia"/>
-        </w:rPr>
-        <w:t>，透過影像識別，流淚流出詞</w:t>
-      </w:r>
-      <w:proofErr w:type="gramStart"/>
-      <w:r>
-        <w:rPr>
-          <w:rFonts w:hint="eastAsia"/>
-        </w:rPr>
-        <w:t>匯</w:t>
-      </w:r>
-      <w:proofErr w:type="gramEnd"/>
-      <w:r>
-        <w:rPr>
-          <w:rFonts w:hint="eastAsia"/>
-        </w:rPr>
-        <w:t>最終流入平板，匯聚成寶石。</w:t>
+        <w:t>預設是一個顯示器，一個平板，平板選擇詞匯后，透過影像識別，流淚流出詞匯最終流入平板，匯聚成寶石。</w:t>
       </w:r>
     </w:p>
     <w:p/>
@@ -2445,55 +2015,7 @@
         <w:t>Pixi</w:t>
       </w:r>
       <w:r>
-        <w:t>，設計點擊五組心情詞擇</w:t>
-      </w:r>
-      <w:proofErr w:type="gramStart"/>
-      <w:r>
-        <w:t>一</w:t>
-      </w:r>
-      <w:proofErr w:type="gramEnd"/>
-      <w:r>
-        <w:t>後，透過影像識別人眼，最終選擇的</w:t>
-      </w:r>
-      <w:proofErr w:type="gramStart"/>
-      <w:r>
-        <w:t>心情詞會不斷</w:t>
-      </w:r>
-      <w:proofErr w:type="gramEnd"/>
-      <w:r>
-        <w:t>從眼中流出（流出的詞</w:t>
-      </w:r>
-      <w:proofErr w:type="gramStart"/>
-      <w:r>
-        <w:t>匯</w:t>
-      </w:r>
-      <w:proofErr w:type="gramEnd"/>
-      <w:r>
-        <w:t>越來越多，有最大值），詞</w:t>
-      </w:r>
-      <w:proofErr w:type="gramStart"/>
-      <w:r>
-        <w:t>匯</w:t>
-      </w:r>
-      <w:proofErr w:type="gramEnd"/>
-      <w:r>
-        <w:t>在顯示器的流動過程中，慢慢由完整的字分解成流動的水墨，最後流入顯示器底端，幾秒</w:t>
-      </w:r>
-      <w:proofErr w:type="gramStart"/>
-      <w:r>
-        <w:t>后</w:t>
-      </w:r>
-      <w:proofErr w:type="gramEnd"/>
-      <w:r>
-        <w:t>平板接續顯示器的水墨，並慢慢往平板中心匯聚，匯聚過程中漸漸變色</w:t>
-      </w:r>
-      <w:proofErr w:type="gramStart"/>
-      <w:r>
-        <w:t>（</w:t>
-      </w:r>
-      <w:proofErr w:type="gramEnd"/>
-      <w:r>
-        <w:t>顔色是根據最終要生成的寶石顔色決定）</w:t>
+        <w:t>，設計點擊五組心情詞擇一後，透過影像識別人眼，最終選擇的心情詞會不斷從眼中流出（流出的詞匯越來越多，有最大值），詞匯在顯示器的流動過程中，慢慢由完整的字分解成流動的水墨，最後流入顯示器底端，幾秒后平板接續顯示器的水墨，並慢慢往平板中心匯聚，匯聚過程中漸漸變色（顔色是根據最終要生成的寶石顔色決定）</w:t>
       </w:r>
       <w:r>
         <w:t>,</w:t>

</xml_diff>

<commit_message>
0.13.5 style(tablet): enrich settlement UI with dynamic gem psychological descriptions
</commit_message>
<xml_diff>
--- a/To do.docx
+++ b/To do.docx
@@ -167,6 +167,7 @@
       <w:pPr>
         <w:jc w:val="left"/>
         <w:rPr>
+          <w:rFonts w:asciiTheme="minorEastAsia" w:eastAsia="DengXian" w:hAnsiTheme="minorEastAsia"/>
           <w:lang w:eastAsia="zh-CN"/>
         </w:rPr>
       </w:pPr>
@@ -211,6 +212,50 @@
       <w:pPr>
         <w:jc w:val="left"/>
         <w:rPr>
+          <w:rFonts w:eastAsia="DengXian" w:hint="eastAsia"/>
+          <w:lang w:eastAsia="zh-CN"/>
+        </w:rPr>
+      </w:pPr>
+      <w:sdt>
+        <w:sdtPr>
+          <w:rPr>
+            <w:rFonts w:eastAsia="DengXian" w:hint="eastAsia"/>
+          </w:rPr>
+          <w:id w:val="-1266382887"/>
+          <w14:checkbox>
+            <w14:checked w14:val="0"/>
+            <w14:checkedState w14:val="2612" w14:font="MS Gothic"/>
+            <w14:uncheckedState w14:val="2610" w14:font="MS Gothic"/>
+          </w14:checkbox>
+        </w:sdtPr>
+        <w:sdtContent>
+          <w:r>
+            <w:rPr>
+              <w:rFonts w:ascii="MS Gothic" w:eastAsia="MS Gothic" w:hAnsi="MS Gothic" w:hint="eastAsia"/>
+            </w:rPr>
+            <w:t>☐</w:t>
+          </w:r>
+        </w:sdtContent>
+      </w:sdt>
+      <w:r>
+        <w:rPr>
+          <w:rFonts w:eastAsia="DengXian" w:hint="eastAsia"/>
+          <w:lang w:eastAsia="zh-CN"/>
+        </w:rPr>
+        <w:t xml:space="preserve"> 平板待机点击提示</w:t>
+      </w:r>
+      <w:r>
+        <w:rPr>
+          <w:rFonts w:eastAsia="DengXian" w:hint="eastAsia"/>
+          <w:lang w:eastAsia="zh-CN"/>
+        </w:rPr>
+        <w:t>待机动画</w:t>
+      </w:r>
+    </w:p>
+    <w:p>
+      <w:pPr>
+        <w:jc w:val="left"/>
+        <w:rPr>
           <w:rFonts w:eastAsia="DengXian"/>
           <w:lang w:eastAsia="zh-CN"/>
         </w:rPr>
@@ -350,6 +395,10 @@
     <w:p>
       <w:pPr>
         <w:jc w:val="left"/>
+        <w:rPr>
+          <w:rFonts w:eastAsia="DengXian"/>
+          <w:lang w:eastAsia="zh-CN"/>
+        </w:rPr>
       </w:pPr>
       <w:r>
         <w:rPr>
@@ -364,6 +413,93 @@
         <w:jc w:val="left"/>
         <w:rPr>
           <w:rFonts w:eastAsia="DengXian"/>
+          <w:lang w:eastAsia="zh-CN"/>
+        </w:rPr>
+      </w:pPr>
+      <w:sdt>
+        <w:sdtPr>
+          <w:rPr>
+            <w:rFonts w:eastAsia="DengXian" w:hint="eastAsia"/>
+          </w:rPr>
+          <w:id w:val="1205982233"/>
+          <w14:checkbox>
+            <w14:checked w14:val="0"/>
+            <w14:checkedState w14:val="2612" w14:font="MS Gothic"/>
+            <w14:uncheckedState w14:val="2610" w14:font="MS Gothic"/>
+          </w14:checkbox>
+        </w:sdtPr>
+        <w:sdtContent>
+          <w:r>
+            <w:rPr>
+              <w:rFonts w:ascii="MS Gothic" w:eastAsia="MS Gothic" w:hAnsi="MS Gothic" w:hint="eastAsia"/>
+            </w:rPr>
+            <w:t>☐</w:t>
+          </w:r>
+        </w:sdtContent>
+      </w:sdt>
+      <w:r>
+        <w:rPr>
+          <w:rFonts w:eastAsia="DengXian" w:hint="eastAsia"/>
+          <w:lang w:eastAsia="zh-CN"/>
+        </w:rPr>
+        <w:t xml:space="preserve"> 平板外接</w:t>
+      </w:r>
+      <w:r>
+        <w:rPr>
+          <w:rFonts w:eastAsia="DengXian" w:hint="eastAsia"/>
+          <w:lang w:eastAsia="zh-CN"/>
+        </w:rPr>
+        <w:t>网路</w:t>
+      </w:r>
+      <w:r>
+        <w:rPr>
+          <w:rFonts w:eastAsia="DengXian" w:hint="eastAsia"/>
+          <w:lang w:eastAsia="zh-CN"/>
+        </w:rPr>
+        <w:t>测试</w:t>
+      </w:r>
+    </w:p>
+    <w:p>
+      <w:pPr>
+        <w:jc w:val="left"/>
+        <w:rPr>
+          <w:rFonts w:hint="eastAsia"/>
+        </w:rPr>
+      </w:pPr>
+      <w:sdt>
+        <w:sdtPr>
+          <w:rPr>
+            <w:rFonts w:eastAsia="DengXian" w:hint="eastAsia"/>
+          </w:rPr>
+          <w:id w:val="-2128773119"/>
+          <w14:checkbox>
+            <w14:checked w14:val="0"/>
+            <w14:checkedState w14:val="2612" w14:font="MS Gothic"/>
+            <w14:uncheckedState w14:val="2610" w14:font="MS Gothic"/>
+          </w14:checkbox>
+        </w:sdtPr>
+        <w:sdtContent>
+          <w:r>
+            <w:rPr>
+              <w:rFonts w:ascii="MS Gothic" w:eastAsia="MS Gothic" w:hAnsi="MS Gothic" w:hint="eastAsia"/>
+            </w:rPr>
+            <w:t>☐</w:t>
+          </w:r>
+        </w:sdtContent>
+      </w:sdt>
+      <w:r>
+        <w:rPr>
+          <w:rFonts w:eastAsia="DengXian" w:hint="eastAsia"/>
+          <w:lang w:eastAsia="zh-CN"/>
+        </w:rPr>
+        <w:t xml:space="preserve"> 显示器摄像头隐私测试</w:t>
+      </w:r>
+    </w:p>
+    <w:p>
+      <w:pPr>
+        <w:jc w:val="left"/>
+        <w:rPr>
+          <w:rFonts w:eastAsia="DengXian" w:hint="eastAsia"/>
           <w:lang w:eastAsia="zh-CN"/>
         </w:rPr>
       </w:pPr>
@@ -405,6 +541,146 @@
       <w:pPr>
         <w:jc w:val="left"/>
         <w:rPr>
+          <w:rFonts w:eastAsia="DengXian"/>
+          <w:lang w:eastAsia="zh-CN"/>
+        </w:rPr>
+      </w:pPr>
+      <w:sdt>
+        <w:sdtPr>
+          <w:rPr>
+            <w:rFonts w:eastAsia="DengXian" w:hint="eastAsia"/>
+          </w:rPr>
+          <w:id w:val="881442455"/>
+          <w14:checkbox>
+            <w14:checked w14:val="0"/>
+            <w14:checkedState w14:val="2612" w14:font="MS Gothic"/>
+            <w14:uncheckedState w14:val="2610" w14:font="MS Gothic"/>
+          </w14:checkbox>
+        </w:sdtPr>
+        <w:sdtContent>
+          <w:r>
+            <w:rPr>
+              <w:rFonts w:ascii="MS Gothic" w:eastAsia="MS Gothic" w:hAnsi="MS Gothic" w:hint="eastAsia"/>
+            </w:rPr>
+            <w:t>☐</w:t>
+          </w:r>
+        </w:sdtContent>
+      </w:sdt>
+      <w:r>
+        <w:rPr>
+          <w:rFonts w:asciiTheme="minorEastAsia" w:hAnsiTheme="minorEastAsia" w:hint="eastAsia"/>
+        </w:rPr>
+        <w:t xml:space="preserve"> 遊玩錄製 (5個寶石)</w:t>
+      </w:r>
+    </w:p>
+    <w:p>
+      <w:pPr>
+        <w:jc w:val="left"/>
+        <w:rPr>
+          <w:rFonts w:eastAsia="DengXian"/>
+          <w:lang w:eastAsia="zh-CN"/>
+        </w:rPr>
+      </w:pPr>
+      <w:sdt>
+        <w:sdtPr>
+          <w:rPr>
+            <w:rFonts w:eastAsia="DengXian" w:hint="eastAsia"/>
+          </w:rPr>
+          <w:id w:val="-565875338"/>
+          <w14:checkbox>
+            <w14:checked w14:val="0"/>
+            <w14:checkedState w14:val="2612" w14:font="MS Gothic"/>
+            <w14:uncheckedState w14:val="2610" w14:font="MS Gothic"/>
+          </w14:checkbox>
+        </w:sdtPr>
+        <w:sdtContent>
+          <w:r>
+            <w:rPr>
+              <w:rFonts w:ascii="MS Gothic" w:eastAsia="MS Gothic" w:hAnsi="MS Gothic" w:hint="eastAsia"/>
+            </w:rPr>
+            <w:t>☐</w:t>
+          </w:r>
+        </w:sdtContent>
+      </w:sdt>
+      <w:r>
+        <w:rPr>
+          <w:rFonts w:eastAsia="DengXian" w:hint="eastAsia"/>
+        </w:rPr>
+        <w:t xml:space="preserve"> GPU预设修改</w:t>
+      </w:r>
+    </w:p>
+    <w:p>
+      <w:pPr>
+        <w:jc w:val="left"/>
+      </w:pPr>
+      <w:sdt>
+        <w:sdtPr>
+          <w:rPr>
+            <w:rFonts w:eastAsia="DengXian" w:hint="eastAsia"/>
+          </w:rPr>
+          <w:id w:val="-1468742947"/>
+          <w14:checkbox>
+            <w14:checked w14:val="0"/>
+            <w14:checkedState w14:val="2612" w14:font="MS Gothic"/>
+            <w14:uncheckedState w14:val="2610" w14:font="MS Gothic"/>
+          </w14:checkbox>
+        </w:sdtPr>
+        <w:sdtContent>
+          <w:r>
+            <w:rPr>
+              <w:rFonts w:ascii="MS Gothic" w:eastAsia="MS Gothic" w:hAnsi="MS Gothic" w:hint="eastAsia"/>
+            </w:rPr>
+            <w:t>☐</w:t>
+          </w:r>
+        </w:sdtContent>
+      </w:sdt>
+      <w:r>
+        <w:rPr>
+          <w:rFonts w:eastAsia="DengXian" w:hint="eastAsia"/>
+          <w:lang w:eastAsia="zh-CN"/>
+        </w:rPr>
+        <w:t xml:space="preserve"> 宝石汇聚</w:t>
+      </w:r>
+    </w:p>
+    <w:p>
+      <w:pPr>
+        <w:jc w:val="left"/>
+        <w:rPr>
+          <w:rFonts w:hint="eastAsia"/>
+        </w:rPr>
+      </w:pPr>
+      <w:sdt>
+        <w:sdtPr>
+          <w:rPr>
+            <w:rFonts w:eastAsia="DengXian" w:hint="eastAsia"/>
+          </w:rPr>
+          <w:id w:val="1768113167"/>
+          <w14:checkbox>
+            <w14:checked w14:val="0"/>
+            <w14:checkedState w14:val="2612" w14:font="MS Gothic"/>
+            <w14:uncheckedState w14:val="2610" w14:font="MS Gothic"/>
+          </w14:checkbox>
+        </w:sdtPr>
+        <w:sdtContent>
+          <w:r>
+            <w:rPr>
+              <w:rFonts w:ascii="MS Gothic" w:eastAsia="MS Gothic" w:hAnsi="MS Gothic" w:hint="eastAsia"/>
+            </w:rPr>
+            <w:t>☐</w:t>
+          </w:r>
+        </w:sdtContent>
+      </w:sdt>
+      <w:r>
+        <w:rPr>
+          <w:rFonts w:asciiTheme="minorEastAsia" w:hAnsiTheme="minorEastAsia" w:hint="eastAsia"/>
+        </w:rPr>
+        <w:t xml:space="preserve"> UI文字描述修改，加入回饋文字對應的寶石描述</w:t>
+      </w:r>
+    </w:p>
+    <w:p>
+      <w:pPr>
+        <w:jc w:val="left"/>
+        <w:rPr>
           <w:rFonts w:asciiTheme="minorEastAsia" w:hAnsiTheme="minorEastAsia"/>
         </w:rPr>
       </w:pPr>
@@ -513,7 +789,8 @@
       <w:pPr>
         <w:jc w:val="left"/>
         <w:rPr>
-          <w:rFonts w:asciiTheme="minorEastAsia" w:hAnsiTheme="minorEastAsia"/>
+          <w:rFonts w:eastAsia="DengXian" w:hint="eastAsia"/>
+          <w:lang w:eastAsia="zh-CN"/>
         </w:rPr>
       </w:pPr>
       <w:sdt>
@@ -542,88 +819,6 @@
           <w:rFonts w:asciiTheme="minorEastAsia" w:hAnsiTheme="minorEastAsia" w:hint="eastAsia"/>
         </w:rPr>
         <w:t xml:space="preserve"> 文字圖速度，待機模糊數據遷出</w:t>
-      </w:r>
-    </w:p>
-    <w:p>
-      <w:pPr>
-        <w:jc w:val="left"/>
-        <w:rPr>
-          <w:rFonts w:asciiTheme="minorEastAsia" w:hAnsiTheme="minorEastAsia"/>
-        </w:rPr>
-      </w:pPr>
-      <w:sdt>
-        <w:sdtPr>
-          <w:rPr>
-            <w:rFonts w:eastAsia="DengXian" w:hint="eastAsia"/>
-          </w:rPr>
-          <w:id w:val="881442455"/>
-          <w14:checkbox>
-            <w14:checked w14:val="0"/>
-            <w14:checkedState w14:val="2612" w14:font="MS Gothic"/>
-            <w14:uncheckedState w14:val="2610" w14:font="MS Gothic"/>
-          </w14:checkbox>
-        </w:sdtPr>
-        <w:sdtContent>
-          <w:r>
-            <w:rPr>
-              <w:rFonts w:ascii="MS Gothic" w:eastAsia="MS Gothic" w:hAnsi="MS Gothic" w:hint="eastAsia"/>
-            </w:rPr>
-            <w:t>☐</w:t>
-          </w:r>
-        </w:sdtContent>
-      </w:sdt>
-      <w:r>
-        <w:rPr>
-          <w:rFonts w:asciiTheme="minorEastAsia" w:hAnsiTheme="minorEastAsia" w:hint="eastAsia"/>
-        </w:rPr>
-        <w:t xml:space="preserve"> 遊玩錄製</w:t>
-      </w:r>
-      <w:r>
-        <w:rPr>
-          <w:rFonts w:asciiTheme="minorEastAsia" w:hAnsiTheme="minorEastAsia" w:hint="eastAsia"/>
-        </w:rPr>
-        <w:t xml:space="preserve"> (5個寶石)</w:t>
-      </w:r>
-    </w:p>
-    <w:p>
-      <w:pPr>
-        <w:jc w:val="left"/>
-        <w:rPr>
-          <w:rFonts w:hint="eastAsia"/>
-        </w:rPr>
-      </w:pPr>
-      <w:sdt>
-        <w:sdtPr>
-          <w:rPr>
-            <w:rFonts w:eastAsia="DengXian" w:hint="eastAsia"/>
-          </w:rPr>
-          <w:id w:val="1870637296"/>
-          <w14:checkbox>
-            <w14:checked w14:val="0"/>
-            <w14:checkedState w14:val="2612" w14:font="MS Gothic"/>
-            <w14:uncheckedState w14:val="2610" w14:font="MS Gothic"/>
-          </w14:checkbox>
-        </w:sdtPr>
-        <w:sdtContent>
-          <w:r>
-            <w:rPr>
-              <w:rFonts w:ascii="MS Gothic" w:eastAsia="MS Gothic" w:hAnsi="MS Gothic" w:hint="eastAsia"/>
-            </w:rPr>
-            <w:t>☐</w:t>
-          </w:r>
-        </w:sdtContent>
-      </w:sdt>
-      <w:r>
-        <w:rPr>
-          <w:rFonts w:asciiTheme="minorEastAsia" w:hAnsiTheme="minorEastAsia" w:hint="eastAsia"/>
-        </w:rPr>
-        <w:t xml:space="preserve"> 回饋</w:t>
-      </w:r>
-      <w:r>
-        <w:rPr>
-          <w:rFonts w:ascii="DengXian" w:eastAsia="DengXian" w:hAnsi="DengXian" w:hint="eastAsia"/>
-        </w:rPr>
-        <w:t>文字对应宝石</w:t>
       </w:r>
     </w:p>
     <w:p>
@@ -716,7 +911,6 @@
         <w:jc w:val="left"/>
         <w:rPr>
           <w:rFonts w:eastAsia="DengXian"/>
-          <w:lang w:eastAsia="zh-CN"/>
         </w:rPr>
       </w:pPr>
       <w:sdt>
@@ -753,41 +947,6 @@
     <w:p>
       <w:pPr>
         <w:jc w:val="left"/>
-        <w:rPr>
-          <w:rFonts w:eastAsia="DengXian"/>
-        </w:rPr>
-      </w:pPr>
-      <w:sdt>
-        <w:sdtPr>
-          <w:rPr>
-            <w:rFonts w:eastAsia="DengXian" w:hint="eastAsia"/>
-          </w:rPr>
-          <w:id w:val="-565875338"/>
-          <w14:checkbox>
-            <w14:checked w14:val="0"/>
-            <w14:checkedState w14:val="2612" w14:font="MS Gothic"/>
-            <w14:uncheckedState w14:val="2610" w14:font="MS Gothic"/>
-          </w14:checkbox>
-        </w:sdtPr>
-        <w:sdtContent>
-          <w:r>
-            <w:rPr>
-              <w:rFonts w:ascii="MS Gothic" w:eastAsia="MS Gothic" w:hAnsi="MS Gothic" w:hint="eastAsia"/>
-            </w:rPr>
-            <w:t>☐</w:t>
-          </w:r>
-        </w:sdtContent>
-      </w:sdt>
-      <w:r>
-        <w:rPr>
-          <w:rFonts w:eastAsia="DengXian" w:hint="eastAsia"/>
-        </w:rPr>
-        <w:t xml:space="preserve"> GPU预设修改</w:t>
-      </w:r>
-    </w:p>
-    <w:p>
-      <w:pPr>
-        <w:jc w:val="left"/>
       </w:pPr>
       <w:sdt>
         <w:sdtPr>
@@ -820,12 +979,26 @@
         <w:rPr>
           <w:rFonts w:asciiTheme="minorEastAsia" w:hAnsiTheme="minorEastAsia" w:hint="eastAsia"/>
         </w:rPr>
-        <w:t>UI設計(改成小字小框長方形小圓角，加入橫向分隔線，按鈕與標題和開始互動按鈕用粗分隔線，20個字詞的選框之間用較細的分隔線</w:t>
-      </w:r>
+        <w:t>UI設計(改成</w:t>
+      </w:r>
+      <w:proofErr w:type="gramStart"/>
       <w:r>
         <w:rPr>
           <w:rFonts w:asciiTheme="minorEastAsia" w:hAnsiTheme="minorEastAsia" w:hint="eastAsia"/>
         </w:rPr>
+        <w:t>小字小框長方形</w:t>
+      </w:r>
+      <w:proofErr w:type="gramEnd"/>
+      <w:r>
+        <w:rPr>
+          <w:rFonts w:asciiTheme="minorEastAsia" w:hAnsiTheme="minorEastAsia" w:hint="eastAsia"/>
+        </w:rPr>
+        <w:t>小圓角，加入橫向分隔線，按鈕與標題和開始互動按鈕用粗分隔線，20個字詞的選框之間用較細的分隔線</w:t>
+      </w:r>
+      <w:r>
+        <w:rPr>
+          <w:rFonts w:asciiTheme="minorEastAsia" w:hAnsiTheme="minorEastAsia" w:hint="eastAsia"/>
+        </w:rPr>
         <w:t>，類似蘋果的風格</w:t>
       </w:r>
       <w:r>
@@ -833,50 +1006,6 @@
           <w:rFonts w:asciiTheme="minorEastAsia" w:hAnsiTheme="minorEastAsia" w:hint="eastAsia"/>
         </w:rPr>
         <w:t>)</w:t>
-      </w:r>
-    </w:p>
-    <w:p>
-      <w:pPr>
-        <w:jc w:val="left"/>
-      </w:pPr>
-      <w:sdt>
-        <w:sdtPr>
-          <w:rPr>
-            <w:rFonts w:eastAsia="DengXian" w:hint="eastAsia"/>
-          </w:rPr>
-          <w:id w:val="1768113167"/>
-          <w14:checkbox>
-            <w14:checked w14:val="0"/>
-            <w14:checkedState w14:val="2612" w14:font="MS Gothic"/>
-            <w14:uncheckedState w14:val="2610" w14:font="MS Gothic"/>
-          </w14:checkbox>
-        </w:sdtPr>
-        <w:sdtContent>
-          <w:r>
-            <w:rPr>
-              <w:rFonts w:ascii="MS Gothic" w:eastAsia="MS Gothic" w:hAnsi="MS Gothic" w:hint="eastAsia"/>
-            </w:rPr>
-            <w:t>☐</w:t>
-          </w:r>
-        </w:sdtContent>
-      </w:sdt>
-      <w:r>
-        <w:rPr>
-          <w:rFonts w:asciiTheme="minorEastAsia" w:hAnsiTheme="minorEastAsia" w:hint="eastAsia"/>
-        </w:rPr>
-        <w:t xml:space="preserve"> </w:t>
-      </w:r>
-      <w:r>
-        <w:rPr>
-          <w:rFonts w:asciiTheme="minorEastAsia" w:hAnsiTheme="minorEastAsia" w:hint="eastAsia"/>
-        </w:rPr>
-        <w:t>UI文字描述修改</w:t>
-      </w:r>
-      <w:r>
-        <w:rPr>
-          <w:rFonts w:asciiTheme="minorEastAsia" w:hAnsiTheme="minorEastAsia" w:hint="eastAsia"/>
-        </w:rPr>
-        <w:t>，加入回饋文字對應的寶石描述</w:t>
       </w:r>
     </w:p>
     <w:p>
@@ -1060,7 +1189,23 @@
           <w:rFonts w:eastAsia="DengXian"/>
           <w:lang w:eastAsia="zh-CN"/>
         </w:rPr>
-        <w:t xml:space="preserve"># 安裝前端 Socket 用戶端 </w:t>
+        <w:t># 安裝前端 Socket 用</w:t>
+      </w:r>
+      <w:proofErr w:type="gramStart"/>
+      <w:r>
+        <w:rPr>
+          <w:rFonts w:eastAsia="DengXian"/>
+          <w:lang w:eastAsia="zh-CN"/>
+        </w:rPr>
+        <w:t>戶</w:t>
+      </w:r>
+      <w:proofErr w:type="gramEnd"/>
+      <w:r>
+        <w:rPr>
+          <w:rFonts w:eastAsia="DengXian"/>
+          <w:lang w:eastAsia="zh-CN"/>
+        </w:rPr>
+        <w:t xml:space="preserve">端 </w:t>
       </w:r>
     </w:p>
     <w:p>
@@ -1093,7 +1238,55 @@
           <w:rFonts w:eastAsia="DengXian"/>
           <w:lang w:eastAsia="zh-CN"/>
         </w:rPr>
-        <w:t xml:space="preserve"># 安裝後端伺服器套件（用來當兩台裝置的郵差） </w:t>
+        <w:t># 安裝</w:t>
+      </w:r>
+      <w:proofErr w:type="gramStart"/>
+      <w:r>
+        <w:rPr>
+          <w:rFonts w:eastAsia="DengXian"/>
+          <w:lang w:eastAsia="zh-CN"/>
+        </w:rPr>
+        <w:t>後</w:t>
+      </w:r>
+      <w:proofErr w:type="gramEnd"/>
+      <w:r>
+        <w:rPr>
+          <w:rFonts w:eastAsia="DengXian"/>
+          <w:lang w:eastAsia="zh-CN"/>
+        </w:rPr>
+        <w:t>端伺服器套件（用</w:t>
+      </w:r>
+      <w:proofErr w:type="gramStart"/>
+      <w:r>
+        <w:rPr>
+          <w:rFonts w:eastAsia="DengXian"/>
+          <w:lang w:eastAsia="zh-CN"/>
+        </w:rPr>
+        <w:t>來</w:t>
+      </w:r>
+      <w:proofErr w:type="gramEnd"/>
+      <w:r>
+        <w:rPr>
+          <w:rFonts w:eastAsia="DengXian"/>
+          <w:lang w:eastAsia="zh-CN"/>
+        </w:rPr>
+        <w:t>當</w:t>
+      </w:r>
+      <w:proofErr w:type="gramStart"/>
+      <w:r>
+        <w:rPr>
+          <w:rFonts w:eastAsia="DengXian"/>
+          <w:lang w:eastAsia="zh-CN"/>
+        </w:rPr>
+        <w:t>兩</w:t>
+      </w:r>
+      <w:proofErr w:type="gramEnd"/>
+      <w:r>
+        <w:rPr>
+          <w:rFonts w:eastAsia="DengXian"/>
+          <w:lang w:eastAsia="zh-CN"/>
+        </w:rPr>
+        <w:t xml:space="preserve">台裝置的郵差） </w:t>
       </w:r>
     </w:p>
     <w:p>
@@ -1123,19 +1316,29 @@
         </w:rPr>
         <w:t xml:space="preserve"># </w:t>
       </w:r>
+      <w:proofErr w:type="gramStart"/>
       <w:r>
         <w:rPr>
           <w:rFonts w:asciiTheme="minorEastAsia" w:hAnsiTheme="minorEastAsia" w:hint="eastAsia"/>
           <w:lang w:eastAsia="zh-CN"/>
         </w:rPr>
-        <w:t>啟動伺服器</w:t>
-      </w:r>
-    </w:p>
-    <w:p>
-      <w:pPr>
-        <w:jc w:val="left"/>
-      </w:pPr>
-      <w:r>
+        <w:t>啟動</w:t>
+      </w:r>
+      <w:proofErr w:type="gramEnd"/>
+      <w:r>
+        <w:rPr>
+          <w:rFonts w:asciiTheme="minorEastAsia" w:hAnsiTheme="minorEastAsia" w:hint="eastAsia"/>
+          <w:lang w:eastAsia="zh-CN"/>
+        </w:rPr>
+        <w:t>伺服器</w:t>
+      </w:r>
+    </w:p>
+    <w:p>
+      <w:pPr>
+        <w:jc w:val="left"/>
+      </w:pPr>
+      <w:r>
+        <w:lastRenderedPageBreak/>
         <w:tab/>
       </w:r>
       <w:r>
@@ -1262,7 +1465,55 @@
           <w:rFonts w:eastAsia="DengXian"/>
           <w:lang w:eastAsia="zh-CN"/>
         </w:rPr>
-        <w:t>，讓你的專案透過「不同的網址」來決定要顯示哪一個畫面。 例如：</w:t>
+        <w:t>，讓你的</w:t>
+      </w:r>
+      <w:proofErr w:type="gramStart"/>
+      <w:r>
+        <w:rPr>
+          <w:rFonts w:eastAsia="DengXian"/>
+          <w:lang w:eastAsia="zh-CN"/>
+        </w:rPr>
+        <w:t>專</w:t>
+      </w:r>
+      <w:proofErr w:type="gramEnd"/>
+      <w:r>
+        <w:rPr>
+          <w:rFonts w:eastAsia="DengXian"/>
+          <w:lang w:eastAsia="zh-CN"/>
+        </w:rPr>
+        <w:t>案透過「不同的網址」</w:t>
+      </w:r>
+      <w:proofErr w:type="gramStart"/>
+      <w:r>
+        <w:rPr>
+          <w:rFonts w:eastAsia="DengXian"/>
+          <w:lang w:eastAsia="zh-CN"/>
+        </w:rPr>
+        <w:t>來</w:t>
+      </w:r>
+      <w:proofErr w:type="gramEnd"/>
+      <w:r>
+        <w:rPr>
+          <w:rFonts w:eastAsia="DengXian"/>
+          <w:lang w:eastAsia="zh-CN"/>
+        </w:rPr>
+        <w:t>決定要</w:t>
+      </w:r>
+      <w:proofErr w:type="gramStart"/>
+      <w:r>
+        <w:rPr>
+          <w:rFonts w:eastAsia="DengXian"/>
+          <w:lang w:eastAsia="zh-CN"/>
+        </w:rPr>
+        <w:t>顯示哪一</w:t>
+      </w:r>
+      <w:proofErr w:type="gramEnd"/>
+      <w:r>
+        <w:rPr>
+          <w:rFonts w:eastAsia="DengXian"/>
+          <w:lang w:eastAsia="zh-CN"/>
+        </w:rPr>
+        <w:t>個畫面。 例如：</w:t>
       </w:r>
     </w:p>
     <w:p>
@@ -1299,7 +1550,23 @@
           <w:rFonts w:eastAsia="DengXian"/>
           <w:lang w:eastAsia="zh-CN"/>
         </w:rPr>
-        <w:t>http://localhost:5173/monitor（只載入上半部的臉部追蹤與掉落動畫）</w:t>
+        <w:t>http://localhost:5173/monitor（只載入上半部的臉部追蹤與掉落</w:t>
+      </w:r>
+      <w:proofErr w:type="gramStart"/>
+      <w:r>
+        <w:rPr>
+          <w:rFonts w:eastAsia="DengXian"/>
+          <w:lang w:eastAsia="zh-CN"/>
+        </w:rPr>
+        <w:t>動</w:t>
+      </w:r>
+      <w:proofErr w:type="gramEnd"/>
+      <w:r>
+        <w:rPr>
+          <w:rFonts w:eastAsia="DengXian"/>
+          <w:lang w:eastAsia="zh-CN"/>
+        </w:rPr>
+        <w:t>畫）</w:t>
       </w:r>
     </w:p>
     <w:p>
@@ -1474,80 +1741,130 @@
         </w:rPr>
         <w:t>第二步：資料通訊 (Data Transmission)</w:t>
       </w:r>
+      <w:proofErr w:type="gramStart"/>
       <w:r>
         <w:rPr>
           <w:rFonts w:asciiTheme="minorEastAsia" w:hAnsiTheme="minorEastAsia" w:hint="eastAsia"/>
           <w:b/>
           <w:bCs/>
         </w:rPr>
-        <w:t>——使用方案B</w:t>
-      </w:r>
-    </w:p>
-    <w:p>
-      <w:pPr>
-        <w:jc w:val="left"/>
-        <w:rPr>
-          <w:rFonts w:eastAsia="DengXian"/>
-        </w:rPr>
-      </w:pPr>
-      <w:r>
-        <w:rPr>
-          <w:rFonts w:eastAsia="DengXian"/>
-        </w:rPr>
-        <w:t>既然拆成了兩個頁面，它們該怎麼溝通？</w:t>
-      </w:r>
-    </w:p>
-    <w:p>
-      <w:pPr>
-        <w:jc w:val="left"/>
-        <w:rPr>
-          <w:rFonts w:eastAsia="DengXian"/>
-        </w:rPr>
-      </w:pPr>
-      <w:r>
-        <w:rPr>
-          <w:rFonts w:eastAsia="DengXian"/>
-        </w:rPr>
-        <w:t xml:space="preserve">（例如：平板按下了「盡情哭吧 GO」，顯示器怎麼知道要開始掉字？） </w:t>
-      </w:r>
-    </w:p>
-    <w:p>
-      <w:pPr>
-        <w:jc w:val="left"/>
-        <w:rPr>
-          <w:rFonts w:eastAsia="DengXian"/>
-        </w:rPr>
-      </w:pPr>
-      <w:r>
-        <w:rPr>
-          <w:rFonts w:eastAsia="DengXian"/>
-        </w:rPr>
-        <w:t>這裡有兩種解決方案，取決於你展場的</w:t>
-      </w:r>
-      <w:r>
-        <w:rPr>
-          <w:rFonts w:eastAsia="DengXian"/>
+        <w:t>——</w:t>
+      </w:r>
+      <w:proofErr w:type="gramEnd"/>
+      <w:r>
+        <w:rPr>
+          <w:rFonts w:asciiTheme="minorEastAsia" w:hAnsiTheme="minorEastAsia" w:hint="eastAsia"/>
           <w:b/>
           <w:bCs/>
         </w:rPr>
-        <w:t>硬體配置</w:t>
-      </w:r>
-      <w:r>
-        <w:rPr>
-          <w:rFonts w:eastAsia="DengXian"/>
-        </w:rPr>
-        <w:t>：</w:t>
-      </w:r>
-    </w:p>
-    <w:p>
-      <w:pPr>
-        <w:jc w:val="left"/>
+        <w:t>使用方案B</w:t>
+      </w:r>
+    </w:p>
+    <w:p>
+      <w:pPr>
+        <w:jc w:val="left"/>
+        <w:rPr>
+          <w:rFonts w:eastAsia="DengXian"/>
+        </w:rPr>
+      </w:pPr>
+      <w:r>
+        <w:rPr>
+          <w:rFonts w:eastAsia="DengXian"/>
+        </w:rPr>
+        <w:t>既然拆成了</w:t>
+      </w:r>
+      <w:proofErr w:type="gramStart"/>
+      <w:r>
+        <w:rPr>
+          <w:rFonts w:eastAsia="DengXian"/>
+        </w:rPr>
+        <w:t>兩個頁</w:t>
+      </w:r>
+      <w:proofErr w:type="gramEnd"/>
+      <w:r>
+        <w:rPr>
+          <w:rFonts w:eastAsia="DengXian"/>
+        </w:rPr>
+        <w:t>面，它們該怎麼溝通？</w:t>
+      </w:r>
+    </w:p>
+    <w:p>
+      <w:pPr>
+        <w:jc w:val="left"/>
+        <w:rPr>
+          <w:rFonts w:eastAsia="DengXian"/>
+        </w:rPr>
+      </w:pPr>
+      <w:proofErr w:type="gramStart"/>
+      <w:r>
+        <w:rPr>
+          <w:rFonts w:eastAsia="DengXian"/>
+        </w:rPr>
+        <w:t>（</w:t>
+      </w:r>
+      <w:proofErr w:type="gramEnd"/>
+      <w:r>
+        <w:rPr>
+          <w:rFonts w:eastAsia="DengXian"/>
+        </w:rPr>
+        <w:t>例如：平板按下了「</w:t>
+      </w:r>
+      <w:proofErr w:type="gramStart"/>
+      <w:r>
+        <w:rPr>
+          <w:rFonts w:eastAsia="DengXian"/>
+        </w:rPr>
+        <w:t>盡情哭吧</w:t>
+      </w:r>
+      <w:proofErr w:type="gramEnd"/>
+      <w:r>
+        <w:rPr>
+          <w:rFonts w:eastAsia="DengXian"/>
+        </w:rPr>
+        <w:t xml:space="preserve"> GO」，顯示器怎麼知道要</w:t>
+      </w:r>
+      <w:proofErr w:type="gramStart"/>
+      <w:r>
+        <w:rPr>
+          <w:rFonts w:eastAsia="DengXian"/>
+        </w:rPr>
+        <w:t>開始掉字</w:t>
+      </w:r>
+      <w:proofErr w:type="gramEnd"/>
+      <w:r>
+        <w:rPr>
+          <w:rFonts w:eastAsia="DengXian"/>
+        </w:rPr>
+        <w:t xml:space="preserve">？） </w:t>
+      </w:r>
+    </w:p>
+    <w:p>
+      <w:pPr>
+        <w:jc w:val="left"/>
+        <w:rPr>
+          <w:rFonts w:eastAsia="DengXian"/>
+        </w:rPr>
+      </w:pPr>
+      <w:r>
+        <w:rPr>
+          <w:rFonts w:eastAsia="DengXian"/>
+        </w:rPr>
+        <w:t>這裡有兩種解決方案，取決於你展場的</w:t>
+      </w:r>
+      <w:r>
         <w:rPr>
           <w:rFonts w:eastAsia="DengXian"/>
           <w:b/>
           <w:bCs/>
         </w:rPr>
-      </w:pPr>
+        <w:t>硬體配置</w:t>
+      </w:r>
+      <w:r>
+        <w:rPr>
+          <w:rFonts w:eastAsia="DengXian"/>
+        </w:rPr>
+        <w:t>：</w:t>
+      </w:r>
     </w:p>
     <w:p>
       <w:pPr>
@@ -1558,34 +1875,44 @@
           <w:bCs/>
         </w:rPr>
       </w:pPr>
-      <w:r>
+    </w:p>
+    <w:p>
+      <w:pPr>
+        <w:jc w:val="left"/>
         <w:rPr>
           <w:rFonts w:eastAsia="DengXian"/>
           <w:b/>
           <w:bCs/>
         </w:rPr>
-        <w:t>方案 A：雙螢幕接在「同一台電腦」上 (使用 BroadcastChannel API)</w:t>
-      </w:r>
-    </w:p>
-    <w:p>
-      <w:pPr>
-        <w:jc w:val="left"/>
-        <w:rPr>
-          <w:rFonts w:eastAsia="DengXian"/>
-        </w:rPr>
-      </w:pPr>
-      <w:r>
-        <w:rPr>
-          <w:rFonts w:eastAsia="DengXian"/>
-        </w:rPr>
-        <w:t>如果你的展場是使用一台效能較好的主機（如 Mac Macni 或 PC），同時外接兩個螢幕（一個掛牆上，一個平放當平板），這是</w:t>
-      </w:r>
+      </w:pPr>
       <w:r>
         <w:rPr>
           <w:rFonts w:eastAsia="DengXian"/>
           <w:b/>
           <w:bCs/>
         </w:rPr>
+        <w:t>方案 A：雙螢幕接在「同一台電腦」上 (使用 BroadcastChannel API)</w:t>
+      </w:r>
+    </w:p>
+    <w:p>
+      <w:pPr>
+        <w:jc w:val="left"/>
+        <w:rPr>
+          <w:rFonts w:eastAsia="DengXian"/>
+        </w:rPr>
+      </w:pPr>
+      <w:r>
+        <w:rPr>
+          <w:rFonts w:eastAsia="DengXian"/>
+        </w:rPr>
+        <w:t>如果你的展場是使用一台效能較好的主機（如 Mac Macni 或 PC），同時外接兩個螢幕（一個掛牆上，一個平放當平板），這是</w:t>
+      </w:r>
+      <w:r>
+        <w:rPr>
+          <w:rFonts w:eastAsia="DengXian"/>
+          <w:b/>
+          <w:bCs/>
+        </w:rPr>
         <w:t>最推薦且最簡單</w:t>
       </w:r>
       <w:r>
@@ -1608,7 +1935,71 @@
           <w:rFonts w:eastAsia="DengXian"/>
           <w:lang w:eastAsia="zh-CN"/>
         </w:rPr>
-        <w:t>不需要寫後端伺服器，直接利用瀏覽器內建的 BroadcastChannel 就能讓兩個分頁秒速溝通：</w:t>
+        <w:t>不需要寫</w:t>
+      </w:r>
+      <w:proofErr w:type="gramStart"/>
+      <w:r>
+        <w:rPr>
+          <w:rFonts w:eastAsia="DengXian"/>
+          <w:lang w:eastAsia="zh-CN"/>
+        </w:rPr>
+        <w:t>後</w:t>
+      </w:r>
+      <w:proofErr w:type="gramEnd"/>
+      <w:r>
+        <w:rPr>
+          <w:rFonts w:eastAsia="DengXian"/>
+          <w:lang w:eastAsia="zh-CN"/>
+        </w:rPr>
+        <w:t>端伺服器，直接利用瀏覽器</w:t>
+      </w:r>
+      <w:proofErr w:type="gramStart"/>
+      <w:r>
+        <w:rPr>
+          <w:rFonts w:eastAsia="DengXian"/>
+          <w:lang w:eastAsia="zh-CN"/>
+        </w:rPr>
+        <w:t>內</w:t>
+      </w:r>
+      <w:proofErr w:type="gramEnd"/>
+      <w:r>
+        <w:rPr>
+          <w:rFonts w:eastAsia="DengXian"/>
+          <w:lang w:eastAsia="zh-CN"/>
+        </w:rPr>
+        <w:t>建的 BroadcastChannel 就能讓</w:t>
+      </w:r>
+      <w:proofErr w:type="gramStart"/>
+      <w:r>
+        <w:rPr>
+          <w:rFonts w:eastAsia="DengXian"/>
+          <w:lang w:eastAsia="zh-CN"/>
+        </w:rPr>
+        <w:t>兩</w:t>
+      </w:r>
+      <w:proofErr w:type="gramEnd"/>
+      <w:r>
+        <w:rPr>
+          <w:rFonts w:eastAsia="DengXian"/>
+          <w:lang w:eastAsia="zh-CN"/>
+        </w:rPr>
+        <w:t>個分頁秒速</w:t>
+      </w:r>
+      <w:proofErr w:type="gramStart"/>
+      <w:r>
+        <w:rPr>
+          <w:rFonts w:eastAsia="DengXian"/>
+          <w:lang w:eastAsia="zh-CN"/>
+        </w:rPr>
+        <w:t>溝</w:t>
+      </w:r>
+      <w:proofErr w:type="gramEnd"/>
+      <w:r>
+        <w:rPr>
+          <w:rFonts w:eastAsia="DengXian"/>
+          <w:lang w:eastAsia="zh-CN"/>
+        </w:rPr>
+        <w:t>通：</w:t>
       </w:r>
     </w:p>
     <w:p>
@@ -1734,7 +2125,47 @@
           <w:bCs/>
           <w:lang w:eastAsia="zh-CN"/>
         </w:rPr>
-        <w:t>方案 B：使用兩台「完全不同的實體設備」 (使用 WebSocket / Socket.io)</w:t>
+        <w:t>方案 B：使用</w:t>
+      </w:r>
+      <w:proofErr w:type="gramStart"/>
+      <w:r>
+        <w:rPr>
+          <w:rFonts w:eastAsia="DengXian"/>
+          <w:b/>
+          <w:bCs/>
+          <w:lang w:eastAsia="zh-CN"/>
+        </w:rPr>
+        <w:t>兩</w:t>
+      </w:r>
+      <w:proofErr w:type="gramEnd"/>
+      <w:r>
+        <w:rPr>
+          <w:rFonts w:eastAsia="DengXian"/>
+          <w:b/>
+          <w:bCs/>
+          <w:lang w:eastAsia="zh-CN"/>
+        </w:rPr>
+        <w:t>台「完全不同的實體設</w:t>
+      </w:r>
+      <w:proofErr w:type="gramStart"/>
+      <w:r>
+        <w:rPr>
+          <w:rFonts w:eastAsia="DengXian"/>
+          <w:b/>
+          <w:bCs/>
+          <w:lang w:eastAsia="zh-CN"/>
+        </w:rPr>
+        <w:t>備</w:t>
+      </w:r>
+      <w:proofErr w:type="gramEnd"/>
+      <w:r>
+        <w:rPr>
+          <w:rFonts w:eastAsia="DengXian"/>
+          <w:b/>
+          <w:bCs/>
+          <w:lang w:eastAsia="zh-CN"/>
+        </w:rPr>
+        <w:t>」 (使用 WebSocket / Socket.io)</w:t>
       </w:r>
     </w:p>
     <w:p>
@@ -1992,7 +2423,35 @@
           <w:rFonts w:hint="eastAsia"/>
         </w:rPr>
         <w:lastRenderedPageBreak/>
-        <w:t>預設是一個顯示器，一個平板，平板選擇詞匯后，透過影像識別，流淚流出詞匯最終流入平板，匯聚成寶石。</w:t>
+        <w:t>預設是一個顯示器，一個平板，平板選擇詞</w:t>
+      </w:r>
+      <w:proofErr w:type="gramStart"/>
+      <w:r>
+        <w:rPr>
+          <w:rFonts w:hint="eastAsia"/>
+        </w:rPr>
+        <w:t>匯后</w:t>
+      </w:r>
+      <w:proofErr w:type="gramEnd"/>
+      <w:r>
+        <w:rPr>
+          <w:rFonts w:hint="eastAsia"/>
+        </w:rPr>
+        <w:t>，透過影像識別，流淚流出詞</w:t>
+      </w:r>
+      <w:proofErr w:type="gramStart"/>
+      <w:r>
+        <w:rPr>
+          <w:rFonts w:hint="eastAsia"/>
+        </w:rPr>
+        <w:t>匯</w:t>
+      </w:r>
+      <w:proofErr w:type="gramEnd"/>
+      <w:r>
+        <w:rPr>
+          <w:rFonts w:hint="eastAsia"/>
+        </w:rPr>
+        <w:t>最終流入平板，匯聚成寶石。</w:t>
       </w:r>
     </w:p>
     <w:p/>
@@ -2015,7 +2474,55 @@
         <w:t>Pixi</w:t>
       </w:r>
       <w:r>
-        <w:t>，設計點擊五組心情詞擇一後，透過影像識別人眼，最終選擇的心情詞會不斷從眼中流出（流出的詞匯越來越多，有最大值），詞匯在顯示器的流動過程中，慢慢由完整的字分解成流動的水墨，最後流入顯示器底端，幾秒后平板接續顯示器的水墨，並慢慢往平板中心匯聚，匯聚過程中漸漸變色（顔色是根據最終要生成的寶石顔色決定）</w:t>
+        <w:t>，設計點擊五組心情詞擇</w:t>
+      </w:r>
+      <w:proofErr w:type="gramStart"/>
+      <w:r>
+        <w:t>一</w:t>
+      </w:r>
+      <w:proofErr w:type="gramEnd"/>
+      <w:r>
+        <w:t>後，透過影像識別人眼，最終選擇的</w:t>
+      </w:r>
+      <w:proofErr w:type="gramStart"/>
+      <w:r>
+        <w:t>心情詞會不斷</w:t>
+      </w:r>
+      <w:proofErr w:type="gramEnd"/>
+      <w:r>
+        <w:t>從眼中流出（流出的詞</w:t>
+      </w:r>
+      <w:proofErr w:type="gramStart"/>
+      <w:r>
+        <w:t>匯</w:t>
+      </w:r>
+      <w:proofErr w:type="gramEnd"/>
+      <w:r>
+        <w:t>越來越多，有最大值），詞</w:t>
+      </w:r>
+      <w:proofErr w:type="gramStart"/>
+      <w:r>
+        <w:t>匯</w:t>
+      </w:r>
+      <w:proofErr w:type="gramEnd"/>
+      <w:r>
+        <w:t>在顯示器的流動過程中，慢慢由完整的字分解成流動的水墨，最後流入顯示器底端，幾秒</w:t>
+      </w:r>
+      <w:proofErr w:type="gramStart"/>
+      <w:r>
+        <w:t>后</w:t>
+      </w:r>
+      <w:proofErr w:type="gramEnd"/>
+      <w:r>
+        <w:t>平板接續顯示器的水墨，並慢慢往平板中心匯聚，匯聚過程中漸漸變色</w:t>
+      </w:r>
+      <w:proofErr w:type="gramStart"/>
+      <w:r>
+        <w:t>（</w:t>
+      </w:r>
+      <w:proofErr w:type="gramEnd"/>
+      <w:r>
+        <w:t>顔色是根據最終要生成的寶石顔色決定）</w:t>
       </w:r>
       <w:r>
         <w:t>,</w:t>

</xml_diff>

<commit_message>
0.13.6 feat(audio): implement tiered water-drop sound system with distributed cross-device triggers
</commit_message>
<xml_diff>
--- a/To do.docx
+++ b/To do.docx
@@ -2,6 +2,540 @@
 <file path=word/document.xml><?xml version="1.0" encoding="utf-8"?>
 <w:document xmlns:wpc="http://schemas.microsoft.com/office/word/2010/wordprocessingCanvas" xmlns:cx="http://schemas.microsoft.com/office/drawing/2014/chartex" xmlns:cx1="http://schemas.microsoft.com/office/drawing/2015/9/8/chartex" xmlns:cx2="http://schemas.microsoft.com/office/drawing/2015/10/21/chartex" xmlns:cx3="http://schemas.microsoft.com/office/drawing/2016/5/9/chartex" xmlns:cx4="http://schemas.microsoft.com/office/drawing/2016/5/10/chartex" xmlns:cx5="http://schemas.microsoft.com/office/drawing/2016/5/11/chartex" xmlns:cx6="http://schemas.microsoft.com/office/drawing/2016/5/12/chartex" xmlns:cx7="http://schemas.microsoft.com/office/drawing/2016/5/13/chartex" xmlns:cx8="http://schemas.microsoft.com/office/drawing/2016/5/14/chartex" xmlns:mc="http://schemas.openxmlformats.org/markup-compatibility/2006" xmlns:aink="http://schemas.microsoft.com/office/drawing/2016/ink" xmlns:am3d="http://schemas.microsoft.com/office/drawing/2017/model3d" xmlns:o="urn:schemas-microsoft-com:office:office" xmlns:oel="http://schemas.microsoft.com/office/2019/extlst" xmlns:r="http://schemas.openxmlformats.org/officeDocument/2006/relationships" xmlns:m="http://schemas.openxmlformats.org/officeDocument/2006/math" xmlns:v="urn:schemas-microsoft-com:vml" xmlns:wp14="http://schemas.microsoft.com/office/word/2010/wordprocessingDrawing" xmlns:wp="http://schemas.openxmlformats.org/drawingml/2006/wordprocessingDrawing" xmlns:w10="urn:schemas-microsoft-com:office:word" xmlns:w="http://schemas.openxmlformats.org/wordprocessingml/2006/main" xmlns:w14="http://schemas.microsoft.com/office/word/2010/wordml" xmlns:w15="http://schemas.microsoft.com/office/word/2012/wordml" xmlns:w16cex="http://schemas.microsoft.com/office/word/2018/wordml/cex" xmlns:w16cid="http://schemas.microsoft.com/office/word/2016/wordml/cid" xmlns:w16="http://schemas.microsoft.com/office/word/2018/wordml" xmlns:w16du="http://schemas.microsoft.com/office/word/2023/wordml/word16du" xmlns:w16sdtdh="http://schemas.microsoft.com/office/word/2020/wordml/sdtdatahash" xmlns:w16sdtfl="http://schemas.microsoft.com/office/word/2024/wordml/sdtformatlock" xmlns:w16se="http://schemas.microsoft.com/office/word/2015/wordml/symex" xmlns:wpg="http://schemas.microsoft.com/office/word/2010/wordprocessingGroup" xmlns:wpi="http://schemas.microsoft.com/office/word/2010/wordprocessingInk" xmlns:wne="http://schemas.microsoft.com/office/word/2006/wordml" xmlns:wps="http://schemas.microsoft.com/office/word/2010/wordprocessingShape" mc:Ignorable="w14 w15 w16se w16cid w16 w16cex w16sdtdh w16sdtfl w16du wp14">
   <w:body>
+    <w:sdt>
+      <w:sdtPr>
+        <w:rPr>
+          <w:lang w:val="zh-TW"/>
+        </w:rPr>
+        <w:id w:val="-1432343034"/>
+        <w:docPartObj>
+          <w:docPartGallery w:val="Table of Contents"/>
+          <w:docPartUnique/>
+        </w:docPartObj>
+      </w:sdtPr>
+      <w:sdtEndPr>
+        <w:rPr>
+          <w:rFonts w:asciiTheme="minorHAnsi" w:eastAsiaTheme="minorEastAsia" w:hAnsiTheme="minorHAnsi" w:cstheme="minorBidi"/>
+          <w:b/>
+          <w:bCs/>
+          <w:color w:val="auto"/>
+          <w:kern w:val="2"/>
+          <w:sz w:val="24"/>
+          <w:szCs w:val="22"/>
+        </w:rPr>
+      </w:sdtEndPr>
+      <w:sdtContent>
+        <w:p>
+          <w:pPr>
+            <w:pStyle w:val="af2"/>
+          </w:pPr>
+          <w:r>
+            <w:rPr>
+              <w:lang w:val="zh-TW"/>
+            </w:rPr>
+            <w:t>內容</w:t>
+          </w:r>
+        </w:p>
+        <w:p>
+          <w:pPr>
+            <w:pStyle w:val="11"/>
+            <w:tabs>
+              <w:tab w:val="right" w:leader="dot" w:pos="8296"/>
+            </w:tabs>
+            <w:rPr>
+              <w:noProof/>
+              <w:szCs w:val="24"/>
+              <w14:ligatures w14:val="standardContextual"/>
+            </w:rPr>
+          </w:pPr>
+          <w:r>
+            <w:fldChar w:fldCharType="begin"/>
+          </w:r>
+          <w:r>
+            <w:instrText xml:space="preserve"> TOC \o "1-3" \h \z \u </w:instrText>
+          </w:r>
+          <w:r>
+            <w:fldChar w:fldCharType="separate"/>
+          </w:r>
+          <w:hyperlink w:anchor="_Toc230653778" w:history="1">
+            <w:r>
+              <w:rPr>
+                <w:rStyle w:val="af3"/>
+                <w:rFonts w:eastAsia="DengXian"/>
+                <w:noProof/>
+                <w:lang w:eastAsia="zh-CN"/>
+              </w:rPr>
+              <w:t>待办事项</w:t>
+            </w:r>
+            <w:r>
+              <w:rPr>
+                <w:noProof/>
+                <w:webHidden/>
+              </w:rPr>
+              <w:tab/>
+            </w:r>
+            <w:r>
+              <w:rPr>
+                <w:noProof/>
+                <w:webHidden/>
+              </w:rPr>
+              <w:fldChar w:fldCharType="begin"/>
+            </w:r>
+            <w:r>
+              <w:rPr>
+                <w:noProof/>
+                <w:webHidden/>
+              </w:rPr>
+              <w:instrText xml:space="preserve"> PAGEREF _Toc230653778 \h </w:instrText>
+            </w:r>
+            <w:r>
+              <w:rPr>
+                <w:noProof/>
+                <w:webHidden/>
+              </w:rPr>
+            </w:r>
+            <w:r>
+              <w:rPr>
+                <w:noProof/>
+                <w:webHidden/>
+              </w:rPr>
+              <w:fldChar w:fldCharType="separate"/>
+            </w:r>
+            <w:r>
+              <w:rPr>
+                <w:noProof/>
+                <w:webHidden/>
+              </w:rPr>
+              <w:t>2</w:t>
+            </w:r>
+            <w:r>
+              <w:rPr>
+                <w:noProof/>
+                <w:webHidden/>
+              </w:rPr>
+              <w:fldChar w:fldCharType="end"/>
+            </w:r>
+          </w:hyperlink>
+        </w:p>
+        <w:p>
+          <w:pPr>
+            <w:pStyle w:val="11"/>
+            <w:tabs>
+              <w:tab w:val="right" w:leader="dot" w:pos="8296"/>
+            </w:tabs>
+            <w:rPr>
+              <w:noProof/>
+              <w:szCs w:val="24"/>
+              <w14:ligatures w14:val="standardContextual"/>
+            </w:rPr>
+          </w:pPr>
+          <w:hyperlink w:anchor="_Toc230653779" w:history="1">
+            <w:r>
+              <w:rPr>
+                <w:rStyle w:val="af3"/>
+                <w:noProof/>
+                <w:lang w:eastAsia="zh-CN"/>
+              </w:rPr>
+              <w:t>网络连线</w:t>
+            </w:r>
+            <w:r>
+              <w:rPr>
+                <w:noProof/>
+                <w:webHidden/>
+              </w:rPr>
+              <w:tab/>
+            </w:r>
+            <w:r>
+              <w:rPr>
+                <w:noProof/>
+                <w:webHidden/>
+              </w:rPr>
+              <w:fldChar w:fldCharType="begin"/>
+            </w:r>
+            <w:r>
+              <w:rPr>
+                <w:noProof/>
+                <w:webHidden/>
+              </w:rPr>
+              <w:instrText xml:space="preserve"> PAGEREF _Toc230653779 \h </w:instrText>
+            </w:r>
+            <w:r>
+              <w:rPr>
+                <w:noProof/>
+                <w:webHidden/>
+              </w:rPr>
+            </w:r>
+            <w:r>
+              <w:rPr>
+                <w:noProof/>
+                <w:webHidden/>
+              </w:rPr>
+              <w:fldChar w:fldCharType="separate"/>
+            </w:r>
+            <w:r>
+              <w:rPr>
+                <w:noProof/>
+                <w:webHidden/>
+              </w:rPr>
+              <w:t>3</w:t>
+            </w:r>
+            <w:r>
+              <w:rPr>
+                <w:noProof/>
+                <w:webHidden/>
+              </w:rPr>
+              <w:fldChar w:fldCharType="end"/>
+            </w:r>
+          </w:hyperlink>
+        </w:p>
+        <w:p>
+          <w:pPr>
+            <w:pStyle w:val="11"/>
+            <w:tabs>
+              <w:tab w:val="right" w:leader="dot" w:pos="8296"/>
+            </w:tabs>
+            <w:rPr>
+              <w:noProof/>
+              <w:szCs w:val="24"/>
+              <w14:ligatures w14:val="standardContextual"/>
+            </w:rPr>
+          </w:pPr>
+          <w:hyperlink w:anchor="_Toc230653780" w:history="1">
+            <w:r>
+              <w:rPr>
+                <w:rStyle w:val="af3"/>
+                <w:rFonts w:ascii="DengXian" w:eastAsia="DengXian" w:hAnsi="DengXian"/>
+                <w:noProof/>
+                <w:lang w:eastAsia="zh-CN"/>
+              </w:rPr>
+              <w:t>显卡设定</w:t>
+            </w:r>
+            <w:r>
+              <w:rPr>
+                <w:noProof/>
+                <w:webHidden/>
+              </w:rPr>
+              <w:tab/>
+            </w:r>
+            <w:r>
+              <w:rPr>
+                <w:noProof/>
+                <w:webHidden/>
+              </w:rPr>
+              <w:fldChar w:fldCharType="begin"/>
+            </w:r>
+            <w:r>
+              <w:rPr>
+                <w:noProof/>
+                <w:webHidden/>
+              </w:rPr>
+              <w:instrText xml:space="preserve"> PAGEREF _Toc230653780 \h </w:instrText>
+            </w:r>
+            <w:r>
+              <w:rPr>
+                <w:noProof/>
+                <w:webHidden/>
+              </w:rPr>
+            </w:r>
+            <w:r>
+              <w:rPr>
+                <w:noProof/>
+                <w:webHidden/>
+              </w:rPr>
+              <w:fldChar w:fldCharType="separate"/>
+            </w:r>
+            <w:r>
+              <w:rPr>
+                <w:noProof/>
+                <w:webHidden/>
+              </w:rPr>
+              <w:t>5</w:t>
+            </w:r>
+            <w:r>
+              <w:rPr>
+                <w:noProof/>
+                <w:webHidden/>
+              </w:rPr>
+              <w:fldChar w:fldCharType="end"/>
+            </w:r>
+          </w:hyperlink>
+        </w:p>
+        <w:p>
+          <w:pPr>
+            <w:pStyle w:val="11"/>
+            <w:tabs>
+              <w:tab w:val="right" w:leader="dot" w:pos="8296"/>
+            </w:tabs>
+            <w:rPr>
+              <w:noProof/>
+              <w:szCs w:val="24"/>
+              <w14:ligatures w14:val="standardContextual"/>
+            </w:rPr>
+          </w:pPr>
+          <w:hyperlink w:anchor="_Toc230653781" w:history="1">
+            <w:r>
+              <w:rPr>
+                <w:rStyle w:val="af3"/>
+                <w:rFonts w:ascii="DengXian" w:eastAsia="DengXian" w:hAnsi="DengXian"/>
+                <w:noProof/>
+                <w:lang w:eastAsia="zh-CN"/>
+              </w:rPr>
+              <w:t>安装指令</w:t>
+            </w:r>
+            <w:r>
+              <w:rPr>
+                <w:noProof/>
+                <w:webHidden/>
+              </w:rPr>
+              <w:tab/>
+            </w:r>
+            <w:r>
+              <w:rPr>
+                <w:noProof/>
+                <w:webHidden/>
+              </w:rPr>
+              <w:fldChar w:fldCharType="begin"/>
+            </w:r>
+            <w:r>
+              <w:rPr>
+                <w:noProof/>
+                <w:webHidden/>
+              </w:rPr>
+              <w:instrText xml:space="preserve"> PAGEREF _Toc230653781 \h </w:instrText>
+            </w:r>
+            <w:r>
+              <w:rPr>
+                <w:noProof/>
+                <w:webHidden/>
+              </w:rPr>
+            </w:r>
+            <w:r>
+              <w:rPr>
+                <w:noProof/>
+                <w:webHidden/>
+              </w:rPr>
+              <w:fldChar w:fldCharType="separate"/>
+            </w:r>
+            <w:r>
+              <w:rPr>
+                <w:noProof/>
+                <w:webHidden/>
+              </w:rPr>
+              <w:t>6</w:t>
+            </w:r>
+            <w:r>
+              <w:rPr>
+                <w:noProof/>
+                <w:webHidden/>
+              </w:rPr>
+              <w:fldChar w:fldCharType="end"/>
+            </w:r>
+          </w:hyperlink>
+        </w:p>
+        <w:p>
+          <w:pPr>
+            <w:pStyle w:val="11"/>
+            <w:tabs>
+              <w:tab w:val="right" w:leader="dot" w:pos="8296"/>
+            </w:tabs>
+            <w:rPr>
+              <w:noProof/>
+              <w:szCs w:val="24"/>
+              <w14:ligatures w14:val="standardContextual"/>
+            </w:rPr>
+          </w:pPr>
+          <w:hyperlink w:anchor="_Toc230653782" w:history="1">
+            <w:r>
+              <w:rPr>
+                <w:rStyle w:val="af3"/>
+                <w:noProof/>
+                <w:lang w:eastAsia="zh-CN"/>
+              </w:rPr>
+              <w:t>伺服器</w:t>
+            </w:r>
+            <w:r>
+              <w:rPr>
+                <w:noProof/>
+                <w:webHidden/>
+              </w:rPr>
+              <w:tab/>
+            </w:r>
+            <w:r>
+              <w:rPr>
+                <w:noProof/>
+                <w:webHidden/>
+              </w:rPr>
+              <w:fldChar w:fldCharType="begin"/>
+            </w:r>
+            <w:r>
+              <w:rPr>
+                <w:noProof/>
+                <w:webHidden/>
+              </w:rPr>
+              <w:instrText xml:space="preserve"> PAGEREF _Toc230653782 \h </w:instrText>
+            </w:r>
+            <w:r>
+              <w:rPr>
+                <w:noProof/>
+                <w:webHidden/>
+              </w:rPr>
+            </w:r>
+            <w:r>
+              <w:rPr>
+                <w:noProof/>
+                <w:webHidden/>
+              </w:rPr>
+              <w:fldChar w:fldCharType="separate"/>
+            </w:r>
+            <w:r>
+              <w:rPr>
+                <w:noProof/>
+                <w:webHidden/>
+              </w:rPr>
+              <w:t>7</w:t>
+            </w:r>
+            <w:r>
+              <w:rPr>
+                <w:noProof/>
+                <w:webHidden/>
+              </w:rPr>
+              <w:fldChar w:fldCharType="end"/>
+            </w:r>
+          </w:hyperlink>
+        </w:p>
+        <w:p>
+          <w:pPr>
+            <w:pStyle w:val="11"/>
+            <w:tabs>
+              <w:tab w:val="right" w:leader="dot" w:pos="8296"/>
+            </w:tabs>
+            <w:rPr>
+              <w:noProof/>
+              <w:szCs w:val="24"/>
+              <w14:ligatures w14:val="standardContextual"/>
+            </w:rPr>
+          </w:pPr>
+          <w:hyperlink w:anchor="_Toc230653783" w:history="1">
+            <w:r>
+              <w:rPr>
+                <w:rStyle w:val="af3"/>
+                <w:noProof/>
+                <w:lang w:eastAsia="zh-CN"/>
+              </w:rPr>
+              <w:t>制作规划</w:t>
+            </w:r>
+            <w:r>
+              <w:rPr>
+                <w:noProof/>
+                <w:webHidden/>
+              </w:rPr>
+              <w:tab/>
+            </w:r>
+            <w:r>
+              <w:rPr>
+                <w:noProof/>
+                <w:webHidden/>
+              </w:rPr>
+              <w:fldChar w:fldCharType="begin"/>
+            </w:r>
+            <w:r>
+              <w:rPr>
+                <w:noProof/>
+                <w:webHidden/>
+              </w:rPr>
+              <w:instrText xml:space="preserve"> PAGEREF _Toc230653783 \h </w:instrText>
+            </w:r>
+            <w:r>
+              <w:rPr>
+                <w:noProof/>
+                <w:webHidden/>
+              </w:rPr>
+            </w:r>
+            <w:r>
+              <w:rPr>
+                <w:noProof/>
+                <w:webHidden/>
+              </w:rPr>
+              <w:fldChar w:fldCharType="separate"/>
+            </w:r>
+            <w:r>
+              <w:rPr>
+                <w:noProof/>
+                <w:webHidden/>
+              </w:rPr>
+              <w:t>10</w:t>
+            </w:r>
+            <w:r>
+              <w:rPr>
+                <w:noProof/>
+                <w:webHidden/>
+              </w:rPr>
+              <w:fldChar w:fldCharType="end"/>
+            </w:r>
+          </w:hyperlink>
+        </w:p>
+        <w:p>
+          <w:r>
+            <w:rPr>
+              <w:b/>
+              <w:bCs/>
+              <w:lang w:val="zh-TW"/>
+            </w:rPr>
+            <w:fldChar w:fldCharType="end"/>
+          </w:r>
+        </w:p>
+      </w:sdtContent>
+    </w:sdt>
+    <w:p>
+      <w:pPr>
+        <w:jc w:val="left"/>
+        <w:rPr>
+          <w:rFonts w:eastAsia="DengXian" w:hint="eastAsia"/>
+          <w:lang w:eastAsia="zh-CN"/>
+        </w:rPr>
+      </w:pPr>
+    </w:p>
+    <w:p>
+      <w:pPr>
+        <w:jc w:val="left"/>
+        <w:rPr>
+          <w:rFonts w:asciiTheme="majorHAnsi" w:eastAsia="DengXian" w:hAnsiTheme="majorHAnsi" w:cstheme="majorBidi"/>
+          <w:color w:val="2F5496" w:themeColor="accent1" w:themeShade="BF"/>
+          <w:sz w:val="48"/>
+          <w:szCs w:val="48"/>
+          <w:lang w:eastAsia="zh-CN"/>
+        </w:rPr>
+      </w:pPr>
+      <w:r>
+        <w:rPr>
+          <w:rFonts w:asciiTheme="majorHAnsi" w:eastAsia="DengXian" w:hAnsiTheme="majorHAnsi" w:cstheme="majorBidi"/>
+          <w:color w:val="2F5496" w:themeColor="accent1" w:themeShade="BF"/>
+          <w:sz w:val="48"/>
+          <w:szCs w:val="48"/>
+          <w:lang w:eastAsia="zh-CN"/>
+        </w:rPr>
+        <w:br w:type="page"/>
+      </w:r>
+    </w:p>
+    <w:p>
+      <w:pPr>
+        <w:pStyle w:val="1"/>
+        <w:rPr>
+          <w:rFonts w:eastAsia="DengXian" w:hint="eastAsia"/>
+          <w:lang w:eastAsia="zh-CN"/>
+        </w:rPr>
+      </w:pPr>
+      <w:bookmarkStart w:id="0" w:name="_Toc230653778"/>
+      <w:r>
+        <w:rPr>
+          <w:rFonts w:eastAsia="DengXian" w:hint="eastAsia"/>
+          <w:lang w:eastAsia="zh-CN"/>
+        </w:rPr>
+        <w:lastRenderedPageBreak/>
+        <w:t>待办事项</w:t>
+      </w:r>
+      <w:bookmarkEnd w:id="0"/>
+    </w:p>
     <w:p>
       <w:pPr>
         <w:jc w:val="left"/>
@@ -420,6 +954,7 @@
         <w:sdtPr>
           <w:rPr>
             <w:rFonts w:eastAsia="DengXian" w:hint="eastAsia"/>
+            <w:lang w:eastAsia="zh-CN"/>
           </w:rPr>
           <w:id w:val="1205982233"/>
           <w14:checkbox>
@@ -432,6 +967,7 @@
           <w:r>
             <w:rPr>
               <w:rFonts w:ascii="MS Gothic" w:eastAsia="MS Gothic" w:hAnsi="MS Gothic" w:hint="eastAsia"/>
+              <w:lang w:eastAsia="zh-CN"/>
             </w:rPr>
             <w:t>☐</w:t>
           </w:r>
@@ -464,6 +1000,46 @@
         <w:jc w:val="left"/>
         <w:rPr>
           <w:rFonts w:hint="eastAsia"/>
+          <w:lang w:eastAsia="zh-CN"/>
+        </w:rPr>
+      </w:pPr>
+      <w:sdt>
+        <w:sdtPr>
+          <w:rPr>
+            <w:rFonts w:eastAsia="DengXian" w:hint="eastAsia"/>
+            <w:lang w:eastAsia="zh-CN"/>
+          </w:rPr>
+          <w:id w:val="-2128773119"/>
+          <w14:checkbox>
+            <w14:checked w14:val="1"/>
+            <w14:checkedState w14:val="2612" w14:font="MS Gothic"/>
+            <w14:uncheckedState w14:val="2610" w14:font="MS Gothic"/>
+          </w14:checkbox>
+        </w:sdtPr>
+        <w:sdtContent>
+          <w:r>
+            <w:rPr>
+              <w:rFonts w:ascii="MS Gothic" w:eastAsia="MS Gothic" w:hAnsi="MS Gothic" w:hint="eastAsia"/>
+              <w:lang w:eastAsia="zh-CN"/>
+            </w:rPr>
+            <w:t>☒</w:t>
+          </w:r>
+        </w:sdtContent>
+      </w:sdt>
+      <w:r>
+        <w:rPr>
+          <w:rFonts w:eastAsia="DengXian" w:hint="eastAsia"/>
+          <w:lang w:eastAsia="zh-CN"/>
+        </w:rPr>
+        <w:t xml:space="preserve"> 显示器摄像头隐私测试</w:t>
+      </w:r>
+    </w:p>
+    <w:p>
+      <w:pPr>
+        <w:jc w:val="left"/>
+        <w:rPr>
+          <w:rFonts w:eastAsia="DengXian" w:hint="eastAsia"/>
+          <w:lang w:eastAsia="zh-CN"/>
         </w:rPr>
       </w:pPr>
       <w:sdt>
@@ -471,9 +1047,9 @@
           <w:rPr>
             <w:rFonts w:eastAsia="DengXian" w:hint="eastAsia"/>
           </w:rPr>
-          <w:id w:val="-2128773119"/>
+          <w:id w:val="-532811772"/>
           <w14:checkbox>
-            <w14:checked w14:val="0"/>
+            <w14:checked w14:val="1"/>
             <w14:checkedState w14:val="2612" w14:font="MS Gothic"/>
             <w14:uncheckedState w14:val="2610" w14:font="MS Gothic"/>
           </w14:checkbox>
@@ -483,44 +1059,7 @@
             <w:rPr>
               <w:rFonts w:ascii="MS Gothic" w:eastAsia="MS Gothic" w:hAnsi="MS Gothic" w:hint="eastAsia"/>
             </w:rPr>
-            <w:t>☐</w:t>
-          </w:r>
-        </w:sdtContent>
-      </w:sdt>
-      <w:r>
-        <w:rPr>
-          <w:rFonts w:eastAsia="DengXian" w:hint="eastAsia"/>
-          <w:lang w:eastAsia="zh-CN"/>
-        </w:rPr>
-        <w:t xml:space="preserve"> 显示器摄像头隐私测试</w:t>
-      </w:r>
-    </w:p>
-    <w:p>
-      <w:pPr>
-        <w:jc w:val="left"/>
-        <w:rPr>
-          <w:rFonts w:eastAsia="DengXian" w:hint="eastAsia"/>
-          <w:lang w:eastAsia="zh-CN"/>
-        </w:rPr>
-      </w:pPr>
-      <w:sdt>
-        <w:sdtPr>
-          <w:rPr>
-            <w:rFonts w:eastAsia="DengXian" w:hint="eastAsia"/>
-          </w:rPr>
-          <w:id w:val="-532811772"/>
-          <w14:checkbox>
-            <w14:checked w14:val="0"/>
-            <w14:checkedState w14:val="2612" w14:font="MS Gothic"/>
-            <w14:uncheckedState w14:val="2610" w14:font="MS Gothic"/>
-          </w14:checkbox>
-        </w:sdtPr>
-        <w:sdtContent>
-          <w:r>
-            <w:rPr>
-              <w:rFonts w:ascii="MS Gothic" w:eastAsia="MS Gothic" w:hAnsi="MS Gothic" w:hint="eastAsia"/>
-            </w:rPr>
-            <w:t>☐</w:t>
+            <w:t>☒</w:t>
           </w:r>
         </w:sdtContent>
       </w:sdt>
@@ -588,7 +1127,7 @@
           </w:rPr>
           <w:id w:val="-565875338"/>
           <w14:checkbox>
-            <w14:checked w14:val="0"/>
+            <w14:checked w14:val="1"/>
             <w14:checkedState w14:val="2612" w14:font="MS Gothic"/>
             <w14:uncheckedState w14:val="2610" w14:font="MS Gothic"/>
           </w14:checkbox>
@@ -598,7 +1137,7 @@
             <w:rPr>
               <w:rFonts w:ascii="MS Gothic" w:eastAsia="MS Gothic" w:hAnsi="MS Gothic" w:hint="eastAsia"/>
             </w:rPr>
-            <w:t>☐</w:t>
+            <w:t>☒</w:t>
           </w:r>
         </w:sdtContent>
       </w:sdt>
@@ -646,7 +1185,7 @@
       <w:pPr>
         <w:jc w:val="left"/>
         <w:rPr>
-          <w:rFonts w:hint="eastAsia"/>
+          <w:rFonts w:eastAsia="DengXian" w:hint="eastAsia"/>
         </w:rPr>
       </w:pPr>
       <w:sdt>
@@ -656,7 +1195,7 @@
           </w:rPr>
           <w:id w:val="1768113167"/>
           <w14:checkbox>
-            <w14:checked w14:val="0"/>
+            <w14:checked w14:val="1"/>
             <w14:checkedState w14:val="2612" w14:font="MS Gothic"/>
             <w14:uncheckedState w14:val="2610" w14:font="MS Gothic"/>
           </w14:checkbox>
@@ -666,7 +1205,7 @@
             <w:rPr>
               <w:rFonts w:ascii="MS Gothic" w:eastAsia="MS Gothic" w:hAnsi="MS Gothic" w:hint="eastAsia"/>
             </w:rPr>
-            <w:t>☐</w:t>
+            <w:t>☒</w:t>
           </w:r>
         </w:sdtContent>
       </w:sdt>
@@ -979,21 +1518,7 @@
         <w:rPr>
           <w:rFonts w:asciiTheme="minorEastAsia" w:hAnsiTheme="minorEastAsia" w:hint="eastAsia"/>
         </w:rPr>
-        <w:t>UI設計(改成</w:t>
-      </w:r>
-      <w:proofErr w:type="gramStart"/>
-      <w:r>
-        <w:rPr>
-          <w:rFonts w:asciiTheme="minorEastAsia" w:hAnsiTheme="minorEastAsia" w:hint="eastAsia"/>
-        </w:rPr>
-        <w:t>小字小框長方形</w:t>
-      </w:r>
-      <w:proofErr w:type="gramEnd"/>
-      <w:r>
-        <w:rPr>
-          <w:rFonts w:asciiTheme="minorEastAsia" w:hAnsiTheme="minorEastAsia" w:hint="eastAsia"/>
-        </w:rPr>
-        <w:t>小圓角，加入橫向分隔線，按鈕與標題和開始互動按鈕用粗分隔線，20個字詞的選框之間用較細的分隔線</w:t>
+        <w:t>UI設計(改成小字小框長方形小圓角，加入橫向分隔線，按鈕與標題和開始互動按鈕用粗分隔線，20個字詞的選框之間用較細的分隔線</w:t>
       </w:r>
       <w:r>
         <w:rPr>
@@ -1135,20 +1660,600 @@
           <w:lang w:eastAsia="zh-CN"/>
         </w:rPr>
       </w:pPr>
-    </w:p>
-    <w:p>
-      <w:pPr>
-        <w:jc w:val="left"/>
-        <w:rPr>
-          <w:rFonts w:eastAsia="DengXian"/>
-          <w:lang w:eastAsia="zh-CN"/>
-        </w:rPr>
-      </w:pPr>
+      <w:r>
+        <w:rPr>
+          <w:rFonts w:eastAsia="DengXian"/>
+          <w:lang w:eastAsia="zh-CN"/>
+        </w:rPr>
+        <w:br w:type="page"/>
+      </w:r>
+    </w:p>
+    <w:p>
+      <w:pPr>
+        <w:pStyle w:val="1"/>
+        <w:rPr>
+          <w:rFonts w:eastAsia="DengXian"/>
+          <w:lang w:eastAsia="zh-CN"/>
+        </w:rPr>
+      </w:pPr>
+      <w:bookmarkStart w:id="1" w:name="_Toc230653779"/>
       <w:r>
         <w:rPr>
           <w:rFonts w:eastAsia="DengXian" w:hint="eastAsia"/>
           <w:lang w:eastAsia="zh-CN"/>
         </w:rPr>
+        <w:lastRenderedPageBreak/>
+        <w:t>音效设定</w:t>
+      </w:r>
+    </w:p>
+    <w:p>
+      <w:pPr>
+        <w:rPr>
+          <w:rFonts w:eastAsia="DengXian"/>
+          <w:lang w:eastAsia="zh-CN"/>
+        </w:rPr>
+      </w:pPr>
+      <w:r>
+        <w:rPr>
+          <w:noProof/>
+        </w:rPr>
+        <w:drawing>
+          <wp:inline distT="0" distB="0" distL="0" distR="0" wp14:anchorId="56F8C9B4" wp14:editId="11AC0411">
+            <wp:extent cx="5274310" cy="1753870"/>
+            <wp:effectExtent l="0" t="0" r="2540" b="0"/>
+            <wp:docPr id="958759413" name="圖片 1"/>
+            <wp:cNvGraphicFramePr>
+              <a:graphicFrameLocks xmlns:a="http://schemas.openxmlformats.org/drawingml/2006/main" noChangeAspect="1"/>
+            </wp:cNvGraphicFramePr>
+            <a:graphic xmlns:a="http://schemas.openxmlformats.org/drawingml/2006/main">
+              <a:graphicData uri="http://schemas.openxmlformats.org/drawingml/2006/picture">
+                <pic:pic xmlns:pic="http://schemas.openxmlformats.org/drawingml/2006/picture">
+                  <pic:nvPicPr>
+                    <pic:cNvPr id="958759413" name=""/>
+                    <pic:cNvPicPr/>
+                  </pic:nvPicPr>
+                  <pic:blipFill>
+                    <a:blip r:embed="rId8"/>
+                    <a:stretch>
+                      <a:fillRect/>
+                    </a:stretch>
+                  </pic:blipFill>
+                  <pic:spPr>
+                    <a:xfrm>
+                      <a:off x="0" y="0"/>
+                      <a:ext cx="5274310" cy="1753870"/>
+                    </a:xfrm>
+                    <a:prstGeom prst="rect">
+                      <a:avLst/>
+                    </a:prstGeom>
+                  </pic:spPr>
+                </pic:pic>
+              </a:graphicData>
+            </a:graphic>
+          </wp:inline>
+        </w:drawing>
+      </w:r>
+    </w:p>
+    <w:p>
+      <w:pPr>
+        <w:jc w:val="left"/>
+        <w:rPr>
+          <w:rFonts w:eastAsia="DengXian"/>
+          <w:lang w:eastAsia="zh-CN"/>
+        </w:rPr>
+      </w:pPr>
+      <w:r>
+        <w:rPr>
+          <w:rFonts w:eastAsia="DengXian"/>
+          <w:lang w:eastAsia="zh-CN"/>
+        </w:rPr>
+        <w:br w:type="page"/>
+      </w:r>
+    </w:p>
+    <w:p>
+      <w:pPr>
+        <w:pStyle w:val="1"/>
+        <w:rPr>
+          <w:rFonts w:eastAsia="DengXian"/>
+          <w:lang w:eastAsia="zh-CN"/>
+        </w:rPr>
+      </w:pPr>
+      <w:r>
+        <w:rPr>
+          <w:rFonts w:hint="eastAsia"/>
+          <w:lang w:eastAsia="zh-CN"/>
+        </w:rPr>
+        <w:lastRenderedPageBreak/>
+        <w:t>网络连线</w:t>
+      </w:r>
+      <w:bookmarkEnd w:id="1"/>
+    </w:p>
+    <w:p>
+      <w:pPr>
+        <w:rPr>
+          <w:rFonts w:eastAsia="DengXian"/>
+          <w:lang w:eastAsia="zh-CN"/>
+        </w:rPr>
+      </w:pPr>
+      <w:r>
+        <w:rPr>
+          <w:rFonts w:ascii="Segoe UI Emoji" w:eastAsia="DengXian" w:hAnsi="Segoe UI Emoji" w:cs="Segoe UI Emoji"/>
+        </w:rPr>
+        <w:t>🛠️</w:t>
+      </w:r>
+      <w:r>
+        <w:rPr>
+          <w:rFonts w:eastAsia="DengXian"/>
+        </w:rPr>
+        <w:t xml:space="preserve"> 第一步：調整系統底層權限（最常見原因）</w:t>
+      </w:r>
+    </w:p>
+    <w:p>
+      <w:pPr>
+        <w:rPr>
+          <w:rFonts w:eastAsia="DengXian"/>
+          <w:lang w:eastAsia="zh-CN"/>
+        </w:rPr>
+      </w:pPr>
+      <w:r>
+        <w:rPr>
+          <w:rFonts w:ascii="Segoe UI Emoji" w:eastAsia="DengXian" w:hAnsi="Segoe UI Emoji" w:cs="Segoe UI Emoji"/>
+          <w:highlight w:val="yellow"/>
+        </w:rPr>
+        <w:t>🌐</w:t>
+      </w:r>
+      <w:r>
+        <w:rPr>
+          <w:rFonts w:eastAsia="DengXian"/>
+          <w:highlight w:val="yellow"/>
+        </w:rPr>
+        <w:t xml:space="preserve"> 第二步：檢查網頁的「安全連線協議 (HTTPS)」</w:t>
+      </w:r>
+    </w:p>
+    <w:p>
+      <w:pPr>
+        <w:rPr>
+          <w:rFonts w:eastAsia="DengXian" w:hint="eastAsia"/>
+        </w:rPr>
+      </w:pPr>
+      <w:r>
+        <w:rPr>
+          <w:rFonts w:ascii="Segoe UI Emoji" w:eastAsia="DengXian" w:hAnsi="Segoe UI Emoji" w:cs="Segoe UI Emoji"/>
+        </w:rPr>
+        <w:t>🔌</w:t>
+      </w:r>
+      <w:r>
+        <w:rPr>
+          <w:rFonts w:eastAsia="DengXian"/>
+        </w:rPr>
+        <w:t xml:space="preserve"> 第三步：實體硬體與驅動程式排查</w:t>
+      </w:r>
+    </w:p>
+    <w:p>
+      <w:pPr>
+        <w:jc w:val="left"/>
+        <w:rPr>
+          <w:rFonts w:ascii="DengXian" w:eastAsia="DengXian" w:hAnsi="DengXian"/>
+          <w:lang w:eastAsia="zh-CN"/>
+        </w:rPr>
+      </w:pPr>
+      <w:r>
+        <w:rPr>
+          <w:noProof/>
+        </w:rPr>
+        <w:drawing>
+          <wp:inline distT="0" distB="0" distL="0" distR="0" wp14:anchorId="5BB32A35" wp14:editId="4C99C043">
+            <wp:extent cx="5274310" cy="2086610"/>
+            <wp:effectExtent l="0" t="0" r="2540" b="8890"/>
+            <wp:docPr id="1438543046" name="圖片 1"/>
+            <wp:cNvGraphicFramePr>
+              <a:graphicFrameLocks xmlns:a="http://schemas.openxmlformats.org/drawingml/2006/main" noChangeAspect="1"/>
+            </wp:cNvGraphicFramePr>
+            <a:graphic xmlns:a="http://schemas.openxmlformats.org/drawingml/2006/main">
+              <a:graphicData uri="http://schemas.openxmlformats.org/drawingml/2006/picture">
+                <pic:pic xmlns:pic="http://schemas.openxmlformats.org/drawingml/2006/picture">
+                  <pic:nvPicPr>
+                    <pic:cNvPr id="1438543046" name=""/>
+                    <pic:cNvPicPr/>
+                  </pic:nvPicPr>
+                  <pic:blipFill>
+                    <a:blip r:embed="rId9"/>
+                    <a:stretch>
+                      <a:fillRect/>
+                    </a:stretch>
+                  </pic:blipFill>
+                  <pic:spPr>
+                    <a:xfrm>
+                      <a:off x="0" y="0"/>
+                      <a:ext cx="5274310" cy="2086610"/>
+                    </a:xfrm>
+                    <a:prstGeom prst="rect">
+                      <a:avLst/>
+                    </a:prstGeom>
+                  </pic:spPr>
+                </pic:pic>
+              </a:graphicData>
+            </a:graphic>
+          </wp:inline>
+        </w:drawing>
+      </w:r>
+    </w:p>
+    <w:p>
+      <w:pPr>
+        <w:jc w:val="left"/>
+        <w:rPr>
+          <w:rFonts w:ascii="DengXian" w:eastAsia="DengXian" w:hAnsi="DengXian"/>
+          <w:lang w:eastAsia="zh-CN"/>
+        </w:rPr>
+      </w:pPr>
+      <w:r>
+        <w:rPr>
+          <w:noProof/>
+        </w:rPr>
+        <w:drawing>
+          <wp:inline distT="0" distB="0" distL="0" distR="0" wp14:anchorId="038D68D1" wp14:editId="09F906A9">
+            <wp:extent cx="5274310" cy="1283970"/>
+            <wp:effectExtent l="0" t="0" r="2540" b="0"/>
+            <wp:docPr id="861200233" name="圖片 1"/>
+            <wp:cNvGraphicFramePr>
+              <a:graphicFrameLocks xmlns:a="http://schemas.openxmlformats.org/drawingml/2006/main" noChangeAspect="1"/>
+            </wp:cNvGraphicFramePr>
+            <a:graphic xmlns:a="http://schemas.openxmlformats.org/drawingml/2006/main">
+              <a:graphicData uri="http://schemas.openxmlformats.org/drawingml/2006/picture">
+                <pic:pic xmlns:pic="http://schemas.openxmlformats.org/drawingml/2006/picture">
+                  <pic:nvPicPr>
+                    <pic:cNvPr id="861200233" name=""/>
+                    <pic:cNvPicPr/>
+                  </pic:nvPicPr>
+                  <pic:blipFill>
+                    <a:blip r:embed="rId10"/>
+                    <a:stretch>
+                      <a:fillRect/>
+                    </a:stretch>
+                  </pic:blipFill>
+                  <pic:spPr>
+                    <a:xfrm>
+                      <a:off x="0" y="0"/>
+                      <a:ext cx="5274310" cy="1283970"/>
+                    </a:xfrm>
+                    <a:prstGeom prst="rect">
+                      <a:avLst/>
+                    </a:prstGeom>
+                  </pic:spPr>
+                </pic:pic>
+              </a:graphicData>
+            </a:graphic>
+          </wp:inline>
+        </w:drawing>
+      </w:r>
+    </w:p>
+    <w:p>
+      <w:pPr>
+        <w:jc w:val="left"/>
+        <w:rPr>
+          <w:rFonts w:ascii="DengXian" w:eastAsia="DengXian" w:hAnsi="DengXian"/>
+          <w:lang w:eastAsia="zh-CN"/>
+        </w:rPr>
+      </w:pPr>
+      <w:r>
+        <w:rPr>
+          <w:noProof/>
+        </w:rPr>
+        <w:drawing>
+          <wp:inline distT="0" distB="0" distL="0" distR="0" wp14:anchorId="627C6B30" wp14:editId="5CC566D9">
+            <wp:extent cx="5274310" cy="2250440"/>
+            <wp:effectExtent l="0" t="0" r="2540" b="0"/>
+            <wp:docPr id="968233815" name="圖片 1"/>
+            <wp:cNvGraphicFramePr>
+              <a:graphicFrameLocks xmlns:a="http://schemas.openxmlformats.org/drawingml/2006/main" noChangeAspect="1"/>
+            </wp:cNvGraphicFramePr>
+            <a:graphic xmlns:a="http://schemas.openxmlformats.org/drawingml/2006/main">
+              <a:graphicData uri="http://schemas.openxmlformats.org/drawingml/2006/picture">
+                <pic:pic xmlns:pic="http://schemas.openxmlformats.org/drawingml/2006/picture">
+                  <pic:nvPicPr>
+                    <pic:cNvPr id="968233815" name=""/>
+                    <pic:cNvPicPr/>
+                  </pic:nvPicPr>
+                  <pic:blipFill>
+                    <a:blip r:embed="rId11"/>
+                    <a:stretch>
+                      <a:fillRect/>
+                    </a:stretch>
+                  </pic:blipFill>
+                  <pic:spPr>
+                    <a:xfrm>
+                      <a:off x="0" y="0"/>
+                      <a:ext cx="5274310" cy="2250440"/>
+                    </a:xfrm>
+                    <a:prstGeom prst="rect">
+                      <a:avLst/>
+                    </a:prstGeom>
+                  </pic:spPr>
+                </pic:pic>
+              </a:graphicData>
+            </a:graphic>
+          </wp:inline>
+        </w:drawing>
+      </w:r>
+    </w:p>
+    <w:p>
+      <w:pPr>
+        <w:jc w:val="left"/>
+        <w:rPr>
+          <w:rFonts w:ascii="DengXian" w:eastAsia="DengXian" w:hAnsi="DengXian"/>
+          <w:lang w:eastAsia="zh-CN"/>
+        </w:rPr>
+      </w:pPr>
+      <w:r>
+        <w:rPr>
+          <w:noProof/>
+        </w:rPr>
+        <w:lastRenderedPageBreak/>
+        <w:drawing>
+          <wp:inline distT="0" distB="0" distL="0" distR="0" wp14:anchorId="5D6FC787" wp14:editId="390A42FD">
+            <wp:extent cx="5274310" cy="2671445"/>
+            <wp:effectExtent l="0" t="0" r="2540" b="0"/>
+            <wp:docPr id="1838017014" name="圖片 1"/>
+            <wp:cNvGraphicFramePr>
+              <a:graphicFrameLocks xmlns:a="http://schemas.openxmlformats.org/drawingml/2006/main" noChangeAspect="1"/>
+            </wp:cNvGraphicFramePr>
+            <a:graphic xmlns:a="http://schemas.openxmlformats.org/drawingml/2006/main">
+              <a:graphicData uri="http://schemas.openxmlformats.org/drawingml/2006/picture">
+                <pic:pic xmlns:pic="http://schemas.openxmlformats.org/drawingml/2006/picture">
+                  <pic:nvPicPr>
+                    <pic:cNvPr id="1838017014" name=""/>
+                    <pic:cNvPicPr/>
+                  </pic:nvPicPr>
+                  <pic:blipFill>
+                    <a:blip r:embed="rId12"/>
+                    <a:stretch>
+                      <a:fillRect/>
+                    </a:stretch>
+                  </pic:blipFill>
+                  <pic:spPr>
+                    <a:xfrm>
+                      <a:off x="0" y="0"/>
+                      <a:ext cx="5274310" cy="2671445"/>
+                    </a:xfrm>
+                    <a:prstGeom prst="rect">
+                      <a:avLst/>
+                    </a:prstGeom>
+                  </pic:spPr>
+                </pic:pic>
+              </a:graphicData>
+            </a:graphic>
+          </wp:inline>
+        </w:drawing>
+      </w:r>
+    </w:p>
+    <w:p>
+      <w:pPr>
+        <w:jc w:val="left"/>
+        <w:rPr>
+          <w:rFonts w:ascii="DengXian" w:eastAsia="DengXian" w:hAnsi="DengXian" w:hint="eastAsia"/>
+          <w:lang w:eastAsia="zh-CN"/>
+        </w:rPr>
+      </w:pPr>
+      <w:r>
+        <w:rPr>
+          <w:noProof/>
+        </w:rPr>
+        <w:drawing>
+          <wp:inline distT="0" distB="0" distL="0" distR="0" wp14:anchorId="1515BDEA" wp14:editId="2CBD9CB6">
+            <wp:extent cx="5274310" cy="1751330"/>
+            <wp:effectExtent l="0" t="0" r="2540" b="1270"/>
+            <wp:docPr id="717140250" name="圖片 1"/>
+            <wp:cNvGraphicFramePr>
+              <a:graphicFrameLocks xmlns:a="http://schemas.openxmlformats.org/drawingml/2006/main" noChangeAspect="1"/>
+            </wp:cNvGraphicFramePr>
+            <a:graphic xmlns:a="http://schemas.openxmlformats.org/drawingml/2006/main">
+              <a:graphicData uri="http://schemas.openxmlformats.org/drawingml/2006/picture">
+                <pic:pic xmlns:pic="http://schemas.openxmlformats.org/drawingml/2006/picture">
+                  <pic:nvPicPr>
+                    <pic:cNvPr id="717140250" name=""/>
+                    <pic:cNvPicPr/>
+                  </pic:nvPicPr>
+                  <pic:blipFill>
+                    <a:blip r:embed="rId13"/>
+                    <a:stretch>
+                      <a:fillRect/>
+                    </a:stretch>
+                  </pic:blipFill>
+                  <pic:spPr>
+                    <a:xfrm>
+                      <a:off x="0" y="0"/>
+                      <a:ext cx="5274310" cy="1751330"/>
+                    </a:xfrm>
+                    <a:prstGeom prst="rect">
+                      <a:avLst/>
+                    </a:prstGeom>
+                  </pic:spPr>
+                </pic:pic>
+              </a:graphicData>
+            </a:graphic>
+          </wp:inline>
+        </w:drawing>
+      </w:r>
+    </w:p>
+    <w:p>
+      <w:pPr>
+        <w:jc w:val="left"/>
+        <w:rPr>
+          <w:rFonts w:ascii="DengXian" w:eastAsia="DengXian" w:hAnsi="DengXian" w:cstheme="majorBidi"/>
+          <w:color w:val="2F5496" w:themeColor="accent1" w:themeShade="BF"/>
+          <w:sz w:val="48"/>
+          <w:szCs w:val="48"/>
+          <w:lang w:eastAsia="zh-CN"/>
+        </w:rPr>
+      </w:pPr>
+      <w:r>
+        <w:rPr>
+          <w:rFonts w:ascii="DengXian" w:eastAsia="DengXian" w:hAnsi="DengXian"/>
+          <w:lang w:eastAsia="zh-CN"/>
+        </w:rPr>
+        <w:br w:type="page"/>
+      </w:r>
+    </w:p>
+    <w:p>
+      <w:pPr>
+        <w:pStyle w:val="1"/>
+        <w:rPr>
+          <w:rFonts w:ascii="DengXian" w:eastAsia="DengXian" w:hAnsi="DengXian"/>
+          <w:lang w:eastAsia="zh-CN"/>
+        </w:rPr>
+      </w:pPr>
+      <w:bookmarkStart w:id="2" w:name="_Toc230653780"/>
+      <w:r>
+        <w:rPr>
+          <w:rFonts w:ascii="DengXian" w:eastAsia="DengXian" w:hAnsi="DengXian" w:hint="eastAsia"/>
+          <w:lang w:eastAsia="zh-CN"/>
+        </w:rPr>
+        <w:lastRenderedPageBreak/>
+        <w:t>显卡设定</w:t>
+      </w:r>
+      <w:bookmarkEnd w:id="2"/>
+    </w:p>
+    <w:p>
+      <w:pPr>
+        <w:rPr>
+          <w:rFonts w:eastAsia="DengXian"/>
+          <w:lang w:eastAsia="zh-CN"/>
+        </w:rPr>
+      </w:pPr>
+      <w:r>
+        <w:rPr>
+          <w:noProof/>
+        </w:rPr>
+        <w:drawing>
+          <wp:inline distT="0" distB="0" distL="0" distR="0" wp14:anchorId="0A713861" wp14:editId="0793DCAE">
+            <wp:extent cx="5274310" cy="3209925"/>
+            <wp:effectExtent l="0" t="0" r="2540" b="9525"/>
+            <wp:docPr id="956209430" name="圖片 1"/>
+            <wp:cNvGraphicFramePr>
+              <a:graphicFrameLocks xmlns:a="http://schemas.openxmlformats.org/drawingml/2006/main" noChangeAspect="1"/>
+            </wp:cNvGraphicFramePr>
+            <a:graphic xmlns:a="http://schemas.openxmlformats.org/drawingml/2006/main">
+              <a:graphicData uri="http://schemas.openxmlformats.org/drawingml/2006/picture">
+                <pic:pic xmlns:pic="http://schemas.openxmlformats.org/drawingml/2006/picture">
+                  <pic:nvPicPr>
+                    <pic:cNvPr id="956209430" name=""/>
+                    <pic:cNvPicPr/>
+                  </pic:nvPicPr>
+                  <pic:blipFill>
+                    <a:blip r:embed="rId14"/>
+                    <a:stretch>
+                      <a:fillRect/>
+                    </a:stretch>
+                  </pic:blipFill>
+                  <pic:spPr>
+                    <a:xfrm>
+                      <a:off x="0" y="0"/>
+                      <a:ext cx="5274310" cy="3209925"/>
+                    </a:xfrm>
+                    <a:prstGeom prst="rect">
+                      <a:avLst/>
+                    </a:prstGeom>
+                  </pic:spPr>
+                </pic:pic>
+              </a:graphicData>
+            </a:graphic>
+          </wp:inline>
+        </w:drawing>
+      </w:r>
+      <w:r>
+        <w:rPr>
+          <w:noProof/>
+        </w:rPr>
+        <w:t xml:space="preserve"> </w:t>
+      </w:r>
+      <w:r>
+        <w:rPr>
+          <w:noProof/>
+        </w:rPr>
+        <w:drawing>
+          <wp:inline distT="0" distB="0" distL="0" distR="0" wp14:anchorId="3B16F332" wp14:editId="6144AE9A">
+            <wp:extent cx="5274310" cy="3599180"/>
+            <wp:effectExtent l="0" t="0" r="2540" b="1270"/>
+            <wp:docPr id="641256033" name="圖片 1"/>
+            <wp:cNvGraphicFramePr>
+              <a:graphicFrameLocks xmlns:a="http://schemas.openxmlformats.org/drawingml/2006/main" noChangeAspect="1"/>
+            </wp:cNvGraphicFramePr>
+            <a:graphic xmlns:a="http://schemas.openxmlformats.org/drawingml/2006/main">
+              <a:graphicData uri="http://schemas.openxmlformats.org/drawingml/2006/picture">
+                <pic:pic xmlns:pic="http://schemas.openxmlformats.org/drawingml/2006/picture">
+                  <pic:nvPicPr>
+                    <pic:cNvPr id="641256033" name=""/>
+                    <pic:cNvPicPr/>
+                  </pic:nvPicPr>
+                  <pic:blipFill>
+                    <a:blip r:embed="rId15"/>
+                    <a:stretch>
+                      <a:fillRect/>
+                    </a:stretch>
+                  </pic:blipFill>
+                  <pic:spPr>
+                    <a:xfrm>
+                      <a:off x="0" y="0"/>
+                      <a:ext cx="5274310" cy="3599180"/>
+                    </a:xfrm>
+                    <a:prstGeom prst="rect">
+                      <a:avLst/>
+                    </a:prstGeom>
+                  </pic:spPr>
+                </pic:pic>
+              </a:graphicData>
+            </a:graphic>
+          </wp:inline>
+        </w:drawing>
+      </w:r>
+    </w:p>
+    <w:p>
+      <w:pPr>
+        <w:jc w:val="left"/>
+        <w:rPr>
+          <w:rFonts w:eastAsia="DengXian"/>
+          <w:lang w:eastAsia="zh-CN"/>
+        </w:rPr>
+      </w:pPr>
+      <w:r>
+        <w:rPr>
+          <w:rFonts w:eastAsia="DengXian"/>
+          <w:lang w:eastAsia="zh-CN"/>
+        </w:rPr>
+        <w:br w:type="page"/>
+      </w:r>
+    </w:p>
+    <w:p>
+      <w:pPr>
+        <w:pStyle w:val="1"/>
+        <w:rPr>
+          <w:lang w:eastAsia="zh-CN"/>
+        </w:rPr>
+      </w:pPr>
+      <w:bookmarkStart w:id="3" w:name="_Toc230653781"/>
+      <w:r>
+        <w:rPr>
+          <w:rFonts w:ascii="DengXian" w:eastAsia="DengXian" w:hAnsi="DengXian" w:hint="eastAsia"/>
+          <w:lang w:eastAsia="zh-CN"/>
+        </w:rPr>
+        <w:lastRenderedPageBreak/>
+        <w:t>安装指令</w:t>
+      </w:r>
+      <w:bookmarkEnd w:id="3"/>
+    </w:p>
+    <w:p>
+      <w:pPr>
+        <w:jc w:val="left"/>
+        <w:rPr>
+          <w:rFonts w:eastAsia="DengXian"/>
+          <w:lang w:eastAsia="zh-CN"/>
+        </w:rPr>
+      </w:pPr>
+      <w:r>
+        <w:rPr>
+          <w:rFonts w:eastAsia="DengXian" w:hint="eastAsia"/>
+          <w:lang w:eastAsia="zh-CN"/>
+        </w:rPr>
         <w:t xml:space="preserve"># </w:t>
       </w:r>
       <w:r>
@@ -1168,44 +2273,46 @@
           <w:lang w:eastAsia="zh-CN"/>
         </w:rPr>
       </w:pPr>
-      <w:r>
-        <w:rPr>
-          <w:rFonts w:eastAsia="DengXian"/>
-          <w:lang w:eastAsia="zh-CN"/>
-        </w:rPr>
-        <w:t>npm install react-router-dom</w:t>
-      </w:r>
-    </w:p>
-    <w:p>
-      <w:pPr>
-        <w:jc w:val="left"/>
-        <w:rPr>
-          <w:rFonts w:eastAsia="DengXian"/>
-          <w:lang w:eastAsia="zh-CN"/>
-        </w:rPr>
-      </w:pPr>
-      <w:r>
-        <w:rPr>
-          <w:rFonts w:eastAsia="DengXian"/>
-          <w:lang w:eastAsia="zh-CN"/>
-        </w:rPr>
-        <w:t># 安裝前端 Socket 用</w:t>
-      </w:r>
-      <w:proofErr w:type="gramStart"/>
-      <w:r>
-        <w:rPr>
-          <w:rFonts w:eastAsia="DengXian"/>
-          <w:lang w:eastAsia="zh-CN"/>
-        </w:rPr>
-        <w:t>戶</w:t>
-      </w:r>
-      <w:proofErr w:type="gramEnd"/>
-      <w:r>
-        <w:rPr>
-          <w:rFonts w:eastAsia="DengXian"/>
-          <w:lang w:eastAsia="zh-CN"/>
-        </w:rPr>
-        <w:t xml:space="preserve">端 </w:t>
+      <w:proofErr w:type="spellStart"/>
+      <w:r>
+        <w:rPr>
+          <w:rFonts w:eastAsia="DengXian"/>
+          <w:lang w:eastAsia="zh-CN"/>
+        </w:rPr>
+        <w:t>npm</w:t>
+      </w:r>
+      <w:proofErr w:type="spellEnd"/>
+      <w:r>
+        <w:rPr>
+          <w:rFonts w:eastAsia="DengXian"/>
+          <w:lang w:eastAsia="zh-CN"/>
+        </w:rPr>
+        <w:t xml:space="preserve"> install react-router-</w:t>
+      </w:r>
+      <w:proofErr w:type="spellStart"/>
+      <w:r>
+        <w:rPr>
+          <w:rFonts w:eastAsia="DengXian"/>
+          <w:lang w:eastAsia="zh-CN"/>
+        </w:rPr>
+        <w:t>dom</w:t>
+      </w:r>
+      <w:proofErr w:type="spellEnd"/>
+    </w:p>
+    <w:p>
+      <w:pPr>
+        <w:jc w:val="left"/>
+        <w:rPr>
+          <w:rFonts w:eastAsia="DengXian"/>
+          <w:lang w:eastAsia="zh-CN"/>
+        </w:rPr>
+      </w:pPr>
+      <w:r>
+        <w:rPr>
+          <w:rFonts w:eastAsia="DengXian"/>
+          <w:lang w:eastAsia="zh-CN"/>
+        </w:rPr>
+        <w:t xml:space="preserve"># 安裝前端 Socket 用戶端 </w:t>
       </w:r>
     </w:p>
     <w:p>
@@ -1217,76 +2324,37 @@
           <w:lang w:eastAsia="zh-CN"/>
         </w:rPr>
       </w:pPr>
-      <w:r>
-        <w:rPr>
-          <w:rFonts w:eastAsia="DengXian"/>
-          <w:lang w:eastAsia="zh-CN"/>
-        </w:rPr>
-        <w:t>npm install socket.io-client</w:t>
-      </w:r>
-    </w:p>
-    <w:p>
-      <w:pPr>
-        <w:jc w:val="left"/>
-        <w:rPr>
-          <w:rFonts w:eastAsia="DengXian"/>
-          <w:lang w:eastAsia="zh-CN"/>
-        </w:rPr>
-      </w:pPr>
-      <w:r>
-        <w:rPr>
-          <w:rFonts w:eastAsia="DengXian"/>
-          <w:lang w:eastAsia="zh-CN"/>
-        </w:rPr>
-        <w:t># 安裝</w:t>
-      </w:r>
-      <w:proofErr w:type="gramStart"/>
-      <w:r>
-        <w:rPr>
-          <w:rFonts w:eastAsia="DengXian"/>
-          <w:lang w:eastAsia="zh-CN"/>
-        </w:rPr>
-        <w:t>後</w:t>
-      </w:r>
-      <w:proofErr w:type="gramEnd"/>
-      <w:r>
-        <w:rPr>
-          <w:rFonts w:eastAsia="DengXian"/>
-          <w:lang w:eastAsia="zh-CN"/>
-        </w:rPr>
-        <w:t>端伺服器套件（用</w:t>
-      </w:r>
-      <w:proofErr w:type="gramStart"/>
-      <w:r>
-        <w:rPr>
-          <w:rFonts w:eastAsia="DengXian"/>
-          <w:lang w:eastAsia="zh-CN"/>
-        </w:rPr>
-        <w:t>來</w:t>
-      </w:r>
-      <w:proofErr w:type="gramEnd"/>
-      <w:r>
-        <w:rPr>
-          <w:rFonts w:eastAsia="DengXian"/>
-          <w:lang w:eastAsia="zh-CN"/>
-        </w:rPr>
-        <w:t>當</w:t>
-      </w:r>
-      <w:proofErr w:type="gramStart"/>
-      <w:r>
-        <w:rPr>
-          <w:rFonts w:eastAsia="DengXian"/>
-          <w:lang w:eastAsia="zh-CN"/>
-        </w:rPr>
-        <w:t>兩</w:t>
-      </w:r>
-      <w:proofErr w:type="gramEnd"/>
-      <w:r>
-        <w:rPr>
-          <w:rFonts w:eastAsia="DengXian"/>
-          <w:lang w:eastAsia="zh-CN"/>
-        </w:rPr>
-        <w:t xml:space="preserve">台裝置的郵差） </w:t>
+      <w:proofErr w:type="spellStart"/>
+      <w:r>
+        <w:rPr>
+          <w:rFonts w:eastAsia="DengXian"/>
+          <w:lang w:eastAsia="zh-CN"/>
+        </w:rPr>
+        <w:t>npm</w:t>
+      </w:r>
+      <w:proofErr w:type="spellEnd"/>
+      <w:r>
+        <w:rPr>
+          <w:rFonts w:eastAsia="DengXian"/>
+          <w:lang w:eastAsia="zh-CN"/>
+        </w:rPr>
+        <w:t xml:space="preserve"> install socket.io-client</w:t>
+      </w:r>
+    </w:p>
+    <w:p>
+      <w:pPr>
+        <w:jc w:val="left"/>
+        <w:rPr>
+          <w:rFonts w:eastAsia="DengXian"/>
+          <w:lang w:eastAsia="zh-CN"/>
+        </w:rPr>
+      </w:pPr>
+      <w:r>
+        <w:rPr>
+          <w:rFonts w:eastAsia="DengXian"/>
+          <w:lang w:eastAsia="zh-CN"/>
+        </w:rPr>
+        <w:t xml:space="preserve"># 安裝後端伺服器套件（用來當兩台裝置的郵差） </w:t>
       </w:r>
     </w:p>
     <w:p>
@@ -1298,12 +2366,21 @@
           <w:lang w:eastAsia="zh-CN"/>
         </w:rPr>
       </w:pPr>
-      <w:r>
-        <w:rPr>
-          <w:rFonts w:eastAsia="DengXian"/>
-          <w:lang w:eastAsia="zh-CN"/>
-        </w:rPr>
-        <w:t>npm install express socket.io</w:t>
+      <w:proofErr w:type="spellStart"/>
+      <w:r>
+        <w:rPr>
+          <w:rFonts w:eastAsia="DengXian"/>
+          <w:lang w:eastAsia="zh-CN"/>
+        </w:rPr>
+        <w:t>npm</w:t>
+      </w:r>
+      <w:proofErr w:type="spellEnd"/>
+      <w:r>
+        <w:rPr>
+          <w:rFonts w:eastAsia="DengXian"/>
+          <w:lang w:eastAsia="zh-CN"/>
+        </w:rPr>
+        <w:t xml:space="preserve"> install express socket.io</w:t>
       </w:r>
     </w:p>
     <w:p>
@@ -1316,53 +2393,201 @@
         </w:rPr>
         <w:t xml:space="preserve"># </w:t>
       </w:r>
-      <w:proofErr w:type="gramStart"/>
       <w:r>
         <w:rPr>
           <w:rFonts w:asciiTheme="minorEastAsia" w:hAnsiTheme="minorEastAsia" w:hint="eastAsia"/>
           <w:lang w:eastAsia="zh-CN"/>
         </w:rPr>
-        <w:t>啟動</w:t>
-      </w:r>
-      <w:proofErr w:type="gramEnd"/>
-      <w:r>
-        <w:rPr>
-          <w:rFonts w:asciiTheme="minorEastAsia" w:hAnsiTheme="minorEastAsia" w:hint="eastAsia"/>
-          <w:lang w:eastAsia="zh-CN"/>
-        </w:rPr>
+        <w:t>啟動伺服器</w:t>
+      </w:r>
+    </w:p>
+    <w:p>
+      <w:pPr>
+        <w:jc w:val="left"/>
+        <w:rPr>
+          <w:rFonts w:eastAsia="DengXian"/>
+          <w:lang w:eastAsia="zh-CN"/>
+        </w:rPr>
+      </w:pPr>
+      <w:r>
+        <w:tab/>
+      </w:r>
+      <w:r>
+        <w:t>node server.js</w:t>
+      </w:r>
+    </w:p>
+    <w:p>
+      <w:pPr>
+        <w:jc w:val="left"/>
+        <w:rPr>
+          <w:rFonts w:eastAsia="DengXian"/>
+          <w:lang w:eastAsia="zh-CN"/>
+        </w:rPr>
+      </w:pPr>
+      <w:r>
+        <w:rPr>
+          <w:rFonts w:eastAsia="DengXian" w:hint="eastAsia"/>
+          <w:lang w:eastAsia="zh-CN"/>
+        </w:rPr>
+        <w:t xml:space="preserve"># </w:t>
+      </w:r>
+      <w:r>
+        <w:rPr>
+          <w:rFonts w:eastAsia="DengXian"/>
+          <w:lang w:eastAsia="zh-CN"/>
+        </w:rPr>
+        <w:t>第三方音效庫</w:t>
+      </w:r>
+      <w:r>
+        <w:rPr>
+          <w:rFonts w:eastAsia="DengXian" w:hint="eastAsia"/>
+          <w:lang w:eastAsia="zh-CN"/>
+        </w:rPr>
+        <w:t>（</w:t>
+      </w:r>
+      <w:r>
+        <w:rPr>
+          <w:rFonts w:eastAsia="DengXian"/>
+          <w:lang w:eastAsia="zh-CN"/>
+        </w:rPr>
+        <w:t>新增 howler 套件依賴</w:t>
+      </w:r>
+      <w:r>
+        <w:rPr>
+          <w:rFonts w:eastAsia="DengXian" w:hint="eastAsia"/>
+          <w:lang w:eastAsia="zh-CN"/>
+        </w:rPr>
+        <w:t>）</w:t>
+      </w:r>
+    </w:p>
+    <w:p>
+      <w:pPr>
+        <w:jc w:val="left"/>
+        <w:rPr>
+          <w:rFonts w:eastAsia="DengXian" w:hint="eastAsia"/>
+          <w:lang w:eastAsia="zh-CN"/>
+        </w:rPr>
+      </w:pPr>
+      <w:r>
+        <w:rPr>
+          <w:rFonts w:eastAsia="DengXian"/>
+          <w:lang w:eastAsia="zh-CN"/>
+        </w:rPr>
+        <w:tab/>
+      </w:r>
+      <w:proofErr w:type="spellStart"/>
+      <w:r>
+        <w:rPr>
+          <w:rFonts w:eastAsia="DengXian"/>
+          <w:lang w:eastAsia="zh-CN"/>
+        </w:rPr>
+        <w:t>npm</w:t>
+      </w:r>
+      <w:proofErr w:type="spellEnd"/>
+      <w:r>
+        <w:rPr>
+          <w:rFonts w:eastAsia="DengXian"/>
+          <w:lang w:eastAsia="zh-CN"/>
+        </w:rPr>
+        <w:t xml:space="preserve"> </w:t>
+      </w:r>
+      <w:proofErr w:type="spellStart"/>
+      <w:r>
+        <w:rPr>
+          <w:rFonts w:eastAsia="DengXian"/>
+          <w:lang w:eastAsia="zh-CN"/>
+        </w:rPr>
+        <w:t>i</w:t>
+      </w:r>
+      <w:proofErr w:type="spellEnd"/>
+      <w:r>
+        <w:rPr>
+          <w:rFonts w:eastAsia="DengXian"/>
+          <w:lang w:eastAsia="zh-CN"/>
+        </w:rPr>
+        <w:t xml:space="preserve"> howler</w:t>
+      </w:r>
+    </w:p>
+    <w:p>
+      <w:pPr>
+        <w:jc w:val="left"/>
+        <w:rPr>
+          <w:rFonts w:eastAsia="DengXian" w:hint="eastAsia"/>
+          <w:lang w:eastAsia="zh-CN"/>
+        </w:rPr>
+      </w:pPr>
+      <w:r>
+        <w:rPr>
+          <w:noProof/>
+        </w:rPr>
+        <w:drawing>
+          <wp:inline distT="0" distB="0" distL="0" distR="0" wp14:anchorId="170C441B" wp14:editId="1C224BA0">
+            <wp:extent cx="5274310" cy="1469390"/>
+            <wp:effectExtent l="0" t="0" r="2540" b="0"/>
+            <wp:docPr id="1915844796" name="圖片 1"/>
+            <wp:cNvGraphicFramePr>
+              <a:graphicFrameLocks xmlns:a="http://schemas.openxmlformats.org/drawingml/2006/main" noChangeAspect="1"/>
+            </wp:cNvGraphicFramePr>
+            <a:graphic xmlns:a="http://schemas.openxmlformats.org/drawingml/2006/main">
+              <a:graphicData uri="http://schemas.openxmlformats.org/drawingml/2006/picture">
+                <pic:pic xmlns:pic="http://schemas.openxmlformats.org/drawingml/2006/picture">
+                  <pic:nvPicPr>
+                    <pic:cNvPr id="1915844796" name=""/>
+                    <pic:cNvPicPr/>
+                  </pic:nvPicPr>
+                  <pic:blipFill>
+                    <a:blip r:embed="rId16"/>
+                    <a:stretch>
+                      <a:fillRect/>
+                    </a:stretch>
+                  </pic:blipFill>
+                  <pic:spPr>
+                    <a:xfrm>
+                      <a:off x="0" y="0"/>
+                      <a:ext cx="5274310" cy="1469390"/>
+                    </a:xfrm>
+                    <a:prstGeom prst="rect">
+                      <a:avLst/>
+                    </a:prstGeom>
+                  </pic:spPr>
+                </pic:pic>
+              </a:graphicData>
+            </a:graphic>
+          </wp:inline>
+        </w:drawing>
+      </w:r>
+    </w:p>
+    <w:p>
+      <w:pPr>
+        <w:jc w:val="left"/>
+        <w:rPr>
+          <w:lang w:eastAsia="zh-CN"/>
+        </w:rPr>
+      </w:pPr>
+      <w:r>
+        <w:rPr>
+          <w:lang w:eastAsia="zh-CN"/>
+        </w:rPr>
+        <w:br w:type="page"/>
+      </w:r>
+    </w:p>
+    <w:p>
+      <w:pPr>
+        <w:pStyle w:val="1"/>
+        <w:rPr>
+          <w:lang w:eastAsia="zh-CN"/>
+        </w:rPr>
+      </w:pPr>
+      <w:bookmarkStart w:id="4" w:name="_Toc230653782"/>
+      <w:r>
+        <w:rPr>
+          <w:rFonts w:hint="eastAsia"/>
+          <w:lang w:eastAsia="zh-CN"/>
+        </w:rPr>
+        <w:lastRenderedPageBreak/>
         <w:t>伺服器</w:t>
       </w:r>
-    </w:p>
-    <w:p>
-      <w:pPr>
-        <w:jc w:val="left"/>
-      </w:pPr>
-      <w:r>
-        <w:lastRenderedPageBreak/>
-        <w:tab/>
-      </w:r>
-      <w:r>
-        <w:t>node server.js</w:t>
-      </w:r>
-    </w:p>
-    <w:p>
-      <w:pPr>
-        <w:jc w:val="left"/>
-      </w:pPr>
-    </w:p>
-    <w:p>
-      <w:pPr>
-        <w:jc w:val="left"/>
-        <w:rPr>
-          <w:lang w:eastAsia="zh-CN"/>
-        </w:rPr>
-      </w:pPr>
-      <w:r>
-        <w:rPr>
-          <w:lang w:eastAsia="zh-CN"/>
-        </w:rPr>
-        <w:br w:type="page"/>
-      </w:r>
+      <w:bookmarkEnd w:id="4"/>
     </w:p>
     <w:p>
       <w:pPr>
@@ -1378,7 +2603,6 @@
         <w:rPr>
           <w:noProof/>
         </w:rPr>
-        <w:lastRenderedPageBreak/>
         <w:drawing>
           <wp:inline distT="0" distB="0" distL="0" distR="0" wp14:anchorId="747A92AB" wp14:editId="1DC35F82">
             <wp:extent cx="5274310" cy="922020"/>
@@ -1395,7 +2619,7 @@
                     <pic:cNvPicPr/>
                   </pic:nvPicPr>
                   <pic:blipFill>
-                    <a:blip r:embed="rId7"/>
+                    <a:blip r:embed="rId17"/>
                     <a:stretch>
                       <a:fillRect/>
                     </a:stretch>
@@ -1465,55 +2689,7 @@
           <w:rFonts w:eastAsia="DengXian"/>
           <w:lang w:eastAsia="zh-CN"/>
         </w:rPr>
-        <w:t>，讓你的</w:t>
-      </w:r>
-      <w:proofErr w:type="gramStart"/>
-      <w:r>
-        <w:rPr>
-          <w:rFonts w:eastAsia="DengXian"/>
-          <w:lang w:eastAsia="zh-CN"/>
-        </w:rPr>
-        <w:t>專</w:t>
-      </w:r>
-      <w:proofErr w:type="gramEnd"/>
-      <w:r>
-        <w:rPr>
-          <w:rFonts w:eastAsia="DengXian"/>
-          <w:lang w:eastAsia="zh-CN"/>
-        </w:rPr>
-        <w:t>案透過「不同的網址」</w:t>
-      </w:r>
-      <w:proofErr w:type="gramStart"/>
-      <w:r>
-        <w:rPr>
-          <w:rFonts w:eastAsia="DengXian"/>
-          <w:lang w:eastAsia="zh-CN"/>
-        </w:rPr>
-        <w:t>來</w:t>
-      </w:r>
-      <w:proofErr w:type="gramEnd"/>
-      <w:r>
-        <w:rPr>
-          <w:rFonts w:eastAsia="DengXian"/>
-          <w:lang w:eastAsia="zh-CN"/>
-        </w:rPr>
-        <w:t>決定要</w:t>
-      </w:r>
-      <w:proofErr w:type="gramStart"/>
-      <w:r>
-        <w:rPr>
-          <w:rFonts w:eastAsia="DengXian"/>
-          <w:lang w:eastAsia="zh-CN"/>
-        </w:rPr>
-        <w:t>顯示哪一</w:t>
-      </w:r>
-      <w:proofErr w:type="gramEnd"/>
-      <w:r>
-        <w:rPr>
-          <w:rFonts w:eastAsia="DengXian"/>
-          <w:lang w:eastAsia="zh-CN"/>
-        </w:rPr>
-        <w:t>個畫面。 例如：</w:t>
+        <w:t>，讓你的專案透過「不同的網址」來決定要顯示哪一個畫面。 例如：</w:t>
       </w:r>
     </w:p>
     <w:p>
@@ -1550,23 +2726,7 @@
           <w:rFonts w:eastAsia="DengXian"/>
           <w:lang w:eastAsia="zh-CN"/>
         </w:rPr>
-        <w:t>http://localhost:5173/monitor（只載入上半部的臉部追蹤與掉落</w:t>
-      </w:r>
-      <w:proofErr w:type="gramStart"/>
-      <w:r>
-        <w:rPr>
-          <w:rFonts w:eastAsia="DengXian"/>
-          <w:lang w:eastAsia="zh-CN"/>
-        </w:rPr>
-        <w:t>動</w:t>
-      </w:r>
-      <w:proofErr w:type="gramEnd"/>
-      <w:r>
-        <w:rPr>
-          <w:rFonts w:eastAsia="DengXian"/>
-          <w:lang w:eastAsia="zh-CN"/>
-        </w:rPr>
-        <w:t>畫）</w:t>
+        <w:t>http://localhost:5173/monitor（只載入上半部的臉部追蹤與掉落動畫）</w:t>
       </w:r>
     </w:p>
     <w:p>
@@ -1637,8 +2797,33 @@
           <w:rFonts w:eastAsia="DengXian"/>
           <w:lang w:eastAsia="zh-CN"/>
         </w:rPr>
-        <w:t>安裝路由：npm install react-router-dom</w:t>
-      </w:r>
+        <w:t>安裝路由：</w:t>
+      </w:r>
+      <w:proofErr w:type="spellStart"/>
+      <w:r>
+        <w:rPr>
+          <w:rFonts w:eastAsia="DengXian"/>
+          <w:lang w:eastAsia="zh-CN"/>
+        </w:rPr>
+        <w:t>npm</w:t>
+      </w:r>
+      <w:proofErr w:type="spellEnd"/>
+      <w:r>
+        <w:rPr>
+          <w:rFonts w:eastAsia="DengXian"/>
+          <w:lang w:eastAsia="zh-CN"/>
+        </w:rPr>
+        <w:t xml:space="preserve"> install react-router-</w:t>
+      </w:r>
+      <w:proofErr w:type="spellStart"/>
+      <w:r>
+        <w:rPr>
+          <w:rFonts w:eastAsia="DengXian"/>
+          <w:lang w:eastAsia="zh-CN"/>
+        </w:rPr>
+        <w:t>dom</w:t>
+      </w:r>
+      <w:proofErr w:type="spellEnd"/>
     </w:p>
     <w:p>
       <w:pPr>
@@ -1655,7 +2840,21 @@
         <w:rPr>
           <w:rFonts w:eastAsia="DengXian"/>
         </w:rPr>
-        <w:t>將原本的 App.jsx 拆分成三個檔案：</w:t>
+        <w:t xml:space="preserve">將原本的 </w:t>
+      </w:r>
+      <w:proofErr w:type="spellStart"/>
+      <w:r>
+        <w:rPr>
+          <w:rFonts w:eastAsia="DengXian"/>
+        </w:rPr>
+        <w:t>App.jsx</w:t>
+      </w:r>
+      <w:proofErr w:type="spellEnd"/>
+      <w:r>
+        <w:rPr>
+          <w:rFonts w:eastAsia="DengXian"/>
+        </w:rPr>
+        <w:t xml:space="preserve"> 拆分成三個檔案：</w:t>
       </w:r>
     </w:p>
     <w:p>
@@ -1669,11 +2868,19 @@
           <w:rFonts w:eastAsia="DengXian"/>
         </w:rPr>
       </w:pPr>
-      <w:r>
-        <w:rPr>
-          <w:rFonts w:eastAsia="DengXian"/>
-        </w:rPr>
-        <w:t>App.jsx（只負責設定路由路徑）</w:t>
+      <w:proofErr w:type="spellStart"/>
+      <w:r>
+        <w:rPr>
+          <w:rFonts w:eastAsia="DengXian"/>
+        </w:rPr>
+        <w:t>App.jsx</w:t>
+      </w:r>
+      <w:proofErr w:type="spellEnd"/>
+      <w:r>
+        <w:rPr>
+          <w:rFonts w:eastAsia="DengXian"/>
+        </w:rPr>
+        <w:t>（只負責設定路由路徑）</w:t>
       </w:r>
     </w:p>
     <w:p>
@@ -1688,12 +2895,21 @@
           <w:lang w:eastAsia="zh-CN"/>
         </w:rPr>
       </w:pPr>
-      <w:r>
-        <w:rPr>
-          <w:rFonts w:eastAsia="DengXian"/>
-          <w:lang w:eastAsia="zh-CN"/>
-        </w:rPr>
-        <w:t>MonitorView.jsx（原本畫面上半部鏡頭與 PIXI 的邏輯）</w:t>
+      <w:proofErr w:type="spellStart"/>
+      <w:r>
+        <w:rPr>
+          <w:rFonts w:eastAsia="DengXian"/>
+          <w:lang w:eastAsia="zh-CN"/>
+        </w:rPr>
+        <w:t>MonitorView.jsx</w:t>
+      </w:r>
+      <w:proofErr w:type="spellEnd"/>
+      <w:r>
+        <w:rPr>
+          <w:rFonts w:eastAsia="DengXian"/>
+          <w:lang w:eastAsia="zh-CN"/>
+        </w:rPr>
+        <w:t>（原本畫面上半部鏡頭與 PIXI 的邏輯）</w:t>
       </w:r>
     </w:p>
     <w:p>
@@ -1708,12 +2924,21 @@
           <w:lang w:eastAsia="zh-CN"/>
         </w:rPr>
       </w:pPr>
-      <w:r>
-        <w:rPr>
-          <w:rFonts w:eastAsia="DengXian"/>
-          <w:lang w:eastAsia="zh-CN"/>
-        </w:rPr>
-        <w:t>TabletView.jsx（原本畫面下半部的 UI 按鈕與水池 PIXI 邏輯）</w:t>
+      <w:proofErr w:type="spellStart"/>
+      <w:r>
+        <w:rPr>
+          <w:rFonts w:eastAsia="DengXian"/>
+          <w:lang w:eastAsia="zh-CN"/>
+        </w:rPr>
+        <w:t>TabletView.jsx</w:t>
+      </w:r>
+      <w:proofErr w:type="spellEnd"/>
+      <w:r>
+        <w:rPr>
+          <w:rFonts w:eastAsia="DengXian"/>
+          <w:lang w:eastAsia="zh-CN"/>
+        </w:rPr>
+        <w:t>（原本畫面下半部的 UI 按鈕與水池 PIXI 邏輯）</w:t>
       </w:r>
     </w:p>
     <w:p>
@@ -1741,130 +2966,80 @@
         </w:rPr>
         <w:t>第二步：資料通訊 (Data Transmission)</w:t>
       </w:r>
-      <w:proofErr w:type="gramStart"/>
       <w:r>
         <w:rPr>
           <w:rFonts w:asciiTheme="minorEastAsia" w:hAnsiTheme="minorEastAsia" w:hint="eastAsia"/>
           <w:b/>
           <w:bCs/>
         </w:rPr>
-        <w:t>——</w:t>
-      </w:r>
-      <w:proofErr w:type="gramEnd"/>
-      <w:r>
-        <w:rPr>
-          <w:rFonts w:asciiTheme="minorEastAsia" w:hAnsiTheme="minorEastAsia" w:hint="eastAsia"/>
+        <w:t>——使用方案B</w:t>
+      </w:r>
+    </w:p>
+    <w:p>
+      <w:pPr>
+        <w:jc w:val="left"/>
+        <w:rPr>
+          <w:rFonts w:eastAsia="DengXian"/>
+        </w:rPr>
+      </w:pPr>
+      <w:r>
+        <w:rPr>
+          <w:rFonts w:eastAsia="DengXian"/>
+        </w:rPr>
+        <w:t>既然拆成了兩個頁面，它們該怎麼溝通？</w:t>
+      </w:r>
+    </w:p>
+    <w:p>
+      <w:pPr>
+        <w:jc w:val="left"/>
+        <w:rPr>
+          <w:rFonts w:eastAsia="DengXian"/>
+        </w:rPr>
+      </w:pPr>
+      <w:r>
+        <w:rPr>
+          <w:rFonts w:eastAsia="DengXian"/>
+        </w:rPr>
+        <w:t xml:space="preserve">（例如：平板按下了「盡情哭吧 GO」，顯示器怎麼知道要開始掉字？） </w:t>
+      </w:r>
+    </w:p>
+    <w:p>
+      <w:pPr>
+        <w:jc w:val="left"/>
+        <w:rPr>
+          <w:rFonts w:eastAsia="DengXian"/>
+        </w:rPr>
+      </w:pPr>
+      <w:r>
+        <w:rPr>
+          <w:rFonts w:eastAsia="DengXian"/>
+        </w:rPr>
+        <w:t>這裡有兩種解決方案，取決於你展場的</w:t>
+      </w:r>
+      <w:r>
+        <w:rPr>
+          <w:rFonts w:eastAsia="DengXian"/>
           <w:b/>
           <w:bCs/>
         </w:rPr>
-        <w:t>使用方案B</w:t>
-      </w:r>
-    </w:p>
-    <w:p>
-      <w:pPr>
-        <w:jc w:val="left"/>
-        <w:rPr>
-          <w:rFonts w:eastAsia="DengXian"/>
-        </w:rPr>
-      </w:pPr>
-      <w:r>
-        <w:rPr>
-          <w:rFonts w:eastAsia="DengXian"/>
-        </w:rPr>
-        <w:t>既然拆成了</w:t>
-      </w:r>
-      <w:proofErr w:type="gramStart"/>
-      <w:r>
-        <w:rPr>
-          <w:rFonts w:eastAsia="DengXian"/>
-        </w:rPr>
-        <w:t>兩個頁</w:t>
-      </w:r>
-      <w:proofErr w:type="gramEnd"/>
-      <w:r>
-        <w:rPr>
-          <w:rFonts w:eastAsia="DengXian"/>
-        </w:rPr>
-        <w:t>面，它們該怎麼溝通？</w:t>
-      </w:r>
-    </w:p>
-    <w:p>
-      <w:pPr>
-        <w:jc w:val="left"/>
-        <w:rPr>
-          <w:rFonts w:eastAsia="DengXian"/>
-        </w:rPr>
-      </w:pPr>
-      <w:proofErr w:type="gramStart"/>
-      <w:r>
-        <w:rPr>
-          <w:rFonts w:eastAsia="DengXian"/>
-        </w:rPr>
-        <w:t>（</w:t>
-      </w:r>
-      <w:proofErr w:type="gramEnd"/>
-      <w:r>
-        <w:rPr>
-          <w:rFonts w:eastAsia="DengXian"/>
-        </w:rPr>
-        <w:t>例如：平板按下了「</w:t>
-      </w:r>
-      <w:proofErr w:type="gramStart"/>
-      <w:r>
-        <w:rPr>
-          <w:rFonts w:eastAsia="DengXian"/>
-        </w:rPr>
-        <w:t>盡情哭吧</w:t>
-      </w:r>
-      <w:proofErr w:type="gramEnd"/>
-      <w:r>
-        <w:rPr>
-          <w:rFonts w:eastAsia="DengXian"/>
-        </w:rPr>
-        <w:t xml:space="preserve"> GO」，顯示器怎麼知道要</w:t>
-      </w:r>
-      <w:proofErr w:type="gramStart"/>
-      <w:r>
-        <w:rPr>
-          <w:rFonts w:eastAsia="DengXian"/>
-        </w:rPr>
-        <w:t>開始掉字</w:t>
-      </w:r>
-      <w:proofErr w:type="gramEnd"/>
-      <w:r>
-        <w:rPr>
-          <w:rFonts w:eastAsia="DengXian"/>
-        </w:rPr>
-        <w:t xml:space="preserve">？） </w:t>
-      </w:r>
-    </w:p>
-    <w:p>
-      <w:pPr>
-        <w:jc w:val="left"/>
-        <w:rPr>
-          <w:rFonts w:eastAsia="DengXian"/>
-        </w:rPr>
-      </w:pPr>
-      <w:r>
-        <w:rPr>
-          <w:rFonts w:eastAsia="DengXian"/>
-        </w:rPr>
-        <w:t>這裡有兩種解決方案，取決於你展場的</w:t>
-      </w:r>
-      <w:r>
+        <w:t>硬體配置</w:t>
+      </w:r>
+      <w:r>
+        <w:rPr>
+          <w:rFonts w:eastAsia="DengXian"/>
+        </w:rPr>
+        <w:t>：</w:t>
+      </w:r>
+    </w:p>
+    <w:p>
+      <w:pPr>
+        <w:jc w:val="left"/>
         <w:rPr>
           <w:rFonts w:eastAsia="DengXian"/>
           <w:b/>
           <w:bCs/>
         </w:rPr>
-        <w:t>硬體配置</w:t>
-      </w:r>
-      <w:r>
-        <w:rPr>
-          <w:rFonts w:eastAsia="DengXian"/>
-        </w:rPr>
-        <w:t>：</w:t>
-      </w:r>
+      </w:pPr>
     </w:p>
     <w:p>
       <w:pPr>
@@ -1875,44 +3050,52 @@
           <w:bCs/>
         </w:rPr>
       </w:pPr>
-    </w:p>
-    <w:p>
-      <w:pPr>
-        <w:jc w:val="left"/>
+      <w:r>
         <w:rPr>
           <w:rFonts w:eastAsia="DengXian"/>
           <w:b/>
           <w:bCs/>
         </w:rPr>
-      </w:pPr>
+        <w:t xml:space="preserve">方案 A：雙螢幕接在「同一台電腦」上 (使用 </w:t>
+      </w:r>
+      <w:proofErr w:type="spellStart"/>
       <w:r>
         <w:rPr>
           <w:rFonts w:eastAsia="DengXian"/>
           <w:b/>
           <w:bCs/>
         </w:rPr>
-        <w:t>方案 A：雙螢幕接在「同一台電腦」上 (使用 BroadcastChannel API)</w:t>
-      </w:r>
-    </w:p>
-    <w:p>
-      <w:pPr>
-        <w:jc w:val="left"/>
-        <w:rPr>
-          <w:rFonts w:eastAsia="DengXian"/>
-        </w:rPr>
-      </w:pPr>
-      <w:r>
-        <w:rPr>
-          <w:rFonts w:eastAsia="DengXian"/>
-        </w:rPr>
-        <w:t>如果你的展場是使用一台效能較好的主機（如 Mac Macni 或 PC），同時外接兩個螢幕（一個掛牆上，一個平放當平板），這是</w:t>
-      </w:r>
+        <w:t>BroadcastChannel</w:t>
+      </w:r>
+      <w:proofErr w:type="spellEnd"/>
       <w:r>
         <w:rPr>
           <w:rFonts w:eastAsia="DengXian"/>
           <w:b/>
           <w:bCs/>
         </w:rPr>
+        <w:t xml:space="preserve"> API)</w:t>
+      </w:r>
+    </w:p>
+    <w:p>
+      <w:pPr>
+        <w:jc w:val="left"/>
+        <w:rPr>
+          <w:rFonts w:eastAsia="DengXian"/>
+        </w:rPr>
+      </w:pPr>
+      <w:r>
+        <w:rPr>
+          <w:rFonts w:eastAsia="DengXian"/>
+        </w:rPr>
+        <w:t>如果你的展場是使用一台效能較好的主機（如 Mac Macni 或 PC），同時外接兩個螢幕（一個掛牆上，一個平放當平板），這是</w:t>
+      </w:r>
+      <w:r>
+        <w:rPr>
+          <w:rFonts w:eastAsia="DengXian"/>
+          <w:b/>
+          <w:bCs/>
+        </w:rPr>
         <w:t>最推薦且最簡單</w:t>
       </w:r>
       <w:r>
@@ -1935,71 +3118,23 @@
           <w:rFonts w:eastAsia="DengXian"/>
           <w:lang w:eastAsia="zh-CN"/>
         </w:rPr>
-        <w:t>不需要寫</w:t>
-      </w:r>
-      <w:proofErr w:type="gramStart"/>
-      <w:r>
-        <w:rPr>
-          <w:rFonts w:eastAsia="DengXian"/>
-          <w:lang w:eastAsia="zh-CN"/>
-        </w:rPr>
-        <w:t>後</w:t>
-      </w:r>
-      <w:proofErr w:type="gramEnd"/>
-      <w:r>
-        <w:rPr>
-          <w:rFonts w:eastAsia="DengXian"/>
-          <w:lang w:eastAsia="zh-CN"/>
-        </w:rPr>
-        <w:t>端伺服器，直接利用瀏覽器</w:t>
-      </w:r>
-      <w:proofErr w:type="gramStart"/>
-      <w:r>
-        <w:rPr>
-          <w:rFonts w:eastAsia="DengXian"/>
-          <w:lang w:eastAsia="zh-CN"/>
-        </w:rPr>
-        <w:t>內</w:t>
-      </w:r>
-      <w:proofErr w:type="gramEnd"/>
-      <w:r>
-        <w:rPr>
-          <w:rFonts w:eastAsia="DengXian"/>
-          <w:lang w:eastAsia="zh-CN"/>
-        </w:rPr>
-        <w:t>建的 BroadcastChannel 就能讓</w:t>
-      </w:r>
-      <w:proofErr w:type="gramStart"/>
-      <w:r>
-        <w:rPr>
-          <w:rFonts w:eastAsia="DengXian"/>
-          <w:lang w:eastAsia="zh-CN"/>
-        </w:rPr>
-        <w:t>兩</w:t>
-      </w:r>
-      <w:proofErr w:type="gramEnd"/>
-      <w:r>
-        <w:rPr>
-          <w:rFonts w:eastAsia="DengXian"/>
-          <w:lang w:eastAsia="zh-CN"/>
-        </w:rPr>
-        <w:t>個分頁秒速</w:t>
-      </w:r>
-      <w:proofErr w:type="gramStart"/>
-      <w:r>
-        <w:rPr>
-          <w:rFonts w:eastAsia="DengXian"/>
-          <w:lang w:eastAsia="zh-CN"/>
-        </w:rPr>
-        <w:t>溝</w:t>
-      </w:r>
-      <w:proofErr w:type="gramEnd"/>
-      <w:r>
-        <w:rPr>
-          <w:rFonts w:eastAsia="DengXian"/>
-          <w:lang w:eastAsia="zh-CN"/>
-        </w:rPr>
-        <w:t>通：</w:t>
+        <w:t xml:space="preserve">不需要寫後端伺服器，直接利用瀏覽器內建的 </w:t>
+      </w:r>
+      <w:proofErr w:type="spellStart"/>
+      <w:r>
+        <w:rPr>
+          <w:rFonts w:eastAsia="DengXian"/>
+          <w:lang w:eastAsia="zh-CN"/>
+        </w:rPr>
+        <w:t>BroadcastChannel</w:t>
+      </w:r>
+      <w:proofErr w:type="spellEnd"/>
+      <w:r>
+        <w:rPr>
+          <w:rFonts w:eastAsia="DengXian"/>
+          <w:lang w:eastAsia="zh-CN"/>
+        </w:rPr>
+        <w:t xml:space="preserve"> 就能讓兩個分頁秒速溝通：</w:t>
       </w:r>
     </w:p>
     <w:p>
@@ -2032,7 +3167,7 @@
                     <pic:cNvPicPr/>
                   </pic:nvPicPr>
                   <pic:blipFill>
-                    <a:blip r:embed="rId8"/>
+                    <a:blip r:embed="rId18"/>
                     <a:stretch>
                       <a:fillRect/>
                     </a:stretch>
@@ -2087,7 +3222,7 @@
                     <pic:cNvPicPr/>
                   </pic:nvPicPr>
                   <pic:blipFill>
-                    <a:blip r:embed="rId9"/>
+                    <a:blip r:embed="rId19"/>
                     <a:stretch>
                       <a:fillRect/>
                     </a:stretch>
@@ -2125,47 +3260,7 @@
           <w:bCs/>
           <w:lang w:eastAsia="zh-CN"/>
         </w:rPr>
-        <w:t>方案 B：使用</w:t>
-      </w:r>
-      <w:proofErr w:type="gramStart"/>
-      <w:r>
-        <w:rPr>
-          <w:rFonts w:eastAsia="DengXian"/>
-          <w:b/>
-          <w:bCs/>
-          <w:lang w:eastAsia="zh-CN"/>
-        </w:rPr>
-        <w:t>兩</w:t>
-      </w:r>
-      <w:proofErr w:type="gramEnd"/>
-      <w:r>
-        <w:rPr>
-          <w:rFonts w:eastAsia="DengXian"/>
-          <w:b/>
-          <w:bCs/>
-          <w:lang w:eastAsia="zh-CN"/>
-        </w:rPr>
-        <w:t>台「完全不同的實體設</w:t>
-      </w:r>
-      <w:proofErr w:type="gramStart"/>
-      <w:r>
-        <w:rPr>
-          <w:rFonts w:eastAsia="DengXian"/>
-          <w:b/>
-          <w:bCs/>
-          <w:lang w:eastAsia="zh-CN"/>
-        </w:rPr>
-        <w:t>備</w:t>
-      </w:r>
-      <w:proofErr w:type="gramEnd"/>
-      <w:r>
-        <w:rPr>
-          <w:rFonts w:eastAsia="DengXian"/>
-          <w:b/>
-          <w:bCs/>
-          <w:lang w:eastAsia="zh-CN"/>
-        </w:rPr>
-        <w:t>」 (使用 WebSocket / Socket.io)</w:t>
+        <w:t>方案 B：使用兩台「完全不同的實體設備」 (使用 WebSocket / Socket.io)</w:t>
       </w:r>
     </w:p>
     <w:p>
@@ -2196,7 +3291,7 @@
                     <pic:cNvPicPr/>
                   </pic:nvPicPr>
                   <pic:blipFill>
-                    <a:blip r:embed="rId10"/>
+                    <a:blip r:embed="rId20"/>
                     <a:stretch>
                       <a:fillRect/>
                     </a:stretch>
@@ -2242,7 +3337,7 @@
                     <pic:cNvPicPr/>
                   </pic:nvPicPr>
                   <pic:blipFill>
-                    <a:blip r:embed="rId11"/>
+                    <a:blip r:embed="rId21"/>
                     <a:stretch>
                       <a:fillRect/>
                     </a:stretch>
@@ -2298,7 +3393,7 @@
                     <pic:cNvPicPr/>
                   </pic:nvPicPr>
                   <pic:blipFill>
-                    <a:blip r:embed="rId12"/>
+                    <a:blip r:embed="rId22"/>
                     <a:stretch>
                       <a:fillRect/>
                     </a:stretch>
@@ -2388,7 +3483,7 @@
                     <pic:cNvPicPr/>
                   </pic:nvPicPr>
                   <pic:blipFill>
-                    <a:blip r:embed="rId13"/>
+                    <a:blip r:embed="rId23"/>
                     <a:stretch>
                       <a:fillRect/>
                     </a:stretch>
@@ -2418,40 +3513,29 @@
       </w:r>
     </w:p>
     <w:p>
+      <w:pPr>
+        <w:pStyle w:val="1"/>
+        <w:rPr>
+          <w:lang w:eastAsia="zh-CN"/>
+        </w:rPr>
+      </w:pPr>
+      <w:bookmarkStart w:id="5" w:name="_Toc230653783"/>
       <w:r>
         <w:rPr>
           <w:rFonts w:hint="eastAsia"/>
+          <w:lang w:eastAsia="zh-CN"/>
         </w:rPr>
         <w:lastRenderedPageBreak/>
-        <w:t>預設是一個顯示器，一個平板，平板選擇詞</w:t>
-      </w:r>
-      <w:proofErr w:type="gramStart"/>
+        <w:t>制作规划</w:t>
+      </w:r>
+      <w:bookmarkEnd w:id="5"/>
+    </w:p>
+    <w:p>
       <w:r>
         <w:rPr>
           <w:rFonts w:hint="eastAsia"/>
         </w:rPr>
-        <w:t>匯后</w:t>
-      </w:r>
-      <w:proofErr w:type="gramEnd"/>
-      <w:r>
-        <w:rPr>
-          <w:rFonts w:hint="eastAsia"/>
-        </w:rPr>
-        <w:t>，透過影像識別，流淚流出詞</w:t>
-      </w:r>
-      <w:proofErr w:type="gramStart"/>
-      <w:r>
-        <w:rPr>
-          <w:rFonts w:hint="eastAsia"/>
-        </w:rPr>
-        <w:t>匯</w:t>
-      </w:r>
-      <w:proofErr w:type="gramEnd"/>
-      <w:r>
-        <w:rPr>
-          <w:rFonts w:hint="eastAsia"/>
-        </w:rPr>
-        <w:t>最終流入平板，匯聚成寶石。</w:t>
+        <w:t>預設是一個顯示器，一個平板，平板選擇詞匯后，透過影像識別，流淚流出詞匯最終流入平板，匯聚成寶石。</w:t>
       </w:r>
     </w:p>
     <w:p/>
@@ -2474,55 +3558,7 @@
         <w:t>Pixi</w:t>
       </w:r>
       <w:r>
-        <w:t>，設計點擊五組心情詞擇</w:t>
-      </w:r>
-      <w:proofErr w:type="gramStart"/>
-      <w:r>
-        <w:t>一</w:t>
-      </w:r>
-      <w:proofErr w:type="gramEnd"/>
-      <w:r>
-        <w:t>後，透過影像識別人眼，最終選擇的</w:t>
-      </w:r>
-      <w:proofErr w:type="gramStart"/>
-      <w:r>
-        <w:t>心情詞會不斷</w:t>
-      </w:r>
-      <w:proofErr w:type="gramEnd"/>
-      <w:r>
-        <w:t>從眼中流出（流出的詞</w:t>
-      </w:r>
-      <w:proofErr w:type="gramStart"/>
-      <w:r>
-        <w:t>匯</w:t>
-      </w:r>
-      <w:proofErr w:type="gramEnd"/>
-      <w:r>
-        <w:t>越來越多，有最大值），詞</w:t>
-      </w:r>
-      <w:proofErr w:type="gramStart"/>
-      <w:r>
-        <w:t>匯</w:t>
-      </w:r>
-      <w:proofErr w:type="gramEnd"/>
-      <w:r>
-        <w:t>在顯示器的流動過程中，慢慢由完整的字分解成流動的水墨，最後流入顯示器底端，幾秒</w:t>
-      </w:r>
-      <w:proofErr w:type="gramStart"/>
-      <w:r>
-        <w:t>后</w:t>
-      </w:r>
-      <w:proofErr w:type="gramEnd"/>
-      <w:r>
-        <w:t>平板接續顯示器的水墨，並慢慢往平板中心匯聚，匯聚過程中漸漸變色</w:t>
-      </w:r>
-      <w:proofErr w:type="gramStart"/>
-      <w:r>
-        <w:t>（</w:t>
-      </w:r>
-      <w:proofErr w:type="gramEnd"/>
-      <w:r>
-        <w:t>顔色是根據最終要生成的寶石顔色決定）</w:t>
+        <w:t>，設計點擊五組心情詞擇一後，透過影像識別人眼，最終選擇的心情詞會不斷從眼中流出（流出的詞匯越來越多，有最大值），詞匯在顯示器的流動過程中，慢慢由完整的字分解成流動的水墨，最後流入顯示器底端，幾秒后平板接續顯示器的水墨，並慢慢往平板中心匯聚，匯聚過程中漸漸變色（顔色是根據最終要生成的寶石顔色決定）</w:t>
       </w:r>
       <w:r>
         <w:t>,</w:t>
@@ -2596,7 +3632,7 @@
                     <pic:cNvPicPr/>
                   </pic:nvPicPr>
                   <pic:blipFill>
-                    <a:blip r:embed="rId14"/>
+                    <a:blip r:embed="rId24"/>
                     <a:stretch>
                       <a:fillRect/>
                     </a:stretch>
@@ -2641,7 +3677,7 @@
                     <pic:cNvPicPr/>
                   </pic:nvPicPr>
                   <pic:blipFill>
-                    <a:blip r:embed="rId15"/>
+                    <a:blip r:embed="rId25"/>
                     <a:stretch>
                       <a:fillRect/>
                     </a:stretch>
@@ -2687,7 +3723,7 @@
                     <pic:cNvPicPr/>
                   </pic:nvPicPr>
                   <pic:blipFill>
-                    <a:blip r:embed="rId16"/>
+                    <a:blip r:embed="rId26"/>
                     <a:stretch>
                       <a:fillRect/>
                     </a:stretch>
@@ -2737,7 +3773,7 @@
                     <pic:cNvPicPr/>
                   </pic:nvPicPr>
                   <pic:blipFill>
-                    <a:blip r:embed="rId17"/>
+                    <a:blip r:embed="rId27"/>
                     <a:stretch>
                       <a:fillRect/>
                     </a:stretch>
@@ -2782,7 +3818,7 @@
                     <pic:cNvPicPr/>
                   </pic:nvPicPr>
                   <pic:blipFill>
-                    <a:blip r:embed="rId18"/>
+                    <a:blip r:embed="rId28"/>
                     <a:stretch>
                       <a:fillRect/>
                     </a:stretch>
@@ -2828,7 +3864,7 @@
                     <pic:cNvPicPr/>
                   </pic:nvPicPr>
                   <pic:blipFill>
-                    <a:blip r:embed="rId19"/>
+                    <a:blip r:embed="rId29"/>
                     <a:stretch>
                       <a:fillRect/>
                     </a:stretch>
@@ -2873,7 +3909,7 @@
                     <pic:cNvPicPr/>
                   </pic:nvPicPr>
                   <pic:blipFill>
-                    <a:blip r:embed="rId20"/>
+                    <a:blip r:embed="rId30"/>
                     <a:stretch>
                       <a:fillRect/>
                     </a:stretch>
@@ -2918,7 +3954,7 @@
                     <pic:cNvPicPr/>
                   </pic:nvPicPr>
                   <pic:blipFill>
-                    <a:blip r:embed="rId21"/>
+                    <a:blip r:embed="rId31"/>
                     <a:stretch>
                       <a:fillRect/>
                     </a:stretch>
@@ -2964,7 +4000,7 @@
                     <pic:cNvPicPr/>
                   </pic:nvPicPr>
                   <pic:blipFill>
-                    <a:blip r:embed="rId22"/>
+                    <a:blip r:embed="rId32"/>
                     <a:stretch>
                       <a:fillRect/>
                     </a:stretch>
@@ -4184,7 +5220,6 @@
   <w:style w:type="character" w:default="1" w:styleId="a0">
     <w:name w:val="Default Paragraph Font"/>
     <w:uiPriority w:val="1"/>
-    <w:semiHidden/>
     <w:unhideWhenUsed/>
   </w:style>
   <w:style w:type="table" w:default="1" w:styleId="a1">
@@ -4557,6 +5592,46 @@
       <w:szCs w:val="20"/>
     </w:rPr>
   </w:style>
+  <w:style w:type="paragraph" w:styleId="af2">
+    <w:name w:val="TOC Heading"/>
+    <w:basedOn w:val="1"/>
+    <w:next w:val="a"/>
+    <w:uiPriority w:val="39"/>
+    <w:unhideWhenUsed/>
+    <w:qFormat/>
+    <w:rsid w:val="00F8116B"/>
+    <w:pPr>
+      <w:widowControl/>
+      <w:spacing w:before="240" w:after="0" w:line="259" w:lineRule="auto"/>
+      <w:jc w:val="left"/>
+      <w:outlineLvl w:val="9"/>
+    </w:pPr>
+    <w:rPr>
+      <w:kern w:val="0"/>
+      <w:sz w:val="32"/>
+      <w:szCs w:val="32"/>
+    </w:rPr>
+  </w:style>
+  <w:style w:type="paragraph" w:styleId="11">
+    <w:name w:val="toc 1"/>
+    <w:basedOn w:val="a"/>
+    <w:next w:val="a"/>
+    <w:autoRedefine/>
+    <w:uiPriority w:val="39"/>
+    <w:unhideWhenUsed/>
+    <w:rsid w:val="00F8116B"/>
+  </w:style>
+  <w:style w:type="character" w:styleId="af3">
+    <w:name w:val="Hyperlink"/>
+    <w:basedOn w:val="a0"/>
+    <w:uiPriority w:val="99"/>
+    <w:unhideWhenUsed/>
+    <w:rsid w:val="00F8116B"/>
+    <w:rPr>
+      <w:color w:val="0563C1" w:themeColor="hyperlink"/>
+      <w:u w:val="single"/>
+    </w:rPr>
+  </w:style>
 </w:styles>
 </file>
 
@@ -4853,4 +5928,16 @@
     </a:ext>
   </a:extLst>
 </a:theme>
+</file>
+
+<file path=customXml/item1.xml><?xml version="1.0" encoding="utf-8"?>
+<b:Sources xmlns:b="http://schemas.openxmlformats.org/officeDocument/2006/bibliography" xmlns="http://schemas.openxmlformats.org/officeDocument/2006/bibliography" SelectedStyle="\APASixthEditionOfficeOnline.xsl" StyleName="APA" Version="6"/>
+</file>
+
+<file path=customXml/itemProps1.xml><?xml version="1.0" encoding="utf-8"?>
+<ds:datastoreItem xmlns:ds="http://schemas.openxmlformats.org/officeDocument/2006/customXml" ds:itemID="{13CDD381-EFBA-44B7-BDCE-D70DC2BA8C94}">
+  <ds:schemaRefs>
+    <ds:schemaRef ds:uri="http://schemas.openxmlformats.org/officeDocument/2006/bibliography"/>
+  </ds:schemaRefs>
+</ds:datastoreItem>
 </file>
</xml_diff>

<commit_message>
0.13.8 refactor(ripple): adapt client pipeline to support varied sprite sheet JSON schemas
</commit_message>
<xml_diff>
--- a/To do.docx
+++ b/To do.docx
@@ -31,6 +31,7 @@
           </w:pPr>
           <w:r>
             <w:rPr>
+              <w:rFonts w:hint="eastAsia"/>
               <w:lang w:val="zh-TW"/>
             </w:rPr>
             <w:t>內容</w:t>
@@ -57,15 +58,14 @@
           <w:r>
             <w:fldChar w:fldCharType="separate"/>
           </w:r>
-          <w:hyperlink w:anchor="_Toc230653778" w:history="1">
+          <w:hyperlink w:anchor="_Toc230716409" w:history="1">
             <w:r>
               <w:rPr>
                 <w:rStyle w:val="af3"/>
-                <w:rFonts w:eastAsia="DengXian"/>
+                <w:rFonts w:eastAsia="新細明體"/>
                 <w:noProof/>
-                <w:lang w:eastAsia="zh-CN"/>
               </w:rPr>
-              <w:t>待办事项</w:t>
+              <w:t>待辦事項</w:t>
             </w:r>
             <w:r>
               <w:rPr>
@@ -86,7 +86,7 @@
                 <w:noProof/>
                 <w:webHidden/>
               </w:rPr>
-              <w:instrText xml:space="preserve"> PAGEREF _Toc230653778 \h </w:instrText>
+              <w:instrText xml:space="preserve"> PAGEREF _Toc230716409 \h </w:instrText>
             </w:r>
             <w:r>
               <w:rPr>
@@ -129,14 +129,14 @@
               <w14:ligatures w14:val="standardContextual"/>
             </w:rPr>
           </w:pPr>
-          <w:hyperlink w:anchor="_Toc230653779" w:history="1">
+          <w:hyperlink w:anchor="_Toc230716410" w:history="1">
             <w:r>
               <w:rPr>
                 <w:rStyle w:val="af3"/>
+                <w:rFonts w:eastAsia="新細明體"/>
                 <w:noProof/>
-                <w:lang w:eastAsia="zh-CN"/>
               </w:rPr>
-              <w:t>网络连线</w:t>
+              <w:t>音效設定</w:t>
             </w:r>
             <w:r>
               <w:rPr>
@@ -157,7 +157,7 @@
                 <w:noProof/>
                 <w:webHidden/>
               </w:rPr>
-              <w:instrText xml:space="preserve"> PAGEREF _Toc230653779 \h </w:instrText>
+              <w:instrText xml:space="preserve"> PAGEREF _Toc230716410 \h </w:instrText>
             </w:r>
             <w:r>
               <w:rPr>
@@ -200,15 +200,13 @@
               <w14:ligatures w14:val="standardContextual"/>
             </w:rPr>
           </w:pPr>
-          <w:hyperlink w:anchor="_Toc230653780" w:history="1">
+          <w:hyperlink w:anchor="_Toc230716411" w:history="1">
             <w:r>
               <w:rPr>
                 <w:rStyle w:val="af3"/>
-                <w:rFonts w:ascii="DengXian" w:eastAsia="DengXian" w:hAnsi="DengXian"/>
                 <w:noProof/>
-                <w:lang w:eastAsia="zh-CN"/>
               </w:rPr>
-              <w:t>显卡设定</w:t>
+              <w:t>網絡連線</w:t>
             </w:r>
             <w:r>
               <w:rPr>
@@ -229,7 +227,78 @@
                 <w:noProof/>
                 <w:webHidden/>
               </w:rPr>
-              <w:instrText xml:space="preserve"> PAGEREF _Toc230653780 \h </w:instrText>
+              <w:instrText xml:space="preserve"> PAGEREF _Toc230716411 \h </w:instrText>
+            </w:r>
+            <w:r>
+              <w:rPr>
+                <w:noProof/>
+                <w:webHidden/>
+              </w:rPr>
+            </w:r>
+            <w:r>
+              <w:rPr>
+                <w:noProof/>
+                <w:webHidden/>
+              </w:rPr>
+              <w:fldChar w:fldCharType="separate"/>
+            </w:r>
+            <w:r>
+              <w:rPr>
+                <w:noProof/>
+                <w:webHidden/>
+              </w:rPr>
+              <w:t>4</w:t>
+            </w:r>
+            <w:r>
+              <w:rPr>
+                <w:noProof/>
+                <w:webHidden/>
+              </w:rPr>
+              <w:fldChar w:fldCharType="end"/>
+            </w:r>
+          </w:hyperlink>
+        </w:p>
+        <w:p>
+          <w:pPr>
+            <w:pStyle w:val="11"/>
+            <w:tabs>
+              <w:tab w:val="right" w:leader="dot" w:pos="8296"/>
+            </w:tabs>
+            <w:rPr>
+              <w:noProof/>
+              <w:szCs w:val="24"/>
+              <w14:ligatures w14:val="standardContextual"/>
+            </w:rPr>
+          </w:pPr>
+          <w:hyperlink w:anchor="_Toc230716412" w:history="1">
+            <w:r>
+              <w:rPr>
+                <w:rStyle w:val="af3"/>
+                <w:rFonts w:ascii="DengXian" w:eastAsia="新細明體" w:hAnsi="DengXian"/>
+                <w:noProof/>
+              </w:rPr>
+              <w:t>攝像頭權限</w:t>
+            </w:r>
+            <w:r>
+              <w:rPr>
+                <w:noProof/>
+                <w:webHidden/>
+              </w:rPr>
+              <w:tab/>
+            </w:r>
+            <w:r>
+              <w:rPr>
+                <w:noProof/>
+                <w:webHidden/>
+              </w:rPr>
+              <w:fldChar w:fldCharType="begin"/>
+            </w:r>
+            <w:r>
+              <w:rPr>
+                <w:noProof/>
+                <w:webHidden/>
+              </w:rPr>
+              <w:instrText xml:space="preserve"> PAGEREF _Toc230716412 \h </w:instrText>
             </w:r>
             <w:r>
               <w:rPr>
@@ -272,15 +341,14 @@
               <w14:ligatures w14:val="standardContextual"/>
             </w:rPr>
           </w:pPr>
-          <w:hyperlink w:anchor="_Toc230653781" w:history="1">
+          <w:hyperlink w:anchor="_Toc230716413" w:history="1">
             <w:r>
               <w:rPr>
                 <w:rStyle w:val="af3"/>
-                <w:rFonts w:ascii="DengXian" w:eastAsia="DengXian" w:hAnsi="DengXian"/>
+                <w:rFonts w:ascii="DengXian" w:eastAsia="新細明體" w:hAnsi="DengXian"/>
                 <w:noProof/>
-                <w:lang w:eastAsia="zh-CN"/>
               </w:rPr>
-              <w:t>安装指令</w:t>
+              <w:t>顯卡設定</w:t>
             </w:r>
             <w:r>
               <w:rPr>
@@ -301,78 +369,7 @@
                 <w:noProof/>
                 <w:webHidden/>
               </w:rPr>
-              <w:instrText xml:space="preserve"> PAGEREF _Toc230653781 \h </w:instrText>
-            </w:r>
-            <w:r>
-              <w:rPr>
-                <w:noProof/>
-                <w:webHidden/>
-              </w:rPr>
-            </w:r>
-            <w:r>
-              <w:rPr>
-                <w:noProof/>
-                <w:webHidden/>
-              </w:rPr>
-              <w:fldChar w:fldCharType="separate"/>
-            </w:r>
-            <w:r>
-              <w:rPr>
-                <w:noProof/>
-                <w:webHidden/>
-              </w:rPr>
-              <w:t>6</w:t>
-            </w:r>
-            <w:r>
-              <w:rPr>
-                <w:noProof/>
-                <w:webHidden/>
-              </w:rPr>
-              <w:fldChar w:fldCharType="end"/>
-            </w:r>
-          </w:hyperlink>
-        </w:p>
-        <w:p>
-          <w:pPr>
-            <w:pStyle w:val="11"/>
-            <w:tabs>
-              <w:tab w:val="right" w:leader="dot" w:pos="8296"/>
-            </w:tabs>
-            <w:rPr>
-              <w:noProof/>
-              <w:szCs w:val="24"/>
-              <w14:ligatures w14:val="standardContextual"/>
-            </w:rPr>
-          </w:pPr>
-          <w:hyperlink w:anchor="_Toc230653782" w:history="1">
-            <w:r>
-              <w:rPr>
-                <w:rStyle w:val="af3"/>
-                <w:noProof/>
-                <w:lang w:eastAsia="zh-CN"/>
-              </w:rPr>
-              <w:t>伺服器</w:t>
-            </w:r>
-            <w:r>
-              <w:rPr>
-                <w:noProof/>
-                <w:webHidden/>
-              </w:rPr>
-              <w:tab/>
-            </w:r>
-            <w:r>
-              <w:rPr>
-                <w:noProof/>
-                <w:webHidden/>
-              </w:rPr>
-              <w:fldChar w:fldCharType="begin"/>
-            </w:r>
-            <w:r>
-              <w:rPr>
-                <w:noProof/>
-                <w:webHidden/>
-              </w:rPr>
-              <w:instrText xml:space="preserve"> PAGEREF _Toc230653782 \h </w:instrText>
+              <w:instrText xml:space="preserve"> PAGEREF _Toc230716413 \h </w:instrText>
             </w:r>
             <w:r>
               <w:rPr>
@@ -415,14 +412,14 @@
               <w14:ligatures w14:val="standardContextual"/>
             </w:rPr>
           </w:pPr>
-          <w:hyperlink w:anchor="_Toc230653783" w:history="1">
+          <w:hyperlink w:anchor="_Toc230716414" w:history="1">
             <w:r>
               <w:rPr>
                 <w:rStyle w:val="af3"/>
+                <w:rFonts w:ascii="DengXian" w:eastAsia="新細明體" w:hAnsi="DengXian"/>
                 <w:noProof/>
-                <w:lang w:eastAsia="zh-CN"/>
               </w:rPr>
-              <w:t>制作规划</w:t>
+              <w:t>安裝指令</w:t>
             </w:r>
             <w:r>
               <w:rPr>
@@ -443,7 +440,7 @@
                 <w:noProof/>
                 <w:webHidden/>
               </w:rPr>
-              <w:instrText xml:space="preserve"> PAGEREF _Toc230653783 \h </w:instrText>
+              <w:instrText xml:space="preserve"> PAGEREF _Toc230716414 \h </w:instrText>
             </w:r>
             <w:r>
               <w:rPr>
@@ -463,7 +460,147 @@
                 <w:noProof/>
                 <w:webHidden/>
               </w:rPr>
-              <w:t>10</w:t>
+              <w:t>8</w:t>
+            </w:r>
+            <w:r>
+              <w:rPr>
+                <w:noProof/>
+                <w:webHidden/>
+              </w:rPr>
+              <w:fldChar w:fldCharType="end"/>
+            </w:r>
+          </w:hyperlink>
+        </w:p>
+        <w:p>
+          <w:pPr>
+            <w:pStyle w:val="11"/>
+            <w:tabs>
+              <w:tab w:val="right" w:leader="dot" w:pos="8296"/>
+            </w:tabs>
+            <w:rPr>
+              <w:noProof/>
+              <w:szCs w:val="24"/>
+              <w14:ligatures w14:val="standardContextual"/>
+            </w:rPr>
+          </w:pPr>
+          <w:hyperlink w:anchor="_Toc230716415" w:history="1">
+            <w:r>
+              <w:rPr>
+                <w:rStyle w:val="af3"/>
+                <w:noProof/>
+              </w:rPr>
+              <w:t>伺服器</w:t>
+            </w:r>
+            <w:r>
+              <w:rPr>
+                <w:noProof/>
+                <w:webHidden/>
+              </w:rPr>
+              <w:tab/>
+            </w:r>
+            <w:r>
+              <w:rPr>
+                <w:noProof/>
+                <w:webHidden/>
+              </w:rPr>
+              <w:fldChar w:fldCharType="begin"/>
+            </w:r>
+            <w:r>
+              <w:rPr>
+                <w:noProof/>
+                <w:webHidden/>
+              </w:rPr>
+              <w:instrText xml:space="preserve"> PAGEREF _Toc230716415 \h </w:instrText>
+            </w:r>
+            <w:r>
+              <w:rPr>
+                <w:noProof/>
+                <w:webHidden/>
+              </w:rPr>
+            </w:r>
+            <w:r>
+              <w:rPr>
+                <w:noProof/>
+                <w:webHidden/>
+              </w:rPr>
+              <w:fldChar w:fldCharType="separate"/>
+            </w:r>
+            <w:r>
+              <w:rPr>
+                <w:noProof/>
+                <w:webHidden/>
+              </w:rPr>
+              <w:t>9</w:t>
+            </w:r>
+            <w:r>
+              <w:rPr>
+                <w:noProof/>
+                <w:webHidden/>
+              </w:rPr>
+              <w:fldChar w:fldCharType="end"/>
+            </w:r>
+          </w:hyperlink>
+        </w:p>
+        <w:p>
+          <w:pPr>
+            <w:pStyle w:val="11"/>
+            <w:tabs>
+              <w:tab w:val="right" w:leader="dot" w:pos="8296"/>
+            </w:tabs>
+            <w:rPr>
+              <w:noProof/>
+              <w:szCs w:val="24"/>
+              <w14:ligatures w14:val="standardContextual"/>
+            </w:rPr>
+          </w:pPr>
+          <w:hyperlink w:anchor="_Toc230716416" w:history="1">
+            <w:r>
+              <w:rPr>
+                <w:rStyle w:val="af3"/>
+                <w:noProof/>
+              </w:rPr>
+              <w:t>製作規劃</w:t>
+            </w:r>
+            <w:r>
+              <w:rPr>
+                <w:noProof/>
+                <w:webHidden/>
+              </w:rPr>
+              <w:tab/>
+            </w:r>
+            <w:r>
+              <w:rPr>
+                <w:noProof/>
+                <w:webHidden/>
+              </w:rPr>
+              <w:fldChar w:fldCharType="begin"/>
+            </w:r>
+            <w:r>
+              <w:rPr>
+                <w:noProof/>
+                <w:webHidden/>
+              </w:rPr>
+              <w:instrText xml:space="preserve"> PAGEREF _Toc230716416 \h </w:instrText>
+            </w:r>
+            <w:r>
+              <w:rPr>
+                <w:noProof/>
+                <w:webHidden/>
+              </w:rPr>
+            </w:r>
+            <w:r>
+              <w:rPr>
+                <w:noProof/>
+                <w:webHidden/>
+              </w:rPr>
+              <w:fldChar w:fldCharType="separate"/>
+            </w:r>
+            <w:r>
+              <w:rPr>
+                <w:noProof/>
+                <w:webHidden/>
+              </w:rPr>
+              <w:t>12</w:t>
             </w:r>
             <w:r>
               <w:rPr>
@@ -522,17 +659,15 @@
         <w:pStyle w:val="1"/>
         <w:rPr>
           <w:rFonts w:eastAsia="DengXian" w:hint="eastAsia"/>
-          <w:lang w:eastAsia="zh-CN"/>
-        </w:rPr>
-      </w:pPr>
-      <w:bookmarkStart w:id="0" w:name="_Toc230653778"/>
-      <w:r>
-        <w:rPr>
-          <w:rFonts w:eastAsia="DengXian" w:hint="eastAsia"/>
-          <w:lang w:eastAsia="zh-CN"/>
+        </w:rPr>
+      </w:pPr>
+      <w:bookmarkStart w:id="0" w:name="_Toc230716409"/>
+      <w:r>
+        <w:rPr>
+          <w:rFonts w:eastAsia="新細明體" w:hint="eastAsia"/>
         </w:rPr>
         <w:lastRenderedPageBreak/>
-        <w:t>待办事项</w:t>
+        <w:t>待辦事項</w:t>
       </w:r>
       <w:bookmarkEnd w:id="0"/>
     </w:p>
@@ -541,15 +676,13 @@
         <w:jc w:val="left"/>
         <w:rPr>
           <w:rFonts w:eastAsia="DengXian"/>
-          <w:lang w:eastAsia="zh-CN"/>
-        </w:rPr>
-      </w:pPr>
-      <w:r>
-        <w:rPr>
-          <w:rFonts w:ascii="DengXian" w:eastAsia="DengXian" w:hAnsi="DengXian" w:cs="微軟正黑體" w:hint="eastAsia"/>
-          <w:lang w:eastAsia="zh-CN"/>
-        </w:rPr>
-        <w:t>设计组：</w:t>
+        </w:rPr>
+      </w:pPr>
+      <w:r>
+        <w:rPr>
+          <w:rFonts w:ascii="DengXian" w:eastAsia="新細明體" w:hAnsi="DengXian" w:cs="微軟正黑體" w:hint="eastAsia"/>
+        </w:rPr>
+        <w:t>設計組：</w:t>
       </w:r>
     </w:p>
     <w:p>
@@ -557,14 +690,12 @@
         <w:jc w:val="left"/>
         <w:rPr>
           <w:rFonts w:eastAsia="DengXian"/>
-          <w:lang w:eastAsia="zh-CN"/>
         </w:rPr>
       </w:pPr>
       <w:sdt>
         <w:sdtPr>
           <w:rPr>
             <w:rFonts w:eastAsia="DengXian" w:hint="eastAsia"/>
-            <w:lang w:eastAsia="zh-CN"/>
           </w:rPr>
           <w:id w:val="-8457041"/>
           <w14:checkbox>
@@ -577,7 +708,6 @@
           <w:r>
             <w:rPr>
               <w:rFonts w:ascii="MS Gothic" w:eastAsia="MS Gothic" w:hAnsi="MS Gothic" w:hint="eastAsia"/>
-              <w:lang w:eastAsia="zh-CN"/>
             </w:rPr>
             <w:t>☒</w:t>
           </w:r>
@@ -585,17 +715,15 @@
       </w:sdt>
       <w:r>
         <w:rPr>
-          <w:rFonts w:eastAsia="DengXian" w:hint="eastAsia"/>
-          <w:lang w:eastAsia="zh-CN"/>
+          <w:rFonts w:eastAsia="新細明體"/>
         </w:rPr>
         <w:t xml:space="preserve"> </w:t>
       </w:r>
       <w:r>
         <w:rPr>
-          <w:rFonts w:eastAsia="DengXian" w:hint="eastAsia"/>
-          <w:lang w:eastAsia="zh-CN"/>
-        </w:rPr>
-        <w:t>待机动画</w:t>
+          <w:rFonts w:eastAsia="新細明體" w:hint="eastAsia"/>
+        </w:rPr>
+        <w:t>待機動畫</w:t>
       </w:r>
     </w:p>
     <w:p>
@@ -603,14 +731,12 @@
         <w:jc w:val="left"/>
         <w:rPr>
           <w:rFonts w:eastAsia="DengXian"/>
-          <w:lang w:eastAsia="zh-CN"/>
         </w:rPr>
       </w:pPr>
       <w:sdt>
         <w:sdtPr>
           <w:rPr>
             <w:rFonts w:eastAsia="DengXian" w:hint="eastAsia"/>
-            <w:lang w:eastAsia="zh-CN"/>
           </w:rPr>
           <w:id w:val="-1995182535"/>
           <w14:checkbox>
@@ -623,7 +749,6 @@
           <w:r>
             <w:rPr>
               <w:rFonts w:ascii="MS Gothic" w:eastAsia="MS Gothic" w:hAnsi="MS Gothic" w:hint="eastAsia"/>
-              <w:lang w:eastAsia="zh-CN"/>
             </w:rPr>
             <w:t>☒</w:t>
           </w:r>
@@ -631,10 +756,15 @@
       </w:sdt>
       <w:r>
         <w:rPr>
-          <w:rFonts w:eastAsia="DengXian" w:hint="eastAsia"/>
-          <w:lang w:eastAsia="zh-CN"/>
-        </w:rPr>
-        <w:t xml:space="preserve"> UI设计</w:t>
+          <w:rFonts w:eastAsia="新細明體"/>
+        </w:rPr>
+        <w:t xml:space="preserve"> UI</w:t>
+      </w:r>
+      <w:r>
+        <w:rPr>
+          <w:rFonts w:eastAsia="新細明體" w:hint="eastAsia"/>
+        </w:rPr>
+        <w:t>設計</w:t>
       </w:r>
     </w:p>
     <w:p>
@@ -642,18 +772,16 @@
         <w:jc w:val="left"/>
         <w:rPr>
           <w:rFonts w:asciiTheme="minorEastAsia" w:hAnsiTheme="minorEastAsia"/>
-          <w:lang w:eastAsia="zh-CN"/>
         </w:rPr>
       </w:pPr>
       <w:sdt>
         <w:sdtPr>
           <w:rPr>
             <w:rFonts w:eastAsia="DengXian" w:hint="eastAsia"/>
-            <w:lang w:eastAsia="zh-CN"/>
           </w:rPr>
           <w:id w:val="1635052256"/>
           <w14:checkbox>
-            <w14:checked w14:val="0"/>
+            <w14:checked w14:val="1"/>
             <w14:checkedState w14:val="2612" w14:font="MS Gothic"/>
             <w14:uncheckedState w14:val="2610" w14:font="MS Gothic"/>
           </w14:checkbox>
@@ -662,37 +790,62 @@
           <w:r>
             <w:rPr>
               <w:rFonts w:ascii="MS Gothic" w:eastAsia="MS Gothic" w:hAnsi="MS Gothic" w:hint="eastAsia"/>
-              <w:lang w:eastAsia="zh-CN"/>
             </w:rPr>
-            <w:t>☐</w:t>
+            <w:t>☒</w:t>
           </w:r>
         </w:sdtContent>
       </w:sdt>
       <w:r>
         <w:rPr>
-          <w:rFonts w:eastAsia="DengXian" w:hint="eastAsia"/>
-          <w:lang w:eastAsia="zh-CN"/>
-        </w:rPr>
-        <w:t xml:space="preserve"> 5个宝石的旋转序列图</w:t>
-      </w:r>
-      <w:r>
-        <w:rPr>
-          <w:rFonts w:eastAsia="DengXian" w:hint="eastAsia"/>
-          <w:lang w:eastAsia="zh-CN"/>
-        </w:rPr>
-        <w:t>（</w:t>
+          <w:rFonts w:eastAsia="新細明體"/>
+        </w:rPr>
+        <w:t xml:space="preserve"> 5</w:t>
+      </w:r>
+      <w:r>
+        <w:rPr>
+          <w:rFonts w:eastAsia="新細明體" w:hint="eastAsia"/>
+        </w:rPr>
+        <w:t>個寶石的旋轉序列圖（</w:t>
+      </w:r>
+      <w:r>
+        <w:rPr>
+          <w:rFonts w:asciiTheme="minorEastAsia" w:hAnsiTheme="minorEastAsia"/>
+        </w:rPr>
+        <w:t>1</w:t>
       </w:r>
       <w:r>
         <w:rPr>
           <w:rFonts w:asciiTheme="minorEastAsia" w:hAnsiTheme="minorEastAsia" w:hint="eastAsia"/>
-          <w:lang w:eastAsia="zh-CN"/>
-        </w:rPr>
-        <w:t>1秒30，轉一圈30張</w:t>
-      </w:r>
-      <w:r>
-        <w:rPr>
-          <w:rFonts w:eastAsia="DengXian" w:hint="eastAsia"/>
-          <w:lang w:eastAsia="zh-CN"/>
+        </w:rPr>
+        <w:t>秒</w:t>
+      </w:r>
+      <w:r>
+        <w:rPr>
+          <w:rFonts w:asciiTheme="minorEastAsia" w:hAnsiTheme="minorEastAsia"/>
+        </w:rPr>
+        <w:t>30</w:t>
+      </w:r>
+      <w:r>
+        <w:rPr>
+          <w:rFonts w:asciiTheme="minorEastAsia" w:hAnsiTheme="minorEastAsia" w:hint="eastAsia"/>
+        </w:rPr>
+        <w:t>，轉一圈</w:t>
+      </w:r>
+      <w:r>
+        <w:rPr>
+          <w:rFonts w:asciiTheme="minorEastAsia" w:hAnsiTheme="minorEastAsia"/>
+        </w:rPr>
+        <w:t>30</w:t>
+      </w:r>
+      <w:r>
+        <w:rPr>
+          <w:rFonts w:asciiTheme="minorEastAsia" w:hAnsiTheme="minorEastAsia" w:hint="eastAsia"/>
+        </w:rPr>
+        <w:t>張</w:t>
+      </w:r>
+      <w:r>
+        <w:rPr>
+          <w:rFonts w:eastAsia="新細明體" w:hint="eastAsia"/>
         </w:rPr>
         <w:t>）</w:t>
       </w:r>
@@ -702,14 +855,12 @@
         <w:jc w:val="left"/>
         <w:rPr>
           <w:rFonts w:asciiTheme="minorEastAsia" w:eastAsia="DengXian" w:hAnsiTheme="minorEastAsia"/>
-          <w:lang w:eastAsia="zh-CN"/>
         </w:rPr>
       </w:pPr>
       <w:sdt>
         <w:sdtPr>
           <w:rPr>
             <w:rFonts w:eastAsia="DengXian" w:hint="eastAsia"/>
-            <w:lang w:eastAsia="zh-CN"/>
           </w:rPr>
           <w:id w:val="-1680348082"/>
           <w14:checkbox>
@@ -722,7 +873,6 @@
           <w:r>
             <w:rPr>
               <w:rFonts w:ascii="MS Gothic" w:eastAsia="MS Gothic" w:hAnsi="MS Gothic" w:hint="eastAsia"/>
-              <w:lang w:eastAsia="zh-CN"/>
             </w:rPr>
             <w:t>☐</w:t>
           </w:r>
@@ -730,16 +880,33 @@
       </w:sdt>
       <w:r>
         <w:rPr>
+          <w:rFonts w:asciiTheme="minorEastAsia" w:hAnsiTheme="minorEastAsia"/>
+        </w:rPr>
+        <w:t xml:space="preserve"> 20</w:t>
+      </w:r>
+      <w:r>
+        <w:rPr>
           <w:rFonts w:asciiTheme="minorEastAsia" w:hAnsiTheme="minorEastAsia" w:hint="eastAsia"/>
-          <w:lang w:eastAsia="zh-CN"/>
-        </w:rPr>
-        <w:t xml:space="preserve"> 20個水波紋文字圖</w:t>
+        </w:rPr>
+        <w:t>個水波紋文字圖</w:t>
+      </w:r>
+      <w:r>
+        <w:rPr>
+          <w:rFonts w:asciiTheme="minorEastAsia" w:hAnsiTheme="minorEastAsia"/>
+        </w:rPr>
+        <w:t>(</w:t>
       </w:r>
       <w:r>
         <w:rPr>
           <w:rFonts w:asciiTheme="minorEastAsia" w:hAnsiTheme="minorEastAsia" w:hint="eastAsia"/>
         </w:rPr>
-        <w:t>(變形變色)</w:t>
+        <w:t>變形變色</w:t>
+      </w:r>
+      <w:r>
+        <w:rPr>
+          <w:rFonts w:asciiTheme="minorEastAsia" w:hAnsiTheme="minorEastAsia"/>
+        </w:rPr>
+        <w:t>)</w:t>
       </w:r>
     </w:p>
     <w:p>
@@ -747,7 +914,6 @@
         <w:jc w:val="left"/>
         <w:rPr>
           <w:rFonts w:eastAsia="DengXian" w:hint="eastAsia"/>
-          <w:lang w:eastAsia="zh-CN"/>
         </w:rPr>
       </w:pPr>
       <w:sdt>
@@ -773,17 +939,15 @@
       </w:sdt>
       <w:r>
         <w:rPr>
-          <w:rFonts w:eastAsia="DengXian" w:hint="eastAsia"/>
-          <w:lang w:eastAsia="zh-CN"/>
-        </w:rPr>
-        <w:t xml:space="preserve"> 平板待机点击提示</w:t>
-      </w:r>
-      <w:r>
-        <w:rPr>
-          <w:rFonts w:eastAsia="DengXian" w:hint="eastAsia"/>
-          <w:lang w:eastAsia="zh-CN"/>
-        </w:rPr>
-        <w:t>待机动画</w:t>
+          <w:rFonts w:eastAsia="新細明體"/>
+        </w:rPr>
+        <w:t xml:space="preserve"> </w:t>
+      </w:r>
+      <w:r>
+        <w:rPr>
+          <w:rFonts w:eastAsia="新細明體" w:hint="eastAsia"/>
+        </w:rPr>
+        <w:t>平板待機點擊提示待機動畫</w:t>
       </w:r>
     </w:p>
     <w:p>
@@ -791,14 +955,12 @@
         <w:jc w:val="left"/>
         <w:rPr>
           <w:rFonts w:eastAsia="DengXian"/>
-          <w:lang w:eastAsia="zh-CN"/>
         </w:rPr>
       </w:pPr>
       <w:sdt>
         <w:sdtPr>
           <w:rPr>
             <w:rFonts w:eastAsia="DengXian" w:hint="eastAsia"/>
-            <w:lang w:eastAsia="zh-CN"/>
           </w:rPr>
           <w:id w:val="1410652168"/>
           <w14:checkbox>
@@ -811,7 +973,6 @@
           <w:r>
             <w:rPr>
               <w:rFonts w:ascii="MS Gothic" w:eastAsia="MS Gothic" w:hAnsi="MS Gothic" w:hint="eastAsia"/>
-              <w:lang w:eastAsia="zh-CN"/>
             </w:rPr>
             <w:t>☐</w:t>
           </w:r>
@@ -819,10 +980,15 @@
       </w:sdt>
       <w:r>
         <w:rPr>
-          <w:rFonts w:eastAsia="DengXian" w:hint="eastAsia"/>
-          <w:lang w:eastAsia="zh-CN"/>
-        </w:rPr>
-        <w:t xml:space="preserve"> 装置连接测试</w:t>
+          <w:rFonts w:eastAsia="新細明體"/>
+        </w:rPr>
+        <w:t xml:space="preserve"> </w:t>
+      </w:r>
+      <w:r>
+        <w:rPr>
+          <w:rFonts w:eastAsia="新細明體" w:hint="eastAsia"/>
+        </w:rPr>
+        <w:t>裝置連接測試</w:t>
       </w:r>
     </w:p>
     <w:p>
@@ -830,14 +996,12 @@
         <w:jc w:val="left"/>
         <w:rPr>
           <w:rFonts w:eastAsia="DengXian"/>
-          <w:lang w:eastAsia="zh-CN"/>
         </w:rPr>
       </w:pPr>
       <w:sdt>
         <w:sdtPr>
           <w:rPr>
             <w:rFonts w:eastAsia="DengXian" w:hint="eastAsia"/>
-            <w:lang w:eastAsia="zh-CN"/>
           </w:rPr>
           <w:id w:val="1141612850"/>
           <w14:checkbox>
@@ -850,7 +1014,6 @@
           <w:r>
             <w:rPr>
               <w:rFonts w:ascii="MS Gothic" w:eastAsia="MS Gothic" w:hAnsi="MS Gothic" w:hint="eastAsia"/>
-              <w:lang w:eastAsia="zh-CN"/>
             </w:rPr>
             <w:t>☐</w:t>
           </w:r>
@@ -858,17 +1021,15 @@
       </w:sdt>
       <w:r>
         <w:rPr>
-          <w:rFonts w:eastAsia="DengXian" w:hint="eastAsia"/>
-          <w:lang w:eastAsia="zh-CN"/>
+          <w:rFonts w:eastAsia="新細明體"/>
         </w:rPr>
         <w:t xml:space="preserve"> </w:t>
       </w:r>
       <w:r>
         <w:rPr>
-          <w:rFonts w:eastAsia="DengXian" w:hint="eastAsia"/>
-          <w:lang w:eastAsia="zh-CN"/>
-        </w:rPr>
-        <w:t>海报</w:t>
+          <w:rFonts w:eastAsia="新細明體" w:hint="eastAsia"/>
+        </w:rPr>
+        <w:t>海報</w:t>
       </w:r>
     </w:p>
     <w:p>
@@ -876,14 +1037,12 @@
         <w:jc w:val="left"/>
         <w:rPr>
           <w:rFonts w:eastAsia="DengXian"/>
-          <w:lang w:eastAsia="zh-CN"/>
         </w:rPr>
       </w:pPr>
       <w:sdt>
         <w:sdtPr>
           <w:rPr>
             <w:rFonts w:eastAsia="DengXian" w:hint="eastAsia"/>
-            <w:lang w:eastAsia="zh-CN"/>
           </w:rPr>
           <w:id w:val="1562210606"/>
           <w14:checkbox>
@@ -896,7 +1055,6 @@
           <w:r>
             <w:rPr>
               <w:rFonts w:ascii="MS Gothic" w:eastAsia="MS Gothic" w:hAnsi="MS Gothic" w:hint="eastAsia"/>
-              <w:lang w:eastAsia="zh-CN"/>
             </w:rPr>
             <w:t>☒</w:t>
           </w:r>
@@ -904,57 +1062,97 @@
       </w:sdt>
       <w:r>
         <w:rPr>
+          <w:rFonts w:eastAsia="新細明體"/>
+        </w:rPr>
+        <w:t xml:space="preserve"> </w:t>
+      </w:r>
+      <w:r>
+        <w:rPr>
+          <w:rFonts w:eastAsia="新細明體" w:hint="eastAsia"/>
+        </w:rPr>
+        <w:t>展示</w:t>
+      </w:r>
+      <w:r>
+        <w:rPr>
+          <w:rFonts w:eastAsia="新細明體"/>
+        </w:rPr>
+        <w:t>ppt_0525</w:t>
+      </w:r>
+    </w:p>
+    <w:p>
+      <w:pPr>
+        <w:jc w:val="left"/>
+        <w:rPr>
+          <w:rFonts w:eastAsia="DengXian"/>
+        </w:rPr>
+      </w:pPr>
+    </w:p>
+    <w:p>
+      <w:pPr>
+        <w:jc w:val="left"/>
+        <w:rPr>
+          <w:rFonts w:eastAsia="DengXian"/>
+        </w:rPr>
+      </w:pPr>
+      <w:r>
+        <w:rPr>
+          <w:rFonts w:eastAsia="新細明體" w:hint="eastAsia"/>
+        </w:rPr>
+        <w:t>科技組：</w:t>
+      </w:r>
+    </w:p>
+    <w:p>
+      <w:pPr>
+        <w:jc w:val="left"/>
+        <w:rPr>
           <w:rFonts w:eastAsia="DengXian" w:hint="eastAsia"/>
-          <w:lang w:eastAsia="zh-CN"/>
-        </w:rPr>
-        <w:t xml:space="preserve"> 展示ppt</w:t>
-      </w:r>
-      <w:r>
-        <w:rPr>
-          <w:rFonts w:eastAsia="DengXian" w:hint="eastAsia"/>
-          <w:lang w:eastAsia="zh-CN"/>
-        </w:rPr>
-        <w:t>_0525</w:t>
-      </w:r>
-    </w:p>
-    <w:p>
-      <w:pPr>
-        <w:jc w:val="left"/>
-        <w:rPr>
-          <w:rFonts w:eastAsia="DengXian"/>
-          <w:lang w:eastAsia="zh-CN"/>
-        </w:rPr>
-      </w:pPr>
-    </w:p>
-    <w:p>
-      <w:pPr>
-        <w:jc w:val="left"/>
-        <w:rPr>
-          <w:rFonts w:eastAsia="DengXian"/>
-          <w:lang w:eastAsia="zh-CN"/>
-        </w:rPr>
-      </w:pPr>
-      <w:r>
-        <w:rPr>
-          <w:rFonts w:eastAsia="DengXian" w:hint="eastAsia"/>
-          <w:lang w:eastAsia="zh-CN"/>
-        </w:rPr>
-        <w:t>科技组：</w:t>
-      </w:r>
-    </w:p>
-    <w:p>
-      <w:pPr>
-        <w:jc w:val="left"/>
-        <w:rPr>
-          <w:rFonts w:eastAsia="DengXian"/>
-          <w:lang w:eastAsia="zh-CN"/>
         </w:rPr>
       </w:pPr>
       <w:sdt>
         <w:sdtPr>
           <w:rPr>
             <w:rFonts w:eastAsia="DengXian" w:hint="eastAsia"/>
-            <w:lang w:eastAsia="zh-CN"/>
+          </w:rPr>
+          <w:id w:val="-1468742947"/>
+          <w14:checkbox>
+            <w14:checked w14:val="0"/>
+            <w14:checkedState w14:val="2612" w14:font="MS Gothic"/>
+            <w14:uncheckedState w14:val="2610" w14:font="MS Gothic"/>
+          </w14:checkbox>
+        </w:sdtPr>
+        <w:sdtContent>
+          <w:r>
+            <w:rPr>
+              <w:rFonts w:ascii="MS Gothic" w:eastAsia="MS Gothic" w:hAnsi="MS Gothic" w:hint="eastAsia"/>
+            </w:rPr>
+            <w:t>☐</w:t>
+          </w:r>
+        </w:sdtContent>
+      </w:sdt>
+      <w:r>
+        <w:rPr>
+          <w:rFonts w:eastAsia="新細明體"/>
+        </w:rPr>
+        <w:t xml:space="preserve"> </w:t>
+      </w:r>
+      <w:r>
+        <w:rPr>
+          <w:rFonts w:eastAsia="新細明體" w:hint="eastAsia"/>
+        </w:rPr>
+        <w:t>寶石彙聚</w:t>
+      </w:r>
+    </w:p>
+    <w:p>
+      <w:pPr>
+        <w:jc w:val="left"/>
+        <w:rPr>
+          <w:rFonts w:eastAsia="DengXian"/>
+        </w:rPr>
+      </w:pPr>
+      <w:sdt>
+        <w:sdtPr>
+          <w:rPr>
+            <w:rFonts w:eastAsia="DengXian" w:hint="eastAsia"/>
           </w:rPr>
           <w:id w:val="1205982233"/>
           <w14:checkbox>
@@ -967,7 +1165,6 @@
           <w:r>
             <w:rPr>
               <w:rFonts w:ascii="MS Gothic" w:eastAsia="MS Gothic" w:hAnsi="MS Gothic" w:hint="eastAsia"/>
-              <w:lang w:eastAsia="zh-CN"/>
             </w:rPr>
             <w:t>☐</w:t>
           </w:r>
@@ -975,24 +1172,15 @@
       </w:sdt>
       <w:r>
         <w:rPr>
-          <w:rFonts w:eastAsia="DengXian" w:hint="eastAsia"/>
-          <w:lang w:eastAsia="zh-CN"/>
-        </w:rPr>
-        <w:t xml:space="preserve"> 平板外接</w:t>
-      </w:r>
-      <w:r>
-        <w:rPr>
-          <w:rFonts w:eastAsia="DengXian" w:hint="eastAsia"/>
-          <w:lang w:eastAsia="zh-CN"/>
-        </w:rPr>
-        <w:t>网路</w:t>
-      </w:r>
-      <w:r>
-        <w:rPr>
-          <w:rFonts w:eastAsia="DengXian" w:hint="eastAsia"/>
-          <w:lang w:eastAsia="zh-CN"/>
-        </w:rPr>
-        <w:t>测试</w:t>
+          <w:rFonts w:eastAsia="新細明體"/>
+        </w:rPr>
+        <w:t xml:space="preserve"> </w:t>
+      </w:r>
+      <w:r>
+        <w:rPr>
+          <w:rFonts w:eastAsia="新細明體" w:hint="eastAsia"/>
+        </w:rPr>
+        <w:t>平板外接網路測試</w:t>
       </w:r>
     </w:p>
     <w:p>
@@ -1000,14 +1188,71 @@
         <w:jc w:val="left"/>
         <w:rPr>
           <w:rFonts w:hint="eastAsia"/>
-          <w:lang w:eastAsia="zh-CN"/>
         </w:rPr>
       </w:pPr>
       <w:sdt>
         <w:sdtPr>
           <w:rPr>
             <w:rFonts w:eastAsia="DengXian" w:hint="eastAsia"/>
-            <w:lang w:eastAsia="zh-CN"/>
+          </w:rPr>
+          <w:id w:val="881442455"/>
+          <w14:checkbox>
+            <w14:checked w14:val="0"/>
+            <w14:checkedState w14:val="2612" w14:font="MS Gothic"/>
+            <w14:uncheckedState w14:val="2610" w14:font="MS Gothic"/>
+          </w14:checkbox>
+        </w:sdtPr>
+        <w:sdtContent>
+          <w:r>
+            <w:rPr>
+              <w:rFonts w:ascii="MS Gothic" w:eastAsia="MS Gothic" w:hAnsi="MS Gothic" w:hint="eastAsia"/>
+            </w:rPr>
+            <w:t>☐</w:t>
+          </w:r>
+        </w:sdtContent>
+      </w:sdt>
+      <w:r>
+        <w:rPr>
+          <w:rFonts w:asciiTheme="minorEastAsia" w:hAnsiTheme="minorEastAsia"/>
+        </w:rPr>
+        <w:t xml:space="preserve"> </w:t>
+      </w:r>
+      <w:r>
+        <w:rPr>
+          <w:rFonts w:asciiTheme="minorEastAsia" w:hAnsiTheme="minorEastAsia" w:hint="eastAsia"/>
+        </w:rPr>
+        <w:t>遊玩錄製</w:t>
+      </w:r>
+      <w:r>
+        <w:rPr>
+          <w:rFonts w:asciiTheme="minorEastAsia" w:hAnsiTheme="minorEastAsia"/>
+        </w:rPr>
+        <w:t xml:space="preserve"> (5</w:t>
+      </w:r>
+      <w:r>
+        <w:rPr>
+          <w:rFonts w:asciiTheme="minorEastAsia" w:hAnsiTheme="minorEastAsia" w:hint="eastAsia"/>
+        </w:rPr>
+        <w:t>個寶石</w:t>
+      </w:r>
+      <w:r>
+        <w:rPr>
+          <w:rFonts w:asciiTheme="minorEastAsia" w:hAnsiTheme="minorEastAsia"/>
+        </w:rPr>
+        <w:t>)</w:t>
+      </w:r>
+    </w:p>
+    <w:p>
+      <w:pPr>
+        <w:jc w:val="left"/>
+        <w:rPr>
+          <w:rFonts w:hint="eastAsia"/>
+        </w:rPr>
+      </w:pPr>
+      <w:sdt>
+        <w:sdtPr>
+          <w:rPr>
+            <w:rFonts w:eastAsia="DengXian" w:hint="eastAsia"/>
           </w:rPr>
           <w:id w:val="-2128773119"/>
           <w14:checkbox>
@@ -1020,7 +1265,6 @@
           <w:r>
             <w:rPr>
               <w:rFonts w:ascii="MS Gothic" w:eastAsia="MS Gothic" w:hAnsi="MS Gothic" w:hint="eastAsia"/>
-              <w:lang w:eastAsia="zh-CN"/>
             </w:rPr>
             <w:t>☒</w:t>
           </w:r>
@@ -1028,18 +1272,30 @@
       </w:sdt>
       <w:r>
         <w:rPr>
+          <w:rFonts w:eastAsia="新細明體"/>
+        </w:rPr>
+        <w:t xml:space="preserve"> </w:t>
+      </w:r>
+      <w:proofErr w:type="gramStart"/>
+      <w:r>
+        <w:rPr>
+          <w:rFonts w:eastAsia="新細明體" w:hint="eastAsia"/>
+        </w:rPr>
+        <w:t>顯示器攝像頭</w:t>
+      </w:r>
+      <w:proofErr w:type="gramEnd"/>
+      <w:r>
+        <w:rPr>
+          <w:rFonts w:eastAsia="新細明體" w:hint="eastAsia"/>
+        </w:rPr>
+        <w:t>隱私測試</w:t>
+      </w:r>
+    </w:p>
+    <w:p>
+      <w:pPr>
+        <w:jc w:val="left"/>
+        <w:rPr>
           <w:rFonts w:eastAsia="DengXian" w:hint="eastAsia"/>
-          <w:lang w:eastAsia="zh-CN"/>
-        </w:rPr>
-        <w:t xml:space="preserve"> 显示器摄像头隐私测试</w:t>
-      </w:r>
-    </w:p>
-    <w:p>
-      <w:pPr>
-        <w:jc w:val="left"/>
-        <w:rPr>
-          <w:rFonts w:eastAsia="DengXian" w:hint="eastAsia"/>
-          <w:lang w:eastAsia="zh-CN"/>
         </w:rPr>
       </w:pPr>
       <w:sdt>
@@ -1064,15 +1320,12 @@
         </w:sdtContent>
       </w:sdt>
       <w:r>
+        <w:t xml:space="preserve"> </w:t>
+      </w:r>
+      <w:r>
         <w:rPr>
           <w:rFonts w:hint="eastAsia"/>
         </w:rPr>
-        <w:t xml:space="preserve"> </w:t>
-      </w:r>
-      <w:r>
-        <w:rPr>
-          <w:rFonts w:hint="eastAsia"/>
-        </w:rPr>
         <w:t>音效實裝</w:t>
       </w:r>
     </w:p>
@@ -1081,43 +1334,6 @@
         <w:jc w:val="left"/>
         <w:rPr>
           <w:rFonts w:eastAsia="DengXian"/>
-          <w:lang w:eastAsia="zh-CN"/>
-        </w:rPr>
-      </w:pPr>
-      <w:sdt>
-        <w:sdtPr>
-          <w:rPr>
-            <w:rFonts w:eastAsia="DengXian" w:hint="eastAsia"/>
-          </w:rPr>
-          <w:id w:val="881442455"/>
-          <w14:checkbox>
-            <w14:checked w14:val="0"/>
-            <w14:checkedState w14:val="2612" w14:font="MS Gothic"/>
-            <w14:uncheckedState w14:val="2610" w14:font="MS Gothic"/>
-          </w14:checkbox>
-        </w:sdtPr>
-        <w:sdtContent>
-          <w:r>
-            <w:rPr>
-              <w:rFonts w:ascii="MS Gothic" w:eastAsia="MS Gothic" w:hAnsi="MS Gothic" w:hint="eastAsia"/>
-            </w:rPr>
-            <w:t>☐</w:t>
-          </w:r>
-        </w:sdtContent>
-      </w:sdt>
-      <w:r>
-        <w:rPr>
-          <w:rFonts w:asciiTheme="minorEastAsia" w:hAnsiTheme="minorEastAsia" w:hint="eastAsia"/>
-        </w:rPr>
-        <w:t xml:space="preserve"> 遊玩錄製 (5個寶石)</w:t>
-      </w:r>
-    </w:p>
-    <w:p>
-      <w:pPr>
-        <w:jc w:val="left"/>
-        <w:rPr>
-          <w:rFonts w:eastAsia="DengXian"/>
-          <w:lang w:eastAsia="zh-CN"/>
         </w:rPr>
       </w:pPr>
       <w:sdt>
@@ -1143,42 +1359,15 @@
       </w:sdt>
       <w:r>
         <w:rPr>
-          <w:rFonts w:eastAsia="DengXian" w:hint="eastAsia"/>
-        </w:rPr>
-        <w:t xml:space="preserve"> GPU预设修改</w:t>
-      </w:r>
-    </w:p>
-    <w:p>
-      <w:pPr>
-        <w:jc w:val="left"/>
-      </w:pPr>
-      <w:sdt>
-        <w:sdtPr>
-          <w:rPr>
-            <w:rFonts w:eastAsia="DengXian" w:hint="eastAsia"/>
-          </w:rPr>
-          <w:id w:val="-1468742947"/>
-          <w14:checkbox>
-            <w14:checked w14:val="0"/>
-            <w14:checkedState w14:val="2612" w14:font="MS Gothic"/>
-            <w14:uncheckedState w14:val="2610" w14:font="MS Gothic"/>
-          </w14:checkbox>
-        </w:sdtPr>
-        <w:sdtContent>
-          <w:r>
-            <w:rPr>
-              <w:rFonts w:ascii="MS Gothic" w:eastAsia="MS Gothic" w:hAnsi="MS Gothic" w:hint="eastAsia"/>
-            </w:rPr>
-            <w:t>☐</w:t>
-          </w:r>
-        </w:sdtContent>
-      </w:sdt>
-      <w:r>
-        <w:rPr>
-          <w:rFonts w:eastAsia="DengXian" w:hint="eastAsia"/>
-          <w:lang w:eastAsia="zh-CN"/>
-        </w:rPr>
-        <w:t xml:space="preserve"> 宝石汇聚</w:t>
+          <w:rFonts w:eastAsia="新細明體"/>
+        </w:rPr>
+        <w:t xml:space="preserve"> GPU</w:t>
+      </w:r>
+      <w:r>
+        <w:rPr>
+          <w:rFonts w:eastAsia="新細明體" w:hint="eastAsia"/>
+        </w:rPr>
+        <w:t>預設修改</w:t>
       </w:r>
     </w:p>
     <w:p>
@@ -1211,9 +1400,15 @@
       </w:sdt>
       <w:r>
         <w:rPr>
+          <w:rFonts w:asciiTheme="minorEastAsia" w:hAnsiTheme="minorEastAsia"/>
+        </w:rPr>
+        <w:t xml:space="preserve"> UI</w:t>
+      </w:r>
+      <w:r>
+        <w:rPr>
           <w:rFonts w:asciiTheme="minorEastAsia" w:hAnsiTheme="minorEastAsia" w:hint="eastAsia"/>
         </w:rPr>
-        <w:t xml:space="preserve"> UI文字描述修改，加入回饋文字對應的寶石描述</w:t>
+        <w:t>文字描述修改，加入回饋文字對應的寶石描述</w:t>
       </w:r>
     </w:p>
     <w:p>
@@ -1246,9 +1441,27 @@
       </w:sdt>
       <w:r>
         <w:rPr>
+          <w:rFonts w:asciiTheme="minorEastAsia" w:hAnsiTheme="minorEastAsia"/>
+        </w:rPr>
+        <w:t xml:space="preserve"> </w:t>
+      </w:r>
+      <w:r>
+        <w:rPr>
           <w:rFonts w:asciiTheme="minorEastAsia" w:hAnsiTheme="minorEastAsia" w:hint="eastAsia"/>
         </w:rPr>
-        <w:t xml:space="preserve"> 寶石5個轉速可單獨調整</w:t>
+        <w:t>寶石</w:t>
+      </w:r>
+      <w:r>
+        <w:rPr>
+          <w:rFonts w:asciiTheme="minorEastAsia" w:hAnsiTheme="minorEastAsia"/>
+        </w:rPr>
+        <w:t>5</w:t>
+      </w:r>
+      <w:r>
+        <w:rPr>
+          <w:rFonts w:asciiTheme="minorEastAsia" w:hAnsiTheme="minorEastAsia" w:hint="eastAsia"/>
+        </w:rPr>
+        <w:t>個轉速可單獨調整</w:t>
       </w:r>
     </w:p>
     <w:p>
@@ -1256,7 +1469,6 @@
         <w:jc w:val="left"/>
         <w:rPr>
           <w:rFonts w:asciiTheme="minorEastAsia" w:eastAsia="DengXian" w:hAnsiTheme="minorEastAsia"/>
-          <w:lang w:eastAsia="zh-CN"/>
         </w:rPr>
       </w:pPr>
       <w:sdt>
@@ -1282,9 +1494,15 @@
       </w:sdt>
       <w:r>
         <w:rPr>
+          <w:rFonts w:asciiTheme="minorEastAsia" w:hAnsiTheme="minorEastAsia"/>
+        </w:rPr>
+        <w:t xml:space="preserve"> </w:t>
+      </w:r>
+      <w:r>
+        <w:rPr>
           <w:rFonts w:asciiTheme="minorEastAsia" w:hAnsiTheme="minorEastAsia" w:hint="eastAsia"/>
         </w:rPr>
-        <w:t xml:space="preserve"> 寶石大小數據遷出</w:t>
+        <w:t>寶石大小數據遷出</w:t>
       </w:r>
     </w:p>
     <w:p>
@@ -1292,7 +1510,6 @@
         <w:jc w:val="left"/>
         <w:rPr>
           <w:rFonts w:asciiTheme="minorEastAsia" w:eastAsia="DengXian" w:hAnsiTheme="minorEastAsia" w:hint="eastAsia"/>
-          <w:lang w:eastAsia="zh-CN"/>
         </w:rPr>
       </w:pPr>
       <w:sdt>
@@ -1318,18 +1535,22 @@
       </w:sdt>
       <w:r>
         <w:rPr>
+          <w:rFonts w:eastAsia="新細明體"/>
+        </w:rPr>
+        <w:t xml:space="preserve"> </w:t>
+      </w:r>
+      <w:r>
+        <w:rPr>
+          <w:rFonts w:eastAsia="新細明體" w:hint="eastAsia"/>
+        </w:rPr>
+        <w:t>網址數據遷出</w:t>
+      </w:r>
+    </w:p>
+    <w:p>
+      <w:pPr>
+        <w:jc w:val="left"/>
+        <w:rPr>
           <w:rFonts w:eastAsia="DengXian" w:hint="eastAsia"/>
-          <w:lang w:eastAsia="zh-CN"/>
-        </w:rPr>
-        <w:t xml:space="preserve"> 网址数据迁出</w:t>
-      </w:r>
-    </w:p>
-    <w:p>
-      <w:pPr>
-        <w:jc w:val="left"/>
-        <w:rPr>
-          <w:rFonts w:eastAsia="DengXian" w:hint="eastAsia"/>
-          <w:lang w:eastAsia="zh-CN"/>
         </w:rPr>
       </w:pPr>
       <w:sdt>
@@ -1355,9 +1576,15 @@
       </w:sdt>
       <w:r>
         <w:rPr>
+          <w:rFonts w:asciiTheme="minorEastAsia" w:hAnsiTheme="minorEastAsia"/>
+        </w:rPr>
+        <w:t xml:space="preserve"> </w:t>
+      </w:r>
+      <w:r>
+        <w:rPr>
           <w:rFonts w:asciiTheme="minorEastAsia" w:hAnsiTheme="minorEastAsia" w:hint="eastAsia"/>
         </w:rPr>
-        <w:t xml:space="preserve"> 文字圖速度，待機模糊數據遷出</w:t>
+        <w:t>文字圖速度，待機模糊數據遷出</w:t>
       </w:r>
     </w:p>
     <w:p>
@@ -1365,14 +1592,12 @@
         <w:jc w:val="left"/>
         <w:rPr>
           <w:rFonts w:ascii="微軟正黑體" w:eastAsia="DengXian" w:hAnsi="微軟正黑體" w:cs="微軟正黑體"/>
-          <w:lang w:eastAsia="zh-CN"/>
         </w:rPr>
       </w:pPr>
       <w:sdt>
         <w:sdtPr>
           <w:rPr>
             <w:rFonts w:eastAsia="DengXian" w:hint="eastAsia"/>
-            <w:lang w:eastAsia="zh-CN"/>
           </w:rPr>
           <w:id w:val="1112555195"/>
           <w14:checkbox>
@@ -1385,7 +1610,6 @@
           <w:r>
             <w:rPr>
               <w:rFonts w:ascii="MS Gothic" w:eastAsia="MS Gothic" w:hAnsi="MS Gothic" w:hint="eastAsia"/>
-              <w:lang w:eastAsia="zh-CN"/>
             </w:rPr>
             <w:t>☒</w:t>
           </w:r>
@@ -1393,15 +1617,13 @@
       </w:sdt>
       <w:r>
         <w:rPr>
-          <w:rFonts w:asciiTheme="minorEastAsia" w:hAnsiTheme="minorEastAsia" w:hint="eastAsia"/>
-          <w:lang w:eastAsia="zh-CN"/>
+          <w:rFonts w:asciiTheme="minorEastAsia" w:hAnsiTheme="minorEastAsia"/>
         </w:rPr>
         <w:t xml:space="preserve"> UI</w:t>
       </w:r>
       <w:r>
         <w:rPr>
-          <w:rFonts w:ascii="微軟正黑體" w:eastAsia="DengXian" w:hAnsi="微軟正黑體" w:cs="微軟正黑體" w:hint="eastAsia"/>
-          <w:lang w:eastAsia="zh-CN"/>
+          <w:rFonts w:ascii="微軟正黑體" w:eastAsia="新細明體" w:hAnsi="微軟正黑體" w:cs="微軟正黑體" w:hint="eastAsia"/>
         </w:rPr>
         <w:t>套用</w:t>
       </w:r>
@@ -1411,14 +1633,12 @@
         <w:jc w:val="left"/>
         <w:rPr>
           <w:rFonts w:eastAsia="DengXian"/>
-          <w:lang w:eastAsia="zh-CN"/>
         </w:rPr>
       </w:pPr>
       <w:sdt>
         <w:sdtPr>
           <w:rPr>
             <w:rFonts w:eastAsia="DengXian" w:hint="eastAsia"/>
-            <w:lang w:eastAsia="zh-CN"/>
           </w:rPr>
           <w:id w:val="-1247256250"/>
           <w14:checkbox>
@@ -1431,7 +1651,6 @@
           <w:r>
             <w:rPr>
               <w:rFonts w:ascii="MS Gothic" w:eastAsia="MS Gothic" w:hAnsi="MS Gothic" w:hint="eastAsia"/>
-              <w:lang w:eastAsia="zh-CN"/>
             </w:rPr>
             <w:t>☒</w:t>
           </w:r>
@@ -1439,10 +1658,29 @@
       </w:sdt>
       <w:r>
         <w:rPr>
-          <w:rFonts w:eastAsia="DengXian" w:hint="eastAsia"/>
-          <w:lang w:eastAsia="zh-CN"/>
-        </w:rPr>
-        <w:t xml:space="preserve"> React的单界面拆成两个页面</w:t>
+          <w:rFonts w:eastAsia="新細明體"/>
+        </w:rPr>
+        <w:t xml:space="preserve"> React</w:t>
+      </w:r>
+      <w:r>
+        <w:rPr>
+          <w:rFonts w:eastAsia="新細明體" w:hint="eastAsia"/>
+        </w:rPr>
+        <w:t>的</w:t>
+      </w:r>
+      <w:proofErr w:type="gramStart"/>
+      <w:r>
+        <w:rPr>
+          <w:rFonts w:eastAsia="新細明體" w:hint="eastAsia"/>
+        </w:rPr>
+        <w:t>單界面拆成兩個頁</w:t>
+      </w:r>
+      <w:proofErr w:type="gramEnd"/>
+      <w:r>
+        <w:rPr>
+          <w:rFonts w:eastAsia="新細明體" w:hint="eastAsia"/>
+        </w:rPr>
+        <w:t>面</w:t>
       </w:r>
     </w:p>
     <w:p>
@@ -1456,7 +1694,6 @@
         <w:sdtPr>
           <w:rPr>
             <w:rFonts w:eastAsia="DengXian" w:hint="eastAsia"/>
-            <w:lang w:eastAsia="zh-CN"/>
           </w:rPr>
           <w:id w:val="2142530858"/>
           <w14:checkbox>
@@ -1469,7 +1706,6 @@
           <w:r>
             <w:rPr>
               <w:rFonts w:ascii="MS Gothic" w:eastAsia="MS Gothic" w:hAnsi="MS Gothic" w:hint="eastAsia"/>
-              <w:lang w:eastAsia="zh-CN"/>
             </w:rPr>
             <w:t>☒</w:t>
           </w:r>
@@ -1477,10 +1713,15 @@
       </w:sdt>
       <w:r>
         <w:rPr>
-          <w:rFonts w:eastAsia="DengXian" w:hint="eastAsia"/>
-          <w:lang w:eastAsia="zh-CN"/>
-        </w:rPr>
-        <w:t xml:space="preserve"> 平板待机动画实装</w:t>
+          <w:rFonts w:eastAsia="新細明體"/>
+        </w:rPr>
+        <w:t xml:space="preserve"> </w:t>
+      </w:r>
+      <w:r>
+        <w:rPr>
+          <w:rFonts w:eastAsia="新細明體" w:hint="eastAsia"/>
+        </w:rPr>
+        <w:t>平板待機動畫實裝</w:t>
       </w:r>
     </w:p>
     <w:p>
@@ -1510,25 +1751,57 @@
       </w:sdt>
       <w:r>
         <w:rPr>
+          <w:rFonts w:asciiTheme="minorEastAsia" w:hAnsiTheme="minorEastAsia"/>
+        </w:rPr>
+        <w:t xml:space="preserve"> UI</w:t>
+      </w:r>
+      <w:r>
+        <w:rPr>
           <w:rFonts w:asciiTheme="minorEastAsia" w:hAnsiTheme="minorEastAsia" w:hint="eastAsia"/>
         </w:rPr>
-        <w:t xml:space="preserve"> </w:t>
+        <w:t>設計</w:t>
+      </w:r>
+      <w:r>
+        <w:rPr>
+          <w:rFonts w:asciiTheme="minorEastAsia" w:hAnsiTheme="minorEastAsia"/>
+        </w:rPr>
+        <w:t>(</w:t>
       </w:r>
       <w:r>
         <w:rPr>
           <w:rFonts w:asciiTheme="minorEastAsia" w:hAnsiTheme="minorEastAsia" w:hint="eastAsia"/>
         </w:rPr>
-        <w:t>UI設計(改成小字小框長方形小圓角，加入橫向分隔線，按鈕與標題和開始互動按鈕用粗分隔線，20個字詞的選框之間用較細的分隔線</w:t>
-      </w:r>
+        <w:t>改成</w:t>
+      </w:r>
+      <w:proofErr w:type="gramStart"/>
       <w:r>
         <w:rPr>
           <w:rFonts w:asciiTheme="minorEastAsia" w:hAnsiTheme="minorEastAsia" w:hint="eastAsia"/>
         </w:rPr>
-        <w:t>，類似蘋果的風格</w:t>
-      </w:r>
+        <w:t>小字小框長方形</w:t>
+      </w:r>
+      <w:proofErr w:type="gramEnd"/>
       <w:r>
         <w:rPr>
           <w:rFonts w:asciiTheme="minorEastAsia" w:hAnsiTheme="minorEastAsia" w:hint="eastAsia"/>
+        </w:rPr>
+        <w:t>小圓角，加入橫向分隔線，按鈕與標題和開始互動按鈕用粗分隔線，</w:t>
+      </w:r>
+      <w:r>
+        <w:rPr>
+          <w:rFonts w:asciiTheme="minorEastAsia" w:hAnsiTheme="minorEastAsia"/>
+        </w:rPr>
+        <w:t>20</w:t>
+      </w:r>
+      <w:r>
+        <w:rPr>
+          <w:rFonts w:asciiTheme="minorEastAsia" w:hAnsiTheme="minorEastAsia" w:hint="eastAsia"/>
+        </w:rPr>
+        <w:t>個字詞的選框之間用較細的分隔線，類似蘋果的風格</w:t>
+      </w:r>
+      <w:r>
+        <w:rPr>
+          <w:rFonts w:asciiTheme="minorEastAsia" w:hAnsiTheme="minorEastAsia"/>
         </w:rPr>
         <w:t>)</w:t>
       </w:r>
@@ -1562,9 +1835,6 @@
         </w:sdtContent>
       </w:sdt>
       <w:r>
-        <w:rPr>
-          <w:rFonts w:hint="eastAsia"/>
-        </w:rPr>
         <w:t xml:space="preserve"> </w:t>
       </w:r>
       <w:r>
@@ -1579,14 +1849,12 @@
         <w:jc w:val="left"/>
         <w:rPr>
           <w:rFonts w:eastAsia="DengXian"/>
-          <w:lang w:eastAsia="zh-CN"/>
         </w:rPr>
       </w:pPr>
       <w:sdt>
         <w:sdtPr>
           <w:rPr>
             <w:rFonts w:eastAsia="DengXian" w:hint="eastAsia"/>
-            <w:lang w:eastAsia="zh-CN"/>
           </w:rPr>
           <w:id w:val="1096280076"/>
           <w14:checkbox>
@@ -1599,7 +1867,6 @@
           <w:r>
             <w:rPr>
               <w:rFonts w:ascii="MS Gothic" w:eastAsia="MS Gothic" w:hAnsi="MS Gothic" w:hint="eastAsia"/>
-              <w:lang w:eastAsia="zh-CN"/>
             </w:rPr>
             <w:t>☒</w:t>
           </w:r>
@@ -1607,10 +1874,15 @@
       </w:sdt>
       <w:r>
         <w:rPr>
-          <w:rFonts w:eastAsia="DengXian" w:hint="eastAsia"/>
-          <w:lang w:eastAsia="zh-CN"/>
-        </w:rPr>
-        <w:t xml:space="preserve"> 水波纹特效替换</w:t>
+          <w:rFonts w:eastAsia="新細明體"/>
+        </w:rPr>
+        <w:t xml:space="preserve"> </w:t>
+      </w:r>
+      <w:r>
+        <w:rPr>
+          <w:rFonts w:eastAsia="新細明體" w:hint="eastAsia"/>
+        </w:rPr>
+        <w:t>水波紋特效替換</w:t>
       </w:r>
     </w:p>
     <w:p>
@@ -1625,7 +1897,6 @@
         <w:sdtPr>
           <w:rPr>
             <w:rFonts w:eastAsia="DengXian" w:hint="eastAsia"/>
-            <w:lang w:eastAsia="zh-CN"/>
           </w:rPr>
           <w:id w:val="1206906764"/>
           <w14:checkbox>
@@ -1638,7 +1909,6 @@
           <w:r>
             <w:rPr>
               <w:rFonts w:ascii="MS Gothic" w:eastAsia="MS Gothic" w:hAnsi="MS Gothic" w:hint="eastAsia"/>
-              <w:lang w:eastAsia="zh-CN"/>
             </w:rPr>
             <w:t>☒</w:t>
           </w:r>
@@ -1646,10 +1916,15 @@
       </w:sdt>
       <w:r>
         <w:rPr>
-          <w:rFonts w:eastAsia="DengXian" w:hint="eastAsia"/>
-          <w:lang w:eastAsia="zh-CN"/>
-        </w:rPr>
-        <w:t xml:space="preserve"> 文字图打包</w:t>
+          <w:rFonts w:eastAsia="新細明體"/>
+        </w:rPr>
+        <w:t xml:space="preserve"> </w:t>
+      </w:r>
+      <w:r>
+        <w:rPr>
+          <w:rFonts w:eastAsia="新細明體" w:hint="eastAsia"/>
+        </w:rPr>
+        <w:t>文字圖打包</w:t>
       </w:r>
     </w:p>
     <w:p>
@@ -1676,15 +1951,15 @@
           <w:lang w:eastAsia="zh-CN"/>
         </w:rPr>
       </w:pPr>
-      <w:bookmarkStart w:id="1" w:name="_Toc230653779"/>
-      <w:r>
-        <w:rPr>
-          <w:rFonts w:eastAsia="DengXian" w:hint="eastAsia"/>
-          <w:lang w:eastAsia="zh-CN"/>
+      <w:bookmarkStart w:id="1" w:name="_Toc230716410"/>
+      <w:r>
+        <w:rPr>
+          <w:rFonts w:eastAsia="新細明體" w:hint="eastAsia"/>
         </w:rPr>
         <w:lastRenderedPageBreak/>
-        <w:t>音效设定</w:t>
-      </w:r>
+        <w:t>音效設定</w:t>
+      </w:r>
+      <w:bookmarkEnd w:id="1"/>
     </w:p>
     <w:p>
       <w:pPr>
@@ -1758,15 +2033,15 @@
           <w:lang w:eastAsia="zh-CN"/>
         </w:rPr>
       </w:pPr>
+      <w:bookmarkStart w:id="2" w:name="_Toc230716411"/>
       <w:r>
         <w:rPr>
           <w:rFonts w:hint="eastAsia"/>
-          <w:lang w:eastAsia="zh-CN"/>
         </w:rPr>
         <w:lastRenderedPageBreak/>
-        <w:t>网络连线</w:t>
-      </w:r>
-      <w:bookmarkEnd w:id="1"/>
+        <w:t>網絡連線</w:t>
+      </w:r>
+      <w:bookmarkEnd w:id="2"/>
     </w:p>
     <w:p>
       <w:pPr>
@@ -1777,15 +2052,43 @@
       </w:pPr>
       <w:r>
         <w:rPr>
-          <w:rFonts w:ascii="Segoe UI Emoji" w:eastAsia="DengXian" w:hAnsi="Segoe UI Emoji" w:cs="Segoe UI Emoji"/>
-        </w:rPr>
-        <w:t>🛠️</w:t>
-      </w:r>
-      <w:r>
-        <w:rPr>
-          <w:rFonts w:eastAsia="DengXian"/>
-        </w:rPr>
-        <w:t xml:space="preserve"> 第一步：調整系統底層權限（最常見原因）</w:t>
+          <w:noProof/>
+        </w:rPr>
+        <w:drawing>
+          <wp:inline distT="0" distB="0" distL="0" distR="0" wp14:anchorId="41BDAE2D" wp14:editId="4EA02C4A">
+            <wp:extent cx="5274310" cy="2415540"/>
+            <wp:effectExtent l="0" t="0" r="2540" b="3810"/>
+            <wp:docPr id="910802507" name="圖片 1"/>
+            <wp:cNvGraphicFramePr>
+              <a:graphicFrameLocks xmlns:a="http://schemas.openxmlformats.org/drawingml/2006/main" noChangeAspect="1"/>
+            </wp:cNvGraphicFramePr>
+            <a:graphic xmlns:a="http://schemas.openxmlformats.org/drawingml/2006/main">
+              <a:graphicData uri="http://schemas.openxmlformats.org/drawingml/2006/picture">
+                <pic:pic xmlns:pic="http://schemas.openxmlformats.org/drawingml/2006/picture">
+                  <pic:nvPicPr>
+                    <pic:cNvPr id="910802507" name=""/>
+                    <pic:cNvPicPr/>
+                  </pic:nvPicPr>
+                  <pic:blipFill>
+                    <a:blip r:embed="rId9"/>
+                    <a:stretch>
+                      <a:fillRect/>
+                    </a:stretch>
+                  </pic:blipFill>
+                  <pic:spPr>
+                    <a:xfrm>
+                      <a:off x="0" y="0"/>
+                      <a:ext cx="5274310" cy="2415540"/>
+                    </a:xfrm>
+                    <a:prstGeom prst="rect">
+                      <a:avLst/>
+                    </a:prstGeom>
+                  </pic:spPr>
+                </pic:pic>
+              </a:graphicData>
+            </a:graphic>
+          </wp:inline>
+        </w:drawing>
       </w:r>
     </w:p>
     <w:p>
@@ -1797,6 +2100,167 @@
       </w:pPr>
       <w:r>
         <w:rPr>
+          <w:noProof/>
+        </w:rPr>
+        <w:drawing>
+          <wp:inline distT="0" distB="0" distL="0" distR="0" wp14:anchorId="448E3BC7" wp14:editId="362A3AF0">
+            <wp:extent cx="5274310" cy="1876425"/>
+            <wp:effectExtent l="0" t="0" r="2540" b="9525"/>
+            <wp:docPr id="1180532345" name="圖片 1"/>
+            <wp:cNvGraphicFramePr>
+              <a:graphicFrameLocks xmlns:a="http://schemas.openxmlformats.org/drawingml/2006/main" noChangeAspect="1"/>
+            </wp:cNvGraphicFramePr>
+            <a:graphic xmlns:a="http://schemas.openxmlformats.org/drawingml/2006/main">
+              <a:graphicData uri="http://schemas.openxmlformats.org/drawingml/2006/picture">
+                <pic:pic xmlns:pic="http://schemas.openxmlformats.org/drawingml/2006/picture">
+                  <pic:nvPicPr>
+                    <pic:cNvPr id="1180532345" name=""/>
+                    <pic:cNvPicPr/>
+                  </pic:nvPicPr>
+                  <pic:blipFill>
+                    <a:blip r:embed="rId10"/>
+                    <a:stretch>
+                      <a:fillRect/>
+                    </a:stretch>
+                  </pic:blipFill>
+                  <pic:spPr>
+                    <a:xfrm>
+                      <a:off x="0" y="0"/>
+                      <a:ext cx="5274310" cy="1876425"/>
+                    </a:xfrm>
+                    <a:prstGeom prst="rect">
+                      <a:avLst/>
+                    </a:prstGeom>
+                  </pic:spPr>
+                </pic:pic>
+              </a:graphicData>
+            </a:graphic>
+          </wp:inline>
+        </w:drawing>
+      </w:r>
+    </w:p>
+    <w:p>
+      <w:pPr>
+        <w:rPr>
+          <w:rFonts w:eastAsia="DengXian" w:hint="eastAsia"/>
+          <w:lang w:eastAsia="zh-CN"/>
+        </w:rPr>
+      </w:pPr>
+      <w:r>
+        <w:rPr>
+          <w:noProof/>
+        </w:rPr>
+        <w:drawing>
+          <wp:inline distT="0" distB="0" distL="0" distR="0" wp14:anchorId="2727A890" wp14:editId="4DC6F723">
+            <wp:extent cx="5274310" cy="888365"/>
+            <wp:effectExtent l="0" t="0" r="2540" b="6985"/>
+            <wp:docPr id="1418464061" name="圖片 1"/>
+            <wp:cNvGraphicFramePr>
+              <a:graphicFrameLocks xmlns:a="http://schemas.openxmlformats.org/drawingml/2006/main" noChangeAspect="1"/>
+            </wp:cNvGraphicFramePr>
+            <a:graphic xmlns:a="http://schemas.openxmlformats.org/drawingml/2006/main">
+              <a:graphicData uri="http://schemas.openxmlformats.org/drawingml/2006/picture">
+                <pic:pic xmlns:pic="http://schemas.openxmlformats.org/drawingml/2006/picture">
+                  <pic:nvPicPr>
+                    <pic:cNvPr id="1418464061" name=""/>
+                    <pic:cNvPicPr/>
+                  </pic:nvPicPr>
+                  <pic:blipFill>
+                    <a:blip r:embed="rId11"/>
+                    <a:stretch>
+                      <a:fillRect/>
+                    </a:stretch>
+                  </pic:blipFill>
+                  <pic:spPr>
+                    <a:xfrm>
+                      <a:off x="0" y="0"/>
+                      <a:ext cx="5274310" cy="888365"/>
+                    </a:xfrm>
+                    <a:prstGeom prst="rect">
+                      <a:avLst/>
+                    </a:prstGeom>
+                  </pic:spPr>
+                </pic:pic>
+              </a:graphicData>
+            </a:graphic>
+          </wp:inline>
+        </w:drawing>
+      </w:r>
+    </w:p>
+    <w:p>
+      <w:pPr>
+        <w:jc w:val="left"/>
+        <w:rPr>
+          <w:rFonts w:eastAsia="DengXian"/>
+          <w:lang w:eastAsia="zh-CN"/>
+        </w:rPr>
+      </w:pPr>
+      <w:r>
+        <w:rPr>
+          <w:rFonts w:eastAsia="DengXian"/>
+          <w:lang w:eastAsia="zh-CN"/>
+        </w:rPr>
+        <w:br w:type="page"/>
+      </w:r>
+    </w:p>
+    <w:p>
+      <w:pPr>
+        <w:pStyle w:val="1"/>
+        <w:rPr>
+          <w:rFonts w:eastAsia="DengXian"/>
+        </w:rPr>
+      </w:pPr>
+      <w:bookmarkStart w:id="3" w:name="_Toc230716412"/>
+      <w:proofErr w:type="gramStart"/>
+      <w:r>
+        <w:rPr>
+          <w:rFonts w:ascii="DengXian" w:eastAsia="新細明體" w:hAnsi="DengXian" w:hint="eastAsia"/>
+        </w:rPr>
+        <w:lastRenderedPageBreak/>
+        <w:t>攝像頭</w:t>
+      </w:r>
+      <w:proofErr w:type="gramEnd"/>
+      <w:r>
+        <w:rPr>
+          <w:rFonts w:ascii="DengXian" w:eastAsia="新細明體" w:hAnsi="DengXian" w:hint="eastAsia"/>
+        </w:rPr>
+        <w:t>權限</w:t>
+      </w:r>
+      <w:bookmarkEnd w:id="3"/>
+    </w:p>
+    <w:p>
+      <w:pPr>
+        <w:rPr>
+          <w:rFonts w:eastAsia="DengXian"/>
+        </w:rPr>
+      </w:pPr>
+      <w:r>
+        <w:rPr>
+          <w:rFonts w:ascii="Segoe UI Emoji" w:eastAsia="DengXian" w:hAnsi="Segoe UI Emoji" w:cs="Segoe UI Emoji"/>
+        </w:rPr>
+        <w:t>🛠️</w:t>
+      </w:r>
+      <w:r>
+        <w:rPr>
+          <w:rFonts w:eastAsia="新細明體"/>
+        </w:rPr>
+        <w:t xml:space="preserve"> </w:t>
+      </w:r>
+      <w:r>
+        <w:rPr>
+          <w:rFonts w:eastAsia="新細明體" w:hint="eastAsia"/>
+        </w:rPr>
+        <w:t>第一步：調整系統底層權限（最常見原因）</w:t>
+      </w:r>
+    </w:p>
+    <w:p>
+      <w:pPr>
+        <w:rPr>
+          <w:rFonts w:eastAsia="DengXian"/>
+        </w:rPr>
+      </w:pPr>
+      <w:r>
+        <w:rPr>
           <w:rFonts w:ascii="Segoe UI Emoji" w:eastAsia="DengXian" w:hAnsi="Segoe UI Emoji" w:cs="Segoe UI Emoji"/>
           <w:highlight w:val="yellow"/>
         </w:rPr>
@@ -1804,10 +2268,31 @@
       </w:r>
       <w:r>
         <w:rPr>
-          <w:rFonts w:eastAsia="DengXian"/>
+          <w:rFonts w:eastAsia="新細明體"/>
           <w:highlight w:val="yellow"/>
         </w:rPr>
-        <w:t xml:space="preserve"> 第二步：檢查網頁的「安全連線協議 (HTTPS)」</w:t>
+        <w:t xml:space="preserve"> </w:t>
+      </w:r>
+      <w:r>
+        <w:rPr>
+          <w:rFonts w:eastAsia="新細明體" w:hint="eastAsia"/>
+          <w:highlight w:val="yellow"/>
+        </w:rPr>
+        <w:t>第二步：檢查網頁的「安全連線協議</w:t>
+      </w:r>
+      <w:r>
+        <w:rPr>
+          <w:rFonts w:eastAsia="新細明體"/>
+          <w:highlight w:val="yellow"/>
+        </w:rPr>
+        <w:t xml:space="preserve"> (HTTPS)</w:t>
+      </w:r>
+      <w:r>
+        <w:rPr>
+          <w:rFonts w:eastAsia="新細明體" w:hint="eastAsia"/>
+          <w:highlight w:val="yellow"/>
+        </w:rPr>
+        <w:t>」</w:t>
       </w:r>
     </w:p>
     <w:p>
@@ -1824,9 +2309,15 @@
       </w:r>
       <w:r>
         <w:rPr>
-          <w:rFonts w:eastAsia="DengXian"/>
-        </w:rPr>
-        <w:t xml:space="preserve"> 第三步：實體硬體與驅動程式排查</w:t>
+          <w:rFonts w:eastAsia="新細明體"/>
+        </w:rPr>
+        <w:t xml:space="preserve"> </w:t>
+      </w:r>
+      <w:r>
+        <w:rPr>
+          <w:rFonts w:eastAsia="新細明體" w:hint="eastAsia"/>
+        </w:rPr>
+        <w:t>第三步：實體硬體與驅動程式排查</w:t>
       </w:r>
     </w:p>
     <w:p>
@@ -1857,7 +2348,7 @@
                     <pic:cNvPicPr/>
                   </pic:nvPicPr>
                   <pic:blipFill>
-                    <a:blip r:embed="rId9"/>
+                    <a:blip r:embed="rId12"/>
                     <a:stretch>
                       <a:fillRect/>
                     </a:stretch>
@@ -1906,7 +2397,7 @@
                     <pic:cNvPicPr/>
                   </pic:nvPicPr>
                   <pic:blipFill>
-                    <a:blip r:embed="rId10"/>
+                    <a:blip r:embed="rId13"/>
                     <a:stretch>
                       <a:fillRect/>
                     </a:stretch>
@@ -1955,7 +2446,7 @@
                     <pic:cNvPicPr/>
                   </pic:nvPicPr>
                   <pic:blipFill>
-                    <a:blip r:embed="rId11"/>
+                    <a:blip r:embed="rId14"/>
                     <a:stretch>
                       <a:fillRect/>
                     </a:stretch>
@@ -2005,7 +2496,7 @@
                     <pic:cNvPicPr/>
                   </pic:nvPicPr>
                   <pic:blipFill>
-                    <a:blip r:embed="rId12"/>
+                    <a:blip r:embed="rId15"/>
                     <a:stretch>
                       <a:fillRect/>
                     </a:stretch>
@@ -2054,7 +2545,7 @@
                     <pic:cNvPicPr/>
                   </pic:nvPicPr>
                   <pic:blipFill>
-                    <a:blip r:embed="rId13"/>
+                    <a:blip r:embed="rId16"/>
                     <a:stretch>
                       <a:fillRect/>
                     </a:stretch>
@@ -2099,25 +2590,24 @@
         <w:pStyle w:val="1"/>
         <w:rPr>
           <w:rFonts w:ascii="DengXian" w:eastAsia="DengXian" w:hAnsi="DengXian"/>
-          <w:lang w:eastAsia="zh-CN"/>
-        </w:rPr>
-      </w:pPr>
-      <w:bookmarkStart w:id="2" w:name="_Toc230653780"/>
-      <w:r>
-        <w:rPr>
-          <w:rFonts w:ascii="DengXian" w:eastAsia="DengXian" w:hAnsi="DengXian" w:hint="eastAsia"/>
-          <w:lang w:eastAsia="zh-CN"/>
+        </w:rPr>
+      </w:pPr>
+      <w:bookmarkStart w:id="4" w:name="_Toc230716413"/>
+      <w:proofErr w:type="gramStart"/>
+      <w:r>
+        <w:rPr>
+          <w:rFonts w:ascii="DengXian" w:eastAsia="新細明體" w:hAnsi="DengXian" w:hint="eastAsia"/>
         </w:rPr>
         <w:lastRenderedPageBreak/>
-        <w:t>显卡设定</w:t>
-      </w:r>
-      <w:bookmarkEnd w:id="2"/>
+        <w:t>顯卡設定</w:t>
+      </w:r>
+      <w:bookmarkEnd w:id="4"/>
+      <w:proofErr w:type="gramEnd"/>
     </w:p>
     <w:p>
       <w:pPr>
         <w:rPr>
           <w:rFonts w:eastAsia="DengXian"/>
-          <w:lang w:eastAsia="zh-CN"/>
         </w:rPr>
       </w:pPr>
       <w:r>
@@ -2140,7 +2630,7 @@
                     <pic:cNvPicPr/>
                   </pic:nvPicPr>
                   <pic:blipFill>
-                    <a:blip r:embed="rId14"/>
+                    <a:blip r:embed="rId17"/>
                     <a:stretch>
                       <a:fillRect/>
                     </a:stretch>
@@ -2186,7 +2676,7 @@
                     <pic:cNvPicPr/>
                   </pic:nvPicPr>
                   <pic:blipFill>
-                    <a:blip r:embed="rId15"/>
+                    <a:blip r:embed="rId18"/>
                     <a:stretch>
                       <a:fillRect/>
                     </a:stretch>
@@ -2212,34 +2702,80 @@
         <w:jc w:val="left"/>
         <w:rPr>
           <w:rFonts w:eastAsia="DengXian"/>
-          <w:lang w:eastAsia="zh-CN"/>
-        </w:rPr>
-      </w:pPr>
-      <w:r>
+        </w:rPr>
+      </w:pPr>
+      <w:r>
+        <w:rPr>
+          <w:rFonts w:eastAsia="DengXian"/>
+        </w:rPr>
+        <w:br w:type="page"/>
+      </w:r>
+    </w:p>
+    <w:p>
+      <w:pPr>
+        <w:pStyle w:val="1"/>
+      </w:pPr>
+      <w:bookmarkStart w:id="5" w:name="_Toc230716414"/>
+      <w:r>
+        <w:rPr>
+          <w:rFonts w:ascii="DengXian" w:eastAsia="新細明體" w:hAnsi="DengXian" w:hint="eastAsia"/>
+        </w:rPr>
+        <w:lastRenderedPageBreak/>
+        <w:t>安裝指令</w:t>
+      </w:r>
+      <w:bookmarkEnd w:id="5"/>
+    </w:p>
+    <w:p>
+      <w:pPr>
+        <w:jc w:val="left"/>
+        <w:rPr>
+          <w:rFonts w:eastAsia="DengXian"/>
+        </w:rPr>
+      </w:pPr>
+      <w:r>
+        <w:rPr>
+          <w:rFonts w:eastAsia="新細明體"/>
+        </w:rPr>
+        <w:t xml:space="preserve"># </w:t>
+      </w:r>
+      <w:r>
+        <w:rPr>
+          <w:rFonts w:eastAsia="新細明體" w:hint="eastAsia"/>
+        </w:rPr>
+        <w:t>安裝路由</w:t>
+      </w:r>
+    </w:p>
+    <w:p>
+      <w:pPr>
+        <w:ind w:firstLine="480"/>
+        <w:jc w:val="left"/>
         <w:rPr>
           <w:rFonts w:eastAsia="DengXian"/>
           <w:lang w:eastAsia="zh-CN"/>
         </w:rPr>
-        <w:br w:type="page"/>
-      </w:r>
-    </w:p>
-    <w:p>
-      <w:pPr>
-        <w:pStyle w:val="1"/>
-        <w:rPr>
-          <w:lang w:eastAsia="zh-CN"/>
-        </w:rPr>
-      </w:pPr>
-      <w:bookmarkStart w:id="3" w:name="_Toc230653781"/>
-      <w:r>
-        <w:rPr>
-          <w:rFonts w:ascii="DengXian" w:eastAsia="DengXian" w:hAnsi="DengXian" w:hint="eastAsia"/>
-          <w:lang w:eastAsia="zh-CN"/>
-        </w:rPr>
-        <w:lastRenderedPageBreak/>
-        <w:t>安装指令</w:t>
-      </w:r>
-      <w:bookmarkEnd w:id="3"/>
+      </w:pPr>
+      <w:proofErr w:type="spellStart"/>
+      <w:r>
+        <w:rPr>
+          <w:rFonts w:eastAsia="新細明體"/>
+        </w:rPr>
+        <w:t>npm</w:t>
+      </w:r>
+      <w:proofErr w:type="spellEnd"/>
+      <w:r>
+        <w:rPr>
+          <w:rFonts w:eastAsia="新細明體"/>
+        </w:rPr>
+        <w:t xml:space="preserve"> install react-router-</w:t>
+      </w:r>
+      <w:proofErr w:type="spellStart"/>
+      <w:r>
+        <w:rPr>
+          <w:rFonts w:eastAsia="新細明體"/>
+        </w:rPr>
+        <w:t>dom</w:t>
+      </w:r>
+      <w:proofErr w:type="spellEnd"/>
     </w:p>
     <w:p>
       <w:pPr>
@@ -2251,259 +2787,216 @@
       </w:pPr>
       <w:r>
         <w:rPr>
+          <w:rFonts w:eastAsia="新細明體"/>
+        </w:rPr>
+        <w:t xml:space="preserve"># </w:t>
+      </w:r>
+      <w:r>
+        <w:rPr>
+          <w:rFonts w:eastAsia="新細明體" w:hint="eastAsia"/>
+        </w:rPr>
+        <w:t>安裝前端</w:t>
+      </w:r>
+      <w:r>
+        <w:rPr>
+          <w:rFonts w:eastAsia="新細明體"/>
+        </w:rPr>
+        <w:t xml:space="preserve"> Socket </w:t>
+      </w:r>
+      <w:r>
+        <w:rPr>
+          <w:rFonts w:eastAsia="新細明體" w:hint="eastAsia"/>
+        </w:rPr>
+        <w:t>用戶端</w:t>
+      </w:r>
+      <w:r>
+        <w:rPr>
+          <w:rFonts w:eastAsia="DengXian"/>
+          <w:lang w:eastAsia="zh-CN"/>
+        </w:rPr>
+        <w:t xml:space="preserve"> </w:t>
+      </w:r>
+    </w:p>
+    <w:p>
+      <w:pPr>
+        <w:ind w:firstLine="480"/>
+        <w:jc w:val="left"/>
+        <w:rPr>
+          <w:rFonts w:eastAsia="DengXian"/>
+          <w:lang w:eastAsia="zh-CN"/>
+        </w:rPr>
+      </w:pPr>
+      <w:proofErr w:type="spellStart"/>
+      <w:r>
+        <w:rPr>
+          <w:rFonts w:eastAsia="新細明體"/>
+        </w:rPr>
+        <w:t>npm</w:t>
+      </w:r>
+      <w:proofErr w:type="spellEnd"/>
+      <w:r>
+        <w:rPr>
+          <w:rFonts w:eastAsia="新細明體"/>
+        </w:rPr>
+        <w:t xml:space="preserve"> install socket.io-client</w:t>
+      </w:r>
+    </w:p>
+    <w:p>
+      <w:pPr>
+        <w:jc w:val="left"/>
+        <w:rPr>
+          <w:rFonts w:eastAsia="DengXian"/>
+          <w:lang w:eastAsia="zh-CN"/>
+        </w:rPr>
+      </w:pPr>
+      <w:r>
+        <w:rPr>
+          <w:rFonts w:eastAsia="新細明體"/>
+        </w:rPr>
+        <w:t xml:space="preserve"># </w:t>
+      </w:r>
+      <w:r>
+        <w:rPr>
+          <w:rFonts w:eastAsia="新細明體" w:hint="eastAsia"/>
+        </w:rPr>
+        <w:t>安裝後端伺服器套件（用來當兩台裝置的郵差）</w:t>
+      </w:r>
+      <w:r>
+        <w:rPr>
+          <w:rFonts w:eastAsia="DengXian"/>
+          <w:lang w:eastAsia="zh-CN"/>
+        </w:rPr>
+        <w:t xml:space="preserve"> </w:t>
+      </w:r>
+    </w:p>
+    <w:p>
+      <w:pPr>
+        <w:ind w:firstLine="480"/>
+        <w:jc w:val="left"/>
+        <w:rPr>
+          <w:rFonts w:eastAsia="DengXian"/>
+          <w:lang w:eastAsia="zh-CN"/>
+        </w:rPr>
+      </w:pPr>
+      <w:proofErr w:type="spellStart"/>
+      <w:r>
+        <w:rPr>
+          <w:rFonts w:eastAsia="新細明體"/>
+        </w:rPr>
+        <w:t>npm</w:t>
+      </w:r>
+      <w:proofErr w:type="spellEnd"/>
+      <w:r>
+        <w:rPr>
+          <w:rFonts w:eastAsia="新細明體"/>
+        </w:rPr>
+        <w:t xml:space="preserve"> install express socket.io</w:t>
+      </w:r>
+    </w:p>
+    <w:p>
+      <w:pPr>
+        <w:jc w:val="left"/>
+      </w:pPr>
+      <w:r>
+        <w:rPr>
+          <w:rFonts w:asciiTheme="minorEastAsia" w:hAnsiTheme="minorEastAsia"/>
+        </w:rPr>
+        <w:t xml:space="preserve"># </w:t>
+      </w:r>
+      <w:r>
+        <w:rPr>
+          <w:rFonts w:asciiTheme="minorEastAsia" w:hAnsiTheme="minorEastAsia" w:hint="eastAsia"/>
+        </w:rPr>
+        <w:t>啟動伺服器</w:t>
+      </w:r>
+    </w:p>
+    <w:p>
+      <w:pPr>
+        <w:jc w:val="left"/>
+        <w:rPr>
+          <w:rFonts w:eastAsia="DengXian"/>
+          <w:lang w:eastAsia="zh-CN"/>
+        </w:rPr>
+      </w:pPr>
+      <w:r>
+        <w:tab/>
+      </w:r>
+      <w:r>
+        <w:t>node server.js</w:t>
+      </w:r>
+    </w:p>
+    <w:p>
+      <w:pPr>
+        <w:jc w:val="left"/>
+        <w:rPr>
+          <w:rFonts w:eastAsia="DengXian"/>
+          <w:lang w:eastAsia="zh-CN"/>
+        </w:rPr>
+      </w:pPr>
+      <w:r>
+        <w:rPr>
+          <w:rFonts w:eastAsia="新細明體"/>
+        </w:rPr>
+        <w:t xml:space="preserve"># </w:t>
+      </w:r>
+      <w:r>
+        <w:rPr>
+          <w:rFonts w:eastAsia="新細明體" w:hint="eastAsia"/>
+        </w:rPr>
+        <w:t>第三方音效庫（新增</w:t>
+      </w:r>
+      <w:r>
+        <w:rPr>
+          <w:rFonts w:eastAsia="新細明體"/>
+        </w:rPr>
+        <w:t xml:space="preserve"> howler </w:t>
+      </w:r>
+      <w:r>
+        <w:rPr>
+          <w:rFonts w:eastAsia="新細明體" w:hint="eastAsia"/>
+        </w:rPr>
+        <w:t>套件依賴）</w:t>
+      </w:r>
+    </w:p>
+    <w:p>
+      <w:pPr>
+        <w:jc w:val="left"/>
+        <w:rPr>
           <w:rFonts w:eastAsia="DengXian" w:hint="eastAsia"/>
           <w:lang w:eastAsia="zh-CN"/>
         </w:rPr>
-        <w:t xml:space="preserve"># </w:t>
-      </w:r>
-      <w:r>
-        <w:rPr>
-          <w:rFonts w:eastAsia="DengXian"/>
-          <w:lang w:eastAsia="zh-CN"/>
-        </w:rPr>
-        <w:t>安裝路由</w:t>
-      </w:r>
-    </w:p>
-    <w:p>
-      <w:pPr>
-        <w:ind w:firstLine="480"/>
-        <w:jc w:val="left"/>
-        <w:rPr>
-          <w:rFonts w:eastAsia="DengXian"/>
-          <w:lang w:eastAsia="zh-CN"/>
-        </w:rPr>
-      </w:pPr>
+      </w:pPr>
+      <w:r>
+        <w:rPr>
+          <w:rFonts w:eastAsia="新細明體"/>
+        </w:rPr>
+        <w:tab/>
+      </w:r>
       <w:proofErr w:type="spellStart"/>
       <w:r>
         <w:rPr>
-          <w:rFonts w:eastAsia="DengXian"/>
-          <w:lang w:eastAsia="zh-CN"/>
+          <w:rFonts w:eastAsia="新細明體"/>
         </w:rPr>
         <w:t>npm</w:t>
       </w:r>
       <w:proofErr w:type="spellEnd"/>
       <w:r>
         <w:rPr>
-          <w:rFonts w:eastAsia="DengXian"/>
-          <w:lang w:eastAsia="zh-CN"/>
-        </w:rPr>
-        <w:t xml:space="preserve"> install react-router-</w:t>
+          <w:rFonts w:eastAsia="新細明體"/>
+        </w:rPr>
+        <w:t xml:space="preserve"> </w:t>
       </w:r>
       <w:proofErr w:type="spellStart"/>
       <w:r>
         <w:rPr>
-          <w:rFonts w:eastAsia="DengXian"/>
-          <w:lang w:eastAsia="zh-CN"/>
-        </w:rPr>
-        <w:t>dom</w:t>
+          <w:rFonts w:eastAsia="新細明體"/>
+        </w:rPr>
+        <w:t>i</w:t>
       </w:r>
       <w:proofErr w:type="spellEnd"/>
-    </w:p>
-    <w:p>
-      <w:pPr>
-        <w:jc w:val="left"/>
-        <w:rPr>
-          <w:rFonts w:eastAsia="DengXian"/>
-          <w:lang w:eastAsia="zh-CN"/>
-        </w:rPr>
-      </w:pPr>
-      <w:r>
-        <w:rPr>
-          <w:rFonts w:eastAsia="DengXian"/>
-          <w:lang w:eastAsia="zh-CN"/>
-        </w:rPr>
-        <w:t xml:space="preserve"># 安裝前端 Socket 用戶端 </w:t>
-      </w:r>
-    </w:p>
-    <w:p>
-      <w:pPr>
-        <w:ind w:firstLine="480"/>
-        <w:jc w:val="left"/>
-        <w:rPr>
-          <w:rFonts w:eastAsia="DengXian"/>
-          <w:lang w:eastAsia="zh-CN"/>
-        </w:rPr>
-      </w:pPr>
-      <w:proofErr w:type="spellStart"/>
-      <w:r>
-        <w:rPr>
-          <w:rFonts w:eastAsia="DengXian"/>
-          <w:lang w:eastAsia="zh-CN"/>
-        </w:rPr>
-        <w:t>npm</w:t>
-      </w:r>
-      <w:proofErr w:type="spellEnd"/>
-      <w:r>
-        <w:rPr>
-          <w:rFonts w:eastAsia="DengXian"/>
-          <w:lang w:eastAsia="zh-CN"/>
-        </w:rPr>
-        <w:t xml:space="preserve"> install socket.io-client</w:t>
-      </w:r>
-    </w:p>
-    <w:p>
-      <w:pPr>
-        <w:jc w:val="left"/>
-        <w:rPr>
-          <w:rFonts w:eastAsia="DengXian"/>
-          <w:lang w:eastAsia="zh-CN"/>
-        </w:rPr>
-      </w:pPr>
-      <w:r>
-        <w:rPr>
-          <w:rFonts w:eastAsia="DengXian"/>
-          <w:lang w:eastAsia="zh-CN"/>
-        </w:rPr>
-        <w:t xml:space="preserve"># 安裝後端伺服器套件（用來當兩台裝置的郵差） </w:t>
-      </w:r>
-    </w:p>
-    <w:p>
-      <w:pPr>
-        <w:ind w:firstLine="480"/>
-        <w:jc w:val="left"/>
-        <w:rPr>
-          <w:rFonts w:eastAsia="DengXian"/>
-          <w:lang w:eastAsia="zh-CN"/>
-        </w:rPr>
-      </w:pPr>
-      <w:proofErr w:type="spellStart"/>
-      <w:r>
-        <w:rPr>
-          <w:rFonts w:eastAsia="DengXian"/>
-          <w:lang w:eastAsia="zh-CN"/>
-        </w:rPr>
-        <w:t>npm</w:t>
-      </w:r>
-      <w:proofErr w:type="spellEnd"/>
-      <w:r>
-        <w:rPr>
-          <w:rFonts w:eastAsia="DengXian"/>
-          <w:lang w:eastAsia="zh-CN"/>
-        </w:rPr>
-        <w:t xml:space="preserve"> install express socket.io</w:t>
-      </w:r>
-    </w:p>
-    <w:p>
-      <w:pPr>
-        <w:jc w:val="left"/>
-      </w:pPr>
-      <w:r>
-        <w:rPr>
-          <w:rFonts w:asciiTheme="minorEastAsia" w:hAnsiTheme="minorEastAsia" w:hint="eastAsia"/>
-        </w:rPr>
-        <w:t xml:space="preserve"># </w:t>
-      </w:r>
-      <w:r>
-        <w:rPr>
-          <w:rFonts w:asciiTheme="minorEastAsia" w:hAnsiTheme="minorEastAsia" w:hint="eastAsia"/>
-          <w:lang w:eastAsia="zh-CN"/>
-        </w:rPr>
-        <w:t>啟動伺服器</w:t>
-      </w:r>
-    </w:p>
-    <w:p>
-      <w:pPr>
-        <w:jc w:val="left"/>
-        <w:rPr>
-          <w:rFonts w:eastAsia="DengXian"/>
-          <w:lang w:eastAsia="zh-CN"/>
-        </w:rPr>
-      </w:pPr>
-      <w:r>
-        <w:tab/>
-      </w:r>
-      <w:r>
-        <w:t>node server.js</w:t>
-      </w:r>
-    </w:p>
-    <w:p>
-      <w:pPr>
-        <w:jc w:val="left"/>
-        <w:rPr>
-          <w:rFonts w:eastAsia="DengXian"/>
-          <w:lang w:eastAsia="zh-CN"/>
-        </w:rPr>
-      </w:pPr>
-      <w:r>
-        <w:rPr>
-          <w:rFonts w:eastAsia="DengXian" w:hint="eastAsia"/>
-          <w:lang w:eastAsia="zh-CN"/>
-        </w:rPr>
-        <w:t xml:space="preserve"># </w:t>
-      </w:r>
-      <w:r>
-        <w:rPr>
-          <w:rFonts w:eastAsia="DengXian"/>
-          <w:lang w:eastAsia="zh-CN"/>
-        </w:rPr>
-        <w:t>第三方音效庫</w:t>
-      </w:r>
-      <w:r>
-        <w:rPr>
-          <w:rFonts w:eastAsia="DengXian" w:hint="eastAsia"/>
-          <w:lang w:eastAsia="zh-CN"/>
-        </w:rPr>
-        <w:t>（</w:t>
-      </w:r>
-      <w:r>
-        <w:rPr>
-          <w:rFonts w:eastAsia="DengXian"/>
-          <w:lang w:eastAsia="zh-CN"/>
-        </w:rPr>
-        <w:t>新增 howler 套件依賴</w:t>
-      </w:r>
-      <w:r>
-        <w:rPr>
-          <w:rFonts w:eastAsia="DengXian" w:hint="eastAsia"/>
-          <w:lang w:eastAsia="zh-CN"/>
-        </w:rPr>
-        <w:t>）</w:t>
-      </w:r>
-    </w:p>
-    <w:p>
-      <w:pPr>
-        <w:jc w:val="left"/>
-        <w:rPr>
-          <w:rFonts w:eastAsia="DengXian" w:hint="eastAsia"/>
-          <w:lang w:eastAsia="zh-CN"/>
-        </w:rPr>
-      </w:pPr>
-      <w:r>
-        <w:rPr>
-          <w:rFonts w:eastAsia="DengXian"/>
-          <w:lang w:eastAsia="zh-CN"/>
-        </w:rPr>
-        <w:tab/>
-      </w:r>
-      <w:proofErr w:type="spellStart"/>
-      <w:r>
-        <w:rPr>
-          <w:rFonts w:eastAsia="DengXian"/>
-          <w:lang w:eastAsia="zh-CN"/>
-        </w:rPr>
-        <w:t>npm</w:t>
-      </w:r>
-      <w:proofErr w:type="spellEnd"/>
-      <w:r>
-        <w:rPr>
-          <w:rFonts w:eastAsia="DengXian"/>
-          <w:lang w:eastAsia="zh-CN"/>
-        </w:rPr>
-        <w:t xml:space="preserve"> </w:t>
-      </w:r>
-      <w:proofErr w:type="spellStart"/>
-      <w:r>
-        <w:rPr>
-          <w:rFonts w:eastAsia="DengXian"/>
-          <w:lang w:eastAsia="zh-CN"/>
-        </w:rPr>
-        <w:t>i</w:t>
-      </w:r>
-      <w:proofErr w:type="spellEnd"/>
-      <w:r>
-        <w:rPr>
-          <w:rFonts w:eastAsia="DengXian"/>
-          <w:lang w:eastAsia="zh-CN"/>
+      <w:r>
+        <w:rPr>
+          <w:rFonts w:eastAsia="新細明體"/>
         </w:rPr>
         <w:t xml:space="preserve"> howler</w:t>
       </w:r>
@@ -2536,7 +3029,7 @@
                     <pic:cNvPicPr/>
                   </pic:nvPicPr>
                   <pic:blipFill>
-                    <a:blip r:embed="rId16"/>
+                    <a:blip r:embed="rId19"/>
                     <a:stretch>
                       <a:fillRect/>
                     </a:stretch>
@@ -2578,16 +3071,15 @@
           <w:lang w:eastAsia="zh-CN"/>
         </w:rPr>
       </w:pPr>
-      <w:bookmarkStart w:id="4" w:name="_Toc230653782"/>
+      <w:bookmarkStart w:id="6" w:name="_Toc230716415"/>
       <w:r>
         <w:rPr>
           <w:rFonts w:hint="eastAsia"/>
-          <w:lang w:eastAsia="zh-CN"/>
         </w:rPr>
         <w:lastRenderedPageBreak/>
         <w:t>伺服器</w:t>
       </w:r>
-      <w:bookmarkEnd w:id="4"/>
+      <w:bookmarkEnd w:id="6"/>
     </w:p>
     <w:p>
       <w:pPr>
@@ -2619,7 +3111,7 @@
                     <pic:cNvPicPr/>
                   </pic:nvPicPr>
                   <pic:blipFill>
-                    <a:blip r:embed="rId17"/>
+                    <a:blip r:embed="rId20"/>
                     <a:stretch>
                       <a:fillRect/>
                     </a:stretch>
@@ -2652,12 +3144,19 @@
       </w:pPr>
       <w:r>
         <w:rPr>
-          <w:rFonts w:eastAsia="DengXian"/>
+          <w:rFonts w:eastAsia="新細明體" w:hint="eastAsia"/>
           <w:b/>
           <w:bCs/>
-          <w:lang w:eastAsia="zh-CN"/>
-        </w:rPr>
-        <w:t>第一步：畫面拆分 (React Router)</w:t>
+        </w:rPr>
+        <w:t>第一步：畫面拆分</w:t>
+      </w:r>
+      <w:r>
+        <w:rPr>
+          <w:rFonts w:eastAsia="新細明體"/>
+          <w:b/>
+          <w:bCs/>
+        </w:rPr>
+        <w:t xml:space="preserve"> (React Router)</w:t>
       </w:r>
     </w:p>
     <w:p>
@@ -2670,26 +3169,41 @@
       </w:pPr>
       <w:r>
         <w:rPr>
-          <w:rFonts w:eastAsia="DengXian"/>
-          <w:lang w:eastAsia="zh-CN"/>
-        </w:rPr>
-        <w:t xml:space="preserve">引入 </w:t>
-      </w:r>
-      <w:r>
-        <w:rPr>
-          <w:rFonts w:eastAsia="DengXian"/>
+          <w:rFonts w:eastAsia="新細明體" w:hint="eastAsia"/>
+        </w:rPr>
+        <w:t>引入</w:t>
+      </w:r>
+      <w:r>
+        <w:rPr>
+          <w:rFonts w:eastAsia="新細明體"/>
+        </w:rPr>
+        <w:t xml:space="preserve"> </w:t>
+      </w:r>
+      <w:r>
+        <w:rPr>
+          <w:rFonts w:eastAsia="新細明體"/>
           <w:b/>
           <w:bCs/>
-          <w:lang w:eastAsia="zh-CN"/>
         </w:rPr>
         <w:t>React Router</w:t>
       </w:r>
       <w:r>
         <w:rPr>
-          <w:rFonts w:eastAsia="DengXian"/>
-          <w:lang w:eastAsia="zh-CN"/>
-        </w:rPr>
-        <w:t>，讓你的專案透過「不同的網址」來決定要顯示哪一個畫面。 例如：</w:t>
+          <w:rFonts w:eastAsia="新細明體" w:hint="eastAsia"/>
+        </w:rPr>
+        <w:t>，讓你的專案透過「不同的網址」來決定要顯示哪一個畫面。</w:t>
+      </w:r>
+      <w:r>
+        <w:rPr>
+          <w:rFonts w:eastAsia="新細明體"/>
+        </w:rPr>
+        <w:t xml:space="preserve"> </w:t>
+      </w:r>
+      <w:r>
+        <w:rPr>
+          <w:rFonts w:eastAsia="新細明體" w:hint="eastAsia"/>
+        </w:rPr>
+        <w:t>例如：</w:t>
       </w:r>
     </w:p>
     <w:p>
@@ -2706,27 +3220,31 @@
       </w:pPr>
       <w:r>
         <w:rPr>
+          <w:rFonts w:eastAsia="新細明體" w:hint="eastAsia"/>
+        </w:rPr>
+        <w:t>在大螢幕瀏覽器輸入：</w:t>
+      </w:r>
+    </w:p>
+    <w:p>
+      <w:pPr>
+        <w:ind w:left="720"/>
+        <w:jc w:val="left"/>
+        <w:rPr>
           <w:rFonts w:eastAsia="DengXian"/>
           <w:lang w:eastAsia="zh-CN"/>
         </w:rPr>
-        <w:t>在大螢幕瀏覽器輸入：</w:t>
-      </w:r>
-    </w:p>
-    <w:p>
-      <w:pPr>
-        <w:ind w:left="720"/>
-        <w:jc w:val="left"/>
-        <w:rPr>
-          <w:rFonts w:eastAsia="DengXian"/>
-          <w:lang w:eastAsia="zh-CN"/>
-        </w:rPr>
-      </w:pPr>
-      <w:r>
-        <w:rPr>
-          <w:rFonts w:eastAsia="DengXian"/>
-          <w:lang w:eastAsia="zh-CN"/>
-        </w:rPr>
-        <w:t>http://localhost:5173/monitor（只載入上半部的臉部追蹤與掉落動畫）</w:t>
+      </w:pPr>
+      <w:r>
+        <w:rPr>
+          <w:rFonts w:eastAsia="新細明體"/>
+        </w:rPr>
+        <w:t>http://localhost:5173/monitor</w:t>
+      </w:r>
+      <w:r>
+        <w:rPr>
+          <w:rFonts w:eastAsia="新細明體" w:hint="eastAsia"/>
+        </w:rPr>
+        <w:t>（只載入上半部的臉部追蹤與掉落動畫）</w:t>
       </w:r>
     </w:p>
     <w:p>
@@ -2742,24 +3260,42 @@
       </w:pPr>
       <w:r>
         <w:rPr>
+          <w:rFonts w:eastAsia="新細明體" w:hint="eastAsia"/>
+        </w:rPr>
+        <w:t>在平板瀏覽器輸入：</w:t>
+      </w:r>
+    </w:p>
+    <w:p>
+      <w:pPr>
+        <w:ind w:left="720"/>
+        <w:jc w:val="left"/>
+        <w:rPr>
           <w:rFonts w:eastAsia="DengXian"/>
         </w:rPr>
-        <w:t>在平板瀏覽器輸入：</w:t>
-      </w:r>
-    </w:p>
-    <w:p>
-      <w:pPr>
-        <w:ind w:left="720"/>
-        <w:jc w:val="left"/>
-        <w:rPr>
-          <w:rFonts w:eastAsia="DengXian"/>
-        </w:rPr>
-      </w:pPr>
-      <w:r>
-        <w:rPr>
-          <w:rFonts w:eastAsia="DengXian"/>
-        </w:rPr>
-        <w:t>http://localhost:5173/tablet（只載入下半部的選單 UI 與寶石水池）</w:t>
+      </w:pPr>
+      <w:r>
+        <w:rPr>
+          <w:rFonts w:eastAsia="新細明體"/>
+        </w:rPr>
+        <w:t>http://localhost:5173/tablet</w:t>
+      </w:r>
+      <w:r>
+        <w:rPr>
+          <w:rFonts w:eastAsia="新細明體" w:hint="eastAsia"/>
+        </w:rPr>
+        <w:t>（只載入下半部的選單</w:t>
+      </w:r>
+      <w:r>
+        <w:rPr>
+          <w:rFonts w:eastAsia="新細明體"/>
+        </w:rPr>
+        <w:t xml:space="preserve"> UI </w:t>
+      </w:r>
+      <w:r>
+        <w:rPr>
+          <w:rFonts w:eastAsia="新細明體" w:hint="eastAsia"/>
+        </w:rPr>
+        <w:t>與寶石水池）</w:t>
       </w:r>
     </w:p>
     <w:p>
@@ -2772,10 +3308,9 @@
       </w:pPr>
       <w:r>
         <w:rPr>
-          <w:rFonts w:eastAsia="DengXian"/>
+          <w:rFonts w:eastAsia="新細明體" w:hint="eastAsia"/>
           <w:b/>
           <w:bCs/>
-          <w:lang w:eastAsia="zh-CN"/>
         </w:rPr>
         <w:t>架構修改方式：</w:t>
       </w:r>
@@ -2794,32 +3329,28 @@
       </w:pPr>
       <w:r>
         <w:rPr>
-          <w:rFonts w:eastAsia="DengXian"/>
-          <w:lang w:eastAsia="zh-CN"/>
+          <w:rFonts w:eastAsia="新細明體" w:hint="eastAsia"/>
         </w:rPr>
         <w:t>安裝路由：</w:t>
       </w:r>
       <w:proofErr w:type="spellStart"/>
       <w:r>
         <w:rPr>
-          <w:rFonts w:eastAsia="DengXian"/>
-          <w:lang w:eastAsia="zh-CN"/>
+          <w:rFonts w:eastAsia="新細明體"/>
         </w:rPr>
         <w:t>npm</w:t>
       </w:r>
       <w:proofErr w:type="spellEnd"/>
       <w:r>
         <w:rPr>
-          <w:rFonts w:eastAsia="DengXian"/>
-          <w:lang w:eastAsia="zh-CN"/>
+          <w:rFonts w:eastAsia="新細明體"/>
         </w:rPr>
         <w:t xml:space="preserve"> install react-router-</w:t>
       </w:r>
       <w:proofErr w:type="spellStart"/>
       <w:r>
         <w:rPr>
-          <w:rFonts w:eastAsia="DengXian"/>
-          <w:lang w:eastAsia="zh-CN"/>
+          <w:rFonts w:eastAsia="新細明體"/>
         </w:rPr>
         <w:t>dom</w:t>
       </w:r>
@@ -2838,23 +3369,35 @@
       </w:pPr>
       <w:r>
         <w:rPr>
-          <w:rFonts w:eastAsia="DengXian"/>
-        </w:rPr>
-        <w:t xml:space="preserve">將原本的 </w:t>
+          <w:rFonts w:eastAsia="新細明體" w:hint="eastAsia"/>
+        </w:rPr>
+        <w:t>將原本的</w:t>
+      </w:r>
+      <w:r>
+        <w:rPr>
+          <w:rFonts w:eastAsia="新細明體"/>
+        </w:rPr>
+        <w:t xml:space="preserve"> </w:t>
       </w:r>
       <w:proofErr w:type="spellStart"/>
       <w:r>
         <w:rPr>
-          <w:rFonts w:eastAsia="DengXian"/>
+          <w:rFonts w:eastAsia="新細明體"/>
         </w:rPr>
         <w:t>App.jsx</w:t>
       </w:r>
       <w:proofErr w:type="spellEnd"/>
       <w:r>
         <w:rPr>
-          <w:rFonts w:eastAsia="DengXian"/>
-        </w:rPr>
-        <w:t xml:space="preserve"> 拆分成三個檔案：</w:t>
+          <w:rFonts w:eastAsia="新細明體"/>
+        </w:rPr>
+        <w:t xml:space="preserve"> </w:t>
+      </w:r>
+      <w:r>
+        <w:rPr>
+          <w:rFonts w:eastAsia="新細明體" w:hint="eastAsia"/>
+        </w:rPr>
+        <w:t>拆分成三個檔案：</w:t>
       </w:r>
     </w:p>
     <w:p>
@@ -2871,14 +3414,14 @@
       <w:proofErr w:type="spellStart"/>
       <w:r>
         <w:rPr>
-          <w:rFonts w:eastAsia="DengXian"/>
+          <w:rFonts w:eastAsia="新細明體"/>
         </w:rPr>
         <w:t>App.jsx</w:t>
       </w:r>
       <w:proofErr w:type="spellEnd"/>
       <w:r>
         <w:rPr>
-          <w:rFonts w:eastAsia="DengXian"/>
+          <w:rFonts w:eastAsia="新細明體" w:hint="eastAsia"/>
         </w:rPr>
         <w:t>（只負責設定路由路徑）</w:t>
       </w:r>
@@ -2898,18 +3441,28 @@
       <w:proofErr w:type="spellStart"/>
       <w:r>
         <w:rPr>
-          <w:rFonts w:eastAsia="DengXian"/>
-          <w:lang w:eastAsia="zh-CN"/>
+          <w:rFonts w:eastAsia="新細明體"/>
         </w:rPr>
         <w:t>MonitorView.jsx</w:t>
       </w:r>
       <w:proofErr w:type="spellEnd"/>
       <w:r>
         <w:rPr>
-          <w:rFonts w:eastAsia="DengXian"/>
-          <w:lang w:eastAsia="zh-CN"/>
-        </w:rPr>
-        <w:t>（原本畫面上半部鏡頭與 PIXI 的邏輯）</w:t>
+          <w:rFonts w:eastAsia="新細明體" w:hint="eastAsia"/>
+        </w:rPr>
+        <w:t>（原本畫面上半部鏡頭與</w:t>
+      </w:r>
+      <w:r>
+        <w:rPr>
+          <w:rFonts w:eastAsia="新細明體"/>
+        </w:rPr>
+        <w:t xml:space="preserve"> PIXI </w:t>
+      </w:r>
+      <w:r>
+        <w:rPr>
+          <w:rFonts w:eastAsia="新細明體" w:hint="eastAsia"/>
+        </w:rPr>
+        <w:t>的邏輯）</w:t>
       </w:r>
     </w:p>
     <w:p>
@@ -2927,27 +3480,49 @@
       <w:proofErr w:type="spellStart"/>
       <w:r>
         <w:rPr>
+          <w:rFonts w:eastAsia="新細明體"/>
+        </w:rPr>
+        <w:t>TabletView.jsx</w:t>
+      </w:r>
+      <w:proofErr w:type="spellEnd"/>
+      <w:r>
+        <w:rPr>
+          <w:rFonts w:eastAsia="新細明體" w:hint="eastAsia"/>
+        </w:rPr>
+        <w:t>（原本畫面下半部的</w:t>
+      </w:r>
+      <w:r>
+        <w:rPr>
+          <w:rFonts w:eastAsia="新細明體"/>
+        </w:rPr>
+        <w:t xml:space="preserve"> UI </w:t>
+      </w:r>
+      <w:r>
+        <w:rPr>
+          <w:rFonts w:eastAsia="新細明體" w:hint="eastAsia"/>
+        </w:rPr>
+        <w:t>按鈕與水池</w:t>
+      </w:r>
+      <w:r>
+        <w:rPr>
+          <w:rFonts w:eastAsia="新細明體"/>
+        </w:rPr>
+        <w:t xml:space="preserve"> PIXI </w:t>
+      </w:r>
+      <w:r>
+        <w:rPr>
+          <w:rFonts w:eastAsia="新細明體" w:hint="eastAsia"/>
+        </w:rPr>
+        <w:t>邏輯）</w:t>
+      </w:r>
+    </w:p>
+    <w:p>
+      <w:pPr>
+        <w:jc w:val="left"/>
+        <w:rPr>
           <w:rFonts w:eastAsia="DengXian"/>
           <w:lang w:eastAsia="zh-CN"/>
         </w:rPr>
-        <w:t>TabletView.jsx</w:t>
-      </w:r>
-      <w:proofErr w:type="spellEnd"/>
-      <w:r>
-        <w:rPr>
-          <w:rFonts w:eastAsia="DengXian"/>
-          <w:lang w:eastAsia="zh-CN"/>
-        </w:rPr>
-        <w:t>（原本畫面下半部的 UI 按鈕與水池 PIXI 邏輯）</w:t>
-      </w:r>
-    </w:p>
-    <w:p>
-      <w:pPr>
-        <w:jc w:val="left"/>
-        <w:rPr>
-          <w:rFonts w:eastAsia="DengXian"/>
-          <w:lang w:eastAsia="zh-CN"/>
-        </w:rPr>
       </w:pPr>
     </w:p>
     <w:p>
@@ -2959,148 +3534,300 @@
         </w:rPr>
       </w:pPr>
       <w:r>
+        <w:rPr>
+          <w:rFonts w:eastAsia="新細明體" w:hint="eastAsia"/>
+          <w:b/>
+          <w:bCs/>
+        </w:rPr>
+        <w:t>第二步：資料通訊</w:t>
+      </w:r>
+      <w:r>
+        <w:rPr>
+          <w:rFonts w:eastAsia="新細明體"/>
+          <w:b/>
+          <w:bCs/>
+        </w:rPr>
+        <w:t xml:space="preserve"> (Data Transmission)</w:t>
+      </w:r>
+      <w:proofErr w:type="gramStart"/>
+      <w:r>
+        <w:rPr>
+          <w:rFonts w:asciiTheme="minorEastAsia" w:hAnsiTheme="minorEastAsia" w:hint="eastAsia"/>
+          <w:b/>
+          <w:bCs/>
+        </w:rPr>
+        <w:t>——</w:t>
+      </w:r>
+      <w:proofErr w:type="gramEnd"/>
+      <w:r>
+        <w:rPr>
+          <w:rFonts w:asciiTheme="minorEastAsia" w:hAnsiTheme="minorEastAsia" w:hint="eastAsia"/>
+          <w:b/>
+          <w:bCs/>
+        </w:rPr>
+        <w:t>使用方案</w:t>
+      </w:r>
+      <w:r>
+        <w:rPr>
+          <w:rFonts w:asciiTheme="minorEastAsia" w:hAnsiTheme="minorEastAsia"/>
+          <w:b/>
+          <w:bCs/>
+        </w:rPr>
+        <w:t>B</w:t>
+      </w:r>
+    </w:p>
+    <w:p>
+      <w:pPr>
+        <w:jc w:val="left"/>
+        <w:rPr>
+          <w:rFonts w:eastAsia="DengXian"/>
+        </w:rPr>
+      </w:pPr>
+      <w:r>
+        <w:rPr>
+          <w:rFonts w:eastAsia="新細明體" w:hint="eastAsia"/>
+        </w:rPr>
+        <w:t>既然拆成了</w:t>
+      </w:r>
+      <w:proofErr w:type="gramStart"/>
+      <w:r>
+        <w:rPr>
+          <w:rFonts w:eastAsia="新細明體" w:hint="eastAsia"/>
+        </w:rPr>
+        <w:t>兩個頁</w:t>
+      </w:r>
+      <w:proofErr w:type="gramEnd"/>
+      <w:r>
+        <w:rPr>
+          <w:rFonts w:eastAsia="新細明體" w:hint="eastAsia"/>
+        </w:rPr>
+        <w:t>面，它們該怎麼溝通？</w:t>
+      </w:r>
+    </w:p>
+    <w:p>
+      <w:pPr>
+        <w:jc w:val="left"/>
+        <w:rPr>
+          <w:rFonts w:eastAsia="DengXian"/>
+        </w:rPr>
+      </w:pPr>
+      <w:proofErr w:type="gramStart"/>
+      <w:r>
+        <w:rPr>
+          <w:rFonts w:eastAsia="新細明體" w:hint="eastAsia"/>
+        </w:rPr>
+        <w:t>（</w:t>
+      </w:r>
+      <w:proofErr w:type="gramEnd"/>
+      <w:r>
+        <w:rPr>
+          <w:rFonts w:eastAsia="新細明體" w:hint="eastAsia"/>
+        </w:rPr>
+        <w:t>例如：平板按下了「</w:t>
+      </w:r>
+      <w:proofErr w:type="gramStart"/>
+      <w:r>
+        <w:rPr>
+          <w:rFonts w:eastAsia="新細明體" w:hint="eastAsia"/>
+        </w:rPr>
+        <w:t>盡情哭吧</w:t>
+      </w:r>
+      <w:proofErr w:type="gramEnd"/>
+      <w:r>
+        <w:rPr>
+          <w:rFonts w:eastAsia="新細明體"/>
+        </w:rPr>
+        <w:t xml:space="preserve"> GO</w:t>
+      </w:r>
+      <w:r>
+        <w:rPr>
+          <w:rFonts w:eastAsia="新細明體" w:hint="eastAsia"/>
+        </w:rPr>
+        <w:t>」，顯示器怎麼知道要</w:t>
+      </w:r>
+      <w:proofErr w:type="gramStart"/>
+      <w:r>
+        <w:rPr>
+          <w:rFonts w:eastAsia="新細明體" w:hint="eastAsia"/>
+        </w:rPr>
+        <w:t>開始掉字</w:t>
+      </w:r>
+      <w:proofErr w:type="gramEnd"/>
+      <w:r>
+        <w:rPr>
+          <w:rFonts w:eastAsia="新細明體" w:hint="eastAsia"/>
+        </w:rPr>
+        <w:t>？）</w:t>
+      </w:r>
+      <w:r>
+        <w:rPr>
+          <w:rFonts w:eastAsia="DengXian"/>
+        </w:rPr>
+        <w:t xml:space="preserve"> </w:t>
+      </w:r>
+    </w:p>
+    <w:p>
+      <w:pPr>
+        <w:jc w:val="left"/>
+        <w:rPr>
+          <w:rFonts w:eastAsia="DengXian"/>
+        </w:rPr>
+      </w:pPr>
+      <w:r>
+        <w:rPr>
+          <w:rFonts w:eastAsia="新細明體" w:hint="eastAsia"/>
+        </w:rPr>
+        <w:t>這裡有兩種解決方案，取決於你展場的</w:t>
+      </w:r>
+      <w:r>
+        <w:rPr>
+          <w:rFonts w:eastAsia="新細明體" w:hint="eastAsia"/>
+          <w:b/>
+          <w:bCs/>
+        </w:rPr>
+        <w:t>硬體配置</w:t>
+      </w:r>
+      <w:r>
+        <w:rPr>
+          <w:rFonts w:eastAsia="新細明體" w:hint="eastAsia"/>
+        </w:rPr>
+        <w:t>：</w:t>
+      </w:r>
+    </w:p>
+    <w:p>
+      <w:pPr>
+        <w:jc w:val="left"/>
         <w:rPr>
           <w:rFonts w:eastAsia="DengXian"/>
           <w:b/>
           <w:bCs/>
         </w:rPr>
-        <w:t>第二步：資料通訊 (Data Transmission)</w:t>
-      </w:r>
-      <w:r>
-        <w:rPr>
-          <w:rFonts w:asciiTheme="minorEastAsia" w:hAnsiTheme="minorEastAsia" w:hint="eastAsia"/>
-          <w:b/>
-          <w:bCs/>
-        </w:rPr>
-        <w:t>——使用方案B</w:t>
-      </w:r>
-    </w:p>
-    <w:p>
-      <w:pPr>
-        <w:jc w:val="left"/>
-        <w:rPr>
-          <w:rFonts w:eastAsia="DengXian"/>
-        </w:rPr>
-      </w:pPr>
-      <w:r>
-        <w:rPr>
-          <w:rFonts w:eastAsia="DengXian"/>
-        </w:rPr>
-        <w:t>既然拆成了兩個頁面，它們該怎麼溝通？</w:t>
-      </w:r>
-    </w:p>
-    <w:p>
-      <w:pPr>
-        <w:jc w:val="left"/>
-        <w:rPr>
-          <w:rFonts w:eastAsia="DengXian"/>
-        </w:rPr>
-      </w:pPr>
-      <w:r>
-        <w:rPr>
-          <w:rFonts w:eastAsia="DengXian"/>
-        </w:rPr>
-        <w:t xml:space="preserve">（例如：平板按下了「盡情哭吧 GO」，顯示器怎麼知道要開始掉字？） </w:t>
-      </w:r>
-    </w:p>
-    <w:p>
-      <w:pPr>
-        <w:jc w:val="left"/>
-        <w:rPr>
-          <w:rFonts w:eastAsia="DengXian"/>
-        </w:rPr>
-      </w:pPr>
-      <w:r>
-        <w:rPr>
-          <w:rFonts w:eastAsia="DengXian"/>
-        </w:rPr>
-        <w:t>這裡有兩種解決方案，取決於你展場的</w:t>
-      </w:r>
-      <w:r>
+      </w:pPr>
+    </w:p>
+    <w:p>
+      <w:pPr>
+        <w:jc w:val="left"/>
         <w:rPr>
           <w:rFonts w:eastAsia="DengXian"/>
           <w:b/>
           <w:bCs/>
         </w:rPr>
-        <w:t>硬體配置</w:t>
-      </w:r>
-      <w:r>
-        <w:rPr>
-          <w:rFonts w:eastAsia="DengXian"/>
-        </w:rPr>
-        <w:t>：</w:t>
-      </w:r>
-    </w:p>
-    <w:p>
-      <w:pPr>
-        <w:jc w:val="left"/>
-        <w:rPr>
-          <w:rFonts w:eastAsia="DengXian"/>
+      </w:pPr>
+      <w:r>
+        <w:rPr>
+          <w:rFonts w:eastAsia="新細明體" w:hint="eastAsia"/>
           <w:b/>
           <w:bCs/>
         </w:rPr>
-      </w:pPr>
-    </w:p>
-    <w:p>
-      <w:pPr>
-        <w:jc w:val="left"/>
-        <w:rPr>
-          <w:rFonts w:eastAsia="DengXian"/>
+        <w:t>方案</w:t>
+      </w:r>
+      <w:r>
+        <w:rPr>
+          <w:rFonts w:eastAsia="新細明體"/>
           <w:b/>
           <w:bCs/>
         </w:rPr>
-      </w:pPr>
-      <w:r>
-        <w:rPr>
-          <w:rFonts w:eastAsia="DengXian"/>
+        <w:t xml:space="preserve"> A</w:t>
+      </w:r>
+      <w:r>
+        <w:rPr>
+          <w:rFonts w:eastAsia="新細明體" w:hint="eastAsia"/>
           <w:b/>
           <w:bCs/>
         </w:rPr>
-        <w:t xml:space="preserve">方案 A：雙螢幕接在「同一台電腦」上 (使用 </w:t>
-      </w:r>
-      <w:proofErr w:type="spellStart"/>
-      <w:r>
-        <w:rPr>
-          <w:rFonts w:eastAsia="DengXian"/>
+        <w:t>：雙螢幕接在「同一台電腦」上</w:t>
+      </w:r>
+      <w:r>
+        <w:rPr>
+          <w:rFonts w:eastAsia="新細明體"/>
           <w:b/>
           <w:bCs/>
         </w:rPr>
-        <w:t>BroadcastChannel</w:t>
-      </w:r>
-      <w:proofErr w:type="spellEnd"/>
-      <w:r>
-        <w:rPr>
-          <w:rFonts w:eastAsia="DengXian"/>
+        <w:t xml:space="preserve"> (</w:t>
+      </w:r>
+      <w:r>
+        <w:rPr>
+          <w:rFonts w:eastAsia="新細明體" w:hint="eastAsia"/>
           <w:b/>
           <w:bCs/>
         </w:rPr>
-        <w:t xml:space="preserve"> API)</w:t>
-      </w:r>
-    </w:p>
-    <w:p>
-      <w:pPr>
-        <w:jc w:val="left"/>
-        <w:rPr>
-          <w:rFonts w:eastAsia="DengXian"/>
-        </w:rPr>
-      </w:pPr>
-      <w:r>
-        <w:rPr>
-          <w:rFonts w:eastAsia="DengXian"/>
-        </w:rPr>
-        <w:t>如果你的展場是使用一台效能較好的主機（如 Mac Macni 或 PC），同時外接兩個螢幕（一個掛牆上，一個平放當平板），這是</w:t>
-      </w:r>
-      <w:r>
-        <w:rPr>
-          <w:rFonts w:eastAsia="DengXian"/>
+        <w:t>使用</w:t>
+      </w:r>
+      <w:r>
+        <w:rPr>
+          <w:rFonts w:eastAsia="新細明體"/>
           <w:b/>
           <w:bCs/>
         </w:rPr>
+        <w:t xml:space="preserve"> </w:t>
+      </w:r>
+      <w:proofErr w:type="spellStart"/>
+      <w:r>
+        <w:rPr>
+          <w:rFonts w:eastAsia="新細明體"/>
+          <w:b/>
+          <w:bCs/>
+        </w:rPr>
+        <w:t>BroadcastChannel</w:t>
+      </w:r>
+      <w:proofErr w:type="spellEnd"/>
+      <w:r>
+        <w:rPr>
+          <w:rFonts w:eastAsia="新細明體"/>
+          <w:b/>
+          <w:bCs/>
+        </w:rPr>
+        <w:t xml:space="preserve"> API)</w:t>
+      </w:r>
+    </w:p>
+    <w:p>
+      <w:pPr>
+        <w:jc w:val="left"/>
+        <w:rPr>
+          <w:rFonts w:eastAsia="DengXian"/>
+        </w:rPr>
+      </w:pPr>
+      <w:r>
+        <w:rPr>
+          <w:rFonts w:eastAsia="新細明體" w:hint="eastAsia"/>
+        </w:rPr>
+        <w:t>如果你的展場是使用一台效能較好的主機（如</w:t>
+      </w:r>
+      <w:r>
+        <w:rPr>
+          <w:rFonts w:eastAsia="新細明體"/>
+        </w:rPr>
+        <w:t xml:space="preserve"> Mac Macni </w:t>
+      </w:r>
+      <w:r>
+        <w:rPr>
+          <w:rFonts w:eastAsia="新細明體" w:hint="eastAsia"/>
+        </w:rPr>
+        <w:t>或</w:t>
+      </w:r>
+      <w:r>
+        <w:rPr>
+          <w:rFonts w:eastAsia="新細明體"/>
+        </w:rPr>
+        <w:t xml:space="preserve"> PC</w:t>
+      </w:r>
+      <w:r>
+        <w:rPr>
+          <w:rFonts w:eastAsia="新細明體" w:hint="eastAsia"/>
+        </w:rPr>
+        <w:t>），同時外接兩個螢幕（一個掛牆上，一個平放當平板），這是</w:t>
+      </w:r>
+      <w:r>
+        <w:rPr>
+          <w:rFonts w:eastAsia="新細明體" w:hint="eastAsia"/>
+          <w:b/>
+          <w:bCs/>
+        </w:rPr>
         <w:t>最推薦且最簡單</w:t>
       </w:r>
       <w:r>
         <w:rPr>
-          <w:rFonts w:eastAsia="DengXian"/>
+          <w:rFonts w:eastAsia="新細明體" w:hint="eastAsia"/>
         </w:rPr>
         <w:t>的做法！</w:t>
       </w:r>
@@ -3115,26 +3842,49 @@
       </w:pPr>
       <w:r>
         <w:rPr>
-          <w:rFonts w:eastAsia="DengXian"/>
-          <w:lang w:eastAsia="zh-CN"/>
-        </w:rPr>
-        <w:t xml:space="preserve">不需要寫後端伺服器，直接利用瀏覽器內建的 </w:t>
+          <w:rFonts w:eastAsia="新細明體" w:hint="eastAsia"/>
+        </w:rPr>
+        <w:t>不需要寫後端伺服器，直接利用瀏覽器內建的</w:t>
+      </w:r>
+      <w:r>
+        <w:rPr>
+          <w:rFonts w:eastAsia="新細明體"/>
+        </w:rPr>
+        <w:t xml:space="preserve"> </w:t>
       </w:r>
       <w:proofErr w:type="spellStart"/>
       <w:r>
         <w:rPr>
-          <w:rFonts w:eastAsia="DengXian"/>
-          <w:lang w:eastAsia="zh-CN"/>
+          <w:rFonts w:eastAsia="新細明體"/>
         </w:rPr>
         <w:t>BroadcastChannel</w:t>
       </w:r>
       <w:proofErr w:type="spellEnd"/>
       <w:r>
         <w:rPr>
-          <w:rFonts w:eastAsia="DengXian"/>
-          <w:lang w:eastAsia="zh-CN"/>
-        </w:rPr>
-        <w:t xml:space="preserve"> 就能讓兩個分頁秒速溝通：</w:t>
+          <w:rFonts w:eastAsia="新細明體"/>
+        </w:rPr>
+        <w:t xml:space="preserve"> </w:t>
+      </w:r>
+      <w:r>
+        <w:rPr>
+          <w:rFonts w:eastAsia="新細明體" w:hint="eastAsia"/>
+        </w:rPr>
+        <w:t>就能讓兩個</w:t>
+      </w:r>
+      <w:proofErr w:type="gramStart"/>
+      <w:r>
+        <w:rPr>
+          <w:rFonts w:eastAsia="新細明體" w:hint="eastAsia"/>
+        </w:rPr>
+        <w:t>分頁秒速</w:t>
+      </w:r>
+      <w:proofErr w:type="gramEnd"/>
+      <w:r>
+        <w:rPr>
+          <w:rFonts w:eastAsia="新細明體" w:hint="eastAsia"/>
+        </w:rPr>
+        <w:t>溝通：</w:t>
       </w:r>
     </w:p>
     <w:p>
@@ -3167,7 +3917,7 @@
                     <pic:cNvPicPr/>
                   </pic:nvPicPr>
                   <pic:blipFill>
-                    <a:blip r:embed="rId18"/>
+                    <a:blip r:embed="rId21"/>
                     <a:stretch>
                       <a:fillRect/>
                     </a:stretch>
@@ -3222,7 +3972,7 @@
                     <pic:cNvPicPr/>
                   </pic:nvPicPr>
                   <pic:blipFill>
-                    <a:blip r:embed="rId19"/>
+                    <a:blip r:embed="rId22"/>
                     <a:stretch>
                       <a:fillRect/>
                     </a:stretch>
@@ -3255,12 +4005,51 @@
       </w:pPr>
       <w:r>
         <w:rPr>
-          <w:rFonts w:eastAsia="DengXian"/>
+          <w:rFonts w:eastAsia="新細明體" w:hint="eastAsia"/>
           <w:b/>
           <w:bCs/>
-          <w:lang w:eastAsia="zh-CN"/>
-        </w:rPr>
-        <w:t>方案 B：使用兩台「完全不同的實體設備」 (使用 WebSocket / Socket.io)</w:t>
+        </w:rPr>
+        <w:t>方案</w:t>
+      </w:r>
+      <w:r>
+        <w:rPr>
+          <w:rFonts w:eastAsia="新細明體"/>
+          <w:b/>
+          <w:bCs/>
+        </w:rPr>
+        <w:t xml:space="preserve"> B</w:t>
+      </w:r>
+      <w:r>
+        <w:rPr>
+          <w:rFonts w:eastAsia="新細明體" w:hint="eastAsia"/>
+          <w:b/>
+          <w:bCs/>
+        </w:rPr>
+        <w:t>：使用兩台「完全不同的實體設備」</w:t>
+      </w:r>
+      <w:r>
+        <w:rPr>
+          <w:rFonts w:eastAsia="新細明體"/>
+          <w:b/>
+          <w:bCs/>
+        </w:rPr>
+        <w:t xml:space="preserve"> (</w:t>
+      </w:r>
+      <w:r>
+        <w:rPr>
+          <w:rFonts w:eastAsia="新細明體" w:hint="eastAsia"/>
+          <w:b/>
+          <w:bCs/>
+        </w:rPr>
+        <w:t>使用</w:t>
+      </w:r>
+      <w:r>
+        <w:rPr>
+          <w:rFonts w:eastAsia="新細明體"/>
+          <w:b/>
+          <w:bCs/>
+        </w:rPr>
+        <w:t xml:space="preserve"> WebSocket / Socket.io)</w:t>
       </w:r>
     </w:p>
     <w:p>
@@ -3291,7 +4080,7 @@
                     <pic:cNvPicPr/>
                   </pic:nvPicPr>
                   <pic:blipFill>
-                    <a:blip r:embed="rId20"/>
+                    <a:blip r:embed="rId23"/>
                     <a:stretch>
                       <a:fillRect/>
                     </a:stretch>
@@ -3337,7 +4126,7 @@
                     <pic:cNvPicPr/>
                   </pic:nvPicPr>
                   <pic:blipFill>
-                    <a:blip r:embed="rId21"/>
+                    <a:blip r:embed="rId24"/>
                     <a:stretch>
                       <a:fillRect/>
                     </a:stretch>
@@ -3363,6 +4152,9 @@
         <w:jc w:val="left"/>
       </w:pPr>
       <w:r>
+        <w:rPr>
+          <w:rFonts w:hint="eastAsia"/>
+        </w:rPr>
         <w:t>建立中央通訊伺服器</w:t>
       </w:r>
       <w:r>
@@ -3393,7 +4185,7 @@
                     <pic:cNvPicPr/>
                   </pic:nvPicPr>
                   <pic:blipFill>
-                    <a:blip r:embed="rId22"/>
+                    <a:blip r:embed="rId25"/>
                     <a:stretch>
                       <a:fillRect/>
                     </a:stretch>
@@ -3443,9 +4235,6 @@
         <w:t>第三步：</w:t>
       </w:r>
       <w:r>
-        <w:rPr>
-          <w:rFonts w:hint="eastAsia"/>
-        </w:rPr>
         <w:t>PIXI</w:t>
       </w:r>
       <w:r>
@@ -3483,7 +4272,7 @@
                     <pic:cNvPicPr/>
                   </pic:nvPicPr>
                   <pic:blipFill>
-                    <a:blip r:embed="rId23"/>
+                    <a:blip r:embed="rId26"/>
                     <a:stretch>
                       <a:fillRect/>
                     </a:stretch>
@@ -3519,23 +4308,50 @@
           <w:lang w:eastAsia="zh-CN"/>
         </w:rPr>
       </w:pPr>
-      <w:bookmarkStart w:id="5" w:name="_Toc230653783"/>
+      <w:bookmarkStart w:id="7" w:name="_Toc230716416"/>
       <w:r>
         <w:rPr>
           <w:rFonts w:hint="eastAsia"/>
-          <w:lang w:eastAsia="zh-CN"/>
         </w:rPr>
         <w:lastRenderedPageBreak/>
-        <w:t>制作规划</w:t>
-      </w:r>
-      <w:bookmarkEnd w:id="5"/>
+        <w:t>製作規劃</w:t>
+      </w:r>
+      <w:bookmarkEnd w:id="7"/>
     </w:p>
     <w:p>
       <w:r>
         <w:rPr>
           <w:rFonts w:hint="eastAsia"/>
         </w:rPr>
-        <w:t>預設是一個顯示器，一個平板，平板選擇詞匯后，透過影像識別，流淚流出詞匯最終流入平板，匯聚成寶石。</w:t>
+        <w:t>預設是一個顯示器，一個平板，平板選擇詞</w:t>
+      </w:r>
+      <w:proofErr w:type="gramStart"/>
+      <w:r>
+        <w:rPr>
+          <w:rFonts w:hint="eastAsia"/>
+        </w:rPr>
+        <w:t>匯</w:t>
+      </w:r>
+      <w:proofErr w:type="gramEnd"/>
+      <w:r>
+        <w:rPr>
+          <w:rFonts w:hint="eastAsia"/>
+        </w:rPr>
+        <w:t>後，透過影像識別，流淚流出詞</w:t>
+      </w:r>
+      <w:proofErr w:type="gramStart"/>
+      <w:r>
+        <w:rPr>
+          <w:rFonts w:hint="eastAsia"/>
+        </w:rPr>
+        <w:t>匯</w:t>
+      </w:r>
+      <w:proofErr w:type="gramEnd"/>
+      <w:r>
+        <w:rPr>
+          <w:rFonts w:hint="eastAsia"/>
+        </w:rPr>
+        <w:t>最終流入平板，匯聚成寶石。</w:t>
       </w:r>
     </w:p>
     <w:p/>
@@ -3546,61 +4362,128 @@
         </w:rPr>
       </w:pPr>
       <w:r>
+        <w:rPr>
+          <w:rFonts w:hint="eastAsia"/>
+        </w:rPr>
         <w:t>一樣用</w:t>
       </w:r>
       <w:r>
         <w:t>React</w:t>
       </w:r>
       <w:r>
+        <w:rPr>
+          <w:rFonts w:hint="eastAsia"/>
+        </w:rPr>
         <w:t>和</w:t>
       </w:r>
       <w:r>
         <w:t>Pixi</w:t>
       </w:r>
       <w:r>
-        <w:t>，設計點擊五組心情詞擇一後，透過影像識別人眼，最終選擇的心情詞會不斷從眼中流出（流出的詞匯越來越多，有最大值），詞匯在顯示器的流動過程中，慢慢由完整的字分解成流動的水墨，最後流入顯示器底端，幾秒后平板接續顯示器的水墨，並慢慢往平板中心匯聚，匯聚過程中漸漸變色（顔色是根據最終要生成的寶石顔色決定）</w:t>
+        <w:t>，設計點擊五組心情詞擇</w:t>
+      </w:r>
+      <w:proofErr w:type="gramStart"/>
+      <w:r>
+        <w:t>一</w:t>
+      </w:r>
+      <w:proofErr w:type="gramEnd"/>
+      <w:r>
+        <w:t>後，透過影像識別人眼，最終選擇的</w:t>
+      </w:r>
+      <w:proofErr w:type="gramStart"/>
+      <w:r>
+        <w:t>心情詞會不斷</w:t>
+      </w:r>
+      <w:proofErr w:type="gramEnd"/>
+      <w:r>
+        <w:t>從眼中流出（流出的詞</w:t>
+      </w:r>
+      <w:proofErr w:type="gramStart"/>
+      <w:r>
+        <w:t>匯</w:t>
+      </w:r>
+      <w:proofErr w:type="gramEnd"/>
+      <w:r>
+        <w:t>越來越多，有最大值），詞</w:t>
+      </w:r>
+      <w:proofErr w:type="gramStart"/>
+      <w:r>
+        <w:t>匯</w:t>
+      </w:r>
+      <w:proofErr w:type="gramEnd"/>
+      <w:r>
+        <w:t>在顯示器的流動過程中，慢慢由完整的字分解成流動的水墨，最後流入顯示器底端，幾秒後平板接續顯示器的水墨，並慢慢往平板中心匯聚，匯聚過程中漸漸變色</w:t>
+      </w:r>
+      <w:proofErr w:type="gramStart"/>
+      <w:r>
+        <w:t>（</w:t>
+      </w:r>
+      <w:proofErr w:type="gramEnd"/>
+      <w:r>
+        <w:t>顔色是根據最終要生成的寶石顔色決定）</w:t>
       </w:r>
       <w:r>
         <w:t>,</w:t>
       </w:r>
       <w:r>
+        <w:rPr>
+          <w:rFonts w:hint="eastAsia"/>
+        </w:rPr>
         <w:t>眼淚流出文字的過程是</w:t>
       </w:r>
       <w:r>
         <w:t>10</w:t>
       </w:r>
       <w:r>
+        <w:rPr>
+          <w:rFonts w:hint="eastAsia"/>
+        </w:rPr>
         <w:t>秒</w:t>
       </w:r>
       <w:r>
         <w:t>,</w:t>
       </w:r>
       <w:r>
+        <w:rPr>
+          <w:rFonts w:hint="eastAsia"/>
+        </w:rPr>
         <w:t>從文字從眼睛留到顯示器底端的時間是</w:t>
       </w:r>
       <w:r>
         <w:t>5</w:t>
       </w:r>
       <w:r>
+        <w:rPr>
+          <w:rFonts w:hint="eastAsia"/>
+        </w:rPr>
         <w:t>秒</w:t>
       </w:r>
       <w:r>
         <w:t>,</w:t>
       </w:r>
       <w:r>
+        <w:rPr>
+          <w:rFonts w:hint="eastAsia"/>
+        </w:rPr>
         <w:t>文字從平板頂端到匯聚中心是</w:t>
       </w:r>
       <w:r>
         <w:t>3</w:t>
       </w:r>
       <w:r>
+        <w:rPr>
+          <w:rFonts w:hint="eastAsia"/>
+        </w:rPr>
         <w:t>秒</w:t>
       </w:r>
       <w:r>
         <w:t>,</w:t>
       </w:r>
       <w:r>
-        <w:t>所有文字都匯聚后水墨經過一陣波動變成寶石。</w:t>
+        <w:rPr>
+          <w:rFonts w:hint="eastAsia"/>
+        </w:rPr>
+        <w:t>所有文字都匯聚後水墨經過一陣波動變成寶石。</w:t>
       </w:r>
     </w:p>
     <w:p>
@@ -3632,7 +4515,7 @@
                     <pic:cNvPicPr/>
                   </pic:nvPicPr>
                   <pic:blipFill>
-                    <a:blip r:embed="rId24"/>
+                    <a:blip r:embed="rId27"/>
                     <a:stretch>
                       <a:fillRect/>
                     </a:stretch>
@@ -3677,7 +4560,7 @@
                     <pic:cNvPicPr/>
                   </pic:nvPicPr>
                   <pic:blipFill>
-                    <a:blip r:embed="rId25"/>
+                    <a:blip r:embed="rId28"/>
                     <a:stretch>
                       <a:fillRect/>
                     </a:stretch>
@@ -3723,7 +4606,7 @@
                     <pic:cNvPicPr/>
                   </pic:nvPicPr>
                   <pic:blipFill>
-                    <a:blip r:embed="rId26"/>
+                    <a:blip r:embed="rId29"/>
                     <a:stretch>
                       <a:fillRect/>
                     </a:stretch>
@@ -3773,7 +4656,7 @@
                     <pic:cNvPicPr/>
                   </pic:nvPicPr>
                   <pic:blipFill>
-                    <a:blip r:embed="rId27"/>
+                    <a:blip r:embed="rId30"/>
                     <a:stretch>
                       <a:fillRect/>
                     </a:stretch>
@@ -3818,7 +4701,7 @@
                     <pic:cNvPicPr/>
                   </pic:nvPicPr>
                   <pic:blipFill>
-                    <a:blip r:embed="rId28"/>
+                    <a:blip r:embed="rId31"/>
                     <a:stretch>
                       <a:fillRect/>
                     </a:stretch>
@@ -3864,7 +4747,7 @@
                     <pic:cNvPicPr/>
                   </pic:nvPicPr>
                   <pic:blipFill>
-                    <a:blip r:embed="rId29"/>
+                    <a:blip r:embed="rId32"/>
                     <a:stretch>
                       <a:fillRect/>
                     </a:stretch>
@@ -3909,7 +4792,7 @@
                     <pic:cNvPicPr/>
                   </pic:nvPicPr>
                   <pic:blipFill>
-                    <a:blip r:embed="rId30"/>
+                    <a:blip r:embed="rId33"/>
                     <a:stretch>
                       <a:fillRect/>
                     </a:stretch>
@@ -3954,7 +4837,7 @@
                     <pic:cNvPicPr/>
                   </pic:nvPicPr>
                   <pic:blipFill>
-                    <a:blip r:embed="rId31"/>
+                    <a:blip r:embed="rId34"/>
                     <a:stretch>
                       <a:fillRect/>
                     </a:stretch>
@@ -4000,7 +4883,7 @@
                     <pic:cNvPicPr/>
                   </pic:nvPicPr>
                   <pic:blipFill>
-                    <a:blip r:embed="rId32"/>
+                    <a:blip r:embed="rId35"/>
                     <a:stretch>
                       <a:fillRect/>
                     </a:stretch>

</xml_diff>

<commit_message>
0.13.9 fix(gem): correct gem sprite anchor offset and validate dual-device sync
</commit_message>
<xml_diff>
--- a/To do.docx
+++ b/To do.docx
@@ -58,7 +58,7 @@
           <w:r>
             <w:fldChar w:fldCharType="separate"/>
           </w:r>
-          <w:hyperlink w:anchor="_Toc230716409" w:history="1">
+          <w:hyperlink w:anchor="_Toc230804028" w:history="1">
             <w:r>
               <w:rPr>
                 <w:rStyle w:val="af3"/>
@@ -86,7 +86,7 @@
                 <w:noProof/>
                 <w:webHidden/>
               </w:rPr>
-              <w:instrText xml:space="preserve"> PAGEREF _Toc230716409 \h </w:instrText>
+              <w:instrText xml:space="preserve"> PAGEREF _Toc230804028 \h </w:instrText>
             </w:r>
             <w:r>
               <w:rPr>
@@ -129,14 +129,14 @@
               <w14:ligatures w14:val="standardContextual"/>
             </w:rPr>
           </w:pPr>
-          <w:hyperlink w:anchor="_Toc230716410" w:history="1">
+          <w:hyperlink w:anchor="_Toc230804029" w:history="1">
             <w:r>
               <w:rPr>
                 <w:rStyle w:val="af3"/>
                 <w:rFonts w:eastAsia="新細明體"/>
                 <w:noProof/>
               </w:rPr>
-              <w:t>音效設定</w:t>
+              <w:t>安卓平板全螢幕</w:t>
             </w:r>
             <w:r>
               <w:rPr>
@@ -157,77 +157,7 @@
                 <w:noProof/>
                 <w:webHidden/>
               </w:rPr>
-              <w:instrText xml:space="preserve"> PAGEREF _Toc230716410 \h </w:instrText>
-            </w:r>
-            <w:r>
-              <w:rPr>
-                <w:noProof/>
-                <w:webHidden/>
-              </w:rPr>
-            </w:r>
-            <w:r>
-              <w:rPr>
-                <w:noProof/>
-                <w:webHidden/>
-              </w:rPr>
-              <w:fldChar w:fldCharType="separate"/>
-            </w:r>
-            <w:r>
-              <w:rPr>
-                <w:noProof/>
-                <w:webHidden/>
-              </w:rPr>
-              <w:t>3</w:t>
-            </w:r>
-            <w:r>
-              <w:rPr>
-                <w:noProof/>
-                <w:webHidden/>
-              </w:rPr>
-              <w:fldChar w:fldCharType="end"/>
-            </w:r>
-          </w:hyperlink>
-        </w:p>
-        <w:p>
-          <w:pPr>
-            <w:pStyle w:val="11"/>
-            <w:tabs>
-              <w:tab w:val="right" w:leader="dot" w:pos="8296"/>
-            </w:tabs>
-            <w:rPr>
-              <w:noProof/>
-              <w:szCs w:val="24"/>
-              <w14:ligatures w14:val="standardContextual"/>
-            </w:rPr>
-          </w:pPr>
-          <w:hyperlink w:anchor="_Toc230716411" w:history="1">
-            <w:r>
-              <w:rPr>
-                <w:rStyle w:val="af3"/>
-                <w:noProof/>
-              </w:rPr>
-              <w:t>網絡連線</w:t>
-            </w:r>
-            <w:r>
-              <w:rPr>
-                <w:noProof/>
-                <w:webHidden/>
-              </w:rPr>
-              <w:tab/>
-            </w:r>
-            <w:r>
-              <w:rPr>
-                <w:noProof/>
-                <w:webHidden/>
-              </w:rPr>
-              <w:fldChar w:fldCharType="begin"/>
-            </w:r>
-            <w:r>
-              <w:rPr>
-                <w:noProof/>
-                <w:webHidden/>
-              </w:rPr>
-              <w:instrText xml:space="preserve"> PAGEREF _Toc230716411 \h </w:instrText>
+              <w:instrText xml:space="preserve"> PAGEREF _Toc230804029 \h </w:instrText>
             </w:r>
             <w:r>
               <w:rPr>
@@ -270,14 +200,14 @@
               <w14:ligatures w14:val="standardContextual"/>
             </w:rPr>
           </w:pPr>
-          <w:hyperlink w:anchor="_Toc230716412" w:history="1">
+          <w:hyperlink w:anchor="_Toc230804030" w:history="1">
             <w:r>
               <w:rPr>
                 <w:rStyle w:val="af3"/>
-                <w:rFonts w:ascii="DengXian" w:eastAsia="新細明體" w:hAnsi="DengXian"/>
+                <w:rFonts w:eastAsia="新細明體"/>
                 <w:noProof/>
               </w:rPr>
-              <w:t>攝像頭權限</w:t>
+              <w:t>音效設定</w:t>
             </w:r>
             <w:r>
               <w:rPr>
@@ -298,7 +228,77 @@
                 <w:noProof/>
                 <w:webHidden/>
               </w:rPr>
-              <w:instrText xml:space="preserve"> PAGEREF _Toc230716412 \h </w:instrText>
+              <w:instrText xml:space="preserve"> PAGEREF _Toc230804030 \h </w:instrText>
+            </w:r>
+            <w:r>
+              <w:rPr>
+                <w:noProof/>
+                <w:webHidden/>
+              </w:rPr>
+            </w:r>
+            <w:r>
+              <w:rPr>
+                <w:noProof/>
+                <w:webHidden/>
+              </w:rPr>
+              <w:fldChar w:fldCharType="separate"/>
+            </w:r>
+            <w:r>
+              <w:rPr>
+                <w:noProof/>
+                <w:webHidden/>
+              </w:rPr>
+              <w:t>4</w:t>
+            </w:r>
+            <w:r>
+              <w:rPr>
+                <w:noProof/>
+                <w:webHidden/>
+              </w:rPr>
+              <w:fldChar w:fldCharType="end"/>
+            </w:r>
+          </w:hyperlink>
+        </w:p>
+        <w:p>
+          <w:pPr>
+            <w:pStyle w:val="11"/>
+            <w:tabs>
+              <w:tab w:val="right" w:leader="dot" w:pos="8296"/>
+            </w:tabs>
+            <w:rPr>
+              <w:noProof/>
+              <w:szCs w:val="24"/>
+              <w14:ligatures w14:val="standardContextual"/>
+            </w:rPr>
+          </w:pPr>
+          <w:hyperlink w:anchor="_Toc230804031" w:history="1">
+            <w:r>
+              <w:rPr>
+                <w:rStyle w:val="af3"/>
+                <w:noProof/>
+              </w:rPr>
+              <w:t>網絡連線</w:t>
+            </w:r>
+            <w:r>
+              <w:rPr>
+                <w:noProof/>
+                <w:webHidden/>
+              </w:rPr>
+              <w:tab/>
+            </w:r>
+            <w:r>
+              <w:rPr>
+                <w:noProof/>
+                <w:webHidden/>
+              </w:rPr>
+              <w:fldChar w:fldCharType="begin"/>
+            </w:r>
+            <w:r>
+              <w:rPr>
+                <w:noProof/>
+                <w:webHidden/>
+              </w:rPr>
+              <w:instrText xml:space="preserve"> PAGEREF _Toc230804031 \h </w:instrText>
             </w:r>
             <w:r>
               <w:rPr>
@@ -341,14 +341,14 @@
               <w14:ligatures w14:val="standardContextual"/>
             </w:rPr>
           </w:pPr>
-          <w:hyperlink w:anchor="_Toc230716413" w:history="1">
+          <w:hyperlink w:anchor="_Toc230804032" w:history="1">
             <w:r>
               <w:rPr>
                 <w:rStyle w:val="af3"/>
                 <w:rFonts w:ascii="DengXian" w:eastAsia="新細明體" w:hAnsi="DengXian"/>
                 <w:noProof/>
               </w:rPr>
-              <w:t>顯卡設定</w:t>
+              <w:t>攝像頭權限</w:t>
             </w:r>
             <w:r>
               <w:rPr>
@@ -369,78 +369,7 @@
                 <w:noProof/>
                 <w:webHidden/>
               </w:rPr>
-              <w:instrText xml:space="preserve"> PAGEREF _Toc230716413 \h </w:instrText>
-            </w:r>
-            <w:r>
-              <w:rPr>
-                <w:noProof/>
-                <w:webHidden/>
-              </w:rPr>
-            </w:r>
-            <w:r>
-              <w:rPr>
-                <w:noProof/>
-                <w:webHidden/>
-              </w:rPr>
-              <w:fldChar w:fldCharType="separate"/>
-            </w:r>
-            <w:r>
-              <w:rPr>
-                <w:noProof/>
-                <w:webHidden/>
-              </w:rPr>
-              <w:t>7</w:t>
-            </w:r>
-            <w:r>
-              <w:rPr>
-                <w:noProof/>
-                <w:webHidden/>
-              </w:rPr>
-              <w:fldChar w:fldCharType="end"/>
-            </w:r>
-          </w:hyperlink>
-        </w:p>
-        <w:p>
-          <w:pPr>
-            <w:pStyle w:val="11"/>
-            <w:tabs>
-              <w:tab w:val="right" w:leader="dot" w:pos="8296"/>
-            </w:tabs>
-            <w:rPr>
-              <w:noProof/>
-              <w:szCs w:val="24"/>
-              <w14:ligatures w14:val="standardContextual"/>
-            </w:rPr>
-          </w:pPr>
-          <w:hyperlink w:anchor="_Toc230716414" w:history="1">
-            <w:r>
-              <w:rPr>
-                <w:rStyle w:val="af3"/>
-                <w:rFonts w:ascii="DengXian" w:eastAsia="新細明體" w:hAnsi="DengXian"/>
-                <w:noProof/>
-              </w:rPr>
-              <w:t>安裝指令</w:t>
-            </w:r>
-            <w:r>
-              <w:rPr>
-                <w:noProof/>
-                <w:webHidden/>
-              </w:rPr>
-              <w:tab/>
-            </w:r>
-            <w:r>
-              <w:rPr>
-                <w:noProof/>
-                <w:webHidden/>
-              </w:rPr>
-              <w:fldChar w:fldCharType="begin"/>
-            </w:r>
-            <w:r>
-              <w:rPr>
-                <w:noProof/>
-                <w:webHidden/>
-              </w:rPr>
-              <w:instrText xml:space="preserve"> PAGEREF _Toc230716414 \h </w:instrText>
+              <w:instrText xml:space="preserve"> PAGEREF _Toc230804032 \h </w:instrText>
             </w:r>
             <w:r>
               <w:rPr>
@@ -483,7 +412,149 @@
               <w14:ligatures w14:val="standardContextual"/>
             </w:rPr>
           </w:pPr>
-          <w:hyperlink w:anchor="_Toc230716415" w:history="1">
+          <w:hyperlink w:anchor="_Toc230804033" w:history="1">
+            <w:r>
+              <w:rPr>
+                <w:rStyle w:val="af3"/>
+                <w:rFonts w:ascii="DengXian" w:eastAsia="新細明體" w:hAnsi="DengXian"/>
+                <w:noProof/>
+              </w:rPr>
+              <w:t>顯卡設定</w:t>
+            </w:r>
+            <w:r>
+              <w:rPr>
+                <w:noProof/>
+                <w:webHidden/>
+              </w:rPr>
+              <w:tab/>
+            </w:r>
+            <w:r>
+              <w:rPr>
+                <w:noProof/>
+                <w:webHidden/>
+              </w:rPr>
+              <w:fldChar w:fldCharType="begin"/>
+            </w:r>
+            <w:r>
+              <w:rPr>
+                <w:noProof/>
+                <w:webHidden/>
+              </w:rPr>
+              <w:instrText xml:space="preserve"> PAGEREF _Toc230804033 \h </w:instrText>
+            </w:r>
+            <w:r>
+              <w:rPr>
+                <w:noProof/>
+                <w:webHidden/>
+              </w:rPr>
+            </w:r>
+            <w:r>
+              <w:rPr>
+                <w:noProof/>
+                <w:webHidden/>
+              </w:rPr>
+              <w:fldChar w:fldCharType="separate"/>
+            </w:r>
+            <w:r>
+              <w:rPr>
+                <w:noProof/>
+                <w:webHidden/>
+              </w:rPr>
+              <w:t>10</w:t>
+            </w:r>
+            <w:r>
+              <w:rPr>
+                <w:noProof/>
+                <w:webHidden/>
+              </w:rPr>
+              <w:fldChar w:fldCharType="end"/>
+            </w:r>
+          </w:hyperlink>
+        </w:p>
+        <w:p>
+          <w:pPr>
+            <w:pStyle w:val="11"/>
+            <w:tabs>
+              <w:tab w:val="right" w:leader="dot" w:pos="8296"/>
+            </w:tabs>
+            <w:rPr>
+              <w:noProof/>
+              <w:szCs w:val="24"/>
+              <w14:ligatures w14:val="standardContextual"/>
+            </w:rPr>
+          </w:pPr>
+          <w:hyperlink w:anchor="_Toc230804034" w:history="1">
+            <w:r>
+              <w:rPr>
+                <w:rStyle w:val="af3"/>
+                <w:rFonts w:ascii="DengXian" w:eastAsia="新細明體" w:hAnsi="DengXian"/>
+                <w:noProof/>
+              </w:rPr>
+              <w:t>安裝指令</w:t>
+            </w:r>
+            <w:r>
+              <w:rPr>
+                <w:noProof/>
+                <w:webHidden/>
+              </w:rPr>
+              <w:tab/>
+            </w:r>
+            <w:r>
+              <w:rPr>
+                <w:noProof/>
+                <w:webHidden/>
+              </w:rPr>
+              <w:fldChar w:fldCharType="begin"/>
+            </w:r>
+            <w:r>
+              <w:rPr>
+                <w:noProof/>
+                <w:webHidden/>
+              </w:rPr>
+              <w:instrText xml:space="preserve"> PAGEREF _Toc230804034 \h </w:instrText>
+            </w:r>
+            <w:r>
+              <w:rPr>
+                <w:noProof/>
+                <w:webHidden/>
+              </w:rPr>
+            </w:r>
+            <w:r>
+              <w:rPr>
+                <w:noProof/>
+                <w:webHidden/>
+              </w:rPr>
+              <w:fldChar w:fldCharType="separate"/>
+            </w:r>
+            <w:r>
+              <w:rPr>
+                <w:noProof/>
+                <w:webHidden/>
+              </w:rPr>
+              <w:t>11</w:t>
+            </w:r>
+            <w:r>
+              <w:rPr>
+                <w:noProof/>
+                <w:webHidden/>
+              </w:rPr>
+              <w:fldChar w:fldCharType="end"/>
+            </w:r>
+          </w:hyperlink>
+        </w:p>
+        <w:p>
+          <w:pPr>
+            <w:pStyle w:val="11"/>
+            <w:tabs>
+              <w:tab w:val="right" w:leader="dot" w:pos="8296"/>
+            </w:tabs>
+            <w:rPr>
+              <w:noProof/>
+              <w:szCs w:val="24"/>
+              <w14:ligatures w14:val="standardContextual"/>
+            </w:rPr>
+          </w:pPr>
+          <w:hyperlink w:anchor="_Toc230804035" w:history="1">
             <w:r>
               <w:rPr>
                 <w:rStyle w:val="af3"/>
@@ -510,77 +581,7 @@
                 <w:noProof/>
                 <w:webHidden/>
               </w:rPr>
-              <w:instrText xml:space="preserve"> PAGEREF _Toc230716415 \h </w:instrText>
-            </w:r>
-            <w:r>
-              <w:rPr>
-                <w:noProof/>
-                <w:webHidden/>
-              </w:rPr>
-            </w:r>
-            <w:r>
-              <w:rPr>
-                <w:noProof/>
-                <w:webHidden/>
-              </w:rPr>
-              <w:fldChar w:fldCharType="separate"/>
-            </w:r>
-            <w:r>
-              <w:rPr>
-                <w:noProof/>
-                <w:webHidden/>
-              </w:rPr>
-              <w:t>9</w:t>
-            </w:r>
-            <w:r>
-              <w:rPr>
-                <w:noProof/>
-                <w:webHidden/>
-              </w:rPr>
-              <w:fldChar w:fldCharType="end"/>
-            </w:r>
-          </w:hyperlink>
-        </w:p>
-        <w:p>
-          <w:pPr>
-            <w:pStyle w:val="11"/>
-            <w:tabs>
-              <w:tab w:val="right" w:leader="dot" w:pos="8296"/>
-            </w:tabs>
-            <w:rPr>
-              <w:noProof/>
-              <w:szCs w:val="24"/>
-              <w14:ligatures w14:val="standardContextual"/>
-            </w:rPr>
-          </w:pPr>
-          <w:hyperlink w:anchor="_Toc230716416" w:history="1">
-            <w:r>
-              <w:rPr>
-                <w:rStyle w:val="af3"/>
-                <w:noProof/>
-              </w:rPr>
-              <w:t>製作規劃</w:t>
-            </w:r>
-            <w:r>
-              <w:rPr>
-                <w:noProof/>
-                <w:webHidden/>
-              </w:rPr>
-              <w:tab/>
-            </w:r>
-            <w:r>
-              <w:rPr>
-                <w:noProof/>
-                <w:webHidden/>
-              </w:rPr>
-              <w:fldChar w:fldCharType="begin"/>
-            </w:r>
-            <w:r>
-              <w:rPr>
-                <w:noProof/>
-                <w:webHidden/>
-              </w:rPr>
-              <w:instrText xml:space="preserve"> PAGEREF _Toc230716416 \h </w:instrText>
+              <w:instrText xml:space="preserve"> PAGEREF _Toc230804035 \h </w:instrText>
             </w:r>
             <w:r>
               <w:rPr>
@@ -612,6 +613,76 @@
           </w:hyperlink>
         </w:p>
         <w:p>
+          <w:pPr>
+            <w:pStyle w:val="11"/>
+            <w:tabs>
+              <w:tab w:val="right" w:leader="dot" w:pos="8296"/>
+            </w:tabs>
+            <w:rPr>
+              <w:noProof/>
+              <w:szCs w:val="24"/>
+              <w14:ligatures w14:val="standardContextual"/>
+            </w:rPr>
+          </w:pPr>
+          <w:hyperlink w:anchor="_Toc230804036" w:history="1">
+            <w:r>
+              <w:rPr>
+                <w:rStyle w:val="af3"/>
+                <w:noProof/>
+              </w:rPr>
+              <w:t>製作規劃</w:t>
+            </w:r>
+            <w:r>
+              <w:rPr>
+                <w:noProof/>
+                <w:webHidden/>
+              </w:rPr>
+              <w:tab/>
+            </w:r>
+            <w:r>
+              <w:rPr>
+                <w:noProof/>
+                <w:webHidden/>
+              </w:rPr>
+              <w:fldChar w:fldCharType="begin"/>
+            </w:r>
+            <w:r>
+              <w:rPr>
+                <w:noProof/>
+                <w:webHidden/>
+              </w:rPr>
+              <w:instrText xml:space="preserve"> PAGEREF _Toc230804036 \h </w:instrText>
+            </w:r>
+            <w:r>
+              <w:rPr>
+                <w:noProof/>
+                <w:webHidden/>
+              </w:rPr>
+            </w:r>
+            <w:r>
+              <w:rPr>
+                <w:noProof/>
+                <w:webHidden/>
+              </w:rPr>
+              <w:fldChar w:fldCharType="separate"/>
+            </w:r>
+            <w:r>
+              <w:rPr>
+                <w:noProof/>
+                <w:webHidden/>
+              </w:rPr>
+              <w:t>15</w:t>
+            </w:r>
+            <w:r>
+              <w:rPr>
+                <w:noProof/>
+                <w:webHidden/>
+              </w:rPr>
+              <w:fldChar w:fldCharType="end"/>
+            </w:r>
+          </w:hyperlink>
+        </w:p>
+        <w:p>
           <w:r>
             <w:rPr>
               <w:b/>
@@ -627,8 +698,7 @@
       <w:pPr>
         <w:jc w:val="left"/>
         <w:rPr>
-          <w:rFonts w:eastAsia="DengXian" w:hint="eastAsia"/>
-          <w:lang w:eastAsia="zh-CN"/>
+          <w:rFonts w:hint="eastAsia"/>
         </w:rPr>
       </w:pPr>
     </w:p>
@@ -661,7 +731,7 @@
           <w:rFonts w:eastAsia="DengXian" w:hint="eastAsia"/>
         </w:rPr>
       </w:pPr>
-      <w:bookmarkStart w:id="0" w:name="_Toc230716409"/>
+      <w:bookmarkStart w:id="0" w:name="_Toc230804028"/>
       <w:r>
         <w:rPr>
           <w:rFonts w:eastAsia="新細明體" w:hint="eastAsia"/>
@@ -1091,7 +1161,7 @@
       <w:pPr>
         <w:jc w:val="left"/>
         <w:rPr>
-          <w:rFonts w:eastAsia="DengXian"/>
+          <w:rFonts w:asciiTheme="minorEastAsia" w:eastAsia="DengXian" w:hAnsiTheme="minorEastAsia"/>
         </w:rPr>
       </w:pPr>
       <w:r>
@@ -1105,7 +1175,8 @@
       <w:pPr>
         <w:jc w:val="left"/>
         <w:rPr>
-          <w:rFonts w:eastAsia="DengXian" w:hint="eastAsia"/>
+          <w:rFonts w:eastAsia="DengXian"/>
+          <w:lang w:eastAsia="zh-CN"/>
         </w:rPr>
       </w:pPr>
       <w:sdt>
@@ -1113,7 +1184,7 @@
           <w:rPr>
             <w:rFonts w:eastAsia="DengXian" w:hint="eastAsia"/>
           </w:rPr>
-          <w:id w:val="-1468742947"/>
+          <w:id w:val="526533512"/>
           <w14:checkbox>
             <w14:checked w14:val="0"/>
             <w14:checkedState w14:val="2612" w14:font="MS Gothic"/>
@@ -1131,22 +1202,30 @@
       </w:sdt>
       <w:r>
         <w:rPr>
-          <w:rFonts w:eastAsia="新細明體"/>
+          <w:rFonts w:hint="eastAsia"/>
         </w:rPr>
         <w:t xml:space="preserve"> </w:t>
       </w:r>
       <w:r>
         <w:rPr>
-          <w:rFonts w:eastAsia="新細明體" w:hint="eastAsia"/>
-        </w:rPr>
-        <w:t>寶石彙聚</w:t>
-      </w:r>
-    </w:p>
-    <w:p>
-      <w:pPr>
-        <w:jc w:val="left"/>
-        <w:rPr>
-          <w:rFonts w:eastAsia="DengXian"/>
+          <w:rFonts w:ascii="DengXian" w:eastAsia="DengXian" w:hAnsi="DengXian" w:hint="eastAsia"/>
+        </w:rPr>
+        <w:t>记录</w:t>
+      </w:r>
+      <w:r>
+        <w:rPr>
+          <w:rFonts w:eastAsia="DengXian" w:hint="eastAsia"/>
+          <w:lang w:eastAsia="zh-CN"/>
+        </w:rPr>
+        <w:t>水波纹过程</w:t>
+      </w:r>
+    </w:p>
+    <w:p>
+      <w:pPr>
+        <w:jc w:val="left"/>
+        <w:rPr>
+          <w:rFonts w:eastAsia="DengXian" w:hint="eastAsia"/>
+          <w:lang w:eastAsia="zh-CN"/>
         </w:rPr>
       </w:pPr>
       <w:sdt>
@@ -1154,7 +1233,7 @@
           <w:rPr>
             <w:rFonts w:eastAsia="DengXian" w:hint="eastAsia"/>
           </w:rPr>
-          <w:id w:val="1205982233"/>
+          <w:id w:val="-1335524975"/>
           <w14:checkbox>
             <w14:checked w14:val="0"/>
             <w14:checkedState w14:val="2612" w14:font="MS Gothic"/>
@@ -1172,15 +1251,130 @@
       </w:sdt>
       <w:r>
         <w:rPr>
-          <w:rFonts w:eastAsia="新細明體"/>
+          <w:rFonts w:eastAsia="DengXian" w:hint="eastAsia"/>
+          <w:lang w:eastAsia="zh-CN"/>
+        </w:rPr>
+        <w:t xml:space="preserve"> 水波纹过程逆向</w:t>
+      </w:r>
+    </w:p>
+    <w:p>
+      <w:pPr>
+        <w:jc w:val="left"/>
+        <w:rPr>
+          <w:rFonts w:eastAsia="DengXian"/>
+        </w:rPr>
+      </w:pPr>
+      <w:sdt>
+        <w:sdtPr>
+          <w:rPr>
+            <w:rFonts w:eastAsia="DengXian" w:hint="eastAsia"/>
+          </w:rPr>
+          <w:id w:val="-287355676"/>
+          <w14:checkbox>
+            <w14:checked w14:val="0"/>
+            <w14:checkedState w14:val="2612" w14:font="MS Gothic"/>
+            <w14:uncheckedState w14:val="2610" w14:font="MS Gothic"/>
+          </w14:checkbox>
+        </w:sdtPr>
+        <w:sdtContent>
+          <w:r>
+            <w:rPr>
+              <w:rFonts w:ascii="MS Gothic" w:eastAsia="MS Gothic" w:hAnsi="MS Gothic" w:hint="eastAsia"/>
+            </w:rPr>
+            <w:t>☐</w:t>
+          </w:r>
+        </w:sdtContent>
+      </w:sdt>
+      <w:r>
+        <w:rPr>
+          <w:rFonts w:eastAsia="DengXian" w:hint="eastAsia"/>
+        </w:rPr>
+        <w:t xml:space="preserve"> 水波纹中心</w:t>
+      </w:r>
+      <w:r>
+        <w:rPr>
+          <w:rFonts w:eastAsia="DengXian"/>
+        </w:rPr>
+        <w:t>光暈球匯聚</w:t>
+      </w:r>
+    </w:p>
+    <w:p>
+      <w:pPr>
+        <w:jc w:val="left"/>
+        <w:rPr>
+          <w:rFonts w:eastAsia="DengXian"/>
+          <w:lang w:eastAsia="zh-CN"/>
+        </w:rPr>
+      </w:pPr>
+      <w:sdt>
+        <w:sdtPr>
+          <w:rPr>
+            <w:rFonts w:eastAsia="DengXian" w:hint="eastAsia"/>
+          </w:rPr>
+          <w:id w:val="1061449731"/>
+          <w14:checkbox>
+            <w14:checked w14:val="0"/>
+            <w14:checkedState w14:val="2612" w14:font="MS Gothic"/>
+            <w14:uncheckedState w14:val="2610" w14:font="MS Gothic"/>
+          </w14:checkbox>
+        </w:sdtPr>
+        <w:sdtContent>
+          <w:r>
+            <w:rPr>
+              <w:rFonts w:ascii="MS Gothic" w:eastAsia="MS Gothic" w:hAnsi="MS Gothic" w:hint="eastAsia"/>
+            </w:rPr>
+            <w:t>☐</w:t>
+          </w:r>
+        </w:sdtContent>
+      </w:sdt>
+      <w:r>
+        <w:rPr>
+          <w:rFonts w:eastAsia="DengXian" w:hint="eastAsia"/>
         </w:rPr>
         <w:t xml:space="preserve"> </w:t>
       </w:r>
       <w:r>
         <w:rPr>
-          <w:rFonts w:eastAsia="新細明體" w:hint="eastAsia"/>
-        </w:rPr>
-        <w:t>平板外接網路測試</w:t>
+          <w:rFonts w:eastAsia="DengXian"/>
+        </w:rPr>
+        <w:t>遮罩顯影</w:t>
+      </w:r>
+    </w:p>
+    <w:p>
+      <w:pPr>
+        <w:jc w:val="left"/>
+        <w:rPr>
+          <w:rFonts w:eastAsia="DengXian"/>
+          <w:lang w:eastAsia="zh-CN"/>
+        </w:rPr>
+      </w:pPr>
+      <w:sdt>
+        <w:sdtPr>
+          <w:rPr>
+            <w:rFonts w:eastAsia="DengXian" w:hint="eastAsia"/>
+          </w:rPr>
+          <w:id w:val="-1630004191"/>
+          <w14:checkbox>
+            <w14:checked w14:val="0"/>
+            <w14:checkedState w14:val="2612" w14:font="MS Gothic"/>
+            <w14:uncheckedState w14:val="2610" w14:font="MS Gothic"/>
+          </w14:checkbox>
+        </w:sdtPr>
+        <w:sdtContent>
+          <w:r>
+            <w:rPr>
+              <w:rFonts w:ascii="MS Gothic" w:eastAsia="MS Gothic" w:hAnsi="MS Gothic" w:hint="eastAsia"/>
+            </w:rPr>
+            <w:t>☐</w:t>
+          </w:r>
+        </w:sdtContent>
+      </w:sdt>
+      <w:r>
+        <w:rPr>
+          <w:rFonts w:eastAsia="DengXian" w:hint="eastAsia"/>
+          <w:lang w:eastAsia="zh-CN"/>
+        </w:rPr>
+        <w:t xml:space="preserve"> 待机动画风格</w:t>
       </w:r>
     </w:p>
     <w:p>
@@ -1188,6 +1382,42 @@
         <w:jc w:val="left"/>
         <w:rPr>
           <w:rFonts w:hint="eastAsia"/>
+        </w:rPr>
+      </w:pPr>
+      <w:sdt>
+        <w:sdtPr>
+          <w:rPr>
+            <w:rFonts w:eastAsia="DengXian" w:hint="eastAsia"/>
+          </w:rPr>
+          <w:id w:val="-506598520"/>
+          <w14:checkbox>
+            <w14:checked w14:val="0"/>
+            <w14:checkedState w14:val="2612" w14:font="MS Gothic"/>
+            <w14:uncheckedState w14:val="2610" w14:font="MS Gothic"/>
+          </w14:checkbox>
+        </w:sdtPr>
+        <w:sdtContent>
+          <w:r>
+            <w:rPr>
+              <w:rFonts w:ascii="MS Gothic" w:eastAsia="MS Gothic" w:hAnsi="MS Gothic" w:hint="eastAsia"/>
+            </w:rPr>
+            <w:t>☐</w:t>
+          </w:r>
+        </w:sdtContent>
+      </w:sdt>
+      <w:r>
+        <w:rPr>
+          <w:rFonts w:eastAsia="DengXian" w:hint="eastAsia"/>
+          <w:lang w:eastAsia="zh-CN"/>
+        </w:rPr>
+        <w:t xml:space="preserve"> UI顶部选取直接结合在开始按钮上</w:t>
+      </w:r>
+    </w:p>
+    <w:p>
+      <w:pPr>
+        <w:jc w:val="left"/>
+        <w:rPr>
+          <w:rFonts w:eastAsia="DengXian"/>
         </w:rPr>
       </w:pPr>
       <w:sdt>
@@ -1246,6 +1476,88 @@
       <w:pPr>
         <w:jc w:val="left"/>
         <w:rPr>
+          <w:rFonts w:asciiTheme="minorEastAsia" w:hAnsiTheme="minorEastAsia" w:hint="eastAsia"/>
+        </w:rPr>
+      </w:pPr>
+      <w:sdt>
+        <w:sdtPr>
+          <w:rPr>
+            <w:rFonts w:eastAsia="DengXian" w:hint="eastAsia"/>
+          </w:rPr>
+          <w:id w:val="-1468742947"/>
+          <w14:checkbox>
+            <w14:checked w14:val="1"/>
+            <w14:checkedState w14:val="2612" w14:font="MS Gothic"/>
+            <w14:uncheckedState w14:val="2610" w14:font="MS Gothic"/>
+          </w14:checkbox>
+        </w:sdtPr>
+        <w:sdtContent>
+          <w:r>
+            <w:rPr>
+              <w:rFonts w:ascii="MS Gothic" w:eastAsia="MS Gothic" w:hAnsi="MS Gothic" w:hint="eastAsia"/>
+            </w:rPr>
+            <w:t>☒</w:t>
+          </w:r>
+        </w:sdtContent>
+      </w:sdt>
+      <w:r>
+        <w:rPr>
+          <w:rFonts w:eastAsia="新細明體"/>
+        </w:rPr>
+        <w:t xml:space="preserve"> </w:t>
+      </w:r>
+      <w:r>
+        <w:rPr>
+          <w:rFonts w:eastAsia="新細明體" w:hint="eastAsia"/>
+        </w:rPr>
+        <w:t>寶石彙聚</w:t>
+      </w:r>
+    </w:p>
+    <w:p>
+      <w:pPr>
+        <w:jc w:val="left"/>
+        <w:rPr>
+          <w:rFonts w:asciiTheme="minorEastAsia" w:hAnsiTheme="minorEastAsia" w:hint="eastAsia"/>
+        </w:rPr>
+      </w:pPr>
+      <w:sdt>
+        <w:sdtPr>
+          <w:rPr>
+            <w:rFonts w:eastAsia="DengXian" w:hint="eastAsia"/>
+          </w:rPr>
+          <w:id w:val="1205982233"/>
+          <w14:checkbox>
+            <w14:checked w14:val="1"/>
+            <w14:checkedState w14:val="2612" w14:font="MS Gothic"/>
+            <w14:uncheckedState w14:val="2610" w14:font="MS Gothic"/>
+          </w14:checkbox>
+        </w:sdtPr>
+        <w:sdtContent>
+          <w:r>
+            <w:rPr>
+              <w:rFonts w:ascii="MS Gothic" w:eastAsia="MS Gothic" w:hAnsi="MS Gothic" w:hint="eastAsia"/>
+            </w:rPr>
+            <w:t>☒</w:t>
+          </w:r>
+        </w:sdtContent>
+      </w:sdt>
+      <w:r>
+        <w:rPr>
+          <w:rFonts w:eastAsia="新細明體"/>
+        </w:rPr>
+        <w:t xml:space="preserve"> </w:t>
+      </w:r>
+      <w:r>
+        <w:rPr>
+          <w:rFonts w:eastAsia="新細明體" w:hint="eastAsia"/>
+        </w:rPr>
+        <w:t>平板外接網路測試</w:t>
+      </w:r>
+    </w:p>
+    <w:p>
+      <w:pPr>
+        <w:jc w:val="left"/>
+        <w:rPr>
           <w:rFonts w:hint="eastAsia"/>
         </w:rPr>
       </w:pPr>
@@ -1890,7 +2202,6 @@
         <w:jc w:val="left"/>
         <w:rPr>
           <w:rFonts w:eastAsia="DengXian"/>
-          <w:lang w:eastAsia="zh-CN"/>
         </w:rPr>
       </w:pPr>
       <w:sdt>
@@ -1932,34 +2243,181 @@
         <w:jc w:val="left"/>
         <w:rPr>
           <w:rFonts w:eastAsia="DengXian"/>
+        </w:rPr>
+      </w:pPr>
+      <w:r>
+        <w:rPr>
+          <w:rFonts w:eastAsia="DengXian"/>
+        </w:rPr>
+        <w:lastRenderedPageBreak/>
+        <w:br w:type="page"/>
+      </w:r>
+    </w:p>
+    <w:p>
+      <w:pPr>
+        <w:pStyle w:val="1"/>
+        <w:rPr>
+          <w:rFonts w:eastAsia="新細明體" w:hint="eastAsia"/>
+        </w:rPr>
+      </w:pPr>
+      <w:bookmarkStart w:id="1" w:name="_Toc230804029"/>
+      <w:r>
+        <w:rPr>
+          <w:rFonts w:eastAsia="新細明體" w:hint="eastAsia"/>
+        </w:rPr>
+        <w:lastRenderedPageBreak/>
+        <w:t>安卓平板全螢幕</w:t>
+      </w:r>
+      <w:bookmarkEnd w:id="1"/>
+    </w:p>
+    <w:p>
+      <w:r>
+        <w:rPr>
+          <w:noProof/>
+        </w:rPr>
+        <w:drawing>
+          <wp:inline distT="0" distB="0" distL="0" distR="0" wp14:anchorId="182E6790" wp14:editId="73353645">
+            <wp:extent cx="5274310" cy="922020"/>
+            <wp:effectExtent l="0" t="0" r="2540" b="0"/>
+            <wp:docPr id="24725411" name="圖片 1"/>
+            <wp:cNvGraphicFramePr>
+              <a:graphicFrameLocks xmlns:a="http://schemas.openxmlformats.org/drawingml/2006/main" noChangeAspect="1"/>
+            </wp:cNvGraphicFramePr>
+            <a:graphic xmlns:a="http://schemas.openxmlformats.org/drawingml/2006/main">
+              <a:graphicData uri="http://schemas.openxmlformats.org/drawingml/2006/picture">
+                <pic:pic xmlns:pic="http://schemas.openxmlformats.org/drawingml/2006/picture">
+                  <pic:nvPicPr>
+                    <pic:cNvPr id="24725411" name=""/>
+                    <pic:cNvPicPr/>
+                  </pic:nvPicPr>
+                  <pic:blipFill>
+                    <a:blip r:embed="rId8"/>
+                    <a:stretch>
+                      <a:fillRect/>
+                    </a:stretch>
+                  </pic:blipFill>
+                  <pic:spPr>
+                    <a:xfrm>
+                      <a:off x="0" y="0"/>
+                      <a:ext cx="5274310" cy="922020"/>
+                    </a:xfrm>
+                    <a:prstGeom prst="rect">
+                      <a:avLst/>
+                    </a:prstGeom>
+                  </pic:spPr>
+                </pic:pic>
+              </a:graphicData>
+            </a:graphic>
+          </wp:inline>
+        </w:drawing>
+      </w:r>
+    </w:p>
+    <w:p>
+      <w:r>
+        <w:rPr>
+          <w:noProof/>
+        </w:rPr>
+        <w:drawing>
+          <wp:inline distT="0" distB="0" distL="0" distR="0" wp14:anchorId="1692F2B6" wp14:editId="0601AC87">
+            <wp:extent cx="5274310" cy="2245360"/>
+            <wp:effectExtent l="0" t="0" r="2540" b="2540"/>
+            <wp:docPr id="1373211631" name="圖片 1"/>
+            <wp:cNvGraphicFramePr>
+              <a:graphicFrameLocks xmlns:a="http://schemas.openxmlformats.org/drawingml/2006/main" noChangeAspect="1"/>
+            </wp:cNvGraphicFramePr>
+            <a:graphic xmlns:a="http://schemas.openxmlformats.org/drawingml/2006/main">
+              <a:graphicData uri="http://schemas.openxmlformats.org/drawingml/2006/picture">
+                <pic:pic xmlns:pic="http://schemas.openxmlformats.org/drawingml/2006/picture">
+                  <pic:nvPicPr>
+                    <pic:cNvPr id="1373211631" name=""/>
+                    <pic:cNvPicPr/>
+                  </pic:nvPicPr>
+                  <pic:blipFill>
+                    <a:blip r:embed="rId9"/>
+                    <a:stretch>
+                      <a:fillRect/>
+                    </a:stretch>
+                  </pic:blipFill>
+                  <pic:spPr>
+                    <a:xfrm>
+                      <a:off x="0" y="0"/>
+                      <a:ext cx="5274310" cy="2245360"/>
+                    </a:xfrm>
+                    <a:prstGeom prst="rect">
+                      <a:avLst/>
+                    </a:prstGeom>
+                  </pic:spPr>
+                </pic:pic>
+              </a:graphicData>
+            </a:graphic>
+          </wp:inline>
+        </w:drawing>
+      </w:r>
+    </w:p>
+    <w:p>
+      <w:pPr>
+        <w:rPr>
+          <w:rFonts w:eastAsia="DengXian" w:hint="eastAsia"/>
           <w:lang w:eastAsia="zh-CN"/>
         </w:rPr>
       </w:pPr>
       <w:r>
         <w:rPr>
+          <w:noProof/>
+        </w:rPr>
+        <w:drawing>
+          <wp:inline distT="0" distB="0" distL="0" distR="0" wp14:anchorId="2C2EEFAD" wp14:editId="088CA255">
+            <wp:extent cx="5274310" cy="1698625"/>
+            <wp:effectExtent l="0" t="0" r="2540" b="0"/>
+            <wp:docPr id="774355073" name="圖片 1"/>
+            <wp:cNvGraphicFramePr>
+              <a:graphicFrameLocks xmlns:a="http://schemas.openxmlformats.org/drawingml/2006/main" noChangeAspect="1"/>
+            </wp:cNvGraphicFramePr>
+            <a:graphic xmlns:a="http://schemas.openxmlformats.org/drawingml/2006/main">
+              <a:graphicData uri="http://schemas.openxmlformats.org/drawingml/2006/picture">
+                <pic:pic xmlns:pic="http://schemas.openxmlformats.org/drawingml/2006/picture">
+                  <pic:nvPicPr>
+                    <pic:cNvPr id="774355073" name=""/>
+                    <pic:cNvPicPr/>
+                  </pic:nvPicPr>
+                  <pic:blipFill>
+                    <a:blip r:embed="rId10"/>
+                    <a:stretch>
+                      <a:fillRect/>
+                    </a:stretch>
+                  </pic:blipFill>
+                  <pic:spPr>
+                    <a:xfrm>
+                      <a:off x="0" y="0"/>
+                      <a:ext cx="5274310" cy="1698625"/>
+                    </a:xfrm>
+                    <a:prstGeom prst="rect">
+                      <a:avLst/>
+                    </a:prstGeom>
+                  </pic:spPr>
+                </pic:pic>
+              </a:graphicData>
+            </a:graphic>
+          </wp:inline>
+        </w:drawing>
+      </w:r>
+    </w:p>
+    <w:p>
+      <w:pPr>
+        <w:pStyle w:val="1"/>
+        <w:rPr>
           <w:rFonts w:eastAsia="DengXian"/>
           <w:lang w:eastAsia="zh-CN"/>
         </w:rPr>
-        <w:br w:type="page"/>
-      </w:r>
-    </w:p>
-    <w:p>
-      <w:pPr>
-        <w:pStyle w:val="1"/>
-        <w:rPr>
-          <w:rFonts w:eastAsia="DengXian"/>
-          <w:lang w:eastAsia="zh-CN"/>
-        </w:rPr>
-      </w:pPr>
-      <w:bookmarkStart w:id="1" w:name="_Toc230716410"/>
-      <w:r>
-        <w:rPr>
-          <w:rFonts w:eastAsia="新細明體" w:hint="eastAsia"/>
-        </w:rPr>
-        <w:lastRenderedPageBreak/>
+      </w:pPr>
+      <w:bookmarkStart w:id="2" w:name="_Toc230804030"/>
+      <w:r>
+        <w:rPr>
+          <w:rFonts w:eastAsia="新細明體" w:hint="eastAsia"/>
+        </w:rPr>
         <w:t>音效設定</w:t>
       </w:r>
-      <w:bookmarkEnd w:id="1"/>
+      <w:bookmarkEnd w:id="2"/>
     </w:p>
     <w:p>
       <w:pPr>
@@ -1988,7 +2446,7 @@
                     <pic:cNvPicPr/>
                   </pic:nvPicPr>
                   <pic:blipFill>
-                    <a:blip r:embed="rId8"/>
+                    <a:blip r:embed="rId11"/>
                     <a:stretch>
                       <a:fillRect/>
                     </a:stretch>
@@ -2033,7 +2491,7 @@
           <w:lang w:eastAsia="zh-CN"/>
         </w:rPr>
       </w:pPr>
-      <w:bookmarkStart w:id="2" w:name="_Toc230716411"/>
+      <w:bookmarkStart w:id="3" w:name="_Toc230804031"/>
       <w:r>
         <w:rPr>
           <w:rFonts w:hint="eastAsia"/>
@@ -2041,7 +2499,7 @@
         <w:lastRenderedPageBreak/>
         <w:t>網絡連線</w:t>
       </w:r>
-      <w:bookmarkEnd w:id="2"/>
+      <w:bookmarkEnd w:id="3"/>
     </w:p>
     <w:p>
       <w:pPr>
@@ -2070,7 +2528,7 @@
                     <pic:cNvPicPr/>
                   </pic:nvPicPr>
                   <pic:blipFill>
-                    <a:blip r:embed="rId9"/>
+                    <a:blip r:embed="rId12"/>
                     <a:stretch>
                       <a:fillRect/>
                     </a:stretch>
@@ -2118,7 +2576,7 @@
                     <pic:cNvPicPr/>
                   </pic:nvPicPr>
                   <pic:blipFill>
-                    <a:blip r:embed="rId10"/>
+                    <a:blip r:embed="rId13"/>
                     <a:stretch>
                       <a:fillRect/>
                     </a:stretch>
@@ -2142,7 +2600,7 @@
     <w:p>
       <w:pPr>
         <w:rPr>
-          <w:rFonts w:eastAsia="DengXian" w:hint="eastAsia"/>
+          <w:rFonts w:eastAsia="DengXian"/>
           <w:lang w:eastAsia="zh-CN"/>
         </w:rPr>
       </w:pPr>
@@ -2166,7 +2624,7 @@
                     <pic:cNvPicPr/>
                   </pic:nvPicPr>
                   <pic:blipFill>
-                    <a:blip r:embed="rId11"/>
+                    <a:blip r:embed="rId14"/>
                     <a:stretch>
                       <a:fillRect/>
                     </a:stretch>
@@ -2189,7 +2647,6 @@
     </w:p>
     <w:p>
       <w:pPr>
-        <w:jc w:val="left"/>
         <w:rPr>
           <w:rFonts w:eastAsia="DengXian"/>
           <w:lang w:eastAsia="zh-CN"/>
@@ -2197,9 +2654,202 @@
       </w:pPr>
       <w:r>
         <w:rPr>
+          <w:noProof/>
+        </w:rPr>
+        <w:lastRenderedPageBreak/>
+        <w:drawing>
+          <wp:inline distT="0" distB="0" distL="0" distR="0" wp14:anchorId="30A12260" wp14:editId="68949BFE">
+            <wp:extent cx="5274310" cy="2946400"/>
+            <wp:effectExtent l="0" t="0" r="2540" b="6350"/>
+            <wp:docPr id="1521478731" name="圖片 1"/>
+            <wp:cNvGraphicFramePr>
+              <a:graphicFrameLocks xmlns:a="http://schemas.openxmlformats.org/drawingml/2006/main" noChangeAspect="1"/>
+            </wp:cNvGraphicFramePr>
+            <a:graphic xmlns:a="http://schemas.openxmlformats.org/drawingml/2006/main">
+              <a:graphicData uri="http://schemas.openxmlformats.org/drawingml/2006/picture">
+                <pic:pic xmlns:pic="http://schemas.openxmlformats.org/drawingml/2006/picture">
+                  <pic:nvPicPr>
+                    <pic:cNvPr id="1521478731" name=""/>
+                    <pic:cNvPicPr/>
+                  </pic:nvPicPr>
+                  <pic:blipFill>
+                    <a:blip r:embed="rId15"/>
+                    <a:stretch>
+                      <a:fillRect/>
+                    </a:stretch>
+                  </pic:blipFill>
+                  <pic:spPr>
+                    <a:xfrm>
+                      <a:off x="0" y="0"/>
+                      <a:ext cx="5274310" cy="2946400"/>
+                    </a:xfrm>
+                    <a:prstGeom prst="rect">
+                      <a:avLst/>
+                    </a:prstGeom>
+                  </pic:spPr>
+                </pic:pic>
+              </a:graphicData>
+            </a:graphic>
+          </wp:inline>
+        </w:drawing>
+      </w:r>
+    </w:p>
+    <w:p>
+      <w:pPr>
+        <w:rPr>
           <w:rFonts w:eastAsia="DengXian"/>
           <w:lang w:eastAsia="zh-CN"/>
         </w:rPr>
+      </w:pPr>
+      <w:r>
+        <w:rPr>
+          <w:noProof/>
+        </w:rPr>
+        <w:drawing>
+          <wp:inline distT="0" distB="0" distL="0" distR="0" wp14:anchorId="29619499" wp14:editId="62688CB4">
+            <wp:extent cx="5274310" cy="2345690"/>
+            <wp:effectExtent l="0" t="0" r="2540" b="0"/>
+            <wp:docPr id="723077596" name="圖片 1"/>
+            <wp:cNvGraphicFramePr>
+              <a:graphicFrameLocks xmlns:a="http://schemas.openxmlformats.org/drawingml/2006/main" noChangeAspect="1"/>
+            </wp:cNvGraphicFramePr>
+            <a:graphic xmlns:a="http://schemas.openxmlformats.org/drawingml/2006/main">
+              <a:graphicData uri="http://schemas.openxmlformats.org/drawingml/2006/picture">
+                <pic:pic xmlns:pic="http://schemas.openxmlformats.org/drawingml/2006/picture">
+                  <pic:nvPicPr>
+                    <pic:cNvPr id="723077596" name=""/>
+                    <pic:cNvPicPr/>
+                  </pic:nvPicPr>
+                  <pic:blipFill>
+                    <a:blip r:embed="rId16"/>
+                    <a:stretch>
+                      <a:fillRect/>
+                    </a:stretch>
+                  </pic:blipFill>
+                  <pic:spPr>
+                    <a:xfrm>
+                      <a:off x="0" y="0"/>
+                      <a:ext cx="5274310" cy="2345690"/>
+                    </a:xfrm>
+                    <a:prstGeom prst="rect">
+                      <a:avLst/>
+                    </a:prstGeom>
+                  </pic:spPr>
+                </pic:pic>
+              </a:graphicData>
+            </a:graphic>
+          </wp:inline>
+        </w:drawing>
+      </w:r>
+    </w:p>
+    <w:p>
+      <w:pPr>
+        <w:rPr>
+          <w:rFonts w:eastAsia="DengXian" w:hint="eastAsia"/>
+          <w:lang w:eastAsia="zh-CN"/>
+        </w:rPr>
+      </w:pPr>
+      <w:r>
+        <w:rPr>
+          <w:noProof/>
+        </w:rPr>
+        <w:drawing>
+          <wp:inline distT="0" distB="0" distL="0" distR="0" wp14:anchorId="53A93E9F" wp14:editId="5632D17D">
+            <wp:extent cx="5274310" cy="2719705"/>
+            <wp:effectExtent l="0" t="0" r="2540" b="4445"/>
+            <wp:docPr id="1789623020" name="圖片 1"/>
+            <wp:cNvGraphicFramePr>
+              <a:graphicFrameLocks xmlns:a="http://schemas.openxmlformats.org/drawingml/2006/main" noChangeAspect="1"/>
+            </wp:cNvGraphicFramePr>
+            <a:graphic xmlns:a="http://schemas.openxmlformats.org/drawingml/2006/main">
+              <a:graphicData uri="http://schemas.openxmlformats.org/drawingml/2006/picture">
+                <pic:pic xmlns:pic="http://schemas.openxmlformats.org/drawingml/2006/picture">
+                  <pic:nvPicPr>
+                    <pic:cNvPr id="1789623020" name=""/>
+                    <pic:cNvPicPr/>
+                  </pic:nvPicPr>
+                  <pic:blipFill>
+                    <a:blip r:embed="rId17"/>
+                    <a:stretch>
+                      <a:fillRect/>
+                    </a:stretch>
+                  </pic:blipFill>
+                  <pic:spPr>
+                    <a:xfrm>
+                      <a:off x="0" y="0"/>
+                      <a:ext cx="5274310" cy="2719705"/>
+                    </a:xfrm>
+                    <a:prstGeom prst="rect">
+                      <a:avLst/>
+                    </a:prstGeom>
+                  </pic:spPr>
+                </pic:pic>
+              </a:graphicData>
+            </a:graphic>
+          </wp:inline>
+        </w:drawing>
+      </w:r>
+      <w:r>
+        <w:rPr>
+          <w:noProof/>
+        </w:rPr>
+        <w:t xml:space="preserve"> </w:t>
+      </w:r>
+      <w:r>
+        <w:rPr>
+          <w:noProof/>
+        </w:rPr>
+        <w:lastRenderedPageBreak/>
+        <w:drawing>
+          <wp:inline distT="0" distB="0" distL="0" distR="0" wp14:anchorId="2AF21207" wp14:editId="230431E7">
+            <wp:extent cx="5274310" cy="2719705"/>
+            <wp:effectExtent l="0" t="0" r="2540" b="4445"/>
+            <wp:docPr id="21719462" name="圖片 1"/>
+            <wp:cNvGraphicFramePr>
+              <a:graphicFrameLocks xmlns:a="http://schemas.openxmlformats.org/drawingml/2006/main" noChangeAspect="1"/>
+            </wp:cNvGraphicFramePr>
+            <a:graphic xmlns:a="http://schemas.openxmlformats.org/drawingml/2006/main">
+              <a:graphicData uri="http://schemas.openxmlformats.org/drawingml/2006/picture">
+                <pic:pic xmlns:pic="http://schemas.openxmlformats.org/drawingml/2006/picture">
+                  <pic:nvPicPr>
+                    <pic:cNvPr id="21719462" name=""/>
+                    <pic:cNvPicPr/>
+                  </pic:nvPicPr>
+                  <pic:blipFill>
+                    <a:blip r:embed="rId18"/>
+                    <a:stretch>
+                      <a:fillRect/>
+                    </a:stretch>
+                  </pic:blipFill>
+                  <pic:spPr>
+                    <a:xfrm>
+                      <a:off x="0" y="0"/>
+                      <a:ext cx="5274310" cy="2719705"/>
+                    </a:xfrm>
+                    <a:prstGeom prst="rect">
+                      <a:avLst/>
+                    </a:prstGeom>
+                  </pic:spPr>
+                </pic:pic>
+              </a:graphicData>
+            </a:graphic>
+          </wp:inline>
+        </w:drawing>
+      </w:r>
+    </w:p>
+    <w:p>
+      <w:pPr>
+        <w:jc w:val="left"/>
+        <w:rPr>
+          <w:rFonts w:eastAsia="DengXian"/>
+          <w:lang w:eastAsia="zh-CN"/>
+        </w:rPr>
+      </w:pPr>
+      <w:r>
+        <w:rPr>
+          <w:rFonts w:eastAsia="DengXian"/>
+          <w:lang w:eastAsia="zh-CN"/>
+        </w:rPr>
         <w:br w:type="page"/>
       </w:r>
     </w:p>
@@ -2210,7 +2860,7 @@
           <w:rFonts w:eastAsia="DengXian"/>
         </w:rPr>
       </w:pPr>
-      <w:bookmarkStart w:id="3" w:name="_Toc230716412"/>
+      <w:bookmarkStart w:id="4" w:name="_Toc230804032"/>
       <w:proofErr w:type="gramStart"/>
       <w:r>
         <w:rPr>
@@ -2226,7 +2876,7 @@
         </w:rPr>
         <w:t>權限</w:t>
       </w:r>
-      <w:bookmarkEnd w:id="3"/>
+      <w:bookmarkEnd w:id="4"/>
     </w:p>
     <w:p>
       <w:pPr>
@@ -2348,7 +2998,7 @@
                     <pic:cNvPicPr/>
                   </pic:nvPicPr>
                   <pic:blipFill>
-                    <a:blip r:embed="rId12"/>
+                    <a:blip r:embed="rId19"/>
                     <a:stretch>
                       <a:fillRect/>
                     </a:stretch>
@@ -2397,7 +3047,7 @@
                     <pic:cNvPicPr/>
                   </pic:nvPicPr>
                   <pic:blipFill>
-                    <a:blip r:embed="rId13"/>
+                    <a:blip r:embed="rId20"/>
                     <a:stretch>
                       <a:fillRect/>
                     </a:stretch>
@@ -2446,7 +3096,7 @@
                     <pic:cNvPicPr/>
                   </pic:nvPicPr>
                   <pic:blipFill>
-                    <a:blip r:embed="rId14"/>
+                    <a:blip r:embed="rId21"/>
                     <a:stretch>
                       <a:fillRect/>
                     </a:stretch>
@@ -2496,7 +3146,7 @@
                     <pic:cNvPicPr/>
                   </pic:nvPicPr>
                   <pic:blipFill>
-                    <a:blip r:embed="rId15"/>
+                    <a:blip r:embed="rId22"/>
                     <a:stretch>
                       <a:fillRect/>
                     </a:stretch>
@@ -2545,7 +3195,7 @@
                     <pic:cNvPicPr/>
                   </pic:nvPicPr>
                   <pic:blipFill>
-                    <a:blip r:embed="rId16"/>
+                    <a:blip r:embed="rId23"/>
                     <a:stretch>
                       <a:fillRect/>
                     </a:stretch>
@@ -2592,7 +3242,7 @@
           <w:rFonts w:ascii="DengXian" w:eastAsia="DengXian" w:hAnsi="DengXian"/>
         </w:rPr>
       </w:pPr>
-      <w:bookmarkStart w:id="4" w:name="_Toc230716413"/>
+      <w:bookmarkStart w:id="5" w:name="_Toc230804033"/>
       <w:proofErr w:type="gramStart"/>
       <w:r>
         <w:rPr>
@@ -2601,7 +3251,7 @@
         <w:lastRenderedPageBreak/>
         <w:t>顯卡設定</w:t>
       </w:r>
-      <w:bookmarkEnd w:id="4"/>
+      <w:bookmarkEnd w:id="5"/>
       <w:proofErr w:type="gramEnd"/>
     </w:p>
     <w:p>
@@ -2630,7 +3280,7 @@
                     <pic:cNvPicPr/>
                   </pic:nvPicPr>
                   <pic:blipFill>
-                    <a:blip r:embed="rId17"/>
+                    <a:blip r:embed="rId24"/>
                     <a:stretch>
                       <a:fillRect/>
                     </a:stretch>
@@ -2676,7 +3326,7 @@
                     <pic:cNvPicPr/>
                   </pic:nvPicPr>
                   <pic:blipFill>
-                    <a:blip r:embed="rId18"/>
+                    <a:blip r:embed="rId25"/>
                     <a:stretch>
                       <a:fillRect/>
                     </a:stretch>
@@ -2715,7 +3365,7 @@
       <w:pPr>
         <w:pStyle w:val="1"/>
       </w:pPr>
-      <w:bookmarkStart w:id="5" w:name="_Toc230716414"/>
+      <w:bookmarkStart w:id="6" w:name="_Toc230804034"/>
       <w:r>
         <w:rPr>
           <w:rFonts w:ascii="DengXian" w:eastAsia="新細明體" w:hAnsi="DengXian" w:hint="eastAsia"/>
@@ -2723,7 +3373,7 @@
         <w:lastRenderedPageBreak/>
         <w:t>安裝指令</w:t>
       </w:r>
-      <w:bookmarkEnd w:id="5"/>
+      <w:bookmarkEnd w:id="6"/>
     </w:p>
     <w:p>
       <w:pPr>
@@ -3029,7 +3679,7 @@
                     <pic:cNvPicPr/>
                   </pic:nvPicPr>
                   <pic:blipFill>
-                    <a:blip r:embed="rId19"/>
+                    <a:blip r:embed="rId26"/>
                     <a:stretch>
                       <a:fillRect/>
                     </a:stretch>
@@ -3071,7 +3721,7 @@
           <w:lang w:eastAsia="zh-CN"/>
         </w:rPr>
       </w:pPr>
-      <w:bookmarkStart w:id="6" w:name="_Toc230716415"/>
+      <w:bookmarkStart w:id="7" w:name="_Toc230804035"/>
       <w:r>
         <w:rPr>
           <w:rFonts w:hint="eastAsia"/>
@@ -3079,7 +3729,7 @@
         <w:lastRenderedPageBreak/>
         <w:t>伺服器</w:t>
       </w:r>
-      <w:bookmarkEnd w:id="6"/>
+      <w:bookmarkEnd w:id="7"/>
     </w:p>
     <w:p>
       <w:pPr>
@@ -3111,7 +3761,7 @@
                     <pic:cNvPicPr/>
                   </pic:nvPicPr>
                   <pic:blipFill>
-                    <a:blip r:embed="rId20"/>
+                    <a:blip r:embed="rId27"/>
                     <a:stretch>
                       <a:fillRect/>
                     </a:stretch>
@@ -3917,7 +4567,7 @@
                     <pic:cNvPicPr/>
                   </pic:nvPicPr>
                   <pic:blipFill>
-                    <a:blip r:embed="rId21"/>
+                    <a:blip r:embed="rId28"/>
                     <a:stretch>
                       <a:fillRect/>
                     </a:stretch>
@@ -3972,7 +4622,7 @@
                     <pic:cNvPicPr/>
                   </pic:nvPicPr>
                   <pic:blipFill>
-                    <a:blip r:embed="rId22"/>
+                    <a:blip r:embed="rId29"/>
                     <a:stretch>
                       <a:fillRect/>
                     </a:stretch>
@@ -4080,7 +4730,7 @@
                     <pic:cNvPicPr/>
                   </pic:nvPicPr>
                   <pic:blipFill>
-                    <a:blip r:embed="rId23"/>
+                    <a:blip r:embed="rId30"/>
                     <a:stretch>
                       <a:fillRect/>
                     </a:stretch>
@@ -4126,7 +4776,7 @@
                     <pic:cNvPicPr/>
                   </pic:nvPicPr>
                   <pic:blipFill>
-                    <a:blip r:embed="rId24"/>
+                    <a:blip r:embed="rId31"/>
                     <a:stretch>
                       <a:fillRect/>
                     </a:stretch>
@@ -4185,7 +4835,7 @@
                     <pic:cNvPicPr/>
                   </pic:nvPicPr>
                   <pic:blipFill>
-                    <a:blip r:embed="rId25"/>
+                    <a:blip r:embed="rId32"/>
                     <a:stretch>
                       <a:fillRect/>
                     </a:stretch>
@@ -4272,7 +4922,7 @@
                     <pic:cNvPicPr/>
                   </pic:nvPicPr>
                   <pic:blipFill>
-                    <a:blip r:embed="rId26"/>
+                    <a:blip r:embed="rId33"/>
                     <a:stretch>
                       <a:fillRect/>
                     </a:stretch>
@@ -4308,7 +4958,7 @@
           <w:lang w:eastAsia="zh-CN"/>
         </w:rPr>
       </w:pPr>
-      <w:bookmarkStart w:id="7" w:name="_Toc230716416"/>
+      <w:bookmarkStart w:id="8" w:name="_Toc230804036"/>
       <w:r>
         <w:rPr>
           <w:rFonts w:hint="eastAsia"/>
@@ -4316,7 +4966,7 @@
         <w:lastRenderedPageBreak/>
         <w:t>製作規劃</w:t>
       </w:r>
-      <w:bookmarkEnd w:id="7"/>
+      <w:bookmarkEnd w:id="8"/>
     </w:p>
     <w:p>
       <w:r>
@@ -4515,7 +5165,7 @@
                     <pic:cNvPicPr/>
                   </pic:nvPicPr>
                   <pic:blipFill>
-                    <a:blip r:embed="rId27"/>
+                    <a:blip r:embed="rId34"/>
                     <a:stretch>
                       <a:fillRect/>
                     </a:stretch>
@@ -4560,7 +5210,7 @@
                     <pic:cNvPicPr/>
                   </pic:nvPicPr>
                   <pic:blipFill>
-                    <a:blip r:embed="rId28"/>
+                    <a:blip r:embed="rId35"/>
                     <a:stretch>
                       <a:fillRect/>
                     </a:stretch>
@@ -4606,7 +5256,7 @@
                     <pic:cNvPicPr/>
                   </pic:nvPicPr>
                   <pic:blipFill>
-                    <a:blip r:embed="rId29"/>
+                    <a:blip r:embed="rId36"/>
                     <a:stretch>
                       <a:fillRect/>
                     </a:stretch>
@@ -4656,7 +5306,7 @@
                     <pic:cNvPicPr/>
                   </pic:nvPicPr>
                   <pic:blipFill>
-                    <a:blip r:embed="rId30"/>
+                    <a:blip r:embed="rId37"/>
                     <a:stretch>
                       <a:fillRect/>
                     </a:stretch>
@@ -4701,7 +5351,7 @@
                     <pic:cNvPicPr/>
                   </pic:nvPicPr>
                   <pic:blipFill>
-                    <a:blip r:embed="rId31"/>
+                    <a:blip r:embed="rId38"/>
                     <a:stretch>
                       <a:fillRect/>
                     </a:stretch>
@@ -4747,7 +5397,7 @@
                     <pic:cNvPicPr/>
                   </pic:nvPicPr>
                   <pic:blipFill>
-                    <a:blip r:embed="rId32"/>
+                    <a:blip r:embed="rId39"/>
                     <a:stretch>
                       <a:fillRect/>
                     </a:stretch>
@@ -4792,7 +5442,7 @@
                     <pic:cNvPicPr/>
                   </pic:nvPicPr>
                   <pic:blipFill>
-                    <a:blip r:embed="rId33"/>
+                    <a:blip r:embed="rId40"/>
                     <a:stretch>
                       <a:fillRect/>
                     </a:stretch>
@@ -4837,7 +5487,7 @@
                     <pic:cNvPicPr/>
                   </pic:nvPicPr>
                   <pic:blipFill>
-                    <a:blip r:embed="rId34"/>
+                    <a:blip r:embed="rId41"/>
                     <a:stretch>
                       <a:fillRect/>
                     </a:stretch>
@@ -4883,7 +5533,7 @@
                     <pic:cNvPicPr/>
                   </pic:nvPicPr>
                   <pic:blipFill>
-                    <a:blip r:embed="rId35"/>
+                    <a:blip r:embed="rId42"/>
                     <a:stretch>
                       <a:fillRect/>
                     </a:stretch>

</xml_diff>

<commit_message>
0.13.12 refactor(config): extract animation timing constants and tune visual pacing
</commit_message>
<xml_diff>
--- a/To do.docx
+++ b/To do.docx
@@ -1183,10 +1183,110 @@
         <w:sdtPr>
           <w:rPr>
             <w:rFonts w:eastAsia="DengXian" w:hint="eastAsia"/>
+            <w:lang w:eastAsia="zh-CN"/>
           </w:rPr>
           <w:id w:val="526533512"/>
           <w14:checkbox>
-            <w14:checked w14:val="0"/>
+            <w14:checked w14:val="1"/>
+            <w14:checkedState w14:val="2612" w14:font="MS Gothic"/>
+            <w14:uncheckedState w14:val="2610" w14:font="MS Gothic"/>
+          </w14:checkbox>
+        </w:sdtPr>
+        <w:sdtContent>
+          <w:r>
+            <w:rPr>
+              <w:rFonts w:ascii="MS Gothic" w:eastAsia="MS Gothic" w:hAnsi="MS Gothic" w:hint="eastAsia"/>
+              <w:lang w:eastAsia="zh-CN"/>
+            </w:rPr>
+            <w:t>☒</w:t>
+          </w:r>
+        </w:sdtContent>
+      </w:sdt>
+      <w:r>
+        <w:rPr>
+          <w:rFonts w:hint="eastAsia"/>
+          <w:lang w:eastAsia="zh-CN"/>
+        </w:rPr>
+        <w:t xml:space="preserve"> </w:t>
+      </w:r>
+      <w:proofErr w:type="gramStart"/>
+      <w:r>
+        <w:rPr>
+          <w:rFonts w:ascii="DengXian" w:eastAsia="DengXian" w:hAnsi="DengXian" w:hint="eastAsia"/>
+          <w:lang w:eastAsia="zh-CN"/>
+        </w:rPr>
+        <w:t>记录</w:t>
+      </w:r>
+      <w:r>
+        <w:rPr>
+          <w:rFonts w:eastAsia="DengXian" w:hint="eastAsia"/>
+          <w:lang w:eastAsia="zh-CN"/>
+        </w:rPr>
+        <w:t>水</w:t>
+      </w:r>
+      <w:proofErr w:type="gramEnd"/>
+      <w:r>
+        <w:rPr>
+          <w:rFonts w:eastAsia="DengXian" w:hint="eastAsia"/>
+          <w:lang w:eastAsia="zh-CN"/>
+        </w:rPr>
+        <w:t>波纹过程</w:t>
+      </w:r>
+    </w:p>
+    <w:p>
+      <w:pPr>
+        <w:jc w:val="left"/>
+        <w:rPr>
+          <w:rFonts w:eastAsia="DengXian" w:hint="eastAsia"/>
+          <w:lang w:eastAsia="zh-CN"/>
+        </w:rPr>
+      </w:pPr>
+      <w:sdt>
+        <w:sdtPr>
+          <w:rPr>
+            <w:rFonts w:eastAsia="DengXian" w:hint="eastAsia"/>
+            <w:lang w:eastAsia="zh-CN"/>
+          </w:rPr>
+          <w:id w:val="-1335524975"/>
+          <w14:checkbox>
+            <w14:checked w14:val="1"/>
+            <w14:checkedState w14:val="2612" w14:font="MS Gothic"/>
+            <w14:uncheckedState w14:val="2610" w14:font="MS Gothic"/>
+          </w14:checkbox>
+        </w:sdtPr>
+        <w:sdtContent>
+          <w:r>
+            <w:rPr>
+              <w:rFonts w:ascii="MS Gothic" w:eastAsia="MS Gothic" w:hAnsi="MS Gothic" w:hint="eastAsia"/>
+              <w:lang w:eastAsia="zh-CN"/>
+            </w:rPr>
+            <w:t>☒</w:t>
+          </w:r>
+        </w:sdtContent>
+      </w:sdt>
+      <w:r>
+        <w:rPr>
+          <w:rFonts w:eastAsia="DengXian" w:hint="eastAsia"/>
+          <w:lang w:eastAsia="zh-CN"/>
+        </w:rPr>
+        <w:t xml:space="preserve"> 水波纹过程逆向</w:t>
+      </w:r>
+    </w:p>
+    <w:p>
+      <w:pPr>
+        <w:jc w:val="left"/>
+        <w:rPr>
+          <w:rFonts w:eastAsia="DengXian"/>
+        </w:rPr>
+      </w:pPr>
+      <w:sdt>
+        <w:sdtPr>
+          <w:rPr>
+            <w:rFonts w:eastAsia="DengXian" w:hint="eastAsia"/>
+          </w:rPr>
+          <w:id w:val="-287355676"/>
+          <w14:checkbox>
+            <w14:checked w14:val="1"/>
             <w14:checkedState w14:val="2612" w14:font="MS Gothic"/>
             <w14:uncheckedState w14:val="2610" w14:font="MS Gothic"/>
           </w14:checkbox>
@@ -1196,92 +1296,7 @@
             <w:rPr>
               <w:rFonts w:ascii="MS Gothic" w:eastAsia="MS Gothic" w:hAnsi="MS Gothic" w:hint="eastAsia"/>
             </w:rPr>
-            <w:t>☐</w:t>
-          </w:r>
-        </w:sdtContent>
-      </w:sdt>
-      <w:r>
-        <w:rPr>
-          <w:rFonts w:hint="eastAsia"/>
-        </w:rPr>
-        <w:t xml:space="preserve"> </w:t>
-      </w:r>
-      <w:r>
-        <w:rPr>
-          <w:rFonts w:ascii="DengXian" w:eastAsia="DengXian" w:hAnsi="DengXian" w:hint="eastAsia"/>
-        </w:rPr>
-        <w:t>记录</w:t>
-      </w:r>
-      <w:r>
-        <w:rPr>
-          <w:rFonts w:eastAsia="DengXian" w:hint="eastAsia"/>
-          <w:lang w:eastAsia="zh-CN"/>
-        </w:rPr>
-        <w:t>水波纹过程</w:t>
-      </w:r>
-    </w:p>
-    <w:p>
-      <w:pPr>
-        <w:jc w:val="left"/>
-        <w:rPr>
-          <w:rFonts w:eastAsia="DengXian" w:hint="eastAsia"/>
-          <w:lang w:eastAsia="zh-CN"/>
-        </w:rPr>
-      </w:pPr>
-      <w:sdt>
-        <w:sdtPr>
-          <w:rPr>
-            <w:rFonts w:eastAsia="DengXian" w:hint="eastAsia"/>
-          </w:rPr>
-          <w:id w:val="-1335524975"/>
-          <w14:checkbox>
-            <w14:checked w14:val="0"/>
-            <w14:checkedState w14:val="2612" w14:font="MS Gothic"/>
-            <w14:uncheckedState w14:val="2610" w14:font="MS Gothic"/>
-          </w14:checkbox>
-        </w:sdtPr>
-        <w:sdtContent>
-          <w:r>
-            <w:rPr>
-              <w:rFonts w:ascii="MS Gothic" w:eastAsia="MS Gothic" w:hAnsi="MS Gothic" w:hint="eastAsia"/>
-            </w:rPr>
-            <w:t>☐</w:t>
-          </w:r>
-        </w:sdtContent>
-      </w:sdt>
-      <w:r>
-        <w:rPr>
-          <w:rFonts w:eastAsia="DengXian" w:hint="eastAsia"/>
-          <w:lang w:eastAsia="zh-CN"/>
-        </w:rPr>
-        <w:t xml:space="preserve"> 水波纹过程逆向</w:t>
-      </w:r>
-    </w:p>
-    <w:p>
-      <w:pPr>
-        <w:jc w:val="left"/>
-        <w:rPr>
-          <w:rFonts w:eastAsia="DengXian"/>
-        </w:rPr>
-      </w:pPr>
-      <w:sdt>
-        <w:sdtPr>
-          <w:rPr>
-            <w:rFonts w:eastAsia="DengXian" w:hint="eastAsia"/>
-          </w:rPr>
-          <w:id w:val="-287355676"/>
-          <w14:checkbox>
-            <w14:checked w14:val="0"/>
-            <w14:checkedState w14:val="2612" w14:font="MS Gothic"/>
-            <w14:uncheckedState w14:val="2610" w14:font="MS Gothic"/>
-          </w14:checkbox>
-        </w:sdtPr>
-        <w:sdtContent>
-          <w:r>
-            <w:rPr>
-              <w:rFonts w:ascii="MS Gothic" w:eastAsia="MS Gothic" w:hAnsi="MS Gothic" w:hint="eastAsia"/>
-            </w:rPr>
-            <w:t>☐</w:t>
+            <w:t>☒</w:t>
           </w:r>
         </w:sdtContent>
       </w:sdt>
@@ -3404,143 +3419,111 @@
           <w:lang w:eastAsia="zh-CN"/>
         </w:rPr>
       </w:pPr>
-      <w:proofErr w:type="spellStart"/>
       <w:r>
         <w:rPr>
           <w:rFonts w:eastAsia="新細明體"/>
         </w:rPr>
-        <w:t>npm</w:t>
-      </w:r>
-      <w:proofErr w:type="spellEnd"/>
+        <w:t>npm install react-router-dom</w:t>
+      </w:r>
+    </w:p>
+    <w:p>
+      <w:pPr>
+        <w:jc w:val="left"/>
+        <w:rPr>
+          <w:rFonts w:eastAsia="DengXian"/>
+          <w:lang w:eastAsia="zh-CN"/>
+        </w:rPr>
+      </w:pPr>
       <w:r>
         <w:rPr>
           <w:rFonts w:eastAsia="新細明體"/>
         </w:rPr>
-        <w:t xml:space="preserve"> install react-router-</w:t>
-      </w:r>
-      <w:proofErr w:type="spellStart"/>
+        <w:t xml:space="preserve"># </w:t>
+      </w:r>
+      <w:r>
+        <w:rPr>
+          <w:rFonts w:eastAsia="新細明體" w:hint="eastAsia"/>
+        </w:rPr>
+        <w:t>安裝前端</w:t>
+      </w:r>
       <w:r>
         <w:rPr>
           <w:rFonts w:eastAsia="新細明體"/>
         </w:rPr>
-        <w:t>dom</w:t>
-      </w:r>
-      <w:proofErr w:type="spellEnd"/>
-    </w:p>
-    <w:p>
-      <w:pPr>
-        <w:jc w:val="left"/>
+        <w:t xml:space="preserve"> Socket </w:t>
+      </w:r>
+      <w:r>
+        <w:rPr>
+          <w:rFonts w:eastAsia="新細明體" w:hint="eastAsia"/>
+        </w:rPr>
+        <w:t>用戶端</w:t>
+      </w:r>
+      <w:r>
         <w:rPr>
           <w:rFonts w:eastAsia="DengXian"/>
           <w:lang w:eastAsia="zh-CN"/>
         </w:rPr>
+        <w:t xml:space="preserve"> </w:t>
+      </w:r>
+    </w:p>
+    <w:p>
+      <w:pPr>
+        <w:ind w:firstLine="480"/>
+        <w:jc w:val="left"/>
+        <w:rPr>
+          <w:rFonts w:eastAsia="DengXian"/>
+          <w:lang w:eastAsia="zh-CN"/>
+        </w:rPr>
       </w:pPr>
       <w:r>
         <w:rPr>
           <w:rFonts w:eastAsia="新細明體"/>
         </w:rPr>
+        <w:t>npm install socket.io-client</w:t>
+      </w:r>
+    </w:p>
+    <w:p>
+      <w:pPr>
+        <w:jc w:val="left"/>
+        <w:rPr>
+          <w:rFonts w:eastAsia="DengXian"/>
+          <w:lang w:eastAsia="zh-CN"/>
+        </w:rPr>
+      </w:pPr>
+      <w:r>
+        <w:rPr>
+          <w:rFonts w:eastAsia="新細明體"/>
+        </w:rPr>
         <w:t xml:space="preserve"># </w:t>
       </w:r>
       <w:r>
         <w:rPr>
           <w:rFonts w:eastAsia="新細明體" w:hint="eastAsia"/>
         </w:rPr>
-        <w:t>安裝前端</w:t>
-      </w:r>
+        <w:t>安裝後端伺服器套件（用來當兩台裝置的郵差）</w:t>
+      </w:r>
+      <w:r>
+        <w:rPr>
+          <w:rFonts w:eastAsia="DengXian"/>
+          <w:lang w:eastAsia="zh-CN"/>
+        </w:rPr>
+        <w:t xml:space="preserve"> </w:t>
+      </w:r>
+    </w:p>
+    <w:p>
+      <w:pPr>
+        <w:ind w:firstLine="480"/>
+        <w:jc w:val="left"/>
+        <w:rPr>
+          <w:rFonts w:eastAsia="DengXian"/>
+          <w:lang w:eastAsia="zh-CN"/>
+        </w:rPr>
+      </w:pPr>
       <w:r>
         <w:rPr>
           <w:rFonts w:eastAsia="新細明體"/>
         </w:rPr>
-        <w:t xml:space="preserve"> Socket </w:t>
-      </w:r>
-      <w:r>
-        <w:rPr>
-          <w:rFonts w:eastAsia="新細明體" w:hint="eastAsia"/>
-        </w:rPr>
-        <w:t>用戶端</w:t>
-      </w:r>
-      <w:r>
-        <w:rPr>
-          <w:rFonts w:eastAsia="DengXian"/>
-          <w:lang w:eastAsia="zh-CN"/>
-        </w:rPr>
-        <w:t xml:space="preserve"> </w:t>
-      </w:r>
-    </w:p>
-    <w:p>
-      <w:pPr>
-        <w:ind w:firstLine="480"/>
-        <w:jc w:val="left"/>
-        <w:rPr>
-          <w:rFonts w:eastAsia="DengXian"/>
-          <w:lang w:eastAsia="zh-CN"/>
-        </w:rPr>
-      </w:pPr>
-      <w:proofErr w:type="spellStart"/>
-      <w:r>
-        <w:rPr>
-          <w:rFonts w:eastAsia="新細明體"/>
-        </w:rPr>
-        <w:t>npm</w:t>
-      </w:r>
-      <w:proofErr w:type="spellEnd"/>
-      <w:r>
-        <w:rPr>
-          <w:rFonts w:eastAsia="新細明體"/>
-        </w:rPr>
-        <w:t xml:space="preserve"> install socket.io-client</w:t>
-      </w:r>
-    </w:p>
-    <w:p>
-      <w:pPr>
-        <w:jc w:val="left"/>
-        <w:rPr>
-          <w:rFonts w:eastAsia="DengXian"/>
-          <w:lang w:eastAsia="zh-CN"/>
-        </w:rPr>
-      </w:pPr>
-      <w:r>
-        <w:rPr>
-          <w:rFonts w:eastAsia="新細明體"/>
-        </w:rPr>
-        <w:t xml:space="preserve"># </w:t>
-      </w:r>
-      <w:r>
-        <w:rPr>
-          <w:rFonts w:eastAsia="新細明體" w:hint="eastAsia"/>
-        </w:rPr>
-        <w:t>安裝後端伺服器套件（用來當兩台裝置的郵差）</w:t>
-      </w:r>
-      <w:r>
-        <w:rPr>
-          <w:rFonts w:eastAsia="DengXian"/>
-          <w:lang w:eastAsia="zh-CN"/>
-        </w:rPr>
-        <w:t xml:space="preserve"> </w:t>
-      </w:r>
-    </w:p>
-    <w:p>
-      <w:pPr>
-        <w:ind w:firstLine="480"/>
-        <w:jc w:val="left"/>
-        <w:rPr>
-          <w:rFonts w:eastAsia="DengXian"/>
-          <w:lang w:eastAsia="zh-CN"/>
-        </w:rPr>
-      </w:pPr>
-      <w:proofErr w:type="spellStart"/>
-      <w:r>
-        <w:rPr>
-          <w:rFonts w:eastAsia="新細明體"/>
-        </w:rPr>
-        <w:t>npm</w:t>
-      </w:r>
-      <w:proofErr w:type="spellEnd"/>
-      <w:r>
-        <w:rPr>
-          <w:rFonts w:eastAsia="新細明體"/>
-        </w:rPr>
-        <w:t xml:space="preserve"> install express socket.io</w:t>
+        <w:t>npm install express socket.io</w:t>
       </w:r>
     </w:p>
     <w:p>
@@ -3621,34 +3604,7 @@
           <w:rFonts w:eastAsia="新細明體"/>
         </w:rPr>
         <w:tab/>
-      </w:r>
-      <w:proofErr w:type="spellStart"/>
-      <w:r>
-        <w:rPr>
-          <w:rFonts w:eastAsia="新細明體"/>
-        </w:rPr>
-        <w:t>npm</w:t>
-      </w:r>
-      <w:proofErr w:type="spellEnd"/>
-      <w:r>
-        <w:rPr>
-          <w:rFonts w:eastAsia="新細明體"/>
-        </w:rPr>
-        <w:t xml:space="preserve"> </w:t>
-      </w:r>
-      <w:proofErr w:type="spellStart"/>
-      <w:r>
-        <w:rPr>
-          <w:rFonts w:eastAsia="新細明體"/>
-        </w:rPr>
-        <w:t>i</w:t>
-      </w:r>
-      <w:proofErr w:type="spellEnd"/>
-      <w:r>
-        <w:rPr>
-          <w:rFonts w:eastAsia="新細明體"/>
-        </w:rPr>
-        <w:t xml:space="preserve"> howler</w:t>
+        <w:t>npm i howler</w:t>
       </w:r>
     </w:p>
     <w:p>
@@ -3983,28 +3939,12 @@
         </w:rPr>
         <w:t>安裝路由：</w:t>
       </w:r>
-      <w:proofErr w:type="spellStart"/>
       <w:r>
         <w:rPr>
           <w:rFonts w:eastAsia="新細明體"/>
         </w:rPr>
-        <w:t>npm</w:t>
-      </w:r>
-      <w:proofErr w:type="spellEnd"/>
-      <w:r>
-        <w:rPr>
-          <w:rFonts w:eastAsia="新細明體"/>
-        </w:rPr>
-        <w:t xml:space="preserve"> install react-router-</w:t>
-      </w:r>
-      <w:proofErr w:type="spellStart"/>
-      <w:r>
-        <w:rPr>
-          <w:rFonts w:eastAsia="新細明體"/>
-        </w:rPr>
-        <w:t>dom</w:t>
-      </w:r>
-      <w:proofErr w:type="spellEnd"/>
+        <w:t>npm install react-router-dom</w:t>
+      </w:r>
     </w:p>
     <w:p>
       <w:pPr>
@@ -4027,21 +3967,7 @@
         <w:rPr>
           <w:rFonts w:eastAsia="新細明體"/>
         </w:rPr>
-        <w:t xml:space="preserve"> </w:t>
-      </w:r>
-      <w:proofErr w:type="spellStart"/>
-      <w:r>
-        <w:rPr>
-          <w:rFonts w:eastAsia="新細明體"/>
-        </w:rPr>
-        <w:t>App.jsx</w:t>
-      </w:r>
-      <w:proofErr w:type="spellEnd"/>
-      <w:r>
-        <w:rPr>
-          <w:rFonts w:eastAsia="新細明體"/>
-        </w:rPr>
-        <w:t xml:space="preserve"> </w:t>
+        <w:t xml:space="preserve"> App.jsx </w:t>
       </w:r>
       <w:r>
         <w:rPr>
@@ -4061,14 +3987,12 @@
           <w:rFonts w:eastAsia="DengXian"/>
         </w:rPr>
       </w:pPr>
-      <w:proofErr w:type="spellStart"/>
       <w:r>
         <w:rPr>
           <w:rFonts w:eastAsia="新細明體"/>
         </w:rPr>
         <w:t>App.jsx</w:t>
       </w:r>
-      <w:proofErr w:type="spellEnd"/>
       <w:r>
         <w:rPr>
           <w:rFonts w:eastAsia="新細明體" w:hint="eastAsia"/>
@@ -4088,14 +4012,12 @@
           <w:lang w:eastAsia="zh-CN"/>
         </w:rPr>
       </w:pPr>
-      <w:proofErr w:type="spellStart"/>
       <w:r>
         <w:rPr>
           <w:rFonts w:eastAsia="新細明體"/>
         </w:rPr>
         <w:t>MonitorView.jsx</w:t>
       </w:r>
-      <w:proofErr w:type="spellEnd"/>
       <w:r>
         <w:rPr>
           <w:rFonts w:eastAsia="新細明體" w:hint="eastAsia"/>
@@ -4127,14 +4049,12 @@
           <w:lang w:eastAsia="zh-CN"/>
         </w:rPr>
       </w:pPr>
-      <w:proofErr w:type="spellStart"/>
       <w:r>
         <w:rPr>
           <w:rFonts w:eastAsia="新細明體"/>
         </w:rPr>
         <w:t>TabletView.jsx</w:t>
       </w:r>
-      <w:proofErr w:type="spellEnd"/>
       <w:r>
         <w:rPr>
           <w:rFonts w:eastAsia="新細明體" w:hint="eastAsia"/>
@@ -4409,112 +4329,80 @@
           <w:b/>
           <w:bCs/>
         </w:rPr>
-        <w:t xml:space="preserve"> </w:t>
-      </w:r>
-      <w:proofErr w:type="spellStart"/>
+        <w:t xml:space="preserve"> BroadcastChannel API)</w:t>
+      </w:r>
+    </w:p>
+    <w:p>
+      <w:pPr>
+        <w:jc w:val="left"/>
+        <w:rPr>
+          <w:rFonts w:eastAsia="DengXian"/>
+        </w:rPr>
+      </w:pPr>
+      <w:r>
+        <w:rPr>
+          <w:rFonts w:eastAsia="新細明體" w:hint="eastAsia"/>
+        </w:rPr>
+        <w:t>如果你的展場是使用一台效能較好的主機（如</w:t>
+      </w:r>
       <w:r>
         <w:rPr>
           <w:rFonts w:eastAsia="新細明體"/>
+        </w:rPr>
+        <w:t xml:space="preserve"> Mac Macni </w:t>
+      </w:r>
+      <w:r>
+        <w:rPr>
+          <w:rFonts w:eastAsia="新細明體" w:hint="eastAsia"/>
+        </w:rPr>
+        <w:t>或</w:t>
+      </w:r>
+      <w:r>
+        <w:rPr>
+          <w:rFonts w:eastAsia="新細明體"/>
+        </w:rPr>
+        <w:t xml:space="preserve"> PC</w:t>
+      </w:r>
+      <w:r>
+        <w:rPr>
+          <w:rFonts w:eastAsia="新細明體" w:hint="eastAsia"/>
+        </w:rPr>
+        <w:t>），同時外接兩個螢幕（一個掛牆上，一個平放當平板），這是</w:t>
+      </w:r>
+      <w:r>
+        <w:rPr>
+          <w:rFonts w:eastAsia="新細明體" w:hint="eastAsia"/>
           <w:b/>
           <w:bCs/>
         </w:rPr>
-        <w:t>BroadcastChannel</w:t>
-      </w:r>
-      <w:proofErr w:type="spellEnd"/>
+        <w:t>最推薦且最簡單</w:t>
+      </w:r>
+      <w:r>
+        <w:rPr>
+          <w:rFonts w:eastAsia="新細明體" w:hint="eastAsia"/>
+        </w:rPr>
+        <w:t>的做法！</w:t>
+      </w:r>
+    </w:p>
+    <w:p>
+      <w:pPr>
+        <w:jc w:val="left"/>
+        <w:rPr>
+          <w:rFonts w:eastAsia="DengXian"/>
+          <w:lang w:eastAsia="zh-CN"/>
+        </w:rPr>
+      </w:pPr>
+      <w:r>
+        <w:rPr>
+          <w:rFonts w:eastAsia="新細明體" w:hint="eastAsia"/>
+        </w:rPr>
+        <w:t>不需要寫後端伺服器，直接利用瀏覽器內建的</w:t>
+      </w:r>
       <w:r>
         <w:rPr>
           <w:rFonts w:eastAsia="新細明體"/>
-          <w:b/>
-          <w:bCs/>
-        </w:rPr>
-        <w:t xml:space="preserve"> API)</w:t>
-      </w:r>
-    </w:p>
-    <w:p>
-      <w:pPr>
-        <w:jc w:val="left"/>
-        <w:rPr>
-          <w:rFonts w:eastAsia="DengXian"/>
-        </w:rPr>
-      </w:pPr>
-      <w:r>
-        <w:rPr>
-          <w:rFonts w:eastAsia="新細明體" w:hint="eastAsia"/>
-        </w:rPr>
-        <w:t>如果你的展場是使用一台效能較好的主機（如</w:t>
-      </w:r>
-      <w:r>
-        <w:rPr>
-          <w:rFonts w:eastAsia="新細明體"/>
-        </w:rPr>
-        <w:t xml:space="preserve"> Mac Macni </w:t>
-      </w:r>
-      <w:r>
-        <w:rPr>
-          <w:rFonts w:eastAsia="新細明體" w:hint="eastAsia"/>
-        </w:rPr>
-        <w:t>或</w:t>
-      </w:r>
-      <w:r>
-        <w:rPr>
-          <w:rFonts w:eastAsia="新細明體"/>
-        </w:rPr>
-        <w:t xml:space="preserve"> PC</w:t>
-      </w:r>
-      <w:r>
-        <w:rPr>
-          <w:rFonts w:eastAsia="新細明體" w:hint="eastAsia"/>
-        </w:rPr>
-        <w:t>），同時外接兩個螢幕（一個掛牆上，一個平放當平板），這是</w:t>
-      </w:r>
-      <w:r>
-        <w:rPr>
-          <w:rFonts w:eastAsia="新細明體" w:hint="eastAsia"/>
-          <w:b/>
-          <w:bCs/>
-        </w:rPr>
-        <w:t>最推薦且最簡單</w:t>
-      </w:r>
-      <w:r>
-        <w:rPr>
-          <w:rFonts w:eastAsia="新細明體" w:hint="eastAsia"/>
-        </w:rPr>
-        <w:t>的做法！</w:t>
-      </w:r>
-    </w:p>
-    <w:p>
-      <w:pPr>
-        <w:jc w:val="left"/>
-        <w:rPr>
-          <w:rFonts w:eastAsia="DengXian"/>
-          <w:lang w:eastAsia="zh-CN"/>
-        </w:rPr>
-      </w:pPr>
-      <w:r>
-        <w:rPr>
-          <w:rFonts w:eastAsia="新細明體" w:hint="eastAsia"/>
-        </w:rPr>
-        <w:t>不需要寫後端伺服器，直接利用瀏覽器內建的</w:t>
-      </w:r>
-      <w:r>
-        <w:rPr>
-          <w:rFonts w:eastAsia="新細明體"/>
-        </w:rPr>
-        <w:t xml:space="preserve"> </w:t>
-      </w:r>
-      <w:proofErr w:type="spellStart"/>
-      <w:r>
-        <w:rPr>
-          <w:rFonts w:eastAsia="新細明體"/>
-        </w:rPr>
-        <w:t>BroadcastChannel</w:t>
-      </w:r>
-      <w:proofErr w:type="spellEnd"/>
-      <w:r>
-        <w:rPr>
-          <w:rFonts w:eastAsia="新細明體"/>
-        </w:rPr>
-        <w:t xml:space="preserve"> </w:t>
+        </w:rPr>
+        <w:t xml:space="preserve"> BroadcastChannel </w:t>
       </w:r>
       <w:r>
         <w:rPr>

</xml_diff>

<commit_message>
0.13.16 chore(assets): completely replace text image assets
</commit_message>
<xml_diff>
--- a/To do.docx
+++ b/To do.docx
@@ -5,6 +5,11 @@
     <w:sdt>
       <w:sdtPr>
         <w:rPr>
+          <w:rFonts w:asciiTheme="minorHAnsi" w:eastAsiaTheme="minorEastAsia" w:hAnsiTheme="minorHAnsi" w:cstheme="minorBidi"/>
+          <w:color w:val="auto"/>
+          <w:kern w:val="2"/>
+          <w:sz w:val="24"/>
+          <w:szCs w:val="22"/>
           <w:lang w:val="zh-TW"/>
         </w:rPr>
         <w:id w:val="-1432343034"/>
@@ -15,13 +20,8 @@
       </w:sdtPr>
       <w:sdtEndPr>
         <w:rPr>
-          <w:rFonts w:asciiTheme="minorHAnsi" w:eastAsiaTheme="minorEastAsia" w:hAnsiTheme="minorHAnsi" w:cstheme="minorBidi"/>
           <w:b/>
           <w:bCs/>
-          <w:color w:val="auto"/>
-          <w:kern w:val="2"/>
-          <w:sz w:val="24"/>
-          <w:szCs w:val="22"/>
         </w:rPr>
       </w:sdtEndPr>
       <w:sdtContent>
@@ -697,9 +697,6 @@
     <w:p>
       <w:pPr>
         <w:jc w:val="left"/>
-        <w:rPr>
-          <w:rFonts w:hint="eastAsia"/>
-        </w:rPr>
       </w:pPr>
     </w:p>
     <w:p>
@@ -728,7 +725,7 @@
       <w:pPr>
         <w:pStyle w:val="1"/>
         <w:rPr>
-          <w:rFonts w:eastAsia="DengXian" w:hint="eastAsia"/>
+          <w:rFonts w:eastAsia="DengXian"/>
         </w:rPr>
       </w:pPr>
       <w:bookmarkStart w:id="0" w:name="_Toc230804028"/>
@@ -736,7 +733,6 @@
         <w:rPr>
           <w:rFonts w:eastAsia="新細明體" w:hint="eastAsia"/>
         </w:rPr>
-        <w:lastRenderedPageBreak/>
         <w:t>待辦事項</w:t>
       </w:r>
       <w:bookmarkEnd w:id="0"/>
@@ -983,7 +979,7 @@
       <w:pPr>
         <w:jc w:val="left"/>
         <w:rPr>
-          <w:rFonts w:eastAsia="DengXian" w:hint="eastAsia"/>
+          <w:rFonts w:eastAsia="DengXian"/>
         </w:rPr>
       </w:pPr>
       <w:sdt>
@@ -1162,11 +1158,13 @@
         <w:jc w:val="left"/>
         <w:rPr>
           <w:rFonts w:asciiTheme="minorEastAsia" w:eastAsia="DengXian" w:hAnsiTheme="minorEastAsia"/>
-        </w:rPr>
-      </w:pPr>
-      <w:r>
-        <w:rPr>
-          <w:rFonts w:eastAsia="新細明體" w:hint="eastAsia"/>
+          <w:lang w:eastAsia="zh-CN"/>
+        </w:rPr>
+      </w:pPr>
+      <w:r>
+        <w:rPr>
+          <w:rFonts w:eastAsia="新細明體" w:hint="eastAsia"/>
+          <w:lang w:eastAsia="zh-CN"/>
         </w:rPr>
         <w:t>科技組：</w:t>
       </w:r>
@@ -1237,7 +1235,7 @@
       <w:pPr>
         <w:jc w:val="left"/>
         <w:rPr>
-          <w:rFonts w:eastAsia="DengXian" w:hint="eastAsia"/>
+          <w:rFonts w:eastAsia="DengXian"/>
           <w:lang w:eastAsia="zh-CN"/>
         </w:rPr>
       </w:pPr>
@@ -1318,7 +1316,6 @@
         <w:jc w:val="left"/>
         <w:rPr>
           <w:rFonts w:eastAsia="DengXian"/>
-          <w:lang w:eastAsia="zh-CN"/>
         </w:rPr>
       </w:pPr>
       <w:sdt>
@@ -1367,6 +1364,7 @@
         <w:sdtPr>
           <w:rPr>
             <w:rFonts w:eastAsia="DengXian" w:hint="eastAsia"/>
+            <w:lang w:eastAsia="zh-CN"/>
           </w:rPr>
           <w:id w:val="-1630004191"/>
           <w14:checkbox>
@@ -1379,6 +1377,7 @@
           <w:r>
             <w:rPr>
               <w:rFonts w:ascii="MS Gothic" w:eastAsia="MS Gothic" w:hAnsi="MS Gothic" w:hint="eastAsia"/>
+              <w:lang w:eastAsia="zh-CN"/>
             </w:rPr>
             <w:t>☐</w:t>
           </w:r>
@@ -1396,13 +1395,14 @@
       <w:pPr>
         <w:jc w:val="left"/>
         <w:rPr>
-          <w:rFonts w:hint="eastAsia"/>
+          <w:lang w:eastAsia="zh-CN"/>
         </w:rPr>
       </w:pPr>
       <w:sdt>
         <w:sdtPr>
           <w:rPr>
             <w:rFonts w:eastAsia="DengXian" w:hint="eastAsia"/>
+            <w:lang w:eastAsia="zh-CN"/>
           </w:rPr>
           <w:id w:val="-506598520"/>
           <w14:checkbox>
@@ -1415,6 +1415,7 @@
           <w:r>
             <w:rPr>
               <w:rFonts w:ascii="MS Gothic" w:eastAsia="MS Gothic" w:hAnsi="MS Gothic" w:hint="eastAsia"/>
+              <w:lang w:eastAsia="zh-CN"/>
             </w:rPr>
             <w:t>☐</w:t>
           </w:r>
@@ -1432,7 +1433,7 @@
       <w:pPr>
         <w:jc w:val="left"/>
         <w:rPr>
-          <w:rFonts w:eastAsia="DengXian"/>
+          <w:rFonts w:eastAsia="DengXian" w:hint="eastAsia"/>
         </w:rPr>
       </w:pPr>
       <w:sdt>
@@ -1486,12 +1487,18 @@
         </w:rPr>
         <w:t>)</w:t>
       </w:r>
-    </w:p>
-    <w:p>
-      <w:pPr>
-        <w:jc w:val="left"/>
-        <w:rPr>
-          <w:rFonts w:asciiTheme="minorEastAsia" w:hAnsiTheme="minorEastAsia" w:hint="eastAsia"/>
+      <w:r>
+        <w:rPr>
+          <w:rFonts w:asciiTheme="minorEastAsia" w:hAnsiTheme="minorEastAsia"/>
+        </w:rPr>
+        <w:tab/>
+      </w:r>
+    </w:p>
+    <w:p>
+      <w:pPr>
+        <w:jc w:val="left"/>
+        <w:rPr>
+          <w:rFonts w:asciiTheme="minorEastAsia" w:hAnsiTheme="minorEastAsia"/>
         </w:rPr>
       </w:pPr>
       <w:sdt>
@@ -1532,7 +1539,7 @@
       <w:pPr>
         <w:jc w:val="left"/>
         <w:rPr>
-          <w:rFonts w:asciiTheme="minorEastAsia" w:hAnsiTheme="minorEastAsia" w:hint="eastAsia"/>
+          <w:rFonts w:asciiTheme="minorEastAsia" w:hAnsiTheme="minorEastAsia"/>
         </w:rPr>
       </w:pPr>
       <w:sdt>
@@ -1572,9 +1579,6 @@
     <w:p>
       <w:pPr>
         <w:jc w:val="left"/>
-        <w:rPr>
-          <w:rFonts w:hint="eastAsia"/>
-        </w:rPr>
       </w:pPr>
       <w:sdt>
         <w:sdtPr>
@@ -1622,7 +1626,7 @@
       <w:pPr>
         <w:jc w:val="left"/>
         <w:rPr>
-          <w:rFonts w:eastAsia="DengXian" w:hint="eastAsia"/>
+          <w:rFonts w:eastAsia="DengXian"/>
         </w:rPr>
       </w:pPr>
       <w:sdt>
@@ -1701,7 +1705,7 @@
       <w:pPr>
         <w:jc w:val="left"/>
         <w:rPr>
-          <w:rFonts w:eastAsia="DengXian" w:hint="eastAsia"/>
+          <w:rFonts w:eastAsia="DengXian"/>
         </w:rPr>
       </w:pPr>
       <w:sdt>
@@ -1836,7 +1840,7 @@
       <w:pPr>
         <w:jc w:val="left"/>
         <w:rPr>
-          <w:rFonts w:asciiTheme="minorEastAsia" w:eastAsia="DengXian" w:hAnsiTheme="minorEastAsia" w:hint="eastAsia"/>
+          <w:rFonts w:asciiTheme="minorEastAsia" w:eastAsia="DengXian" w:hAnsiTheme="minorEastAsia"/>
         </w:rPr>
       </w:pPr>
       <w:sdt>
@@ -1877,7 +1881,7 @@
       <w:pPr>
         <w:jc w:val="left"/>
         <w:rPr>
-          <w:rFonts w:eastAsia="DengXian" w:hint="eastAsia"/>
+          <w:rFonts w:eastAsia="DengXian"/>
         </w:rPr>
       </w:pPr>
       <w:sdt>
@@ -2264,7 +2268,6 @@
         <w:rPr>
           <w:rFonts w:eastAsia="DengXian"/>
         </w:rPr>
-        <w:lastRenderedPageBreak/>
         <w:br w:type="page"/>
       </w:r>
     </w:p>
@@ -2272,7 +2275,7 @@
       <w:pPr>
         <w:pStyle w:val="1"/>
         <w:rPr>
-          <w:rFonts w:eastAsia="新細明體" w:hint="eastAsia"/>
+          <w:rFonts w:eastAsia="新細明體"/>
         </w:rPr>
       </w:pPr>
       <w:bookmarkStart w:id="1" w:name="_Toc230804029"/>
@@ -2280,7 +2283,6 @@
         <w:rPr>
           <w:rFonts w:eastAsia="新細明體" w:hint="eastAsia"/>
         </w:rPr>
-        <w:lastRenderedPageBreak/>
         <w:t>安卓平板全螢幕</w:t>
       </w:r>
       <w:bookmarkEnd w:id="1"/>
@@ -2372,7 +2374,7 @@
     <w:p>
       <w:pPr>
         <w:rPr>
-          <w:rFonts w:eastAsia="DengXian" w:hint="eastAsia"/>
+          <w:rFonts w:eastAsia="DengXian"/>
           <w:lang w:eastAsia="zh-CN"/>
         </w:rPr>
       </w:pPr>
@@ -2511,7 +2513,6 @@
         <w:rPr>
           <w:rFonts w:hint="eastAsia"/>
         </w:rPr>
-        <w:lastRenderedPageBreak/>
         <w:t>網絡連線</w:t>
       </w:r>
       <w:bookmarkEnd w:id="3"/>
@@ -2671,7 +2672,6 @@
         <w:rPr>
           <w:noProof/>
         </w:rPr>
-        <w:lastRenderedPageBreak/>
         <w:drawing>
           <wp:inline distT="0" distB="0" distL="0" distR="0" wp14:anchorId="30A12260" wp14:editId="68949BFE">
             <wp:extent cx="5274310" cy="2946400"/>
@@ -2760,8 +2760,7 @@
     <w:p>
       <w:pPr>
         <w:rPr>
-          <w:rFonts w:eastAsia="DengXian" w:hint="eastAsia"/>
-          <w:lang w:eastAsia="zh-CN"/>
+          <w:rFonts w:eastAsia="DengXian"/>
         </w:rPr>
       </w:pPr>
       <w:r>
@@ -2814,7 +2813,6 @@
         <w:rPr>
           <w:noProof/>
         </w:rPr>
-        <w:lastRenderedPageBreak/>
         <w:drawing>
           <wp:inline distT="0" distB="0" distL="0" distR="0" wp14:anchorId="2AF21207" wp14:editId="230431E7">
             <wp:extent cx="5274310" cy="2719705"/>
@@ -2857,13 +2855,11 @@
         <w:jc w:val="left"/>
         <w:rPr>
           <w:rFonts w:eastAsia="DengXian"/>
-          <w:lang w:eastAsia="zh-CN"/>
-        </w:rPr>
-      </w:pPr>
-      <w:r>
-        <w:rPr>
-          <w:rFonts w:eastAsia="DengXian"/>
-          <w:lang w:eastAsia="zh-CN"/>
+        </w:rPr>
+      </w:pPr>
+      <w:r>
+        <w:rPr>
+          <w:rFonts w:eastAsia="DengXian"/>
         </w:rPr>
         <w:br w:type="page"/>
       </w:r>
@@ -2881,7 +2877,6 @@
         <w:rPr>
           <w:rFonts w:ascii="DengXian" w:eastAsia="新細明體" w:hAnsi="DengXian" w:hint="eastAsia"/>
         </w:rPr>
-        <w:lastRenderedPageBreak/>
         <w:t>攝像頭</w:t>
       </w:r>
       <w:proofErr w:type="gramEnd"/>
@@ -2963,7 +2958,7 @@
     <w:p>
       <w:pPr>
         <w:rPr>
-          <w:rFonts w:eastAsia="DengXian" w:hint="eastAsia"/>
+          <w:rFonts w:eastAsia="DengXian"/>
         </w:rPr>
       </w:pPr>
       <w:r>
@@ -3144,7 +3139,6 @@
         <w:rPr>
           <w:noProof/>
         </w:rPr>
-        <w:lastRenderedPageBreak/>
         <w:drawing>
           <wp:inline distT="0" distB="0" distL="0" distR="0" wp14:anchorId="5D6FC787" wp14:editId="390A42FD">
             <wp:extent cx="5274310" cy="2671445"/>
@@ -3186,7 +3180,7 @@
       <w:pPr>
         <w:jc w:val="left"/>
         <w:rPr>
-          <w:rFonts w:ascii="DengXian" w:eastAsia="DengXian" w:hAnsi="DengXian" w:hint="eastAsia"/>
+          <w:rFonts w:ascii="DengXian" w:eastAsia="DengXian" w:hAnsi="DengXian"/>
           <w:lang w:eastAsia="zh-CN"/>
         </w:rPr>
       </w:pPr>
@@ -3263,7 +3257,6 @@
         <w:rPr>
           <w:rFonts w:ascii="DengXian" w:eastAsia="新細明體" w:hAnsi="DengXian" w:hint="eastAsia"/>
         </w:rPr>
-        <w:lastRenderedPageBreak/>
         <w:t>顯卡設定</w:t>
       </w:r>
       <w:bookmarkEnd w:id="5"/>
@@ -3385,7 +3378,6 @@
         <w:rPr>
           <w:rFonts w:ascii="DengXian" w:eastAsia="新細明體" w:hAnsi="DengXian" w:hint="eastAsia"/>
         </w:rPr>
-        <w:lastRenderedPageBreak/>
         <w:t>安裝指令</w:t>
       </w:r>
       <w:bookmarkEnd w:id="6"/>
@@ -3419,12 +3411,28 @@
           <w:lang w:eastAsia="zh-CN"/>
         </w:rPr>
       </w:pPr>
+      <w:proofErr w:type="spellStart"/>
       <w:r>
         <w:rPr>
           <w:rFonts w:eastAsia="新細明體"/>
         </w:rPr>
-        <w:t>npm install react-router-dom</w:t>
-      </w:r>
+        <w:t>npm</w:t>
+      </w:r>
+      <w:proofErr w:type="spellEnd"/>
+      <w:r>
+        <w:rPr>
+          <w:rFonts w:eastAsia="新細明體"/>
+        </w:rPr>
+        <w:t xml:space="preserve"> install react-router-</w:t>
+      </w:r>
+      <w:proofErr w:type="spellStart"/>
+      <w:r>
+        <w:rPr>
+          <w:rFonts w:eastAsia="新細明體"/>
+        </w:rPr>
+        <w:t>dom</w:t>
+      </w:r>
+      <w:proofErr w:type="spellEnd"/>
     </w:p>
     <w:p>
       <w:pPr>
@@ -3475,11 +3483,19 @@
           <w:lang w:eastAsia="zh-CN"/>
         </w:rPr>
       </w:pPr>
+      <w:proofErr w:type="spellStart"/>
       <w:r>
         <w:rPr>
           <w:rFonts w:eastAsia="新細明體"/>
         </w:rPr>
-        <w:t>npm install socket.io-client</w:t>
+        <w:t>npm</w:t>
+      </w:r>
+      <w:proofErr w:type="spellEnd"/>
+      <w:r>
+        <w:rPr>
+          <w:rFonts w:eastAsia="新細明體"/>
+        </w:rPr>
+        <w:t xml:space="preserve"> install socket.io-client</w:t>
       </w:r>
     </w:p>
     <w:p>
@@ -3519,11 +3535,19 @@
           <w:lang w:eastAsia="zh-CN"/>
         </w:rPr>
       </w:pPr>
+      <w:proofErr w:type="spellStart"/>
       <w:r>
         <w:rPr>
           <w:rFonts w:eastAsia="新細明體"/>
         </w:rPr>
-        <w:t>npm install express socket.io</w:t>
+        <w:t>npm</w:t>
+      </w:r>
+      <w:proofErr w:type="spellEnd"/>
+      <w:r>
+        <w:rPr>
+          <w:rFonts w:eastAsia="新細明體"/>
+        </w:rPr>
+        <w:t xml:space="preserve"> install express socket.io</w:t>
       </w:r>
     </w:p>
     <w:p>
@@ -3595,7 +3619,7 @@
       <w:pPr>
         <w:jc w:val="left"/>
         <w:rPr>
-          <w:rFonts w:eastAsia="DengXian" w:hint="eastAsia"/>
+          <w:rFonts w:eastAsia="DengXian"/>
           <w:lang w:eastAsia="zh-CN"/>
         </w:rPr>
       </w:pPr>
@@ -3604,14 +3628,41 @@
           <w:rFonts w:eastAsia="新細明體"/>
         </w:rPr>
         <w:tab/>
-        <w:t>npm i howler</w:t>
-      </w:r>
-    </w:p>
-    <w:p>
-      <w:pPr>
-        <w:jc w:val="left"/>
-        <w:rPr>
-          <w:rFonts w:eastAsia="DengXian" w:hint="eastAsia"/>
+      </w:r>
+      <w:proofErr w:type="spellStart"/>
+      <w:r>
+        <w:rPr>
+          <w:rFonts w:eastAsia="新細明體"/>
+        </w:rPr>
+        <w:t>npm</w:t>
+      </w:r>
+      <w:proofErr w:type="spellEnd"/>
+      <w:r>
+        <w:rPr>
+          <w:rFonts w:eastAsia="新細明體"/>
+        </w:rPr>
+        <w:t xml:space="preserve"> </w:t>
+      </w:r>
+      <w:proofErr w:type="spellStart"/>
+      <w:r>
+        <w:rPr>
+          <w:rFonts w:eastAsia="新細明體"/>
+        </w:rPr>
+        <w:t>i</w:t>
+      </w:r>
+      <w:proofErr w:type="spellEnd"/>
+      <w:r>
+        <w:rPr>
+          <w:rFonts w:eastAsia="新細明體"/>
+        </w:rPr>
+        <w:t xml:space="preserve"> howler</w:t>
+      </w:r>
+    </w:p>
+    <w:p>
+      <w:pPr>
+        <w:jc w:val="left"/>
+        <w:rPr>
+          <w:rFonts w:eastAsia="DengXian"/>
           <w:lang w:eastAsia="zh-CN"/>
         </w:rPr>
       </w:pPr>
@@ -3682,7 +3733,6 @@
         <w:rPr>
           <w:rFonts w:hint="eastAsia"/>
         </w:rPr>
-        <w:lastRenderedPageBreak/>
         <w:t>伺服器</w:t>
       </w:r>
       <w:bookmarkEnd w:id="7"/>
@@ -3939,12 +3989,28 @@
         </w:rPr>
         <w:t>安裝路由：</w:t>
       </w:r>
+      <w:proofErr w:type="spellStart"/>
       <w:r>
         <w:rPr>
           <w:rFonts w:eastAsia="新細明體"/>
         </w:rPr>
-        <w:t>npm install react-router-dom</w:t>
-      </w:r>
+        <w:t>npm</w:t>
+      </w:r>
+      <w:proofErr w:type="spellEnd"/>
+      <w:r>
+        <w:rPr>
+          <w:rFonts w:eastAsia="新細明體"/>
+        </w:rPr>
+        <w:t xml:space="preserve"> install react-router-</w:t>
+      </w:r>
+      <w:proofErr w:type="spellStart"/>
+      <w:r>
+        <w:rPr>
+          <w:rFonts w:eastAsia="新細明體"/>
+        </w:rPr>
+        <w:t>dom</w:t>
+      </w:r>
+      <w:proofErr w:type="spellEnd"/>
     </w:p>
     <w:p>
       <w:pPr>
@@ -3967,7 +4033,21 @@
         <w:rPr>
           <w:rFonts w:eastAsia="新細明體"/>
         </w:rPr>
-        <w:t xml:space="preserve"> App.jsx </w:t>
+        <w:t xml:space="preserve"> </w:t>
+      </w:r>
+      <w:proofErr w:type="spellStart"/>
+      <w:r>
+        <w:rPr>
+          <w:rFonts w:eastAsia="新細明體"/>
+        </w:rPr>
+        <w:t>App.jsx</w:t>
+      </w:r>
+      <w:proofErr w:type="spellEnd"/>
+      <w:r>
+        <w:rPr>
+          <w:rFonts w:eastAsia="新細明體"/>
+        </w:rPr>
+        <w:t xml:space="preserve"> </w:t>
       </w:r>
       <w:r>
         <w:rPr>
@@ -3987,12 +4067,14 @@
           <w:rFonts w:eastAsia="DengXian"/>
         </w:rPr>
       </w:pPr>
+      <w:proofErr w:type="spellStart"/>
       <w:r>
         <w:rPr>
           <w:rFonts w:eastAsia="新細明體"/>
         </w:rPr>
         <w:t>App.jsx</w:t>
       </w:r>
+      <w:proofErr w:type="spellEnd"/>
       <w:r>
         <w:rPr>
           <w:rFonts w:eastAsia="新細明體" w:hint="eastAsia"/>
@@ -4012,12 +4094,14 @@
           <w:lang w:eastAsia="zh-CN"/>
         </w:rPr>
       </w:pPr>
+      <w:proofErr w:type="spellStart"/>
       <w:r>
         <w:rPr>
           <w:rFonts w:eastAsia="新細明體"/>
         </w:rPr>
         <w:t>MonitorView.jsx</w:t>
       </w:r>
+      <w:proofErr w:type="spellEnd"/>
       <w:r>
         <w:rPr>
           <w:rFonts w:eastAsia="新細明體" w:hint="eastAsia"/>
@@ -4049,12 +4133,14 @@
           <w:lang w:eastAsia="zh-CN"/>
         </w:rPr>
       </w:pPr>
+      <w:proofErr w:type="spellStart"/>
       <w:r>
         <w:rPr>
           <w:rFonts w:eastAsia="新細明體"/>
         </w:rPr>
         <w:t>TabletView.jsx</w:t>
       </w:r>
+      <w:proofErr w:type="spellEnd"/>
       <w:r>
         <w:rPr>
           <w:rFonts w:eastAsia="新細明體" w:hint="eastAsia"/>
@@ -4329,52 +4415,70 @@
           <w:b/>
           <w:bCs/>
         </w:rPr>
-        <w:t xml:space="preserve"> BroadcastChannel API)</w:t>
-      </w:r>
-    </w:p>
-    <w:p>
-      <w:pPr>
-        <w:jc w:val="left"/>
-        <w:rPr>
-          <w:rFonts w:eastAsia="DengXian"/>
-        </w:rPr>
-      </w:pPr>
-      <w:r>
-        <w:rPr>
-          <w:rFonts w:eastAsia="新細明體" w:hint="eastAsia"/>
-        </w:rPr>
-        <w:t>如果你的展場是使用一台效能較好的主機（如</w:t>
-      </w:r>
+        <w:t xml:space="preserve"> </w:t>
+      </w:r>
+      <w:proofErr w:type="spellStart"/>
       <w:r>
         <w:rPr>
           <w:rFonts w:eastAsia="新細明體"/>
-        </w:rPr>
-        <w:t xml:space="preserve"> Mac Macni </w:t>
-      </w:r>
-      <w:r>
-        <w:rPr>
-          <w:rFonts w:eastAsia="新細明體" w:hint="eastAsia"/>
-        </w:rPr>
-        <w:t>或</w:t>
-      </w:r>
-      <w:r>
-        <w:rPr>
-          <w:rFonts w:eastAsia="新細明體"/>
-        </w:rPr>
-        <w:t xml:space="preserve"> PC</w:t>
-      </w:r>
-      <w:r>
-        <w:rPr>
-          <w:rFonts w:eastAsia="新細明體" w:hint="eastAsia"/>
-        </w:rPr>
-        <w:t>），同時外接兩個螢幕（一個掛牆上，一個平放當平板），這是</w:t>
-      </w:r>
-      <w:r>
-        <w:rPr>
-          <w:rFonts w:eastAsia="新細明體" w:hint="eastAsia"/>
           <w:b/>
           <w:bCs/>
         </w:rPr>
+        <w:t>BroadcastChannel</w:t>
+      </w:r>
+      <w:proofErr w:type="spellEnd"/>
+      <w:r>
+        <w:rPr>
+          <w:rFonts w:eastAsia="新細明體"/>
+          <w:b/>
+          <w:bCs/>
+        </w:rPr>
+        <w:t xml:space="preserve"> API)</w:t>
+      </w:r>
+    </w:p>
+    <w:p>
+      <w:pPr>
+        <w:jc w:val="left"/>
+        <w:rPr>
+          <w:rFonts w:eastAsia="DengXian"/>
+        </w:rPr>
+      </w:pPr>
+      <w:r>
+        <w:rPr>
+          <w:rFonts w:eastAsia="新細明體" w:hint="eastAsia"/>
+        </w:rPr>
+        <w:t>如果你的展場是使用一台效能較好的主機（如</w:t>
+      </w:r>
+      <w:r>
+        <w:rPr>
+          <w:rFonts w:eastAsia="新細明體"/>
+        </w:rPr>
+        <w:t xml:space="preserve"> Mac Macni </w:t>
+      </w:r>
+      <w:r>
+        <w:rPr>
+          <w:rFonts w:eastAsia="新細明體" w:hint="eastAsia"/>
+        </w:rPr>
+        <w:t>或</w:t>
+      </w:r>
+      <w:r>
+        <w:rPr>
+          <w:rFonts w:eastAsia="新細明體"/>
+        </w:rPr>
+        <w:t xml:space="preserve"> PC</w:t>
+      </w:r>
+      <w:r>
+        <w:rPr>
+          <w:rFonts w:eastAsia="新細明體" w:hint="eastAsia"/>
+        </w:rPr>
+        <w:t>），同時外接兩個螢幕（一個掛牆上，一個平放當平板），這是</w:t>
+      </w:r>
+      <w:r>
+        <w:rPr>
+          <w:rFonts w:eastAsia="新細明體" w:hint="eastAsia"/>
+          <w:b/>
+          <w:bCs/>
+        </w:rPr>
         <w:t>最推薦且最簡單</w:t>
       </w:r>
       <w:r>
@@ -4402,7 +4506,21 @@
         <w:rPr>
           <w:rFonts w:eastAsia="新細明體"/>
         </w:rPr>
-        <w:t xml:space="preserve"> BroadcastChannel </w:t>
+        <w:t xml:space="preserve"> </w:t>
+      </w:r>
+      <w:proofErr w:type="spellStart"/>
+      <w:r>
+        <w:rPr>
+          <w:rFonts w:eastAsia="新細明體"/>
+        </w:rPr>
+        <w:t>BroadcastChannel</w:t>
+      </w:r>
+      <w:proofErr w:type="spellEnd"/>
+      <w:r>
+        <w:rPr>
+          <w:rFonts w:eastAsia="新細明體"/>
+        </w:rPr>
+        <w:t xml:space="preserve"> </w:t>
       </w:r>
       <w:r>
         <w:rPr>
@@ -4438,7 +4556,6 @@
         <w:rPr>
           <w:noProof/>
         </w:rPr>
-        <w:lastRenderedPageBreak/>
         <w:drawing>
           <wp:inline distT="0" distB="0" distL="0" distR="0" wp14:anchorId="5831CBF5" wp14:editId="5C93E509">
             <wp:extent cx="5274310" cy="2571750"/>
@@ -4647,7 +4764,6 @@
         <w:rPr>
           <w:noProof/>
         </w:rPr>
-        <w:lastRenderedPageBreak/>
         <w:drawing>
           <wp:inline distT="0" distB="0" distL="0" distR="0" wp14:anchorId="2E9739E9" wp14:editId="6DFE1A54">
             <wp:extent cx="5274310" cy="1706245"/>
@@ -4851,7 +4967,6 @@
         <w:rPr>
           <w:rFonts w:hint="eastAsia"/>
         </w:rPr>
-        <w:lastRenderedPageBreak/>
         <w:t>製作規劃</w:t>
       </w:r>
       <w:bookmarkEnd w:id="8"/>
@@ -5127,7 +5242,6 @@
         <w:rPr>
           <w:noProof/>
         </w:rPr>
-        <w:lastRenderedPageBreak/>
         <w:drawing>
           <wp:inline distT="0" distB="0" distL="0" distR="0" wp14:anchorId="755F5801" wp14:editId="11054A60">
             <wp:extent cx="5274310" cy="2160270"/>
@@ -5268,7 +5382,6 @@
         <w:rPr>
           <w:noProof/>
         </w:rPr>
-        <w:lastRenderedPageBreak/>
         <w:drawing>
           <wp:inline distT="0" distB="0" distL="0" distR="0" wp14:anchorId="0B78E0C1" wp14:editId="0ED73B1D">
             <wp:extent cx="5274310" cy="2898140"/>
@@ -5404,7 +5517,6 @@
         <w:rPr>
           <w:noProof/>
         </w:rPr>
-        <w:lastRenderedPageBreak/>
         <w:drawing>
           <wp:inline distT="0" distB="0" distL="0" distR="0" wp14:anchorId="40F4A1C2" wp14:editId="254072D8">
             <wp:extent cx="5274310" cy="2540635"/>
@@ -6641,6 +6753,7 @@
   <w:style w:type="character" w:default="1" w:styleId="a0">
     <w:name w:val="Default Paragraph Font"/>
     <w:uiPriority w:val="1"/>
+    <w:semiHidden/>
     <w:unhideWhenUsed/>
   </w:style>
   <w:style w:type="table" w:default="1" w:styleId="a1">

</xml_diff>

<commit_message>
0.13.18 style(engine): remove holographic base glow before gem reveal
</commit_message>
<xml_diff>
--- a/To do.docx
+++ b/To do.docx
@@ -733,6 +733,7 @@
         <w:rPr>
           <w:rFonts w:eastAsia="新細明體" w:hint="eastAsia"/>
         </w:rPr>
+        <w:lastRenderedPageBreak/>
         <w:t>待辦事項</w:t>
       </w:r>
       <w:bookmarkEnd w:id="0"/>
@@ -1157,16 +1158,156 @@
       <w:pPr>
         <w:jc w:val="left"/>
         <w:rPr>
+          <w:rFonts w:eastAsia="新細明體"/>
+        </w:rPr>
+      </w:pPr>
+      <w:r>
+        <w:rPr>
+          <w:rFonts w:eastAsia="新細明體" w:hint="eastAsia"/>
+          <w:lang w:eastAsia="zh-CN"/>
+        </w:rPr>
+        <w:t>科技組：</w:t>
+      </w:r>
+    </w:p>
+    <w:p>
+      <w:pPr>
+        <w:jc w:val="left"/>
+        <w:rPr>
+          <w:rFonts w:eastAsia="DengXian" w:hint="eastAsia"/>
+        </w:rPr>
+      </w:pPr>
+      <w:sdt>
+        <w:sdtPr>
+          <w:rPr>
+            <w:rFonts w:eastAsia="DengXian" w:hint="eastAsia"/>
+            <w:lang w:eastAsia="zh-CN"/>
+          </w:rPr>
+          <w:id w:val="-1236013805"/>
+          <w14:checkbox>
+            <w14:checked w14:val="0"/>
+            <w14:checkedState w14:val="2612" w14:font="MS Gothic"/>
+            <w14:uncheckedState w14:val="2610" w14:font="MS Gothic"/>
+          </w14:checkbox>
+        </w:sdtPr>
+        <w:sdtContent>
+          <w:r>
+            <w:rPr>
+              <w:rFonts w:ascii="MS Gothic" w:eastAsia="MS Gothic" w:hAnsi="MS Gothic" w:hint="eastAsia"/>
+              <w:lang w:eastAsia="zh-CN"/>
+            </w:rPr>
+            <w:t>☐</w:t>
+          </w:r>
+        </w:sdtContent>
+      </w:sdt>
+      <w:r>
+        <w:rPr>
+          <w:rFonts w:asciiTheme="minorEastAsia" w:hAnsiTheme="minorEastAsia" w:hint="eastAsia"/>
+        </w:rPr>
+        <w:t xml:space="preserve"> </w:t>
+      </w:r>
+    </w:p>
+    <w:p>
+      <w:pPr>
+        <w:jc w:val="left"/>
+        <w:rPr>
+          <w:rFonts w:hint="eastAsia"/>
+        </w:rPr>
+      </w:pPr>
+      <w:sdt>
+        <w:sdtPr>
+          <w:rPr>
+            <w:rFonts w:eastAsia="DengXian" w:hint="eastAsia"/>
+            <w:lang w:eastAsia="zh-CN"/>
+          </w:rPr>
+          <w:id w:val="-1630004191"/>
+          <w14:checkbox>
+            <w14:checked w14:val="0"/>
+            <w14:checkedState w14:val="2612" w14:font="MS Gothic"/>
+            <w14:uncheckedState w14:val="2610" w14:font="MS Gothic"/>
+          </w14:checkbox>
+        </w:sdtPr>
+        <w:sdtContent>
+          <w:r>
+            <w:rPr>
+              <w:rFonts w:ascii="MS Gothic" w:eastAsia="MS Gothic" w:hAnsi="MS Gothic" w:hint="eastAsia"/>
+              <w:lang w:eastAsia="zh-CN"/>
+            </w:rPr>
+            <w:t>☐</w:t>
+          </w:r>
+        </w:sdtContent>
+      </w:sdt>
+      <w:r>
+        <w:rPr>
+          <w:rFonts w:eastAsia="DengXian" w:hint="eastAsia"/>
+          <w:lang w:eastAsia="zh-CN"/>
+        </w:rPr>
+        <w:t xml:space="preserve"> 待机动画风格</w:t>
+      </w:r>
+    </w:p>
+    <w:p>
+      <w:pPr>
+        <w:jc w:val="left"/>
+        <w:rPr>
           <w:rFonts w:asciiTheme="minorEastAsia" w:eastAsia="DengXian" w:hAnsiTheme="minorEastAsia"/>
           <w:lang w:eastAsia="zh-CN"/>
         </w:rPr>
       </w:pPr>
-      <w:r>
-        <w:rPr>
-          <w:rFonts w:eastAsia="新細明體" w:hint="eastAsia"/>
-          <w:lang w:eastAsia="zh-CN"/>
-        </w:rPr>
-        <w:t>科技組：</w:t>
+      <w:sdt>
+        <w:sdtPr>
+          <w:rPr>
+            <w:rFonts w:eastAsia="DengXian" w:hint="eastAsia"/>
+          </w:rPr>
+          <w:id w:val="881442455"/>
+          <w14:checkbox>
+            <w14:checked w14:val="0"/>
+            <w14:checkedState w14:val="2612" w14:font="MS Gothic"/>
+            <w14:uncheckedState w14:val="2610" w14:font="MS Gothic"/>
+          </w14:checkbox>
+        </w:sdtPr>
+        <w:sdtContent>
+          <w:r>
+            <w:rPr>
+              <w:rFonts w:ascii="MS Gothic" w:eastAsia="MS Gothic" w:hAnsi="MS Gothic" w:hint="eastAsia"/>
+            </w:rPr>
+            <w:t>☐</w:t>
+          </w:r>
+        </w:sdtContent>
+      </w:sdt>
+      <w:r>
+        <w:rPr>
+          <w:rFonts w:asciiTheme="minorEastAsia" w:hAnsiTheme="minorEastAsia"/>
+        </w:rPr>
+        <w:t xml:space="preserve"> </w:t>
+      </w:r>
+      <w:r>
+        <w:rPr>
+          <w:rFonts w:asciiTheme="minorEastAsia" w:hAnsiTheme="minorEastAsia" w:hint="eastAsia"/>
+        </w:rPr>
+        <w:t>遊玩錄製</w:t>
+      </w:r>
+      <w:r>
+        <w:rPr>
+          <w:rFonts w:asciiTheme="minorEastAsia" w:hAnsiTheme="minorEastAsia"/>
+        </w:rPr>
+        <w:t xml:space="preserve"> (5</w:t>
+      </w:r>
+      <w:r>
+        <w:rPr>
+          <w:rFonts w:asciiTheme="minorEastAsia" w:hAnsiTheme="minorEastAsia" w:hint="eastAsia"/>
+        </w:rPr>
+        <w:t>個寶石</w:t>
+      </w:r>
+      <w:r>
+        <w:rPr>
+          <w:rFonts w:asciiTheme="minorEastAsia" w:hAnsiTheme="minorEastAsia"/>
+        </w:rPr>
+        <w:t>)</w:t>
+      </w:r>
+      <w:r>
+        <w:rPr>
+          <w:rFonts w:asciiTheme="minorEastAsia" w:hAnsiTheme="minorEastAsia"/>
+        </w:rPr>
+        <w:tab/>
       </w:r>
     </w:p>
     <w:p>
@@ -1207,7 +1348,6 @@
         </w:rPr>
         <w:t xml:space="preserve"> </w:t>
       </w:r>
-      <w:proofErr w:type="gramStart"/>
       <w:r>
         <w:rPr>
           <w:rFonts w:ascii="DengXian" w:eastAsia="DengXian" w:hAnsi="DengXian" w:hint="eastAsia"/>
@@ -1220,15 +1360,7 @@
           <w:rFonts w:eastAsia="DengXian" w:hint="eastAsia"/>
           <w:lang w:eastAsia="zh-CN"/>
         </w:rPr>
-        <w:t>水</w:t>
-      </w:r>
-      <w:proofErr w:type="gramEnd"/>
-      <w:r>
-        <w:rPr>
-          <w:rFonts w:eastAsia="DengXian" w:hint="eastAsia"/>
-          <w:lang w:eastAsia="zh-CN"/>
-        </w:rPr>
-        <w:t>波纹过程</w:t>
+        <w:t>水波纹过程</w:t>
       </w:r>
     </w:p>
     <w:p>
@@ -1316,6 +1448,7 @@
         <w:jc w:val="left"/>
         <w:rPr>
           <w:rFonts w:eastAsia="DengXian"/>
+          <w:lang w:eastAsia="zh-CN"/>
         </w:rPr>
       </w:pPr>
       <w:sdt>
@@ -1325,7 +1458,7 @@
           </w:rPr>
           <w:id w:val="1061449731"/>
           <w14:checkbox>
-            <w14:checked w14:val="0"/>
+            <w14:checked w14:val="1"/>
             <w14:checkedState w14:val="2612" w14:font="MS Gothic"/>
             <w14:uncheckedState w14:val="2610" w14:font="MS Gothic"/>
           </w14:checkbox>
@@ -1335,7 +1468,7 @@
             <w:rPr>
               <w:rFonts w:ascii="MS Gothic" w:eastAsia="MS Gothic" w:hAnsi="MS Gothic" w:hint="eastAsia"/>
             </w:rPr>
-            <w:t>☐</w:t>
+            <w:t>☒</w:t>
           </w:r>
         </w:sdtContent>
       </w:sdt>
@@ -1357,7 +1490,6 @@
         <w:jc w:val="left"/>
         <w:rPr>
           <w:rFonts w:eastAsia="DengXian"/>
-          <w:lang w:eastAsia="zh-CN"/>
         </w:rPr>
       </w:pPr>
       <w:sdt>
@@ -1366,9 +1498,9 @@
             <w:rFonts w:eastAsia="DengXian" w:hint="eastAsia"/>
             <w:lang w:eastAsia="zh-CN"/>
           </w:rPr>
-          <w:id w:val="-1630004191"/>
+          <w:id w:val="-506598520"/>
           <w14:checkbox>
-            <w14:checked w14:val="0"/>
+            <w14:checked w14:val="1"/>
             <w14:checkedState w14:val="2612" w14:font="MS Gothic"/>
             <w14:uncheckedState w14:val="2610" w14:font="MS Gothic"/>
           </w14:checkbox>
@@ -1379,7 +1511,7 @@
               <w:rFonts w:ascii="MS Gothic" w:eastAsia="MS Gothic" w:hAnsi="MS Gothic" w:hint="eastAsia"/>
               <w:lang w:eastAsia="zh-CN"/>
             </w:rPr>
-            <w:t>☐</w:t>
+            <w:t>☒</w:t>
           </w:r>
         </w:sdtContent>
       </w:sdt>
@@ -1388,110 +1520,7 @@
           <w:rFonts w:eastAsia="DengXian" w:hint="eastAsia"/>
           <w:lang w:eastAsia="zh-CN"/>
         </w:rPr>
-        <w:t xml:space="preserve"> 待机动画风格</w:t>
-      </w:r>
-    </w:p>
-    <w:p>
-      <w:pPr>
-        <w:jc w:val="left"/>
-        <w:rPr>
-          <w:lang w:eastAsia="zh-CN"/>
-        </w:rPr>
-      </w:pPr>
-      <w:sdt>
-        <w:sdtPr>
-          <w:rPr>
-            <w:rFonts w:eastAsia="DengXian" w:hint="eastAsia"/>
-            <w:lang w:eastAsia="zh-CN"/>
-          </w:rPr>
-          <w:id w:val="-506598520"/>
-          <w14:checkbox>
-            <w14:checked w14:val="0"/>
-            <w14:checkedState w14:val="2612" w14:font="MS Gothic"/>
-            <w14:uncheckedState w14:val="2610" w14:font="MS Gothic"/>
-          </w14:checkbox>
-        </w:sdtPr>
-        <w:sdtContent>
-          <w:r>
-            <w:rPr>
-              <w:rFonts w:ascii="MS Gothic" w:eastAsia="MS Gothic" w:hAnsi="MS Gothic" w:hint="eastAsia"/>
-              <w:lang w:eastAsia="zh-CN"/>
-            </w:rPr>
-            <w:t>☐</w:t>
-          </w:r>
-        </w:sdtContent>
-      </w:sdt>
-      <w:r>
-        <w:rPr>
-          <w:rFonts w:eastAsia="DengXian" w:hint="eastAsia"/>
-          <w:lang w:eastAsia="zh-CN"/>
-        </w:rPr>
         <w:t xml:space="preserve"> UI顶部选取直接结合在开始按钮上</w:t>
-      </w:r>
-    </w:p>
-    <w:p>
-      <w:pPr>
-        <w:jc w:val="left"/>
-        <w:rPr>
-          <w:rFonts w:eastAsia="DengXian" w:hint="eastAsia"/>
-        </w:rPr>
-      </w:pPr>
-      <w:sdt>
-        <w:sdtPr>
-          <w:rPr>
-            <w:rFonts w:eastAsia="DengXian" w:hint="eastAsia"/>
-          </w:rPr>
-          <w:id w:val="881442455"/>
-          <w14:checkbox>
-            <w14:checked w14:val="0"/>
-            <w14:checkedState w14:val="2612" w14:font="MS Gothic"/>
-            <w14:uncheckedState w14:val="2610" w14:font="MS Gothic"/>
-          </w14:checkbox>
-        </w:sdtPr>
-        <w:sdtContent>
-          <w:r>
-            <w:rPr>
-              <w:rFonts w:ascii="MS Gothic" w:eastAsia="MS Gothic" w:hAnsi="MS Gothic" w:hint="eastAsia"/>
-            </w:rPr>
-            <w:t>☐</w:t>
-          </w:r>
-        </w:sdtContent>
-      </w:sdt>
-      <w:r>
-        <w:rPr>
-          <w:rFonts w:asciiTheme="minorEastAsia" w:hAnsiTheme="minorEastAsia"/>
-        </w:rPr>
-        <w:t xml:space="preserve"> </w:t>
-      </w:r>
-      <w:r>
-        <w:rPr>
-          <w:rFonts w:asciiTheme="minorEastAsia" w:hAnsiTheme="minorEastAsia" w:hint="eastAsia"/>
-        </w:rPr>
-        <w:t>遊玩錄製</w:t>
-      </w:r>
-      <w:r>
-        <w:rPr>
-          <w:rFonts w:asciiTheme="minorEastAsia" w:hAnsiTheme="minorEastAsia"/>
-        </w:rPr>
-        <w:t xml:space="preserve"> (5</w:t>
-      </w:r>
-      <w:r>
-        <w:rPr>
-          <w:rFonts w:asciiTheme="minorEastAsia" w:hAnsiTheme="minorEastAsia" w:hint="eastAsia"/>
-        </w:rPr>
-        <w:t>個寶石</w:t>
-      </w:r>
-      <w:r>
-        <w:rPr>
-          <w:rFonts w:asciiTheme="minorEastAsia" w:hAnsiTheme="minorEastAsia"/>
-        </w:rPr>
-        <w:t>)</w:t>
-      </w:r>
-      <w:r>
-        <w:rPr>
-          <w:rFonts w:asciiTheme="minorEastAsia" w:hAnsiTheme="minorEastAsia"/>
-        </w:rPr>
-        <w:tab/>
       </w:r>
     </w:p>
     <w:p>
@@ -1607,19 +1636,11 @@
         </w:rPr>
         <w:t xml:space="preserve"> </w:t>
       </w:r>
-      <w:proofErr w:type="gramStart"/>
       <w:r>
         <w:rPr>
           <w:rFonts w:eastAsia="新細明體" w:hint="eastAsia"/>
         </w:rPr>
-        <w:t>顯示器攝像頭</w:t>
-      </w:r>
-      <w:proofErr w:type="gramEnd"/>
-      <w:r>
-        <w:rPr>
-          <w:rFonts w:eastAsia="新細明體" w:hint="eastAsia"/>
-        </w:rPr>
-        <w:t>隱私測試</w:t>
+        <w:t>顯示器攝像頭隱私測試</w:t>
       </w:r>
     </w:p>
     <w:p>
@@ -1997,21 +2018,7 @@
         <w:rPr>
           <w:rFonts w:eastAsia="新細明體" w:hint="eastAsia"/>
         </w:rPr>
-        <w:t>的</w:t>
-      </w:r>
-      <w:proofErr w:type="gramStart"/>
-      <w:r>
-        <w:rPr>
-          <w:rFonts w:eastAsia="新細明體" w:hint="eastAsia"/>
-        </w:rPr>
-        <w:t>單界面拆成兩個頁</w:t>
-      </w:r>
-      <w:proofErr w:type="gramEnd"/>
-      <w:r>
-        <w:rPr>
-          <w:rFonts w:eastAsia="新細明體" w:hint="eastAsia"/>
-        </w:rPr>
-        <w:t>面</w:t>
+        <w:t>的單界面拆成兩個頁面</w:t>
       </w:r>
     </w:p>
     <w:p>
@@ -2102,21 +2109,7 @@
         <w:rPr>
           <w:rFonts w:asciiTheme="minorEastAsia" w:hAnsiTheme="minorEastAsia" w:hint="eastAsia"/>
         </w:rPr>
-        <w:t>改成</w:t>
-      </w:r>
-      <w:proofErr w:type="gramStart"/>
-      <w:r>
-        <w:rPr>
-          <w:rFonts w:asciiTheme="minorEastAsia" w:hAnsiTheme="minorEastAsia" w:hint="eastAsia"/>
-        </w:rPr>
-        <w:t>小字小框長方形</w:t>
-      </w:r>
-      <w:proofErr w:type="gramEnd"/>
-      <w:r>
-        <w:rPr>
-          <w:rFonts w:asciiTheme="minorEastAsia" w:hAnsiTheme="minorEastAsia" w:hint="eastAsia"/>
-        </w:rPr>
-        <w:t>小圓角，加入橫向分隔線，按鈕與標題和開始互動按鈕用粗分隔線，</w:t>
+        <w:t>改成小字小框長方形小圓角，加入橫向分隔線，按鈕與標題和開始互動按鈕用粗分隔線，</w:t>
       </w:r>
       <w:r>
         <w:rPr>
@@ -2283,6 +2276,7 @@
         <w:rPr>
           <w:rFonts w:eastAsia="新細明體" w:hint="eastAsia"/>
         </w:rPr>
+        <w:lastRenderedPageBreak/>
         <w:t>安卓平板全螢幕</w:t>
       </w:r>
       <w:bookmarkEnd w:id="1"/>
@@ -2513,6 +2507,7 @@
         <w:rPr>
           <w:rFonts w:hint="eastAsia"/>
         </w:rPr>
+        <w:lastRenderedPageBreak/>
         <w:t>網絡連線</w:t>
       </w:r>
       <w:bookmarkEnd w:id="3"/>
@@ -2672,6 +2667,7 @@
         <w:rPr>
           <w:noProof/>
         </w:rPr>
+        <w:lastRenderedPageBreak/>
         <w:drawing>
           <wp:inline distT="0" distB="0" distL="0" distR="0" wp14:anchorId="30A12260" wp14:editId="68949BFE">
             <wp:extent cx="5274310" cy="2946400"/>
@@ -2813,6 +2809,7 @@
         <w:rPr>
           <w:noProof/>
         </w:rPr>
+        <w:lastRenderedPageBreak/>
         <w:drawing>
           <wp:inline distT="0" distB="0" distL="0" distR="0" wp14:anchorId="2AF21207" wp14:editId="230431E7">
             <wp:extent cx="5274310" cy="2719705"/>
@@ -2872,19 +2869,12 @@
         </w:rPr>
       </w:pPr>
       <w:bookmarkStart w:id="4" w:name="_Toc230804032"/>
-      <w:proofErr w:type="gramStart"/>
       <w:r>
         <w:rPr>
           <w:rFonts w:ascii="DengXian" w:eastAsia="新細明體" w:hAnsi="DengXian" w:hint="eastAsia"/>
         </w:rPr>
-        <w:t>攝像頭</w:t>
-      </w:r>
-      <w:proofErr w:type="gramEnd"/>
-      <w:r>
-        <w:rPr>
-          <w:rFonts w:ascii="DengXian" w:eastAsia="新細明體" w:hAnsi="DengXian" w:hint="eastAsia"/>
-        </w:rPr>
-        <w:t>權限</w:t>
+        <w:lastRenderedPageBreak/>
+        <w:t>攝像頭權限</w:t>
       </w:r>
       <w:bookmarkEnd w:id="4"/>
     </w:p>
@@ -3139,6 +3129,7 @@
         <w:rPr>
           <w:noProof/>
         </w:rPr>
+        <w:lastRenderedPageBreak/>
         <w:drawing>
           <wp:inline distT="0" distB="0" distL="0" distR="0" wp14:anchorId="5D6FC787" wp14:editId="390A42FD">
             <wp:extent cx="5274310" cy="2671445"/>
@@ -3252,15 +3243,14 @@
         </w:rPr>
       </w:pPr>
       <w:bookmarkStart w:id="5" w:name="_Toc230804033"/>
-      <w:proofErr w:type="gramStart"/>
       <w:r>
         <w:rPr>
           <w:rFonts w:ascii="DengXian" w:eastAsia="新細明體" w:hAnsi="DengXian" w:hint="eastAsia"/>
         </w:rPr>
+        <w:lastRenderedPageBreak/>
         <w:t>顯卡設定</w:t>
       </w:r>
       <w:bookmarkEnd w:id="5"/>
-      <w:proofErr w:type="gramEnd"/>
     </w:p>
     <w:p>
       <w:pPr>
@@ -3378,6 +3368,7 @@
         <w:rPr>
           <w:rFonts w:ascii="DengXian" w:eastAsia="新細明體" w:hAnsi="DengXian" w:hint="eastAsia"/>
         </w:rPr>
+        <w:lastRenderedPageBreak/>
         <w:t>安裝指令</w:t>
       </w:r>
       <w:bookmarkEnd w:id="6"/>
@@ -3641,21 +3632,7 @@
         <w:rPr>
           <w:rFonts w:eastAsia="新細明體"/>
         </w:rPr>
-        <w:t xml:space="preserve"> </w:t>
-      </w:r>
-      <w:proofErr w:type="spellStart"/>
-      <w:r>
-        <w:rPr>
-          <w:rFonts w:eastAsia="新細明體"/>
-        </w:rPr>
-        <w:t>i</w:t>
-      </w:r>
-      <w:proofErr w:type="spellEnd"/>
-      <w:r>
-        <w:rPr>
-          <w:rFonts w:eastAsia="新細明體"/>
-        </w:rPr>
-        <w:t xml:space="preserve"> howler</w:t>
+        <w:t xml:space="preserve"> i howler</w:t>
       </w:r>
     </w:p>
     <w:p>
@@ -3733,6 +3710,7 @@
         <w:rPr>
           <w:rFonts w:hint="eastAsia"/>
         </w:rPr>
+        <w:lastRenderedPageBreak/>
         <w:t>伺服器</w:t>
       </w:r>
       <w:bookmarkEnd w:id="7"/>
@@ -4205,23 +4183,13 @@
         </w:rPr>
         <w:t xml:space="preserve"> (Data Transmission)</w:t>
       </w:r>
-      <w:proofErr w:type="gramStart"/>
       <w:r>
         <w:rPr>
           <w:rFonts w:asciiTheme="minorEastAsia" w:hAnsiTheme="minorEastAsia" w:hint="eastAsia"/>
           <w:b/>
           <w:bCs/>
         </w:rPr>
-        <w:t>——</w:t>
-      </w:r>
-      <w:proofErr w:type="gramEnd"/>
-      <w:r>
-        <w:rPr>
-          <w:rFonts w:asciiTheme="minorEastAsia" w:hAnsiTheme="minorEastAsia" w:hint="eastAsia"/>
-          <w:b/>
-          <w:bCs/>
-        </w:rPr>
-        <w:t>使用方案</w:t>
+        <w:t>——使用方案</w:t>
       </w:r>
       <w:r>
         <w:rPr>
@@ -4243,77 +4211,33 @@
         <w:rPr>
           <w:rFonts w:eastAsia="新細明體" w:hint="eastAsia"/>
         </w:rPr>
-        <w:t>既然拆成了</w:t>
-      </w:r>
-      <w:proofErr w:type="gramStart"/>
+        <w:t>既然拆成了兩個頁面，它們該怎麼溝通？</w:t>
+      </w:r>
+    </w:p>
+    <w:p>
+      <w:pPr>
+        <w:jc w:val="left"/>
+        <w:rPr>
+          <w:rFonts w:eastAsia="DengXian"/>
+        </w:rPr>
+      </w:pPr>
       <w:r>
         <w:rPr>
           <w:rFonts w:eastAsia="新細明體" w:hint="eastAsia"/>
         </w:rPr>
-        <w:t>兩個頁</w:t>
-      </w:r>
-      <w:proofErr w:type="gramEnd"/>
+        <w:t>（例如：平板按下了「盡情哭吧</w:t>
+      </w:r>
+      <w:r>
+        <w:rPr>
+          <w:rFonts w:eastAsia="新細明體"/>
+        </w:rPr>
+        <w:t xml:space="preserve"> GO</w:t>
+      </w:r>
       <w:r>
         <w:rPr>
           <w:rFonts w:eastAsia="新細明體" w:hint="eastAsia"/>
         </w:rPr>
-        <w:t>面，它們該怎麼溝通？</w:t>
-      </w:r>
-    </w:p>
-    <w:p>
-      <w:pPr>
-        <w:jc w:val="left"/>
-        <w:rPr>
-          <w:rFonts w:eastAsia="DengXian"/>
-        </w:rPr>
-      </w:pPr>
-      <w:proofErr w:type="gramStart"/>
-      <w:r>
-        <w:rPr>
-          <w:rFonts w:eastAsia="新細明體" w:hint="eastAsia"/>
-        </w:rPr>
-        <w:t>（</w:t>
-      </w:r>
-      <w:proofErr w:type="gramEnd"/>
-      <w:r>
-        <w:rPr>
-          <w:rFonts w:eastAsia="新細明體" w:hint="eastAsia"/>
-        </w:rPr>
-        <w:t>例如：平板按下了「</w:t>
-      </w:r>
-      <w:proofErr w:type="gramStart"/>
-      <w:r>
-        <w:rPr>
-          <w:rFonts w:eastAsia="新細明體" w:hint="eastAsia"/>
-        </w:rPr>
-        <w:t>盡情哭吧</w:t>
-      </w:r>
-      <w:proofErr w:type="gramEnd"/>
-      <w:r>
-        <w:rPr>
-          <w:rFonts w:eastAsia="新細明體"/>
-        </w:rPr>
-        <w:t xml:space="preserve"> GO</w:t>
-      </w:r>
-      <w:r>
-        <w:rPr>
-          <w:rFonts w:eastAsia="新細明體" w:hint="eastAsia"/>
-        </w:rPr>
-        <w:t>」，顯示器怎麼知道要</w:t>
-      </w:r>
-      <w:proofErr w:type="gramStart"/>
-      <w:r>
-        <w:rPr>
-          <w:rFonts w:eastAsia="新細明體" w:hint="eastAsia"/>
-        </w:rPr>
-        <w:t>開始掉字</w:t>
-      </w:r>
-      <w:proofErr w:type="gramEnd"/>
-      <w:r>
-        <w:rPr>
-          <w:rFonts w:eastAsia="新細明體" w:hint="eastAsia"/>
-        </w:rPr>
-        <w:t>？）</w:t>
+        <w:t>」，顯示器怎麼知道要開始掉字？）</w:t>
       </w:r>
       <w:r>
         <w:rPr>
@@ -4526,21 +4450,7 @@
         <w:rPr>
           <w:rFonts w:eastAsia="新細明體" w:hint="eastAsia"/>
         </w:rPr>
-        <w:t>就能讓兩個</w:t>
-      </w:r>
-      <w:proofErr w:type="gramStart"/>
-      <w:r>
-        <w:rPr>
-          <w:rFonts w:eastAsia="新細明體" w:hint="eastAsia"/>
-        </w:rPr>
-        <w:t>分頁秒速</w:t>
-      </w:r>
-      <w:proofErr w:type="gramEnd"/>
-      <w:r>
-        <w:rPr>
-          <w:rFonts w:eastAsia="新細明體" w:hint="eastAsia"/>
-        </w:rPr>
-        <w:t>溝通：</w:t>
+        <w:t>就能讓兩個分頁秒速溝通：</w:t>
       </w:r>
     </w:p>
     <w:p>
@@ -4556,6 +4466,7 @@
         <w:rPr>
           <w:noProof/>
         </w:rPr>
+        <w:lastRenderedPageBreak/>
         <w:drawing>
           <wp:inline distT="0" distB="0" distL="0" distR="0" wp14:anchorId="5831CBF5" wp14:editId="5C93E509">
             <wp:extent cx="5274310" cy="2571750"/>
@@ -4764,6 +4675,7 @@
         <w:rPr>
           <w:noProof/>
         </w:rPr>
+        <w:lastRenderedPageBreak/>
         <w:drawing>
           <wp:inline distT="0" distB="0" distL="0" distR="0" wp14:anchorId="2E9739E9" wp14:editId="6DFE1A54">
             <wp:extent cx="5274310" cy="1706245"/>
@@ -4967,6 +4879,7 @@
         <w:rPr>
           <w:rFonts w:hint="eastAsia"/>
         </w:rPr>
+        <w:lastRenderedPageBreak/>
         <w:t>製作規劃</w:t>
       </w:r>
       <w:bookmarkEnd w:id="8"/>
@@ -4976,104 +4889,36 @@
         <w:rPr>
           <w:rFonts w:hint="eastAsia"/>
         </w:rPr>
-        <w:t>預設是一個顯示器，一個平板，平板選擇詞</w:t>
-      </w:r>
-      <w:proofErr w:type="gramStart"/>
+        <w:t>預設是一個顯示器，一個平板，平板選擇詞匯後，透過影像識別，流淚流出詞匯最終流入平板，匯聚成寶石。</w:t>
+      </w:r>
+    </w:p>
+    <w:p/>
+    <w:p>
+      <w:pPr>
+        <w:rPr>
+          <w:rFonts w:eastAsia="DengXian"/>
+        </w:rPr>
+      </w:pPr>
       <w:r>
         <w:rPr>
           <w:rFonts w:hint="eastAsia"/>
         </w:rPr>
-        <w:t>匯</w:t>
-      </w:r>
-      <w:proofErr w:type="gramEnd"/>
+        <w:t>一樣用</w:t>
+      </w:r>
+      <w:r>
+        <w:t>React</w:t>
+      </w:r>
       <w:r>
         <w:rPr>
           <w:rFonts w:hint="eastAsia"/>
         </w:rPr>
-        <w:t>後，透過影像識別，流淚流出詞</w:t>
-      </w:r>
-      <w:proofErr w:type="gramStart"/>
-      <w:r>
-        <w:rPr>
-          <w:rFonts w:hint="eastAsia"/>
-        </w:rPr>
-        <w:t>匯</w:t>
-      </w:r>
-      <w:proofErr w:type="gramEnd"/>
-      <w:r>
-        <w:rPr>
-          <w:rFonts w:hint="eastAsia"/>
-        </w:rPr>
-        <w:t>最終流入平板，匯聚成寶石。</w:t>
-      </w:r>
-    </w:p>
-    <w:p/>
-    <w:p>
-      <w:pPr>
-        <w:rPr>
-          <w:rFonts w:eastAsia="DengXian"/>
-        </w:rPr>
-      </w:pPr>
-      <w:r>
-        <w:rPr>
-          <w:rFonts w:hint="eastAsia"/>
-        </w:rPr>
-        <w:t>一樣用</w:t>
-      </w:r>
-      <w:r>
-        <w:t>React</w:t>
-      </w:r>
-      <w:r>
-        <w:rPr>
-          <w:rFonts w:hint="eastAsia"/>
-        </w:rPr>
         <w:t>和</w:t>
       </w:r>
       <w:r>
         <w:t>Pixi</w:t>
       </w:r>
       <w:r>
-        <w:t>，設計點擊五組心情詞擇</w:t>
-      </w:r>
-      <w:proofErr w:type="gramStart"/>
-      <w:r>
-        <w:t>一</w:t>
-      </w:r>
-      <w:proofErr w:type="gramEnd"/>
-      <w:r>
-        <w:t>後，透過影像識別人眼，最終選擇的</w:t>
-      </w:r>
-      <w:proofErr w:type="gramStart"/>
-      <w:r>
-        <w:t>心情詞會不斷</w:t>
-      </w:r>
-      <w:proofErr w:type="gramEnd"/>
-      <w:r>
-        <w:t>從眼中流出（流出的詞</w:t>
-      </w:r>
-      <w:proofErr w:type="gramStart"/>
-      <w:r>
-        <w:t>匯</w:t>
-      </w:r>
-      <w:proofErr w:type="gramEnd"/>
-      <w:r>
-        <w:t>越來越多，有最大值），詞</w:t>
-      </w:r>
-      <w:proofErr w:type="gramStart"/>
-      <w:r>
-        <w:t>匯</w:t>
-      </w:r>
-      <w:proofErr w:type="gramEnd"/>
-      <w:r>
-        <w:t>在顯示器的流動過程中，慢慢由完整的字分解成流動的水墨，最後流入顯示器底端，幾秒後平板接續顯示器的水墨，並慢慢往平板中心匯聚，匯聚過程中漸漸變色</w:t>
-      </w:r>
-      <w:proofErr w:type="gramStart"/>
-      <w:r>
-        <w:t>（</w:t>
-      </w:r>
-      <w:proofErr w:type="gramEnd"/>
-      <w:r>
-        <w:t>顔色是根據最終要生成的寶石顔色決定）</w:t>
+        <w:t>，設計點擊五組心情詞擇一後，透過影像識別人眼，最終選擇的心情詞會不斷從眼中流出（流出的詞匯越來越多，有最大值），詞匯在顯示器的流動過程中，慢慢由完整的字分解成流動的水墨，最後流入顯示器底端，幾秒後平板接續顯示器的水墨，並慢慢往平板中心匯聚，匯聚過程中漸漸變色（顔色是根據最終要生成的寶石顔色決定）</w:t>
       </w:r>
       <w:r>
         <w:t>,</w:t>
@@ -5242,6 +5087,7 @@
         <w:rPr>
           <w:noProof/>
         </w:rPr>
+        <w:lastRenderedPageBreak/>
         <w:drawing>
           <wp:inline distT="0" distB="0" distL="0" distR="0" wp14:anchorId="755F5801" wp14:editId="11054A60">
             <wp:extent cx="5274310" cy="2160270"/>
@@ -5382,6 +5228,7 @@
         <w:rPr>
           <w:noProof/>
         </w:rPr>
+        <w:lastRenderedPageBreak/>
         <w:drawing>
           <wp:inline distT="0" distB="0" distL="0" distR="0" wp14:anchorId="0B78E0C1" wp14:editId="0ED73B1D">
             <wp:extent cx="5274310" cy="2898140"/>
@@ -5517,6 +5364,7 @@
         <w:rPr>
           <w:noProof/>
         </w:rPr>
+        <w:lastRenderedPageBreak/>
         <w:drawing>
           <wp:inline distT="0" distB="0" distL="0" distR="0" wp14:anchorId="40F4A1C2" wp14:editId="254072D8">
             <wp:extent cx="5274310" cy="2540635"/>

</xml_diff>

<commit_message>
0.13.20 feat(engine): implement smart random horizontal distribution for tablet ripples
</commit_message>
<xml_diff>
--- a/To do.docx
+++ b/To do.docx
@@ -742,7 +742,8 @@
       <w:pPr>
         <w:jc w:val="left"/>
         <w:rPr>
-          <w:rFonts w:eastAsia="DengXian"/>
+          <w:rFonts w:ascii="DengXian" w:eastAsia="DengXian" w:hAnsi="DengXian" w:cs="微軟正黑體"/>
+          <w:lang w:eastAsia="zh-CN"/>
         </w:rPr>
       </w:pPr>
       <w:r>
@@ -750,6 +751,209 @@
           <w:rFonts w:ascii="DengXian" w:eastAsia="新細明體" w:hAnsi="DengXian" w:cs="微軟正黑體" w:hint="eastAsia"/>
         </w:rPr>
         <w:t>設計組：</w:t>
+      </w:r>
+    </w:p>
+    <w:p>
+      <w:pPr>
+        <w:jc w:val="left"/>
+        <w:rPr>
+          <w:rFonts w:asciiTheme="minorEastAsia" w:eastAsia="DengXian" w:hAnsiTheme="minorEastAsia"/>
+          <w:lang w:eastAsia="zh-CN"/>
+        </w:rPr>
+      </w:pPr>
+      <w:sdt>
+        <w:sdtPr>
+          <w:rPr>
+            <w:rFonts w:eastAsia="DengXian" w:hint="eastAsia"/>
+          </w:rPr>
+          <w:id w:val="779608598"/>
+          <w14:checkbox>
+            <w14:checked w14:val="0"/>
+            <w14:checkedState w14:val="2612" w14:font="MS Gothic"/>
+            <w14:uncheckedState w14:val="2610" w14:font="MS Gothic"/>
+          </w14:checkbox>
+        </w:sdtPr>
+        <w:sdtContent>
+          <w:r>
+            <w:rPr>
+              <w:rFonts w:ascii="MS Gothic" w:eastAsia="MS Gothic" w:hAnsi="MS Gothic" w:hint="eastAsia"/>
+            </w:rPr>
+            <w:t>☐</w:t>
+          </w:r>
+        </w:sdtContent>
+      </w:sdt>
+      <w:r>
+        <w:rPr>
+          <w:rFonts w:asciiTheme="minorEastAsia" w:hAnsiTheme="minorEastAsia"/>
+        </w:rPr>
+        <w:t xml:space="preserve"> 20</w:t>
+      </w:r>
+      <w:r>
+        <w:rPr>
+          <w:rFonts w:asciiTheme="minorEastAsia" w:hAnsiTheme="minorEastAsia" w:hint="eastAsia"/>
+        </w:rPr>
+        <w:t>個水波紋文字圖</w:t>
+      </w:r>
+      <w:r>
+        <w:rPr>
+          <w:rFonts w:asciiTheme="minorEastAsia" w:hAnsiTheme="minorEastAsia"/>
+        </w:rPr>
+        <w:t>(</w:t>
+      </w:r>
+      <w:r>
+        <w:rPr>
+          <w:rFonts w:asciiTheme="minorEastAsia" w:hAnsiTheme="minorEastAsia" w:hint="eastAsia"/>
+        </w:rPr>
+        <w:t>變形</w:t>
+      </w:r>
+      <w:r>
+        <w:rPr>
+          <w:rFonts w:asciiTheme="minorEastAsia" w:hAnsiTheme="minorEastAsia"/>
+        </w:rPr>
+        <w:t>)</w:t>
+      </w:r>
+    </w:p>
+    <w:p>
+      <w:pPr>
+        <w:jc w:val="left"/>
+        <w:rPr>
+          <w:rFonts w:eastAsia="DengXian"/>
+          <w:lang w:eastAsia="zh-CN"/>
+        </w:rPr>
+      </w:pPr>
+      <w:sdt>
+        <w:sdtPr>
+          <w:rPr>
+            <w:rFonts w:eastAsia="DengXian" w:hint="eastAsia"/>
+          </w:rPr>
+          <w:id w:val="-316335364"/>
+          <w14:checkbox>
+            <w14:checked w14:val="0"/>
+            <w14:checkedState w14:val="2612" w14:font="MS Gothic"/>
+            <w14:uncheckedState w14:val="2610" w14:font="MS Gothic"/>
+          </w14:checkbox>
+        </w:sdtPr>
+        <w:sdtContent>
+          <w:r>
+            <w:rPr>
+              <w:rFonts w:ascii="MS Gothic" w:eastAsia="MS Gothic" w:hAnsi="MS Gothic" w:hint="eastAsia"/>
+            </w:rPr>
+            <w:t>☐</w:t>
+          </w:r>
+        </w:sdtContent>
+      </w:sdt>
+      <w:r>
+        <w:rPr>
+          <w:rFonts w:eastAsia="DengXian" w:hint="eastAsia"/>
+          <w:lang w:eastAsia="zh-CN"/>
+        </w:rPr>
+        <w:t xml:space="preserve"> 水波纹音效</w:t>
+      </w:r>
+    </w:p>
+    <w:p>
+      <w:pPr>
+        <w:jc w:val="left"/>
+        <w:rPr>
+          <w:rFonts w:eastAsia="DengXian" w:hint="eastAsia"/>
+          <w:lang w:eastAsia="zh-CN"/>
+        </w:rPr>
+      </w:pPr>
+      <w:sdt>
+        <w:sdtPr>
+          <w:rPr>
+            <w:rFonts w:eastAsia="DengXian" w:hint="eastAsia"/>
+            <w:lang w:eastAsia="zh-CN"/>
+          </w:rPr>
+          <w:id w:val="14043562"/>
+          <w14:checkbox>
+            <w14:checked w14:val="0"/>
+            <w14:checkedState w14:val="2612" w14:font="MS Gothic"/>
+            <w14:uncheckedState w14:val="2610" w14:font="MS Gothic"/>
+          </w14:checkbox>
+        </w:sdtPr>
+        <w:sdtContent>
+          <w:r>
+            <w:rPr>
+              <w:rFonts w:ascii="MS Gothic" w:eastAsia="MS Gothic" w:hAnsi="MS Gothic" w:hint="eastAsia"/>
+              <w:lang w:eastAsia="zh-CN"/>
+            </w:rPr>
+            <w:t>☐</w:t>
+          </w:r>
+        </w:sdtContent>
+      </w:sdt>
+      <w:r>
+        <w:rPr>
+          <w:rFonts w:eastAsia="DengXian" w:hint="eastAsia"/>
+          <w:lang w:eastAsia="zh-CN"/>
+        </w:rPr>
+        <w:t xml:space="preserve"> </w:t>
+      </w:r>
+      <w:r>
+        <w:rPr>
+          <w:rFonts w:eastAsia="DengXian" w:hint="eastAsia"/>
+          <w:lang w:eastAsia="zh-CN"/>
+        </w:rPr>
+        <w:t>宝石呈现音效</w:t>
+      </w:r>
+      <w:r>
+        <w:rPr>
+          <w:rFonts w:eastAsia="DengXian" w:hint="eastAsia"/>
+          <w:lang w:eastAsia="zh-CN"/>
+        </w:rPr>
+        <w:t>(可不准备)</w:t>
+      </w:r>
+    </w:p>
+    <w:p>
+      <w:pPr>
+        <w:jc w:val="left"/>
+        <w:rPr>
+          <w:rFonts w:eastAsia="DengXian" w:hint="eastAsia"/>
+          <w:lang w:eastAsia="zh-CN"/>
+        </w:rPr>
+      </w:pPr>
+      <w:sdt>
+        <w:sdtPr>
+          <w:rPr>
+            <w:rFonts w:eastAsia="DengXian" w:hint="eastAsia"/>
+            <w:lang w:eastAsia="zh-CN"/>
+          </w:rPr>
+          <w:id w:val="1615317404"/>
+          <w14:checkbox>
+            <w14:checked w14:val="0"/>
+            <w14:checkedState w14:val="2612" w14:font="MS Gothic"/>
+            <w14:uncheckedState w14:val="2610" w14:font="MS Gothic"/>
+          </w14:checkbox>
+        </w:sdtPr>
+        <w:sdtContent>
+          <w:r>
+            <w:rPr>
+              <w:rFonts w:ascii="MS Gothic" w:eastAsia="MS Gothic" w:hAnsi="MS Gothic" w:hint="eastAsia"/>
+              <w:lang w:eastAsia="zh-CN"/>
+            </w:rPr>
+            <w:t>☐</w:t>
+          </w:r>
+        </w:sdtContent>
+      </w:sdt>
+      <w:r>
+        <w:rPr>
+          <w:rFonts w:eastAsia="DengXian" w:hint="eastAsia"/>
+          <w:lang w:eastAsia="zh-CN"/>
+        </w:rPr>
+        <w:t xml:space="preserve"> </w:t>
+      </w:r>
+      <w:r>
+        <w:rPr>
+          <w:rFonts w:eastAsia="DengXian" w:hint="eastAsia"/>
+          <w:lang w:eastAsia="zh-CN"/>
+        </w:rPr>
+        <w:t>待机音效</w:t>
+      </w:r>
+      <w:r>
+        <w:rPr>
+          <w:rFonts w:eastAsia="DengXian" w:hint="eastAsia"/>
+          <w:lang w:eastAsia="zh-CN"/>
+        </w:rPr>
+        <w:t>(可不准备)</w:t>
       </w:r>
     </w:p>
     <w:p>
@@ -921,7 +1125,7 @@
       <w:pPr>
         <w:jc w:val="left"/>
         <w:rPr>
-          <w:rFonts w:asciiTheme="minorEastAsia" w:eastAsia="DengXian" w:hAnsiTheme="minorEastAsia"/>
+          <w:rFonts w:asciiTheme="minorEastAsia" w:hAnsiTheme="minorEastAsia"/>
         </w:rPr>
       </w:pPr>
       <w:sdt>
@@ -931,7 +1135,7 @@
           </w:rPr>
           <w:id w:val="-1680348082"/>
           <w14:checkbox>
-            <w14:checked w14:val="0"/>
+            <w14:checked w14:val="1"/>
             <w14:checkedState w14:val="2612" w14:font="MS Gothic"/>
             <w14:uncheckedState w14:val="2610" w14:font="MS Gothic"/>
           </w14:checkbox>
@@ -941,7 +1145,7 @@
             <w:rPr>
               <w:rFonts w:ascii="MS Gothic" w:eastAsia="MS Gothic" w:hAnsi="MS Gothic" w:hint="eastAsia"/>
             </w:rPr>
-            <w:t>☐</w:t>
+            <w:t>☒</w:t>
           </w:r>
         </w:sdtContent>
       </w:sdt>
@@ -967,7 +1171,7 @@
         <w:rPr>
           <w:rFonts w:asciiTheme="minorEastAsia" w:hAnsiTheme="minorEastAsia" w:hint="eastAsia"/>
         </w:rPr>
-        <w:t>變形變色</w:t>
+        <w:t>變色</w:t>
       </w:r>
       <w:r>
         <w:rPr>
@@ -990,7 +1194,7 @@
           </w:rPr>
           <w:id w:val="-1266382887"/>
           <w14:checkbox>
-            <w14:checked w14:val="0"/>
+            <w14:checked w14:val="1"/>
             <w14:checkedState w14:val="2612" w14:font="MS Gothic"/>
             <w14:uncheckedState w14:val="2610" w14:font="MS Gothic"/>
           </w14:checkbox>
@@ -1000,7 +1204,7 @@
             <w:rPr>
               <w:rFonts w:ascii="MS Gothic" w:eastAsia="MS Gothic" w:hAnsi="MS Gothic" w:hint="eastAsia"/>
             </w:rPr>
-            <w:t>☐</w:t>
+            <w:t>☒</w:t>
           </w:r>
         </w:sdtContent>
       </w:sdt>
@@ -1031,7 +1235,7 @@
           </w:rPr>
           <w:id w:val="1410652168"/>
           <w14:checkbox>
-            <w14:checked w14:val="0"/>
+            <w14:checked w14:val="1"/>
             <w14:checkedState w14:val="2612" w14:font="MS Gothic"/>
             <w14:uncheckedState w14:val="2610" w14:font="MS Gothic"/>
           </w14:checkbox>
@@ -1041,7 +1245,7 @@
             <w:rPr>
               <w:rFonts w:ascii="MS Gothic" w:eastAsia="MS Gothic" w:hAnsi="MS Gothic" w:hint="eastAsia"/>
             </w:rPr>
-            <w:t>☐</w:t>
+            <w:t>☒</w:t>
           </w:r>
         </w:sdtContent>
       </w:sdt>
@@ -1072,7 +1276,7 @@
           </w:rPr>
           <w:id w:val="1141612850"/>
           <w14:checkbox>
-            <w14:checked w14:val="0"/>
+            <w14:checked w14:val="1"/>
             <w14:checkedState w14:val="2612" w14:font="MS Gothic"/>
             <w14:uncheckedState w14:val="2610" w14:font="MS Gothic"/>
           </w14:checkbox>
@@ -1082,7 +1286,7 @@
             <w:rPr>
               <w:rFonts w:ascii="MS Gothic" w:eastAsia="MS Gothic" w:hAnsi="MS Gothic" w:hint="eastAsia"/>
             </w:rPr>
-            <w:t>☐</w:t>
+            <w:t>☒</w:t>
           </w:r>
         </w:sdtContent>
       </w:sdt>
@@ -1159,6 +1363,7 @@
         <w:jc w:val="left"/>
         <w:rPr>
           <w:rFonts w:eastAsia="新細明體"/>
+          <w:lang w:eastAsia="zh-CN"/>
         </w:rPr>
       </w:pPr>
       <w:r>
@@ -1173,7 +1378,8 @@
       <w:pPr>
         <w:jc w:val="left"/>
         <w:rPr>
-          <w:rFonts w:eastAsia="DengXian" w:hint="eastAsia"/>
+          <w:rFonts w:eastAsia="DengXian"/>
+          <w:lang w:eastAsia="zh-CN"/>
         </w:rPr>
       </w:pPr>
       <w:sdt>
@@ -1202,62 +1408,42 @@
       <w:r>
         <w:rPr>
           <w:rFonts w:asciiTheme="minorEastAsia" w:hAnsiTheme="minorEastAsia" w:hint="eastAsia"/>
+          <w:lang w:eastAsia="zh-CN"/>
         </w:rPr>
         <w:t xml:space="preserve"> </w:t>
       </w:r>
-    </w:p>
-    <w:p>
-      <w:pPr>
-        <w:jc w:val="left"/>
-        <w:rPr>
-          <w:rFonts w:hint="eastAsia"/>
-        </w:rPr>
-      </w:pPr>
-      <w:sdt>
-        <w:sdtPr>
-          <w:rPr>
-            <w:rFonts w:eastAsia="DengXian" w:hint="eastAsia"/>
-            <w:lang w:eastAsia="zh-CN"/>
-          </w:rPr>
-          <w:id w:val="-1630004191"/>
-          <w14:checkbox>
-            <w14:checked w14:val="0"/>
-            <w14:checkedState w14:val="2612" w14:font="MS Gothic"/>
-            <w14:uncheckedState w14:val="2610" w14:font="MS Gothic"/>
-          </w14:checkbox>
-        </w:sdtPr>
-        <w:sdtContent>
-          <w:r>
-            <w:rPr>
-              <w:rFonts w:ascii="MS Gothic" w:eastAsia="MS Gothic" w:hAnsi="MS Gothic" w:hint="eastAsia"/>
-              <w:lang w:eastAsia="zh-CN"/>
-            </w:rPr>
-            <w:t>☐</w:t>
-          </w:r>
-        </w:sdtContent>
-      </w:sdt>
-      <w:r>
-        <w:rPr>
-          <w:rFonts w:eastAsia="DengXian" w:hint="eastAsia"/>
-          <w:lang w:eastAsia="zh-CN"/>
-        </w:rPr>
-        <w:t xml:space="preserve"> 待机动画风格</w:t>
-      </w:r>
-    </w:p>
-    <w:p>
-      <w:pPr>
-        <w:jc w:val="left"/>
-        <w:rPr>
-          <w:rFonts w:asciiTheme="minorEastAsia" w:eastAsia="DengXian" w:hAnsiTheme="minorEastAsia"/>
-          <w:lang w:eastAsia="zh-CN"/>
-        </w:rPr>
+      <w:r>
+        <w:rPr>
+          <w:rFonts w:ascii="DengXian" w:eastAsia="DengXian" w:hAnsi="DengXian" w:hint="eastAsia"/>
+          <w:lang w:eastAsia="zh-CN"/>
+        </w:rPr>
+        <w:t>水波纹水平</w:t>
+      </w:r>
+      <w:r>
+        <w:rPr>
+          <w:rFonts w:ascii="DengXian" w:eastAsia="DengXian" w:hAnsi="DengXian" w:hint="eastAsia"/>
+          <w:lang w:eastAsia="zh-CN"/>
+        </w:rPr>
+        <w:t>映射</w:t>
+      </w:r>
+      <w:r>
+        <w:rPr>
+          <w:rFonts w:ascii="DengXian" w:eastAsia="DengXian" w:hAnsi="DengXian" w:hint="eastAsia"/>
+          <w:lang w:eastAsia="zh-CN"/>
+        </w:rPr>
+        <w:t>转随机</w:t>
+      </w:r>
+    </w:p>
+    <w:p>
+      <w:pPr>
+        <w:jc w:val="left"/>
       </w:pPr>
       <w:sdt>
         <w:sdtPr>
           <w:rPr>
             <w:rFonts w:eastAsia="DengXian" w:hint="eastAsia"/>
           </w:rPr>
-          <w:id w:val="881442455"/>
+          <w:id w:val="-1630004191"/>
           <w14:checkbox>
             <w14:checked w14:val="0"/>
             <w14:checkedState w14:val="2612" w14:font="MS Gothic"/>
@@ -1275,6 +1461,91 @@
       </w:sdt>
       <w:r>
         <w:rPr>
+          <w:rFonts w:eastAsia="DengXian" w:hint="eastAsia"/>
+        </w:rPr>
+        <w:t xml:space="preserve"> 待机动画风格</w:t>
+      </w:r>
+    </w:p>
+    <w:p>
+      <w:pPr>
+        <w:jc w:val="left"/>
+        <w:rPr>
+          <w:rFonts w:eastAsia="DengXian" w:hint="eastAsia"/>
+          <w:lang w:eastAsia="zh-CN"/>
+        </w:rPr>
+      </w:pPr>
+      <w:sdt>
+        <w:sdtPr>
+          <w:rPr>
+            <w:rFonts w:eastAsia="DengXian" w:hint="eastAsia"/>
+          </w:rPr>
+          <w:id w:val="1843670598"/>
+          <w14:checkbox>
+            <w14:checked w14:val="1"/>
+            <w14:checkedState w14:val="2612" w14:font="MS Gothic"/>
+            <w14:uncheckedState w14:val="2610" w14:font="MS Gothic"/>
+          </w14:checkbox>
+        </w:sdtPr>
+        <w:sdtContent>
+          <w:r>
+            <w:rPr>
+              <w:rFonts w:ascii="MS Gothic" w:eastAsia="MS Gothic" w:hAnsi="MS Gothic" w:hint="eastAsia"/>
+            </w:rPr>
+            <w:t>☒</w:t>
+          </w:r>
+        </w:sdtContent>
+      </w:sdt>
+      <w:r>
+        <w:rPr>
+          <w:rFonts w:hint="eastAsia"/>
+        </w:rPr>
+        <w:t xml:space="preserve"> </w:t>
+      </w:r>
+      <w:r>
+        <w:rPr>
+          <w:rFonts w:eastAsia="DengXian" w:hint="eastAsia"/>
+          <w:lang w:eastAsia="zh-CN"/>
+        </w:rPr>
+        <w:t>待机动画噪音图</w:t>
+      </w:r>
+      <w:r>
+        <w:rPr>
+          <w:rFonts w:eastAsia="DengXian" w:hint="eastAsia"/>
+          <w:lang w:eastAsia="zh-CN"/>
+        </w:rPr>
+        <w:t>数值</w:t>
+      </w:r>
+    </w:p>
+    <w:p>
+      <w:pPr>
+        <w:jc w:val="left"/>
+        <w:rPr>
+          <w:rFonts w:asciiTheme="minorEastAsia" w:eastAsia="DengXian" w:hAnsiTheme="minorEastAsia" w:hint="eastAsia"/>
+        </w:rPr>
+      </w:pPr>
+      <w:sdt>
+        <w:sdtPr>
+          <w:rPr>
+            <w:rFonts w:eastAsia="DengXian" w:hint="eastAsia"/>
+          </w:rPr>
+          <w:id w:val="881442455"/>
+          <w14:checkbox>
+            <w14:checked w14:val="1"/>
+            <w14:checkedState w14:val="2612" w14:font="MS Gothic"/>
+            <w14:uncheckedState w14:val="2610" w14:font="MS Gothic"/>
+          </w14:checkbox>
+        </w:sdtPr>
+        <w:sdtContent>
+          <w:r>
+            <w:rPr>
+              <w:rFonts w:ascii="MS Gothic" w:eastAsia="MS Gothic" w:hAnsi="MS Gothic" w:hint="eastAsia"/>
+            </w:rPr>
+            <w:t>☒</w:t>
+          </w:r>
+        </w:sdtContent>
+      </w:sdt>
+      <w:r>
+        <w:rPr>
           <w:rFonts w:asciiTheme="minorEastAsia" w:hAnsiTheme="minorEastAsia"/>
         </w:rPr>
         <w:t xml:space="preserve"> </w:t>
@@ -1299,15 +1570,15 @@
       </w:r>
       <w:r>
         <w:rPr>
+          <w:rFonts w:ascii="DengXian" w:eastAsia="DengXian" w:hAnsi="DengXian" w:hint="eastAsia"/>
+        </w:rPr>
+        <w:t>，可不准备</w:t>
+      </w:r>
+      <w:r>
+        <w:rPr>
           <w:rFonts w:asciiTheme="minorEastAsia" w:hAnsiTheme="minorEastAsia"/>
         </w:rPr>
         <w:t>)</w:t>
-      </w:r>
-      <w:r>
-        <w:rPr>
-          <w:rFonts w:asciiTheme="minorEastAsia" w:hAnsiTheme="minorEastAsia"/>
-        </w:rPr>
-        <w:tab/>
       </w:r>
     </w:p>
     <w:p>
@@ -1448,7 +1719,6 @@
         <w:jc w:val="left"/>
         <w:rPr>
           <w:rFonts w:eastAsia="DengXian"/>
-          <w:lang w:eastAsia="zh-CN"/>
         </w:rPr>
       </w:pPr>
       <w:sdt>
@@ -1490,6 +1760,7 @@
         <w:jc w:val="left"/>
         <w:rPr>
           <w:rFonts w:eastAsia="DengXian"/>
+          <w:lang w:eastAsia="zh-CN"/>
         </w:rPr>
       </w:pPr>
       <w:sdt>
@@ -3402,31 +3673,56 @@
           <w:lang w:eastAsia="zh-CN"/>
         </w:rPr>
       </w:pPr>
-      <w:proofErr w:type="spellStart"/>
       <w:r>
         <w:rPr>
           <w:rFonts w:eastAsia="新細明體"/>
         </w:rPr>
-        <w:t>npm</w:t>
-      </w:r>
-      <w:proofErr w:type="spellEnd"/>
+        <w:t>npm install react-router-dom</w:t>
+      </w:r>
+    </w:p>
+    <w:p>
+      <w:pPr>
+        <w:jc w:val="left"/>
+        <w:rPr>
+          <w:rFonts w:eastAsia="DengXian"/>
+          <w:lang w:eastAsia="zh-CN"/>
+        </w:rPr>
+      </w:pPr>
       <w:r>
         <w:rPr>
           <w:rFonts w:eastAsia="新細明體"/>
         </w:rPr>
-        <w:t xml:space="preserve"> install react-router-</w:t>
-      </w:r>
-      <w:proofErr w:type="spellStart"/>
+        <w:t xml:space="preserve"># </w:t>
+      </w:r>
+      <w:r>
+        <w:rPr>
+          <w:rFonts w:eastAsia="新細明體" w:hint="eastAsia"/>
+        </w:rPr>
+        <w:t>安裝前端</w:t>
+      </w:r>
       <w:r>
         <w:rPr>
           <w:rFonts w:eastAsia="新細明體"/>
         </w:rPr>
-        <w:t>dom</w:t>
-      </w:r>
-      <w:proofErr w:type="spellEnd"/>
-    </w:p>
-    <w:p>
-      <w:pPr>
+        <w:t xml:space="preserve"> Socket </w:t>
+      </w:r>
+      <w:r>
+        <w:rPr>
+          <w:rFonts w:eastAsia="新細明體" w:hint="eastAsia"/>
+        </w:rPr>
+        <w:t>用戶端</w:t>
+      </w:r>
+      <w:r>
+        <w:rPr>
+          <w:rFonts w:eastAsia="DengXian"/>
+          <w:lang w:eastAsia="zh-CN"/>
+        </w:rPr>
+        <w:t xml:space="preserve"> </w:t>
+      </w:r>
+    </w:p>
+    <w:p>
+      <w:pPr>
+        <w:ind w:firstLine="480"/>
         <w:jc w:val="left"/>
         <w:rPr>
           <w:rFonts w:eastAsia="DengXian"/>
@@ -3437,202 +3733,130 @@
         <w:rPr>
           <w:rFonts w:eastAsia="新細明體"/>
         </w:rPr>
+        <w:t>npm install socket.io-client</w:t>
+      </w:r>
+    </w:p>
+    <w:p>
+      <w:pPr>
+        <w:jc w:val="left"/>
+        <w:rPr>
+          <w:rFonts w:eastAsia="DengXian"/>
+        </w:rPr>
+      </w:pPr>
+      <w:r>
+        <w:rPr>
+          <w:rFonts w:eastAsia="新細明體"/>
+        </w:rPr>
         <w:t xml:space="preserve"># </w:t>
       </w:r>
       <w:r>
         <w:rPr>
           <w:rFonts w:eastAsia="新細明體" w:hint="eastAsia"/>
         </w:rPr>
-        <w:t>安裝前端</w:t>
-      </w:r>
+        <w:t>安裝後端伺服器套件（用來當兩台裝置的郵差）</w:t>
+      </w:r>
+      <w:r>
+        <w:rPr>
+          <w:rFonts w:eastAsia="DengXian"/>
+        </w:rPr>
+        <w:t xml:space="preserve"> </w:t>
+      </w:r>
+    </w:p>
+    <w:p>
+      <w:pPr>
+        <w:ind w:firstLine="480"/>
+        <w:jc w:val="left"/>
+        <w:rPr>
+          <w:rFonts w:eastAsia="DengXian"/>
+          <w:lang w:eastAsia="zh-CN"/>
+        </w:rPr>
+      </w:pPr>
       <w:r>
         <w:rPr>
           <w:rFonts w:eastAsia="新細明體"/>
         </w:rPr>
-        <w:t xml:space="preserve"> Socket </w:t>
+        <w:t>npm install express socket.io</w:t>
+      </w:r>
+    </w:p>
+    <w:p>
+      <w:pPr>
+        <w:jc w:val="left"/>
+      </w:pPr>
+      <w:r>
+        <w:rPr>
+          <w:rFonts w:asciiTheme="minorEastAsia" w:hAnsiTheme="minorEastAsia"/>
+        </w:rPr>
+        <w:t xml:space="preserve"># </w:t>
+      </w:r>
+      <w:r>
+        <w:rPr>
+          <w:rFonts w:asciiTheme="minorEastAsia" w:hAnsiTheme="minorEastAsia" w:hint="eastAsia"/>
+        </w:rPr>
+        <w:t>啟動伺服器</w:t>
+      </w:r>
+    </w:p>
+    <w:p>
+      <w:pPr>
+        <w:jc w:val="left"/>
+        <w:rPr>
+          <w:rFonts w:eastAsia="DengXian"/>
+          <w:lang w:eastAsia="zh-CN"/>
+        </w:rPr>
+      </w:pPr>
+      <w:r>
+        <w:tab/>
+      </w:r>
+      <w:r>
+        <w:t>node server.js</w:t>
+      </w:r>
+    </w:p>
+    <w:p>
+      <w:pPr>
+        <w:jc w:val="left"/>
+        <w:rPr>
+          <w:rFonts w:eastAsia="DengXian"/>
+          <w:lang w:eastAsia="zh-CN"/>
+        </w:rPr>
+      </w:pPr>
+      <w:r>
+        <w:rPr>
+          <w:rFonts w:eastAsia="新細明體"/>
+        </w:rPr>
+        <w:t xml:space="preserve"># </w:t>
       </w:r>
       <w:r>
         <w:rPr>
           <w:rFonts w:eastAsia="新細明體" w:hint="eastAsia"/>
         </w:rPr>
-        <w:t>用戶端</w:t>
-      </w:r>
-      <w:r>
-        <w:rPr>
-          <w:rFonts w:eastAsia="DengXian"/>
-          <w:lang w:eastAsia="zh-CN"/>
-        </w:rPr>
-        <w:t xml:space="preserve"> </w:t>
-      </w:r>
-    </w:p>
-    <w:p>
-      <w:pPr>
-        <w:ind w:firstLine="480"/>
-        <w:jc w:val="left"/>
-        <w:rPr>
-          <w:rFonts w:eastAsia="DengXian"/>
-          <w:lang w:eastAsia="zh-CN"/>
-        </w:rPr>
-      </w:pPr>
-      <w:proofErr w:type="spellStart"/>
+        <w:t>第三方音效庫（新增</w:t>
+      </w:r>
       <w:r>
         <w:rPr>
           <w:rFonts w:eastAsia="新細明體"/>
         </w:rPr>
-        <w:t>npm</w:t>
-      </w:r>
-      <w:proofErr w:type="spellEnd"/>
+        <w:t xml:space="preserve"> howler </w:t>
+      </w:r>
+      <w:r>
+        <w:rPr>
+          <w:rFonts w:eastAsia="新細明體" w:hint="eastAsia"/>
+        </w:rPr>
+        <w:t>套件依賴）</w:t>
+      </w:r>
+    </w:p>
+    <w:p>
+      <w:pPr>
+        <w:jc w:val="left"/>
+        <w:rPr>
+          <w:rFonts w:eastAsia="DengXian"/>
+          <w:lang w:eastAsia="zh-CN"/>
+        </w:rPr>
+      </w:pPr>
       <w:r>
         <w:rPr>
           <w:rFonts w:eastAsia="新細明體"/>
         </w:rPr>
-        <w:t xml:space="preserve"> install socket.io-client</w:t>
-      </w:r>
-    </w:p>
-    <w:p>
-      <w:pPr>
-        <w:jc w:val="left"/>
-        <w:rPr>
-          <w:rFonts w:eastAsia="DengXian"/>
-          <w:lang w:eastAsia="zh-CN"/>
-        </w:rPr>
-      </w:pPr>
-      <w:r>
-        <w:rPr>
-          <w:rFonts w:eastAsia="新細明體"/>
-        </w:rPr>
-        <w:t xml:space="preserve"># </w:t>
-      </w:r>
-      <w:r>
-        <w:rPr>
-          <w:rFonts w:eastAsia="新細明體" w:hint="eastAsia"/>
-        </w:rPr>
-        <w:t>安裝後端伺服器套件（用來當兩台裝置的郵差）</w:t>
-      </w:r>
-      <w:r>
-        <w:rPr>
-          <w:rFonts w:eastAsia="DengXian"/>
-          <w:lang w:eastAsia="zh-CN"/>
-        </w:rPr>
-        <w:t xml:space="preserve"> </w:t>
-      </w:r>
-    </w:p>
-    <w:p>
-      <w:pPr>
-        <w:ind w:firstLine="480"/>
-        <w:jc w:val="left"/>
-        <w:rPr>
-          <w:rFonts w:eastAsia="DengXian"/>
-          <w:lang w:eastAsia="zh-CN"/>
-        </w:rPr>
-      </w:pPr>
-      <w:proofErr w:type="spellStart"/>
-      <w:r>
-        <w:rPr>
-          <w:rFonts w:eastAsia="新細明體"/>
-        </w:rPr>
-        <w:t>npm</w:t>
-      </w:r>
-      <w:proofErr w:type="spellEnd"/>
-      <w:r>
-        <w:rPr>
-          <w:rFonts w:eastAsia="新細明體"/>
-        </w:rPr>
-        <w:t xml:space="preserve"> install express socket.io</w:t>
-      </w:r>
-    </w:p>
-    <w:p>
-      <w:pPr>
-        <w:jc w:val="left"/>
-      </w:pPr>
-      <w:r>
-        <w:rPr>
-          <w:rFonts w:asciiTheme="minorEastAsia" w:hAnsiTheme="minorEastAsia"/>
-        </w:rPr>
-        <w:t xml:space="preserve"># </w:t>
-      </w:r>
-      <w:r>
-        <w:rPr>
-          <w:rFonts w:asciiTheme="minorEastAsia" w:hAnsiTheme="minorEastAsia" w:hint="eastAsia"/>
-        </w:rPr>
-        <w:t>啟動伺服器</w:t>
-      </w:r>
-    </w:p>
-    <w:p>
-      <w:pPr>
-        <w:jc w:val="left"/>
-        <w:rPr>
-          <w:rFonts w:eastAsia="DengXian"/>
-          <w:lang w:eastAsia="zh-CN"/>
-        </w:rPr>
-      </w:pPr>
-      <w:r>
         <w:tab/>
-      </w:r>
-      <w:r>
-        <w:t>node server.js</w:t>
-      </w:r>
-    </w:p>
-    <w:p>
-      <w:pPr>
-        <w:jc w:val="left"/>
-        <w:rPr>
-          <w:rFonts w:eastAsia="DengXian"/>
-          <w:lang w:eastAsia="zh-CN"/>
-        </w:rPr>
-      </w:pPr>
-      <w:r>
-        <w:rPr>
-          <w:rFonts w:eastAsia="新細明體"/>
-        </w:rPr>
-        <w:t xml:space="preserve"># </w:t>
-      </w:r>
-      <w:r>
-        <w:rPr>
-          <w:rFonts w:eastAsia="新細明體" w:hint="eastAsia"/>
-        </w:rPr>
-        <w:t>第三方音效庫（新增</w:t>
-      </w:r>
-      <w:r>
-        <w:rPr>
-          <w:rFonts w:eastAsia="新細明體"/>
-        </w:rPr>
-        <w:t xml:space="preserve"> howler </w:t>
-      </w:r>
-      <w:r>
-        <w:rPr>
-          <w:rFonts w:eastAsia="新細明體" w:hint="eastAsia"/>
-        </w:rPr>
-        <w:t>套件依賴）</w:t>
-      </w:r>
-    </w:p>
-    <w:p>
-      <w:pPr>
-        <w:jc w:val="left"/>
-        <w:rPr>
-          <w:rFonts w:eastAsia="DengXian"/>
-          <w:lang w:eastAsia="zh-CN"/>
-        </w:rPr>
-      </w:pPr>
-      <w:r>
-        <w:rPr>
-          <w:rFonts w:eastAsia="新細明體"/>
-        </w:rPr>
-        <w:tab/>
-      </w:r>
-      <w:proofErr w:type="spellStart"/>
-      <w:r>
-        <w:rPr>
-          <w:rFonts w:eastAsia="新細明體"/>
-        </w:rPr>
-        <w:t>npm</w:t>
-      </w:r>
-      <w:proofErr w:type="spellEnd"/>
-      <w:r>
-        <w:rPr>
-          <w:rFonts w:eastAsia="新細明體"/>
-        </w:rPr>
-        <w:t xml:space="preserve"> i howler</w:t>
+        <w:t>npm i howler</w:t>
       </w:r>
     </w:p>
     <w:p>
@@ -3967,28 +4191,12 @@
         </w:rPr>
         <w:t>安裝路由：</w:t>
       </w:r>
-      <w:proofErr w:type="spellStart"/>
       <w:r>
         <w:rPr>
           <w:rFonts w:eastAsia="新細明體"/>
         </w:rPr>
-        <w:t>npm</w:t>
-      </w:r>
-      <w:proofErr w:type="spellEnd"/>
-      <w:r>
-        <w:rPr>
-          <w:rFonts w:eastAsia="新細明體"/>
-        </w:rPr>
-        <w:t xml:space="preserve"> install react-router-</w:t>
-      </w:r>
-      <w:proofErr w:type="spellStart"/>
-      <w:r>
-        <w:rPr>
-          <w:rFonts w:eastAsia="新細明體"/>
-        </w:rPr>
-        <w:t>dom</w:t>
-      </w:r>
-      <w:proofErr w:type="spellEnd"/>
+        <w:t>npm install react-router-dom</w:t>
+      </w:r>
     </w:p>
     <w:p>
       <w:pPr>
@@ -4011,21 +4219,7 @@
         <w:rPr>
           <w:rFonts w:eastAsia="新細明體"/>
         </w:rPr>
-        <w:t xml:space="preserve"> </w:t>
-      </w:r>
-      <w:proofErr w:type="spellStart"/>
-      <w:r>
-        <w:rPr>
-          <w:rFonts w:eastAsia="新細明體"/>
-        </w:rPr>
-        <w:t>App.jsx</w:t>
-      </w:r>
-      <w:proofErr w:type="spellEnd"/>
-      <w:r>
-        <w:rPr>
-          <w:rFonts w:eastAsia="新細明體"/>
-        </w:rPr>
-        <w:t xml:space="preserve"> </w:t>
+        <w:t xml:space="preserve"> App.jsx </w:t>
       </w:r>
       <w:r>
         <w:rPr>
@@ -4045,14 +4239,12 @@
           <w:rFonts w:eastAsia="DengXian"/>
         </w:rPr>
       </w:pPr>
-      <w:proofErr w:type="spellStart"/>
       <w:r>
         <w:rPr>
           <w:rFonts w:eastAsia="新細明體"/>
         </w:rPr>
         <w:t>App.jsx</w:t>
       </w:r>
-      <w:proofErr w:type="spellEnd"/>
       <w:r>
         <w:rPr>
           <w:rFonts w:eastAsia="新細明體" w:hint="eastAsia"/>
@@ -4072,14 +4264,12 @@
           <w:lang w:eastAsia="zh-CN"/>
         </w:rPr>
       </w:pPr>
-      <w:proofErr w:type="spellStart"/>
       <w:r>
         <w:rPr>
           <w:rFonts w:eastAsia="新細明體"/>
         </w:rPr>
         <w:t>MonitorView.jsx</w:t>
       </w:r>
-      <w:proofErr w:type="spellEnd"/>
       <w:r>
         <w:rPr>
           <w:rFonts w:eastAsia="新細明體" w:hint="eastAsia"/>
@@ -4111,14 +4301,12 @@
           <w:lang w:eastAsia="zh-CN"/>
         </w:rPr>
       </w:pPr>
-      <w:proofErr w:type="spellStart"/>
       <w:r>
         <w:rPr>
           <w:rFonts w:eastAsia="新細明體"/>
         </w:rPr>
         <w:t>TabletView.jsx</w:t>
       </w:r>
-      <w:proofErr w:type="spellEnd"/>
       <w:r>
         <w:rPr>
           <w:rFonts w:eastAsia="新細明體" w:hint="eastAsia"/>
@@ -4339,25 +4527,7 @@
           <w:b/>
           <w:bCs/>
         </w:rPr>
-        <w:t xml:space="preserve"> </w:t>
-      </w:r>
-      <w:proofErr w:type="spellStart"/>
-      <w:r>
-        <w:rPr>
-          <w:rFonts w:eastAsia="新細明體"/>
-          <w:b/>
-          <w:bCs/>
-        </w:rPr>
-        <w:t>BroadcastChannel</w:t>
-      </w:r>
-      <w:proofErr w:type="spellEnd"/>
-      <w:r>
-        <w:rPr>
-          <w:rFonts w:eastAsia="新細明體"/>
-          <w:b/>
-          <w:bCs/>
-        </w:rPr>
-        <w:t xml:space="preserve"> API)</w:t>
+        <w:t xml:space="preserve"> BroadcastChannel API)</w:t>
       </w:r>
     </w:p>
     <w:p>
@@ -4430,21 +4600,7 @@
         <w:rPr>
           <w:rFonts w:eastAsia="新細明體"/>
         </w:rPr>
-        <w:t xml:space="preserve"> </w:t>
-      </w:r>
-      <w:proofErr w:type="spellStart"/>
-      <w:r>
-        <w:rPr>
-          <w:rFonts w:eastAsia="新細明體"/>
-        </w:rPr>
-        <w:t>BroadcastChannel</w:t>
-      </w:r>
-      <w:proofErr w:type="spellEnd"/>
-      <w:r>
-        <w:rPr>
-          <w:rFonts w:eastAsia="新細明體"/>
-        </w:rPr>
-        <w:t xml:space="preserve"> </w:t>
+        <w:t xml:space="preserve"> BroadcastChannel </w:t>
       </w:r>
       <w:r>
         <w:rPr>
@@ -4870,9 +5026,6 @@
     <w:p>
       <w:pPr>
         <w:pStyle w:val="1"/>
-        <w:rPr>
-          <w:lang w:eastAsia="zh-CN"/>
-        </w:rPr>
       </w:pPr>
       <w:bookmarkStart w:id="8" w:name="_Toc230804036"/>
       <w:r>

</xml_diff>

<commit_message>
chore(assets): update gem sprite sheets and textures (v0.13.21)
</commit_message>
<xml_diff>
--- a/To do.docx
+++ b/To do.docx
@@ -742,23 +742,138 @@
       <w:pPr>
         <w:jc w:val="left"/>
         <w:rPr>
+          <w:rFonts w:asciiTheme="minorEastAsia" w:eastAsia="DengXian" w:hAnsiTheme="minorEastAsia"/>
+          <w:lang w:eastAsia="zh-CN"/>
+        </w:rPr>
+      </w:pPr>
+      <w:r>
+        <w:rPr>
+          <w:rFonts w:ascii="DengXian" w:eastAsia="新細明體" w:hAnsi="DengXian" w:cs="微軟正黑體" w:hint="eastAsia"/>
+        </w:rPr>
+        <w:t>設計組：</w:t>
+      </w:r>
+    </w:p>
+    <w:p>
+      <w:pPr>
+        <w:jc w:val="left"/>
+      </w:pPr>
+      <w:sdt>
+        <w:sdtPr>
+          <w:rPr>
+            <w:rFonts w:eastAsia="DengXian" w:hint="eastAsia"/>
+          </w:rPr>
+          <w:id w:val="-316335364"/>
+          <w14:checkbox>
+            <w14:checked w14:val="0"/>
+            <w14:checkedState w14:val="2612" w14:font="MS Gothic"/>
+            <w14:uncheckedState w14:val="2610" w14:font="MS Gothic"/>
+          </w14:checkbox>
+        </w:sdtPr>
+        <w:sdtContent>
+          <w:r>
+            <w:rPr>
+              <w:rFonts w:ascii="MS Gothic" w:eastAsia="MS Gothic" w:hAnsi="MS Gothic" w:hint="eastAsia"/>
+            </w:rPr>
+            <w:t>☐</w:t>
+          </w:r>
+        </w:sdtContent>
+      </w:sdt>
+      <w:r>
+        <w:rPr>
+          <w:rFonts w:eastAsia="DengXian" w:hint="eastAsia"/>
+          <w:lang w:eastAsia="zh-CN"/>
+        </w:rPr>
+        <w:t xml:space="preserve"> 水波纹音效</w:t>
+      </w:r>
+      <w:r>
+        <w:rPr>
+          <w:rFonts w:asciiTheme="minorEastAsia" w:hAnsiTheme="minorEastAsia" w:hint="eastAsia"/>
+        </w:rPr>
+        <w:t>(必須)</w:t>
+      </w:r>
+    </w:p>
+    <w:p>
+      <w:pPr>
+        <w:jc w:val="left"/>
+        <w:rPr>
+          <w:rFonts w:asciiTheme="minorEastAsia" w:hAnsiTheme="minorEastAsia"/>
+        </w:rPr>
+      </w:pPr>
+      <w:sdt>
+        <w:sdtPr>
+          <w:rPr>
+            <w:rFonts w:eastAsia="DengXian" w:hint="eastAsia"/>
+          </w:rPr>
+          <w:id w:val="-1630004191"/>
+          <w14:checkbox>
+            <w14:checked w14:val="0"/>
+            <w14:checkedState w14:val="2612" w14:font="MS Gothic"/>
+            <w14:uncheckedState w14:val="2610" w14:font="MS Gothic"/>
+          </w14:checkbox>
+        </w:sdtPr>
+        <w:sdtContent>
+          <w:r>
+            <w:rPr>
+              <w:rFonts w:ascii="MS Gothic" w:eastAsia="MS Gothic" w:hAnsi="MS Gothic" w:hint="eastAsia"/>
+            </w:rPr>
+            <w:t>☐</w:t>
+          </w:r>
+        </w:sdtContent>
+      </w:sdt>
+      <w:r>
+        <w:rPr>
+          <w:rFonts w:eastAsia="DengXian" w:hint="eastAsia"/>
+        </w:rPr>
+        <w:t xml:space="preserve"> 待机动画风格</w:t>
+      </w:r>
+      <w:r>
+        <w:rPr>
+          <w:rFonts w:asciiTheme="minorEastAsia" w:hAnsiTheme="minorEastAsia" w:hint="eastAsia"/>
+        </w:rPr>
+        <w:t>(必須)</w:t>
+      </w:r>
+    </w:p>
+    <w:p>
+      <w:pPr>
+        <w:jc w:val="left"/>
+        <w:rPr>
           <w:rFonts w:ascii="DengXian" w:eastAsia="DengXian" w:hAnsi="DengXian" w:cs="微軟正黑體"/>
           <w:lang w:eastAsia="zh-CN"/>
         </w:rPr>
       </w:pPr>
-      <w:r>
-        <w:rPr>
-          <w:rFonts w:ascii="DengXian" w:eastAsia="新細明體" w:hAnsi="DengXian" w:cs="微軟正黑體" w:hint="eastAsia"/>
-        </w:rPr>
-        <w:t>設計組：</w:t>
-      </w:r>
-    </w:p>
-    <w:p>
-      <w:pPr>
-        <w:jc w:val="left"/>
-        <w:rPr>
-          <w:rFonts w:asciiTheme="minorEastAsia" w:eastAsia="DengXian" w:hAnsiTheme="minorEastAsia"/>
-          <w:lang w:eastAsia="zh-CN"/>
+      <w:sdt>
+        <w:sdtPr>
+          <w:rPr>
+            <w:rFonts w:eastAsia="DengXian" w:hint="eastAsia"/>
+          </w:rPr>
+          <w:id w:val="-1525860148"/>
+          <w14:checkbox>
+            <w14:checked w14:val="0"/>
+            <w14:checkedState w14:val="2612" w14:font="MS Gothic"/>
+            <w14:uncheckedState w14:val="2610" w14:font="MS Gothic"/>
+          </w14:checkbox>
+        </w:sdtPr>
+        <w:sdtContent>
+          <w:r>
+            <w:rPr>
+              <w:rFonts w:ascii="MS Gothic" w:eastAsia="MS Gothic" w:hAnsi="MS Gothic" w:hint="eastAsia"/>
+            </w:rPr>
+            <w:t>☐</w:t>
+          </w:r>
+        </w:sdtContent>
+      </w:sdt>
+      <w:r>
+        <w:rPr>
+          <w:rFonts w:asciiTheme="minorEastAsia" w:hAnsiTheme="minorEastAsia" w:hint="eastAsia"/>
+        </w:rPr>
+        <w:t xml:space="preserve"> 寶石全新序列圖(必須)</w:t>
+      </w:r>
+    </w:p>
+    <w:p>
+      <w:pPr>
+        <w:jc w:val="left"/>
+        <w:rPr>
+          <w:rFonts w:asciiTheme="minorEastAsia" w:hAnsiTheme="minorEastAsia" w:hint="eastAsia"/>
         </w:rPr>
       </w:pPr>
       <w:sdt>
@@ -808,46 +923,15 @@
       </w:r>
       <w:r>
         <w:rPr>
+          <w:rFonts w:asciiTheme="minorEastAsia" w:hAnsiTheme="minorEastAsia" w:hint="eastAsia"/>
+        </w:rPr>
+        <w:t>-可選</w:t>
+      </w:r>
+      <w:r>
+        <w:rPr>
           <w:rFonts w:asciiTheme="minorEastAsia" w:hAnsiTheme="minorEastAsia"/>
         </w:rPr>
         <w:t>)</w:t>
-      </w:r>
-    </w:p>
-    <w:p>
-      <w:pPr>
-        <w:jc w:val="left"/>
-        <w:rPr>
-          <w:rFonts w:eastAsia="DengXian"/>
-          <w:lang w:eastAsia="zh-CN"/>
-        </w:rPr>
-      </w:pPr>
-      <w:sdt>
-        <w:sdtPr>
-          <w:rPr>
-            <w:rFonts w:eastAsia="DengXian" w:hint="eastAsia"/>
-          </w:rPr>
-          <w:id w:val="-316335364"/>
-          <w14:checkbox>
-            <w14:checked w14:val="0"/>
-            <w14:checkedState w14:val="2612" w14:font="MS Gothic"/>
-            <w14:uncheckedState w14:val="2610" w14:font="MS Gothic"/>
-          </w14:checkbox>
-        </w:sdtPr>
-        <w:sdtContent>
-          <w:r>
-            <w:rPr>
-              <w:rFonts w:ascii="MS Gothic" w:eastAsia="MS Gothic" w:hAnsi="MS Gothic" w:hint="eastAsia"/>
-            </w:rPr>
-            <w:t>☐</w:t>
-          </w:r>
-        </w:sdtContent>
-      </w:sdt>
-      <w:r>
-        <w:rPr>
-          <w:rFonts w:eastAsia="DengXian" w:hint="eastAsia"/>
-          <w:lang w:eastAsia="zh-CN"/>
-        </w:rPr>
-        <w:t xml:space="preserve"> 水波纹音效</w:t>
       </w:r>
     </w:p>
     <w:p>
@@ -1363,7 +1447,6 @@
         <w:jc w:val="left"/>
         <w:rPr>
           <w:rFonts w:eastAsia="新細明體"/>
-          <w:lang w:eastAsia="zh-CN"/>
         </w:rPr>
       </w:pPr>
       <w:r>
@@ -1378,72 +1461,15 @@
       <w:pPr>
         <w:jc w:val="left"/>
         <w:rPr>
-          <w:rFonts w:eastAsia="DengXian"/>
-          <w:lang w:eastAsia="zh-CN"/>
-        </w:rPr>
-      </w:pPr>
-      <w:sdt>
-        <w:sdtPr>
-          <w:rPr>
-            <w:rFonts w:eastAsia="DengXian" w:hint="eastAsia"/>
-            <w:lang w:eastAsia="zh-CN"/>
-          </w:rPr>
-          <w:id w:val="-1236013805"/>
-          <w14:checkbox>
-            <w14:checked w14:val="0"/>
-            <w14:checkedState w14:val="2612" w14:font="MS Gothic"/>
-            <w14:uncheckedState w14:val="2610" w14:font="MS Gothic"/>
-          </w14:checkbox>
-        </w:sdtPr>
-        <w:sdtContent>
-          <w:r>
-            <w:rPr>
-              <w:rFonts w:ascii="MS Gothic" w:eastAsia="MS Gothic" w:hAnsi="MS Gothic" w:hint="eastAsia"/>
-              <w:lang w:eastAsia="zh-CN"/>
-            </w:rPr>
-            <w:t>☐</w:t>
-          </w:r>
-        </w:sdtContent>
-      </w:sdt>
-      <w:r>
-        <w:rPr>
-          <w:rFonts w:asciiTheme="minorEastAsia" w:hAnsiTheme="minorEastAsia" w:hint="eastAsia"/>
-          <w:lang w:eastAsia="zh-CN"/>
-        </w:rPr>
-        <w:t xml:space="preserve"> </w:t>
-      </w:r>
-      <w:r>
-        <w:rPr>
-          <w:rFonts w:ascii="DengXian" w:eastAsia="DengXian" w:hAnsi="DengXian" w:hint="eastAsia"/>
-          <w:lang w:eastAsia="zh-CN"/>
-        </w:rPr>
-        <w:t>水波纹水平</w:t>
-      </w:r>
-      <w:r>
-        <w:rPr>
-          <w:rFonts w:ascii="DengXian" w:eastAsia="DengXian" w:hAnsi="DengXian" w:hint="eastAsia"/>
-          <w:lang w:eastAsia="zh-CN"/>
-        </w:rPr>
-        <w:t>映射</w:t>
-      </w:r>
-      <w:r>
-        <w:rPr>
-          <w:rFonts w:ascii="DengXian" w:eastAsia="DengXian" w:hAnsi="DengXian" w:hint="eastAsia"/>
-          <w:lang w:eastAsia="zh-CN"/>
-        </w:rPr>
-        <w:t>转随机</w:t>
-      </w:r>
-    </w:p>
-    <w:p>
-      <w:pPr>
-        <w:jc w:val="left"/>
+          <w:rFonts w:eastAsia="新細明體" w:hint="eastAsia"/>
+        </w:rPr>
       </w:pPr>
       <w:sdt>
         <w:sdtPr>
           <w:rPr>
             <w:rFonts w:eastAsia="DengXian" w:hint="eastAsia"/>
           </w:rPr>
-          <w:id w:val="-1630004191"/>
+          <w:id w:val="-148981754"/>
           <w14:checkbox>
             <w14:checked w14:val="0"/>
             <w14:checkedState w14:val="2612" w14:font="MS Gothic"/>
@@ -1461,9 +1487,81 @@
       </w:sdt>
       <w:r>
         <w:rPr>
-          <w:rFonts w:eastAsia="DengXian" w:hint="eastAsia"/>
-        </w:rPr>
-        <w:t xml:space="preserve"> 待机动画风格</w:t>
+          <w:rFonts w:asciiTheme="minorEastAsia" w:hAnsiTheme="minorEastAsia" w:hint="eastAsia"/>
+        </w:rPr>
+        <w:t xml:space="preserve"> </w:t>
+      </w:r>
+      <w:r>
+        <w:rPr>
+          <w:rFonts w:asciiTheme="minorEastAsia" w:hAnsiTheme="minorEastAsia" w:hint="eastAsia"/>
+        </w:rPr>
+        <w:t>寶石全新序列圖</w:t>
+      </w:r>
+      <w:r>
+        <w:rPr>
+          <w:rFonts w:asciiTheme="minorEastAsia" w:hAnsiTheme="minorEastAsia" w:hint="eastAsia"/>
+        </w:rPr>
+        <w:t>打包更換(必須)</w:t>
+      </w:r>
+    </w:p>
+    <w:p>
+      <w:pPr>
+        <w:jc w:val="left"/>
+        <w:rPr>
+          <w:rFonts w:hint="eastAsia"/>
+          <w:lang w:eastAsia="zh-CN"/>
+        </w:rPr>
+      </w:pPr>
+      <w:sdt>
+        <w:sdtPr>
+          <w:rPr>
+            <w:rFonts w:eastAsia="DengXian" w:hint="eastAsia"/>
+            <w:lang w:eastAsia="zh-CN"/>
+          </w:rPr>
+          <w:id w:val="-1236013805"/>
+          <w14:checkbox>
+            <w14:checked w14:val="1"/>
+            <w14:checkedState w14:val="2612" w14:font="MS Gothic"/>
+            <w14:uncheckedState w14:val="2610" w14:font="MS Gothic"/>
+          </w14:checkbox>
+        </w:sdtPr>
+        <w:sdtContent>
+          <w:r>
+            <w:rPr>
+              <w:rFonts w:ascii="MS Gothic" w:eastAsia="MS Gothic" w:hAnsi="MS Gothic" w:hint="eastAsia"/>
+              <w:lang w:eastAsia="zh-CN"/>
+            </w:rPr>
+            <w:t>☒</w:t>
+          </w:r>
+        </w:sdtContent>
+      </w:sdt>
+      <w:r>
+        <w:rPr>
+          <w:rFonts w:asciiTheme="minorEastAsia" w:hAnsiTheme="minorEastAsia" w:hint="eastAsia"/>
+          <w:lang w:eastAsia="zh-CN"/>
+        </w:rPr>
+        <w:t xml:space="preserve"> </w:t>
+      </w:r>
+      <w:r>
+        <w:rPr>
+          <w:rFonts w:ascii="DengXian" w:eastAsia="DengXian" w:hAnsi="DengXian" w:hint="eastAsia"/>
+          <w:lang w:eastAsia="zh-CN"/>
+        </w:rPr>
+        <w:t>水波纹水平</w:t>
+      </w:r>
+      <w:r>
+        <w:rPr>
+          <w:rFonts w:ascii="DengXian" w:eastAsia="DengXian" w:hAnsi="DengXian" w:hint="eastAsia"/>
+          <w:lang w:eastAsia="zh-CN"/>
+        </w:rPr>
+        <w:t>映射</w:t>
+      </w:r>
+      <w:r>
+        <w:rPr>
+          <w:rFonts w:ascii="DengXian" w:eastAsia="DengXian" w:hAnsi="DengXian" w:hint="eastAsia"/>
+          <w:lang w:eastAsia="zh-CN"/>
+        </w:rPr>
+        <w:t>转随机</w:t>
       </w:r>
     </w:p>
     <w:p>
@@ -1585,8 +1683,7 @@
       <w:pPr>
         <w:jc w:val="left"/>
         <w:rPr>
-          <w:rFonts w:eastAsia="DengXian"/>
-          <w:lang w:eastAsia="zh-CN"/>
+          <w:rFonts w:hint="eastAsia"/>
         </w:rPr>
       </w:pPr>
       <w:sdt>
@@ -3673,12 +3770,28 @@
           <w:lang w:eastAsia="zh-CN"/>
         </w:rPr>
       </w:pPr>
+      <w:proofErr w:type="spellStart"/>
       <w:r>
         <w:rPr>
           <w:rFonts w:eastAsia="新細明體"/>
         </w:rPr>
-        <w:t>npm install react-router-dom</w:t>
-      </w:r>
+        <w:t>npm</w:t>
+      </w:r>
+      <w:proofErr w:type="spellEnd"/>
+      <w:r>
+        <w:rPr>
+          <w:rFonts w:eastAsia="新細明體"/>
+        </w:rPr>
+        <w:t xml:space="preserve"> install react-router-</w:t>
+      </w:r>
+      <w:proofErr w:type="spellStart"/>
+      <w:r>
+        <w:rPr>
+          <w:rFonts w:eastAsia="新細明體"/>
+        </w:rPr>
+        <w:t>dom</w:t>
+      </w:r>
+      <w:proofErr w:type="spellEnd"/>
     </w:p>
     <w:p>
       <w:pPr>
@@ -3729,24 +3842,32 @@
           <w:lang w:eastAsia="zh-CN"/>
         </w:rPr>
       </w:pPr>
+      <w:proofErr w:type="spellStart"/>
       <w:r>
         <w:rPr>
           <w:rFonts w:eastAsia="新細明體"/>
         </w:rPr>
-        <w:t>npm install socket.io-client</w:t>
-      </w:r>
-    </w:p>
-    <w:p>
-      <w:pPr>
-        <w:jc w:val="left"/>
-        <w:rPr>
-          <w:rFonts w:eastAsia="DengXian"/>
-        </w:rPr>
-      </w:pPr>
+        <w:t>npm</w:t>
+      </w:r>
+      <w:proofErr w:type="spellEnd"/>
       <w:r>
         <w:rPr>
           <w:rFonts w:eastAsia="新細明體"/>
         </w:rPr>
+        <w:t xml:space="preserve"> install socket.io-client</w:t>
+      </w:r>
+    </w:p>
+    <w:p>
+      <w:pPr>
+        <w:jc w:val="left"/>
+        <w:rPr>
+          <w:rFonts w:eastAsia="DengXian"/>
+        </w:rPr>
+      </w:pPr>
+      <w:r>
+        <w:rPr>
+          <w:rFonts w:eastAsia="新細明體"/>
+        </w:rPr>
         <w:t xml:space="preserve"># </w:t>
       </w:r>
       <w:r>
@@ -3771,11 +3892,19 @@
           <w:lang w:eastAsia="zh-CN"/>
         </w:rPr>
       </w:pPr>
+      <w:proofErr w:type="spellStart"/>
       <w:r>
         <w:rPr>
           <w:rFonts w:eastAsia="新細明體"/>
         </w:rPr>
-        <w:t>npm install express socket.io</w:t>
+        <w:t>npm</w:t>
+      </w:r>
+      <w:proofErr w:type="spellEnd"/>
+      <w:r>
+        <w:rPr>
+          <w:rFonts w:eastAsia="新細明體"/>
+        </w:rPr>
+        <w:t xml:space="preserve"> install express socket.io</w:t>
       </w:r>
     </w:p>
     <w:p>
@@ -3856,7 +3985,20 @@
           <w:rFonts w:eastAsia="新細明體"/>
         </w:rPr>
         <w:tab/>
-        <w:t>npm i howler</w:t>
+      </w:r>
+      <w:proofErr w:type="spellStart"/>
+      <w:r>
+        <w:rPr>
+          <w:rFonts w:eastAsia="新細明體"/>
+        </w:rPr>
+        <w:t>npm</w:t>
+      </w:r>
+      <w:proofErr w:type="spellEnd"/>
+      <w:r>
+        <w:rPr>
+          <w:rFonts w:eastAsia="新細明體"/>
+        </w:rPr>
+        <w:t xml:space="preserve"> i howler</w:t>
       </w:r>
     </w:p>
     <w:p>
@@ -4191,12 +4333,28 @@
         </w:rPr>
         <w:t>安裝路由：</w:t>
       </w:r>
+      <w:proofErr w:type="spellStart"/>
       <w:r>
         <w:rPr>
           <w:rFonts w:eastAsia="新細明體"/>
         </w:rPr>
-        <w:t>npm install react-router-dom</w:t>
-      </w:r>
+        <w:t>npm</w:t>
+      </w:r>
+      <w:proofErr w:type="spellEnd"/>
+      <w:r>
+        <w:rPr>
+          <w:rFonts w:eastAsia="新細明體"/>
+        </w:rPr>
+        <w:t xml:space="preserve"> install react-router-</w:t>
+      </w:r>
+      <w:proofErr w:type="spellStart"/>
+      <w:r>
+        <w:rPr>
+          <w:rFonts w:eastAsia="新細明體"/>
+        </w:rPr>
+        <w:t>dom</w:t>
+      </w:r>
+      <w:proofErr w:type="spellEnd"/>
     </w:p>
     <w:p>
       <w:pPr>
@@ -4219,7 +4377,21 @@
         <w:rPr>
           <w:rFonts w:eastAsia="新細明體"/>
         </w:rPr>
-        <w:t xml:space="preserve"> App.jsx </w:t>
+        <w:t xml:space="preserve"> </w:t>
+      </w:r>
+      <w:proofErr w:type="spellStart"/>
+      <w:r>
+        <w:rPr>
+          <w:rFonts w:eastAsia="新細明體"/>
+        </w:rPr>
+        <w:t>App.jsx</w:t>
+      </w:r>
+      <w:proofErr w:type="spellEnd"/>
+      <w:r>
+        <w:rPr>
+          <w:rFonts w:eastAsia="新細明體"/>
+        </w:rPr>
+        <w:t xml:space="preserve"> </w:t>
       </w:r>
       <w:r>
         <w:rPr>
@@ -4239,12 +4411,14 @@
           <w:rFonts w:eastAsia="DengXian"/>
         </w:rPr>
       </w:pPr>
+      <w:proofErr w:type="spellStart"/>
       <w:r>
         <w:rPr>
           <w:rFonts w:eastAsia="新細明體"/>
         </w:rPr>
         <w:t>App.jsx</w:t>
       </w:r>
+      <w:proofErr w:type="spellEnd"/>
       <w:r>
         <w:rPr>
           <w:rFonts w:eastAsia="新細明體" w:hint="eastAsia"/>
@@ -4264,12 +4438,14 @@
           <w:lang w:eastAsia="zh-CN"/>
         </w:rPr>
       </w:pPr>
+      <w:proofErr w:type="spellStart"/>
       <w:r>
         <w:rPr>
           <w:rFonts w:eastAsia="新細明體"/>
         </w:rPr>
         <w:t>MonitorView.jsx</w:t>
       </w:r>
+      <w:proofErr w:type="spellEnd"/>
       <w:r>
         <w:rPr>
           <w:rFonts w:eastAsia="新細明體" w:hint="eastAsia"/>
@@ -4301,12 +4477,14 @@
           <w:lang w:eastAsia="zh-CN"/>
         </w:rPr>
       </w:pPr>
+      <w:proofErr w:type="spellStart"/>
       <w:r>
         <w:rPr>
           <w:rFonts w:eastAsia="新細明體"/>
         </w:rPr>
         <w:t>TabletView.jsx</w:t>
       </w:r>
+      <w:proofErr w:type="spellEnd"/>
       <w:r>
         <w:rPr>
           <w:rFonts w:eastAsia="新細明體" w:hint="eastAsia"/>
@@ -4527,7 +4705,25 @@
           <w:b/>
           <w:bCs/>
         </w:rPr>
-        <w:t xml:space="preserve"> BroadcastChannel API)</w:t>
+        <w:t xml:space="preserve"> </w:t>
+      </w:r>
+      <w:proofErr w:type="spellStart"/>
+      <w:r>
+        <w:rPr>
+          <w:rFonts w:eastAsia="新細明體"/>
+          <w:b/>
+          <w:bCs/>
+        </w:rPr>
+        <w:t>BroadcastChannel</w:t>
+      </w:r>
+      <w:proofErr w:type="spellEnd"/>
+      <w:r>
+        <w:rPr>
+          <w:rFonts w:eastAsia="新細明體"/>
+          <w:b/>
+          <w:bCs/>
+        </w:rPr>
+        <w:t xml:space="preserve"> API)</w:t>
       </w:r>
     </w:p>
     <w:p>
@@ -4600,7 +4796,21 @@
         <w:rPr>
           <w:rFonts w:eastAsia="新細明體"/>
         </w:rPr>
-        <w:t xml:space="preserve"> BroadcastChannel </w:t>
+        <w:t xml:space="preserve"> </w:t>
+      </w:r>
+      <w:proofErr w:type="spellStart"/>
+      <w:r>
+        <w:rPr>
+          <w:rFonts w:eastAsia="新細明體"/>
+        </w:rPr>
+        <w:t>BroadcastChannel</w:t>
+      </w:r>
+      <w:proofErr w:type="spellEnd"/>
+      <w:r>
+        <w:rPr>
+          <w:rFonts w:eastAsia="新細明體"/>
+        </w:rPr>
+        <w:t xml:space="preserve"> </w:t>
       </w:r>
       <w:r>
         <w:rPr>

</xml_diff>

<commit_message>
chore(assets): update monitor standby image (v0.13.22)
</commit_message>
<xml_diff>
--- a/To do.docx
+++ b/To do.docx
@@ -743,7 +743,6 @@
         <w:jc w:val="left"/>
         <w:rPr>
           <w:rFonts w:asciiTheme="minorEastAsia" w:eastAsia="DengXian" w:hAnsiTheme="minorEastAsia"/>
-          <w:lang w:eastAsia="zh-CN"/>
         </w:rPr>
       </w:pPr>
       <w:r>
@@ -781,7 +780,6 @@
       <w:r>
         <w:rPr>
           <w:rFonts w:eastAsia="DengXian" w:hint="eastAsia"/>
-          <w:lang w:eastAsia="zh-CN"/>
         </w:rPr>
         <w:t xml:space="preserve"> 水波纹音效</w:t>
       </w:r>
@@ -806,7 +804,7 @@
           </w:rPr>
           <w:id w:val="-1630004191"/>
           <w14:checkbox>
-            <w14:checked w14:val="0"/>
+            <w14:checked w14:val="1"/>
             <w14:checkedState w14:val="2612" w14:font="MS Gothic"/>
             <w14:uncheckedState w14:val="2610" w14:font="MS Gothic"/>
           </w14:checkbox>
@@ -816,7 +814,7 @@
             <w:rPr>
               <w:rFonts w:ascii="MS Gothic" w:eastAsia="MS Gothic" w:hAnsi="MS Gothic" w:hint="eastAsia"/>
             </w:rPr>
-            <w:t>☐</w:t>
+            <w:t>☒</w:t>
           </w:r>
         </w:sdtContent>
       </w:sdt>
@@ -824,7 +822,21 @@
         <w:rPr>
           <w:rFonts w:eastAsia="DengXian" w:hint="eastAsia"/>
         </w:rPr>
-        <w:t xml:space="preserve"> 待机动画风格</w:t>
+        <w:t xml:space="preserve"> 待</w:t>
+      </w:r>
+      <w:proofErr w:type="gramStart"/>
+      <w:r>
+        <w:rPr>
+          <w:rFonts w:eastAsia="DengXian" w:hint="eastAsia"/>
+        </w:rPr>
+        <w:t>机</w:t>
+      </w:r>
+      <w:proofErr w:type="gramEnd"/>
+      <w:r>
+        <w:rPr>
+          <w:rFonts w:eastAsia="DengXian" w:hint="eastAsia"/>
+        </w:rPr>
+        <w:t>动画风格</w:t>
       </w:r>
       <w:r>
         <w:rPr>
@@ -838,7 +850,6 @@
         <w:jc w:val="left"/>
         <w:rPr>
           <w:rFonts w:ascii="DengXian" w:eastAsia="DengXian" w:hAnsi="DengXian" w:cs="微軟正黑體"/>
-          <w:lang w:eastAsia="zh-CN"/>
         </w:rPr>
       </w:pPr>
       <w:sdt>
@@ -848,7 +859,7 @@
           </w:rPr>
           <w:id w:val="-1525860148"/>
           <w14:checkbox>
-            <w14:checked w14:val="0"/>
+            <w14:checked w14:val="1"/>
             <w14:checkedState w14:val="2612" w14:font="MS Gothic"/>
             <w14:uncheckedState w14:val="2610" w14:font="MS Gothic"/>
           </w14:checkbox>
@@ -858,7 +869,7 @@
             <w:rPr>
               <w:rFonts w:ascii="MS Gothic" w:eastAsia="MS Gothic" w:hAnsi="MS Gothic" w:hint="eastAsia"/>
             </w:rPr>
-            <w:t>☐</w:t>
+            <w:t>☒</w:t>
           </w:r>
         </w:sdtContent>
       </w:sdt>
@@ -873,7 +884,7 @@
       <w:pPr>
         <w:jc w:val="left"/>
         <w:rPr>
-          <w:rFonts w:asciiTheme="minorEastAsia" w:hAnsiTheme="minorEastAsia" w:hint="eastAsia"/>
+          <w:rFonts w:asciiTheme="minorEastAsia" w:hAnsiTheme="minorEastAsia"/>
         </w:rPr>
       </w:pPr>
       <w:sdt>
@@ -919,13 +930,7 @@
         <w:rPr>
           <w:rFonts w:asciiTheme="minorEastAsia" w:hAnsiTheme="minorEastAsia" w:hint="eastAsia"/>
         </w:rPr>
-        <w:t>變形</w:t>
-      </w:r>
-      <w:r>
-        <w:rPr>
-          <w:rFonts w:asciiTheme="minorEastAsia" w:hAnsiTheme="minorEastAsia" w:hint="eastAsia"/>
-        </w:rPr>
-        <w:t>-可選</w:t>
+        <w:t>變形-可選</w:t>
       </w:r>
       <w:r>
         <w:rPr>
@@ -938,7 +943,7 @@
       <w:pPr>
         <w:jc w:val="left"/>
         <w:rPr>
-          <w:rFonts w:eastAsia="DengXian" w:hint="eastAsia"/>
+          <w:rFonts w:eastAsia="DengXian"/>
           <w:lang w:eastAsia="zh-CN"/>
         </w:rPr>
       </w:pPr>
@@ -970,20 +975,13 @@
           <w:rFonts w:eastAsia="DengXian" w:hint="eastAsia"/>
           <w:lang w:eastAsia="zh-CN"/>
         </w:rPr>
-        <w:t xml:space="preserve"> </w:t>
+        <w:t xml:space="preserve"> 宝石呈现音效</w:t>
       </w:r>
       <w:r>
         <w:rPr>
           <w:rFonts w:eastAsia="DengXian" w:hint="eastAsia"/>
           <w:lang w:eastAsia="zh-CN"/>
         </w:rPr>
-        <w:t>宝石呈现音效</w:t>
-      </w:r>
-      <w:r>
-        <w:rPr>
-          <w:rFonts w:eastAsia="DengXian" w:hint="eastAsia"/>
-          <w:lang w:eastAsia="zh-CN"/>
-        </w:rPr>
         <w:t>(可不准备)</w:t>
       </w:r>
     </w:p>
@@ -991,15 +989,13 @@
       <w:pPr>
         <w:jc w:val="left"/>
         <w:rPr>
-          <w:rFonts w:eastAsia="DengXian" w:hint="eastAsia"/>
-          <w:lang w:eastAsia="zh-CN"/>
+          <w:rFonts w:eastAsia="DengXian"/>
         </w:rPr>
       </w:pPr>
       <w:sdt>
         <w:sdtPr>
           <w:rPr>
             <w:rFonts w:eastAsia="DengXian" w:hint="eastAsia"/>
-            <w:lang w:eastAsia="zh-CN"/>
           </w:rPr>
           <w:id w:val="1615317404"/>
           <w14:checkbox>
@@ -1012,7 +1008,6 @@
           <w:r>
             <w:rPr>
               <w:rFonts w:ascii="MS Gothic" w:eastAsia="MS Gothic" w:hAnsi="MS Gothic" w:hint="eastAsia"/>
-              <w:lang w:eastAsia="zh-CN"/>
             </w:rPr>
             <w:t>☐</w:t>
           </w:r>
@@ -1021,21 +1016,26 @@
       <w:r>
         <w:rPr>
           <w:rFonts w:eastAsia="DengXian" w:hint="eastAsia"/>
-          <w:lang w:eastAsia="zh-CN"/>
-        </w:rPr>
-        <w:t xml:space="preserve"> </w:t>
-      </w:r>
+        </w:rPr>
+        <w:t xml:space="preserve"> 待</w:t>
+      </w:r>
+      <w:proofErr w:type="gramStart"/>
       <w:r>
         <w:rPr>
           <w:rFonts w:eastAsia="DengXian" w:hint="eastAsia"/>
-          <w:lang w:eastAsia="zh-CN"/>
-        </w:rPr>
-        <w:t>待机音效</w:t>
-      </w:r>
+        </w:rPr>
+        <w:t>机</w:t>
+      </w:r>
+      <w:proofErr w:type="gramEnd"/>
       <w:r>
         <w:rPr>
           <w:rFonts w:eastAsia="DengXian" w:hint="eastAsia"/>
-          <w:lang w:eastAsia="zh-CN"/>
+        </w:rPr>
+        <w:t>音效</w:t>
+      </w:r>
+      <w:r>
+        <w:rPr>
+          <w:rFonts w:eastAsia="DengXian" w:hint="eastAsia"/>
         </w:rPr>
         <w:t>(可不准备)</w:t>
       </w:r>
@@ -1452,7 +1452,6 @@
       <w:r>
         <w:rPr>
           <w:rFonts w:eastAsia="新細明體" w:hint="eastAsia"/>
-          <w:lang w:eastAsia="zh-CN"/>
         </w:rPr>
         <w:t>科技組：</w:t>
       </w:r>
@@ -1461,7 +1460,7 @@
       <w:pPr>
         <w:jc w:val="left"/>
         <w:rPr>
-          <w:rFonts w:eastAsia="新細明體" w:hint="eastAsia"/>
+          <w:rFonts w:eastAsia="新細明體"/>
         </w:rPr>
       </w:pPr>
       <w:sdt>
@@ -1489,26 +1488,13 @@
         <w:rPr>
           <w:rFonts w:asciiTheme="minorEastAsia" w:hAnsiTheme="minorEastAsia" w:hint="eastAsia"/>
         </w:rPr>
-        <w:t xml:space="preserve"> </w:t>
-      </w:r>
-      <w:r>
-        <w:rPr>
-          <w:rFonts w:asciiTheme="minorEastAsia" w:hAnsiTheme="minorEastAsia" w:hint="eastAsia"/>
-        </w:rPr>
-        <w:t>寶石全新序列圖</w:t>
-      </w:r>
-      <w:r>
-        <w:rPr>
-          <w:rFonts w:asciiTheme="minorEastAsia" w:hAnsiTheme="minorEastAsia" w:hint="eastAsia"/>
-        </w:rPr>
-        <w:t>打包更換(必須)</w:t>
-      </w:r>
-    </w:p>
-    <w:p>
-      <w:pPr>
-        <w:jc w:val="left"/>
-        <w:rPr>
-          <w:rFonts w:hint="eastAsia"/>
+        <w:t xml:space="preserve"> 寶石全新序列圖打包更換(必須)</w:t>
+      </w:r>
+    </w:p>
+    <w:p>
+      <w:pPr>
+        <w:jc w:val="left"/>
+        <w:rPr>
           <w:lang w:eastAsia="zh-CN"/>
         </w:rPr>
       </w:pPr>
@@ -1568,7 +1554,7 @@
       <w:pPr>
         <w:jc w:val="left"/>
         <w:rPr>
-          <w:rFonts w:eastAsia="DengXian" w:hint="eastAsia"/>
+          <w:rFonts w:eastAsia="DengXian"/>
           <w:lang w:eastAsia="zh-CN"/>
         </w:rPr>
       </w:pPr>
@@ -1576,6 +1562,7 @@
         <w:sdtPr>
           <w:rPr>
             <w:rFonts w:eastAsia="DengXian" w:hint="eastAsia"/>
+            <w:lang w:eastAsia="zh-CN"/>
           </w:rPr>
           <w:id w:val="1843670598"/>
           <w14:checkbox>
@@ -1588,6 +1575,7 @@
           <w:r>
             <w:rPr>
               <w:rFonts w:ascii="MS Gothic" w:eastAsia="MS Gothic" w:hAnsi="MS Gothic" w:hint="eastAsia"/>
+              <w:lang w:eastAsia="zh-CN"/>
             </w:rPr>
             <w:t>☒</w:t>
           </w:r>
@@ -1596,6 +1584,7 @@
       <w:r>
         <w:rPr>
           <w:rFonts w:hint="eastAsia"/>
+          <w:lang w:eastAsia="zh-CN"/>
         </w:rPr>
         <w:t xml:space="preserve"> </w:t>
       </w:r>
@@ -1618,7 +1607,7 @@
       <w:pPr>
         <w:jc w:val="left"/>
         <w:rPr>
-          <w:rFonts w:asciiTheme="minorEastAsia" w:eastAsia="DengXian" w:hAnsiTheme="minorEastAsia" w:hint="eastAsia"/>
+          <w:rFonts w:asciiTheme="minorEastAsia" w:eastAsia="DengXian" w:hAnsiTheme="minorEastAsia"/>
         </w:rPr>
       </w:pPr>
       <w:sdt>
@@ -1683,7 +1672,7 @@
       <w:pPr>
         <w:jc w:val="left"/>
         <w:rPr>
-          <w:rFonts w:hint="eastAsia"/>
+          <w:lang w:eastAsia="zh-CN"/>
         </w:rPr>
       </w:pPr>
       <w:sdt>
@@ -1716,6 +1705,7 @@
         </w:rPr>
         <w:t xml:space="preserve"> </w:t>
       </w:r>
+      <w:proofErr w:type="gramStart"/>
       <w:r>
         <w:rPr>
           <w:rFonts w:ascii="DengXian" w:eastAsia="DengXian" w:hAnsi="DengXian" w:hint="eastAsia"/>
@@ -1728,7 +1718,15 @@
           <w:rFonts w:eastAsia="DengXian" w:hint="eastAsia"/>
           <w:lang w:eastAsia="zh-CN"/>
         </w:rPr>
-        <w:t>水波纹过程</w:t>
+        <w:t>水</w:t>
+      </w:r>
+      <w:proofErr w:type="gramEnd"/>
+      <w:r>
+        <w:rPr>
+          <w:rFonts w:eastAsia="DengXian" w:hint="eastAsia"/>
+          <w:lang w:eastAsia="zh-CN"/>
+        </w:rPr>
+        <w:t>波纹过程</w:t>
       </w:r>
     </w:p>
     <w:p>
@@ -2004,11 +2002,19 @@
         </w:rPr>
         <w:t xml:space="preserve"> </w:t>
       </w:r>
-      <w:r>
-        <w:rPr>
-          <w:rFonts w:eastAsia="新細明體" w:hint="eastAsia"/>
-        </w:rPr>
-        <w:t>顯示器攝像頭隱私測試</w:t>
+      <w:proofErr w:type="gramStart"/>
+      <w:r>
+        <w:rPr>
+          <w:rFonts w:eastAsia="新細明體" w:hint="eastAsia"/>
+        </w:rPr>
+        <w:t>顯示器攝像頭</w:t>
+      </w:r>
+      <w:proofErr w:type="gramEnd"/>
+      <w:r>
+        <w:rPr>
+          <w:rFonts w:eastAsia="新細明體" w:hint="eastAsia"/>
+        </w:rPr>
+        <w:t>隱私測試</w:t>
       </w:r>
     </w:p>
     <w:p>
@@ -2386,7 +2392,21 @@
         <w:rPr>
           <w:rFonts w:eastAsia="新細明體" w:hint="eastAsia"/>
         </w:rPr>
-        <w:t>的單界面拆成兩個頁面</w:t>
+        <w:t>的</w:t>
+      </w:r>
+      <w:proofErr w:type="gramStart"/>
+      <w:r>
+        <w:rPr>
+          <w:rFonts w:eastAsia="新細明體" w:hint="eastAsia"/>
+        </w:rPr>
+        <w:t>單界面拆成兩個頁</w:t>
+      </w:r>
+      <w:proofErr w:type="gramEnd"/>
+      <w:r>
+        <w:rPr>
+          <w:rFonts w:eastAsia="新細明體" w:hint="eastAsia"/>
+        </w:rPr>
+        <w:t>面</w:t>
       </w:r>
     </w:p>
     <w:p>
@@ -2477,7 +2497,21 @@
         <w:rPr>
           <w:rFonts w:asciiTheme="minorEastAsia" w:hAnsiTheme="minorEastAsia" w:hint="eastAsia"/>
         </w:rPr>
-        <w:t>改成小字小框長方形小圓角，加入橫向分隔線，按鈕與標題和開始互動按鈕用粗分隔線，</w:t>
+        <w:t>改成</w:t>
+      </w:r>
+      <w:proofErr w:type="gramStart"/>
+      <w:r>
+        <w:rPr>
+          <w:rFonts w:asciiTheme="minorEastAsia" w:hAnsiTheme="minorEastAsia" w:hint="eastAsia"/>
+        </w:rPr>
+        <w:t>小字小框長方形</w:t>
+      </w:r>
+      <w:proofErr w:type="gramEnd"/>
+      <w:r>
+        <w:rPr>
+          <w:rFonts w:asciiTheme="minorEastAsia" w:hAnsiTheme="minorEastAsia" w:hint="eastAsia"/>
+        </w:rPr>
+        <w:t>小圓角，加入橫向分隔線，按鈕與標題和開始互動按鈕用粗分隔線，</w:t>
       </w:r>
       <w:r>
         <w:rPr>
@@ -3237,12 +3271,20 @@
         </w:rPr>
       </w:pPr>
       <w:bookmarkStart w:id="4" w:name="_Toc230804032"/>
+      <w:proofErr w:type="gramStart"/>
       <w:r>
         <w:rPr>
           <w:rFonts w:ascii="DengXian" w:eastAsia="新細明體" w:hAnsi="DengXian" w:hint="eastAsia"/>
         </w:rPr>
         <w:lastRenderedPageBreak/>
-        <w:t>攝像頭權限</w:t>
+        <w:t>攝像頭</w:t>
+      </w:r>
+      <w:proofErr w:type="gramEnd"/>
+      <w:r>
+        <w:rPr>
+          <w:rFonts w:ascii="DengXian" w:eastAsia="新細明體" w:hAnsi="DengXian" w:hint="eastAsia"/>
+        </w:rPr>
+        <w:t>權限</w:t>
       </w:r>
       <w:bookmarkEnd w:id="4"/>
     </w:p>
@@ -3611,6 +3653,7 @@
         </w:rPr>
       </w:pPr>
       <w:bookmarkStart w:id="5" w:name="_Toc230804033"/>
+      <w:proofErr w:type="gramStart"/>
       <w:r>
         <w:rPr>
           <w:rFonts w:ascii="DengXian" w:eastAsia="新細明體" w:hAnsi="DengXian" w:hint="eastAsia"/>
@@ -3619,6 +3662,7 @@
         <w:t>顯卡設定</w:t>
       </w:r>
       <w:bookmarkEnd w:id="5"/>
+      <w:proofErr w:type="gramEnd"/>
     </w:p>
     <w:p>
       <w:pPr>
@@ -3770,235 +3814,190 @@
           <w:lang w:eastAsia="zh-CN"/>
         </w:rPr>
       </w:pPr>
-      <w:proofErr w:type="spellStart"/>
       <w:r>
         <w:rPr>
           <w:rFonts w:eastAsia="新細明體"/>
         </w:rPr>
-        <w:t>npm</w:t>
-      </w:r>
-      <w:proofErr w:type="spellEnd"/>
+        <w:t>npm install react-router-dom</w:t>
+      </w:r>
+    </w:p>
+    <w:p>
+      <w:pPr>
+        <w:jc w:val="left"/>
+        <w:rPr>
+          <w:rFonts w:eastAsia="DengXian"/>
+          <w:lang w:eastAsia="zh-CN"/>
+        </w:rPr>
+      </w:pPr>
       <w:r>
         <w:rPr>
           <w:rFonts w:eastAsia="新細明體"/>
         </w:rPr>
-        <w:t xml:space="preserve"> install react-router-</w:t>
-      </w:r>
-      <w:proofErr w:type="spellStart"/>
+        <w:t xml:space="preserve"># </w:t>
+      </w:r>
+      <w:r>
+        <w:rPr>
+          <w:rFonts w:eastAsia="新細明體" w:hint="eastAsia"/>
+        </w:rPr>
+        <w:t>安裝前端</w:t>
+      </w:r>
       <w:r>
         <w:rPr>
           <w:rFonts w:eastAsia="新細明體"/>
         </w:rPr>
-        <w:t>dom</w:t>
-      </w:r>
-      <w:proofErr w:type="spellEnd"/>
-    </w:p>
-    <w:p>
-      <w:pPr>
-        <w:jc w:val="left"/>
+        <w:t xml:space="preserve"> Socket </w:t>
+      </w:r>
+      <w:r>
+        <w:rPr>
+          <w:rFonts w:eastAsia="新細明體" w:hint="eastAsia"/>
+        </w:rPr>
+        <w:t>用戶端</w:t>
+      </w:r>
+      <w:r>
         <w:rPr>
           <w:rFonts w:eastAsia="DengXian"/>
           <w:lang w:eastAsia="zh-CN"/>
         </w:rPr>
+        <w:t xml:space="preserve"> </w:t>
+      </w:r>
+    </w:p>
+    <w:p>
+      <w:pPr>
+        <w:ind w:firstLine="480"/>
+        <w:jc w:val="left"/>
+        <w:rPr>
+          <w:rFonts w:eastAsia="DengXian"/>
+          <w:lang w:eastAsia="zh-CN"/>
+        </w:rPr>
       </w:pPr>
       <w:r>
         <w:rPr>
           <w:rFonts w:eastAsia="新細明體"/>
         </w:rPr>
+        <w:t>npm install socket.io-client</w:t>
+      </w:r>
+    </w:p>
+    <w:p>
+      <w:pPr>
+        <w:jc w:val="left"/>
+        <w:rPr>
+          <w:rFonts w:eastAsia="DengXian"/>
+        </w:rPr>
+      </w:pPr>
+      <w:r>
+        <w:rPr>
+          <w:rFonts w:eastAsia="新細明體"/>
+        </w:rPr>
         <w:t xml:space="preserve"># </w:t>
       </w:r>
       <w:r>
         <w:rPr>
           <w:rFonts w:eastAsia="新細明體" w:hint="eastAsia"/>
         </w:rPr>
-        <w:t>安裝前端</w:t>
-      </w:r>
+        <w:t>安裝後端伺服器套件（用來當兩台裝置的郵差）</w:t>
+      </w:r>
+      <w:r>
+        <w:rPr>
+          <w:rFonts w:eastAsia="DengXian"/>
+        </w:rPr>
+        <w:t xml:space="preserve"> </w:t>
+      </w:r>
+    </w:p>
+    <w:p>
+      <w:pPr>
+        <w:ind w:firstLine="480"/>
+        <w:jc w:val="left"/>
+        <w:rPr>
+          <w:rFonts w:eastAsia="DengXian"/>
+          <w:lang w:eastAsia="zh-CN"/>
+        </w:rPr>
+      </w:pPr>
       <w:r>
         <w:rPr>
           <w:rFonts w:eastAsia="新細明體"/>
         </w:rPr>
-        <w:t xml:space="preserve"> Socket </w:t>
-      </w:r>
-      <w:r>
-        <w:rPr>
-          <w:rFonts w:eastAsia="新細明體" w:hint="eastAsia"/>
-        </w:rPr>
-        <w:t>用戶端</w:t>
-      </w:r>
-      <w:r>
+        <w:t>npm install express socket.io</w:t>
+      </w:r>
+    </w:p>
+    <w:p>
+      <w:pPr>
+        <w:jc w:val="left"/>
+      </w:pPr>
+      <w:r>
+        <w:rPr>
+          <w:rFonts w:asciiTheme="minorEastAsia" w:hAnsiTheme="minorEastAsia"/>
+        </w:rPr>
+        <w:t xml:space="preserve"># </w:t>
+      </w:r>
+      <w:r>
+        <w:rPr>
+          <w:rFonts w:asciiTheme="minorEastAsia" w:hAnsiTheme="minorEastAsia" w:hint="eastAsia"/>
+        </w:rPr>
+        <w:t>啟動伺服器</w:t>
+      </w:r>
+    </w:p>
+    <w:p>
+      <w:pPr>
+        <w:jc w:val="left"/>
         <w:rPr>
           <w:rFonts w:eastAsia="DengXian"/>
           <w:lang w:eastAsia="zh-CN"/>
         </w:rPr>
-        <w:t xml:space="preserve"> </w:t>
-      </w:r>
-    </w:p>
-    <w:p>
-      <w:pPr>
-        <w:ind w:firstLine="480"/>
+      </w:pPr>
+      <w:r>
+        <w:tab/>
+      </w:r>
+      <w:r>
+        <w:t>node server.js</w:t>
+      </w:r>
+    </w:p>
+    <w:p>
+      <w:pPr>
         <w:jc w:val="left"/>
         <w:rPr>
           <w:rFonts w:eastAsia="DengXian"/>
           <w:lang w:eastAsia="zh-CN"/>
         </w:rPr>
       </w:pPr>
-      <w:proofErr w:type="spellStart"/>
       <w:r>
         <w:rPr>
           <w:rFonts w:eastAsia="新細明體"/>
         </w:rPr>
-        <w:t>npm</w:t>
-      </w:r>
-      <w:proofErr w:type="spellEnd"/>
+        <w:t xml:space="preserve"># </w:t>
+      </w:r>
+      <w:r>
+        <w:rPr>
+          <w:rFonts w:eastAsia="新細明體" w:hint="eastAsia"/>
+        </w:rPr>
+        <w:t>第三方音效庫（新增</w:t>
+      </w:r>
       <w:r>
         <w:rPr>
           <w:rFonts w:eastAsia="新細明體"/>
         </w:rPr>
-        <w:t xml:space="preserve"> install socket.io-client</w:t>
-      </w:r>
-    </w:p>
-    <w:p>
-      <w:pPr>
-        <w:jc w:val="left"/>
-        <w:rPr>
-          <w:rFonts w:eastAsia="DengXian"/>
+        <w:t xml:space="preserve"> howler </w:t>
+      </w:r>
+      <w:r>
+        <w:rPr>
+          <w:rFonts w:eastAsia="新細明體" w:hint="eastAsia"/>
+        </w:rPr>
+        <w:t>套件依賴）</w:t>
+      </w:r>
+    </w:p>
+    <w:p>
+      <w:pPr>
+        <w:jc w:val="left"/>
+        <w:rPr>
+          <w:rFonts w:eastAsia="DengXian"/>
+          <w:lang w:eastAsia="zh-CN"/>
         </w:rPr>
       </w:pPr>
       <w:r>
         <w:rPr>
           <w:rFonts w:eastAsia="新細明體"/>
         </w:rPr>
-        <w:t xml:space="preserve"># </w:t>
-      </w:r>
-      <w:r>
-        <w:rPr>
-          <w:rFonts w:eastAsia="新細明體" w:hint="eastAsia"/>
-        </w:rPr>
-        <w:t>安裝後端伺服器套件（用來當兩台裝置的郵差）</w:t>
-      </w:r>
-      <w:r>
-        <w:rPr>
-          <w:rFonts w:eastAsia="DengXian"/>
-        </w:rPr>
-        <w:t xml:space="preserve"> </w:t>
-      </w:r>
-    </w:p>
-    <w:p>
-      <w:pPr>
-        <w:ind w:firstLine="480"/>
-        <w:jc w:val="left"/>
-        <w:rPr>
-          <w:rFonts w:eastAsia="DengXian"/>
-          <w:lang w:eastAsia="zh-CN"/>
-        </w:rPr>
-      </w:pPr>
-      <w:proofErr w:type="spellStart"/>
-      <w:r>
-        <w:rPr>
-          <w:rFonts w:eastAsia="新細明體"/>
-        </w:rPr>
-        <w:t>npm</w:t>
-      </w:r>
-      <w:proofErr w:type="spellEnd"/>
-      <w:r>
-        <w:rPr>
-          <w:rFonts w:eastAsia="新細明體"/>
-        </w:rPr>
-        <w:t xml:space="preserve"> install express socket.io</w:t>
-      </w:r>
-    </w:p>
-    <w:p>
-      <w:pPr>
-        <w:jc w:val="left"/>
-      </w:pPr>
-      <w:r>
-        <w:rPr>
-          <w:rFonts w:asciiTheme="minorEastAsia" w:hAnsiTheme="minorEastAsia"/>
-        </w:rPr>
-        <w:t xml:space="preserve"># </w:t>
-      </w:r>
-      <w:r>
-        <w:rPr>
-          <w:rFonts w:asciiTheme="minorEastAsia" w:hAnsiTheme="minorEastAsia" w:hint="eastAsia"/>
-        </w:rPr>
-        <w:t>啟動伺服器</w:t>
-      </w:r>
-    </w:p>
-    <w:p>
-      <w:pPr>
-        <w:jc w:val="left"/>
-        <w:rPr>
-          <w:rFonts w:eastAsia="DengXian"/>
-          <w:lang w:eastAsia="zh-CN"/>
-        </w:rPr>
-      </w:pPr>
-      <w:r>
         <w:tab/>
-      </w:r>
-      <w:r>
-        <w:t>node server.js</w:t>
-      </w:r>
-    </w:p>
-    <w:p>
-      <w:pPr>
-        <w:jc w:val="left"/>
-        <w:rPr>
-          <w:rFonts w:eastAsia="DengXian"/>
-          <w:lang w:eastAsia="zh-CN"/>
-        </w:rPr>
-      </w:pPr>
-      <w:r>
-        <w:rPr>
-          <w:rFonts w:eastAsia="新細明體"/>
-        </w:rPr>
-        <w:t xml:space="preserve"># </w:t>
-      </w:r>
-      <w:r>
-        <w:rPr>
-          <w:rFonts w:eastAsia="新細明體" w:hint="eastAsia"/>
-        </w:rPr>
-        <w:t>第三方音效庫（新增</w:t>
-      </w:r>
-      <w:r>
-        <w:rPr>
-          <w:rFonts w:eastAsia="新細明體"/>
-        </w:rPr>
-        <w:t xml:space="preserve"> howler </w:t>
-      </w:r>
-      <w:r>
-        <w:rPr>
-          <w:rFonts w:eastAsia="新細明體" w:hint="eastAsia"/>
-        </w:rPr>
-        <w:t>套件依賴）</w:t>
-      </w:r>
-    </w:p>
-    <w:p>
-      <w:pPr>
-        <w:jc w:val="left"/>
-        <w:rPr>
-          <w:rFonts w:eastAsia="DengXian"/>
-          <w:lang w:eastAsia="zh-CN"/>
-        </w:rPr>
-      </w:pPr>
-      <w:r>
-        <w:rPr>
-          <w:rFonts w:eastAsia="新細明體"/>
-        </w:rPr>
-        <w:tab/>
-      </w:r>
-      <w:proofErr w:type="spellStart"/>
-      <w:r>
-        <w:rPr>
-          <w:rFonts w:eastAsia="新細明體"/>
-        </w:rPr>
-        <w:t>npm</w:t>
-      </w:r>
-      <w:proofErr w:type="spellEnd"/>
-      <w:r>
-        <w:rPr>
-          <w:rFonts w:eastAsia="新細明體"/>
-        </w:rPr>
-        <w:t xml:space="preserve"> i howler</w:t>
+        <w:t>npm i howler</w:t>
       </w:r>
     </w:p>
     <w:p>
@@ -4333,28 +4332,12 @@
         </w:rPr>
         <w:t>安裝路由：</w:t>
       </w:r>
-      <w:proofErr w:type="spellStart"/>
       <w:r>
         <w:rPr>
           <w:rFonts w:eastAsia="新細明體"/>
         </w:rPr>
-        <w:t>npm</w:t>
-      </w:r>
-      <w:proofErr w:type="spellEnd"/>
-      <w:r>
-        <w:rPr>
-          <w:rFonts w:eastAsia="新細明體"/>
-        </w:rPr>
-        <w:t xml:space="preserve"> install react-router-</w:t>
-      </w:r>
-      <w:proofErr w:type="spellStart"/>
-      <w:r>
-        <w:rPr>
-          <w:rFonts w:eastAsia="新細明體"/>
-        </w:rPr>
-        <w:t>dom</w:t>
-      </w:r>
-      <w:proofErr w:type="spellEnd"/>
+        <w:t>npm install react-router-dom</w:t>
+      </w:r>
     </w:p>
     <w:p>
       <w:pPr>
@@ -4377,21 +4360,7 @@
         <w:rPr>
           <w:rFonts w:eastAsia="新細明體"/>
         </w:rPr>
-        <w:t xml:space="preserve"> </w:t>
-      </w:r>
-      <w:proofErr w:type="spellStart"/>
-      <w:r>
-        <w:rPr>
-          <w:rFonts w:eastAsia="新細明體"/>
-        </w:rPr>
-        <w:t>App.jsx</w:t>
-      </w:r>
-      <w:proofErr w:type="spellEnd"/>
-      <w:r>
-        <w:rPr>
-          <w:rFonts w:eastAsia="新細明體"/>
-        </w:rPr>
-        <w:t xml:space="preserve"> </w:t>
+        <w:t xml:space="preserve"> App.jsx </w:t>
       </w:r>
       <w:r>
         <w:rPr>
@@ -4411,14 +4380,12 @@
           <w:rFonts w:eastAsia="DengXian"/>
         </w:rPr>
       </w:pPr>
-      <w:proofErr w:type="spellStart"/>
       <w:r>
         <w:rPr>
           <w:rFonts w:eastAsia="新細明體"/>
         </w:rPr>
         <w:t>App.jsx</w:t>
       </w:r>
-      <w:proofErr w:type="spellEnd"/>
       <w:r>
         <w:rPr>
           <w:rFonts w:eastAsia="新細明體" w:hint="eastAsia"/>
@@ -4438,14 +4405,12 @@
           <w:lang w:eastAsia="zh-CN"/>
         </w:rPr>
       </w:pPr>
-      <w:proofErr w:type="spellStart"/>
       <w:r>
         <w:rPr>
           <w:rFonts w:eastAsia="新細明體"/>
         </w:rPr>
         <w:t>MonitorView.jsx</w:t>
       </w:r>
-      <w:proofErr w:type="spellEnd"/>
       <w:r>
         <w:rPr>
           <w:rFonts w:eastAsia="新細明體" w:hint="eastAsia"/>
@@ -4477,14 +4442,12 @@
           <w:lang w:eastAsia="zh-CN"/>
         </w:rPr>
       </w:pPr>
-      <w:proofErr w:type="spellStart"/>
       <w:r>
         <w:rPr>
           <w:rFonts w:eastAsia="新細明體"/>
         </w:rPr>
         <w:t>TabletView.jsx</w:t>
       </w:r>
-      <w:proofErr w:type="spellEnd"/>
       <w:r>
         <w:rPr>
           <w:rFonts w:eastAsia="新細明體" w:hint="eastAsia"/>
@@ -4549,13 +4512,23 @@
         </w:rPr>
         <w:t xml:space="preserve"> (Data Transmission)</w:t>
       </w:r>
+      <w:proofErr w:type="gramStart"/>
       <w:r>
         <w:rPr>
           <w:rFonts w:asciiTheme="minorEastAsia" w:hAnsiTheme="minorEastAsia" w:hint="eastAsia"/>
           <w:b/>
           <w:bCs/>
         </w:rPr>
-        <w:t>——使用方案</w:t>
+        <w:t>——</w:t>
+      </w:r>
+      <w:proofErr w:type="gramEnd"/>
+      <w:r>
+        <w:rPr>
+          <w:rFonts w:asciiTheme="minorEastAsia" w:hAnsiTheme="minorEastAsia" w:hint="eastAsia"/>
+          <w:b/>
+          <w:bCs/>
+        </w:rPr>
+        <w:t>使用方案</w:t>
       </w:r>
       <w:r>
         <w:rPr>
@@ -4577,22 +4550,52 @@
         <w:rPr>
           <w:rFonts w:eastAsia="新細明體" w:hint="eastAsia"/>
         </w:rPr>
-        <w:t>既然拆成了兩個頁面，它們該怎麼溝通？</w:t>
-      </w:r>
-    </w:p>
-    <w:p>
-      <w:pPr>
-        <w:jc w:val="left"/>
-        <w:rPr>
-          <w:rFonts w:eastAsia="DengXian"/>
-        </w:rPr>
-      </w:pPr>
-      <w:r>
-        <w:rPr>
-          <w:rFonts w:eastAsia="新細明體" w:hint="eastAsia"/>
-        </w:rPr>
-        <w:t>（例如：平板按下了「盡情哭吧</w:t>
-      </w:r>
+        <w:t>既然拆成了</w:t>
+      </w:r>
+      <w:proofErr w:type="gramStart"/>
+      <w:r>
+        <w:rPr>
+          <w:rFonts w:eastAsia="新細明體" w:hint="eastAsia"/>
+        </w:rPr>
+        <w:t>兩個頁</w:t>
+      </w:r>
+      <w:proofErr w:type="gramEnd"/>
+      <w:r>
+        <w:rPr>
+          <w:rFonts w:eastAsia="新細明體" w:hint="eastAsia"/>
+        </w:rPr>
+        <w:t>面，它們該怎麼溝通？</w:t>
+      </w:r>
+    </w:p>
+    <w:p>
+      <w:pPr>
+        <w:jc w:val="left"/>
+        <w:rPr>
+          <w:rFonts w:eastAsia="DengXian"/>
+        </w:rPr>
+      </w:pPr>
+      <w:proofErr w:type="gramStart"/>
+      <w:r>
+        <w:rPr>
+          <w:rFonts w:eastAsia="新細明體" w:hint="eastAsia"/>
+        </w:rPr>
+        <w:t>（</w:t>
+      </w:r>
+      <w:proofErr w:type="gramEnd"/>
+      <w:r>
+        <w:rPr>
+          <w:rFonts w:eastAsia="新細明體" w:hint="eastAsia"/>
+        </w:rPr>
+        <w:t>例如：平板按下了「</w:t>
+      </w:r>
+      <w:proofErr w:type="gramStart"/>
+      <w:r>
+        <w:rPr>
+          <w:rFonts w:eastAsia="新細明體" w:hint="eastAsia"/>
+        </w:rPr>
+        <w:t>盡情哭吧</w:t>
+      </w:r>
+      <w:proofErr w:type="gramEnd"/>
       <w:r>
         <w:rPr>
           <w:rFonts w:eastAsia="新細明體"/>
@@ -4603,7 +4606,21 @@
         <w:rPr>
           <w:rFonts w:eastAsia="新細明體" w:hint="eastAsia"/>
         </w:rPr>
-        <w:t>」，顯示器怎麼知道要開始掉字？）</w:t>
+        <w:t>」，顯示器怎麼知道要</w:t>
+      </w:r>
+      <w:proofErr w:type="gramStart"/>
+      <w:r>
+        <w:rPr>
+          <w:rFonts w:eastAsia="新細明體" w:hint="eastAsia"/>
+        </w:rPr>
+        <w:t>開始掉字</w:t>
+      </w:r>
+      <w:proofErr w:type="gramEnd"/>
+      <w:r>
+        <w:rPr>
+          <w:rFonts w:eastAsia="新細明體" w:hint="eastAsia"/>
+        </w:rPr>
+        <w:t>？）</w:t>
       </w:r>
       <w:r>
         <w:rPr>
@@ -4705,118 +4722,100 @@
           <w:b/>
           <w:bCs/>
         </w:rPr>
-        <w:t xml:space="preserve"> </w:t>
-      </w:r>
-      <w:proofErr w:type="spellStart"/>
+        <w:t xml:space="preserve"> BroadcastChannel API)</w:t>
+      </w:r>
+    </w:p>
+    <w:p>
+      <w:pPr>
+        <w:jc w:val="left"/>
+        <w:rPr>
+          <w:rFonts w:eastAsia="DengXian"/>
+        </w:rPr>
+      </w:pPr>
+      <w:r>
+        <w:rPr>
+          <w:rFonts w:eastAsia="新細明體" w:hint="eastAsia"/>
+        </w:rPr>
+        <w:t>如果你的展場是使用一台效能較好的主機（如</w:t>
+      </w:r>
       <w:r>
         <w:rPr>
           <w:rFonts w:eastAsia="新細明體"/>
+        </w:rPr>
+        <w:t xml:space="preserve"> Mac Macni </w:t>
+      </w:r>
+      <w:r>
+        <w:rPr>
+          <w:rFonts w:eastAsia="新細明體" w:hint="eastAsia"/>
+        </w:rPr>
+        <w:t>或</w:t>
+      </w:r>
+      <w:r>
+        <w:rPr>
+          <w:rFonts w:eastAsia="新細明體"/>
+        </w:rPr>
+        <w:t xml:space="preserve"> PC</w:t>
+      </w:r>
+      <w:r>
+        <w:rPr>
+          <w:rFonts w:eastAsia="新細明體" w:hint="eastAsia"/>
+        </w:rPr>
+        <w:t>），同時外接兩個螢幕（一個掛牆上，一個平放當平板），這是</w:t>
+      </w:r>
+      <w:r>
+        <w:rPr>
+          <w:rFonts w:eastAsia="新細明體" w:hint="eastAsia"/>
           <w:b/>
           <w:bCs/>
         </w:rPr>
-        <w:t>BroadcastChannel</w:t>
-      </w:r>
-      <w:proofErr w:type="spellEnd"/>
+        <w:t>最推薦且最簡單</w:t>
+      </w:r>
+      <w:r>
+        <w:rPr>
+          <w:rFonts w:eastAsia="新細明體" w:hint="eastAsia"/>
+        </w:rPr>
+        <w:t>的做法！</w:t>
+      </w:r>
+    </w:p>
+    <w:p>
+      <w:pPr>
+        <w:jc w:val="left"/>
+        <w:rPr>
+          <w:rFonts w:eastAsia="DengXian"/>
+          <w:lang w:eastAsia="zh-CN"/>
+        </w:rPr>
+      </w:pPr>
+      <w:r>
+        <w:rPr>
+          <w:rFonts w:eastAsia="新細明體" w:hint="eastAsia"/>
+        </w:rPr>
+        <w:t>不需要寫後端伺服器，直接利用瀏覽器內建的</w:t>
+      </w:r>
       <w:r>
         <w:rPr>
           <w:rFonts w:eastAsia="新細明體"/>
-          <w:b/>
-          <w:bCs/>
-        </w:rPr>
-        <w:t xml:space="preserve"> API)</w:t>
-      </w:r>
-    </w:p>
-    <w:p>
-      <w:pPr>
-        <w:jc w:val="left"/>
-        <w:rPr>
-          <w:rFonts w:eastAsia="DengXian"/>
-        </w:rPr>
-      </w:pPr>
-      <w:r>
-        <w:rPr>
-          <w:rFonts w:eastAsia="新細明體" w:hint="eastAsia"/>
-        </w:rPr>
-        <w:t>如果你的展場是使用一台效能較好的主機（如</w:t>
-      </w:r>
-      <w:r>
-        <w:rPr>
-          <w:rFonts w:eastAsia="新細明體"/>
-        </w:rPr>
-        <w:t xml:space="preserve"> Mac Macni </w:t>
-      </w:r>
-      <w:r>
-        <w:rPr>
-          <w:rFonts w:eastAsia="新細明體" w:hint="eastAsia"/>
-        </w:rPr>
-        <w:t>或</w:t>
-      </w:r>
-      <w:r>
-        <w:rPr>
-          <w:rFonts w:eastAsia="新細明體"/>
-        </w:rPr>
-        <w:t xml:space="preserve"> PC</w:t>
-      </w:r>
-      <w:r>
-        <w:rPr>
-          <w:rFonts w:eastAsia="新細明體" w:hint="eastAsia"/>
-        </w:rPr>
-        <w:t>），同時外接兩個螢幕（一個掛牆上，一個平放當平板），這是</w:t>
-      </w:r>
-      <w:r>
-        <w:rPr>
-          <w:rFonts w:eastAsia="新細明體" w:hint="eastAsia"/>
-          <w:b/>
-          <w:bCs/>
-        </w:rPr>
-        <w:t>最推薦且最簡單</w:t>
-      </w:r>
-      <w:r>
-        <w:rPr>
-          <w:rFonts w:eastAsia="新細明體" w:hint="eastAsia"/>
-        </w:rPr>
-        <w:t>的做法！</w:t>
-      </w:r>
-    </w:p>
-    <w:p>
-      <w:pPr>
-        <w:jc w:val="left"/>
-        <w:rPr>
-          <w:rFonts w:eastAsia="DengXian"/>
-          <w:lang w:eastAsia="zh-CN"/>
-        </w:rPr>
-      </w:pPr>
-      <w:r>
-        <w:rPr>
-          <w:rFonts w:eastAsia="新細明體" w:hint="eastAsia"/>
-        </w:rPr>
-        <w:t>不需要寫後端伺服器，直接利用瀏覽器內建的</w:t>
-      </w:r>
-      <w:r>
-        <w:rPr>
-          <w:rFonts w:eastAsia="新細明體"/>
-        </w:rPr>
-        <w:t xml:space="preserve"> </w:t>
-      </w:r>
-      <w:proofErr w:type="spellStart"/>
-      <w:r>
-        <w:rPr>
-          <w:rFonts w:eastAsia="新細明體"/>
-        </w:rPr>
-        <w:t>BroadcastChannel</w:t>
-      </w:r>
-      <w:proofErr w:type="spellEnd"/>
-      <w:r>
-        <w:rPr>
-          <w:rFonts w:eastAsia="新細明體"/>
-        </w:rPr>
-        <w:t xml:space="preserve"> </w:t>
-      </w:r>
-      <w:r>
-        <w:rPr>
-          <w:rFonts w:eastAsia="新細明體" w:hint="eastAsia"/>
-        </w:rPr>
-        <w:t>就能讓兩個分頁秒速溝通：</w:t>
+        </w:rPr>
+        <w:t xml:space="preserve"> BroadcastChannel </w:t>
+      </w:r>
+      <w:r>
+        <w:rPr>
+          <w:rFonts w:eastAsia="新細明體" w:hint="eastAsia"/>
+        </w:rPr>
+        <w:t>就能讓兩個</w:t>
+      </w:r>
+      <w:proofErr w:type="gramStart"/>
+      <w:r>
+        <w:rPr>
+          <w:rFonts w:eastAsia="新細明體" w:hint="eastAsia"/>
+        </w:rPr>
+        <w:t>分頁秒速</w:t>
+      </w:r>
+      <w:proofErr w:type="gramEnd"/>
+      <w:r>
+        <w:rPr>
+          <w:rFonts w:eastAsia="新細明體" w:hint="eastAsia"/>
+        </w:rPr>
+        <w:t>溝通：</w:t>
       </w:r>
     </w:p>
     <w:p>
@@ -5252,7 +5251,35 @@
         <w:rPr>
           <w:rFonts w:hint="eastAsia"/>
         </w:rPr>
-        <w:t>預設是一個顯示器，一個平板，平板選擇詞匯後，透過影像識別，流淚流出詞匯最終流入平板，匯聚成寶石。</w:t>
+        <w:t>預設是一個顯示器，一個平板，平板選擇詞</w:t>
+      </w:r>
+      <w:proofErr w:type="gramStart"/>
+      <w:r>
+        <w:rPr>
+          <w:rFonts w:hint="eastAsia"/>
+        </w:rPr>
+        <w:t>匯</w:t>
+      </w:r>
+      <w:proofErr w:type="gramEnd"/>
+      <w:r>
+        <w:rPr>
+          <w:rFonts w:hint="eastAsia"/>
+        </w:rPr>
+        <w:t>後，透過影像識別，流淚流出詞</w:t>
+      </w:r>
+      <w:proofErr w:type="gramStart"/>
+      <w:r>
+        <w:rPr>
+          <w:rFonts w:hint="eastAsia"/>
+        </w:rPr>
+        <w:t>匯</w:t>
+      </w:r>
+      <w:proofErr w:type="gramEnd"/>
+      <w:r>
+        <w:rPr>
+          <w:rFonts w:hint="eastAsia"/>
+        </w:rPr>
+        <w:t>最終流入平板，匯聚成寶石。</w:t>
       </w:r>
     </w:p>
     <w:p/>
@@ -5281,7 +5308,47 @@
         <w:t>Pixi</w:t>
       </w:r>
       <w:r>
-        <w:t>，設計點擊五組心情詞擇一後，透過影像識別人眼，最終選擇的心情詞會不斷從眼中流出（流出的詞匯越來越多，有最大值），詞匯在顯示器的流動過程中，慢慢由完整的字分解成流動的水墨，最後流入顯示器底端，幾秒後平板接續顯示器的水墨，並慢慢往平板中心匯聚，匯聚過程中漸漸變色（顔色是根據最終要生成的寶石顔色決定）</w:t>
+        <w:t>，設計點擊五組心情詞擇</w:t>
+      </w:r>
+      <w:proofErr w:type="gramStart"/>
+      <w:r>
+        <w:t>一</w:t>
+      </w:r>
+      <w:proofErr w:type="gramEnd"/>
+      <w:r>
+        <w:t>後，透過影像識別人眼，最終選擇的</w:t>
+      </w:r>
+      <w:proofErr w:type="gramStart"/>
+      <w:r>
+        <w:t>心情詞會不斷</w:t>
+      </w:r>
+      <w:proofErr w:type="gramEnd"/>
+      <w:r>
+        <w:t>從眼中流出（流出的詞</w:t>
+      </w:r>
+      <w:proofErr w:type="gramStart"/>
+      <w:r>
+        <w:t>匯</w:t>
+      </w:r>
+      <w:proofErr w:type="gramEnd"/>
+      <w:r>
+        <w:t>越來越多，有最大值），詞</w:t>
+      </w:r>
+      <w:proofErr w:type="gramStart"/>
+      <w:r>
+        <w:t>匯</w:t>
+      </w:r>
+      <w:proofErr w:type="gramEnd"/>
+      <w:r>
+        <w:t>在顯示器的流動過程中，慢慢由完整的字分解成流動的水墨，最後流入顯示器底端，幾秒後平板接續顯示器的水墨，並慢慢往平板中心匯聚，匯聚過程中漸漸變色</w:t>
+      </w:r>
+      <w:proofErr w:type="gramStart"/>
+      <w:r>
+        <w:t>（</w:t>
+      </w:r>
+      <w:proofErr w:type="gramEnd"/>
+      <w:r>
+        <w:t>顔色是根據最終要生成的寶石顔色決定）</w:t>
       </w:r>
       <w:r>
         <w:t>,</w:t>

</xml_diff>

<commit_message>
feat(audio): implement dynamic randomized audio pool (v0.13.23)
</commit_message>
<xml_diff>
--- a/To do.docx
+++ b/To do.docx
@@ -763,7 +763,7 @@
           </w:rPr>
           <w:id w:val="-316335364"/>
           <w14:checkbox>
-            <w14:checked w14:val="0"/>
+            <w14:checked w14:val="1"/>
             <w14:checkedState w14:val="2612" w14:font="MS Gothic"/>
             <w14:uncheckedState w14:val="2610" w14:font="MS Gothic"/>
           </w14:checkbox>
@@ -773,7 +773,7 @@
             <w:rPr>
               <w:rFonts w:ascii="MS Gothic" w:eastAsia="MS Gothic" w:hAnsi="MS Gothic" w:hint="eastAsia"/>
             </w:rPr>
-            <w:t>☐</w:t>
+            <w:t>☒</w:t>
           </w:r>
         </w:sdtContent>
       </w:sdt>
@@ -3814,12 +3814,28 @@
           <w:lang w:eastAsia="zh-CN"/>
         </w:rPr>
       </w:pPr>
+      <w:proofErr w:type="spellStart"/>
       <w:r>
         <w:rPr>
           <w:rFonts w:eastAsia="新細明體"/>
         </w:rPr>
-        <w:t>npm install react-router-dom</w:t>
-      </w:r>
+        <w:t>npm</w:t>
+      </w:r>
+      <w:proofErr w:type="spellEnd"/>
+      <w:r>
+        <w:rPr>
+          <w:rFonts w:eastAsia="新細明體"/>
+        </w:rPr>
+        <w:t xml:space="preserve"> install react-router-</w:t>
+      </w:r>
+      <w:proofErr w:type="spellStart"/>
+      <w:r>
+        <w:rPr>
+          <w:rFonts w:eastAsia="新細明體"/>
+        </w:rPr>
+        <w:t>dom</w:t>
+      </w:r>
+      <w:proofErr w:type="spellEnd"/>
     </w:p>
     <w:p>
       <w:pPr>
@@ -3870,24 +3886,32 @@
           <w:lang w:eastAsia="zh-CN"/>
         </w:rPr>
       </w:pPr>
+      <w:proofErr w:type="spellStart"/>
       <w:r>
         <w:rPr>
           <w:rFonts w:eastAsia="新細明體"/>
         </w:rPr>
-        <w:t>npm install socket.io-client</w:t>
-      </w:r>
-    </w:p>
-    <w:p>
-      <w:pPr>
-        <w:jc w:val="left"/>
-        <w:rPr>
-          <w:rFonts w:eastAsia="DengXian"/>
-        </w:rPr>
-      </w:pPr>
+        <w:t>npm</w:t>
+      </w:r>
+      <w:proofErr w:type="spellEnd"/>
       <w:r>
         <w:rPr>
           <w:rFonts w:eastAsia="新細明體"/>
         </w:rPr>
+        <w:t xml:space="preserve"> install socket.io-client</w:t>
+      </w:r>
+    </w:p>
+    <w:p>
+      <w:pPr>
+        <w:jc w:val="left"/>
+        <w:rPr>
+          <w:rFonts w:eastAsia="DengXian"/>
+        </w:rPr>
+      </w:pPr>
+      <w:r>
+        <w:rPr>
+          <w:rFonts w:eastAsia="新細明體"/>
+        </w:rPr>
         <w:t xml:space="preserve"># </w:t>
       </w:r>
       <w:r>
@@ -3912,11 +3936,19 @@
           <w:lang w:eastAsia="zh-CN"/>
         </w:rPr>
       </w:pPr>
+      <w:proofErr w:type="spellStart"/>
       <w:r>
         <w:rPr>
           <w:rFonts w:eastAsia="新細明體"/>
         </w:rPr>
-        <w:t>npm install express socket.io</w:t>
+        <w:t>npm</w:t>
+      </w:r>
+      <w:proofErr w:type="spellEnd"/>
+      <w:r>
+        <w:rPr>
+          <w:rFonts w:eastAsia="新細明體"/>
+        </w:rPr>
+        <w:t xml:space="preserve"> install express socket.io</w:t>
       </w:r>
     </w:p>
     <w:p>
@@ -3997,7 +4029,20 @@
           <w:rFonts w:eastAsia="新細明體"/>
         </w:rPr>
         <w:tab/>
-        <w:t>npm i howler</w:t>
+      </w:r>
+      <w:proofErr w:type="spellStart"/>
+      <w:r>
+        <w:rPr>
+          <w:rFonts w:eastAsia="新細明體"/>
+        </w:rPr>
+        <w:t>npm</w:t>
+      </w:r>
+      <w:proofErr w:type="spellEnd"/>
+      <w:r>
+        <w:rPr>
+          <w:rFonts w:eastAsia="新細明體"/>
+        </w:rPr>
+        <w:t xml:space="preserve"> i howler</w:t>
       </w:r>
     </w:p>
     <w:p>
@@ -4332,12 +4377,28 @@
         </w:rPr>
         <w:t>安裝路由：</w:t>
       </w:r>
+      <w:proofErr w:type="spellStart"/>
       <w:r>
         <w:rPr>
           <w:rFonts w:eastAsia="新細明體"/>
         </w:rPr>
-        <w:t>npm install react-router-dom</w:t>
-      </w:r>
+        <w:t>npm</w:t>
+      </w:r>
+      <w:proofErr w:type="spellEnd"/>
+      <w:r>
+        <w:rPr>
+          <w:rFonts w:eastAsia="新細明體"/>
+        </w:rPr>
+        <w:t xml:space="preserve"> install react-router-</w:t>
+      </w:r>
+      <w:proofErr w:type="spellStart"/>
+      <w:r>
+        <w:rPr>
+          <w:rFonts w:eastAsia="新細明體"/>
+        </w:rPr>
+        <w:t>dom</w:t>
+      </w:r>
+      <w:proofErr w:type="spellEnd"/>
     </w:p>
     <w:p>
       <w:pPr>
@@ -4360,7 +4421,21 @@
         <w:rPr>
           <w:rFonts w:eastAsia="新細明體"/>
         </w:rPr>
-        <w:t xml:space="preserve"> App.jsx </w:t>
+        <w:t xml:space="preserve"> </w:t>
+      </w:r>
+      <w:proofErr w:type="spellStart"/>
+      <w:r>
+        <w:rPr>
+          <w:rFonts w:eastAsia="新細明體"/>
+        </w:rPr>
+        <w:t>App.jsx</w:t>
+      </w:r>
+      <w:proofErr w:type="spellEnd"/>
+      <w:r>
+        <w:rPr>
+          <w:rFonts w:eastAsia="新細明體"/>
+        </w:rPr>
+        <w:t xml:space="preserve"> </w:t>
       </w:r>
       <w:r>
         <w:rPr>
@@ -4380,12 +4455,14 @@
           <w:rFonts w:eastAsia="DengXian"/>
         </w:rPr>
       </w:pPr>
+      <w:proofErr w:type="spellStart"/>
       <w:r>
         <w:rPr>
           <w:rFonts w:eastAsia="新細明體"/>
         </w:rPr>
         <w:t>App.jsx</w:t>
       </w:r>
+      <w:proofErr w:type="spellEnd"/>
       <w:r>
         <w:rPr>
           <w:rFonts w:eastAsia="新細明體" w:hint="eastAsia"/>
@@ -4405,12 +4482,14 @@
           <w:lang w:eastAsia="zh-CN"/>
         </w:rPr>
       </w:pPr>
+      <w:proofErr w:type="spellStart"/>
       <w:r>
         <w:rPr>
           <w:rFonts w:eastAsia="新細明體"/>
         </w:rPr>
         <w:t>MonitorView.jsx</w:t>
       </w:r>
+      <w:proofErr w:type="spellEnd"/>
       <w:r>
         <w:rPr>
           <w:rFonts w:eastAsia="新細明體" w:hint="eastAsia"/>
@@ -4442,12 +4521,14 @@
           <w:lang w:eastAsia="zh-CN"/>
         </w:rPr>
       </w:pPr>
+      <w:proofErr w:type="spellStart"/>
       <w:r>
         <w:rPr>
           <w:rFonts w:eastAsia="新細明體"/>
         </w:rPr>
         <w:t>TabletView.jsx</w:t>
       </w:r>
+      <w:proofErr w:type="spellEnd"/>
       <w:r>
         <w:rPr>
           <w:rFonts w:eastAsia="新細明體" w:hint="eastAsia"/>
@@ -4722,52 +4803,70 @@
           <w:b/>
           <w:bCs/>
         </w:rPr>
-        <w:t xml:space="preserve"> BroadcastChannel API)</w:t>
-      </w:r>
-    </w:p>
-    <w:p>
-      <w:pPr>
-        <w:jc w:val="left"/>
-        <w:rPr>
-          <w:rFonts w:eastAsia="DengXian"/>
-        </w:rPr>
-      </w:pPr>
-      <w:r>
-        <w:rPr>
-          <w:rFonts w:eastAsia="新細明體" w:hint="eastAsia"/>
-        </w:rPr>
-        <w:t>如果你的展場是使用一台效能較好的主機（如</w:t>
-      </w:r>
+        <w:t xml:space="preserve"> </w:t>
+      </w:r>
+      <w:proofErr w:type="spellStart"/>
       <w:r>
         <w:rPr>
           <w:rFonts w:eastAsia="新細明體"/>
-        </w:rPr>
-        <w:t xml:space="preserve"> Mac Macni </w:t>
-      </w:r>
-      <w:r>
-        <w:rPr>
-          <w:rFonts w:eastAsia="新細明體" w:hint="eastAsia"/>
-        </w:rPr>
-        <w:t>或</w:t>
-      </w:r>
-      <w:r>
-        <w:rPr>
-          <w:rFonts w:eastAsia="新細明體"/>
-        </w:rPr>
-        <w:t xml:space="preserve"> PC</w:t>
-      </w:r>
-      <w:r>
-        <w:rPr>
-          <w:rFonts w:eastAsia="新細明體" w:hint="eastAsia"/>
-        </w:rPr>
-        <w:t>），同時外接兩個螢幕（一個掛牆上，一個平放當平板），這是</w:t>
-      </w:r>
-      <w:r>
-        <w:rPr>
-          <w:rFonts w:eastAsia="新細明體" w:hint="eastAsia"/>
           <w:b/>
           <w:bCs/>
         </w:rPr>
+        <w:t>BroadcastChannel</w:t>
+      </w:r>
+      <w:proofErr w:type="spellEnd"/>
+      <w:r>
+        <w:rPr>
+          <w:rFonts w:eastAsia="新細明體"/>
+          <w:b/>
+          <w:bCs/>
+        </w:rPr>
+        <w:t xml:space="preserve"> API)</w:t>
+      </w:r>
+    </w:p>
+    <w:p>
+      <w:pPr>
+        <w:jc w:val="left"/>
+        <w:rPr>
+          <w:rFonts w:eastAsia="DengXian"/>
+        </w:rPr>
+      </w:pPr>
+      <w:r>
+        <w:rPr>
+          <w:rFonts w:eastAsia="新細明體" w:hint="eastAsia"/>
+        </w:rPr>
+        <w:t>如果你的展場是使用一台效能較好的主機（如</w:t>
+      </w:r>
+      <w:r>
+        <w:rPr>
+          <w:rFonts w:eastAsia="新細明體"/>
+        </w:rPr>
+        <w:t xml:space="preserve"> Mac Macni </w:t>
+      </w:r>
+      <w:r>
+        <w:rPr>
+          <w:rFonts w:eastAsia="新細明體" w:hint="eastAsia"/>
+        </w:rPr>
+        <w:t>或</w:t>
+      </w:r>
+      <w:r>
+        <w:rPr>
+          <w:rFonts w:eastAsia="新細明體"/>
+        </w:rPr>
+        <w:t xml:space="preserve"> PC</w:t>
+      </w:r>
+      <w:r>
+        <w:rPr>
+          <w:rFonts w:eastAsia="新細明體" w:hint="eastAsia"/>
+        </w:rPr>
+        <w:t>），同時外接兩個螢幕（一個掛牆上，一個平放當平板），這是</w:t>
+      </w:r>
+      <w:r>
+        <w:rPr>
+          <w:rFonts w:eastAsia="新細明體" w:hint="eastAsia"/>
+          <w:b/>
+          <w:bCs/>
+        </w:rPr>
         <w:t>最推薦且最簡單</w:t>
       </w:r>
       <w:r>
@@ -4795,7 +4894,21 @@
         <w:rPr>
           <w:rFonts w:eastAsia="新細明體"/>
         </w:rPr>
-        <w:t xml:space="preserve"> BroadcastChannel </w:t>
+        <w:t xml:space="preserve"> </w:t>
+      </w:r>
+      <w:proofErr w:type="spellStart"/>
+      <w:r>
+        <w:rPr>
+          <w:rFonts w:eastAsia="新細明體"/>
+        </w:rPr>
+        <w:t>BroadcastChannel</w:t>
+      </w:r>
+      <w:proofErr w:type="spellEnd"/>
+      <w:r>
+        <w:rPr>
+          <w:rFonts w:eastAsia="新細明體"/>
+        </w:rPr>
+        <w:t xml:space="preserve"> </w:t>
       </w:r>
       <w:r>
         <w:rPr>

</xml_diff>

<commit_message>
style(ui): update and polish tablet settlement screen styles (v0.14.2)
</commit_message>
<xml_diff>
--- a/To do.docx
+++ b/To do.docx
@@ -1446,7 +1446,8 @@
       <w:pPr>
         <w:jc w:val="left"/>
         <w:rPr>
-          <w:rFonts w:eastAsia="新細明體"/>
+          <w:rFonts w:eastAsia="DengXian"/>
+          <w:lang w:eastAsia="zh-CN"/>
         </w:rPr>
       </w:pPr>
       <w:r>
@@ -1460,7 +1461,7 @@
       <w:pPr>
         <w:jc w:val="left"/>
         <w:rPr>
-          <w:rFonts w:eastAsia="新細明體"/>
+          <w:rFonts w:eastAsia="DengXian"/>
         </w:rPr>
       </w:pPr>
       <w:sdt>
@@ -1468,7 +1469,7 @@
           <w:rPr>
             <w:rFonts w:eastAsia="DengXian" w:hint="eastAsia"/>
           </w:rPr>
-          <w:id w:val="-148981754"/>
+          <w:id w:val="802508113"/>
           <w14:checkbox>
             <w14:checked w14:val="0"/>
             <w14:checkedState w14:val="2612" w14:font="MS Gothic"/>
@@ -1481,6 +1482,137 @@
               <w:rFonts w:ascii="MS Gothic" w:eastAsia="MS Gothic" w:hAnsi="MS Gothic" w:hint="eastAsia"/>
             </w:rPr>
             <w:t>☐</w:t>
+          </w:r>
+        </w:sdtContent>
+      </w:sdt>
+      <w:r>
+        <w:rPr>
+          <w:rFonts w:eastAsia="DengXian" w:hint="eastAsia"/>
+        </w:rPr>
+        <w:t xml:space="preserve"> </w:t>
+      </w:r>
+      <w:r>
+        <w:rPr>
+          <w:rFonts w:eastAsia="DengXian"/>
+        </w:rPr>
+        <w:t>偵測改多人，偵測最接近，口罩、帽子、眼鏡</w:t>
+      </w:r>
+    </w:p>
+    <w:p>
+      <w:pPr>
+        <w:jc w:val="left"/>
+        <w:rPr>
+          <w:rFonts w:eastAsia="DengXian"/>
+        </w:rPr>
+      </w:pPr>
+      <w:sdt>
+        <w:sdtPr>
+          <w:rPr>
+            <w:rFonts w:eastAsia="DengXian" w:hint="eastAsia"/>
+          </w:rPr>
+          <w:id w:val="1242531762"/>
+          <w14:checkbox>
+            <w14:checked w14:val="0"/>
+            <w14:checkedState w14:val="2612" w14:font="MS Gothic"/>
+            <w14:uncheckedState w14:val="2610" w14:font="MS Gothic"/>
+          </w14:checkbox>
+        </w:sdtPr>
+        <w:sdtContent>
+          <w:r>
+            <w:rPr>
+              <w:rFonts w:ascii="MS Gothic" w:eastAsia="MS Gothic" w:hAnsi="MS Gothic" w:hint="eastAsia"/>
+            </w:rPr>
+            <w:t>☐</w:t>
+          </w:r>
+        </w:sdtContent>
+      </w:sdt>
+      <w:r>
+        <w:rPr>
+          <w:rFonts w:eastAsia="DengXian" w:hint="eastAsia"/>
+        </w:rPr>
+        <w:t xml:space="preserve"> </w:t>
+      </w:r>
+      <w:r>
+        <w:rPr>
+          <w:rFonts w:eastAsia="DengXian"/>
+        </w:rPr>
+        <w:t>平板待機</w:t>
+      </w:r>
+      <w:proofErr w:type="gramStart"/>
+      <w:r>
+        <w:rPr>
+          <w:rFonts w:eastAsia="DengXian"/>
+        </w:rPr>
+        <w:t>畫面請輕觸</w:t>
+      </w:r>
+      <w:proofErr w:type="gramEnd"/>
+    </w:p>
+    <w:p>
+      <w:pPr>
+        <w:jc w:val="left"/>
+        <w:rPr>
+          <w:rFonts w:eastAsia="DengXian" w:hint="eastAsia"/>
+        </w:rPr>
+      </w:pPr>
+      <w:sdt>
+        <w:sdtPr>
+          <w:rPr>
+            <w:rFonts w:eastAsia="DengXian" w:hint="eastAsia"/>
+          </w:rPr>
+          <w:id w:val="1559897900"/>
+          <w14:checkbox>
+            <w14:checked w14:val="0"/>
+            <w14:checkedState w14:val="2612" w14:font="MS Gothic"/>
+            <w14:uncheckedState w14:val="2610" w14:font="MS Gothic"/>
+          </w14:checkbox>
+        </w:sdtPr>
+        <w:sdtContent>
+          <w:r>
+            <w:rPr>
+              <w:rFonts w:ascii="MS Gothic" w:eastAsia="MS Gothic" w:hAnsi="MS Gothic" w:hint="eastAsia"/>
+            </w:rPr>
+            <w:t>☐</w:t>
+          </w:r>
+        </w:sdtContent>
+      </w:sdt>
+      <w:r>
+        <w:rPr>
+          <w:rFonts w:eastAsia="DengXian" w:hint="eastAsia"/>
+        </w:rPr>
+        <w:t xml:space="preserve"> </w:t>
+      </w:r>
+      <w:r>
+        <w:rPr>
+          <w:rFonts w:eastAsia="DengXian"/>
+        </w:rPr>
+        <w:t>顯示器去背</w:t>
+      </w:r>
+    </w:p>
+    <w:p>
+      <w:pPr>
+        <w:jc w:val="left"/>
+        <w:rPr>
+          <w:rFonts w:eastAsia="新細明體"/>
+        </w:rPr>
+      </w:pPr>
+      <w:sdt>
+        <w:sdtPr>
+          <w:rPr>
+            <w:rFonts w:eastAsia="DengXian" w:hint="eastAsia"/>
+          </w:rPr>
+          <w:id w:val="-148981754"/>
+          <w14:checkbox>
+            <w14:checked w14:val="1"/>
+            <w14:checkedState w14:val="2612" w14:font="MS Gothic"/>
+            <w14:uncheckedState w14:val="2610" w14:font="MS Gothic"/>
+          </w14:checkbox>
+        </w:sdtPr>
+        <w:sdtContent>
+          <w:r>
+            <w:rPr>
+              <w:rFonts w:ascii="MS Gothic" w:eastAsia="MS Gothic" w:hAnsi="MS Gothic" w:hint="eastAsia"/>
+            </w:rPr>
+            <w:t>☒</w:t>
           </w:r>
         </w:sdtContent>
       </w:sdt>
@@ -3814,235 +3946,190 @@
           <w:lang w:eastAsia="zh-CN"/>
         </w:rPr>
       </w:pPr>
-      <w:proofErr w:type="spellStart"/>
       <w:r>
         <w:rPr>
           <w:rFonts w:eastAsia="新細明體"/>
         </w:rPr>
-        <w:t>npm</w:t>
-      </w:r>
-      <w:proofErr w:type="spellEnd"/>
+        <w:t>npm install react-router-dom</w:t>
+      </w:r>
+    </w:p>
+    <w:p>
+      <w:pPr>
+        <w:jc w:val="left"/>
+        <w:rPr>
+          <w:rFonts w:eastAsia="DengXian"/>
+          <w:lang w:eastAsia="zh-CN"/>
+        </w:rPr>
+      </w:pPr>
       <w:r>
         <w:rPr>
           <w:rFonts w:eastAsia="新細明體"/>
         </w:rPr>
-        <w:t xml:space="preserve"> install react-router-</w:t>
-      </w:r>
-      <w:proofErr w:type="spellStart"/>
+        <w:t xml:space="preserve"># </w:t>
+      </w:r>
+      <w:r>
+        <w:rPr>
+          <w:rFonts w:eastAsia="新細明體" w:hint="eastAsia"/>
+        </w:rPr>
+        <w:t>安裝前端</w:t>
+      </w:r>
       <w:r>
         <w:rPr>
           <w:rFonts w:eastAsia="新細明體"/>
         </w:rPr>
-        <w:t>dom</w:t>
-      </w:r>
-      <w:proofErr w:type="spellEnd"/>
-    </w:p>
-    <w:p>
-      <w:pPr>
-        <w:jc w:val="left"/>
+        <w:t xml:space="preserve"> Socket </w:t>
+      </w:r>
+      <w:r>
+        <w:rPr>
+          <w:rFonts w:eastAsia="新細明體" w:hint="eastAsia"/>
+        </w:rPr>
+        <w:t>用戶端</w:t>
+      </w:r>
+      <w:r>
         <w:rPr>
           <w:rFonts w:eastAsia="DengXian"/>
           <w:lang w:eastAsia="zh-CN"/>
         </w:rPr>
+        <w:t xml:space="preserve"> </w:t>
+      </w:r>
+    </w:p>
+    <w:p>
+      <w:pPr>
+        <w:ind w:firstLine="480"/>
+        <w:jc w:val="left"/>
+        <w:rPr>
+          <w:rFonts w:eastAsia="DengXian"/>
+          <w:lang w:eastAsia="zh-CN"/>
+        </w:rPr>
       </w:pPr>
       <w:r>
         <w:rPr>
           <w:rFonts w:eastAsia="新細明體"/>
         </w:rPr>
+        <w:t>npm install socket.io-client</w:t>
+      </w:r>
+    </w:p>
+    <w:p>
+      <w:pPr>
+        <w:jc w:val="left"/>
+        <w:rPr>
+          <w:rFonts w:eastAsia="DengXian"/>
+        </w:rPr>
+      </w:pPr>
+      <w:r>
+        <w:rPr>
+          <w:rFonts w:eastAsia="新細明體"/>
+        </w:rPr>
         <w:t xml:space="preserve"># </w:t>
       </w:r>
       <w:r>
         <w:rPr>
           <w:rFonts w:eastAsia="新細明體" w:hint="eastAsia"/>
         </w:rPr>
-        <w:t>安裝前端</w:t>
-      </w:r>
+        <w:t>安裝後端伺服器套件（用來當兩台裝置的郵差）</w:t>
+      </w:r>
+      <w:r>
+        <w:rPr>
+          <w:rFonts w:eastAsia="DengXian"/>
+        </w:rPr>
+        <w:t xml:space="preserve"> </w:t>
+      </w:r>
+    </w:p>
+    <w:p>
+      <w:pPr>
+        <w:ind w:firstLine="480"/>
+        <w:jc w:val="left"/>
+        <w:rPr>
+          <w:rFonts w:eastAsia="DengXian"/>
+          <w:lang w:eastAsia="zh-CN"/>
+        </w:rPr>
+      </w:pPr>
       <w:r>
         <w:rPr>
           <w:rFonts w:eastAsia="新細明體"/>
         </w:rPr>
-        <w:t xml:space="preserve"> Socket </w:t>
-      </w:r>
-      <w:r>
-        <w:rPr>
-          <w:rFonts w:eastAsia="新細明體" w:hint="eastAsia"/>
-        </w:rPr>
-        <w:t>用戶端</w:t>
-      </w:r>
-      <w:r>
+        <w:t>npm install express socket.io</w:t>
+      </w:r>
+    </w:p>
+    <w:p>
+      <w:pPr>
+        <w:jc w:val="left"/>
+      </w:pPr>
+      <w:r>
+        <w:rPr>
+          <w:rFonts w:asciiTheme="minorEastAsia" w:hAnsiTheme="minorEastAsia"/>
+        </w:rPr>
+        <w:t xml:space="preserve"># </w:t>
+      </w:r>
+      <w:r>
+        <w:rPr>
+          <w:rFonts w:asciiTheme="minorEastAsia" w:hAnsiTheme="minorEastAsia" w:hint="eastAsia"/>
+        </w:rPr>
+        <w:t>啟動伺服器</w:t>
+      </w:r>
+    </w:p>
+    <w:p>
+      <w:pPr>
+        <w:jc w:val="left"/>
         <w:rPr>
           <w:rFonts w:eastAsia="DengXian"/>
           <w:lang w:eastAsia="zh-CN"/>
         </w:rPr>
-        <w:t xml:space="preserve"> </w:t>
-      </w:r>
-    </w:p>
-    <w:p>
-      <w:pPr>
-        <w:ind w:firstLine="480"/>
+      </w:pPr>
+      <w:r>
+        <w:tab/>
+      </w:r>
+      <w:r>
+        <w:t>node server.js</w:t>
+      </w:r>
+    </w:p>
+    <w:p>
+      <w:pPr>
         <w:jc w:val="left"/>
         <w:rPr>
           <w:rFonts w:eastAsia="DengXian"/>
           <w:lang w:eastAsia="zh-CN"/>
         </w:rPr>
       </w:pPr>
-      <w:proofErr w:type="spellStart"/>
       <w:r>
         <w:rPr>
           <w:rFonts w:eastAsia="新細明體"/>
         </w:rPr>
-        <w:t>npm</w:t>
-      </w:r>
-      <w:proofErr w:type="spellEnd"/>
+        <w:t xml:space="preserve"># </w:t>
+      </w:r>
+      <w:r>
+        <w:rPr>
+          <w:rFonts w:eastAsia="新細明體" w:hint="eastAsia"/>
+        </w:rPr>
+        <w:t>第三方音效庫（新增</w:t>
+      </w:r>
       <w:r>
         <w:rPr>
           <w:rFonts w:eastAsia="新細明體"/>
         </w:rPr>
-        <w:t xml:space="preserve"> install socket.io-client</w:t>
-      </w:r>
-    </w:p>
-    <w:p>
-      <w:pPr>
-        <w:jc w:val="left"/>
-        <w:rPr>
-          <w:rFonts w:eastAsia="DengXian"/>
+        <w:t xml:space="preserve"> howler </w:t>
+      </w:r>
+      <w:r>
+        <w:rPr>
+          <w:rFonts w:eastAsia="新細明體" w:hint="eastAsia"/>
+        </w:rPr>
+        <w:t>套件依賴）</w:t>
+      </w:r>
+    </w:p>
+    <w:p>
+      <w:pPr>
+        <w:jc w:val="left"/>
+        <w:rPr>
+          <w:rFonts w:eastAsia="DengXian"/>
+          <w:lang w:eastAsia="zh-CN"/>
         </w:rPr>
       </w:pPr>
       <w:r>
         <w:rPr>
           <w:rFonts w:eastAsia="新細明體"/>
         </w:rPr>
-        <w:t xml:space="preserve"># </w:t>
-      </w:r>
-      <w:r>
-        <w:rPr>
-          <w:rFonts w:eastAsia="新細明體" w:hint="eastAsia"/>
-        </w:rPr>
-        <w:t>安裝後端伺服器套件（用來當兩台裝置的郵差）</w:t>
-      </w:r>
-      <w:r>
-        <w:rPr>
-          <w:rFonts w:eastAsia="DengXian"/>
-        </w:rPr>
-        <w:t xml:space="preserve"> </w:t>
-      </w:r>
-    </w:p>
-    <w:p>
-      <w:pPr>
-        <w:ind w:firstLine="480"/>
-        <w:jc w:val="left"/>
-        <w:rPr>
-          <w:rFonts w:eastAsia="DengXian"/>
-          <w:lang w:eastAsia="zh-CN"/>
-        </w:rPr>
-      </w:pPr>
-      <w:proofErr w:type="spellStart"/>
-      <w:r>
-        <w:rPr>
-          <w:rFonts w:eastAsia="新細明體"/>
-        </w:rPr>
-        <w:t>npm</w:t>
-      </w:r>
-      <w:proofErr w:type="spellEnd"/>
-      <w:r>
-        <w:rPr>
-          <w:rFonts w:eastAsia="新細明體"/>
-        </w:rPr>
-        <w:t xml:space="preserve"> install express socket.io</w:t>
-      </w:r>
-    </w:p>
-    <w:p>
-      <w:pPr>
-        <w:jc w:val="left"/>
-      </w:pPr>
-      <w:r>
-        <w:rPr>
-          <w:rFonts w:asciiTheme="minorEastAsia" w:hAnsiTheme="minorEastAsia"/>
-        </w:rPr>
-        <w:t xml:space="preserve"># </w:t>
-      </w:r>
-      <w:r>
-        <w:rPr>
-          <w:rFonts w:asciiTheme="minorEastAsia" w:hAnsiTheme="minorEastAsia" w:hint="eastAsia"/>
-        </w:rPr>
-        <w:t>啟動伺服器</w:t>
-      </w:r>
-    </w:p>
-    <w:p>
-      <w:pPr>
-        <w:jc w:val="left"/>
-        <w:rPr>
-          <w:rFonts w:eastAsia="DengXian"/>
-          <w:lang w:eastAsia="zh-CN"/>
-        </w:rPr>
-      </w:pPr>
-      <w:r>
         <w:tab/>
-      </w:r>
-      <w:r>
-        <w:t>node server.js</w:t>
-      </w:r>
-    </w:p>
-    <w:p>
-      <w:pPr>
-        <w:jc w:val="left"/>
-        <w:rPr>
-          <w:rFonts w:eastAsia="DengXian"/>
-          <w:lang w:eastAsia="zh-CN"/>
-        </w:rPr>
-      </w:pPr>
-      <w:r>
-        <w:rPr>
-          <w:rFonts w:eastAsia="新細明體"/>
-        </w:rPr>
-        <w:t xml:space="preserve"># </w:t>
-      </w:r>
-      <w:r>
-        <w:rPr>
-          <w:rFonts w:eastAsia="新細明體" w:hint="eastAsia"/>
-        </w:rPr>
-        <w:t>第三方音效庫（新增</w:t>
-      </w:r>
-      <w:r>
-        <w:rPr>
-          <w:rFonts w:eastAsia="新細明體"/>
-        </w:rPr>
-        <w:t xml:space="preserve"> howler </w:t>
-      </w:r>
-      <w:r>
-        <w:rPr>
-          <w:rFonts w:eastAsia="新細明體" w:hint="eastAsia"/>
-        </w:rPr>
-        <w:t>套件依賴）</w:t>
-      </w:r>
-    </w:p>
-    <w:p>
-      <w:pPr>
-        <w:jc w:val="left"/>
-        <w:rPr>
-          <w:rFonts w:eastAsia="DengXian"/>
-          <w:lang w:eastAsia="zh-CN"/>
-        </w:rPr>
-      </w:pPr>
-      <w:r>
-        <w:rPr>
-          <w:rFonts w:eastAsia="新細明體"/>
-        </w:rPr>
-        <w:tab/>
-      </w:r>
-      <w:proofErr w:type="spellStart"/>
-      <w:r>
-        <w:rPr>
-          <w:rFonts w:eastAsia="新細明體"/>
-        </w:rPr>
-        <w:t>npm</w:t>
-      </w:r>
-      <w:proofErr w:type="spellEnd"/>
-      <w:r>
-        <w:rPr>
-          <w:rFonts w:eastAsia="新細明體"/>
-        </w:rPr>
-        <w:t xml:space="preserve"> i howler</w:t>
+        <w:t>npm i howler</w:t>
       </w:r>
     </w:p>
     <w:p>
@@ -4377,28 +4464,12 @@
         </w:rPr>
         <w:t>安裝路由：</w:t>
       </w:r>
-      <w:proofErr w:type="spellStart"/>
       <w:r>
         <w:rPr>
           <w:rFonts w:eastAsia="新細明體"/>
         </w:rPr>
-        <w:t>npm</w:t>
-      </w:r>
-      <w:proofErr w:type="spellEnd"/>
-      <w:r>
-        <w:rPr>
-          <w:rFonts w:eastAsia="新細明體"/>
-        </w:rPr>
-        <w:t xml:space="preserve"> install react-router-</w:t>
-      </w:r>
-      <w:proofErr w:type="spellStart"/>
-      <w:r>
-        <w:rPr>
-          <w:rFonts w:eastAsia="新細明體"/>
-        </w:rPr>
-        <w:t>dom</w:t>
-      </w:r>
-      <w:proofErr w:type="spellEnd"/>
+        <w:t>npm install react-router-dom</w:t>
+      </w:r>
     </w:p>
     <w:p>
       <w:pPr>
@@ -4421,21 +4492,7 @@
         <w:rPr>
           <w:rFonts w:eastAsia="新細明體"/>
         </w:rPr>
-        <w:t xml:space="preserve"> </w:t>
-      </w:r>
-      <w:proofErr w:type="spellStart"/>
-      <w:r>
-        <w:rPr>
-          <w:rFonts w:eastAsia="新細明體"/>
-        </w:rPr>
-        <w:t>App.jsx</w:t>
-      </w:r>
-      <w:proofErr w:type="spellEnd"/>
-      <w:r>
-        <w:rPr>
-          <w:rFonts w:eastAsia="新細明體"/>
-        </w:rPr>
-        <w:t xml:space="preserve"> </w:t>
+        <w:t xml:space="preserve"> App.jsx </w:t>
       </w:r>
       <w:r>
         <w:rPr>
@@ -4455,14 +4512,12 @@
           <w:rFonts w:eastAsia="DengXian"/>
         </w:rPr>
       </w:pPr>
-      <w:proofErr w:type="spellStart"/>
       <w:r>
         <w:rPr>
           <w:rFonts w:eastAsia="新細明體"/>
         </w:rPr>
         <w:t>App.jsx</w:t>
       </w:r>
-      <w:proofErr w:type="spellEnd"/>
       <w:r>
         <w:rPr>
           <w:rFonts w:eastAsia="新細明體" w:hint="eastAsia"/>
@@ -4482,14 +4537,12 @@
           <w:lang w:eastAsia="zh-CN"/>
         </w:rPr>
       </w:pPr>
-      <w:proofErr w:type="spellStart"/>
       <w:r>
         <w:rPr>
           <w:rFonts w:eastAsia="新細明體"/>
         </w:rPr>
         <w:t>MonitorView.jsx</w:t>
       </w:r>
-      <w:proofErr w:type="spellEnd"/>
       <w:r>
         <w:rPr>
           <w:rFonts w:eastAsia="新細明體" w:hint="eastAsia"/>
@@ -4521,14 +4574,12 @@
           <w:lang w:eastAsia="zh-CN"/>
         </w:rPr>
       </w:pPr>
-      <w:proofErr w:type="spellStart"/>
       <w:r>
         <w:rPr>
           <w:rFonts w:eastAsia="新細明體"/>
         </w:rPr>
         <w:t>TabletView.jsx</w:t>
       </w:r>
-      <w:proofErr w:type="spellEnd"/>
       <w:r>
         <w:rPr>
           <w:rFonts w:eastAsia="新細明體" w:hint="eastAsia"/>
@@ -4803,112 +4854,80 @@
           <w:b/>
           <w:bCs/>
         </w:rPr>
-        <w:t xml:space="preserve"> </w:t>
-      </w:r>
-      <w:proofErr w:type="spellStart"/>
+        <w:t xml:space="preserve"> BroadcastChannel API)</w:t>
+      </w:r>
+    </w:p>
+    <w:p>
+      <w:pPr>
+        <w:jc w:val="left"/>
+        <w:rPr>
+          <w:rFonts w:eastAsia="DengXian"/>
+        </w:rPr>
+      </w:pPr>
+      <w:r>
+        <w:rPr>
+          <w:rFonts w:eastAsia="新細明體" w:hint="eastAsia"/>
+        </w:rPr>
+        <w:t>如果你的展場是使用一台效能較好的主機（如</w:t>
+      </w:r>
       <w:r>
         <w:rPr>
           <w:rFonts w:eastAsia="新細明體"/>
+        </w:rPr>
+        <w:t xml:space="preserve"> Mac Macni </w:t>
+      </w:r>
+      <w:r>
+        <w:rPr>
+          <w:rFonts w:eastAsia="新細明體" w:hint="eastAsia"/>
+        </w:rPr>
+        <w:t>或</w:t>
+      </w:r>
+      <w:r>
+        <w:rPr>
+          <w:rFonts w:eastAsia="新細明體"/>
+        </w:rPr>
+        <w:t xml:space="preserve"> PC</w:t>
+      </w:r>
+      <w:r>
+        <w:rPr>
+          <w:rFonts w:eastAsia="新細明體" w:hint="eastAsia"/>
+        </w:rPr>
+        <w:t>），同時外接兩個螢幕（一個掛牆上，一個平放當平板），這是</w:t>
+      </w:r>
+      <w:r>
+        <w:rPr>
+          <w:rFonts w:eastAsia="新細明體" w:hint="eastAsia"/>
           <w:b/>
           <w:bCs/>
         </w:rPr>
-        <w:t>BroadcastChannel</w:t>
-      </w:r>
-      <w:proofErr w:type="spellEnd"/>
+        <w:t>最推薦且最簡單</w:t>
+      </w:r>
+      <w:r>
+        <w:rPr>
+          <w:rFonts w:eastAsia="新細明體" w:hint="eastAsia"/>
+        </w:rPr>
+        <w:t>的做法！</w:t>
+      </w:r>
+    </w:p>
+    <w:p>
+      <w:pPr>
+        <w:jc w:val="left"/>
+        <w:rPr>
+          <w:rFonts w:eastAsia="DengXian"/>
+          <w:lang w:eastAsia="zh-CN"/>
+        </w:rPr>
+      </w:pPr>
+      <w:r>
+        <w:rPr>
+          <w:rFonts w:eastAsia="新細明體" w:hint="eastAsia"/>
+        </w:rPr>
+        <w:t>不需要寫後端伺服器，直接利用瀏覽器內建的</w:t>
+      </w:r>
       <w:r>
         <w:rPr>
           <w:rFonts w:eastAsia="新細明體"/>
-          <w:b/>
-          <w:bCs/>
-        </w:rPr>
-        <w:t xml:space="preserve"> API)</w:t>
-      </w:r>
-    </w:p>
-    <w:p>
-      <w:pPr>
-        <w:jc w:val="left"/>
-        <w:rPr>
-          <w:rFonts w:eastAsia="DengXian"/>
-        </w:rPr>
-      </w:pPr>
-      <w:r>
-        <w:rPr>
-          <w:rFonts w:eastAsia="新細明體" w:hint="eastAsia"/>
-        </w:rPr>
-        <w:t>如果你的展場是使用一台效能較好的主機（如</w:t>
-      </w:r>
-      <w:r>
-        <w:rPr>
-          <w:rFonts w:eastAsia="新細明體"/>
-        </w:rPr>
-        <w:t xml:space="preserve"> Mac Macni </w:t>
-      </w:r>
-      <w:r>
-        <w:rPr>
-          <w:rFonts w:eastAsia="新細明體" w:hint="eastAsia"/>
-        </w:rPr>
-        <w:t>或</w:t>
-      </w:r>
-      <w:r>
-        <w:rPr>
-          <w:rFonts w:eastAsia="新細明體"/>
-        </w:rPr>
-        <w:t xml:space="preserve"> PC</w:t>
-      </w:r>
-      <w:r>
-        <w:rPr>
-          <w:rFonts w:eastAsia="新細明體" w:hint="eastAsia"/>
-        </w:rPr>
-        <w:t>），同時外接兩個螢幕（一個掛牆上，一個平放當平板），這是</w:t>
-      </w:r>
-      <w:r>
-        <w:rPr>
-          <w:rFonts w:eastAsia="新細明體" w:hint="eastAsia"/>
-          <w:b/>
-          <w:bCs/>
-        </w:rPr>
-        <w:t>最推薦且最簡單</w:t>
-      </w:r>
-      <w:r>
-        <w:rPr>
-          <w:rFonts w:eastAsia="新細明體" w:hint="eastAsia"/>
-        </w:rPr>
-        <w:t>的做法！</w:t>
-      </w:r>
-    </w:p>
-    <w:p>
-      <w:pPr>
-        <w:jc w:val="left"/>
-        <w:rPr>
-          <w:rFonts w:eastAsia="DengXian"/>
-          <w:lang w:eastAsia="zh-CN"/>
-        </w:rPr>
-      </w:pPr>
-      <w:r>
-        <w:rPr>
-          <w:rFonts w:eastAsia="新細明體" w:hint="eastAsia"/>
-        </w:rPr>
-        <w:t>不需要寫後端伺服器，直接利用瀏覽器內建的</w:t>
-      </w:r>
-      <w:r>
-        <w:rPr>
-          <w:rFonts w:eastAsia="新細明體"/>
-        </w:rPr>
-        <w:t xml:space="preserve"> </w:t>
-      </w:r>
-      <w:proofErr w:type="spellStart"/>
-      <w:r>
-        <w:rPr>
-          <w:rFonts w:eastAsia="新細明體"/>
-        </w:rPr>
-        <w:t>BroadcastChannel</w:t>
-      </w:r>
-      <w:proofErr w:type="spellEnd"/>
-      <w:r>
-        <w:rPr>
-          <w:rFonts w:eastAsia="新細明體"/>
-        </w:rPr>
-        <w:t xml:space="preserve"> </w:t>
+        </w:rPr>
+        <w:t xml:space="preserve"> BroadcastChannel </w:t>
       </w:r>
       <w:r>
         <w:rPr>

</xml_diff>

<commit_message>
feat(ai): upgrade MediaPipe tracking for multi-user and occlusion (v0.14.4)
</commit_message>
<xml_diff>
--- a/To do.docx
+++ b/To do.docx
@@ -822,21 +822,7 @@
         <w:rPr>
           <w:rFonts w:eastAsia="DengXian" w:hint="eastAsia"/>
         </w:rPr>
-        <w:t xml:space="preserve"> 待</w:t>
-      </w:r>
-      <w:proofErr w:type="gramStart"/>
-      <w:r>
-        <w:rPr>
-          <w:rFonts w:eastAsia="DengXian" w:hint="eastAsia"/>
-        </w:rPr>
-        <w:t>机</w:t>
-      </w:r>
-      <w:proofErr w:type="gramEnd"/>
-      <w:r>
-        <w:rPr>
-          <w:rFonts w:eastAsia="DengXian" w:hint="eastAsia"/>
-        </w:rPr>
-        <w:t>动画风格</w:t>
+        <w:t xml:space="preserve"> 待机动画风格</w:t>
       </w:r>
       <w:r>
         <w:rPr>
@@ -1017,21 +1003,7 @@
         <w:rPr>
           <w:rFonts w:eastAsia="DengXian" w:hint="eastAsia"/>
         </w:rPr>
-        <w:t xml:space="preserve"> 待</w:t>
-      </w:r>
-      <w:proofErr w:type="gramStart"/>
-      <w:r>
-        <w:rPr>
-          <w:rFonts w:eastAsia="DengXian" w:hint="eastAsia"/>
-        </w:rPr>
-        <w:t>机</w:t>
-      </w:r>
-      <w:proofErr w:type="gramEnd"/>
-      <w:r>
-        <w:rPr>
-          <w:rFonts w:eastAsia="DengXian" w:hint="eastAsia"/>
-        </w:rPr>
-        <w:t>音效</w:t>
+        <w:t xml:space="preserve"> 待机音效</w:t>
       </w:r>
       <w:r>
         <w:rPr>
@@ -1462,6 +1434,7 @@
         <w:jc w:val="left"/>
         <w:rPr>
           <w:rFonts w:eastAsia="DengXian"/>
+          <w:lang w:eastAsia="zh-CN"/>
         </w:rPr>
       </w:pPr>
       <w:sdt>
@@ -1502,15 +1475,17 @@
       <w:pPr>
         <w:jc w:val="left"/>
         <w:rPr>
-          <w:rFonts w:eastAsia="DengXian"/>
+          <w:rFonts w:eastAsia="DengXian" w:hint="eastAsia"/>
+          <w:lang w:eastAsia="zh-CN"/>
         </w:rPr>
       </w:pPr>
       <w:sdt>
         <w:sdtPr>
           <w:rPr>
             <w:rFonts w:eastAsia="DengXian" w:hint="eastAsia"/>
+            <w:lang w:eastAsia="zh-CN"/>
           </w:rPr>
-          <w:id w:val="1242531762"/>
+          <w:id w:val="944120091"/>
           <w14:checkbox>
             <w14:checked w14:val="0"/>
             <w14:checkedState w14:val="2612" w14:font="MS Gothic"/>
@@ -1521,6 +1496,7 @@
           <w:r>
             <w:rPr>
               <w:rFonts w:ascii="MS Gothic" w:eastAsia="MS Gothic" w:hAnsi="MS Gothic" w:hint="eastAsia"/>
+              <w:lang w:eastAsia="zh-CN"/>
             </w:rPr>
             <w:t>☐</w:t>
           </w:r>
@@ -1529,23 +1505,65 @@
       <w:r>
         <w:rPr>
           <w:rFonts w:eastAsia="DengXian" w:hint="eastAsia"/>
+          <w:lang w:eastAsia="zh-CN"/>
         </w:rPr>
         <w:t xml:space="preserve"> </w:t>
       </w:r>
       <w:r>
         <w:rPr>
           <w:rFonts w:eastAsia="DengXian"/>
-        </w:rPr>
-        <w:t>平板待機</w:t>
-      </w:r>
-      <w:proofErr w:type="gramStart"/>
-      <w:r>
-        <w:rPr>
-          <w:rFonts w:eastAsia="DengXian"/>
-        </w:rPr>
-        <w:t>畫面請輕觸</w:t>
-      </w:r>
-      <w:proofErr w:type="gramEnd"/>
+          <w:lang w:eastAsia="zh-CN"/>
+        </w:rPr>
+        <w:t>侦测异常时，预设的假眼睛</w:t>
+      </w:r>
+      <w:r>
+        <w:rPr>
+          <w:rFonts w:eastAsia="DengXian" w:hint="eastAsia"/>
+          <w:lang w:eastAsia="zh-CN"/>
+        </w:rPr>
+        <w:t>流泪</w:t>
+      </w:r>
+    </w:p>
+    <w:p>
+      <w:pPr>
+        <w:jc w:val="left"/>
+        <w:rPr>
+          <w:rFonts w:eastAsia="DengXian"/>
+        </w:rPr>
+      </w:pPr>
+      <w:sdt>
+        <w:sdtPr>
+          <w:rPr>
+            <w:rFonts w:eastAsia="DengXian" w:hint="eastAsia"/>
+          </w:rPr>
+          <w:id w:val="1242531762"/>
+          <w14:checkbox>
+            <w14:checked w14:val="1"/>
+            <w14:checkedState w14:val="2612" w14:font="MS Gothic"/>
+            <w14:uncheckedState w14:val="2610" w14:font="MS Gothic"/>
+          </w14:checkbox>
+        </w:sdtPr>
+        <w:sdtContent>
+          <w:r>
+            <w:rPr>
+              <w:rFonts w:ascii="MS Gothic" w:eastAsia="MS Gothic" w:hAnsi="MS Gothic" w:hint="eastAsia"/>
+            </w:rPr>
+            <w:t>☒</w:t>
+          </w:r>
+        </w:sdtContent>
+      </w:sdt>
+      <w:r>
+        <w:rPr>
+          <w:rFonts w:eastAsia="DengXian" w:hint="eastAsia"/>
+        </w:rPr>
+        <w:t xml:space="preserve"> </w:t>
+      </w:r>
+      <w:r>
+        <w:rPr>
+          <w:rFonts w:eastAsia="DengXian"/>
+        </w:rPr>
+        <w:t>平板待機畫面請輕觸</w:t>
+      </w:r>
     </w:p>
     <w:p>
       <w:pPr>
@@ -1837,7 +1855,6 @@
         </w:rPr>
         <w:t xml:space="preserve"> </w:t>
       </w:r>
-      <w:proofErr w:type="gramStart"/>
       <w:r>
         <w:rPr>
           <w:rFonts w:ascii="DengXian" w:eastAsia="DengXian" w:hAnsi="DengXian" w:hint="eastAsia"/>
@@ -1850,15 +1867,7 @@
           <w:rFonts w:eastAsia="DengXian" w:hint="eastAsia"/>
           <w:lang w:eastAsia="zh-CN"/>
         </w:rPr>
-        <w:t>水</w:t>
-      </w:r>
-      <w:proofErr w:type="gramEnd"/>
-      <w:r>
-        <w:rPr>
-          <w:rFonts w:eastAsia="DengXian" w:hint="eastAsia"/>
-          <w:lang w:eastAsia="zh-CN"/>
-        </w:rPr>
-        <w:t>波纹过程</w:t>
+        <w:t>水波纹过程</w:t>
       </w:r>
     </w:p>
     <w:p>
@@ -2134,19 +2143,11 @@
         </w:rPr>
         <w:t xml:space="preserve"> </w:t>
       </w:r>
-      <w:proofErr w:type="gramStart"/>
       <w:r>
         <w:rPr>
           <w:rFonts w:eastAsia="新細明體" w:hint="eastAsia"/>
         </w:rPr>
-        <w:t>顯示器攝像頭</w:t>
-      </w:r>
-      <w:proofErr w:type="gramEnd"/>
-      <w:r>
-        <w:rPr>
-          <w:rFonts w:eastAsia="新細明體" w:hint="eastAsia"/>
-        </w:rPr>
-        <w:t>隱私測試</w:t>
+        <w:t>顯示器攝像頭隱私測試</w:t>
       </w:r>
     </w:p>
     <w:p>
@@ -2524,21 +2525,7 @@
         <w:rPr>
           <w:rFonts w:eastAsia="新細明體" w:hint="eastAsia"/>
         </w:rPr>
-        <w:t>的</w:t>
-      </w:r>
-      <w:proofErr w:type="gramStart"/>
-      <w:r>
-        <w:rPr>
-          <w:rFonts w:eastAsia="新細明體" w:hint="eastAsia"/>
-        </w:rPr>
-        <w:t>單界面拆成兩個頁</w:t>
-      </w:r>
-      <w:proofErr w:type="gramEnd"/>
-      <w:r>
-        <w:rPr>
-          <w:rFonts w:eastAsia="新細明體" w:hint="eastAsia"/>
-        </w:rPr>
-        <w:t>面</w:t>
+        <w:t>的單界面拆成兩個頁面</w:t>
       </w:r>
     </w:p>
     <w:p>
@@ -2629,21 +2616,7 @@
         <w:rPr>
           <w:rFonts w:asciiTheme="minorEastAsia" w:hAnsiTheme="minorEastAsia" w:hint="eastAsia"/>
         </w:rPr>
-        <w:t>改成</w:t>
-      </w:r>
-      <w:proofErr w:type="gramStart"/>
-      <w:r>
-        <w:rPr>
-          <w:rFonts w:asciiTheme="minorEastAsia" w:hAnsiTheme="minorEastAsia" w:hint="eastAsia"/>
-        </w:rPr>
-        <w:t>小字小框長方形</w:t>
-      </w:r>
-      <w:proofErr w:type="gramEnd"/>
-      <w:r>
-        <w:rPr>
-          <w:rFonts w:asciiTheme="minorEastAsia" w:hAnsiTheme="minorEastAsia" w:hint="eastAsia"/>
-        </w:rPr>
-        <w:t>小圓角，加入橫向分隔線，按鈕與標題和開始互動按鈕用粗分隔線，</w:t>
+        <w:t>改成小字小框長方形小圓角，加入橫向分隔線，按鈕與標題和開始互動按鈕用粗分隔線，</w:t>
       </w:r>
       <w:r>
         <w:rPr>
@@ -3403,20 +3376,12 @@
         </w:rPr>
       </w:pPr>
       <w:bookmarkStart w:id="4" w:name="_Toc230804032"/>
-      <w:proofErr w:type="gramStart"/>
       <w:r>
         <w:rPr>
           <w:rFonts w:ascii="DengXian" w:eastAsia="新細明體" w:hAnsi="DengXian" w:hint="eastAsia"/>
         </w:rPr>
         <w:lastRenderedPageBreak/>
-        <w:t>攝像頭</w:t>
-      </w:r>
-      <w:proofErr w:type="gramEnd"/>
-      <w:r>
-        <w:rPr>
-          <w:rFonts w:ascii="DengXian" w:eastAsia="新細明體" w:hAnsi="DengXian" w:hint="eastAsia"/>
-        </w:rPr>
-        <w:t>權限</w:t>
+        <w:t>攝像頭權限</w:t>
       </w:r>
       <w:bookmarkEnd w:id="4"/>
     </w:p>
@@ -3785,7 +3750,6 @@
         </w:rPr>
       </w:pPr>
       <w:bookmarkStart w:id="5" w:name="_Toc230804033"/>
-      <w:proofErr w:type="gramStart"/>
       <w:r>
         <w:rPr>
           <w:rFonts w:ascii="DengXian" w:eastAsia="新細明體" w:hAnsi="DengXian" w:hint="eastAsia"/>
@@ -3794,7 +3758,6 @@
         <w:t>顯卡設定</w:t>
       </w:r>
       <w:bookmarkEnd w:id="5"/>
-      <w:proofErr w:type="gramEnd"/>
     </w:p>
     <w:p>
       <w:pPr>
@@ -4644,23 +4607,13 @@
         </w:rPr>
         <w:t xml:space="preserve"> (Data Transmission)</w:t>
       </w:r>
-      <w:proofErr w:type="gramStart"/>
       <w:r>
         <w:rPr>
           <w:rFonts w:asciiTheme="minorEastAsia" w:hAnsiTheme="minorEastAsia" w:hint="eastAsia"/>
           <w:b/>
           <w:bCs/>
         </w:rPr>
-        <w:t>——</w:t>
-      </w:r>
-      <w:proofErr w:type="gramEnd"/>
-      <w:r>
-        <w:rPr>
-          <w:rFonts w:asciiTheme="minorEastAsia" w:hAnsiTheme="minorEastAsia" w:hint="eastAsia"/>
-          <w:b/>
-          <w:bCs/>
-        </w:rPr>
-        <w:t>使用方案</w:t>
+        <w:t>——使用方案</w:t>
       </w:r>
       <w:r>
         <w:rPr>
@@ -4682,77 +4635,33 @@
         <w:rPr>
           <w:rFonts w:eastAsia="新細明體" w:hint="eastAsia"/>
         </w:rPr>
-        <w:t>既然拆成了</w:t>
-      </w:r>
-      <w:proofErr w:type="gramStart"/>
+        <w:t>既然拆成了兩個頁面，它們該怎麼溝通？</w:t>
+      </w:r>
+    </w:p>
+    <w:p>
+      <w:pPr>
+        <w:jc w:val="left"/>
+        <w:rPr>
+          <w:rFonts w:eastAsia="DengXian"/>
+        </w:rPr>
+      </w:pPr>
       <w:r>
         <w:rPr>
           <w:rFonts w:eastAsia="新細明體" w:hint="eastAsia"/>
         </w:rPr>
-        <w:t>兩個頁</w:t>
-      </w:r>
-      <w:proofErr w:type="gramEnd"/>
+        <w:t>（例如：平板按下了「盡情哭吧</w:t>
+      </w:r>
+      <w:r>
+        <w:rPr>
+          <w:rFonts w:eastAsia="新細明體"/>
+        </w:rPr>
+        <w:t xml:space="preserve"> GO</w:t>
+      </w:r>
       <w:r>
         <w:rPr>
           <w:rFonts w:eastAsia="新細明體" w:hint="eastAsia"/>
         </w:rPr>
-        <w:t>面，它們該怎麼溝通？</w:t>
-      </w:r>
-    </w:p>
-    <w:p>
-      <w:pPr>
-        <w:jc w:val="left"/>
-        <w:rPr>
-          <w:rFonts w:eastAsia="DengXian"/>
-        </w:rPr>
-      </w:pPr>
-      <w:proofErr w:type="gramStart"/>
-      <w:r>
-        <w:rPr>
-          <w:rFonts w:eastAsia="新細明體" w:hint="eastAsia"/>
-        </w:rPr>
-        <w:t>（</w:t>
-      </w:r>
-      <w:proofErr w:type="gramEnd"/>
-      <w:r>
-        <w:rPr>
-          <w:rFonts w:eastAsia="新細明體" w:hint="eastAsia"/>
-        </w:rPr>
-        <w:t>例如：平板按下了「</w:t>
-      </w:r>
-      <w:proofErr w:type="gramStart"/>
-      <w:r>
-        <w:rPr>
-          <w:rFonts w:eastAsia="新細明體" w:hint="eastAsia"/>
-        </w:rPr>
-        <w:t>盡情哭吧</w:t>
-      </w:r>
-      <w:proofErr w:type="gramEnd"/>
-      <w:r>
-        <w:rPr>
-          <w:rFonts w:eastAsia="新細明體"/>
-        </w:rPr>
-        <w:t xml:space="preserve"> GO</w:t>
-      </w:r>
-      <w:r>
-        <w:rPr>
-          <w:rFonts w:eastAsia="新細明體" w:hint="eastAsia"/>
-        </w:rPr>
-        <w:t>」，顯示器怎麼知道要</w:t>
-      </w:r>
-      <w:proofErr w:type="gramStart"/>
-      <w:r>
-        <w:rPr>
-          <w:rFonts w:eastAsia="新細明體" w:hint="eastAsia"/>
-        </w:rPr>
-        <w:t>開始掉字</w:t>
-      </w:r>
-      <w:proofErr w:type="gramEnd"/>
-      <w:r>
-        <w:rPr>
-          <w:rFonts w:eastAsia="新細明體" w:hint="eastAsia"/>
-        </w:rPr>
-        <w:t>？）</w:t>
+        <w:t>」，顯示器怎麼知道要開始掉字？）</w:t>
       </w:r>
       <w:r>
         <w:rPr>
@@ -4933,21 +4842,7 @@
         <w:rPr>
           <w:rFonts w:eastAsia="新細明體" w:hint="eastAsia"/>
         </w:rPr>
-        <w:t>就能讓兩個</w:t>
-      </w:r>
-      <w:proofErr w:type="gramStart"/>
-      <w:r>
-        <w:rPr>
-          <w:rFonts w:eastAsia="新細明體" w:hint="eastAsia"/>
-        </w:rPr>
-        <w:t>分頁秒速</w:t>
-      </w:r>
-      <w:proofErr w:type="gramEnd"/>
-      <w:r>
-        <w:rPr>
-          <w:rFonts w:eastAsia="新細明體" w:hint="eastAsia"/>
-        </w:rPr>
-        <w:t>溝通：</w:t>
+        <w:t>就能讓兩個分頁秒速溝通：</w:t>
       </w:r>
     </w:p>
     <w:p>
@@ -5383,104 +5278,36 @@
         <w:rPr>
           <w:rFonts w:hint="eastAsia"/>
         </w:rPr>
-        <w:t>預設是一個顯示器，一個平板，平板選擇詞</w:t>
-      </w:r>
-      <w:proofErr w:type="gramStart"/>
+        <w:t>預設是一個顯示器，一個平板，平板選擇詞匯後，透過影像識別，流淚流出詞匯最終流入平板，匯聚成寶石。</w:t>
+      </w:r>
+    </w:p>
+    <w:p/>
+    <w:p>
+      <w:pPr>
+        <w:rPr>
+          <w:rFonts w:eastAsia="DengXian"/>
+        </w:rPr>
+      </w:pPr>
       <w:r>
         <w:rPr>
           <w:rFonts w:hint="eastAsia"/>
         </w:rPr>
-        <w:t>匯</w:t>
-      </w:r>
-      <w:proofErr w:type="gramEnd"/>
+        <w:t>一樣用</w:t>
+      </w:r>
+      <w:r>
+        <w:t>React</w:t>
+      </w:r>
       <w:r>
         <w:rPr>
           <w:rFonts w:hint="eastAsia"/>
         </w:rPr>
-        <w:t>後，透過影像識別，流淚流出詞</w:t>
-      </w:r>
-      <w:proofErr w:type="gramStart"/>
-      <w:r>
-        <w:rPr>
-          <w:rFonts w:hint="eastAsia"/>
-        </w:rPr>
-        <w:t>匯</w:t>
-      </w:r>
-      <w:proofErr w:type="gramEnd"/>
-      <w:r>
-        <w:rPr>
-          <w:rFonts w:hint="eastAsia"/>
-        </w:rPr>
-        <w:t>最終流入平板，匯聚成寶石。</w:t>
-      </w:r>
-    </w:p>
-    <w:p/>
-    <w:p>
-      <w:pPr>
-        <w:rPr>
-          <w:rFonts w:eastAsia="DengXian"/>
-        </w:rPr>
-      </w:pPr>
-      <w:r>
-        <w:rPr>
-          <w:rFonts w:hint="eastAsia"/>
-        </w:rPr>
-        <w:t>一樣用</w:t>
-      </w:r>
-      <w:r>
-        <w:t>React</w:t>
-      </w:r>
-      <w:r>
-        <w:rPr>
-          <w:rFonts w:hint="eastAsia"/>
-        </w:rPr>
         <w:t>和</w:t>
       </w:r>
       <w:r>
         <w:t>Pixi</w:t>
       </w:r>
       <w:r>
-        <w:t>，設計點擊五組心情詞擇</w:t>
-      </w:r>
-      <w:proofErr w:type="gramStart"/>
-      <w:r>
-        <w:t>一</w:t>
-      </w:r>
-      <w:proofErr w:type="gramEnd"/>
-      <w:r>
-        <w:t>後，透過影像識別人眼，最終選擇的</w:t>
-      </w:r>
-      <w:proofErr w:type="gramStart"/>
-      <w:r>
-        <w:t>心情詞會不斷</w:t>
-      </w:r>
-      <w:proofErr w:type="gramEnd"/>
-      <w:r>
-        <w:t>從眼中流出（流出的詞</w:t>
-      </w:r>
-      <w:proofErr w:type="gramStart"/>
-      <w:r>
-        <w:t>匯</w:t>
-      </w:r>
-      <w:proofErr w:type="gramEnd"/>
-      <w:r>
-        <w:t>越來越多，有最大值），詞</w:t>
-      </w:r>
-      <w:proofErr w:type="gramStart"/>
-      <w:r>
-        <w:t>匯</w:t>
-      </w:r>
-      <w:proofErr w:type="gramEnd"/>
-      <w:r>
-        <w:t>在顯示器的流動過程中，慢慢由完整的字分解成流動的水墨，最後流入顯示器底端，幾秒後平板接續顯示器的水墨，並慢慢往平板中心匯聚，匯聚過程中漸漸變色</w:t>
-      </w:r>
-      <w:proofErr w:type="gramStart"/>
-      <w:r>
-        <w:t>（</w:t>
-      </w:r>
-      <w:proofErr w:type="gramEnd"/>
-      <w:r>
-        <w:t>顔色是根據最終要生成的寶石顔色決定）</w:t>
+        <w:t>，設計點擊五組心情詞擇一後，透過影像識別人眼，最終選擇的心情詞會不斷從眼中流出（流出的詞匯越來越多，有最大值），詞匯在顯示器的流動過程中，慢慢由完整的字分解成流動的水墨，最後流入顯示器底端，幾秒後平板接續顯示器的水墨，並慢慢往平板中心匯聚，匯聚過程中漸漸變色（顔色是根據最終要生成的寶石顔色決定）</w:t>
       </w:r>
       <w:r>
         <w:t>,</w:t>
@@ -7163,7 +6990,6 @@
   <w:style w:type="character" w:default="1" w:styleId="a0">
     <w:name w:val="Default Paragraph Font"/>
     <w:uiPriority w:val="1"/>
-    <w:semiHidden/>
     <w:unhideWhenUsed/>
   </w:style>
   <w:style w:type="table" w:default="1" w:styleId="a1">

</xml_diff>

<commit_message>
feat(ai): integrate offline segmentation, tracking stability, and texture fixes (v0.14.5)
</commit_message>
<xml_diff>
--- a/To do.docx
+++ b/To do.docx
@@ -822,7 +822,21 @@
         <w:rPr>
           <w:rFonts w:eastAsia="DengXian" w:hint="eastAsia"/>
         </w:rPr>
-        <w:t xml:space="preserve"> 待机动画风格</w:t>
+        <w:t xml:space="preserve"> 待</w:t>
+      </w:r>
+      <w:proofErr w:type="gramStart"/>
+      <w:r>
+        <w:rPr>
+          <w:rFonts w:eastAsia="DengXian" w:hint="eastAsia"/>
+        </w:rPr>
+        <w:t>机</w:t>
+      </w:r>
+      <w:proofErr w:type="gramEnd"/>
+      <w:r>
+        <w:rPr>
+          <w:rFonts w:eastAsia="DengXian" w:hint="eastAsia"/>
+        </w:rPr>
+        <w:t>动画风格</w:t>
       </w:r>
       <w:r>
         <w:rPr>
@@ -1003,7 +1017,21 @@
         <w:rPr>
           <w:rFonts w:eastAsia="DengXian" w:hint="eastAsia"/>
         </w:rPr>
-        <w:t xml:space="preserve"> 待机音效</w:t>
+        <w:t xml:space="preserve"> 待</w:t>
+      </w:r>
+      <w:proofErr w:type="gramStart"/>
+      <w:r>
+        <w:rPr>
+          <w:rFonts w:eastAsia="DengXian" w:hint="eastAsia"/>
+        </w:rPr>
+        <w:t>机</w:t>
+      </w:r>
+      <w:proofErr w:type="gramEnd"/>
+      <w:r>
+        <w:rPr>
+          <w:rFonts w:eastAsia="DengXian" w:hint="eastAsia"/>
+        </w:rPr>
+        <w:t>音效</w:t>
       </w:r>
       <w:r>
         <w:rPr>
@@ -1434,7 +1462,6 @@
         <w:jc w:val="left"/>
         <w:rPr>
           <w:rFonts w:eastAsia="DengXian"/>
-          <w:lang w:eastAsia="zh-CN"/>
         </w:rPr>
       </w:pPr>
       <w:sdt>
@@ -1444,7 +1471,7 @@
           </w:rPr>
           <w:id w:val="802508113"/>
           <w14:checkbox>
-            <w14:checked w14:val="0"/>
+            <w14:checked w14:val="1"/>
             <w14:checkedState w14:val="2612" w14:font="MS Gothic"/>
             <w14:uncheckedState w14:val="2610" w14:font="MS Gothic"/>
           </w14:checkbox>
@@ -1454,7 +1481,7 @@
             <w:rPr>
               <w:rFonts w:ascii="MS Gothic" w:eastAsia="MS Gothic" w:hAnsi="MS Gothic" w:hint="eastAsia"/>
             </w:rPr>
-            <w:t>☐</w:t>
+            <w:t>☒</w:t>
           </w:r>
         </w:sdtContent>
       </w:sdt>
@@ -1487,7 +1514,7 @@
           </w:rPr>
           <w:id w:val="944120091"/>
           <w14:checkbox>
-            <w14:checked w14:val="0"/>
+            <w14:checked w14:val="1"/>
             <w14:checkedState w14:val="2612" w14:font="MS Gothic"/>
             <w14:uncheckedState w14:val="2610" w14:font="MS Gothic"/>
           </w14:checkbox>
@@ -1498,7 +1525,7 @@
               <w:rFonts w:ascii="MS Gothic" w:eastAsia="MS Gothic" w:hAnsi="MS Gothic" w:hint="eastAsia"/>
               <w:lang w:eastAsia="zh-CN"/>
             </w:rPr>
-            <w:t>☐</w:t>
+            <w:t>☒</w:t>
           </w:r>
         </w:sdtContent>
       </w:sdt>
@@ -1562,8 +1589,16 @@
         <w:rPr>
           <w:rFonts w:eastAsia="DengXian"/>
         </w:rPr>
-        <w:t>平板待機畫面請輕觸</w:t>
-      </w:r>
+        <w:t>平板待機</w:t>
+      </w:r>
+      <w:proofErr w:type="gramStart"/>
+      <w:r>
+        <w:rPr>
+          <w:rFonts w:eastAsia="DengXian"/>
+        </w:rPr>
+        <w:t>畫面請輕觸</w:t>
+      </w:r>
+      <w:proofErr w:type="gramEnd"/>
     </w:p>
     <w:p>
       <w:pPr>
@@ -1855,6 +1890,7 @@
         </w:rPr>
         <w:t xml:space="preserve"> </w:t>
       </w:r>
+      <w:proofErr w:type="gramStart"/>
       <w:r>
         <w:rPr>
           <w:rFonts w:ascii="DengXian" w:eastAsia="DengXian" w:hAnsi="DengXian" w:hint="eastAsia"/>
@@ -1867,7 +1903,15 @@
           <w:rFonts w:eastAsia="DengXian" w:hint="eastAsia"/>
           <w:lang w:eastAsia="zh-CN"/>
         </w:rPr>
-        <w:t>水波纹过程</w:t>
+        <w:t>水</w:t>
+      </w:r>
+      <w:proofErr w:type="gramEnd"/>
+      <w:r>
+        <w:rPr>
+          <w:rFonts w:eastAsia="DengXian" w:hint="eastAsia"/>
+          <w:lang w:eastAsia="zh-CN"/>
+        </w:rPr>
+        <w:t>波纹过程</w:t>
       </w:r>
     </w:p>
     <w:p>
@@ -2143,11 +2187,19 @@
         </w:rPr>
         <w:t xml:space="preserve"> </w:t>
       </w:r>
+      <w:proofErr w:type="gramStart"/>
       <w:r>
         <w:rPr>
           <w:rFonts w:eastAsia="新細明體" w:hint="eastAsia"/>
         </w:rPr>
-        <w:t>顯示器攝像頭隱私測試</w:t>
+        <w:t>顯示器攝像頭</w:t>
+      </w:r>
+      <w:proofErr w:type="gramEnd"/>
+      <w:r>
+        <w:rPr>
+          <w:rFonts w:eastAsia="新細明體" w:hint="eastAsia"/>
+        </w:rPr>
+        <w:t>隱私測試</w:t>
       </w:r>
     </w:p>
     <w:p>
@@ -2525,7 +2577,21 @@
         <w:rPr>
           <w:rFonts w:eastAsia="新細明體" w:hint="eastAsia"/>
         </w:rPr>
-        <w:t>的單界面拆成兩個頁面</w:t>
+        <w:t>的</w:t>
+      </w:r>
+      <w:proofErr w:type="gramStart"/>
+      <w:r>
+        <w:rPr>
+          <w:rFonts w:eastAsia="新細明體" w:hint="eastAsia"/>
+        </w:rPr>
+        <w:t>單界面拆成兩個頁</w:t>
+      </w:r>
+      <w:proofErr w:type="gramEnd"/>
+      <w:r>
+        <w:rPr>
+          <w:rFonts w:eastAsia="新細明體" w:hint="eastAsia"/>
+        </w:rPr>
+        <w:t>面</w:t>
       </w:r>
     </w:p>
     <w:p>
@@ -2616,7 +2682,21 @@
         <w:rPr>
           <w:rFonts w:asciiTheme="minorEastAsia" w:hAnsiTheme="minorEastAsia" w:hint="eastAsia"/>
         </w:rPr>
-        <w:t>改成小字小框長方形小圓角，加入橫向分隔線，按鈕與標題和開始互動按鈕用粗分隔線，</w:t>
+        <w:t>改成</w:t>
+      </w:r>
+      <w:proofErr w:type="gramStart"/>
+      <w:r>
+        <w:rPr>
+          <w:rFonts w:asciiTheme="minorEastAsia" w:hAnsiTheme="minorEastAsia" w:hint="eastAsia"/>
+        </w:rPr>
+        <w:t>小字小框長方形</w:t>
+      </w:r>
+      <w:proofErr w:type="gramEnd"/>
+      <w:r>
+        <w:rPr>
+          <w:rFonts w:asciiTheme="minorEastAsia" w:hAnsiTheme="minorEastAsia" w:hint="eastAsia"/>
+        </w:rPr>
+        <w:t>小圓角，加入橫向分隔線，按鈕與標題和開始互動按鈕用粗分隔線，</w:t>
       </w:r>
       <w:r>
         <w:rPr>
@@ -3376,12 +3456,20 @@
         </w:rPr>
       </w:pPr>
       <w:bookmarkStart w:id="4" w:name="_Toc230804032"/>
+      <w:proofErr w:type="gramStart"/>
       <w:r>
         <w:rPr>
           <w:rFonts w:ascii="DengXian" w:eastAsia="新細明體" w:hAnsi="DengXian" w:hint="eastAsia"/>
         </w:rPr>
         <w:lastRenderedPageBreak/>
-        <w:t>攝像頭權限</w:t>
+        <w:t>攝像頭</w:t>
+      </w:r>
+      <w:proofErr w:type="gramEnd"/>
+      <w:r>
+        <w:rPr>
+          <w:rFonts w:ascii="DengXian" w:eastAsia="新細明體" w:hAnsi="DengXian" w:hint="eastAsia"/>
+        </w:rPr>
+        <w:t>權限</w:t>
       </w:r>
       <w:bookmarkEnd w:id="4"/>
     </w:p>
@@ -3750,6 +3838,7 @@
         </w:rPr>
       </w:pPr>
       <w:bookmarkStart w:id="5" w:name="_Toc230804033"/>
+      <w:proofErr w:type="gramStart"/>
       <w:r>
         <w:rPr>
           <w:rFonts w:ascii="DengXian" w:eastAsia="新細明體" w:hAnsi="DengXian" w:hint="eastAsia"/>
@@ -3758,6 +3847,7 @@
         <w:t>顯卡設定</w:t>
       </w:r>
       <w:bookmarkEnd w:id="5"/>
+      <w:proofErr w:type="gramEnd"/>
     </w:p>
     <w:p>
       <w:pPr>
@@ -3909,12 +3999,28 @@
           <w:lang w:eastAsia="zh-CN"/>
         </w:rPr>
       </w:pPr>
+      <w:proofErr w:type="spellStart"/>
       <w:r>
         <w:rPr>
           <w:rFonts w:eastAsia="新細明體"/>
         </w:rPr>
-        <w:t>npm install react-router-dom</w:t>
-      </w:r>
+        <w:t>npm</w:t>
+      </w:r>
+      <w:proofErr w:type="spellEnd"/>
+      <w:r>
+        <w:rPr>
+          <w:rFonts w:eastAsia="新細明體"/>
+        </w:rPr>
+        <w:t xml:space="preserve"> install react-router-</w:t>
+      </w:r>
+      <w:proofErr w:type="spellStart"/>
+      <w:r>
+        <w:rPr>
+          <w:rFonts w:eastAsia="新細明體"/>
+        </w:rPr>
+        <w:t>dom</w:t>
+      </w:r>
+      <w:proofErr w:type="spellEnd"/>
     </w:p>
     <w:p>
       <w:pPr>
@@ -3965,24 +4071,32 @@
           <w:lang w:eastAsia="zh-CN"/>
         </w:rPr>
       </w:pPr>
+      <w:proofErr w:type="spellStart"/>
       <w:r>
         <w:rPr>
           <w:rFonts w:eastAsia="新細明體"/>
         </w:rPr>
-        <w:t>npm install socket.io-client</w:t>
-      </w:r>
-    </w:p>
-    <w:p>
-      <w:pPr>
-        <w:jc w:val="left"/>
-        <w:rPr>
-          <w:rFonts w:eastAsia="DengXian"/>
-        </w:rPr>
-      </w:pPr>
+        <w:t>npm</w:t>
+      </w:r>
+      <w:proofErr w:type="spellEnd"/>
       <w:r>
         <w:rPr>
           <w:rFonts w:eastAsia="新細明體"/>
         </w:rPr>
+        <w:t xml:space="preserve"> install socket.io-client</w:t>
+      </w:r>
+    </w:p>
+    <w:p>
+      <w:pPr>
+        <w:jc w:val="left"/>
+        <w:rPr>
+          <w:rFonts w:eastAsia="DengXian"/>
+        </w:rPr>
+      </w:pPr>
+      <w:r>
+        <w:rPr>
+          <w:rFonts w:eastAsia="新細明體"/>
+        </w:rPr>
         <w:t xml:space="preserve"># </w:t>
       </w:r>
       <w:r>
@@ -4007,11 +4121,19 @@
           <w:lang w:eastAsia="zh-CN"/>
         </w:rPr>
       </w:pPr>
+      <w:proofErr w:type="spellStart"/>
       <w:r>
         <w:rPr>
           <w:rFonts w:eastAsia="新細明體"/>
         </w:rPr>
-        <w:t>npm install express socket.io</w:t>
+        <w:t>npm</w:t>
+      </w:r>
+      <w:proofErr w:type="spellEnd"/>
+      <w:r>
+        <w:rPr>
+          <w:rFonts w:eastAsia="新細明體"/>
+        </w:rPr>
+        <w:t xml:space="preserve"> install express socket.io</w:t>
       </w:r>
     </w:p>
     <w:p>
@@ -4092,7 +4214,20 @@
           <w:rFonts w:eastAsia="新細明體"/>
         </w:rPr>
         <w:tab/>
-        <w:t>npm i howler</w:t>
+      </w:r>
+      <w:proofErr w:type="spellStart"/>
+      <w:r>
+        <w:rPr>
+          <w:rFonts w:eastAsia="新細明體"/>
+        </w:rPr>
+        <w:t>npm</w:t>
+      </w:r>
+      <w:proofErr w:type="spellEnd"/>
+      <w:r>
+        <w:rPr>
+          <w:rFonts w:eastAsia="新細明體"/>
+        </w:rPr>
+        <w:t xml:space="preserve"> i howler</w:t>
       </w:r>
     </w:p>
     <w:p>
@@ -4427,12 +4562,28 @@
         </w:rPr>
         <w:t>安裝路由：</w:t>
       </w:r>
+      <w:proofErr w:type="spellStart"/>
       <w:r>
         <w:rPr>
           <w:rFonts w:eastAsia="新細明體"/>
         </w:rPr>
-        <w:t>npm install react-router-dom</w:t>
-      </w:r>
+        <w:t>npm</w:t>
+      </w:r>
+      <w:proofErr w:type="spellEnd"/>
+      <w:r>
+        <w:rPr>
+          <w:rFonts w:eastAsia="新細明體"/>
+        </w:rPr>
+        <w:t xml:space="preserve"> install react-router-</w:t>
+      </w:r>
+      <w:proofErr w:type="spellStart"/>
+      <w:r>
+        <w:rPr>
+          <w:rFonts w:eastAsia="新細明體"/>
+        </w:rPr>
+        <w:t>dom</w:t>
+      </w:r>
+      <w:proofErr w:type="spellEnd"/>
     </w:p>
     <w:p>
       <w:pPr>
@@ -4455,7 +4606,21 @@
         <w:rPr>
           <w:rFonts w:eastAsia="新細明體"/>
         </w:rPr>
-        <w:t xml:space="preserve"> App.jsx </w:t>
+        <w:t xml:space="preserve"> </w:t>
+      </w:r>
+      <w:proofErr w:type="spellStart"/>
+      <w:r>
+        <w:rPr>
+          <w:rFonts w:eastAsia="新細明體"/>
+        </w:rPr>
+        <w:t>App.jsx</w:t>
+      </w:r>
+      <w:proofErr w:type="spellEnd"/>
+      <w:r>
+        <w:rPr>
+          <w:rFonts w:eastAsia="新細明體"/>
+        </w:rPr>
+        <w:t xml:space="preserve"> </w:t>
       </w:r>
       <w:r>
         <w:rPr>
@@ -4475,12 +4640,14 @@
           <w:rFonts w:eastAsia="DengXian"/>
         </w:rPr>
       </w:pPr>
+      <w:proofErr w:type="spellStart"/>
       <w:r>
         <w:rPr>
           <w:rFonts w:eastAsia="新細明體"/>
         </w:rPr>
         <w:t>App.jsx</w:t>
       </w:r>
+      <w:proofErr w:type="spellEnd"/>
       <w:r>
         <w:rPr>
           <w:rFonts w:eastAsia="新細明體" w:hint="eastAsia"/>
@@ -4500,12 +4667,14 @@
           <w:lang w:eastAsia="zh-CN"/>
         </w:rPr>
       </w:pPr>
+      <w:proofErr w:type="spellStart"/>
       <w:r>
         <w:rPr>
           <w:rFonts w:eastAsia="新細明體"/>
         </w:rPr>
         <w:t>MonitorView.jsx</w:t>
       </w:r>
+      <w:proofErr w:type="spellEnd"/>
       <w:r>
         <w:rPr>
           <w:rFonts w:eastAsia="新細明體" w:hint="eastAsia"/>
@@ -4537,12 +4706,14 @@
           <w:lang w:eastAsia="zh-CN"/>
         </w:rPr>
       </w:pPr>
+      <w:proofErr w:type="spellStart"/>
       <w:r>
         <w:rPr>
           <w:rFonts w:eastAsia="新細明體"/>
         </w:rPr>
         <w:t>TabletView.jsx</w:t>
       </w:r>
+      <w:proofErr w:type="spellEnd"/>
       <w:r>
         <w:rPr>
           <w:rFonts w:eastAsia="新細明體" w:hint="eastAsia"/>
@@ -4607,13 +4778,23 @@
         </w:rPr>
         <w:t xml:space="preserve"> (Data Transmission)</w:t>
       </w:r>
+      <w:proofErr w:type="gramStart"/>
       <w:r>
         <w:rPr>
           <w:rFonts w:asciiTheme="minorEastAsia" w:hAnsiTheme="minorEastAsia" w:hint="eastAsia"/>
           <w:b/>
           <w:bCs/>
         </w:rPr>
-        <w:t>——使用方案</w:t>
+        <w:t>——</w:t>
+      </w:r>
+      <w:proofErr w:type="gramEnd"/>
+      <w:r>
+        <w:rPr>
+          <w:rFonts w:asciiTheme="minorEastAsia" w:hAnsiTheme="minorEastAsia" w:hint="eastAsia"/>
+          <w:b/>
+          <w:bCs/>
+        </w:rPr>
+        <w:t>使用方案</w:t>
       </w:r>
       <w:r>
         <w:rPr>
@@ -4635,22 +4816,52 @@
         <w:rPr>
           <w:rFonts w:eastAsia="新細明體" w:hint="eastAsia"/>
         </w:rPr>
-        <w:t>既然拆成了兩個頁面，它們該怎麼溝通？</w:t>
-      </w:r>
-    </w:p>
-    <w:p>
-      <w:pPr>
-        <w:jc w:val="left"/>
-        <w:rPr>
-          <w:rFonts w:eastAsia="DengXian"/>
-        </w:rPr>
-      </w:pPr>
+        <w:t>既然拆成了</w:t>
+      </w:r>
+      <w:proofErr w:type="gramStart"/>
       <w:r>
         <w:rPr>
           <w:rFonts w:eastAsia="新細明體" w:hint="eastAsia"/>
         </w:rPr>
-        <w:t>（例如：平板按下了「盡情哭吧</w:t>
-      </w:r>
+        <w:t>兩個頁</w:t>
+      </w:r>
+      <w:proofErr w:type="gramEnd"/>
+      <w:r>
+        <w:rPr>
+          <w:rFonts w:eastAsia="新細明體" w:hint="eastAsia"/>
+        </w:rPr>
+        <w:t>面，它們該怎麼溝通？</w:t>
+      </w:r>
+    </w:p>
+    <w:p>
+      <w:pPr>
+        <w:jc w:val="left"/>
+        <w:rPr>
+          <w:rFonts w:eastAsia="DengXian"/>
+        </w:rPr>
+      </w:pPr>
+      <w:proofErr w:type="gramStart"/>
+      <w:r>
+        <w:rPr>
+          <w:rFonts w:eastAsia="新細明體" w:hint="eastAsia"/>
+        </w:rPr>
+        <w:t>（</w:t>
+      </w:r>
+      <w:proofErr w:type="gramEnd"/>
+      <w:r>
+        <w:rPr>
+          <w:rFonts w:eastAsia="新細明體" w:hint="eastAsia"/>
+        </w:rPr>
+        <w:t>例如：平板按下了「</w:t>
+      </w:r>
+      <w:proofErr w:type="gramStart"/>
+      <w:r>
+        <w:rPr>
+          <w:rFonts w:eastAsia="新細明體" w:hint="eastAsia"/>
+        </w:rPr>
+        <w:t>盡情哭吧</w:t>
+      </w:r>
+      <w:proofErr w:type="gramEnd"/>
       <w:r>
         <w:rPr>
           <w:rFonts w:eastAsia="新細明體"/>
@@ -4661,7 +4872,21 @@
         <w:rPr>
           <w:rFonts w:eastAsia="新細明體" w:hint="eastAsia"/>
         </w:rPr>
-        <w:t>」，顯示器怎麼知道要開始掉字？）</w:t>
+        <w:t>」，顯示器怎麼知道要</w:t>
+      </w:r>
+      <w:proofErr w:type="gramStart"/>
+      <w:r>
+        <w:rPr>
+          <w:rFonts w:eastAsia="新細明體" w:hint="eastAsia"/>
+        </w:rPr>
+        <w:t>開始掉字</w:t>
+      </w:r>
+      <w:proofErr w:type="gramEnd"/>
+      <w:r>
+        <w:rPr>
+          <w:rFonts w:eastAsia="新細明體" w:hint="eastAsia"/>
+        </w:rPr>
+        <w:t>？）</w:t>
       </w:r>
       <w:r>
         <w:rPr>
@@ -4763,7 +4988,25 @@
           <w:b/>
           <w:bCs/>
         </w:rPr>
-        <w:t xml:space="preserve"> BroadcastChannel API)</w:t>
+        <w:t xml:space="preserve"> </w:t>
+      </w:r>
+      <w:proofErr w:type="spellStart"/>
+      <w:r>
+        <w:rPr>
+          <w:rFonts w:eastAsia="新細明體"/>
+          <w:b/>
+          <w:bCs/>
+        </w:rPr>
+        <w:t>BroadcastChannel</w:t>
+      </w:r>
+      <w:proofErr w:type="spellEnd"/>
+      <w:r>
+        <w:rPr>
+          <w:rFonts w:eastAsia="新細明體"/>
+          <w:b/>
+          <w:bCs/>
+        </w:rPr>
+        <w:t xml:space="preserve"> API)</w:t>
       </w:r>
     </w:p>
     <w:p>
@@ -4836,13 +5079,41 @@
         <w:rPr>
           <w:rFonts w:eastAsia="新細明體"/>
         </w:rPr>
-        <w:t xml:space="preserve"> BroadcastChannel </w:t>
+        <w:t xml:space="preserve"> </w:t>
+      </w:r>
+      <w:proofErr w:type="spellStart"/>
+      <w:r>
+        <w:rPr>
+          <w:rFonts w:eastAsia="新細明體"/>
+        </w:rPr>
+        <w:t>BroadcastChannel</w:t>
+      </w:r>
+      <w:proofErr w:type="spellEnd"/>
+      <w:r>
+        <w:rPr>
+          <w:rFonts w:eastAsia="新細明體"/>
+        </w:rPr>
+        <w:t xml:space="preserve"> </w:t>
       </w:r>
       <w:r>
         <w:rPr>
           <w:rFonts w:eastAsia="新細明體" w:hint="eastAsia"/>
         </w:rPr>
-        <w:t>就能讓兩個分頁秒速溝通：</w:t>
+        <w:t>就能讓兩個</w:t>
+      </w:r>
+      <w:proofErr w:type="gramStart"/>
+      <w:r>
+        <w:rPr>
+          <w:rFonts w:eastAsia="新細明體" w:hint="eastAsia"/>
+        </w:rPr>
+        <w:t>分頁秒速</w:t>
+      </w:r>
+      <w:proofErr w:type="gramEnd"/>
+      <w:r>
+        <w:rPr>
+          <w:rFonts w:eastAsia="新細明體" w:hint="eastAsia"/>
+        </w:rPr>
+        <w:t>溝通：</w:t>
       </w:r>
     </w:p>
     <w:p>
@@ -5278,7 +5549,35 @@
         <w:rPr>
           <w:rFonts w:hint="eastAsia"/>
         </w:rPr>
-        <w:t>預設是一個顯示器，一個平板，平板選擇詞匯後，透過影像識別，流淚流出詞匯最終流入平板，匯聚成寶石。</w:t>
+        <w:t>預設是一個顯示器，一個平板，平板選擇詞</w:t>
+      </w:r>
+      <w:proofErr w:type="gramStart"/>
+      <w:r>
+        <w:rPr>
+          <w:rFonts w:hint="eastAsia"/>
+        </w:rPr>
+        <w:t>匯</w:t>
+      </w:r>
+      <w:proofErr w:type="gramEnd"/>
+      <w:r>
+        <w:rPr>
+          <w:rFonts w:hint="eastAsia"/>
+        </w:rPr>
+        <w:t>後，透過影像識別，流淚流出詞</w:t>
+      </w:r>
+      <w:proofErr w:type="gramStart"/>
+      <w:r>
+        <w:rPr>
+          <w:rFonts w:hint="eastAsia"/>
+        </w:rPr>
+        <w:t>匯</w:t>
+      </w:r>
+      <w:proofErr w:type="gramEnd"/>
+      <w:r>
+        <w:rPr>
+          <w:rFonts w:hint="eastAsia"/>
+        </w:rPr>
+        <w:t>最終流入平板，匯聚成寶石。</w:t>
       </w:r>
     </w:p>
     <w:p/>
@@ -5307,7 +5606,47 @@
         <w:t>Pixi</w:t>
       </w:r>
       <w:r>
-        <w:t>，設計點擊五組心情詞擇一後，透過影像識別人眼，最終選擇的心情詞會不斷從眼中流出（流出的詞匯越來越多，有最大值），詞匯在顯示器的流動過程中，慢慢由完整的字分解成流動的水墨，最後流入顯示器底端，幾秒後平板接續顯示器的水墨，並慢慢往平板中心匯聚，匯聚過程中漸漸變色（顔色是根據最終要生成的寶石顔色決定）</w:t>
+        <w:t>，設計點擊五組心情詞擇</w:t>
+      </w:r>
+      <w:proofErr w:type="gramStart"/>
+      <w:r>
+        <w:t>一</w:t>
+      </w:r>
+      <w:proofErr w:type="gramEnd"/>
+      <w:r>
+        <w:t>後，透過影像識別人眼，最終選擇的</w:t>
+      </w:r>
+      <w:proofErr w:type="gramStart"/>
+      <w:r>
+        <w:t>心情詞會不斷</w:t>
+      </w:r>
+      <w:proofErr w:type="gramEnd"/>
+      <w:r>
+        <w:t>從眼中流出（流出的詞</w:t>
+      </w:r>
+      <w:proofErr w:type="gramStart"/>
+      <w:r>
+        <w:t>匯</w:t>
+      </w:r>
+      <w:proofErr w:type="gramEnd"/>
+      <w:r>
+        <w:t>越來越多，有最大值），詞</w:t>
+      </w:r>
+      <w:proofErr w:type="gramStart"/>
+      <w:r>
+        <w:t>匯</w:t>
+      </w:r>
+      <w:proofErr w:type="gramEnd"/>
+      <w:r>
+        <w:t>在顯示器的流動過程中，慢慢由完整的字分解成流動的水墨，最後流入顯示器底端，幾秒後平板接續顯示器的水墨，並慢慢往平板中心匯聚，匯聚過程中漸漸變色</w:t>
+      </w:r>
+      <w:proofErr w:type="gramStart"/>
+      <w:r>
+        <w:t>（</w:t>
+      </w:r>
+      <w:proofErr w:type="gramEnd"/>
+      <w:r>
+        <w:t>顔色是根據最終要生成的寶石顔色決定）</w:t>
       </w:r>
       <w:r>
         <w:t>,</w:t>

</xml_diff>